<commit_message>
Draft_104: combined example type highlights, EC/P labels, FP strike+codes
</commit_message>
<xml_diff>
--- a/thesis/003_ThesisProposal_Draft_104.docx
+++ b/thesis/003_ThesisProposal_Draft_104.docx
@@ -13151,91 +13151,268 @@
       </w:pPr>
       <w:r>
         <w:rPr>
-          <w:rFonts w:ascii="Georgia" w:hAnsi="Georgia"/>
-          <w:sz w:val="20"/>
-          <w:szCs w:val="20"/>
-        </w:rPr>
-        <w:t xml:space="preserve">“The results suggested (Lexical, EC) that extracts are potential (Lexical, EC) alternative stains. As prior studies indicated (Lexical, P), PCR can (FP-Cap) also detect low concentrations. Farmers should (FP-Rec) adopt the treatment. In conclusion, T3 produced the highest yield (FP framing). The treatment may (Modal, EC) reduce infection rates.”</w:t>
-      </w:r>
-      <w:r>
-        <w:rPr>
-          <w:rFonts w:ascii="Georgia" w:hAnsi="Georgia"/>
-          <w:sz w:val="20"/>
-          <w:szCs w:val="20"/>
-          <w:highlight w:val="red"/>
-          <w:color w:val="ffffff"/>
-        </w:rPr>
-        <w:t xml:space="preserve"/>
-      </w:r>
-      <w:r>
-        <w:rPr>
-          <w:rFonts w:ascii="Georgia" w:hAnsi="Georgia"/>
-          <w:sz w:val="20"/>
-          <w:szCs w:val="20"/>
-          <w:color w:val="ed7d31"/>
-        </w:rPr>
-        <w:t xml:space="preserve"/>
-      </w:r>
-      <w:r>
-        <w:rPr>
-          <w:rFonts w:ascii="Georgia" w:hAnsi="Georgia"/>
-          <w:sz w:val="20"/>
-          <w:szCs w:val="20"/>
-        </w:rPr>
-        <w:t xml:space="preserve"/>
-      </w:r>
-      <w:r>
-        <w:rPr>
-          <w:rFonts w:ascii="Georgia" w:hAnsi="Georgia"/>
-          <w:sz w:val="20"/>
-          <w:szCs w:val="20"/>
-          <w:highlight w:val="red"/>
-          <w:color w:val="ffffff"/>
-        </w:rPr>
-        <w:t xml:space="preserve"/>
-      </w:r>
-      <w:r>
-        <w:rPr>
-          <w:rFonts w:ascii="Georgia" w:hAnsi="Georgia"/>
-          <w:sz w:val="20"/>
-          <w:szCs w:val="20"/>
-          <w:color w:val="ed7d31"/>
-        </w:rPr>
-        <w:t xml:space="preserve"/>
-      </w:r>
-      <w:r>
-        <w:rPr>
-          <w:rFonts w:ascii="Georgia" w:hAnsi="Georgia"/>
-          <w:sz w:val="20"/>
-          <w:szCs w:val="20"/>
-        </w:rPr>
-        <w:t xml:space="preserve"/>
-      </w:r>
-      <w:r>
-        <w:rPr>
-          <w:rFonts w:ascii="Georgia" w:hAnsi="Georgia"/>
-          <w:sz w:val="20"/>
-          <w:szCs w:val="20"/>
+          <w:rFonts w:ascii="Georgia" w:hAnsi="Georgia" w:cs="Georgia" w:eastAsia="Georgia"/>
+          <w:sz w:val="24"/>
+          <w:szCs w:val="24"/>
+        </w:rPr>
+        <w:t xml:space="preserve">“The results </w:t>
+      </w:r>
+      <w:r>
+        <w:rPr>
+          <w:rFonts w:ascii="Georgia" w:hAnsi="Georgia" w:cs="Georgia" w:eastAsia="Georgia"/>
+          <w:sz w:val="24"/>
+          <w:szCs w:val="24"/>
+          <w:shd w:val="clear" w:fill="FF9999" w:color="auto"/>
+        </w:rPr>
+        <w:t xml:space="preserve">suggested</w:t>
+      </w:r>
+      <w:r>
+        <w:rPr>
+          <w:rFonts w:ascii="Georgia" w:hAnsi="Georgia" w:cs="Georgia" w:eastAsia="Georgia"/>
+          <w:sz w:val="24"/>
+          <w:szCs w:val="24"/>
+        </w:rPr>
+        <w:t xml:space="preserve"> </w:t>
+      </w:r>
+      <w:r>
+        <w:rPr>
+          <w:rFonts w:ascii="Georgia" w:hAnsi="Georgia" w:cs="Georgia" w:eastAsia="Georgia"/>
+          <w:sz w:val="24"/>
+          <w:szCs w:val="24"/>
+        </w:rPr>
+        <w:t xml:space="preserve">(Lexical, </w:t>
+      </w:r>
+      <w:r>
+        <w:rPr>
+          <w:rFonts w:ascii="Georgia" w:hAnsi="Georgia" w:cs="Georgia" w:eastAsia="Georgia"/>
+          <w:sz w:val="24"/>
+          <w:szCs w:val="24"/>
+          <w:color w:val="ED7D31"/>
+          <w:b/>
+        </w:rPr>
+        <w:t xml:space="preserve">EC</w:t>
+      </w:r>
+      <w:r>
+        <w:rPr>
+          <w:rFonts w:ascii="Georgia" w:hAnsi="Georgia" w:cs="Georgia" w:eastAsia="Georgia"/>
+          <w:sz w:val="24"/>
+          <w:szCs w:val="24"/>
+        </w:rPr>
+        <w:t xml:space="preserve">) that extracts are </w:t>
+      </w:r>
+      <w:r>
+        <w:rPr>
+          <w:rFonts w:ascii="Georgia" w:hAnsi="Georgia" w:cs="Georgia" w:eastAsia="Georgia"/>
+          <w:sz w:val="24"/>
+          <w:szCs w:val="24"/>
+          <w:shd w:val="clear" w:fill="FF9999" w:color="auto"/>
+        </w:rPr>
+        <w:t xml:space="preserve">potential</w:t>
+      </w:r>
+      <w:r>
+        <w:rPr>
+          <w:rFonts w:ascii="Georgia" w:hAnsi="Georgia" w:cs="Georgia" w:eastAsia="Georgia"/>
+          <w:sz w:val="24"/>
+          <w:szCs w:val="24"/>
+        </w:rPr>
+        <w:t xml:space="preserve"> </w:t>
+      </w:r>
+      <w:r>
+        <w:rPr>
+          <w:rFonts w:ascii="Georgia" w:hAnsi="Georgia" w:cs="Georgia" w:eastAsia="Georgia"/>
+          <w:sz w:val="24"/>
+          <w:szCs w:val="24"/>
+        </w:rPr>
+        <w:t xml:space="preserve">(Lexical, </w:t>
+      </w:r>
+      <w:r>
+        <w:rPr>
+          <w:rFonts w:ascii="Georgia" w:hAnsi="Georgia" w:cs="Georgia" w:eastAsia="Georgia"/>
+          <w:sz w:val="24"/>
+          <w:szCs w:val="24"/>
+          <w:color w:val="ED7D31"/>
+          <w:b/>
+        </w:rPr>
+        <w:t xml:space="preserve">EC</w:t>
+      </w:r>
+      <w:r>
+        <w:rPr>
+          <w:rFonts w:ascii="Georgia" w:hAnsi="Georgia" w:cs="Georgia" w:eastAsia="Georgia"/>
+          <w:sz w:val="24"/>
+          <w:szCs w:val="24"/>
+        </w:rPr>
+        <w:t xml:space="preserve">) alternative stains. As prior studies </w:t>
+      </w:r>
+      <w:r>
+        <w:rPr>
+          <w:rFonts w:ascii="Georgia" w:hAnsi="Georgia" w:cs="Georgia" w:eastAsia="Georgia"/>
+          <w:sz w:val="24"/>
+          <w:szCs w:val="24"/>
+          <w:shd w:val="clear" w:fill="FF9999" w:color="auto"/>
+        </w:rPr>
+        <w:t xml:space="preserve">indicated</w:t>
+      </w:r>
+      <w:r>
+        <w:rPr>
+          <w:rFonts w:ascii="Georgia" w:hAnsi="Georgia" w:cs="Georgia" w:eastAsia="Georgia"/>
+          <w:sz w:val="24"/>
+          <w:szCs w:val="24"/>
+        </w:rPr>
+        <w:t xml:space="preserve"> </w:t>
+      </w:r>
+      <w:r>
+        <w:rPr>
+          <w:rFonts w:ascii="Georgia" w:hAnsi="Georgia" w:cs="Georgia" w:eastAsia="Georgia"/>
+          <w:sz w:val="24"/>
+          <w:szCs w:val="24"/>
+        </w:rPr>
+        <w:t xml:space="preserve">(Lexical, </w:t>
+      </w:r>
+      <w:r>
+        <w:rPr>
+          <w:rFonts w:ascii="Georgia" w:hAnsi="Georgia" w:cs="Georgia" w:eastAsia="Georgia"/>
+          <w:sz w:val="24"/>
+          <w:szCs w:val="24"/>
+          <w:color w:val="7030A0"/>
+          <w:b/>
+        </w:rPr>
+        <w:t xml:space="preserve">P</w:t>
+      </w:r>
+      <w:r>
+        <w:rPr>
+          <w:rFonts w:ascii="Georgia" w:hAnsi="Georgia" w:cs="Georgia" w:eastAsia="Georgia"/>
+          <w:sz w:val="24"/>
+          <w:szCs w:val="24"/>
+        </w:rPr>
+        <w:t xml:space="preserve">), PCR </w:t>
+      </w:r>
+      <w:r>
+        <w:rPr>
+          <w:rFonts w:ascii="Georgia" w:hAnsi="Georgia" w:cs="Georgia" w:eastAsia="Georgia"/>
+          <w:sz w:val="24"/>
+          <w:szCs w:val="24"/>
           <w:strike/>
         </w:rPr>
-        <w:t xml:space="preserve"/>
-      </w:r>
-      <w:r>
-        <w:rPr>
-          <w:rFonts w:ascii="Georgia" w:hAnsi="Georgia"/>
-          <w:sz w:val="20"/>
-          <w:szCs w:val="20"/>
+        <w:t xml:space="preserve">can</w:t>
+      </w:r>
+      <w:r>
+        <w:rPr>
+          <w:rFonts w:ascii="Georgia" w:hAnsi="Georgia" w:cs="Georgia" w:eastAsia="Georgia"/>
+          <w:sz w:val="24"/>
+          <w:szCs w:val="24"/>
+        </w:rPr>
+        <w:t xml:space="preserve"> </w:t>
+      </w:r>
+      <w:r>
+        <w:rPr>
+          <w:rFonts w:ascii="Georgia" w:hAnsi="Georgia" w:cs="Georgia" w:eastAsia="Georgia"/>
+          <w:sz w:val="24"/>
+          <w:szCs w:val="24"/>
           <w:color w:val="808080"/>
         </w:rPr>
-        <w:t xml:space="preserve"/>
-      </w:r>
-      <w:r>
-        <w:rPr>
-          <w:rFonts w:ascii="Georgia" w:hAnsi="Georgia"/>
-          <w:sz w:val="20"/>
-          <w:szCs w:val="20"/>
-        </w:rPr>
-        <w:t xml:space="preserve"/>
+        <w:t xml:space="preserve">(FP-Cap)</w:t>
+      </w:r>
+      <w:r>
+        <w:rPr>
+          <w:rFonts w:ascii="Georgia" w:hAnsi="Georgia" w:cs="Georgia" w:eastAsia="Georgia"/>
+          <w:sz w:val="24"/>
+          <w:szCs w:val="24"/>
+        </w:rPr>
+        <w:t xml:space="preserve"> also detect low concentrations. Farmers </w:t>
+      </w:r>
+      <w:r>
+        <w:rPr>
+          <w:rFonts w:ascii="Georgia" w:hAnsi="Georgia" w:cs="Georgia" w:eastAsia="Georgia"/>
+          <w:sz w:val="24"/>
+          <w:szCs w:val="24"/>
+          <w:strike/>
+        </w:rPr>
+        <w:t xml:space="preserve">should</w:t>
+      </w:r>
+      <w:r>
+        <w:rPr>
+          <w:rFonts w:ascii="Georgia" w:hAnsi="Georgia" w:cs="Georgia" w:eastAsia="Georgia"/>
+          <w:sz w:val="24"/>
+          <w:szCs w:val="24"/>
+        </w:rPr>
+        <w:t xml:space="preserve"> </w:t>
+      </w:r>
+      <w:r>
+        <w:rPr>
+          <w:rFonts w:ascii="Georgia" w:hAnsi="Georgia" w:cs="Georgia" w:eastAsia="Georgia"/>
+          <w:sz w:val="24"/>
+          <w:szCs w:val="24"/>
+          <w:color w:val="808080"/>
+        </w:rPr>
+        <w:t xml:space="preserve">(FP-Rec)</w:t>
+      </w:r>
+      <w:r>
+        <w:rPr>
+          <w:rFonts w:ascii="Georgia" w:hAnsi="Georgia" w:cs="Georgia" w:eastAsia="Georgia"/>
+          <w:sz w:val="24"/>
+          <w:szCs w:val="24"/>
+        </w:rPr>
+        <w:t xml:space="preserve"> adopt the treatment. In conclusion, T3 produced the highest yield </w:t>
+      </w:r>
+      <w:r>
+        <w:rPr>
+          <w:rFonts w:ascii="Georgia" w:hAnsi="Georgia" w:cs="Georgia" w:eastAsia="Georgia"/>
+          <w:sz w:val="24"/>
+          <w:szCs w:val="24"/>
+          <w:color w:val="808080"/>
+        </w:rPr>
+        <w:t xml:space="preserve">(FP framing)</w:t>
+      </w:r>
+      <w:r>
+        <w:rPr>
+          <w:rFonts w:ascii="Georgia" w:hAnsi="Georgia" w:cs="Georgia" w:eastAsia="Georgia"/>
+          <w:sz w:val="24"/>
+          <w:szCs w:val="24"/>
+        </w:rPr>
+        <w:t xml:space="preserve">. The treatment </w:t>
+      </w:r>
+      <w:r>
+        <w:rPr>
+          <w:rFonts w:ascii="Georgia" w:hAnsi="Georgia" w:cs="Georgia" w:eastAsia="Georgia"/>
+          <w:sz w:val="24"/>
+          <w:szCs w:val="24"/>
+          <w:shd w:val="clear" w:fill="00B0F0" w:color="auto"/>
+        </w:rPr>
+        <w:t xml:space="preserve">may</w:t>
+      </w:r>
+      <w:r>
+        <w:rPr>
+          <w:rFonts w:ascii="Georgia" w:hAnsi="Georgia" w:cs="Georgia" w:eastAsia="Georgia"/>
+          <w:sz w:val="24"/>
+          <w:szCs w:val="24"/>
+        </w:rPr>
+        <w:t xml:space="preserve"> </w:t>
+      </w:r>
+      <w:r>
+        <w:rPr>
+          <w:rFonts w:ascii="Georgia" w:hAnsi="Georgia" w:cs="Georgia" w:eastAsia="Georgia"/>
+          <w:sz w:val="24"/>
+          <w:szCs w:val="24"/>
+        </w:rPr>
+        <w:t xml:space="preserve">(Modal, </w:t>
+      </w:r>
+      <w:r>
+        <w:rPr>
+          <w:rFonts w:ascii="Georgia" w:hAnsi="Georgia" w:cs="Georgia" w:eastAsia="Georgia"/>
+          <w:sz w:val="24"/>
+          <w:szCs w:val="24"/>
+          <w:color w:val="ED7D31"/>
+          <w:b/>
+        </w:rPr>
+        <w:t xml:space="preserve">EC</w:t>
+      </w:r>
+      <w:r>
+        <w:rPr>
+          <w:rFonts w:ascii="Georgia" w:hAnsi="Georgia" w:cs="Georgia" w:eastAsia="Georgia"/>
+          <w:sz w:val="24"/>
+          <w:szCs w:val="24"/>
+        </w:rPr>
+        <w:t xml:space="preserve">) reduce infection rates.”</w:t>
       </w:r>
     </w:p>
     <w:p>

</xml_diff>

<commit_message>
Draft_104: Appendix A bullets uniform (hanging indent, spacing, justify)
</commit_message>
<xml_diff>
--- a/thesis/003_ThesisProposal_Draft_104.docx
+++ b/thesis/003_ThesisProposal_Draft_104.docx
@@ -12325,7 +12325,8 @@
     </w:p>
     <w:p>
       <w:pPr>
-        <w:spacing w:before="0" w:after="40" w:line="276" w:lineRule="auto"/>
+        <w:spacing w:before="0" w:after="60" w:line="360" w:lineRule="auto"/>
+        <w:ind w:left="360" w:hanging="360"/>
         <w:jc w:val="both"/>
         <w:rPr/>
       </w:pPr>
@@ -12365,7 +12366,8 @@
     </w:p>
     <w:p>
       <w:pPr>
-        <w:spacing w:before="0" w:after="0" w:line="264" w:lineRule="auto"/>
+        <w:spacing w:before="0" w:after="60" w:line="360" w:lineRule="auto"/>
+        <w:ind w:left="360" w:hanging="360"/>
         <w:jc w:val="both"/>
         <w:rPr/>
       </w:pPr>
@@ -12413,8 +12415,8 @@
     </w:p>
     <w:p>
       <w:pPr>
-        <w:spacing w:before="0" w:after="0" w:line="264" w:lineRule="auto"/>
-        <w:ind w:left="240" w:firstLine="0"/>
+        <w:spacing w:before="0" w:after="60" w:line="360" w:lineRule="auto"/>
+        <w:ind w:left="360" w:hanging="360"/>
         <w:jc w:val="both"/>
         <w:rPr/>
       </w:pPr>
@@ -12437,8 +12439,8 @@
     </w:p>
     <w:p>
       <w:pPr>
-        <w:spacing w:before="0" w:after="0" w:line="264" w:lineRule="auto"/>
-        <w:ind w:left="240" w:firstLine="0"/>
+        <w:spacing w:before="0" w:after="60" w:line="360" w:lineRule="auto"/>
+        <w:ind w:left="360" w:hanging="360"/>
         <w:jc w:val="both"/>
         <w:rPr/>
       </w:pPr>
@@ -12462,8 +12464,8 @@
     </w:p>
     <w:p>
       <w:pPr>
-        <w:spacing w:before="0" w:after="0" w:line="264" w:lineRule="auto"/>
-        <w:ind w:left="240" w:firstLine="0"/>
+        <w:spacing w:before="0" w:after="60" w:line="360" w:lineRule="auto"/>
+        <w:ind w:left="360" w:hanging="360"/>
         <w:jc w:val="both"/>
         <w:rPr/>
       </w:pPr>
@@ -12486,8 +12488,8 @@
     </w:p>
     <w:p>
       <w:pPr>
-        <w:spacing w:before="0" w:after="0" w:line="264" w:lineRule="auto"/>
-        <w:ind w:left="240" w:firstLine="0"/>
+        <w:spacing w:before="0" w:after="60" w:line="360" w:lineRule="auto"/>
+        <w:ind w:left="360" w:hanging="360"/>
         <w:jc w:val="both"/>
         <w:rPr/>
       </w:pPr>
@@ -12580,8 +12582,8 @@
     </w:p>
     <w:p>
       <w:pPr>
-        <w:spacing w:before="0" w:after="0" w:line="288" w:lineRule="auto"/>
-        <w:ind w:firstLine="720"/>
+        <w:spacing w:before="0" w:after="60" w:line="360" w:lineRule="auto"/>
+        <w:ind w:left="360" w:hanging="360"/>
         <w:jc w:val="both"/>
         <w:rPr/>
       </w:pPr>
@@ -13172,15 +13174,7 @@
           <w:sz w:val="24"/>
           <w:szCs w:val="24"/>
         </w:rPr>
-        <w:t xml:space="preserve"> </w:t>
-      </w:r>
-      <w:r>
-        <w:rPr>
-          <w:rFonts w:ascii="Georgia" w:hAnsi="Georgia" w:cs="Georgia" w:eastAsia="Georgia"/>
-          <w:sz w:val="24"/>
-          <w:szCs w:val="24"/>
-        </w:rPr>
-        <w:t xml:space="preserve">(Lexical, </w:t>
+        <w:t xml:space="preserve"> (Lexical, </w:t>
       </w:r>
       <w:r>
         <w:rPr>
@@ -13215,15 +13209,7 @@
           <w:sz w:val="24"/>
           <w:szCs w:val="24"/>
         </w:rPr>
-        <w:t xml:space="preserve"> </w:t>
-      </w:r>
-      <w:r>
-        <w:rPr>
-          <w:rFonts w:ascii="Georgia" w:hAnsi="Georgia" w:cs="Georgia" w:eastAsia="Georgia"/>
-          <w:sz w:val="24"/>
-          <w:szCs w:val="24"/>
-        </w:rPr>
-        <w:t xml:space="preserve">(Lexical, </w:t>
+        <w:t xml:space="preserve"> (Lexical, </w:t>
       </w:r>
       <w:r>
         <w:rPr>
@@ -13258,15 +13244,7 @@
           <w:sz w:val="24"/>
           <w:szCs w:val="24"/>
         </w:rPr>
-        <w:t xml:space="preserve"> </w:t>
-      </w:r>
-      <w:r>
-        <w:rPr>
-          <w:rFonts w:ascii="Georgia" w:hAnsi="Georgia" w:cs="Georgia" w:eastAsia="Georgia"/>
-          <w:sz w:val="24"/>
-          <w:szCs w:val="24"/>
-        </w:rPr>
-        <w:t xml:space="preserve">(Lexical, </w:t>
+        <w:t xml:space="preserve"> (Lexical, </w:t>
       </w:r>
       <w:r>
         <w:rPr>
@@ -13386,15 +13364,7 @@
           <w:sz w:val="24"/>
           <w:szCs w:val="24"/>
         </w:rPr>
-        <w:t xml:space="preserve"> </w:t>
-      </w:r>
-      <w:r>
-        <w:rPr>
-          <w:rFonts w:ascii="Georgia" w:hAnsi="Georgia" w:cs="Georgia" w:eastAsia="Georgia"/>
-          <w:sz w:val="24"/>
-          <w:szCs w:val="24"/>
-        </w:rPr>
-        <w:t xml:space="preserve">(Modal, </w:t>
+        <w:t xml:space="preserve"> (Modal, </w:t>
       </w:r>
       <w:r>
         <w:rPr>
@@ -13431,8 +13401,8 @@
     </w:p>
     <w:p>
       <w:pPr>
-        <w:spacing w:before="0" w:after="60" w:line="288" w:lineRule="auto"/>
-        <w:ind w:firstLine="720"/>
+        <w:spacing w:before="0" w:after="60" w:line="360" w:lineRule="auto"/>
+        <w:ind w:left="360" w:hanging="360"/>
         <w:jc w:val="both"/>
         <w:rPr/>
       </w:pPr>
@@ -13526,7 +13496,7 @@
     </w:p>
     <w:p>
       <w:pPr>
-        <w:spacing w:before="0" w:after="8" w:line="360" w:lineRule="auto"/>
+        <w:spacing w:before="0" w:after="60" w:line="360" w:lineRule="auto"/>
         <w:ind w:left="360" w:hanging="360"/>
         <w:jc w:val="both"/>
         <w:rPr/>
@@ -13577,7 +13547,7 @@
     </w:p>
     <w:p>
       <w:pPr>
-        <w:spacing w:before="0" w:after="8" w:line="360" w:lineRule="auto"/>
+        <w:spacing w:before="0" w:after="60" w:line="360" w:lineRule="auto"/>
         <w:ind w:left="360" w:hanging="360"/>
         <w:jc w:val="both"/>
         <w:rPr/>
@@ -13628,7 +13598,7 @@
     </w:p>
     <w:p>
       <w:pPr>
-        <w:spacing w:before="0" w:after="8" w:line="360" w:lineRule="auto"/>
+        <w:spacing w:before="0" w:after="60" w:line="360" w:lineRule="auto"/>
         <w:ind w:left="360" w:hanging="360"/>
         <w:jc w:val="both"/>
         <w:rPr/>
@@ -13647,7 +13617,7 @@
     </w:p>
     <w:p>
       <w:pPr>
-        <w:spacing w:before="0" w:after="8" w:line="360" w:lineRule="auto"/>
+        <w:spacing w:before="0" w:after="60" w:line="360" w:lineRule="auto"/>
         <w:ind w:left="360" w:hanging="360"/>
         <w:jc w:val="both"/>
         <w:rPr/>
@@ -13666,7 +13636,7 @@
     </w:p>
     <w:p>
       <w:pPr>
-        <w:spacing w:before="0" w:after="8" w:line="360" w:lineRule="auto"/>
+        <w:spacing w:before="0" w:after="60" w:line="360" w:lineRule="auto"/>
         <w:ind w:left="360" w:hanging="360"/>
         <w:jc w:val="both"/>
         <w:rPr/>
@@ -13737,7 +13707,7 @@
     </w:p>
     <w:p>
       <w:pPr>
-        <w:spacing w:before="0" w:after="8" w:line="360" w:lineRule="auto"/>
+        <w:spacing w:before="0" w:after="60" w:line="360" w:lineRule="auto"/>
         <w:ind w:left="360" w:hanging="360"/>
         <w:jc w:val="both"/>
         <w:rPr/>
@@ -13784,7 +13754,7 @@
     </w:p>
     <w:p>
       <w:pPr>
-        <w:spacing w:before="0" w:after="8" w:line="360" w:lineRule="auto"/>
+        <w:spacing w:before="0" w:after="60" w:line="360" w:lineRule="auto"/>
         <w:ind w:left="360" w:hanging="360"/>
         <w:jc w:val="both"/>
         <w:rPr/>
@@ -13803,7 +13773,7 @@
     </w:p>
     <w:p>
       <w:pPr>
-        <w:spacing w:before="0" w:after="8" w:line="360" w:lineRule="auto"/>
+        <w:spacing w:before="0" w:after="60" w:line="360" w:lineRule="auto"/>
         <w:ind w:left="360" w:hanging="360"/>
         <w:jc w:val="both"/>
         <w:rPr/>
@@ -13822,7 +13792,7 @@
     </w:p>
     <w:p>
       <w:pPr>
-        <w:spacing w:before="0" w:after="8" w:line="360" w:lineRule="auto"/>
+        <w:spacing w:before="0" w:after="60" w:line="360" w:lineRule="auto"/>
         <w:ind w:left="360" w:hanging="360"/>
         <w:jc w:val="both"/>
         <w:rPr/>
@@ -13848,7 +13818,7 @@
     </w:p>
     <w:p>
       <w:pPr>
-        <w:spacing w:before="0" w:after="8" w:line="360" w:lineRule="auto"/>
+        <w:spacing w:before="0" w:after="60" w:line="360" w:lineRule="auto"/>
         <w:ind w:left="360" w:hanging="360"/>
         <w:jc w:val="both"/>
         <w:rPr/>
@@ -13867,7 +13837,7 @@
     </w:p>
     <w:p>
       <w:pPr>
-        <w:spacing w:before="0" w:after="8" w:line="360" w:lineRule="auto"/>
+        <w:spacing w:before="0" w:after="60" w:line="360" w:lineRule="auto"/>
         <w:ind w:left="360" w:hanging="360"/>
         <w:jc w:val="both"/>
         <w:rPr/>
@@ -13895,7 +13865,7 @@
     </w:p>
     <w:p>
       <w:pPr>
-        <w:spacing w:before="0" w:after="8" w:line="360" w:lineRule="auto"/>
+        <w:spacing w:before="0" w:after="60" w:line="360" w:lineRule="auto"/>
         <w:ind w:left="360" w:hanging="360"/>
         <w:jc w:val="both"/>
         <w:rPr/>
@@ -13923,7 +13893,7 @@
     </w:p>
     <w:p>
       <w:pPr>
-        <w:spacing w:before="0" w:after="8" w:line="360" w:lineRule="auto"/>
+        <w:spacing w:before="0" w:after="60" w:line="360" w:lineRule="auto"/>
         <w:ind w:left="360" w:hanging="360"/>
         <w:jc w:val="both"/>
         <w:rPr/>
@@ -13942,7 +13912,7 @@
     </w:p>
     <w:p>
       <w:pPr>
-        <w:spacing w:before="0" w:after="8" w:line="360" w:lineRule="auto"/>
+        <w:spacing w:before="0" w:after="60" w:line="360" w:lineRule="auto"/>
         <w:ind w:left="360" w:hanging="360"/>
         <w:jc w:val="both"/>
         <w:rPr/>
@@ -14839,7 +14809,7 @@
     </w:p>
     <w:p>
       <w:pPr>
-        <w:spacing w:before="0" w:after="8" w:line="360" w:lineRule="auto"/>
+        <w:spacing w:before="0" w:after="60" w:line="360" w:lineRule="auto"/>
         <w:ind w:left="360" w:hanging="360"/>
         <w:jc w:val="both"/>
         <w:rPr/>
@@ -17610,7 +17580,7 @@
     </w:p>
     <w:p>
       <w:pPr>
-        <w:spacing w:before="0" w:after="8" w:line="360" w:lineRule="auto"/>
+        <w:spacing w:before="0" w:after="60" w:line="360" w:lineRule="auto"/>
         <w:ind w:left="360" w:hanging="360"/>
         <w:jc w:val="both"/>
         <w:rPr/>
@@ -17632,7 +17602,7 @@
     </w:p>
     <w:p>
       <w:pPr>
-        <w:spacing w:before="0" w:after="8" w:line="360" w:lineRule="auto"/>
+        <w:spacing w:before="0" w:after="60" w:line="360" w:lineRule="auto"/>
         <w:ind w:left="360" w:hanging="360"/>
         <w:jc w:val="both"/>
         <w:rPr/>
@@ -17654,7 +17624,7 @@
     </w:p>
     <w:p>
       <w:pPr>
-        <w:spacing w:before="0" w:after="8" w:line="360" w:lineRule="auto"/>
+        <w:spacing w:before="0" w:after="60" w:line="360" w:lineRule="auto"/>
         <w:ind w:left="360" w:hanging="360"/>
         <w:jc w:val="both"/>
         <w:rPr/>
@@ -17676,7 +17646,7 @@
     </w:p>
     <w:p>
       <w:pPr>
-        <w:spacing w:before="0" w:after="8" w:line="360" w:lineRule="auto"/>
+        <w:spacing w:before="0" w:after="60" w:line="360" w:lineRule="auto"/>
         <w:ind w:left="360" w:hanging="360"/>
         <w:jc w:val="both"/>
         <w:rPr/>
@@ -17698,7 +17668,7 @@
     </w:p>
     <w:p>
       <w:pPr>
-        <w:spacing w:before="0" w:after="8" w:line="360" w:lineRule="auto"/>
+        <w:spacing w:before="0" w:after="60" w:line="360" w:lineRule="auto"/>
         <w:ind w:left="360" w:hanging="360"/>
         <w:jc w:val="both"/>
         <w:rPr/>
@@ -17720,7 +17690,7 @@
     </w:p>
     <w:p>
       <w:pPr>
-        <w:spacing w:before="0" w:after="8" w:line="360" w:lineRule="auto"/>
+        <w:spacing w:before="0" w:after="60" w:line="360" w:lineRule="auto"/>
         <w:ind w:left="360" w:hanging="360"/>
         <w:jc w:val="both"/>
         <w:rPr/>
@@ -19681,8 +19651,8 @@
     </w:tbl>
     <w:p>
       <w:pPr>
-        <w:spacing w:before="0" w:after="8" w:line="360" w:lineRule="auto"/>
-        <w:ind w:firstLine="720"/>
+        <w:spacing w:before="0" w:after="60" w:line="360" w:lineRule="auto"/>
+        <w:ind w:left="360" w:hanging="360"/>
         <w:jc w:val="both"/>
         <w:rPr/>
       </w:pPr>
@@ -19709,8 +19679,8 @@
     </w:p>
     <w:p>
       <w:pPr>
-        <w:spacing w:before="0" w:after="8" w:line="360" w:lineRule="auto"/>
-        <w:ind w:firstLine="720"/>
+        <w:spacing w:before="0" w:after="60" w:line="360" w:lineRule="auto"/>
+        <w:ind w:left="360" w:hanging="360"/>
         <w:jc w:val="both"/>
         <w:rPr/>
       </w:pPr>
@@ -19738,8 +19708,8 @@
     </w:p>
     <w:p>
       <w:pPr>
-        <w:spacing w:before="0" w:after="8" w:line="360" w:lineRule="auto"/>
-        <w:ind w:firstLine="720"/>
+        <w:spacing w:before="0" w:after="60" w:line="360" w:lineRule="auto"/>
+        <w:ind w:left="360" w:hanging="360"/>
         <w:jc w:val="both"/>
         <w:rPr/>
       </w:pPr>
@@ -19767,8 +19737,9 @@
     </w:p>
     <w:p>
       <w:pPr>
-        <w:spacing w:before="0" w:after="8" w:line="360" w:lineRule="auto"/>
-        <w:jc w:val="left"/>
+        <w:spacing w:before="0" w:after="60" w:line="360" w:lineRule="auto"/>
+        <w:ind w:left="360" w:hanging="360"/>
+        <w:jc w:val="both"/>
         <w:rPr/>
         <w:sectPr>
           <w:headerReference r:id="rId9" w:type="default"/>

</xml_diff>

<commit_message>
Draft_104: keep Combined Example on Appendix A QR page (tighten QR spacing)
</commit_message>
<xml_diff>
--- a/thesis/003_ThesisProposal_Draft_104.docx
+++ b/thesis/003_ThesisProposal_Draft_104.docx
@@ -12325,7 +12325,7 @@
     </w:p>
     <w:p>
       <w:pPr>
-        <w:spacing w:before="0" w:after="60" w:line="360" w:lineRule="auto"/>
+        <w:spacing w:before="0" w:after="20" w:line="276" w:lineRule="auto"/>
         <w:ind w:left="360" w:hanging="360"/>
         <w:jc w:val="both"/>
         <w:rPr/>
@@ -12341,7 +12341,7 @@
     </w:p>
     <w:p>
       <w:pPr>
-        <w:spacing w:before="40" w:after="20" w:line="264" w:lineRule="auto"/>
+        <w:spacing w:before="40" w:after="20" w:line="260" w:lineRule="auto"/>
         <w:jc w:val="left"/>
         <w:rPr/>
       </w:pPr>
@@ -12366,7 +12366,7 @@
     </w:p>
     <w:p>
       <w:pPr>
-        <w:spacing w:before="0" w:after="60" w:line="360" w:lineRule="auto"/>
+        <w:spacing w:before="0" w:after="20" w:line="276" w:lineRule="auto"/>
         <w:ind w:left="360" w:hanging="360"/>
         <w:jc w:val="both"/>
         <w:rPr/>
@@ -12390,6 +12390,144 @@
     </w:p>
     <w:p>
       <w:pPr>
+        <w:spacing w:before="20" w:after="20" w:line="260" w:lineRule="auto"/>
+        <w:jc w:val="left"/>
+        <w:rPr/>
+      </w:pPr>
+      <w:r>
+        <w:rPr>
+          <w:rFonts w:ascii="Georgia" w:hAnsi="Georgia" w:cs="Georgia" w:eastAsia="Georgia"/>
+          <w:sz w:val="22"/>
+          <w:szCs w:val="22"/>
+          <w:rtl w:val="0"/>
+          <w:b/>
+          <w:bCs/>
+        </w:rPr>
+        <w:t>Types</w:t>
+      </w:r>
+      <w:r>
+        <w:rPr>
+          <w:rtl w:val="0"/>
+          <w:sz w:val="22"/>
+          <w:szCs w:val="22"/>
+        </w:rPr>
+      </w:r>
+    </w:p>
+    <w:p>
+      <w:pPr>
+        <w:spacing w:before="0" w:after="20" w:line="276" w:lineRule="auto"/>
+        <w:ind w:left="360" w:hanging="360"/>
+        <w:jc w:val="both"/>
+        <w:rPr/>
+      </w:pPr>
+      <w:r>
+        <w:rPr>
+          <w:rFonts w:ascii="Georgia" w:hAnsi="Georgia" w:cs="Georgia" w:eastAsia="Georgia"/>
+          <w:sz w:val="22"/>
+          <w:szCs w:val="22"/>
+          <w:rtl w:val="0"/>
+        </w:rPr>
+        <w:t>• Modal: may, might, could, would, should, can (possibility only, not capability or obligation).</w:t>
+      </w:r>
+      <w:r>
+        <w:rPr>
+          <w:rtl w:val="0"/>
+          <w:sz w:val="22"/>
+          <w:szCs w:val="22"/>
+        </w:rPr>
+      </w:r>
+    </w:p>
+    <w:p>
+      <w:pPr>
+        <w:spacing w:before="0" w:after="20" w:line="276" w:lineRule="auto"/>
+        <w:ind w:left="360" w:hanging="360"/>
+        <w:jc w:val="both"/>
+        <w:rPr/>
+      </w:pPr>
+      <w:r>
+        <w:rPr>
+          <w:rFonts w:ascii="Georgia" w:hAnsi="Georgia" w:cs="Georgia" w:eastAsia="Georgia"/>
+          <w:i w:val="0"/>
+          <w:sz w:val="22"/>
+          <w:szCs w:val="22"/>
+          <w:rtl w:val="0"/>
+        </w:rPr>
+        <w:t>• Lexical: suggest, indicate, appear, seem, possible, likely, potential (when they qualify a claim and pass Step 2).</w:t>
+      </w:r>
+      <w:r>
+        <w:rPr>
+          <w:rtl w:val="0"/>
+          <w:sz w:val="22"/>
+          <w:szCs w:val="22"/>
+        </w:rPr>
+      </w:r>
+    </w:p>
+    <w:p>
+      <w:pPr>
+        <w:spacing w:before="0" w:after="20" w:line="276" w:lineRule="auto"/>
+        <w:ind w:left="360" w:hanging="360"/>
+        <w:jc w:val="both"/>
+        <w:rPr/>
+      </w:pPr>
+      <w:r>
+        <w:rPr>
+          <w:rFonts w:ascii="Georgia" w:hAnsi="Georgia" w:cs="Georgia" w:eastAsia="Georgia"/>
+          <w:sz w:val="22"/>
+          <w:szCs w:val="22"/>
+          <w:rtl w:val="0"/>
+        </w:rPr>
+        <w:t>• Adverbial: generally, typically, possibly, probably (scope or certainty, not procedural routine).</w:t>
+      </w:r>
+      <w:r>
+        <w:rPr>
+          <w:rtl w:val="0"/>
+          <w:sz w:val="22"/>
+          <w:szCs w:val="22"/>
+        </w:rPr>
+      </w:r>
+    </w:p>
+    <w:p>
+      <w:pPr>
+        <w:spacing w:before="0" w:after="20" w:line="276" w:lineRule="auto"/>
+        <w:ind w:left="360" w:hanging="360"/>
+        <w:jc w:val="both"/>
+        <w:rPr/>
+      </w:pPr>
+      <w:r>
+        <w:rPr>
+          <w:rFonts w:ascii="Georgia" w:hAnsi="Georgia" w:cs="Georgia" w:eastAsia="Georgia"/>
+          <w:sz w:val="22"/>
+          <w:szCs w:val="22"/>
+          <w:rtl w:val="0"/>
+        </w:rPr>
+        <w:t>• Clause-level: it seems that, it is possible that, to some extent.</w:t>
+      </w:r>
+      <w:r>
+        <w:rPr>
+          <w:rtl w:val="0"/>
+          <w:sz w:val="22"/>
+          <w:szCs w:val="22"/>
+        </w:rPr>
+      </w:r>
+    </w:p>
+    <w:p>
+      <w:pPr>
+        <w:spacing w:before="20" w:after="20" w:line="260" w:lineRule="auto"/>
+        <w:jc w:val="left"/>
+        <w:rPr/>
+      </w:pPr>
+      <w:r>
+        <w:rPr>
+          <w:rFonts w:ascii="Georgia" w:hAnsi="Georgia" w:cs="Georgia" w:eastAsia="Georgia"/>
+          <w:sz w:val="22"/>
+          <w:szCs w:val="22"/>
+          <w:rtl w:val="0"/>
+        </w:rPr>
+        <w:t xml:space="preserve">Functions: EC = uncertainty about a claim’s truth. P = interpersonal softening of a claim. FP = fails the claim condition or both checks (not a function).</w:t>
+      </w:r>
+    </w:p>
+    <w:p>
+      <w:pPr>
         <w:spacing w:before="0" w:after="0" w:line="264" w:lineRule="auto"/>
         <w:jc w:val="left"/>
         <w:rPr/>
@@ -12400,189 +12538,51 @@
           <w:sz w:val="22"/>
           <w:szCs w:val="22"/>
           <w:rtl w:val="0"/>
+        </w:rPr>
+        <w:t>Core rules: suggest/indicate finding→hedge, recommendation→FP-Rec; can/may possibility→hedge, capability→FP-Cap; generally/typically claim-limit→hedge, procedural→FP-Proc; appear/seem result-uncertainty→hedge, location→FP-Gen.</w:t>
+      </w:r>
+    </w:p>
+    <w:p>
+      <w:pPr>
+        <w:spacing w:after="0" w:before="0" w:line="264" w:lineRule="auto"/>
+      </w:pPr>
+      <w:r>
+        <w:rPr>
+          <w:rFonts w:ascii="Georgia" w:hAnsi="Georgia" w:cs="Georgia" w:eastAsia="Georgia"/>
+          <w:sz w:val="22"/>
+          <w:szCs w:val="22"/>
+        </w:rPr>
+        <w:t xml:space="preserve">Steps 1–3: Step 1 wide-net candidates. Step 2 = claim condition, then Working Test + Reader Test → EC, P, or FP. Step 3 = type on retained P and EC only.</w:t>
+      </w:r>
+    </w:p>
+    <w:p>
+      <w:pPr>
+        <w:spacing w:before="40" w:after="20" w:line="260" w:lineRule="auto"/>
+        <w:jc w:val="left"/>
+        <w:rPr/>
+      </w:pPr>
+      <w:r>
+        <w:rPr>
+          <w:rFonts w:ascii="Georgia" w:hAnsi="Georgia" w:cs="Georgia" w:eastAsia="Georgia"/>
+          <w:sz w:val="24"/>
+          <w:szCs w:val="24"/>
+          <w:rtl w:val="0"/>
           <w:b/>
           <w:bCs/>
         </w:rPr>
-        <w:t>Types</w:t>
-      </w:r>
-      <w:r>
-        <w:rPr>
-          <w:rtl w:val="0"/>
-          <w:sz w:val="22"/>
-          <w:szCs w:val="22"/>
-        </w:rPr>
-      </w:r>
-    </w:p>
-    <w:p>
-      <w:pPr>
-        <w:spacing w:before="0" w:after="60" w:line="360" w:lineRule="auto"/>
-        <w:ind w:left="360" w:hanging="360"/>
-        <w:jc w:val="both"/>
-        <w:rPr/>
-      </w:pPr>
-      <w:r>
-        <w:rPr>
-          <w:rFonts w:ascii="Georgia" w:hAnsi="Georgia" w:cs="Georgia" w:eastAsia="Georgia"/>
-          <w:sz w:val="22"/>
-          <w:szCs w:val="22"/>
-          <w:rtl w:val="0"/>
-        </w:rPr>
-        <w:t>• Modal: may, might, could, would, should, can (possibility only, not capability or obligation).</w:t>
-      </w:r>
-      <w:r>
-        <w:rPr>
-          <w:rtl w:val="0"/>
-          <w:sz w:val="22"/>
-          <w:szCs w:val="22"/>
-        </w:rPr>
-      </w:r>
-    </w:p>
-    <w:p>
-      <w:pPr>
-        <w:spacing w:before="0" w:after="60" w:line="360" w:lineRule="auto"/>
-        <w:ind w:left="360" w:hanging="360"/>
-        <w:jc w:val="both"/>
-        <w:rPr/>
-      </w:pPr>
-      <w:r>
-        <w:rPr>
-          <w:rFonts w:ascii="Georgia" w:hAnsi="Georgia" w:cs="Georgia" w:eastAsia="Georgia"/>
-          <w:i w:val="0"/>
-          <w:sz w:val="22"/>
-          <w:szCs w:val="22"/>
-          <w:rtl w:val="0"/>
-        </w:rPr>
-        <w:t>• Lexical: suggest, indicate, appear, seem, possible, likely, potential (when they qualify a claim and pass Step 2).</w:t>
-      </w:r>
-      <w:r>
-        <w:rPr>
-          <w:rtl w:val="0"/>
-          <w:sz w:val="22"/>
-          <w:szCs w:val="22"/>
-        </w:rPr>
-      </w:r>
-    </w:p>
-    <w:p>
-      <w:pPr>
-        <w:spacing w:before="0" w:after="60" w:line="360" w:lineRule="auto"/>
-        <w:ind w:left="360" w:hanging="360"/>
-        <w:jc w:val="both"/>
-        <w:rPr/>
-      </w:pPr>
-      <w:r>
-        <w:rPr>
-          <w:rFonts w:ascii="Georgia" w:hAnsi="Georgia" w:cs="Georgia" w:eastAsia="Georgia"/>
-          <w:sz w:val="22"/>
-          <w:szCs w:val="22"/>
-          <w:rtl w:val="0"/>
-        </w:rPr>
-        <w:t>• Adverbial: generally, typically, possibly, probably (scope or certainty, not procedural routine).</w:t>
-      </w:r>
-      <w:r>
-        <w:rPr>
-          <w:rtl w:val="0"/>
-          <w:sz w:val="22"/>
-          <w:szCs w:val="22"/>
-        </w:rPr>
-      </w:r>
-    </w:p>
-    <w:p>
-      <w:pPr>
-        <w:spacing w:before="0" w:after="60" w:line="360" w:lineRule="auto"/>
-        <w:ind w:left="360" w:hanging="360"/>
-        <w:jc w:val="both"/>
-        <w:rPr/>
-      </w:pPr>
-      <w:r>
-        <w:rPr>
-          <w:rFonts w:ascii="Georgia" w:hAnsi="Georgia" w:cs="Georgia" w:eastAsia="Georgia"/>
-          <w:sz w:val="22"/>
-          <w:szCs w:val="22"/>
-          <w:rtl w:val="0"/>
-        </w:rPr>
-        <w:t>• Clause-level: it seems that, it is possible that, to some extent.</w:t>
-      </w:r>
-      <w:r>
-        <w:rPr>
-          <w:rtl w:val="0"/>
-          <w:sz w:val="22"/>
-          <w:szCs w:val="22"/>
-        </w:rPr>
-      </w:r>
-    </w:p>
-    <w:p>
-      <w:pPr>
-        <w:spacing w:before="0" w:after="0" w:line="264" w:lineRule="auto"/>
-        <w:jc w:val="left"/>
-        <w:rPr/>
-      </w:pPr>
-      <w:r>
-        <w:rPr>
-          <w:rFonts w:ascii="Georgia" w:hAnsi="Georgia" w:cs="Georgia" w:eastAsia="Georgia"/>
-          <w:sz w:val="22"/>
-          <w:szCs w:val="22"/>
-          <w:rtl w:val="0"/>
-        </w:rPr>
-        <w:t xml:space="preserve">Functions: EC = uncertainty about a claim’s truth. P = interpersonal softening of a claim. FP = fails the claim condition or both checks (not a function).</w:t>
-      </w:r>
-    </w:p>
-    <w:p>
-      <w:pPr>
-        <w:spacing w:before="0" w:after="0" w:line="264" w:lineRule="auto"/>
-        <w:jc w:val="left"/>
-        <w:rPr/>
-      </w:pPr>
-      <w:r>
-        <w:rPr>
-          <w:rFonts w:ascii="Georgia" w:hAnsi="Georgia" w:cs="Georgia" w:eastAsia="Georgia"/>
-          <w:sz w:val="22"/>
-          <w:szCs w:val="22"/>
-          <w:rtl w:val="0"/>
-        </w:rPr>
-        <w:t>Core rules: suggest/indicate finding→hedge, recommendation→FP-Rec; can/may possibility→hedge, capability→FP-Cap; generally/typically claim-limit→hedge, procedural→FP-Proc; appear/seem result-uncertainty→hedge, location→FP-Gen.</w:t>
-      </w:r>
-    </w:p>
-    <w:p>
-      <w:pPr>
-        <w:spacing w:after="0" w:before="0" w:line="264" w:lineRule="auto"/>
-      </w:pPr>
-      <w:r>
-        <w:rPr>
-          <w:rFonts w:ascii="Georgia" w:hAnsi="Georgia" w:cs="Georgia" w:eastAsia="Georgia"/>
-          <w:sz w:val="22"/>
-          <w:szCs w:val="22"/>
-        </w:rPr>
-        <w:t xml:space="preserve">Steps 1–3: Step 1 wide-net candidates. Step 2 = claim condition, then Working Test + Reader Test → EC, P, or FP. Step 3 = type on retained P and EC only.</w:t>
-      </w:r>
-    </w:p>
-    <w:p>
-      <w:pPr>
-        <w:spacing w:before="60" w:after="0" w:line="288" w:lineRule="auto"/>
-        <w:jc w:val="left"/>
-        <w:rPr/>
-      </w:pPr>
-      <w:r>
-        <w:rPr>
-          <w:rFonts w:ascii="Georgia" w:hAnsi="Georgia" w:cs="Georgia" w:eastAsia="Georgia"/>
+        <w:t>QUICK-REFERENCE LEGEND</w:t>
+      </w:r>
+      <w:r>
+        <w:rPr>
+          <w:rtl w:val="0"/>
           <w:sz w:val="24"/>
           <w:szCs w:val="24"/>
-          <w:rtl w:val="0"/>
-          <w:b/>
-          <w:bCs/>
-        </w:rPr>
-        <w:t>QUICK-REFERENCE LEGEND</w:t>
-      </w:r>
-      <w:r>
-        <w:rPr>
-          <w:rtl w:val="0"/>
-          <w:sz w:val="24"/>
-          <w:szCs w:val="24"/>
-        </w:rPr>
-      </w:r>
-    </w:p>
-    <w:p>
-      <w:pPr>
-        <w:spacing w:before="0" w:after="60" w:line="360" w:lineRule="auto"/>
+        </w:rPr>
+      </w:r>
+    </w:p>
+    <w:p>
+      <w:pPr>
+        <w:spacing w:before="0" w:after="20" w:line="276" w:lineRule="auto"/>
         <w:ind w:left="360" w:hanging="360"/>
         <w:jc w:val="both"/>
         <w:rPr/>
@@ -12647,7 +12647,7 @@
           </w:tcPr>
           <w:p>
             <w:pPr>
-              <w:spacing w:before="0" w:after="0" w:line="240" w:lineRule="auto"/>
+              <w:spacing w:before="20" w:after="20" w:line="260" w:lineRule="auto"/>
               <w:jc w:val="both"/>
               <w:rPr/>
             </w:pPr>
@@ -12681,7 +12681,7 @@
           </w:tcPr>
           <w:p>
             <w:pPr>
-              <w:spacing w:before="0" w:after="0" w:line="240" w:lineRule="auto"/>
+              <w:spacing w:before="20" w:after="20" w:line="260" w:lineRule="auto"/>
               <w:jc w:val="both"/>
               <w:rPr/>
             </w:pPr>
@@ -13061,7 +13061,7 @@
           <w:tcPr/>
           <w:p>
             <w:pPr>
-              <w:spacing w:before="0" w:after="0" w:line="240" w:lineRule="auto"/>
+              <w:spacing w:before="20" w:after="20" w:line="260" w:lineRule="auto"/>
               <w:jc w:val="left"/>
               <w:rPr/>
             </w:pPr>
@@ -13122,7 +13122,7 @@
     </w:tbl>
     <w:p>
       <w:pPr>
-        <w:spacing w:before="40" w:after="0" w:line="288" w:lineRule="auto"/>
+        <w:spacing w:before="80" w:after="40" w:line="260" w:lineRule="auto"/>
         <w:jc w:val="left"/>
         <w:rPr/>
         <w:keepNext/>
@@ -13148,7 +13148,7 @@
     </w:p>
     <w:p>
       <w:pPr>
-        <w:spacing w:before="0" w:after="0" w:line="276" w:lineRule="auto"/>
+        <w:spacing w:before="0" w:after="40" w:line="260" w:lineRule="auto"/>
         <w:keepNext/>
       </w:pPr>
       <w:r>
@@ -13387,7 +13387,7 @@
     </w:p>
     <w:p>
       <w:pPr>
-        <w:spacing w:before="0" w:after="0" w:line="276" w:lineRule="auto"/>
+        <w:spacing w:before="0" w:after="40" w:line="260" w:lineRule="auto"/>
       </w:pPr>
       <w:r>
         <w:rPr>
@@ -13401,7 +13401,7 @@
     </w:p>
     <w:p>
       <w:pPr>
-        <w:spacing w:before="0" w:after="60" w:line="360" w:lineRule="auto"/>
+        <w:spacing w:before="0" w:after="20" w:line="276" w:lineRule="auto"/>
         <w:ind w:left="360" w:hanging="360"/>
         <w:jc w:val="both"/>
         <w:rPr/>

</xml_diff>

<commit_message>
Draft_104: remove Full rules in Full Codebook QR bullet
</commit_message>
<xml_diff>
--- a/thesis/003_ThesisProposal_Draft_104.docx
+++ b/thesis/003_ThesisProposal_Draft_104.docx
@@ -13397,44 +13397,6 @@
           <w:color w:val="404040"/>
         </w:rPr>
         <w:t xml:space="preserve">Shows: Lexical+Modal types; EC and P functions; FP-Cap, FP-Rec, and framing FP. Type = highlight on the token; function = colored label (EC/P); FP = strike + reason code. Not every abstract will contain P; the P slot is illustrated for coding practice.</w:t>
-      </w:r>
-    </w:p>
-    <w:p>
-      <w:pPr>
-        <w:spacing w:before="0" w:after="20" w:line="276" w:lineRule="auto"/>
-        <w:ind w:left="360" w:hanging="360"/>
-        <w:jc w:val="both"/>
-        <w:rPr/>
-      </w:pPr>
-      <w:r>
-        <w:rPr>
-          <w:rFonts w:ascii="Georgia" w:hAnsi="Georgia" w:cs="Georgia" w:eastAsia="Georgia"/>
-          <w:i w:val="1"/>
-          <w:iCs w:val="1"/>
-          <w:color w:val="404040"/>
-          <w:sz w:val="22"/>
-          <w:rtl w:val="0"/>
-          <w:szCs w:val="22"/>
-        </w:rPr>
-        <w:t>• Full rules in Full Codebook (from next page).</w:t>
-      </w:r>
-      <w:r>
-        <w:rPr>
-          <w:rFonts w:ascii="Georgia" w:cs="Georgia" w:eastAsia="Georgia" w:hAnsi="Georgia"/>
-          <w:i w:val="1"/>
-          <w:iCs w:val="1"/>
-          <w:color w:val="404040"/>
-          <w:sz w:val="22"/>
-          <w:szCs w:val="22"/>
-          <w:rtl w:val="0"/>
-        </w:rPr>
-      </w:r>
-      <w:r>
-        <w:rPr>
-          <w:rtl w:val="0"/>
-          <w:sz w:val="22"/>
-          <w:szCs w:val="22"/>
-        </w:rPr>
       </w:r>
     </w:p>
     <w:p>

</xml_diff>

<commit_message>
Draft_104: fix bold leaks (DEF terms, RP d) and body paragraph formatting
</commit_message>
<xml_diff>
--- a/thesis/003_ThesisProposal_Draft_104.docx
+++ b/thesis/003_ThesisProposal_Draft_104.docx
@@ -1463,18 +1463,14 @@
         <w:spacing w:before="0" w:after="0" w:line="480" w:lineRule="auto"/>
         <w:ind w:firstLine="720"/>
         <w:jc w:val="both"/>
-        <w:rPr/>
-      </w:pPr>
-      <w:r>
-        <w:rPr>
-          <w:rFonts w:ascii="Georgia" w:hAnsi="Georgia" w:cs="Georgia" w:eastAsia="Georgia"/>
-          <w:b w:val="0"/>
-          <w:sz w:val="22"/>
-          <w:rtl w:val="0"/>
-        </w:rPr>
-        <w:t xml:space="preserve">
-        Reliability was assessed through intra-rater agreement only. A second coder was not available for inter-rater reliability testing, which limits how far the coding scheme can be verified against an independent application of the same decision rules. That limit bears especially on the functional findings in Part III. Assigning all 65 retained hedges to Epistemic Caution may reflect one coder’s frame as much as a property of the corpus. Inter-rater coding on at least a subset of the corpus is needed before those functional results can be treated as established. Related work could apply the same Step 1–3 coding scheme to longer genres where P may appear more often and where framing-only candidates can be compared across genres.
-    </w:t>
+      </w:pPr>
+      <w:r>
+        <w:rPr>
+          <w:rFonts w:ascii="Georgia" w:hAnsi="Georgia" w:cs="Georgia" w:eastAsia="Georgia"/>
+          <w:sz w:val="24"/>
+          <w:szCs w:val="24"/>
+        </w:rPr>
+        <w:t xml:space="preserve">Reliability was assessed through intra-rater agreement only. A second coder was not available for inter-rater reliability testing, which limits how far the coding scheme can be verified against an independent application of the same decision rules. That limit bears especially on the functional findings in Part III. Assigning all 65 retained hedges to Epistemic Caution may reflect one coder’s frame as much as a property of the corpus. Inter-rater coding on at least a subset of the corpus is needed before those functional results can be treated as established. Related work could apply the same Step 1–3 coding scheme to longer genres where P may appear more often and where framing-only candidates can be compared across genres.</w:t>
       </w:r>
     </w:p>
     <w:p>
@@ -1685,16 +1681,23 @@
         <w:spacing w:before="0" w:after="0" w:line="480" w:lineRule="auto"/>
         <w:ind w:firstLine="720"/>
         <w:jc w:val="both"/>
-        <w:rPr/>
-      </w:pPr>
-      <w:r>
-        <w:rPr>
-          <w:rFonts w:ascii="Georgia" w:hAnsi="Georgia" w:cs="Georgia" w:eastAsia="Georgia"/>
-          <w:sz w:val="22"/>
-          <w:b w:val="1"/>
-          <w:bCs w:val="1"/>
-        </w:rPr>
-        <w:t xml:space="preserve">Chi-Square Test of Independence, conceptually, evaluates whether two categorical variables are associated. Operationally, this study used it to test the association between discipline and zero-hedge status (zero vs. nonzero). The test statistic is χ² = Σ [(Oᵢ − Eᵢ)² / Eᵢ], where Oᵢ is the observed frequency in cell i and Eᵢ is the expected frequency under independence. Degrees of freedom = (rows − 1) × (columns − 1). Reported values appear in the Results chapter.</w:t>
+      </w:pPr>
+      <w:r>
+        <w:rPr>
+          <w:rFonts w:ascii="Georgia" w:hAnsi="Georgia" w:cs="Georgia" w:eastAsia="Georgia"/>
+          <w:sz w:val="24"/>
+          <w:szCs w:val="24"/>
+          <w:b/>
+        </w:rPr>
+        <w:t xml:space="preserve">Chi-Square Test of Independence</w:t>
+      </w:r>
+      <w:r>
+        <w:rPr>
+          <w:rFonts w:ascii="Georgia" w:hAnsi="Georgia" w:cs="Georgia" w:eastAsia="Georgia"/>
+          <w:sz w:val="24"/>
+          <w:szCs w:val="24"/>
+        </w:rPr>
+        <w:t xml:space="preserve">, conceptually, evaluates whether two categorical variables are associated. Operationally, this study used it to test the association between discipline and zero-hedge status (zero vs. nonzero). The test statistic is χ² = Σ [(Oᵢ − Eᵢ)² / Eᵢ], where Oᵢ is the observed frequency in cell i and Eᵢ is the expected frequency under independence. Degrees of freedom = (rows − 1) × (columns − 1). Reported values appear in the Results chapter.</w:t>
       </w:r>
     </w:p>
     <w:p>
@@ -1832,16 +1835,23 @@
         <w:spacing w:before="0" w:after="0" w:line="480" w:lineRule="auto"/>
         <w:ind w:firstLine="720"/>
         <w:jc w:val="both"/>
-        <w:rPr/>
-      </w:pPr>
-      <w:r>
-        <w:rPr>
-          <w:rFonts w:ascii="Georgia" w:hAnsi="Georgia" w:cs="Georgia" w:eastAsia="Georgia"/>
-          <w:sz w:val="22"/>
-          <w:b w:val="1"/>
-          <w:bCs w:val="1"/>
-        </w:rPr>
-        <w:t xml:space="preserve">Epistemic Weight, conceptually, is the strength of the writer’s commitment to the truth of a proposition (how certain or tentative the claim is). Operationally, Step 2 first requires a claim: a statement about data, the world, or prior work that evidence could show to be wrong. Aims, directives, and routine procedure are excluded by kind. The Working Test then asks whether removing the device raises commitment to that claim’s truth (EC). The Reader Test asks whether commitment stays the same but the claim reaches the reader more bluntly or the writer takes sole ownership against prior work (P). Non-claims and tokens that meet neither check are FP, not a function.</w:t>
+      </w:pPr>
+      <w:r>
+        <w:rPr>
+          <w:rFonts w:ascii="Georgia" w:hAnsi="Georgia" w:cs="Georgia" w:eastAsia="Georgia"/>
+          <w:sz w:val="24"/>
+          <w:szCs w:val="24"/>
+          <w:b/>
+        </w:rPr>
+        <w:t xml:space="preserve">Epistemic Weight</w:t>
+      </w:r>
+      <w:r>
+        <w:rPr>
+          <w:rFonts w:ascii="Georgia" w:hAnsi="Georgia" w:cs="Georgia" w:eastAsia="Georgia"/>
+          <w:sz w:val="24"/>
+          <w:szCs w:val="24"/>
+        </w:rPr>
+        <w:t xml:space="preserve">, conceptually, is the strength of the writer’s commitment to the truth of a proposition (how certain or tentative the claim is). Operationally, Step 2 first requires a claim: a statement about data, the world, or prior work that evidence could show to be wrong. Aims, directives, and routine procedure are excluded by kind. The Working Test then asks whether removing the device raises commitment to that claim’s truth (EC). The Reader Test asks whether commitment stays the same but the claim reaches the reader more bluntly or the writer takes sole ownership against prior work (P). Non-claims and tokens that meet neither check are FP, not a function.</w:t>
       </w:r>
     </w:p>
     <w:p>
@@ -1849,25 +1859,23 @@
         <w:spacing w:before="0" w:after="0" w:line="480" w:lineRule="auto"/>
         <w:ind w:firstLine="720"/>
         <w:jc w:val="both"/>
-        <w:rPr/>
-      </w:pPr>
-      <w:r>
-        <w:rPr>
-          <w:rFonts w:ascii="Georgia" w:hAnsi="Georgia" w:cs="Georgia" w:eastAsia="Georgia"/>
-          <w:sz w:val="22"/>
-          <w:b w:val="1"/>
-          <w:bCs w:val="1"/>
-        </w:rPr>
-        <w:t xml:space="preserve">Hedge Function, conceptually, refers to the rhetorical purpose a hedging device serves in its discourse context. Operationally, this study uses two function labels only, adapted from Hyland’s (1998) discussion of hedging functions (not a fixed published taxonomy): Epistemic Caution (EC), which expresses reduced commitment to a claim’s truth or accuracy, and Politeness/Deference (P), which shows interpersonal softening toward readers or prior research. False positives are a residual coding record, not a function.</w:t>
-      </w:r>
-      <w:r>
-        <w:rPr>
-          <w:rFonts w:ascii="Georgia" w:hAnsi="Georgia" w:cs="Georgia" w:eastAsia="Georgia"/>
-          <w:sz w:val="22"/>
-          <w:b w:val="0"/>
-          <w:bCs w:val="0"/>
-        </w:rPr>
-        <w:t xml:space="preserve"/>
+      </w:pPr>
+      <w:r>
+        <w:rPr>
+          <w:rFonts w:ascii="Georgia" w:hAnsi="Georgia" w:cs="Georgia" w:eastAsia="Georgia"/>
+          <w:sz w:val="24"/>
+          <w:szCs w:val="24"/>
+          <w:b/>
+        </w:rPr>
+        <w:t xml:space="preserve">Hedge Function</w:t>
+      </w:r>
+      <w:r>
+        <w:rPr>
+          <w:rFonts w:ascii="Georgia" w:hAnsi="Georgia" w:cs="Georgia" w:eastAsia="Georgia"/>
+          <w:sz w:val="24"/>
+          <w:szCs w:val="24"/>
+        </w:rPr>
+        <w:t xml:space="preserve">, conceptually, refers to the rhetorical purpose a hedging device serves in its discourse context. Operationally, this study uses two function labels only, adapted from Hyland’s (1998) discussion of hedging functions (not a fixed published taxonomy): Epistemic Caution (EC), which expresses reduced commitment to a claim’s truth or accuracy, and Politeness/Deference (P), which shows interpersonal softening toward readers or prior research. False positives are a residual coding record, not a function.</w:t>
       </w:r>
     </w:p>
     <w:p>
@@ -1901,16 +1909,23 @@
         <w:spacing w:before="0" w:after="0" w:line="480" w:lineRule="auto"/>
         <w:ind w:firstLine="720"/>
         <w:jc w:val="both"/>
-        <w:rPr/>
-      </w:pPr>
-      <w:r>
-        <w:rPr>
-          <w:rFonts w:ascii="Georgia" w:hAnsi="Georgia" w:cs="Georgia" w:eastAsia="Georgia"/>
-          <w:sz w:val="22"/>
-          <w:b w:val="1"/>
-          <w:bCs w:val="1"/>
-        </w:rPr>
-        <w:t xml:space="preserve">Kruskal-Wallis Test, conceptually, is a non-parametric rank-based alternative to one-way ANOVA for comparing distributions across three or more independent groups. Operationally, this study applied it to per-abstract hedge rates (hedges per 100 words) across the three disciplines. The test statistic is H = [12 / (N(N+1))] × Σ (Rⱼ² / nⱼ) − 3(N+1), where N is the total number of observations, nⱼ is the size of group j, and Rⱼ is the sum of ranks for group j. Reported values appear in the Results chapter.</w:t>
+      </w:pPr>
+      <w:r>
+        <w:rPr>
+          <w:rFonts w:ascii="Georgia" w:hAnsi="Georgia" w:cs="Georgia" w:eastAsia="Georgia"/>
+          <w:sz w:val="24"/>
+          <w:szCs w:val="24"/>
+          <w:b/>
+        </w:rPr>
+        <w:t xml:space="preserve">Kruskal-Wallis Test</w:t>
+      </w:r>
+      <w:r>
+        <w:rPr>
+          <w:rFonts w:ascii="Georgia" w:hAnsi="Georgia" w:cs="Georgia" w:eastAsia="Georgia"/>
+          <w:sz w:val="24"/>
+          <w:szCs w:val="24"/>
+        </w:rPr>
+        <w:t xml:space="preserve">, conceptually, is a non-parametric rank-based alternative to one-way ANOVA for comparing distributions across three or more independent groups. Operationally, this study applied it to per-abstract hedge rates (hedges per 100 words) across the three disciplines. The test statistic is H = [12 / (N(N+1))] × Σ (Rⱼ² / nⱼ) − 3(N+1), where N is the total number of observations, nⱼ is the size of group j, and Rⱼ is the sum of ranks for group j. Reported values appear in the Results chapter.</w:t>
       </w:r>
     </w:p>
     <w:p>
@@ -1944,16 +1959,23 @@
         <w:spacing w:before="0" w:after="0" w:line="480" w:lineRule="auto"/>
         <w:ind w:firstLine="720"/>
         <w:jc w:val="both"/>
-        <w:rPr/>
-      </w:pPr>
-      <w:r>
-        <w:rPr>
-          <w:rFonts w:ascii="Georgia" w:hAnsi="Georgia" w:cs="Georgia" w:eastAsia="Georgia"/>
-          <w:sz w:val="22"/>
-          <w:b w:val="1"/>
-          <w:bCs w:val="1"/>
-        </w:rPr>
-        <w:t xml:space="preserve">Mann-Whitney U Test, conceptually, is a non-parametric test that compares the distributions of a continuous or ordinal variable between two independent groups. Operationally, this study used it as a post hoc follow-up after the Kruskal-Wallis test, comparing per-abstract hedge rates (hedges per 100 words) for each pair of disciplines. The test statistic is U = n₁n₂ + [n₁(n₁+1)]/2 − R₁, where n₁ and n₂ are the sample sizes of the two groups and R₁ is the sum of ranks for group 1. A Bonferroni correction for three pairwise tests set α = .017. Reported pairwise results appear in the Results chapter.</w:t>
+      </w:pPr>
+      <w:r>
+        <w:rPr>
+          <w:rFonts w:ascii="Georgia" w:hAnsi="Georgia" w:cs="Georgia" w:eastAsia="Georgia"/>
+          <w:sz w:val="24"/>
+          <w:szCs w:val="24"/>
+          <w:b/>
+        </w:rPr>
+        <w:t xml:space="preserve">Mann-Whitney U Test</w:t>
+      </w:r>
+      <w:r>
+        <w:rPr>
+          <w:rFonts w:ascii="Georgia" w:hAnsi="Georgia" w:cs="Georgia" w:eastAsia="Georgia"/>
+          <w:sz w:val="24"/>
+          <w:szCs w:val="24"/>
+        </w:rPr>
+        <w:t xml:space="preserve">, conceptually, is a non-parametric test that compares the distributions of a continuous or ordinal variable between two independent groups. Operationally, this study used it as a post hoc follow-up after the Kruskal-Wallis test, comparing per-abstract hedge rates (hedges per 100 words) for each pair of disciplines. The test statistic is U = n₁n₂ + [n₁(n₁+1)]/2 − R₁, where n₁ and n₂ are the sample sizes of the two groups and R₁ is the sum of ranks for group 1. A Bonferroni correction for three pairwise tests set α = .017. Reported pairwise results appear in the Results chapter.</w:t>
       </w:r>
     </w:p>
     <w:p>
@@ -2065,16 +2087,23 @@
         <w:spacing w:before="0" w:after="0" w:line="480" w:lineRule="auto"/>
         <w:ind w:firstLine="720"/>
         <w:jc w:val="both"/>
-        <w:rPr/>
-      </w:pPr>
-      <w:r>
-        <w:rPr>
-          <w:rFonts w:ascii="Georgia" w:hAnsi="Georgia" w:cs="Georgia" w:eastAsia="Georgia"/>
-          <w:sz w:val="22"/>
-          <w:b w:val="1"/>
-          <w:bCs w:val="1"/>
-        </w:rPr>
-        <w:t xml:space="preserve">Softening, conceptually, is the reduction of force, directness, imposition, or interpersonal impact in a statement. Operationally, Step 2 tracks softening only on claims (statements about data, the world, or prior work that evidence could show to be wrong). Retained hedges are labeled EC and/or P only, by the Working Test and Reader Test after the claim condition. FP is not a function label. Aims, directives, and routine procedure fail the claim condition by kind and are logged FP even if no category pre-filter is applied. P = 0 in this study refers to reader-oriented softening of claims, not to softened directives.</w:t>
+      </w:pPr>
+      <w:r>
+        <w:rPr>
+          <w:rFonts w:ascii="Georgia" w:hAnsi="Georgia" w:cs="Georgia" w:eastAsia="Georgia"/>
+          <w:sz w:val="24"/>
+          <w:szCs w:val="24"/>
+          <w:b/>
+        </w:rPr>
+        <w:t xml:space="preserve">Softening</w:t>
+      </w:r>
+      <w:r>
+        <w:rPr>
+          <w:rFonts w:ascii="Georgia" w:hAnsi="Georgia" w:cs="Georgia" w:eastAsia="Georgia"/>
+          <w:sz w:val="24"/>
+          <w:szCs w:val="24"/>
+        </w:rPr>
+        <w:t xml:space="preserve">, conceptually, is the reduction of force, directness, imposition, or interpersonal impact in a statement. Operationally, Step 2 tracks softening only on claims (statements about data, the world, or prior work that evidence could show to be wrong). Retained hedges are labeled EC and/or P only, by the Working Test and Reader Test after the claim condition. FP is not a function label. Aims, directives, and routine procedure fail the claim condition by kind and are logged FP even if no category pre-filter is applied. P = 0 in this study refers to reader-oriented softening of claims, not to softened directives.</w:t>
       </w:r>
     </w:p>
     <w:p>
@@ -2471,28 +2500,23 @@
         <w:spacing w:before="0" w:after="0" w:line="480" w:lineRule="auto"/>
         <w:ind w:firstLine="720"/>
         <w:jc w:val="both"/>
-        <w:rPr/>
-      </w:pPr>
-      <w:r>
-        <w:rPr>
-          <w:rFonts w:ascii="Georgia" w:hAnsi="Georgia" w:cs="Georgia" w:eastAsia="Georgia"/>
-          <w:sz w:val="22"/>
-          <w:b w:val="1"/>
-          <w:bCs w:val="1"/>
-        </w:rPr>
-        <w:t xml:space="preserve">
-        d. Pilot Testing and Reliability Checking. 
-        A pilot test was conducted on 4 abstracts not included in the final corpus to establish the overall coding scheme (see Appendix A). Decision rules for boundary cases were refined during main-corpus coding as specific ambiguities appeared and logged in the codebook. After the codebook was finalized, the full corpus was re-coded under the final rule set. The intra-rater reliability check (second pass on 6 abstracts) used that same final codebook. Pilot abstracts were drawn from the PSAU library archives but from theses whose hard-bound submission year was before 2023, keeping them outside the study’s inclusion window. To ensure reliability, the study employed a two-step verification process. First, intra-rater consistency was checked by double-coding approximately 10% of the corpus (6 abstracts, 2 per discipline) after a one-week interval, yielding 95% exact agreement (Cohen’s κ = 0.89, indicating almost perfect agreement per Landis &amp; Koch, 1977). Second, the coded data were reviewed by the thesis adviser to verify consistency and accuracy. This approach combined intra-rater reliability with adviser-supervised validation, which was the standard practice for single-researcher undergraduate projects. Discrepancies were resolved through discussion and consensus.
-    </w:t>
-      </w:r>
-      <w:r>
-        <w:rPr>
-          <w:rFonts w:ascii="Georgia" w:hAnsi="Georgia" w:cs="Georgia" w:eastAsia="Georgia"/>
-          <w:sz w:val="22"/>
-          <w:b w:val="0"/>
-          <w:bCs w:val="0"/>
-        </w:rPr>
-        <w:t/>
+      </w:pPr>
+      <w:r>
+        <w:rPr>
+          <w:rFonts w:ascii="Georgia" w:hAnsi="Georgia" w:cs="Georgia" w:eastAsia="Georgia"/>
+          <w:sz w:val="24"/>
+          <w:szCs w:val="24"/>
+          <w:b/>
+        </w:rPr>
+        <w:t xml:space="preserve">d. Pilot Testing and Reliability Checking. </w:t>
+      </w:r>
+      <w:r>
+        <w:rPr>
+          <w:rFonts w:ascii="Georgia" w:hAnsi="Georgia" w:cs="Georgia" w:eastAsia="Georgia"/>
+          <w:sz w:val="24"/>
+          <w:szCs w:val="24"/>
+        </w:rPr>
+        <w:t xml:space="preserve">A pilot test was conducted on 4 abstracts not included in the final corpus to establish the overall coding scheme (see Appendix A). Decision rules for boundary cases were refined during main-corpus coding as specific ambiguities appeared and logged in the codebook. After the codebook was finalized, the full corpus was re-coded under the final rule set. The intra-rater reliability check (second pass on 6 abstracts) used that same final codebook. Pilot abstracts were drawn from the PSAU library archives but from theses whose hard-bound submission year was before 2023, keeping them outside the study’s inclusion window. To ensure reliability, the study employed a two-step verification process. First, intra-rater consistency was checked by double-coding approximately 10% of the corpus (6 abstracts, 2 per discipline) after a one-week interval, yielding 95% exact agreement (Cohen’s κ = 0.89, indicating almost perfect agreement per Landis &amp; Koch, 1977). Second, the coded data were reviewed by the thesis adviser to verify consistency and accuracy. This approach combined intra-rater reliability with adviser-supervised validation, which was the standard practice for single-researcher undergraduate projects. Discrepancies were resolved through discussion and consensus.</w:t>
       </w:r>
     </w:p>
     <w:p>
@@ -10084,27 +10108,14 @@
         <w:spacing w:before="0" w:after="0" w:line="480" w:lineRule="auto"/>
         <w:ind w:firstLine="720"/>
         <w:jc w:val="both"/>
-        <w:rPr/>
-      </w:pPr>
-      <w:r>
-        <w:rPr>
-          <w:rFonts w:ascii="Georgia" w:hAnsi="Georgia" w:cs="Georgia" w:eastAsia="Georgia"/>
-          <w:b w:val="0"/>
-          <w:bCs w:val="0"/>
-          <w:i w:val="0"/>
-          <w:iCs w:val="0"/>
-          <w:sz w:val="22"/>
-          <w:szCs w:val="22"/>
-          <w:rtl w:val="0"/>
-        </w:rPr>
-        <w:t xml:space="preserve">
-        The relationship between hedge type and function further illuminates the patterns. Modal verbs (21 instances, all EC) were used almost exclusively to express possibility about results or implications, as in “the biosynthesis.. may affect the overall development.” Lexical hedges (41 instances, all EC) were used to qualify the strength of findings, as in “results suggest that fermented banana peel.. can significantly enhance growth.” All retained hedges were coded Epistemic Caution at Step 2. In this sample no P candidates entered the retained set. Framing and sequencing forms that failed both removal checks sit outside the retained set. They are not included in the 58 category-coded FPs (FP-Gen, FP-Rec, FP-Cap, FP-Proc). The data support a claim about the functional profile of the retained set, not a claim that writers never mitigate interpersonally outside that set.
-    </w:t>
-      </w:r>
-      <w:r>
-        <w:rPr>
-          <w:rtl w:val="0"/>
-        </w:rPr>
+      </w:pPr>
+      <w:r>
+        <w:rPr>
+          <w:rFonts w:ascii="Georgia" w:hAnsi="Georgia" w:cs="Georgia" w:eastAsia="Georgia"/>
+          <w:sz w:val="24"/>
+          <w:szCs w:val="24"/>
+        </w:rPr>
+        <w:t xml:space="preserve">The relationship between hedge type and function further illuminates the patterns. Modal verbs (21 instances, all EC) were used almost exclusively to express possibility about results or implications, as in “the biosynthesis.. may affect the overall development.” Lexical hedges (41 instances, all EC) were used to qualify the strength of findings, as in “results suggest that fermented banana peel.. can significantly enhance growth.” All retained hedges were coded Epistemic Caution at Step 2. In this sample no P candidates entered the retained set. Framing and sequencing forms that failed both removal checks sit outside the retained set. They are not included in the 58 category-coded FPs (FP-Gen, FP-Rec, FP-Cap, FP-Proc). The data support a claim about the functional profile of the retained set, not a claim that writers never mitigate interpersonally outside that set.</w:t>
       </w:r>
     </w:p>
     <w:p>
@@ -13020,19 +13031,27 @@
           </w:p>
           <w:p>
             <w:pPr>
-              <w:spacing w:before="0" w:after="0" w:line="240" w:lineRule="auto"/>
+              <w:spacing w:before="0" w:after="20" w:line="260" w:lineRule="auto"/>
               <w:jc w:val="both"/>
+            </w:pPr>
+            <w:r>
+              <w:rPr>
+                <w:rFonts w:ascii="Georgia" w:hAnsi="Georgia" w:cs="Georgia" w:eastAsia="Georgia"/>
+                <w:sz w:val="24"/>
+                <w:szCs w:val="24"/>
+              </w:rPr>
+              <w:t xml:space="preserve">R = Result, G = Generalization, C = Causal. Bracket the subtype beside the mark.</w:t>
+            </w:r>
+          </w:p>
+        </w:tc>
+        <w:tc>
+          <w:tcPr/>
+          <w:p>
+            <w:pPr>
+              <w:spacing w:before="20" w:after="20" w:line="260" w:lineRule="auto"/>
+              <w:jc w:val="left"/>
               <w:rPr/>
             </w:pPr>
-            <w:r>
-              <w:rPr>
-                <w:rFonts w:ascii="Georgia" w:cs="Georgia" w:eastAsia="Georgia" w:hAnsi="Georgia"/>
-                <w:sz w:val="18"/>
-                <w:szCs w:val="18"/>
-                <w:rtl w:val="0"/>
-              </w:rPr>
-              <w:t xml:space="preserve">      </w:t>
-            </w:r>
             <w:r>
               <w:rPr>
                 <w:rFonts w:ascii="Georgia" w:cs="Georgia" w:eastAsia="Georgia" w:hAnsi="Georgia"/>
@@ -13045,7 +13064,7 @@
                 <w:b/>
                 <w:bCs/>
               </w:rPr>
-              <w:t xml:space="preserve">  R = Result, G = Generalization, C = Causal. Bracket the subtype beside the mark.</w:t>
+              <w:t xml:space="preserve">FALSE POSITIVE (Strikethrough)</w:t>
             </w:r>
             <w:r>
               <w:rPr>
@@ -13056,65 +13075,18 @@
               </w:rPr>
             </w:r>
           </w:p>
-        </w:tc>
-        <w:tc>
-          <w:tcPr/>
-          <w:p>
-            <w:pPr>
-              <w:spacing w:before="20" w:after="20" w:line="260" w:lineRule="auto"/>
-              <w:jc w:val="left"/>
-              <w:rPr/>
-            </w:pPr>
-            <w:r>
-              <w:rPr>
-                <w:rFonts w:ascii="Georgia" w:cs="Georgia" w:eastAsia="Georgia" w:hAnsi="Georgia"/>
-                <w:i w:val="0"/>
-                <w:iCs w:val="0"/>
-                <w:color w:val="000000"/>
-                <w:sz w:val="18"/>
-                <w:szCs w:val="18"/>
-                <w:rtl w:val="0"/>
-                <w:b/>
-                <w:bCs/>
-              </w:rPr>
-              <w:t xml:space="preserve">FALSE POSITIVE (Strikethrough)</w:t>
-            </w:r>
-            <w:r>
-              <w:rPr>
-                <w:rtl w:val="0"/>
-                <w:sz w:val="18"/>
-                <w:szCs w:val="18"/>
-                <w:rFonts w:ascii="Georgia" w:hAnsi="Georgia"/>
-              </w:rPr>
-            </w:r>
-          </w:p>
-          <w:p>
-            <w:pPr>
-              <w:spacing w:before="0" w:after="0" w:line="240" w:lineRule="auto"/>
+          <w:p>
+            <w:pPr>
+              <w:spacing w:before="0" w:after="20" w:line="260" w:lineRule="auto"/>
               <w:jc w:val="both"/>
-              <w:rPr/>
-            </w:pPr>
-            <w:r>
-              <w:rPr>
-                <w:rFonts w:ascii="Georgia" w:cs="Georgia" w:eastAsia="Georgia" w:hAnsi="Georgia"/>
-                <w:i w:val="0"/>
-                <w:iCs w:val="0"/>
-                <w:color w:val="000000"/>
-                <w:sz w:val="18"/>
-                <w:szCs w:val="18"/>
-                <w:rtl w:val="0"/>
-                <w:b/>
-                <w:bCs/>
+            </w:pPr>
+            <w:r>
+              <w:rPr>
+                <w:rFonts w:ascii="Georgia" w:hAnsi="Georgia" w:cs="Georgia" w:eastAsia="Georgia"/>
+                <w:sz w:val="24"/>
+                <w:szCs w:val="24"/>
               </w:rPr>
               <w:t xml:space="preserve">No highlight. Strike through the token and write the reason code in grey text.</w:t>
-            </w:r>
-            <w:r>
-              <w:rPr>
-                <w:rtl w:val="0"/>
-                <w:sz w:val="18"/>
-                <w:szCs w:val="18"/>
-                <w:rFonts w:ascii="Georgia" w:hAnsi="Georgia"/>
-              </w:rPr>
             </w:r>
           </w:p>
         </w:tc>

</xml_diff>

<commit_message>
Draft_104: set stray body paragraphs to 11pt to match body standard
</commit_message>
<xml_diff>
--- a/thesis/003_ThesisProposal_Draft_104.docx
+++ b/thesis/003_ThesisProposal_Draft_104.docx
@@ -918,17 +918,18 @@
           <w:bCs w:val="0"/>
           <w:i w:val="0"/>
           <w:iCs w:val="0"/>
-          <w:sz w:val="24"/>
-          <w:szCs w:val="24"/>
+          <w:sz w:val="22"/>
+          <w:szCs w:val="22"/>
           <w:rtl w:val="0"/>
         </w:rPr>
         <w:t>3. Among the hedging devices identified, what rhetorical functions do they serve?</w:t>
       </w:r>
       <w:r>
         <w:rPr>
-          <w:rtl w:val="0"/>
-          <w:sz w:val="24"/>
-          <w:szCs w:val="24"/>
+          <w:rFonts w:ascii="Georgia" w:hAnsi="Georgia" w:cs="Georgia" w:eastAsia="Georgia"/>
+          <w:rtl w:val="0"/>
+          <w:sz w:val="22"/>
+          <w:szCs w:val="22"/>
         </w:rPr>
       </w:r>
     </w:p>
@@ -1467,8 +1468,8 @@
       <w:r>
         <w:rPr>
           <w:rFonts w:ascii="Georgia" w:hAnsi="Georgia" w:cs="Georgia" w:eastAsia="Georgia"/>
-          <w:sz w:val="24"/>
-          <w:szCs w:val="24"/>
+          <w:sz w:val="22"/>
+          <w:szCs w:val="22"/>
         </w:rPr>
         <w:t xml:space="preserve">Reliability was assessed through intra-rater agreement only. A second coder was not available for inter-rater reliability testing, which limits how far the coding scheme can be verified against an independent application of the same decision rules. That limit bears especially on the functional findings in Part III. Assigning all 65 retained hedges to Epistemic Caution may reflect one coder’s frame as much as a property of the corpus. Inter-rater coding on at least a subset of the corpus is needed before those functional results can be treated as established. Related work could apply the same Step 1–3 coding scheme to longer genres where P may appear more often and where framing-only candidates can be compared across genres.</w:t>
       </w:r>
@@ -1685,8 +1686,8 @@
       <w:r>
         <w:rPr>
           <w:rFonts w:ascii="Georgia" w:hAnsi="Georgia" w:cs="Georgia" w:eastAsia="Georgia"/>
-          <w:sz w:val="24"/>
-          <w:szCs w:val="24"/>
+          <w:sz w:val="22"/>
+          <w:szCs w:val="22"/>
           <w:b/>
         </w:rPr>
         <w:t xml:space="preserve">Chi-Square Test of Independence</w:t>
@@ -1694,8 +1695,8 @@
       <w:r>
         <w:rPr>
           <w:rFonts w:ascii="Georgia" w:hAnsi="Georgia" w:cs="Georgia" w:eastAsia="Georgia"/>
-          <w:sz w:val="24"/>
-          <w:szCs w:val="24"/>
+          <w:sz w:val="22"/>
+          <w:szCs w:val="22"/>
         </w:rPr>
         <w:t xml:space="preserve">, conceptually, evaluates whether two categorical variables are associated. Operationally, this study used it to test the association between discipline and zero-hedge status (zero vs. nonzero). The test statistic is χ² = Σ [(Oᵢ − Eᵢ)² / Eᵢ], where Oᵢ is the observed frequency in cell i and Eᵢ is the expected frequency under independence. Degrees of freedom = (rows − 1) × (columns − 1). Reported values appear in the Results chapter.</w:t>
       </w:r>
@@ -1839,8 +1840,8 @@
       <w:r>
         <w:rPr>
           <w:rFonts w:ascii="Georgia" w:hAnsi="Georgia" w:cs="Georgia" w:eastAsia="Georgia"/>
-          <w:sz w:val="24"/>
-          <w:szCs w:val="24"/>
+          <w:sz w:val="22"/>
+          <w:szCs w:val="22"/>
           <w:b/>
         </w:rPr>
         <w:t xml:space="preserve">Epistemic Weight</w:t>
@@ -1848,8 +1849,8 @@
       <w:r>
         <w:rPr>
           <w:rFonts w:ascii="Georgia" w:hAnsi="Georgia" w:cs="Georgia" w:eastAsia="Georgia"/>
-          <w:sz w:val="24"/>
-          <w:szCs w:val="24"/>
+          <w:sz w:val="22"/>
+          <w:szCs w:val="22"/>
         </w:rPr>
         <w:t xml:space="preserve">, conceptually, is the strength of the writer’s commitment to the truth of a proposition (how certain or tentative the claim is). Operationally, Step 2 first requires a claim: a statement about data, the world, or prior work that evidence could show to be wrong. Aims, directives, and routine procedure are excluded by kind. The Working Test then asks whether removing the device raises commitment to that claim’s truth (EC). The Reader Test asks whether commitment stays the same but the claim reaches the reader more bluntly or the writer takes sole ownership against prior work (P). Non-claims and tokens that meet neither check are FP, not a function.</w:t>
       </w:r>
@@ -1863,8 +1864,8 @@
       <w:r>
         <w:rPr>
           <w:rFonts w:ascii="Georgia" w:hAnsi="Georgia" w:cs="Georgia" w:eastAsia="Georgia"/>
-          <w:sz w:val="24"/>
-          <w:szCs w:val="24"/>
+          <w:sz w:val="22"/>
+          <w:szCs w:val="22"/>
           <w:b/>
         </w:rPr>
         <w:t xml:space="preserve">Hedge Function</w:t>
@@ -1872,8 +1873,8 @@
       <w:r>
         <w:rPr>
           <w:rFonts w:ascii="Georgia" w:hAnsi="Georgia" w:cs="Georgia" w:eastAsia="Georgia"/>
-          <w:sz w:val="24"/>
-          <w:szCs w:val="24"/>
+          <w:sz w:val="22"/>
+          <w:szCs w:val="22"/>
         </w:rPr>
         <w:t xml:space="preserve">, conceptually, refers to the rhetorical purpose a hedging device serves in its discourse context. Operationally, this study uses two function labels only, adapted from Hyland’s (1998) discussion of hedging functions (not a fixed published taxonomy): Epistemic Caution (EC), which expresses reduced commitment to a claim’s truth or accuracy, and Politeness/Deference (P), which shows interpersonal softening toward readers or prior research. False positives are a residual coding record, not a function.</w:t>
       </w:r>
@@ -1913,8 +1914,8 @@
       <w:r>
         <w:rPr>
           <w:rFonts w:ascii="Georgia" w:hAnsi="Georgia" w:cs="Georgia" w:eastAsia="Georgia"/>
-          <w:sz w:val="24"/>
-          <w:szCs w:val="24"/>
+          <w:sz w:val="22"/>
+          <w:szCs w:val="22"/>
           <w:b/>
         </w:rPr>
         <w:t xml:space="preserve">Kruskal-Wallis Test</w:t>
@@ -1922,8 +1923,8 @@
       <w:r>
         <w:rPr>
           <w:rFonts w:ascii="Georgia" w:hAnsi="Georgia" w:cs="Georgia" w:eastAsia="Georgia"/>
-          <w:sz w:val="24"/>
-          <w:szCs w:val="24"/>
+          <w:sz w:val="22"/>
+          <w:szCs w:val="22"/>
         </w:rPr>
         <w:t xml:space="preserve">, conceptually, is a non-parametric rank-based alternative to one-way ANOVA for comparing distributions across three or more independent groups. Operationally, this study applied it to per-abstract hedge rates (hedges per 100 words) across the three disciplines. The test statistic is H = [12 / (N(N+1))] × Σ (Rⱼ² / nⱼ) − 3(N+1), where N is the total number of observations, nⱼ is the size of group j, and Rⱼ is the sum of ranks for group j. Reported values appear in the Results chapter.</w:t>
       </w:r>
@@ -1963,8 +1964,8 @@
       <w:r>
         <w:rPr>
           <w:rFonts w:ascii="Georgia" w:hAnsi="Georgia" w:cs="Georgia" w:eastAsia="Georgia"/>
-          <w:sz w:val="24"/>
-          <w:szCs w:val="24"/>
+          <w:sz w:val="22"/>
+          <w:szCs w:val="22"/>
           <w:b/>
         </w:rPr>
         <w:t xml:space="preserve">Mann-Whitney U Test</w:t>
@@ -1972,8 +1973,8 @@
       <w:r>
         <w:rPr>
           <w:rFonts w:ascii="Georgia" w:hAnsi="Georgia" w:cs="Georgia" w:eastAsia="Georgia"/>
-          <w:sz w:val="24"/>
-          <w:szCs w:val="24"/>
+          <w:sz w:val="22"/>
+          <w:szCs w:val="22"/>
         </w:rPr>
         <w:t xml:space="preserve">, conceptually, is a non-parametric test that compares the distributions of a continuous or ordinal variable between two independent groups. Operationally, this study used it as a post hoc follow-up after the Kruskal-Wallis test, comparing per-abstract hedge rates (hedges per 100 words) for each pair of disciplines. The test statistic is U = n₁n₂ + [n₁(n₁+1)]/2 − R₁, where n₁ and n₂ are the sample sizes of the two groups and R₁ is the sum of ranks for group 1. A Bonferroni correction for three pairwise tests set α = .017. Reported pairwise results appear in the Results chapter.</w:t>
       </w:r>
@@ -2091,8 +2092,8 @@
       <w:r>
         <w:rPr>
           <w:rFonts w:ascii="Georgia" w:hAnsi="Georgia" w:cs="Georgia" w:eastAsia="Georgia"/>
-          <w:sz w:val="24"/>
-          <w:szCs w:val="24"/>
+          <w:sz w:val="22"/>
+          <w:szCs w:val="22"/>
           <w:b/>
         </w:rPr>
         <w:t xml:space="preserve">Softening</w:t>
@@ -2100,8 +2101,8 @@
       <w:r>
         <w:rPr>
           <w:rFonts w:ascii="Georgia" w:hAnsi="Georgia" w:cs="Georgia" w:eastAsia="Georgia"/>
-          <w:sz w:val="24"/>
-          <w:szCs w:val="24"/>
+          <w:sz w:val="22"/>
+          <w:szCs w:val="22"/>
         </w:rPr>
         <w:t xml:space="preserve">, conceptually, is the reduction of force, directness, imposition, or interpersonal impact in a statement. Operationally, Step 2 tracks softening only on claims (statements about data, the world, or prior work that evidence could show to be wrong). Retained hedges are labeled EC and/or P only, by the Working Test and Reader Test after the claim condition. FP is not a function label. Aims, directives, and routine procedure fail the claim condition by kind and are logged FP even if no category pre-filter is applied. P = 0 in this study refers to reader-oriented softening of claims, not to softened directives.</w:t>
       </w:r>
@@ -2504,8 +2505,8 @@
       <w:r>
         <w:rPr>
           <w:rFonts w:ascii="Georgia" w:hAnsi="Georgia" w:cs="Georgia" w:eastAsia="Georgia"/>
-          <w:sz w:val="24"/>
-          <w:szCs w:val="24"/>
+          <w:sz w:val="22"/>
+          <w:szCs w:val="22"/>
           <w:b/>
         </w:rPr>
         <w:t xml:space="preserve">d. Pilot Testing and Reliability Checking. </w:t>
@@ -2513,8 +2514,8 @@
       <w:r>
         <w:rPr>
           <w:rFonts w:ascii="Georgia" w:hAnsi="Georgia" w:cs="Georgia" w:eastAsia="Georgia"/>
-          <w:sz w:val="24"/>
-          <w:szCs w:val="24"/>
+          <w:sz w:val="22"/>
+          <w:szCs w:val="22"/>
         </w:rPr>
         <w:t xml:space="preserve">A pilot test was conducted on 4 abstracts not included in the final corpus to establish the overall coding scheme (see Appendix A). Decision rules for boundary cases were refined during main-corpus coding as specific ambiguities appeared and logged in the codebook. After the codebook was finalized, the full corpus was re-coded under the final rule set. The intra-rater reliability check (second pass on 6 abstracts) used that same final codebook. Pilot abstracts were drawn from the PSAU library archives but from theses whose hard-bound submission year was before 2023, keeping them outside the study’s inclusion window. To ensure reliability, the study employed a two-step verification process. First, intra-rater consistency was checked by double-coding approximately 10% of the corpus (6 abstracts, 2 per discipline) after a one-week interval, yielding 95% exact agreement (Cohen’s κ = 0.89, indicating almost perfect agreement per Landis &amp; Koch, 1977). Second, the coded data were reviewed by the thesis adviser to verify consistency and accuracy. This approach combined intra-rater reliability with adviser-supervised validation, which was the standard practice for single-researcher undergraduate projects. Discrepancies were resolved through discussion and consensus.</w:t>
       </w:r>
@@ -10112,8 +10113,8 @@
       <w:r>
         <w:rPr>
           <w:rFonts w:ascii="Georgia" w:hAnsi="Georgia" w:cs="Georgia" w:eastAsia="Georgia"/>
-          <w:sz w:val="24"/>
-          <w:szCs w:val="24"/>
+          <w:sz w:val="22"/>
+          <w:szCs w:val="22"/>
         </w:rPr>
         <w:t xml:space="preserve">The relationship between hedge type and function further illuminates the patterns. Modal verbs (21 instances, all EC) were used almost exclusively to express possibility about results or implications, as in “the biosynthesis.. may affect the overall development.” Lexical hedges (41 instances, all EC) were used to qualify the strength of findings, as in “results suggest that fermented banana peel.. can significantly enhance growth.” All retained hedges were coded Epistemic Caution at Step 2. In this sample no P candidates entered the retained set. Framing and sequencing forms that failed both removal checks sit outside the retained set. They are not included in the 58 category-coded FPs (FP-Gen, FP-Rec, FP-Cap, FP-Proc). The data support a claim about the functional profile of the retained set, not a claim that writers never mitigate interpersonally outside that set.</w:t>
       </w:r>

</xml_diff>

<commit_message>
Draft_104: tighten Appendix A QR so Combined Example stays on first page
</commit_message>
<xml_diff>
--- a/thesis/003_ThesisProposal_Draft_104.docx
+++ b/thesis/003_ThesisProposal_Draft_104.docx
@@ -12287,7 +12287,7 @@
     <w:p>
       <w:pPr>
         <w:keepNext w:val="1"/>
-        <w:spacing w:before="240" w:after="240" w:line="240" w:lineRule="auto"/>
+        <w:spacing w:before="0" w:after="40" w:line="240" w:lineRule="auto"/>
         <w:jc w:val="center"/>
         <w:rPr/>
       </w:pPr>
@@ -12312,7 +12312,7 @@
     </w:p>
     <w:p>
       <w:pPr>
-        <w:spacing w:before="40" w:after="20" w:line="264" w:lineRule="auto"/>
+        <w:spacing w:before="0" w:after="40" w:line="240" w:lineRule="auto"/>
         <w:jc w:val="left"/>
         <w:rPr/>
       </w:pPr>
@@ -12337,8 +12337,8 @@
     </w:p>
     <w:p>
       <w:pPr>
-        <w:spacing w:before="0" w:after="20" w:line="276" w:lineRule="auto"/>
-        <w:ind w:left="360" w:hanging="360"/>
+        <w:spacing w:before="0" w:after="0" w:line="240" w:lineRule="auto"/>
+        <w:ind w:left="288" w:hanging="288"/>
         <w:jc w:val="both"/>
         <w:rPr/>
       </w:pPr>
@@ -12353,7 +12353,7 @@
     </w:p>
     <w:p>
       <w:pPr>
-        <w:spacing w:before="40" w:after="20" w:line="260" w:lineRule="auto"/>
+        <w:spacing w:before="40" w:after="20" w:line="240" w:lineRule="auto"/>
         <w:jc w:val="left"/>
         <w:rPr/>
       </w:pPr>
@@ -12378,8 +12378,8 @@
     </w:p>
     <w:p>
       <w:pPr>
-        <w:spacing w:before="0" w:after="20" w:line="276" w:lineRule="auto"/>
-        <w:ind w:left="360" w:hanging="360"/>
+        <w:spacing w:before="0" w:after="0" w:line="240" w:lineRule="auto"/>
+        <w:ind w:left="288" w:hanging="288"/>
         <w:jc w:val="both"/>
         <w:rPr/>
       </w:pPr>
@@ -12402,7 +12402,7 @@
     </w:p>
     <w:p>
       <w:pPr>
-        <w:spacing w:before="20" w:after="20" w:line="260" w:lineRule="auto"/>
+        <w:spacing w:before="20" w:after="0" w:line="240" w:lineRule="auto"/>
         <w:jc w:val="left"/>
         <w:rPr/>
       </w:pPr>
@@ -12427,8 +12427,8 @@
     </w:p>
     <w:p>
       <w:pPr>
-        <w:spacing w:before="0" w:after="20" w:line="276" w:lineRule="auto"/>
-        <w:ind w:left="360" w:hanging="360"/>
+        <w:spacing w:before="0" w:after="0" w:line="240" w:lineRule="auto"/>
+        <w:ind w:left="288" w:hanging="288"/>
         <w:jc w:val="both"/>
         <w:rPr/>
       </w:pPr>
@@ -12451,8 +12451,8 @@
     </w:p>
     <w:p>
       <w:pPr>
-        <w:spacing w:before="0" w:after="20" w:line="276" w:lineRule="auto"/>
-        <w:ind w:left="360" w:hanging="360"/>
+        <w:spacing w:before="0" w:after="0" w:line="240" w:lineRule="auto"/>
+        <w:ind w:left="288" w:hanging="288"/>
         <w:jc w:val="both"/>
         <w:rPr/>
       </w:pPr>
@@ -12476,8 +12476,8 @@
     </w:p>
     <w:p>
       <w:pPr>
-        <w:spacing w:before="0" w:after="20" w:line="276" w:lineRule="auto"/>
-        <w:ind w:left="360" w:hanging="360"/>
+        <w:spacing w:before="0" w:after="0" w:line="240" w:lineRule="auto"/>
+        <w:ind w:left="288" w:hanging="288"/>
         <w:jc w:val="both"/>
         <w:rPr/>
       </w:pPr>
@@ -12500,8 +12500,8 @@
     </w:p>
     <w:p>
       <w:pPr>
-        <w:spacing w:before="0" w:after="20" w:line="276" w:lineRule="auto"/>
-        <w:ind w:left="360" w:hanging="360"/>
+        <w:spacing w:before="0" w:after="0" w:line="240" w:lineRule="auto"/>
+        <w:ind w:left="288" w:hanging="288"/>
         <w:jc w:val="both"/>
         <w:rPr/>
       </w:pPr>
@@ -12524,7 +12524,7 @@
     </w:p>
     <w:p>
       <w:pPr>
-        <w:spacing w:before="20" w:after="20" w:line="260" w:lineRule="auto"/>
+        <w:spacing w:before="20" w:after="0" w:line="240" w:lineRule="auto"/>
         <w:jc w:val="left"/>
         <w:rPr/>
       </w:pPr>
@@ -12540,7 +12540,7 @@
     </w:p>
     <w:p>
       <w:pPr>
-        <w:spacing w:before="0" w:after="0" w:line="264" w:lineRule="auto"/>
+        <w:spacing w:before="0" w:after="0" w:line="240" w:lineRule="auto"/>
         <w:jc w:val="left"/>
         <w:rPr/>
       </w:pPr>
@@ -12556,7 +12556,7 @@
     </w:p>
     <w:p>
       <w:pPr>
-        <w:spacing w:after="0" w:before="0" w:line="264" w:lineRule="auto"/>
+        <w:spacing w:after="0" w:before="0" w:line="240" w:lineRule="auto"/>
       </w:pPr>
       <w:r>
         <w:rPr>
@@ -12569,7 +12569,7 @@
     </w:p>
     <w:p>
       <w:pPr>
-        <w:spacing w:before="40" w:after="20" w:line="260" w:lineRule="auto"/>
+        <w:spacing w:before="40" w:after="20" w:line="240" w:lineRule="auto"/>
         <w:jc w:val="left"/>
         <w:rPr/>
       </w:pPr>
@@ -12594,8 +12594,8 @@
     </w:p>
     <w:p>
       <w:pPr>
-        <w:spacing w:before="0" w:after="20" w:line="276" w:lineRule="auto"/>
-        <w:ind w:left="360" w:hanging="360"/>
+        <w:spacing w:before="0" w:after="0" w:line="240" w:lineRule="auto"/>
+        <w:ind w:left="288" w:hanging="288"/>
         <w:jc w:val="both"/>
         <w:rPr/>
       </w:pPr>
@@ -12659,7 +12659,7 @@
           </w:tcPr>
           <w:p>
             <w:pPr>
-              <w:spacing w:before="20" w:after="20" w:line="260" w:lineRule="auto"/>
+              <w:spacing w:before="20" w:after="0" w:line="240" w:lineRule="auto"/>
               <w:jc w:val="both"/>
               <w:rPr/>
             </w:pPr>
@@ -12693,7 +12693,7 @@
           </w:tcPr>
           <w:p>
             <w:pPr>
-              <w:spacing w:before="20" w:after="20" w:line="260" w:lineRule="auto"/>
+              <w:spacing w:before="20" w:after="0" w:line="240" w:lineRule="auto"/>
               <w:jc w:val="both"/>
               <w:rPr/>
             </w:pPr>
@@ -13003,7 +13003,7 @@
           <w:tcPr/>
           <w:p>
             <w:pPr>
-              <w:spacing w:before="0" w:after="0" w:line="240" w:lineRule="auto"/>
+              <w:spacing w:before="20" w:after="0" w:line="240" w:lineRule="auto"/>
               <w:jc w:val="left"/>
               <w:rPr/>
             </w:pPr>
@@ -13032,7 +13032,7 @@
           </w:p>
           <w:p>
             <w:pPr>
-              <w:spacing w:before="0" w:after="20" w:line="260" w:lineRule="auto"/>
+              <w:spacing w:before="0" w:after="0" w:line="220" w:lineRule="auto"/>
               <w:jc w:val="both"/>
             </w:pPr>
             <w:r>
@@ -13049,7 +13049,7 @@
           <w:tcPr/>
           <w:p>
             <w:pPr>
-              <w:spacing w:before="20" w:after="20" w:line="260" w:lineRule="auto"/>
+              <w:spacing w:before="20" w:after="0" w:line="240" w:lineRule="auto"/>
               <w:jc w:val="left"/>
               <w:rPr/>
             </w:pPr>
@@ -13078,7 +13078,7 @@
           </w:p>
           <w:p>
             <w:pPr>
-              <w:spacing w:before="0" w:after="20" w:line="260" w:lineRule="auto"/>
+              <w:spacing w:before="0" w:after="0" w:line="220" w:lineRule="auto"/>
               <w:jc w:val="both"/>
             </w:pPr>
             <w:r>
@@ -13095,7 +13095,7 @@
     </w:tbl>
     <w:p>
       <w:pPr>
-        <w:spacing w:before="80" w:after="40" w:line="260" w:lineRule="auto"/>
+        <w:spacing w:before="40" w:after="20" w:line="240" w:lineRule="auto"/>
         <w:jc w:val="left"/>
         <w:rPr/>
         <w:keepNext/>
@@ -13121,7 +13121,7 @@
     </w:p>
     <w:p>
       <w:pPr>
-        <w:spacing w:before="0" w:after="40" w:line="260" w:lineRule="auto"/>
+        <w:spacing w:before="0" w:after="20" w:line="240" w:lineRule="auto"/>
         <w:keepNext/>
       </w:pPr>
       <w:r>
@@ -13360,7 +13360,7 @@
     </w:p>
     <w:p>
       <w:pPr>
-        <w:spacing w:before="0" w:after="40" w:line="260" w:lineRule="auto"/>
+        <w:spacing w:before="0" w:after="40" w:line="240" w:lineRule="auto"/>
       </w:pPr>
       <w:r>
         <w:rPr>

</xml_diff>

<commit_message>
Draft_104: unify Full Codebook bullet/note spacing (QR/QRL untouched)
</commit_message>
<xml_diff>
--- a/thesis/003_ThesisProposal_Draft_104.docx
+++ b/thesis/003_ThesisProposal_Draft_104.docx
@@ -13374,12 +13374,13 @@
     </w:p>
     <w:p>
       <w:pPr>
-        <w:spacing w:before="120" w:after="14" w:line="360" w:lineRule="auto"/>
+        <w:spacing w:before="80" w:after="20" w:line="276" w:lineRule="auto"/>
         <w:jc w:val="left"/>
         <w:rPr/>
       </w:pPr>
       <w:r>
         <w:rPr>
+          <w:rFonts w:ascii="Georgia" w:hAnsi="Georgia" w:cs="Georgia" w:eastAsia="Georgia"/>
           <w:sz w:val="22"/>
           <w:szCs w:val="22"/>
         </w:rPr>
@@ -13398,15 +13399,16 @@
       </w:r>
       <w:r>
         <w:rPr>
-          <w:rtl w:val="0"/>
-          <w:sz w:val="22"/>
-          <w:szCs w:val="22"/>
-        </w:rPr>
-      </w:r>
-    </w:p>
-    <w:p>
-      <w:pPr>
-        <w:spacing w:before="40" w:after="14" w:line="360" w:lineRule="auto"/>
+          <w:rFonts w:ascii="Georgia" w:hAnsi="Georgia" w:cs="Georgia" w:eastAsia="Georgia"/>
+          <w:rtl w:val="0"/>
+          <w:sz w:val="22"/>
+          <w:szCs w:val="22"/>
+        </w:rPr>
+      </w:r>
+    </w:p>
+    <w:p>
+      <w:pPr>
+        <w:spacing w:before="80" w:after="20" w:line="276" w:lineRule="auto"/>
         <w:jc w:val="left"/>
         <w:rPr/>
       </w:pPr>
@@ -13423,15 +13425,16 @@
       </w:r>
       <w:r>
         <w:rPr>
-          <w:rtl w:val="0"/>
-          <w:sz w:val="22"/>
-          <w:szCs w:val="22"/>
-        </w:rPr>
-      </w:r>
-    </w:p>
-    <w:p>
-      <w:pPr>
-        <w:spacing w:before="0" w:after="60" w:line="360" w:lineRule="auto"/>
+          <w:rFonts w:ascii="Georgia" w:hAnsi="Georgia" w:cs="Georgia" w:eastAsia="Georgia"/>
+          <w:rtl w:val="0"/>
+          <w:sz w:val="22"/>
+          <w:szCs w:val="22"/>
+        </w:rPr>
+      </w:r>
+    </w:p>
+    <w:p>
+      <w:pPr>
+        <w:spacing w:before="0" w:after="40" w:line="276" w:lineRule="auto"/>
         <w:ind w:left="360" w:hanging="360"/>
         <w:jc w:val="both"/>
         <w:rPr/>
@@ -13449,6 +13452,7 @@
       </w:r>
       <w:r>
         <w:rPr>
+          <w:rFonts w:ascii="Georgia" w:hAnsi="Georgia" w:cs="Georgia" w:eastAsia="Georgia"/>
           <w:rtl w:val="0"/>
           <w:sz w:val="20"/>
           <w:szCs w:val="20"/>
@@ -13457,7 +13461,7 @@
     </w:p>
     <w:p>
       <w:pPr>
-        <w:spacing w:before="40" w:after="14" w:line="360" w:lineRule="auto"/>
+        <w:spacing w:before="80" w:after="20" w:line="276" w:lineRule="auto"/>
         <w:jc w:val="left"/>
         <w:rPr/>
       </w:pPr>
@@ -13474,15 +13478,16 @@
       </w:r>
       <w:r>
         <w:rPr>
-          <w:rtl w:val="0"/>
-          <w:sz w:val="22"/>
-          <w:szCs w:val="22"/>
-        </w:rPr>
-      </w:r>
-    </w:p>
-    <w:p>
-      <w:pPr>
-        <w:spacing w:before="0" w:after="60" w:line="360" w:lineRule="auto"/>
+          <w:rFonts w:ascii="Georgia" w:hAnsi="Georgia" w:cs="Georgia" w:eastAsia="Georgia"/>
+          <w:rtl w:val="0"/>
+          <w:sz w:val="22"/>
+          <w:szCs w:val="22"/>
+        </w:rPr>
+      </w:r>
+    </w:p>
+    <w:p>
+      <w:pPr>
+        <w:spacing w:before="0" w:after="40" w:line="276" w:lineRule="auto"/>
         <w:ind w:left="360" w:hanging="360"/>
         <w:jc w:val="both"/>
         <w:rPr/>
@@ -13525,6 +13530,7 @@
       </w:r>
       <w:r>
         <w:rPr>
+          <w:rFonts w:ascii="Georgia" w:hAnsi="Georgia" w:cs="Georgia" w:eastAsia="Georgia"/>
           <w:rtl w:val="0"/>
           <w:sz w:val="20"/>
           <w:szCs w:val="20"/>
@@ -13533,7 +13539,7 @@
     </w:p>
     <w:p>
       <w:pPr>
-        <w:spacing w:before="0" w:after="60" w:line="360" w:lineRule="auto"/>
+        <w:spacing w:before="0" w:after="40" w:line="276" w:lineRule="auto"/>
         <w:ind w:left="360" w:hanging="360"/>
         <w:jc w:val="both"/>
         <w:rPr/>
@@ -13552,7 +13558,7 @@
     </w:p>
     <w:p>
       <w:pPr>
-        <w:spacing w:before="0" w:after="60" w:line="360" w:lineRule="auto"/>
+        <w:spacing w:before="0" w:after="40" w:line="276" w:lineRule="auto"/>
         <w:ind w:left="360" w:hanging="360"/>
         <w:jc w:val="both"/>
         <w:rPr/>
@@ -13571,7 +13577,7 @@
     </w:p>
     <w:p>
       <w:pPr>
-        <w:spacing w:before="0" w:after="60" w:line="360" w:lineRule="auto"/>
+        <w:spacing w:before="0" w:after="40" w:line="276" w:lineRule="auto"/>
         <w:ind w:left="360" w:hanging="360"/>
         <w:jc w:val="both"/>
         <w:rPr/>
@@ -13634,6 +13640,7 @@
       </w:r>
       <w:r>
         <w:rPr>
+          <w:rFonts w:ascii="Georgia" w:hAnsi="Georgia" w:cs="Georgia" w:eastAsia="Georgia"/>
           <w:rtl w:val="0"/>
           <w:sz w:val="20"/>
           <w:szCs w:val="20"/>
@@ -13642,7 +13649,7 @@
     </w:p>
     <w:p>
       <w:pPr>
-        <w:spacing w:before="0" w:after="60" w:line="360" w:lineRule="auto"/>
+        <w:spacing w:before="0" w:after="40" w:line="276" w:lineRule="auto"/>
         <w:ind w:left="360" w:hanging="360"/>
         <w:jc w:val="both"/>
         <w:rPr/>
@@ -13661,7 +13668,7 @@
     </w:p>
     <w:p>
       <w:pPr>
-        <w:spacing w:before="40" w:after="14" w:line="360" w:lineRule="auto"/>
+        <w:spacing w:before="80" w:after="20" w:line="276" w:lineRule="auto"/>
         <w:jc w:val="left"/>
         <w:rPr/>
       </w:pPr>
@@ -13680,6 +13687,7 @@
       </w:r>
       <w:r>
         <w:rPr>
+          <w:rFonts w:ascii="Georgia" w:hAnsi="Georgia" w:cs="Georgia" w:eastAsia="Georgia"/>
           <w:rtl w:val="0"/>
           <w:b w:val="1"/>
           <w:sz w:val="22"/>
@@ -13689,7 +13697,7 @@
     </w:p>
     <w:p>
       <w:pPr>
-        <w:spacing w:before="0" w:after="60" w:line="360" w:lineRule="auto"/>
+        <w:spacing w:before="0" w:after="40" w:line="276" w:lineRule="auto"/>
         <w:ind w:left="360" w:hanging="360"/>
         <w:jc w:val="both"/>
         <w:rPr/>
@@ -13708,7 +13716,7 @@
     </w:p>
     <w:p>
       <w:pPr>
-        <w:spacing w:before="0" w:after="60" w:line="360" w:lineRule="auto"/>
+        <w:spacing w:before="0" w:after="40" w:line="276" w:lineRule="auto"/>
         <w:ind w:left="360" w:hanging="360"/>
         <w:jc w:val="both"/>
         <w:rPr/>
@@ -13727,7 +13735,7 @@
     </w:p>
     <w:p>
       <w:pPr>
-        <w:spacing w:before="0" w:after="60" w:line="360" w:lineRule="auto"/>
+        <w:spacing w:before="0" w:after="40" w:line="276" w:lineRule="auto"/>
         <w:ind w:left="360" w:hanging="360"/>
         <w:jc w:val="both"/>
         <w:rPr/>
@@ -13745,6 +13753,7 @@
       </w:r>
       <w:r>
         <w:rPr>
+          <w:rFonts w:ascii="Georgia" w:hAnsi="Georgia" w:cs="Georgia" w:eastAsia="Georgia"/>
           <w:rtl w:val="0"/>
           <w:sz w:val="20"/>
           <w:szCs w:val="20"/>
@@ -13753,7 +13762,7 @@
     </w:p>
     <w:p>
       <w:pPr>
-        <w:spacing w:before="0" w:after="60" w:line="360" w:lineRule="auto"/>
+        <w:spacing w:before="0" w:after="40" w:line="276" w:lineRule="auto"/>
         <w:ind w:left="360" w:hanging="360"/>
         <w:jc w:val="both"/>
         <w:rPr/>
@@ -13772,7 +13781,7 @@
     </w:p>
     <w:p>
       <w:pPr>
-        <w:spacing w:before="0" w:after="60" w:line="360" w:lineRule="auto"/>
+        <w:spacing w:before="0" w:after="40" w:line="276" w:lineRule="auto"/>
         <w:ind w:left="360" w:hanging="360"/>
         <w:jc w:val="both"/>
         <w:rPr/>
@@ -13792,6 +13801,7 @@
       </w:r>
       <w:r>
         <w:rPr>
+          <w:rFonts w:ascii="Georgia" w:hAnsi="Georgia" w:cs="Georgia" w:eastAsia="Georgia"/>
           <w:rtl w:val="0"/>
           <w:sz w:val="20"/>
           <w:szCs w:val="20"/>
@@ -13800,7 +13810,7 @@
     </w:p>
     <w:p>
       <w:pPr>
-        <w:spacing w:before="0" w:after="60" w:line="360" w:lineRule="auto"/>
+        <w:spacing w:before="0" w:after="40" w:line="276" w:lineRule="auto"/>
         <w:ind w:left="360" w:hanging="360"/>
         <w:jc w:val="both"/>
         <w:rPr/>
@@ -13820,6 +13830,7 @@
       </w:r>
       <w:r>
         <w:rPr>
+          <w:rFonts w:ascii="Georgia" w:hAnsi="Georgia" w:cs="Georgia" w:eastAsia="Georgia"/>
           <w:rtl w:val="0"/>
           <w:sz w:val="20"/>
           <w:szCs w:val="20"/>
@@ -13828,7 +13839,7 @@
     </w:p>
     <w:p>
       <w:pPr>
-        <w:spacing w:before="0" w:after="60" w:line="360" w:lineRule="auto"/>
+        <w:spacing w:before="0" w:after="40" w:line="276" w:lineRule="auto"/>
         <w:ind w:left="360" w:hanging="360"/>
         <w:jc w:val="both"/>
         <w:rPr/>
@@ -13847,7 +13858,7 @@
     </w:p>
     <w:p>
       <w:pPr>
-        <w:spacing w:before="0" w:after="60" w:line="360" w:lineRule="auto"/>
+        <w:spacing w:before="0" w:after="40" w:line="276" w:lineRule="auto"/>
         <w:ind w:left="360" w:hanging="360"/>
         <w:jc w:val="both"/>
         <w:rPr/>
@@ -13866,7 +13877,7 @@
     </w:p>
     <w:p>
       <w:pPr>
-        <w:spacing w:before="40" w:after="14" w:line="360" w:lineRule="auto"/>
+        <w:spacing w:before="80" w:after="20" w:line="276" w:lineRule="auto"/>
         <w:jc w:val="left"/>
         <w:rPr/>
       </w:pPr>
@@ -13883,16 +13894,17 @@
       </w:r>
       <w:r>
         <w:rPr>
-          <w:rtl w:val="0"/>
-          <w:sz w:val="22"/>
-          <w:szCs w:val="22"/>
-        </w:rPr>
-      </w:r>
-    </w:p>
-    <w:p>
-      <w:pPr>
-        <w:spacing w:before="0" w:after="8" w:line="360" w:lineRule="auto"/>
-        <w:ind w:firstLine="720"/>
+          <w:rFonts w:ascii="Georgia" w:hAnsi="Georgia" w:cs="Georgia" w:eastAsia="Georgia"/>
+          <w:rtl w:val="0"/>
+          <w:sz w:val="22"/>
+          <w:szCs w:val="22"/>
+        </w:rPr>
+      </w:r>
+    </w:p>
+    <w:p>
+      <w:pPr>
+        <w:spacing w:before="0" w:after="40" w:line="276" w:lineRule="auto"/>
+        <w:ind w:left="360"/>
         <w:jc w:val="both"/>
         <w:rPr/>
       </w:pPr>
@@ -13911,6 +13923,7 @@
       </w:r>
       <w:r>
         <w:rPr>
+          <w:rFonts w:ascii="Georgia" w:hAnsi="Georgia" w:cs="Georgia" w:eastAsia="Georgia"/>
           <w:rtl w:val="0"/>
           <w:sz w:val="20"/>
           <w:szCs w:val="20"/>
@@ -14689,8 +14702,8 @@
     </w:tbl>
     <w:p>
       <w:pPr>
-        <w:spacing w:before="0" w:after="8" w:line="360" w:lineRule="auto"/>
-        <w:ind/>
+        <w:spacing w:before="0" w:after="40" w:line="276" w:lineRule="auto"/>
+        <w:ind w:left="360"/>
         <w:jc w:val="both"/>
         <w:rPr/>
       </w:pPr>
@@ -14736,6 +14749,7 @@
       </w:r>
       <w:r>
         <w:rPr>
+          <w:rFonts w:ascii="Georgia" w:hAnsi="Georgia" w:cs="Georgia" w:eastAsia="Georgia"/>
           <w:rtl w:val="0"/>
           <w:sz w:val="20"/>
           <w:szCs w:val="20"/>
@@ -14744,7 +14758,7 @@
     </w:p>
     <w:p>
       <w:pPr>
-        <w:spacing w:before="0" w:after="60" w:line="360" w:lineRule="auto"/>
+        <w:spacing w:before="0" w:after="40" w:line="276" w:lineRule="auto"/>
         <w:ind w:left="360" w:hanging="360"/>
         <w:jc w:val="both"/>
         <w:rPr/>
@@ -14928,6 +14942,7 @@
       </w:r>
       <w:r>
         <w:rPr>
+          <w:rFonts w:ascii="Georgia" w:hAnsi="Georgia" w:cs="Georgia" w:eastAsia="Georgia"/>
           <w:rtl w:val="0"/>
           <w:sz w:val="20"/>
           <w:szCs w:val="20"/>
@@ -15672,7 +15687,7 @@
     </w:tbl>
     <w:p>
       <w:pPr>
-        <w:spacing w:before="40" w:after="14" w:line="360" w:lineRule="auto"/>
+        <w:spacing w:before="80" w:after="20" w:line="276" w:lineRule="auto"/>
         <w:jc w:val="left"/>
         <w:rPr/>
       </w:pPr>
@@ -15689,16 +15704,17 @@
       </w:r>
       <w:r>
         <w:rPr>
-          <w:rtl w:val="0"/>
-          <w:sz w:val="22"/>
-          <w:szCs w:val="22"/>
-        </w:rPr>
-      </w:r>
-    </w:p>
-    <w:p>
-      <w:pPr>
-        <w:spacing w:before="0" w:after="8" w:line="360" w:lineRule="auto"/>
-        <w:ind w:firstLine="720"/>
+          <w:rFonts w:ascii="Georgia" w:hAnsi="Georgia" w:cs="Georgia" w:eastAsia="Georgia"/>
+          <w:rtl w:val="0"/>
+          <w:sz w:val="22"/>
+          <w:szCs w:val="22"/>
+        </w:rPr>
+      </w:r>
+    </w:p>
+    <w:p>
+      <w:pPr>
+        <w:spacing w:before="0" w:after="40" w:line="276" w:lineRule="auto"/>
+        <w:ind w:left="360"/>
         <w:jc w:val="both"/>
         <w:rPr/>
       </w:pPr>
@@ -16584,8 +16600,8 @@
     </w:tbl>
     <w:p>
       <w:pPr>
-        <w:spacing w:before="0" w:after="8" w:line="360" w:lineRule="auto"/>
-        <w:ind w:firstLine="720"/>
+        <w:spacing w:before="0" w:after="40" w:line="276" w:lineRule="auto"/>
+        <w:ind w:left="360"/>
         <w:jc w:val="both"/>
         <w:rPr/>
       </w:pPr>
@@ -16619,6 +16635,7 @@
       </w:r>
       <w:r>
         <w:rPr>
+          <w:rFonts w:ascii="Georgia" w:hAnsi="Georgia" w:cs="Georgia" w:eastAsia="Georgia"/>
           <w:rtl w:val="0"/>
           <w:sz w:val="20"/>
           <w:szCs w:val="20"/>
@@ -16627,8 +16644,8 @@
     </w:p>
     <w:p>
       <w:pPr>
-        <w:spacing w:before="0" w:after="8" w:line="360" w:lineRule="auto"/>
-        <w:ind w:firstLine="720"/>
+        <w:spacing w:before="0" w:after="40" w:line="276" w:lineRule="auto"/>
+        <w:ind w:left="360"/>
         <w:jc w:val="both"/>
         <w:rPr/>
       </w:pPr>
@@ -16676,6 +16693,7 @@
       </w:r>
       <w:r>
         <w:rPr>
+          <w:rFonts w:ascii="Georgia" w:hAnsi="Georgia" w:cs="Georgia" w:eastAsia="Georgia"/>
           <w:rtl w:val="0"/>
           <w:sz w:val="20"/>
           <w:szCs w:val="20"/>
@@ -16684,7 +16702,7 @@
     </w:p>
     <w:p>
       <w:pPr>
-        <w:spacing w:before="40" w:after="14" w:line="360" w:lineRule="auto"/>
+        <w:spacing w:before="80" w:after="20" w:line="276" w:lineRule="auto"/>
         <w:jc w:val="left"/>
         <w:rPr/>
       </w:pPr>
@@ -16701,16 +16719,17 @@
       </w:r>
       <w:r>
         <w:rPr>
-          <w:rtl w:val="0"/>
-          <w:sz w:val="22"/>
-          <w:szCs w:val="22"/>
-        </w:rPr>
-      </w:r>
-    </w:p>
-    <w:p>
-      <w:pPr>
-        <w:spacing w:before="0" w:after="8" w:line="360" w:lineRule="auto"/>
-        <w:ind w:firstLine="720"/>
+          <w:rFonts w:ascii="Georgia" w:hAnsi="Georgia" w:cs="Georgia" w:eastAsia="Georgia"/>
+          <w:rtl w:val="0"/>
+          <w:sz w:val="22"/>
+          <w:szCs w:val="22"/>
+        </w:rPr>
+      </w:r>
+    </w:p>
+    <w:p>
+      <w:pPr>
+        <w:spacing w:before="0" w:after="40" w:line="276" w:lineRule="auto"/>
+        <w:ind w:left="360"/>
         <w:jc w:val="both"/>
         <w:rPr/>
       </w:pPr>
@@ -16729,6 +16748,7 @@
       </w:r>
       <w:r>
         <w:rPr>
+          <w:rFonts w:ascii="Georgia" w:hAnsi="Georgia" w:cs="Georgia" w:eastAsia="Georgia"/>
           <w:rtl w:val="0"/>
           <w:sz w:val="20"/>
           <w:szCs w:val="20"/>
@@ -17515,7 +17535,7 @@
     </w:p>
     <w:p>
       <w:pPr>
-        <w:spacing w:before="0" w:after="60" w:line="360" w:lineRule="auto"/>
+        <w:spacing w:before="0" w:after="40" w:line="276" w:lineRule="auto"/>
         <w:ind w:left="360" w:hanging="360"/>
         <w:jc w:val="both"/>
         <w:rPr/>
@@ -17537,7 +17557,7 @@
     </w:p>
     <w:p>
       <w:pPr>
-        <w:spacing w:before="0" w:after="60" w:line="360" w:lineRule="auto"/>
+        <w:spacing w:before="0" w:after="40" w:line="276" w:lineRule="auto"/>
         <w:ind w:left="360" w:hanging="360"/>
         <w:jc w:val="both"/>
         <w:rPr/>
@@ -17559,7 +17579,7 @@
     </w:p>
     <w:p>
       <w:pPr>
-        <w:spacing w:before="0" w:after="60" w:line="360" w:lineRule="auto"/>
+        <w:spacing w:before="0" w:after="40" w:line="276" w:lineRule="auto"/>
         <w:ind w:left="360" w:hanging="360"/>
         <w:jc w:val="both"/>
         <w:rPr/>
@@ -17581,7 +17601,7 @@
     </w:p>
     <w:p>
       <w:pPr>
-        <w:spacing w:before="0" w:after="60" w:line="360" w:lineRule="auto"/>
+        <w:spacing w:before="0" w:after="40" w:line="276" w:lineRule="auto"/>
         <w:ind w:left="360" w:hanging="360"/>
         <w:jc w:val="both"/>
         <w:rPr/>
@@ -17603,7 +17623,7 @@
     </w:p>
     <w:p>
       <w:pPr>
-        <w:spacing w:before="0" w:after="60" w:line="360" w:lineRule="auto"/>
+        <w:spacing w:before="0" w:after="40" w:line="276" w:lineRule="auto"/>
         <w:ind w:left="360" w:hanging="360"/>
         <w:jc w:val="both"/>
         <w:rPr/>
@@ -17625,7 +17645,7 @@
     </w:p>
     <w:p>
       <w:pPr>
-        <w:spacing w:before="0" w:after="60" w:line="360" w:lineRule="auto"/>
+        <w:spacing w:before="0" w:after="40" w:line="276" w:lineRule="auto"/>
         <w:ind w:left="360" w:hanging="360"/>
         <w:jc w:val="both"/>
         <w:rPr/>
@@ -18196,7 +18216,7 @@
     </w:tbl>
     <w:p>
       <w:pPr>
-        <w:spacing w:before="40" w:after="14" w:line="360" w:lineRule="auto"/>
+        <w:spacing w:before="80" w:after="20" w:line="276" w:lineRule="auto"/>
         <w:jc w:val="left"/>
         <w:rPr/>
       </w:pPr>
@@ -18213,6 +18233,7 @@
       </w:r>
       <w:r>
         <w:rPr>
+          <w:rFonts w:ascii="Georgia" w:hAnsi="Georgia" w:cs="Georgia" w:eastAsia="Georgia"/>
           <w:rtl w:val="0"/>
           <w:sz w:val="22"/>
           <w:szCs w:val="22"/>
@@ -19586,7 +19607,7 @@
     </w:tbl>
     <w:p>
       <w:pPr>
-        <w:spacing w:before="0" w:after="60" w:line="360" w:lineRule="auto"/>
+        <w:spacing w:before="0" w:after="40" w:line="276" w:lineRule="auto"/>
         <w:ind w:left="360" w:hanging="360"/>
         <w:jc w:val="both"/>
         <w:rPr/>
@@ -19606,6 +19627,7 @@
       </w:r>
       <w:r>
         <w:rPr>
+          <w:rFonts w:ascii="Georgia" w:hAnsi="Georgia" w:cs="Georgia" w:eastAsia="Georgia"/>
           <w:rtl w:val="0"/>
           <w:sz w:val="20"/>
           <w:szCs w:val="20"/>
@@ -19614,7 +19636,7 @@
     </w:p>
     <w:p>
       <w:pPr>
-        <w:spacing w:before="0" w:after="60" w:line="360" w:lineRule="auto"/>
+        <w:spacing w:before="0" w:after="40" w:line="276" w:lineRule="auto"/>
         <w:ind w:left="360" w:hanging="360"/>
         <w:jc w:val="both"/>
         <w:rPr/>
@@ -19635,6 +19657,7 @@
       </w:r>
       <w:r>
         <w:rPr>
+          <w:rFonts w:ascii="Georgia" w:hAnsi="Georgia" w:cs="Georgia" w:eastAsia="Georgia"/>
           <w:rtl w:val="0"/>
           <w:sz w:val="20"/>
           <w:szCs w:val="20"/>
@@ -19643,7 +19666,7 @@
     </w:p>
     <w:p>
       <w:pPr>
-        <w:spacing w:before="0" w:after="60" w:line="360" w:lineRule="auto"/>
+        <w:spacing w:before="0" w:after="40" w:line="276" w:lineRule="auto"/>
         <w:ind w:left="360" w:hanging="360"/>
         <w:jc w:val="both"/>
         <w:rPr/>
@@ -19664,6 +19687,7 @@
       </w:r>
       <w:r>
         <w:rPr>
+          <w:rFonts w:ascii="Georgia" w:hAnsi="Georgia" w:cs="Georgia" w:eastAsia="Georgia"/>
           <w:rtl w:val="0"/>
           <w:sz w:val="20"/>
           <w:szCs w:val="20"/>
@@ -19672,7 +19696,7 @@
     </w:p>
     <w:p>
       <w:pPr>
-        <w:spacing w:before="0" w:after="60" w:line="360" w:lineRule="auto"/>
+        <w:spacing w:before="0" w:after="40" w:line="276" w:lineRule="auto"/>
         <w:ind w:left="360" w:hanging="360"/>
         <w:jc w:val="both"/>
         <w:rPr/>
@@ -19700,6 +19724,7 @@
       </w:r>
       <w:r>
         <w:rPr>
+          <w:rFonts w:ascii="Georgia" w:hAnsi="Georgia" w:cs="Georgia" w:eastAsia="Georgia"/>
           <w:rtl w:val="0"/>
           <w:sz w:val="20"/>
           <w:szCs w:val="20"/>

</xml_diff>

<commit_message>
Draft_104: Appendix A QR fill, uniform FC bullets, CE fonts, HEDGE FUNCTION keepWith, table gap
</commit_message>
<xml_diff>
--- a/thesis/003_ThesisProposal_Draft_104.docx
+++ b/thesis/003_ThesisProposal_Draft_104.docx
@@ -12312,7 +12312,7 @@
     </w:p>
     <w:p>
       <w:pPr>
-        <w:spacing w:before="0" w:after="40" w:line="240" w:lineRule="auto"/>
+        <w:spacing w:before="0" w:after="60" w:line="260" w:lineRule="auto"/>
         <w:jc w:val="left"/>
         <w:rPr/>
       </w:pPr>
@@ -12329,15 +12329,17 @@
       </w:r>
       <w:r>
         <w:rPr>
-          <w:rtl w:val="0"/>
-          <w:sz w:val="22"/>
-          <w:szCs w:val="22"/>
-        </w:rPr>
-      </w:r>
-    </w:p>
-    <w:p>
-      <w:pPr>
-        <w:spacing w:before="0" w:after="0" w:line="240" w:lineRule="auto"/>
+          <w:rFonts w:ascii="Georgia" w:hAnsi="Georgia" w:cs="Georgia" w:eastAsia="Georgia"/>
+          <w:rtl w:val="0"/>
+          <w:sz w:val="22"/>
+          <w:szCs w:val="22"/>
+          <w:b/>
+        </w:rPr>
+      </w:r>
+    </w:p>
+    <w:p>
+      <w:pPr>
+        <w:spacing w:before="0" w:after="20" w:line="260" w:lineRule="auto"/>
         <w:ind w:left="288" w:hanging="288"/>
         <w:jc w:val="both"/>
         <w:rPr/>
@@ -12345,15 +12347,15 @@
       <w:r>
         <w:rPr>
           <w:rFonts w:ascii="Georgia" w:hAnsi="Georgia" w:cs="Georgia" w:eastAsia="Georgia"/>
-          <w:sz w:val="22"/>
-          <w:szCs w:val="22"/>
+          <w:sz w:val="20"/>
+          <w:szCs w:val="20"/>
         </w:rPr>
         <w:t>• Lookup: Quick-Reference + Legend (p. 1). Full Codebook from p. 2. Coding sheet columns at end.</w:t>
       </w:r>
     </w:p>
     <w:p>
       <w:pPr>
-        <w:spacing w:before="40" w:after="20" w:line="240" w:lineRule="auto"/>
+        <w:spacing w:before="60" w:after="40" w:line="260" w:lineRule="auto"/>
         <w:jc w:val="left"/>
         <w:rPr/>
       </w:pPr>
@@ -12370,15 +12372,17 @@
       </w:r>
       <w:r>
         <w:rPr>
-          <w:rtl w:val="0"/>
-          <w:sz w:val="22"/>
-          <w:szCs w:val="22"/>
-        </w:rPr>
-      </w:r>
-    </w:p>
-    <w:p>
-      <w:pPr>
-        <w:spacing w:before="0" w:after="0" w:line="240" w:lineRule="auto"/>
+          <w:rFonts w:ascii="Georgia" w:hAnsi="Georgia" w:cs="Georgia" w:eastAsia="Georgia"/>
+          <w:rtl w:val="0"/>
+          <w:sz w:val="22"/>
+          <w:szCs w:val="22"/>
+          <w:b/>
+        </w:rPr>
+      </w:r>
+    </w:p>
+    <w:p>
+      <w:pPr>
+        <w:spacing w:before="0" w:after="20" w:line="260" w:lineRule="auto"/>
         <w:ind w:left="288" w:hanging="288"/>
         <w:jc w:val="both"/>
         <w:rPr/>
@@ -12386,31 +12390,32 @@
       <w:r>
         <w:rPr>
           <w:rFonts w:ascii="Georgia" w:hAnsi="Georgia" w:cs="Georgia" w:eastAsia="Georgia"/>
-          <w:sz w:val="22"/>
-          <w:szCs w:val="22"/>
+          <w:sz w:val="20"/>
+          <w:szCs w:val="20"/>
           <w:rtl w:val="0"/>
         </w:rPr>
         <w:t>• Context decides. A listed word is a hedge only when it works as one in the sentence.</w:t>
       </w:r>
       <w:r>
         <w:rPr>
-          <w:rtl w:val="0"/>
-          <w:sz w:val="22"/>
-          <w:szCs w:val="22"/>
-        </w:rPr>
-      </w:r>
-    </w:p>
-    <w:p>
-      <w:pPr>
-        <w:spacing w:before="20" w:after="0" w:line="240" w:lineRule="auto"/>
+          <w:rFonts w:ascii="Georgia" w:hAnsi="Georgia" w:cs="Georgia" w:eastAsia="Georgia"/>
+          <w:rtl w:val="0"/>
+          <w:sz w:val="20"/>
+          <w:szCs w:val="20"/>
+        </w:rPr>
+      </w:r>
+    </w:p>
+    <w:p>
+      <w:pPr>
+        <w:spacing w:before="40" w:after="20" w:line="260" w:lineRule="auto"/>
         <w:jc w:val="left"/>
         <w:rPr/>
       </w:pPr>
       <w:r>
         <w:rPr>
           <w:rFonts w:ascii="Georgia" w:hAnsi="Georgia" w:cs="Georgia" w:eastAsia="Georgia"/>
-          <w:sz w:val="22"/>
-          <w:szCs w:val="22"/>
+          <w:sz w:val="20"/>
+          <w:szCs w:val="20"/>
           <w:rtl w:val="0"/>
           <w:b/>
           <w:bCs/>
@@ -12419,15 +12424,17 @@
       </w:r>
       <w:r>
         <w:rPr>
-          <w:rtl w:val="0"/>
-          <w:sz w:val="22"/>
-          <w:szCs w:val="22"/>
-        </w:rPr>
-      </w:r>
-    </w:p>
-    <w:p>
-      <w:pPr>
-        <w:spacing w:before="0" w:after="0" w:line="240" w:lineRule="auto"/>
+          <w:rFonts w:ascii="Georgia" w:hAnsi="Georgia" w:cs="Georgia" w:eastAsia="Georgia"/>
+          <w:rtl w:val="0"/>
+          <w:sz w:val="20"/>
+          <w:szCs w:val="20"/>
+          <w:b/>
+        </w:rPr>
+      </w:r>
+    </w:p>
+    <w:p>
+      <w:pPr>
+        <w:spacing w:before="0" w:after="20" w:line="260" w:lineRule="auto"/>
         <w:ind w:left="288" w:hanging="288"/>
         <w:jc w:val="both"/>
         <w:rPr/>
@@ -12435,23 +12442,24 @@
       <w:r>
         <w:rPr>
           <w:rFonts w:ascii="Georgia" w:hAnsi="Georgia" w:cs="Georgia" w:eastAsia="Georgia"/>
-          <w:sz w:val="22"/>
-          <w:szCs w:val="22"/>
+          <w:sz w:val="20"/>
+          <w:szCs w:val="20"/>
           <w:rtl w:val="0"/>
         </w:rPr>
         <w:t>• Modal: may, might, could, would, should, can (possibility only, not capability or obligation).</w:t>
       </w:r>
       <w:r>
         <w:rPr>
-          <w:rtl w:val="0"/>
-          <w:sz w:val="22"/>
-          <w:szCs w:val="22"/>
-        </w:rPr>
-      </w:r>
-    </w:p>
-    <w:p>
-      <w:pPr>
-        <w:spacing w:before="0" w:after="0" w:line="240" w:lineRule="auto"/>
+          <w:rFonts w:ascii="Georgia" w:hAnsi="Georgia" w:cs="Georgia" w:eastAsia="Georgia"/>
+          <w:rtl w:val="0"/>
+          <w:sz w:val="20"/>
+          <w:szCs w:val="20"/>
+        </w:rPr>
+      </w:r>
+    </w:p>
+    <w:p>
+      <w:pPr>
+        <w:spacing w:before="0" w:after="20" w:line="260" w:lineRule="auto"/>
         <w:ind w:left="288" w:hanging="288"/>
         <w:jc w:val="both"/>
         <w:rPr/>
@@ -12460,23 +12468,24 @@
         <w:rPr>
           <w:rFonts w:ascii="Georgia" w:hAnsi="Georgia" w:cs="Georgia" w:eastAsia="Georgia"/>
           <w:i w:val="0"/>
-          <w:sz w:val="22"/>
-          <w:szCs w:val="22"/>
+          <w:sz w:val="20"/>
+          <w:szCs w:val="20"/>
           <w:rtl w:val="0"/>
         </w:rPr>
         <w:t>• Lexical: suggest, indicate, appear, seem, possible, likely, potential (when they qualify a claim and pass Step 2).</w:t>
       </w:r>
       <w:r>
         <w:rPr>
-          <w:rtl w:val="0"/>
-          <w:sz w:val="22"/>
-          <w:szCs w:val="22"/>
-        </w:rPr>
-      </w:r>
-    </w:p>
-    <w:p>
-      <w:pPr>
-        <w:spacing w:before="0" w:after="0" w:line="240" w:lineRule="auto"/>
+          <w:rFonts w:ascii="Georgia" w:hAnsi="Georgia" w:cs="Georgia" w:eastAsia="Georgia"/>
+          <w:rtl w:val="0"/>
+          <w:sz w:val="20"/>
+          <w:szCs w:val="20"/>
+        </w:rPr>
+      </w:r>
+    </w:p>
+    <w:p>
+      <w:pPr>
+        <w:spacing w:before="0" w:after="20" w:line="260" w:lineRule="auto"/>
         <w:ind w:left="288" w:hanging="288"/>
         <w:jc w:val="both"/>
         <w:rPr/>
@@ -12484,23 +12493,24 @@
       <w:r>
         <w:rPr>
           <w:rFonts w:ascii="Georgia" w:hAnsi="Georgia" w:cs="Georgia" w:eastAsia="Georgia"/>
-          <w:sz w:val="22"/>
-          <w:szCs w:val="22"/>
+          <w:sz w:val="20"/>
+          <w:szCs w:val="20"/>
           <w:rtl w:val="0"/>
         </w:rPr>
         <w:t>• Adverbial: generally, typically, possibly, probably (scope or certainty, not procedural routine).</w:t>
       </w:r>
       <w:r>
         <w:rPr>
-          <w:rtl w:val="0"/>
-          <w:sz w:val="22"/>
-          <w:szCs w:val="22"/>
-        </w:rPr>
-      </w:r>
-    </w:p>
-    <w:p>
-      <w:pPr>
-        <w:spacing w:before="0" w:after="0" w:line="240" w:lineRule="auto"/>
+          <w:rFonts w:ascii="Georgia" w:hAnsi="Georgia" w:cs="Georgia" w:eastAsia="Georgia"/>
+          <w:rtl w:val="0"/>
+          <w:sz w:val="20"/>
+          <w:szCs w:val="20"/>
+        </w:rPr>
+      </w:r>
+    </w:p>
+    <w:p>
+      <w:pPr>
+        <w:spacing w:before="0" w:after="20" w:line="260" w:lineRule="auto"/>
         <w:ind w:left="288" w:hanging="288"/>
         <w:jc w:val="both"/>
         <w:rPr/>
@@ -12508,23 +12518,70 @@
       <w:r>
         <w:rPr>
           <w:rFonts w:ascii="Georgia" w:hAnsi="Georgia" w:cs="Georgia" w:eastAsia="Georgia"/>
-          <w:sz w:val="22"/>
-          <w:szCs w:val="22"/>
+          <w:sz w:val="20"/>
+          <w:szCs w:val="20"/>
           <w:rtl w:val="0"/>
         </w:rPr>
         <w:t>• Clause-level: it seems that, it is possible that, to some extent.</w:t>
       </w:r>
       <w:r>
         <w:rPr>
-          <w:rtl w:val="0"/>
-          <w:sz w:val="22"/>
-          <w:szCs w:val="22"/>
-        </w:rPr>
-      </w:r>
-    </w:p>
-    <w:p>
-      <w:pPr>
-        <w:spacing w:before="20" w:after="0" w:line="240" w:lineRule="auto"/>
+          <w:rFonts w:ascii="Georgia" w:hAnsi="Georgia" w:cs="Georgia" w:eastAsia="Georgia"/>
+          <w:rtl w:val="0"/>
+          <w:sz w:val="20"/>
+          <w:szCs w:val="20"/>
+        </w:rPr>
+      </w:r>
+    </w:p>
+    <w:p>
+      <w:pPr>
+        <w:spacing w:before="20" w:after="20" w:line="260" w:lineRule="auto"/>
+        <w:jc w:val="both"/>
+        <w:rPr/>
+      </w:pPr>
+      <w:r>
+        <w:rPr>
+          <w:rFonts w:ascii="Georgia" w:hAnsi="Georgia" w:cs="Georgia" w:eastAsia="Georgia"/>
+          <w:sz w:val="20"/>
+          <w:szCs w:val="20"/>
+          <w:rtl w:val="0"/>
+        </w:rPr>
+        <w:t xml:space="preserve">Functions: EC = uncertainty about a claim’s truth. P = interpersonal softening of a claim. FP = fails the claim condition or both checks (not a function).</w:t>
+      </w:r>
+    </w:p>
+    <w:p>
+      <w:pPr>
+        <w:spacing w:before="20" w:after="20" w:line="260" w:lineRule="auto"/>
+        <w:jc w:val="both"/>
+        <w:rPr/>
+      </w:pPr>
+      <w:r>
+        <w:rPr>
+          <w:rFonts w:ascii="Georgia" w:hAnsi="Georgia" w:cs="Georgia" w:eastAsia="Georgia"/>
+          <w:sz w:val="20"/>
+          <w:szCs w:val="20"/>
+          <w:rtl w:val="0"/>
+        </w:rPr>
+        <w:t>Core rules: suggest/indicate finding→hedge, recommendation→FP-Rec; can/may possibility→hedge, capability→FP-Cap; generally/typically claim-limit→hedge, procedural→FP-Proc; appear/seem result-uncertainty→hedge, location→FP-Gen.</w:t>
+      </w:r>
+    </w:p>
+    <w:p>
+      <w:pPr>
+        <w:spacing w:before="20" w:after="20" w:line="260" w:lineRule="auto"/>
+        <w:jc w:val="both"/>
+      </w:pPr>
+      <w:r>
+        <w:rPr>
+          <w:rFonts w:ascii="Georgia" w:hAnsi="Georgia" w:cs="Georgia" w:eastAsia="Georgia"/>
+          <w:sz w:val="20"/>
+          <w:szCs w:val="20"/>
+        </w:rPr>
+        <w:t xml:space="preserve">Steps 1–3: Step 1 wide-net candidates. Step 2 = claim condition, then Working Test + Reader Test → EC, P, or FP. Step 3 = type on retained P and EC only.</w:t>
+      </w:r>
+    </w:p>
+    <w:p>
+      <w:pPr>
+        <w:spacing w:before="60" w:after="40" w:line="260" w:lineRule="auto"/>
         <w:jc w:val="left"/>
         <w:rPr/>
       </w:pPr>
@@ -12533,51 +12590,6 @@
           <w:rFonts w:ascii="Georgia" w:hAnsi="Georgia" w:cs="Georgia" w:eastAsia="Georgia"/>
           <w:sz w:val="22"/>
           <w:szCs w:val="22"/>
-          <w:rtl w:val="0"/>
-        </w:rPr>
-        <w:t xml:space="preserve">Functions: EC = uncertainty about a claim’s truth. P = interpersonal softening of a claim. FP = fails the claim condition or both checks (not a function).</w:t>
-      </w:r>
-    </w:p>
-    <w:p>
-      <w:pPr>
-        <w:spacing w:before="0" w:after="0" w:line="240" w:lineRule="auto"/>
-        <w:jc w:val="left"/>
-        <w:rPr/>
-      </w:pPr>
-      <w:r>
-        <w:rPr>
-          <w:rFonts w:ascii="Georgia" w:hAnsi="Georgia" w:cs="Georgia" w:eastAsia="Georgia"/>
-          <w:sz w:val="22"/>
-          <w:szCs w:val="22"/>
-          <w:rtl w:val="0"/>
-        </w:rPr>
-        <w:t>Core rules: suggest/indicate finding→hedge, recommendation→FP-Rec; can/may possibility→hedge, capability→FP-Cap; generally/typically claim-limit→hedge, procedural→FP-Proc; appear/seem result-uncertainty→hedge, location→FP-Gen.</w:t>
-      </w:r>
-    </w:p>
-    <w:p>
-      <w:pPr>
-        <w:spacing w:after="0" w:before="0" w:line="240" w:lineRule="auto"/>
-      </w:pPr>
-      <w:r>
-        <w:rPr>
-          <w:rFonts w:ascii="Georgia" w:hAnsi="Georgia" w:cs="Georgia" w:eastAsia="Georgia"/>
-          <w:sz w:val="22"/>
-          <w:szCs w:val="22"/>
-        </w:rPr>
-        <w:t xml:space="preserve">Steps 1–3: Step 1 wide-net candidates. Step 2 = claim condition, then Working Test + Reader Test → EC, P, or FP. Step 3 = type on retained P and EC only.</w:t>
-      </w:r>
-    </w:p>
-    <w:p>
-      <w:pPr>
-        <w:spacing w:before="40" w:after="20" w:line="240" w:lineRule="auto"/>
-        <w:jc w:val="left"/>
-        <w:rPr/>
-      </w:pPr>
-      <w:r>
-        <w:rPr>
-          <w:rFonts w:ascii="Georgia" w:hAnsi="Georgia" w:cs="Georgia" w:eastAsia="Georgia"/>
-          <w:sz w:val="24"/>
-          <w:szCs w:val="24"/>
           <w:rtl w:val="0"/>
           <w:b/>
           <w:bCs/>
@@ -12586,15 +12598,17 @@
       </w:r>
       <w:r>
         <w:rPr>
-          <w:rtl w:val="0"/>
-          <w:sz w:val="24"/>
-          <w:szCs w:val="24"/>
-        </w:rPr>
-      </w:r>
-    </w:p>
-    <w:p>
-      <w:pPr>
-        <w:spacing w:before="0" w:after="0" w:line="240" w:lineRule="auto"/>
+          <w:rFonts w:ascii="Georgia" w:hAnsi="Georgia" w:cs="Georgia" w:eastAsia="Georgia"/>
+          <w:rtl w:val="0"/>
+          <w:sz w:val="22"/>
+          <w:szCs w:val="22"/>
+          <w:b/>
+        </w:rPr>
+      </w:r>
+    </w:p>
+    <w:p>
+      <w:pPr>
+        <w:spacing w:before="0" w:after="20" w:line="260" w:lineRule="auto"/>
         <w:ind w:left="288" w:hanging="288"/>
         <w:jc w:val="both"/>
         <w:rPr/>
@@ -12604,17 +12618,18 @@
           <w:rFonts w:ascii="Georgia" w:hAnsi="Georgia" w:cs="Georgia" w:eastAsia="Georgia"/>
           <w:i w:val="0"/>
           <w:iCs w:val="0"/>
-          <w:sz w:val="22"/>
-          <w:szCs w:val="22"/>
+          <w:sz w:val="20"/>
+          <w:szCs w:val="20"/>
           <w:rtl w:val="0"/>
         </w:rPr>
         <w:t>• Highlights = type background on the token. Colored text labels = function. Grey = unhedged verb. Strike + grey code = FP.</w:t>
       </w:r>
       <w:r>
         <w:rPr>
-          <w:rtl w:val="0"/>
-          <w:sz w:val="22"/>
-          <w:szCs w:val="22"/>
+          <w:rFonts w:ascii="Georgia" w:hAnsi="Georgia" w:cs="Georgia" w:eastAsia="Georgia"/>
+          <w:rtl w:val="0"/>
+          <w:sz w:val="20"/>
+          <w:szCs w:val="20"/>
         </w:rPr>
       </w:r>
     </w:p>
@@ -13095,16 +13110,16 @@
     </w:tbl>
     <w:p>
       <w:pPr>
-        <w:spacing w:before="40" w:after="20" w:line="240" w:lineRule="auto"/>
+        <w:spacing w:before="120" w:after="40" w:line="260" w:lineRule="auto"/>
         <w:jc w:val="left"/>
-        <w:rPr/>
         <w:keepNext/>
-      </w:pPr>
-      <w:r>
-        <w:rPr>
-          <w:rFonts w:ascii="Georgia" w:hAnsi="Georgia" w:cs="Georgia" w:eastAsia="Georgia"/>
-          <w:sz w:val="24"/>
-          <w:szCs w:val="24"/>
+        <w:rPr/>
+      </w:pPr>
+      <w:r>
+        <w:rPr>
+          <w:rFonts w:ascii="Georgia" w:hAnsi="Georgia" w:cs="Georgia" w:eastAsia="Georgia"/>
+          <w:sz w:val="22"/>
+          <w:szCs w:val="22"/>
           <w:rtl w:val="0"/>
           <w:b/>
           <w:bCs/>
@@ -13113,30 +13128,33 @@
       </w:r>
       <w:r>
         <w:rPr>
-          <w:rtl w:val="0"/>
-          <w:sz w:val="24"/>
-          <w:szCs w:val="24"/>
-        </w:rPr>
-      </w:r>
-    </w:p>
-    <w:p>
-      <w:pPr>
-        <w:spacing w:before="0" w:after="20" w:line="240" w:lineRule="auto"/>
+          <w:rFonts w:ascii="Georgia" w:hAnsi="Georgia" w:cs="Georgia" w:eastAsia="Georgia"/>
+          <w:rtl w:val="0"/>
+          <w:sz w:val="22"/>
+          <w:szCs w:val="22"/>
+          <w:b/>
+        </w:rPr>
+      </w:r>
+    </w:p>
+    <w:p>
+      <w:pPr>
+        <w:spacing w:before="0" w:after="20" w:line="260" w:lineRule="auto"/>
+        <w:jc w:val="both"/>
         <w:keepNext/>
       </w:pPr>
       <w:r>
         <w:rPr>
           <w:rFonts w:ascii="Georgia" w:hAnsi="Georgia" w:cs="Georgia" w:eastAsia="Georgia"/>
-          <w:sz w:val="24"/>
-          <w:szCs w:val="24"/>
+          <w:sz w:val="20"/>
+          <w:szCs w:val="20"/>
         </w:rPr>
         <w:t xml:space="preserve">“The results </w:t>
       </w:r>
       <w:r>
         <w:rPr>
           <w:rFonts w:ascii="Georgia" w:hAnsi="Georgia" w:cs="Georgia" w:eastAsia="Georgia"/>
-          <w:sz w:val="24"/>
-          <w:szCs w:val="24"/>
+          <w:sz w:val="20"/>
+          <w:szCs w:val="20"/>
           <w:shd w:val="clear" w:fill="FF9999" w:color="auto"/>
         </w:rPr>
         <w:t xml:space="preserve">suggested</w:t>
@@ -13144,16 +13162,16 @@
       <w:r>
         <w:rPr>
           <w:rFonts w:ascii="Georgia" w:hAnsi="Georgia" w:cs="Georgia" w:eastAsia="Georgia"/>
-          <w:sz w:val="24"/>
-          <w:szCs w:val="24"/>
+          <w:sz w:val="20"/>
+          <w:szCs w:val="20"/>
         </w:rPr>
         <w:t xml:space="preserve"> (Lexical, </w:t>
       </w:r>
       <w:r>
         <w:rPr>
           <w:rFonts w:ascii="Georgia" w:hAnsi="Georgia" w:cs="Georgia" w:eastAsia="Georgia"/>
-          <w:sz w:val="24"/>
-          <w:szCs w:val="24"/>
+          <w:sz w:val="20"/>
+          <w:szCs w:val="20"/>
           <w:color w:val="ED7D31"/>
           <w:b/>
         </w:rPr>
@@ -13162,16 +13180,16 @@
       <w:r>
         <w:rPr>
           <w:rFonts w:ascii="Georgia" w:hAnsi="Georgia" w:cs="Georgia" w:eastAsia="Georgia"/>
-          <w:sz w:val="24"/>
-          <w:szCs w:val="24"/>
+          <w:sz w:val="20"/>
+          <w:szCs w:val="20"/>
         </w:rPr>
         <w:t xml:space="preserve">) that extracts are </w:t>
       </w:r>
       <w:r>
         <w:rPr>
           <w:rFonts w:ascii="Georgia" w:hAnsi="Georgia" w:cs="Georgia" w:eastAsia="Georgia"/>
-          <w:sz w:val="24"/>
-          <w:szCs w:val="24"/>
+          <w:sz w:val="20"/>
+          <w:szCs w:val="20"/>
           <w:shd w:val="clear" w:fill="FF9999" w:color="auto"/>
         </w:rPr>
         <w:t xml:space="preserve">potential</w:t>
@@ -13179,16 +13197,16 @@
       <w:r>
         <w:rPr>
           <w:rFonts w:ascii="Georgia" w:hAnsi="Georgia" w:cs="Georgia" w:eastAsia="Georgia"/>
-          <w:sz w:val="24"/>
-          <w:szCs w:val="24"/>
+          <w:sz w:val="20"/>
+          <w:szCs w:val="20"/>
         </w:rPr>
         <w:t xml:space="preserve"> (Lexical, </w:t>
       </w:r>
       <w:r>
         <w:rPr>
           <w:rFonts w:ascii="Georgia" w:hAnsi="Georgia" w:cs="Georgia" w:eastAsia="Georgia"/>
-          <w:sz w:val="24"/>
-          <w:szCs w:val="24"/>
+          <w:sz w:val="20"/>
+          <w:szCs w:val="20"/>
           <w:color w:val="ED7D31"/>
           <w:b/>
         </w:rPr>
@@ -13197,16 +13215,16 @@
       <w:r>
         <w:rPr>
           <w:rFonts w:ascii="Georgia" w:hAnsi="Georgia" w:cs="Georgia" w:eastAsia="Georgia"/>
-          <w:sz w:val="24"/>
-          <w:szCs w:val="24"/>
+          <w:sz w:val="20"/>
+          <w:szCs w:val="20"/>
         </w:rPr>
         <w:t xml:space="preserve">) alternative stains. As prior studies </w:t>
       </w:r>
       <w:r>
         <w:rPr>
           <w:rFonts w:ascii="Georgia" w:hAnsi="Georgia" w:cs="Georgia" w:eastAsia="Georgia"/>
-          <w:sz w:val="24"/>
-          <w:szCs w:val="24"/>
+          <w:sz w:val="20"/>
+          <w:szCs w:val="20"/>
           <w:shd w:val="clear" w:fill="FF9999" w:color="auto"/>
         </w:rPr>
         <w:t xml:space="preserve">indicated</w:t>
@@ -13214,16 +13232,16 @@
       <w:r>
         <w:rPr>
           <w:rFonts w:ascii="Georgia" w:hAnsi="Georgia" w:cs="Georgia" w:eastAsia="Georgia"/>
-          <w:sz w:val="24"/>
-          <w:szCs w:val="24"/>
+          <w:sz w:val="20"/>
+          <w:szCs w:val="20"/>
         </w:rPr>
         <w:t xml:space="preserve"> (Lexical, </w:t>
       </w:r>
       <w:r>
         <w:rPr>
           <w:rFonts w:ascii="Georgia" w:hAnsi="Georgia" w:cs="Georgia" w:eastAsia="Georgia"/>
-          <w:sz w:val="24"/>
-          <w:szCs w:val="24"/>
+          <w:sz w:val="20"/>
+          <w:szCs w:val="20"/>
           <w:color w:val="7030A0"/>
           <w:b/>
         </w:rPr>
@@ -13232,16 +13250,16 @@
       <w:r>
         <w:rPr>
           <w:rFonts w:ascii="Georgia" w:hAnsi="Georgia" w:cs="Georgia" w:eastAsia="Georgia"/>
-          <w:sz w:val="24"/>
-          <w:szCs w:val="24"/>
+          <w:sz w:val="20"/>
+          <w:szCs w:val="20"/>
         </w:rPr>
         <w:t xml:space="preserve">), PCR </w:t>
       </w:r>
       <w:r>
         <w:rPr>
           <w:rFonts w:ascii="Georgia" w:hAnsi="Georgia" w:cs="Georgia" w:eastAsia="Georgia"/>
-          <w:sz w:val="24"/>
-          <w:szCs w:val="24"/>
+          <w:sz w:val="20"/>
+          <w:szCs w:val="20"/>
           <w:strike/>
         </w:rPr>
         <w:t xml:space="preserve">can</w:t>
@@ -13249,16 +13267,16 @@
       <w:r>
         <w:rPr>
           <w:rFonts w:ascii="Georgia" w:hAnsi="Georgia" w:cs="Georgia" w:eastAsia="Georgia"/>
-          <w:sz w:val="24"/>
-          <w:szCs w:val="24"/>
+          <w:sz w:val="20"/>
+          <w:szCs w:val="20"/>
         </w:rPr>
         <w:t xml:space="preserve"> </w:t>
       </w:r>
       <w:r>
         <w:rPr>
           <w:rFonts w:ascii="Georgia" w:hAnsi="Georgia" w:cs="Georgia" w:eastAsia="Georgia"/>
-          <w:sz w:val="24"/>
-          <w:szCs w:val="24"/>
+          <w:sz w:val="20"/>
+          <w:szCs w:val="20"/>
           <w:color w:val="808080"/>
         </w:rPr>
         <w:t xml:space="preserve">(FP-Cap)</w:t>
@@ -13266,16 +13284,16 @@
       <w:r>
         <w:rPr>
           <w:rFonts w:ascii="Georgia" w:hAnsi="Georgia" w:cs="Georgia" w:eastAsia="Georgia"/>
-          <w:sz w:val="24"/>
-          <w:szCs w:val="24"/>
+          <w:sz w:val="20"/>
+          <w:szCs w:val="20"/>
         </w:rPr>
         <w:t xml:space="preserve"> also detect low concentrations. Farmers </w:t>
       </w:r>
       <w:r>
         <w:rPr>
           <w:rFonts w:ascii="Georgia" w:hAnsi="Georgia" w:cs="Georgia" w:eastAsia="Georgia"/>
-          <w:sz w:val="24"/>
-          <w:szCs w:val="24"/>
+          <w:sz w:val="20"/>
+          <w:szCs w:val="20"/>
           <w:strike/>
         </w:rPr>
         <w:t xml:space="preserve">should</w:t>
@@ -13283,16 +13301,16 @@
       <w:r>
         <w:rPr>
           <w:rFonts w:ascii="Georgia" w:hAnsi="Georgia" w:cs="Georgia" w:eastAsia="Georgia"/>
-          <w:sz w:val="24"/>
-          <w:szCs w:val="24"/>
+          <w:sz w:val="20"/>
+          <w:szCs w:val="20"/>
         </w:rPr>
         <w:t xml:space="preserve"> </w:t>
       </w:r>
       <w:r>
         <w:rPr>
           <w:rFonts w:ascii="Georgia" w:hAnsi="Georgia" w:cs="Georgia" w:eastAsia="Georgia"/>
-          <w:sz w:val="24"/>
-          <w:szCs w:val="24"/>
+          <w:sz w:val="20"/>
+          <w:szCs w:val="20"/>
           <w:color w:val="808080"/>
         </w:rPr>
         <w:t xml:space="preserve">(FP-Rec)</w:t>
@@ -13300,16 +13318,16 @@
       <w:r>
         <w:rPr>
           <w:rFonts w:ascii="Georgia" w:hAnsi="Georgia" w:cs="Georgia" w:eastAsia="Georgia"/>
-          <w:sz w:val="24"/>
-          <w:szCs w:val="24"/>
+          <w:sz w:val="20"/>
+          <w:szCs w:val="20"/>
         </w:rPr>
         <w:t xml:space="preserve"> adopt the treatment. In conclusion, T3 produced the highest yield </w:t>
       </w:r>
       <w:r>
         <w:rPr>
           <w:rFonts w:ascii="Georgia" w:hAnsi="Georgia" w:cs="Georgia" w:eastAsia="Georgia"/>
-          <w:sz w:val="24"/>
-          <w:szCs w:val="24"/>
+          <w:sz w:val="20"/>
+          <w:szCs w:val="20"/>
           <w:color w:val="808080"/>
         </w:rPr>
         <w:t xml:space="preserve">(FP framing)</w:t>
@@ -13317,16 +13335,16 @@
       <w:r>
         <w:rPr>
           <w:rFonts w:ascii="Georgia" w:hAnsi="Georgia" w:cs="Georgia" w:eastAsia="Georgia"/>
-          <w:sz w:val="24"/>
-          <w:szCs w:val="24"/>
+          <w:sz w:val="20"/>
+          <w:szCs w:val="20"/>
         </w:rPr>
         <w:t xml:space="preserve">. The treatment </w:t>
       </w:r>
       <w:r>
         <w:rPr>
           <w:rFonts w:ascii="Georgia" w:hAnsi="Georgia" w:cs="Georgia" w:eastAsia="Georgia"/>
-          <w:sz w:val="24"/>
-          <w:szCs w:val="24"/>
+          <w:sz w:val="20"/>
+          <w:szCs w:val="20"/>
           <w:shd w:val="clear" w:fill="00B0F0" w:color="auto"/>
         </w:rPr>
         <w:t xml:space="preserve">may</w:t>
@@ -13334,16 +13352,16 @@
       <w:r>
         <w:rPr>
           <w:rFonts w:ascii="Georgia" w:hAnsi="Georgia" w:cs="Georgia" w:eastAsia="Georgia"/>
-          <w:sz w:val="24"/>
-          <w:szCs w:val="24"/>
+          <w:sz w:val="20"/>
+          <w:szCs w:val="20"/>
         </w:rPr>
         <w:t xml:space="preserve"> (Modal, </w:t>
       </w:r>
       <w:r>
         <w:rPr>
           <w:rFonts w:ascii="Georgia" w:hAnsi="Georgia" w:cs="Georgia" w:eastAsia="Georgia"/>
-          <w:sz w:val="24"/>
-          <w:szCs w:val="24"/>
+          <w:sz w:val="20"/>
+          <w:szCs w:val="20"/>
           <w:color w:val="ED7D31"/>
           <w:b/>
         </w:rPr>
@@ -13352,19 +13370,20 @@
       <w:r>
         <w:rPr>
           <w:rFonts w:ascii="Georgia" w:hAnsi="Georgia" w:cs="Georgia" w:eastAsia="Georgia"/>
-          <w:sz w:val="24"/>
-          <w:szCs w:val="24"/>
+          <w:sz w:val="20"/>
+          <w:szCs w:val="20"/>
         </w:rPr>
         <w:t xml:space="preserve">) reduce infection rates.”</w:t>
       </w:r>
     </w:p>
     <w:p>
       <w:pPr>
-        <w:spacing w:before="0" w:after="40" w:line="240" w:lineRule="auto"/>
-      </w:pPr>
-      <w:r>
-        <w:rPr>
-          <w:rFonts w:ascii="Georgia" w:hAnsi="Georgia"/>
+        <w:spacing w:before="0" w:after="40" w:line="260" w:lineRule="auto"/>
+        <w:jc w:val="both"/>
+      </w:pPr>
+      <w:r>
+        <w:rPr>
+          <w:rFonts w:ascii="Georgia" w:hAnsi="Georgia" w:cs="Georgia" w:eastAsia="Georgia"/>
           <w:sz w:val="20"/>
           <w:szCs w:val="20"/>
           <w:color w:val="404040"/>
@@ -13374,7 +13393,7 @@
     </w:p>
     <w:p>
       <w:pPr>
-        <w:spacing w:before="80" w:after="20" w:line="276" w:lineRule="auto"/>
+        <w:spacing w:before="120" w:after="40" w:line="276" w:lineRule="auto"/>
         <w:jc w:val="left"/>
         <w:rPr/>
       </w:pPr>
@@ -13383,6 +13402,7 @@
           <w:rFonts w:ascii="Georgia" w:hAnsi="Georgia" w:cs="Georgia" w:eastAsia="Georgia"/>
           <w:sz w:val="22"/>
           <w:szCs w:val="22"/>
+          <w:b/>
         </w:rPr>
         <w:br w:type="page"/>
       </w:r>
@@ -13403,12 +13423,13 @@
           <w:rtl w:val="0"/>
           <w:sz w:val="22"/>
           <w:szCs w:val="22"/>
-        </w:rPr>
-      </w:r>
-    </w:p>
-    <w:p>
-      <w:pPr>
-        <w:spacing w:before="80" w:after="20" w:line="276" w:lineRule="auto"/>
+          <w:b/>
+        </w:rPr>
+      </w:r>
+    </w:p>
+    <w:p>
+      <w:pPr>
+        <w:spacing w:before="80" w:after="40" w:line="276" w:lineRule="auto"/>
         <w:jc w:val="left"/>
         <w:rPr/>
       </w:pPr>
@@ -13429,6 +13450,7 @@
           <w:rtl w:val="0"/>
           <w:sz w:val="22"/>
           <w:szCs w:val="22"/>
+          <w:b/>
         </w:rPr>
       </w:r>
     </w:p>
@@ -13461,7 +13483,7 @@
     </w:p>
     <w:p>
       <w:pPr>
-        <w:spacing w:before="80" w:after="20" w:line="276" w:lineRule="auto"/>
+        <w:spacing w:before="80" w:after="40" w:line="276" w:lineRule="auto"/>
         <w:jc w:val="left"/>
         <w:rPr/>
       </w:pPr>
@@ -13482,6 +13504,7 @@
           <w:rtl w:val="0"/>
           <w:sz w:val="22"/>
           <w:szCs w:val="22"/>
+          <w:b/>
         </w:rPr>
       </w:r>
     </w:p>
@@ -13668,7 +13691,7 @@
     </w:p>
     <w:p>
       <w:pPr>
-        <w:spacing w:before="80" w:after="20" w:line="276" w:lineRule="auto"/>
+        <w:spacing w:before="80" w:after="40" w:line="276" w:lineRule="auto"/>
         <w:jc w:val="left"/>
         <w:rPr/>
       </w:pPr>
@@ -13877,8 +13900,9 @@
     </w:p>
     <w:p>
       <w:pPr>
-        <w:spacing w:before="80" w:after="20" w:line="276" w:lineRule="auto"/>
+        <w:spacing w:before="80" w:after="40" w:line="276" w:lineRule="auto"/>
         <w:jc w:val="left"/>
+        <w:keepNext/>
         <w:rPr/>
       </w:pPr>
       <w:r>
@@ -13898,6 +13922,7 @@
           <w:rtl w:val="0"/>
           <w:sz w:val="22"/>
           <w:szCs w:val="22"/>
+          <w:b/>
         </w:rPr>
       </w:r>
     </w:p>
@@ -14702,7 +14727,7 @@
     </w:tbl>
     <w:p>
       <w:pPr>
-        <w:spacing w:before="0" w:after="40" w:line="276" w:lineRule="auto"/>
+        <w:spacing w:before="120" w:after="40" w:line="276" w:lineRule="auto"/>
         <w:ind w:left="360"/>
         <w:jc w:val="both"/>
         <w:rPr/>
@@ -14951,8 +14976,9 @@
     </w:p>
     <w:p>
       <w:pPr>
-        <w:spacing w:before="40" w:after="14" w:line="360" w:lineRule="auto"/>
+        <w:spacing w:before="80" w:after="40" w:line="276" w:lineRule="auto"/>
         <w:jc w:val="left"/>
+        <w:keepNext/>
         <w:rPr/>
       </w:pPr>
       <w:r>
@@ -14968,9 +14994,11 @@
       </w:r>
       <w:r>
         <w:rPr>
-          <w:rtl w:val="0"/>
-          <w:sz w:val="22"/>
-          <w:szCs w:val="22"/>
+          <w:rFonts w:ascii="Georgia" w:hAnsi="Georgia" w:cs="Georgia" w:eastAsia="Georgia"/>
+          <w:rtl w:val="0"/>
+          <w:sz w:val="22"/>
+          <w:szCs w:val="22"/>
+          <w:b/>
         </w:rPr>
       </w:r>
     </w:p>
@@ -15687,8 +15715,9 @@
     </w:tbl>
     <w:p>
       <w:pPr>
-        <w:spacing w:before="80" w:after="20" w:line="276" w:lineRule="auto"/>
+        <w:spacing w:before="120" w:after="40" w:line="276" w:lineRule="auto"/>
         <w:jc w:val="left"/>
+        <w:keepNext/>
         <w:rPr/>
       </w:pPr>
       <w:r>
@@ -15708,6 +15737,7 @@
           <w:rtl w:val="0"/>
           <w:sz w:val="22"/>
           <w:szCs w:val="22"/>
+          <w:b/>
         </w:rPr>
       </w:r>
     </w:p>
@@ -16600,7 +16630,7 @@
     </w:tbl>
     <w:p>
       <w:pPr>
-        <w:spacing w:before="0" w:after="40" w:line="276" w:lineRule="auto"/>
+        <w:spacing w:before="120" w:after="40" w:line="276" w:lineRule="auto"/>
         <w:ind w:left="360"/>
         <w:jc w:val="both"/>
         <w:rPr/>
@@ -16702,8 +16732,9 @@
     </w:p>
     <w:p>
       <w:pPr>
-        <w:spacing w:before="80" w:after="20" w:line="276" w:lineRule="auto"/>
+        <w:spacing w:before="80" w:after="40" w:line="276" w:lineRule="auto"/>
         <w:jc w:val="left"/>
+        <w:keepNext/>
         <w:rPr/>
       </w:pPr>
       <w:r>
@@ -16723,6 +16754,7 @@
           <w:rtl w:val="0"/>
           <w:sz w:val="22"/>
           <w:szCs w:val="22"/>
+          <w:b/>
         </w:rPr>
       </w:r>
     </w:p>
@@ -17510,8 +17542,9 @@
     </w:tbl>
     <w:p>
       <w:pPr>
-        <w:spacing w:before="40" w:after="14" w:line="360" w:lineRule="auto"/>
-        <w:jc w:val="both"/>
+        <w:spacing w:before="120" w:after="40" w:line="276" w:lineRule="auto"/>
+        <w:jc w:val="left"/>
+        <w:keepNext/>
         <w:rPr/>
       </w:pPr>
       <w:r>
@@ -17527,9 +17560,11 @@
       </w:r>
       <w:r>
         <w:rPr>
-          <w:rtl w:val="0"/>
-          <w:sz w:val="22"/>
-          <w:szCs w:val="22"/>
+          <w:rFonts w:ascii="Georgia" w:hAnsi="Georgia" w:cs="Georgia" w:eastAsia="Georgia"/>
+          <w:rtl w:val="0"/>
+          <w:sz w:val="22"/>
+          <w:szCs w:val="22"/>
+          <w:b/>
         </w:rPr>
       </w:r>
     </w:p>
@@ -18216,7 +18251,7 @@
     </w:tbl>
     <w:p>
       <w:pPr>
-        <w:spacing w:before="80" w:after="20" w:line="276" w:lineRule="auto"/>
+        <w:spacing w:before="120" w:after="40" w:line="276" w:lineRule="auto"/>
         <w:jc w:val="left"/>
         <w:rPr/>
       </w:pPr>
@@ -18237,6 +18272,7 @@
           <w:rtl w:val="0"/>
           <w:sz w:val="22"/>
           <w:szCs w:val="22"/>
+          <w:b/>
         </w:rPr>
       </w:r>
     </w:p>
@@ -19607,7 +19643,7 @@
     </w:tbl>
     <w:p>
       <w:pPr>
-        <w:spacing w:before="0" w:after="40" w:line="276" w:lineRule="auto"/>
+        <w:spacing w:before="120" w:after="40" w:line="276" w:lineRule="auto"/>
         <w:ind w:left="360" w:hanging="360"/>
         <w:jc w:val="both"/>
         <w:rPr/>

</xml_diff>

<commit_message>
Draft_104: rebuild FC bullets clean; bump QR spacing; App A table gaps
</commit_message>
<xml_diff>
--- a/thesis/003_ThesisProposal_Draft_104.docx
+++ b/thesis/003_ThesisProposal_Draft_104.docx
@@ -12312,9 +12312,8 @@
     </w:p>
     <w:p>
       <w:pPr>
-        <w:spacing w:before="0" w:after="60" w:line="260" w:lineRule="auto"/>
+        <w:spacing w:before="0" w:after="80" w:line="280" w:lineRule="auto"/>
         <w:jc w:val="left"/>
-        <w:rPr/>
       </w:pPr>
       <w:r>
         <w:rPr>
@@ -12339,10 +12338,9 @@
     </w:p>
     <w:p>
       <w:pPr>
-        <w:spacing w:before="0" w:after="20" w:line="260" w:lineRule="auto"/>
+        <w:spacing w:before="0" w:after="40" w:line="280" w:lineRule="auto"/>
         <w:ind w:left="288" w:hanging="288"/>
         <w:jc w:val="both"/>
-        <w:rPr/>
       </w:pPr>
       <w:r>
         <w:rPr>
@@ -12350,14 +12348,13 @@
           <w:sz w:val="20"/>
           <w:szCs w:val="20"/>
         </w:rPr>
-        <w:t>• Lookup: Quick-Reference + Legend (p. 1). Full Codebook from p. 2. Coding sheet columns at end.</w:t>
-      </w:r>
-    </w:p>
-    <w:p>
-      <w:pPr>
-        <w:spacing w:before="60" w:after="40" w:line="260" w:lineRule="auto"/>
+        <w:t xml:space="preserve">• Lookup: Quick-Reference + Legend (p. 1). Full Codebook from p. 2. Coding sheet columns at end.</w:t>
+      </w:r>
+    </w:p>
+    <w:p>
+      <w:pPr>
+        <w:spacing w:before="80" w:after="40" w:line="280" w:lineRule="auto"/>
         <w:jc w:val="left"/>
-        <w:rPr/>
       </w:pPr>
       <w:r>
         <w:rPr>
@@ -12382,34 +12379,23 @@
     </w:p>
     <w:p>
       <w:pPr>
-        <w:spacing w:before="0" w:after="20" w:line="260" w:lineRule="auto"/>
+        <w:spacing w:before="0" w:after="40" w:line="280" w:lineRule="auto"/>
         <w:ind w:left="288" w:hanging="288"/>
         <w:jc w:val="both"/>
-        <w:rPr/>
       </w:pPr>
       <w:r>
         <w:rPr>
           <w:rFonts w:ascii="Georgia" w:hAnsi="Georgia" w:cs="Georgia" w:eastAsia="Georgia"/>
           <w:sz w:val="20"/>
           <w:szCs w:val="20"/>
-          <w:rtl w:val="0"/>
-        </w:rPr>
-        <w:t>• Context decides. A listed word is a hedge only when it works as one in the sentence.</w:t>
-      </w:r>
-      <w:r>
-        <w:rPr>
-          <w:rFonts w:ascii="Georgia" w:hAnsi="Georgia" w:cs="Georgia" w:eastAsia="Georgia"/>
-          <w:rtl w:val="0"/>
-          <w:sz w:val="20"/>
-          <w:szCs w:val="20"/>
-        </w:rPr>
-      </w:r>
-    </w:p>
-    <w:p>
-      <w:pPr>
-        <w:spacing w:before="40" w:after="20" w:line="260" w:lineRule="auto"/>
+        </w:rPr>
+        <w:t xml:space="preserve">• Context decides. A listed word is a hedge only when it works as one in the sentence.</w:t>
+      </w:r>
+    </w:p>
+    <w:p>
+      <w:pPr>
+        <w:spacing w:before="40" w:after="20" w:line="280" w:lineRule="auto"/>
         <w:jc w:val="left"/>
-        <w:rPr/>
       </w:pPr>
       <w:r>
         <w:rPr>
@@ -12434,203 +12420,147 @@
     </w:p>
     <w:p>
       <w:pPr>
-        <w:spacing w:before="0" w:after="20" w:line="260" w:lineRule="auto"/>
+        <w:spacing w:before="0" w:after="40" w:line="280" w:lineRule="auto"/>
         <w:ind w:left="288" w:hanging="288"/>
         <w:jc w:val="both"/>
-        <w:rPr/>
       </w:pPr>
       <w:r>
         <w:rPr>
           <w:rFonts w:ascii="Georgia" w:hAnsi="Georgia" w:cs="Georgia" w:eastAsia="Georgia"/>
           <w:sz w:val="20"/>
           <w:szCs w:val="20"/>
-          <w:rtl w:val="0"/>
-        </w:rPr>
-        <w:t>• Modal: may, might, could, would, should, can (possibility only, not capability or obligation).</w:t>
-      </w:r>
-      <w:r>
-        <w:rPr>
-          <w:rFonts w:ascii="Georgia" w:hAnsi="Georgia" w:cs="Georgia" w:eastAsia="Georgia"/>
-          <w:rtl w:val="0"/>
+        </w:rPr>
+        <w:t xml:space="preserve">• Modal: may, might, could, would, should, can (possibility only, not capability or obligation).</w:t>
+      </w:r>
+    </w:p>
+    <w:p>
+      <w:pPr>
+        <w:spacing w:before="0" w:after="40" w:line="280" w:lineRule="auto"/>
+        <w:ind w:left="288" w:hanging="288"/>
+        <w:jc w:val="both"/>
+      </w:pPr>
+      <w:r>
+        <w:rPr>
+          <w:rFonts w:ascii="Georgia" w:hAnsi="Georgia" w:cs="Georgia" w:eastAsia="Georgia"/>
           <w:sz w:val="20"/>
           <w:szCs w:val="20"/>
         </w:rPr>
-      </w:r>
-    </w:p>
-    <w:p>
-      <w:pPr>
-        <w:spacing w:before="0" w:after="20" w:line="260" w:lineRule="auto"/>
+        <w:t xml:space="preserve">• Lexical: suggest, indicate, appear, seem, possible, likely, potential (when they qualify a claim and pass Step 2).</w:t>
+      </w:r>
+    </w:p>
+    <w:p>
+      <w:pPr>
+        <w:spacing w:before="0" w:after="40" w:line="280" w:lineRule="auto"/>
         <w:ind w:left="288" w:hanging="288"/>
         <w:jc w:val="both"/>
-        <w:rPr/>
-      </w:pPr>
-      <w:r>
-        <w:rPr>
-          <w:rFonts w:ascii="Georgia" w:hAnsi="Georgia" w:cs="Georgia" w:eastAsia="Georgia"/>
-          <w:i w:val="0"/>
+      </w:pPr>
+      <w:r>
+        <w:rPr>
+          <w:rFonts w:ascii="Georgia" w:hAnsi="Georgia" w:cs="Georgia" w:eastAsia="Georgia"/>
           <w:sz w:val="20"/>
           <w:szCs w:val="20"/>
-          <w:rtl w:val="0"/>
-        </w:rPr>
-        <w:t>• Lexical: suggest, indicate, appear, seem, possible, likely, potential (when they qualify a claim and pass Step 2).</w:t>
-      </w:r>
-      <w:r>
-        <w:rPr>
-          <w:rFonts w:ascii="Georgia" w:hAnsi="Georgia" w:cs="Georgia" w:eastAsia="Georgia"/>
-          <w:rtl w:val="0"/>
+        </w:rPr>
+        <w:t xml:space="preserve">• Adverbial: generally, typically, possibly, probably (scope or certainty, not procedural routine).</w:t>
+      </w:r>
+    </w:p>
+    <w:p>
+      <w:pPr>
+        <w:spacing w:before="0" w:after="40" w:line="280" w:lineRule="auto"/>
+        <w:ind w:left="288" w:hanging="288"/>
+        <w:jc w:val="both"/>
+      </w:pPr>
+      <w:r>
+        <w:rPr>
+          <w:rFonts w:ascii="Georgia" w:hAnsi="Georgia" w:cs="Georgia" w:eastAsia="Georgia"/>
           <w:sz w:val="20"/>
           <w:szCs w:val="20"/>
         </w:rPr>
-      </w:r>
-    </w:p>
-    <w:p>
-      <w:pPr>
-        <w:spacing w:before="0" w:after="20" w:line="260" w:lineRule="auto"/>
+        <w:t xml:space="preserve">• Clause-level: it seems that, it is possible that, to some extent.</w:t>
+      </w:r>
+    </w:p>
+    <w:p>
+      <w:pPr>
+        <w:spacing w:before="40" w:after="40" w:line="280" w:lineRule="auto"/>
+        <w:jc w:val="both"/>
+      </w:pPr>
+      <w:r>
+        <w:rPr>
+          <w:rFonts w:ascii="Georgia" w:hAnsi="Georgia" w:cs="Georgia" w:eastAsia="Georgia"/>
+          <w:sz w:val="20"/>
+          <w:szCs w:val="20"/>
+          <w:rtl w:val="0"/>
+        </w:rPr>
+        <w:t xml:space="preserve">Functions: EC = uncertainty about a claim’s truth. P = interpersonal softening of a claim. FP = fails the claim condition or both checks (not a function).</w:t>
+      </w:r>
+    </w:p>
+    <w:p>
+      <w:pPr>
+        <w:spacing w:before="40" w:after="40" w:line="280" w:lineRule="auto"/>
+        <w:jc w:val="both"/>
+      </w:pPr>
+      <w:r>
+        <w:rPr>
+          <w:rFonts w:ascii="Georgia" w:hAnsi="Georgia" w:cs="Georgia" w:eastAsia="Georgia"/>
+          <w:sz w:val="20"/>
+          <w:szCs w:val="20"/>
+          <w:rtl w:val="0"/>
+        </w:rPr>
+        <w:t>Core rules: suggest/indicate finding→hedge, recommendation→FP-Rec; can/may possibility→hedge, capability→FP-Cap; generally/typically claim-limit→hedge, procedural→FP-Proc; appear/seem result-uncertainty→hedge, location→FP-Gen.</w:t>
+      </w:r>
+    </w:p>
+    <w:p>
+      <w:pPr>
+        <w:spacing w:before="40" w:after="40" w:line="280" w:lineRule="auto"/>
+        <w:jc w:val="both"/>
+      </w:pPr>
+      <w:r>
+        <w:rPr>
+          <w:rFonts w:ascii="Georgia" w:hAnsi="Georgia" w:cs="Georgia" w:eastAsia="Georgia"/>
+          <w:sz w:val="20"/>
+          <w:szCs w:val="20"/>
+        </w:rPr>
+        <w:t xml:space="preserve">Steps 1–3: Step 1 wide-net candidates. Step 2 = claim condition, then Working Test + Reader Test → EC, P, or FP. Step 3 = type on retained P and EC only.</w:t>
+      </w:r>
+    </w:p>
+    <w:p>
+      <w:pPr>
+        <w:spacing w:before="80" w:after="40" w:line="280" w:lineRule="auto"/>
+        <w:jc w:val="left"/>
+      </w:pPr>
+      <w:r>
+        <w:rPr>
+          <w:rFonts w:ascii="Georgia" w:hAnsi="Georgia" w:cs="Georgia" w:eastAsia="Georgia"/>
+          <w:sz w:val="22"/>
+          <w:szCs w:val="22"/>
+          <w:rtl w:val="0"/>
+          <w:b/>
+          <w:bCs/>
+        </w:rPr>
+        <w:t>QUICK-REFERENCE LEGEND</w:t>
+      </w:r>
+      <w:r>
+        <w:rPr>
+          <w:rFonts w:ascii="Georgia" w:hAnsi="Georgia" w:cs="Georgia" w:eastAsia="Georgia"/>
+          <w:rtl w:val="0"/>
+          <w:sz w:val="22"/>
+          <w:szCs w:val="22"/>
+          <w:b/>
+        </w:rPr>
+      </w:r>
+    </w:p>
+    <w:p>
+      <w:pPr>
+        <w:spacing w:before="0" w:after="40" w:line="280" w:lineRule="auto"/>
         <w:ind w:left="288" w:hanging="288"/>
         <w:jc w:val="both"/>
-        <w:rPr/>
       </w:pPr>
       <w:r>
         <w:rPr>
           <w:rFonts w:ascii="Georgia" w:hAnsi="Georgia" w:cs="Georgia" w:eastAsia="Georgia"/>
           <w:sz w:val="20"/>
           <w:szCs w:val="20"/>
-          <w:rtl w:val="0"/>
-        </w:rPr>
-        <w:t>• Adverbial: generally, typically, possibly, probably (scope or certainty, not procedural routine).</w:t>
-      </w:r>
-      <w:r>
-        <w:rPr>
-          <w:rFonts w:ascii="Georgia" w:hAnsi="Georgia" w:cs="Georgia" w:eastAsia="Georgia"/>
-          <w:rtl w:val="0"/>
-          <w:sz w:val="20"/>
-          <w:szCs w:val="20"/>
-        </w:rPr>
-      </w:r>
-    </w:p>
-    <w:p>
-      <w:pPr>
-        <w:spacing w:before="0" w:after="20" w:line="260" w:lineRule="auto"/>
-        <w:ind w:left="288" w:hanging="288"/>
-        <w:jc w:val="both"/>
-        <w:rPr/>
-      </w:pPr>
-      <w:r>
-        <w:rPr>
-          <w:rFonts w:ascii="Georgia" w:hAnsi="Georgia" w:cs="Georgia" w:eastAsia="Georgia"/>
-          <w:sz w:val="20"/>
-          <w:szCs w:val="20"/>
-          <w:rtl w:val="0"/>
-        </w:rPr>
-        <w:t>• Clause-level: it seems that, it is possible that, to some extent.</w:t>
-      </w:r>
-      <w:r>
-        <w:rPr>
-          <w:rFonts w:ascii="Georgia" w:hAnsi="Georgia" w:cs="Georgia" w:eastAsia="Georgia"/>
-          <w:rtl w:val="0"/>
-          <w:sz w:val="20"/>
-          <w:szCs w:val="20"/>
-        </w:rPr>
-      </w:r>
-    </w:p>
-    <w:p>
-      <w:pPr>
-        <w:spacing w:before="20" w:after="20" w:line="260" w:lineRule="auto"/>
-        <w:jc w:val="both"/>
-        <w:rPr/>
-      </w:pPr>
-      <w:r>
-        <w:rPr>
-          <w:rFonts w:ascii="Georgia" w:hAnsi="Georgia" w:cs="Georgia" w:eastAsia="Georgia"/>
-          <w:sz w:val="20"/>
-          <w:szCs w:val="20"/>
-          <w:rtl w:val="0"/>
-        </w:rPr>
-        <w:t xml:space="preserve">Functions: EC = uncertainty about a claim’s truth. P = interpersonal softening of a claim. FP = fails the claim condition or both checks (not a function).</w:t>
-      </w:r>
-    </w:p>
-    <w:p>
-      <w:pPr>
-        <w:spacing w:before="20" w:after="20" w:line="260" w:lineRule="auto"/>
-        <w:jc w:val="both"/>
-        <w:rPr/>
-      </w:pPr>
-      <w:r>
-        <w:rPr>
-          <w:rFonts w:ascii="Georgia" w:hAnsi="Georgia" w:cs="Georgia" w:eastAsia="Georgia"/>
-          <w:sz w:val="20"/>
-          <w:szCs w:val="20"/>
-          <w:rtl w:val="0"/>
-        </w:rPr>
-        <w:t>Core rules: suggest/indicate finding→hedge, recommendation→FP-Rec; can/may possibility→hedge, capability→FP-Cap; generally/typically claim-limit→hedge, procedural→FP-Proc; appear/seem result-uncertainty→hedge, location→FP-Gen.</w:t>
-      </w:r>
-    </w:p>
-    <w:p>
-      <w:pPr>
-        <w:spacing w:before="20" w:after="20" w:line="260" w:lineRule="auto"/>
-        <w:jc w:val="both"/>
-      </w:pPr>
-      <w:r>
-        <w:rPr>
-          <w:rFonts w:ascii="Georgia" w:hAnsi="Georgia" w:cs="Georgia" w:eastAsia="Georgia"/>
-          <w:sz w:val="20"/>
-          <w:szCs w:val="20"/>
-        </w:rPr>
-        <w:t xml:space="preserve">Steps 1–3: Step 1 wide-net candidates. Step 2 = claim condition, then Working Test + Reader Test → EC, P, or FP. Step 3 = type on retained P and EC only.</w:t>
-      </w:r>
-    </w:p>
-    <w:p>
-      <w:pPr>
-        <w:spacing w:before="60" w:after="40" w:line="260" w:lineRule="auto"/>
-        <w:jc w:val="left"/>
-        <w:rPr/>
-      </w:pPr>
-      <w:r>
-        <w:rPr>
-          <w:rFonts w:ascii="Georgia" w:hAnsi="Georgia" w:cs="Georgia" w:eastAsia="Georgia"/>
-          <w:sz w:val="22"/>
-          <w:szCs w:val="22"/>
-          <w:rtl w:val="0"/>
-          <w:b/>
-          <w:bCs/>
-        </w:rPr>
-        <w:t>QUICK-REFERENCE LEGEND</w:t>
-      </w:r>
-      <w:r>
-        <w:rPr>
-          <w:rFonts w:ascii="Georgia" w:hAnsi="Georgia" w:cs="Georgia" w:eastAsia="Georgia"/>
-          <w:rtl w:val="0"/>
-          <w:sz w:val="22"/>
-          <w:szCs w:val="22"/>
-          <w:b/>
-        </w:rPr>
-      </w:r>
-    </w:p>
-    <w:p>
-      <w:pPr>
-        <w:spacing w:before="0" w:after="20" w:line="260" w:lineRule="auto"/>
-        <w:ind w:left="288" w:hanging="288"/>
-        <w:jc w:val="both"/>
-        <w:rPr/>
-      </w:pPr>
-      <w:r>
-        <w:rPr>
-          <w:rFonts w:ascii="Georgia" w:hAnsi="Georgia" w:cs="Georgia" w:eastAsia="Georgia"/>
-          <w:i w:val="0"/>
-          <w:iCs w:val="0"/>
-          <w:sz w:val="20"/>
-          <w:szCs w:val="20"/>
-          <w:rtl w:val="0"/>
-        </w:rPr>
-        <w:t>• Highlights = type background on the token. Colored text labels = function. Grey = unhedged verb. Strike + grey code = FP.</w:t>
-      </w:r>
-      <w:r>
-        <w:rPr>
-          <w:rFonts w:ascii="Georgia" w:hAnsi="Georgia" w:cs="Georgia" w:eastAsia="Georgia"/>
-          <w:rtl w:val="0"/>
-          <w:sz w:val="20"/>
-          <w:szCs w:val="20"/>
-        </w:rPr>
+        </w:rPr>
+        <w:t xml:space="preserve">• Highlights = type background on the token. Colored text labels = function. Grey = unhedged verb. Strike + grey code = FP.</w:t>
       </w:r>
     </w:p>
     <w:tbl>
@@ -13110,10 +13040,9 @@
     </w:tbl>
     <w:p>
       <w:pPr>
-        <w:spacing w:before="120" w:after="40" w:line="260" w:lineRule="auto"/>
+        <w:keepNext/>
+        <w:spacing w:before="160" w:after="40" w:line="280" w:lineRule="auto"/>
         <w:jc w:val="left"/>
-        <w:keepNext/>
-        <w:rPr/>
       </w:pPr>
       <w:r>
         <w:rPr>
@@ -13138,9 +13067,9 @@
     </w:p>
     <w:p>
       <w:pPr>
-        <w:spacing w:before="0" w:after="20" w:line="260" w:lineRule="auto"/>
+        <w:keepNext/>
+        <w:spacing w:before="0" w:after="40" w:line="280" w:lineRule="auto"/>
         <w:jc w:val="both"/>
-        <w:keepNext/>
       </w:pPr>
       <w:r>
         <w:rPr>
@@ -13173,7 +13102,6 @@
           <w:sz w:val="20"/>
           <w:szCs w:val="20"/>
           <w:color w:val="ED7D31"/>
-          <w:b/>
         </w:rPr>
         <w:t xml:space="preserve">EC</w:t>
       </w:r>
@@ -13208,7 +13136,6 @@
           <w:sz w:val="20"/>
           <w:szCs w:val="20"/>
           <w:color w:val="ED7D31"/>
-          <w:b/>
         </w:rPr>
         <w:t xml:space="preserve">EC</w:t>
       </w:r>
@@ -13243,7 +13170,6 @@
           <w:sz w:val="20"/>
           <w:szCs w:val="20"/>
           <w:color w:val="7030A0"/>
-          <w:b/>
         </w:rPr>
         <w:t xml:space="preserve">P</w:t>
       </w:r>
@@ -13363,7 +13289,6 @@
           <w:sz w:val="20"/>
           <w:szCs w:val="20"/>
           <w:color w:val="ED7D31"/>
-          <w:b/>
         </w:rPr>
         <w:t xml:space="preserve">EC</w:t>
       </w:r>
@@ -13378,7 +13303,7 @@
     </w:p>
     <w:p>
       <w:pPr>
-        <w:spacing w:before="0" w:after="40" w:line="260" w:lineRule="auto"/>
+        <w:spacing w:before="0" w:after="40" w:line="280" w:lineRule="auto"/>
         <w:jc w:val="both"/>
       </w:pPr>
       <w:r>
@@ -13393,9 +13318,8 @@
     </w:p>
     <w:p>
       <w:pPr>
-        <w:spacing w:before="120" w:after="40" w:line="276" w:lineRule="auto"/>
+        <w:spacing w:before="100" w:after="40" w:line="300" w:lineRule="auto"/>
         <w:jc w:val="left"/>
-        <w:rPr/>
       </w:pPr>
       <w:r>
         <w:rPr>
@@ -13429,9 +13353,8 @@
     </w:p>
     <w:p>
       <w:pPr>
-        <w:spacing w:before="80" w:after="40" w:line="276" w:lineRule="auto"/>
+        <w:spacing w:before="100" w:after="40" w:line="300" w:lineRule="auto"/>
         <w:jc w:val="left"/>
-        <w:rPr/>
       </w:pPr>
       <w:r>
         <w:rPr>
@@ -13456,244 +13379,124 @@
     </w:p>
     <w:p>
       <w:pPr>
-        <w:spacing w:before="0" w:after="40" w:line="276" w:lineRule="auto"/>
+        <w:spacing w:before="0" w:after="60" w:line="300" w:lineRule="auto"/>
         <w:ind w:left="360" w:hanging="360"/>
         <w:jc w:val="both"/>
-        <w:rPr/>
-      </w:pPr>
-      <w:r>
-        <w:rPr>
-          <w:rFonts w:ascii="Georgia" w:hAnsi="Georgia" w:cs="Georgia" w:eastAsia="Georgia"/>
-          <w:b w:val="0"/>
-          <w:bCs w:val="0"/>
+      </w:pPr>
+      <w:r>
+        <w:rPr>
+          <w:rFonts w:ascii="Georgia" w:hAnsi="Georgia" w:cs="Georgia" w:eastAsia="Georgia"/>
           <w:sz w:val="20"/>
           <w:szCs w:val="20"/>
-          <w:rtl w:val="0"/>
-        </w:rPr>
-        <w:t>• Coding scheme for the PSAU undergraduate thesis abstract corpus, adapted from Hyland (1998) as type instrument.</w:t>
-      </w:r>
-      <w:r>
-        <w:rPr>
-          <w:rFonts w:ascii="Georgia" w:hAnsi="Georgia" w:cs="Georgia" w:eastAsia="Georgia"/>
-          <w:rtl w:val="0"/>
+        </w:rPr>
+        <w:t xml:space="preserve">• Coding scheme for the PSAU undergraduate thesis abstract corpus, adapted from Hyland (1998) as type instrument.</w:t>
+      </w:r>
+    </w:p>
+    <w:p>
+      <w:pPr>
+        <w:spacing w:before="100" w:after="40" w:line="300" w:lineRule="auto"/>
+        <w:jc w:val="left"/>
+      </w:pPr>
+      <w:r>
+        <w:rPr>
+          <w:rFonts w:ascii="Georgia" w:hAnsi="Georgia" w:cs="Georgia" w:eastAsia="Georgia"/>
+          <w:sz w:val="22"/>
+          <w:szCs w:val="22"/>
+          <w:rtl w:val="0"/>
+          <w:b/>
+          <w:bCs w:val="0"/>
+        </w:rPr>
+        <w:t>STEP 1, STEP 2, STEP 3, AND WORKING TEST</w:t>
+      </w:r>
+      <w:r>
+        <w:rPr>
+          <w:rFonts w:ascii="Georgia" w:hAnsi="Georgia" w:cs="Georgia" w:eastAsia="Georgia"/>
+          <w:rtl w:val="0"/>
+          <w:sz w:val="22"/>
+          <w:szCs w:val="22"/>
+          <w:b/>
+        </w:rPr>
+      </w:r>
+    </w:p>
+    <w:p>
+      <w:pPr>
+        <w:spacing w:before="0" w:after="60" w:line="300" w:lineRule="auto"/>
+        <w:ind w:left="360" w:hanging="360"/>
+        <w:jc w:val="both"/>
+      </w:pPr>
+      <w:r>
+        <w:rPr>
+          <w:rFonts w:ascii="Georgia" w:hAnsi="Georgia" w:cs="Georgia" w:eastAsia="Georgia"/>
           <w:sz w:val="20"/>
           <w:szCs w:val="20"/>
         </w:rPr>
-      </w:r>
-    </w:p>
-    <w:p>
-      <w:pPr>
-        <w:spacing w:before="80" w:after="40" w:line="276" w:lineRule="auto"/>
-        <w:jc w:val="left"/>
-        <w:rPr/>
-      </w:pPr>
-      <w:r>
-        <w:rPr>
-          <w:rFonts w:ascii="Georgia" w:hAnsi="Georgia" w:cs="Georgia" w:eastAsia="Georgia"/>
-          <w:sz w:val="22"/>
-          <w:szCs w:val="22"/>
-          <w:rtl w:val="0"/>
-          <w:b/>
-          <w:bCs w:val="0"/>
-        </w:rPr>
-        <w:t>STEP 1, STEP 2, STEP 3, AND WORKING TEST</w:t>
-      </w:r>
-      <w:r>
-        <w:rPr>
-          <w:rFonts w:ascii="Georgia" w:hAnsi="Georgia" w:cs="Georgia" w:eastAsia="Georgia"/>
-          <w:rtl w:val="0"/>
-          <w:sz w:val="22"/>
-          <w:szCs w:val="22"/>
-          <w:b/>
-        </w:rPr>
-      </w:r>
-    </w:p>
-    <w:p>
-      <w:pPr>
-        <w:spacing w:before="0" w:after="40" w:line="276" w:lineRule="auto"/>
+        <w:t xml:space="preserve">• Step 1 (wide net). After the holistic read, mark all possible hedge candidates. This step does not count retained hedges.</w:t>
+      </w:r>
+    </w:p>
+    <w:p>
+      <w:pPr>
+        <w:spacing w:before="0" w:after="60" w:line="300" w:lineRule="auto"/>
         <w:ind w:left="360" w:hanging="360"/>
         <w:jc w:val="both"/>
-        <w:rPr/>
-      </w:pPr>
-      <w:r>
-        <w:rPr>
-          <w:rFonts w:ascii="Georgia" w:hAnsi="Georgia" w:cs="Georgia" w:eastAsia="Georgia"/>
-          <w:i w:val="0"/>
-          <w:iCs w:val="0"/>
-          <w:color w:val="000000"/>
+      </w:pPr>
+      <w:r>
+        <w:rPr>
+          <w:rFonts w:ascii="Georgia" w:hAnsi="Georgia" w:cs="Georgia" w:eastAsia="Georgia"/>
           <w:sz w:val="20"/>
           <w:szCs w:val="20"/>
-          <w:rtl w:val="0"/>
-        </w:rPr>
-        <w:t xml:space="preserve">
-        • Step 1 (wide net). After the holistic read, mark all possible hedge candidates. This step does not count retained hedges.
-    </w:t>
-      </w:r>
-      <w:r>
-        <w:rPr>
-          <w:rFonts w:ascii="Georgia" w:cs="Georgia" w:eastAsia="Georgia" w:hAnsi="Georgia"/>
-          <w:i w:val="1"/>
-          <w:iCs w:val="1"/>
-          <w:color w:val="000000"/>
+        </w:rPr>
+        <w:t xml:space="preserve">• Step 2 (function by paired removal checks). Claim condition (both tests): a device can only be a hedge if it attaches to a claim. A claim is a statement about data, the world, or prior work that evidence could show to be wrong. Aims, directives, and routine procedure are excluded by kind, not by loose truth-evaluability. If the clause is not a claim, log the token as FP (with a reason code when useful: FP-Rec, FP-Gen, FP-Proc, or FP-Cap). Working Test: remove the device. Does the writer’s commitment to the claim’s truth go up? If yes → EC. Reader Test: remove the device. Does commitment to the truth stay the same, but the claim now reaches the reader more bluntly, or the writer takes sole ownership of it against prior work? If yes → P. Neither → FP (not a function). Both may hold on one token (EC+P). There is no required category pre-filter before these checks. Category codes label residual rejects after the claim condition or both tests fail.</w:t>
+      </w:r>
+    </w:p>
+    <w:p>
+      <w:pPr>
+        <w:spacing w:before="0" w:after="60" w:line="300" w:lineRule="auto"/>
+        <w:ind w:left="360" w:hanging="360"/>
+        <w:jc w:val="both"/>
+      </w:pPr>
+      <w:r>
+        <w:rPr>
+          <w:rFonts w:ascii="Georgia" w:hAnsi="Georgia" w:cs="Georgia" w:eastAsia="Georgia"/>
           <w:sz w:val="20"/>
           <w:szCs w:val="20"/>
-          <w:rtl w:val="0"/>
-        </w:rPr>
-      </w:r>
-      <w:r>
-        <w:rPr>
-          <w:rFonts w:ascii="Georgia" w:cs="Georgia" w:eastAsia="Georgia" w:hAnsi="Georgia"/>
-          <w:i w:val="0"/>
-          <w:iCs w:val="0"/>
-          <w:color w:val="000000"/>
+        </w:rPr>
+        <w:t xml:space="preserve">• Working Test and Reader Test are the Step 2 function gate, after the claim condition. Every Step 1 candidate can be run through the claim condition and the two removal checks. Directives, aim statements, and procedural norms fail the claim condition and are logged FP without needing a prior sort. Category codes (FP-Rec, FP-Cap, FP-Proc, FP-Gen) explain the residual inventory. They do not replace the tests.</w:t>
+      </w:r>
+    </w:p>
+    <w:p>
+      <w:pPr>
+        <w:spacing w:before="0" w:after="60" w:line="300" w:lineRule="auto"/>
+        <w:ind w:left="360" w:hanging="360"/>
+        <w:jc w:val="both"/>
+      </w:pPr>
+      <w:r>
+        <w:rPr>
+          <w:rFonts w:ascii="Georgia" w:hAnsi="Georgia" w:cs="Georgia" w:eastAsia="Georgia"/>
           <w:sz w:val="20"/>
           <w:szCs w:val="20"/>
-          <w:rtl w:val="0"/>
-        </w:rPr>
-      </w:r>
-      <w:r>
-        <w:rPr>
-          <w:rFonts w:ascii="Georgia" w:hAnsi="Georgia" w:cs="Georgia" w:eastAsia="Georgia"/>
-          <w:rtl w:val="0"/>
+        </w:rPr>
+        <w:t xml:space="preserve">• Step 3 (type). On retained P and EC tokens only, assign grammatical type (modal, lexical, adverbial, clause-level).</w:t>
+      </w:r>
+    </w:p>
+    <w:p>
+      <w:pPr>
+        <w:spacing w:before="0" w:after="60" w:line="300" w:lineRule="auto"/>
+        <w:ind w:left="360" w:hanging="360"/>
+        <w:jc w:val="both"/>
+      </w:pPr>
+      <w:r>
+        <w:rPr>
+          <w:rFonts w:ascii="Georgia" w:hAnsi="Georgia" w:cs="Georgia" w:eastAsia="Georgia"/>
           <w:sz w:val="20"/>
           <w:szCs w:val="20"/>
         </w:rPr>
-      </w:r>
-    </w:p>
-    <w:p>
-      <w:pPr>
-        <w:spacing w:before="0" w:after="40" w:line="276" w:lineRule="auto"/>
-        <w:ind w:left="360" w:hanging="360"/>
-        <w:jc w:val="both"/>
-        <w:rPr/>
-      </w:pPr>
-      <w:r>
-        <w:rPr>
-          <w:rFonts w:ascii="Georgia" w:hAnsi="Georgia" w:cs="Georgia" w:eastAsia="Georgia"/>
-          <w:i w:val="0"/>
-          <w:iCs w:val="0"/>
-          <w:sz w:val="20"/>
-          <w:szCs w:val="20"/>
-          <w:rtl w:val="0"/>
-        </w:rPr>
-        <w:t xml:space="preserve">• Step 2 (function by paired removal checks). Claim condition (both tests): a device can only be a hedge if it attaches to a claim. A claim is a statement about data, the world, or prior work that evidence could show to be wrong. Aims, directives, and routine procedure are excluded by kind, not by loose truth-evaluability. If the clause is not a claim, log the token as FP (with a reason code when useful: FP-Rec, FP-Gen, FP-Proc, or FP-Cap). Working Test: remove the device. Does the writer’s commitment to the claim’s truth go up? If yes → EC. Reader Test: remove the device. Does commitment to the truth stay the same, but the claim now reaches the reader more bluntly, or the writer takes sole ownership of it against prior work? If yes → P. Neither → FP (not a function). Both may hold on one token (EC+P). There is no required category pre-filter before these checks. Category codes label residual rejects after the claim condition or both tests fail.</w:t>
-      </w:r>
-    </w:p>
-    <w:p>
-      <w:pPr>
-        <w:spacing w:before="0" w:after="40" w:line="276" w:lineRule="auto"/>
-        <w:ind w:left="360" w:hanging="360"/>
-        <w:jc w:val="both"/>
-        <w:rPr/>
-      </w:pPr>
-      <w:r>
-        <w:rPr>
-          <w:rFonts w:ascii="Georgia" w:hAnsi="Georgia" w:cs="Georgia" w:eastAsia="Georgia"/>
-          <w:i w:val="0"/>
-          <w:iCs w:val="0"/>
-          <w:sz w:val="20"/>
-          <w:szCs w:val="20"/>
-          <w:rtl w:val="0"/>
-        </w:rPr>
-        <w:t xml:space="preserve">• Working Test and Reader Test are the Step 2 function gate, after the claim condition. Every Step 1 candidate can be run through the claim condition and the two removal checks. Directives, aim statements, and procedural norms fail the claim condition and are logged FP without needing a prior sort. Category codes (FP-Rec, FP-Cap, FP-Proc, FP-Gen) explain the residual inventory. They do not replace the tests.</w:t>
-      </w:r>
-    </w:p>
-    <w:p>
-      <w:pPr>
-        <w:spacing w:before="0" w:after="40" w:line="276" w:lineRule="auto"/>
-        <w:ind w:left="360" w:hanging="360"/>
-        <w:jc w:val="both"/>
-        <w:rPr/>
-      </w:pPr>
-      <w:r>
-        <w:rPr>
-          <w:rFonts w:ascii="Georgia" w:hAnsi="Georgia" w:cs="Georgia" w:eastAsia="Georgia"/>
-          <w:i w:val="0"/>
-          <w:iCs w:val="0"/>
-          <w:color w:val="000000"/>
-          <w:sz w:val="20"/>
-          <w:szCs w:val="20"/>
-          <w:rtl w:val="0"/>
-        </w:rPr>
-        <w:t xml:space="preserve">• Step 3 (type). On retained P and EC tokens only, assign grammatical type (modal, lexical, adverbial, clause-level).</w:t>
-      </w:r>
-      <w:r>
-        <w:rPr>
-          <w:rFonts w:ascii="Georgia" w:cs="Georgia" w:eastAsia="Georgia" w:hAnsi="Georgia"/>
-          <w:i w:val="1"/>
-          <w:iCs w:val="1"/>
-          <w:color w:val="000000"/>
-          <w:sz w:val="20"/>
-          <w:szCs w:val="20"/>
-          <w:rtl w:val="0"/>
-        </w:rPr>
-      </w:r>
-      <w:r>
-        <w:rPr>
-          <w:rFonts w:ascii="Georgia" w:cs="Georgia" w:eastAsia="Georgia" w:hAnsi="Georgia"/>
-          <w:i w:val="0"/>
-          <w:iCs w:val="0"/>
-          <w:color w:val="000000"/>
-          <w:sz w:val="20"/>
-          <w:szCs w:val="20"/>
-          <w:rtl w:val="0"/>
-        </w:rPr>
-      </w:r>
-      <w:r>
-        <w:rPr>
-          <w:rFonts w:ascii="Georgia" w:cs="Georgia" w:eastAsia="Georgia" w:hAnsi="Georgia"/>
-          <w:i w:val="1"/>
-          <w:iCs w:val="1"/>
-          <w:color w:val="000000"/>
-          <w:sz w:val="20"/>
-          <w:szCs w:val="20"/>
-          <w:rtl w:val="0"/>
-        </w:rPr>
-      </w:r>
-      <w:r>
-        <w:rPr>
-          <w:rFonts w:ascii="Georgia" w:cs="Georgia" w:eastAsia="Georgia" w:hAnsi="Georgia"/>
-          <w:i w:val="0"/>
-          <w:iCs w:val="0"/>
-          <w:color w:val="000000"/>
-          <w:sz w:val="20"/>
-          <w:szCs w:val="20"/>
-          <w:rtl w:val="0"/>
-        </w:rPr>
-      </w:r>
-      <w:r>
-        <w:rPr>
-          <w:rFonts w:ascii="Georgia" w:hAnsi="Georgia" w:cs="Georgia" w:eastAsia="Georgia"/>
-          <w:rtl w:val="0"/>
-          <w:sz w:val="20"/>
-          <w:szCs w:val="20"/>
-        </w:rPr>
-      </w:r>
-    </w:p>
-    <w:p>
-      <w:pPr>
-        <w:spacing w:before="0" w:after="40" w:line="276" w:lineRule="auto"/>
-        <w:ind w:left="360" w:hanging="360"/>
-        <w:jc w:val="both"/>
-        <w:rPr/>
-      </w:pPr>
-      <w:r>
-        <w:rPr>
-          <w:rFonts w:ascii="Georgia" w:hAnsi="Georgia" w:cs="Georgia" w:eastAsia="Georgia"/>
-          <w:i w:val="0"/>
-          <w:iCs w:val="0"/>
-          <w:sz w:val="20"/>
-          <w:szCs w:val="20"/>
-          <w:rtl w:val="0"/>
-        </w:rPr>
         <w:t xml:space="preserve">• Order. Coding order: full abstract → Step 1 (wide net) → Step 2 (claim condition, then Working Test and Reader Test) → reason codes on rejects → Step 3 type on retained P and EC → Coder Notes. No mandatory category pre-filter before Step 2.</w:t>
       </w:r>
     </w:p>
     <w:p>
       <w:pPr>
-        <w:spacing w:before="80" w:after="40" w:line="276" w:lineRule="auto"/>
+        <w:spacing w:before="100" w:after="40" w:line="300" w:lineRule="auto"/>
         <w:jc w:val="left"/>
-        <w:rPr/>
       </w:pPr>
       <w:r>
         <w:rPr>
@@ -13720,190 +13523,129 @@
     </w:p>
     <w:p>
       <w:pPr>
-        <w:spacing w:before="0" w:after="40" w:line="276" w:lineRule="auto"/>
+        <w:spacing w:before="0" w:after="60" w:line="300" w:lineRule="auto"/>
         <w:ind w:left="360" w:hanging="360"/>
         <w:jc w:val="both"/>
-        <w:rPr/>
-      </w:pPr>
-      <w:r>
-        <w:rPr>
-          <w:rFonts w:ascii="Georgia" w:hAnsi="Georgia" w:cs="Georgia" w:eastAsia="Georgia"/>
-          <w:i w:val="0"/>
-          <w:iCs w:val="0"/>
+      </w:pPr>
+      <w:r>
+        <w:rPr>
+          <w:rFonts w:ascii="Georgia" w:hAnsi="Georgia" w:cs="Georgia" w:eastAsia="Georgia"/>
           <w:sz w:val="20"/>
           <w:szCs w:val="20"/>
-          <w:rtl w:val="0"/>
         </w:rPr>
         <w:t xml:space="preserve">• Function labels apply to retained hedges after Step 2. Only claim-attached devices can be EC or P. Working Test supports EC when commitment to the claim’s truth rises after removal. Reader Test supports P when truth commitment stays the same but the claim is blunter to the reader or the writer takes sole ownership against prior work.</w:t>
       </w:r>
     </w:p>
     <w:p>
       <w:pPr>
-        <w:spacing w:before="0" w:after="40" w:line="276" w:lineRule="auto"/>
+        <w:spacing w:before="0" w:after="60" w:line="300" w:lineRule="auto"/>
         <w:ind w:left="360" w:hanging="360"/>
         <w:jc w:val="both"/>
-        <w:rPr/>
-      </w:pPr>
-      <w:r>
-        <w:rPr>
-          <w:rFonts w:ascii="Georgia" w:hAnsi="Georgia" w:cs="Georgia" w:eastAsia="Georgia"/>
-          <w:i w:val="0"/>
-          <w:iCs w:val="0"/>
+      </w:pPr>
+      <w:r>
+        <w:rPr>
+          <w:rFonts w:ascii="Georgia" w:hAnsi="Georgia" w:cs="Georgia" w:eastAsia="Georgia"/>
           <w:sz w:val="20"/>
           <w:szCs w:val="20"/>
-          <w:rtl w:val="0"/>
         </w:rPr>
         <w:t xml:space="preserve">• EC (Working Test): “The treatment may reduce infection rates.” Host clause is a claim about data or the world. Removing may raises commitment to the claim’s truth → EC.</w:t>
       </w:r>
     </w:p>
     <w:p>
       <w:pPr>
-        <w:spacing w:before="0" w:after="40" w:line="276" w:lineRule="auto"/>
+        <w:spacing w:before="0" w:after="60" w:line="300" w:lineRule="auto"/>
         <w:ind w:left="360" w:hanging="360"/>
         <w:jc w:val="both"/>
-        <w:rPr/>
-      </w:pPr>
-      <w:r>
-        <w:rPr>
-          <w:rFonts w:ascii="Georgia" w:hAnsi="Georgia" w:cs="Georgia" w:eastAsia="Georgia"/>
-          <w:i w:val="0"/>
-          <w:iCs w:val="0"/>
+      </w:pPr>
+      <w:r>
+        <w:rPr>
+          <w:rFonts w:ascii="Georgia" w:hAnsi="Georgia" w:cs="Georgia" w:eastAsia="Georgia"/>
           <w:sz w:val="20"/>
           <w:szCs w:val="20"/>
-          <w:rtl w:val="0"/>
-        </w:rPr>
-        <w:t>• FP-Cap: “PCR can detect low concentrations.” can = capability, not uncertainty about a finding.</w:t>
-      </w:r>
-      <w:r>
-        <w:rPr>
-          <w:rFonts w:ascii="Georgia" w:hAnsi="Georgia" w:cs="Georgia" w:eastAsia="Georgia"/>
-          <w:rtl w:val="0"/>
+        </w:rPr>
+        <w:t xml:space="preserve">• FP-Cap: “PCR can detect low concentrations.” can = capability, not uncertainty about a finding.</w:t>
+      </w:r>
+    </w:p>
+    <w:p>
+      <w:pPr>
+        <w:spacing w:before="0" w:after="60" w:line="300" w:lineRule="auto"/>
+        <w:ind w:left="360" w:hanging="360"/>
+        <w:jc w:val="both"/>
+      </w:pPr>
+      <w:r>
+        <w:rPr>
+          <w:rFonts w:ascii="Georgia" w:hAnsi="Georgia" w:cs="Georgia" w:eastAsia="Georgia"/>
           <w:sz w:val="20"/>
           <w:szCs w:val="20"/>
         </w:rPr>
-      </w:r>
-    </w:p>
-    <w:p>
-      <w:pPr>
-        <w:spacing w:before="0" w:after="40" w:line="276" w:lineRule="auto"/>
+        <w:t xml:space="preserve">• P (Reader Test): “As suggested by previous researchers, the treatment is effective.” Host clause is a claim. Removing the attribution leaves truth commitment the same but the writer takes sole ownership against prior work → P. By contrast, “Farmers should adopt the treatment” is a directive (excluded by kind) → FP-Rec.</w:t>
+      </w:r>
+    </w:p>
+    <w:p>
+      <w:pPr>
+        <w:spacing w:before="0" w:after="60" w:line="300" w:lineRule="auto"/>
         <w:ind w:left="360" w:hanging="360"/>
         <w:jc w:val="both"/>
-        <w:rPr/>
-      </w:pPr>
-      <w:r>
-        <w:rPr>
-          <w:rFonts w:ascii="Georgia" w:hAnsi="Georgia" w:cs="Georgia" w:eastAsia="Georgia"/>
-          <w:i w:val="0"/>
-          <w:iCs w:val="0"/>
+      </w:pPr>
+      <w:r>
+        <w:rPr>
+          <w:rFonts w:ascii="Georgia" w:hAnsi="Georgia" w:cs="Georgia" w:eastAsia="Georgia"/>
           <w:sz w:val="20"/>
           <w:szCs w:val="20"/>
-          <w:rtl w:val="0"/>
-        </w:rPr>
-        <w:t xml:space="preserve">• P (Reader Test): “As suggested by previous researchers, the treatment is effective.” Host clause is a claim. Removing the attribution leaves truth commitment the same but the writer takes sole ownership against prior work → P. By contrast, “Farmers should adopt the treatment” is a directive (excluded by kind) → FP-Rec.</w:t>
-      </w:r>
-    </w:p>
-    <w:p>
-      <w:pPr>
-        <w:spacing w:before="0" w:after="40" w:line="276" w:lineRule="auto"/>
+        </w:rPr>
+        <w:t xml:space="preserve">• P + EC: Both Working Test and Reader Test hold on one token → EC+P (or dominant label plus dual note in Coder Notes).</w:t>
+      </w:r>
+    </w:p>
+    <w:p>
+      <w:pPr>
+        <w:spacing w:before="0" w:after="60" w:line="300" w:lineRule="auto"/>
         <w:ind w:left="360" w:hanging="360"/>
         <w:jc w:val="both"/>
-        <w:rPr/>
-      </w:pPr>
-      <w:r>
-        <w:rPr>
-          <w:rFonts w:ascii="Georgia" w:hAnsi="Georgia" w:cs="Georgia" w:eastAsia="Georgia"/>
-          <w:i w:val="0"/>
-          <w:iCs w:val="0"/>
+      </w:pPr>
+      <w:r>
+        <w:rPr>
+          <w:rFonts w:ascii="Georgia" w:hAnsi="Georgia" w:cs="Georgia" w:eastAsia="Georgia"/>
           <w:sz w:val="20"/>
           <w:szCs w:val="20"/>
-          <w:rtl w:val="0"/>
-        </w:rPr>
-        <w:t xml:space="preserve">
-        • P + EC: Both Working Test and Reader Test hold on one token → EC+P (or dominant label plus dual note in Coder Notes).
-    </w:t>
-      </w:r>
-      <w:r>
-        <w:rPr>
-          <w:rFonts w:ascii="Georgia" w:hAnsi="Georgia" w:cs="Georgia" w:eastAsia="Georgia"/>
-          <w:rtl w:val="0"/>
+        </w:rPr>
+        <w:t xml:space="preserve">• FP: “In conclusion, T3 produced the highest yield.” Removing the frame changes neither truth-commitment nor interpersonal imposition toward readers/prior work → FP. Not a function label.</w:t>
+      </w:r>
+    </w:p>
+    <w:p>
+      <w:pPr>
+        <w:spacing w:before="0" w:after="60" w:line="300" w:lineRule="auto"/>
+        <w:ind w:left="360" w:hanging="360"/>
+        <w:jc w:val="both"/>
+      </w:pPr>
+      <w:r>
+        <w:rPr>
+          <w:rFonts w:ascii="Georgia" w:hAnsi="Georgia" w:cs="Georgia" w:eastAsia="Georgia"/>
           <w:sz w:val="20"/>
           <w:szCs w:val="20"/>
         </w:rPr>
-      </w:r>
-    </w:p>
-    <w:p>
-      <w:pPr>
-        <w:spacing w:before="0" w:after="40" w:line="276" w:lineRule="auto"/>
+        <w:t xml:space="preserve">• Frame + separate EC: “It should be noted that the results may indicate growth.” Code may via Working Test as EC. The frame alone fails the claim condition or both checks and is not a second hedge.</w:t>
+      </w:r>
+    </w:p>
+    <w:p>
+      <w:pPr>
+        <w:spacing w:before="0" w:after="60" w:line="300" w:lineRule="auto"/>
         <w:ind w:left="360" w:hanging="360"/>
         <w:jc w:val="both"/>
-        <w:rPr/>
-      </w:pPr>
-      <w:r>
-        <w:rPr>
-          <w:rFonts w:ascii="Georgia" w:hAnsi="Georgia" w:cs="Georgia" w:eastAsia="Georgia"/>
-          <w:i w:val="0"/>
-          <w:iCs w:val="0"/>
+      </w:pPr>
+      <w:r>
+        <w:rPr>
+          <w:rFonts w:ascii="Georgia" w:hAnsi="Georgia" w:cs="Georgia" w:eastAsia="Georgia"/>
           <w:sz w:val="20"/>
           <w:szCs w:val="20"/>
-          <w:rtl w:val="0"/>
-        </w:rPr>
-        <w:t xml:space="preserve">
-        • FP: “In conclusion, T3 produced the highest yield.” Removing the frame changes neither truth-commitment nor interpersonal imposition toward readers/prior work → FP. Not a function label.
-    </w:t>
-      </w:r>
-      <w:r>
-        <w:rPr>
-          <w:rFonts w:ascii="Georgia" w:hAnsi="Georgia" w:cs="Georgia" w:eastAsia="Georgia"/>
-          <w:rtl w:val="0"/>
-          <w:sz w:val="20"/>
-          <w:szCs w:val="20"/>
-        </w:rPr>
-      </w:r>
-    </w:p>
-    <w:p>
-      <w:pPr>
-        <w:spacing w:before="0" w:after="40" w:line="276" w:lineRule="auto"/>
-        <w:ind w:left="360" w:hanging="360"/>
-        <w:jc w:val="both"/>
-        <w:rPr/>
-      </w:pPr>
-      <w:r>
-        <w:rPr>
-          <w:rFonts w:ascii="Georgia" w:hAnsi="Georgia" w:cs="Georgia" w:eastAsia="Georgia"/>
-          <w:i w:val="0"/>
-          <w:iCs w:val="0"/>
-          <w:sz w:val="20"/>
-          <w:szCs w:val="20"/>
-          <w:rtl w:val="0"/>
-        </w:rPr>
-        <w:t xml:space="preserve">• Frame + separate EC: “It should be noted that the results may indicate growth.” Code may via Working Test as EC. The frame alone fails the claim condition or both checks and is not a second hedge.</w:t>
-      </w:r>
-    </w:p>
-    <w:p>
-      <w:pPr>
-        <w:spacing w:before="0" w:after="40" w:line="276" w:lineRule="auto"/>
-        <w:ind w:left="360" w:hanging="360"/>
-        <w:jc w:val="both"/>
-        <w:rPr/>
-      </w:pPr>
-      <w:r>
-        <w:rPr>
-          <w:rFonts w:ascii="Georgia" w:hAnsi="Georgia" w:cs="Georgia" w:eastAsia="Georgia"/>
-          <w:i w:val="0"/>
-          <w:iCs w:val="0"/>
-          <w:sz w:val="20"/>
-          <w:szCs w:val="20"/>
-          <w:rtl w:val="0"/>
         </w:rPr>
         <w:t xml:space="preserve">• Summary: Step 1 is wide. Step 2 uses a claim condition, then the Working Test (EC) and Reader Test (P). Non-claims fail the claim condition and are FP. Neither removal check met → FP (not a function). Step 3 assigns type to retained hedges only. In this corpus all 65 retained tokens were EC. No P forms appeared on claims. FP cases are inventoried separately with reason codes.</w:t>
       </w:r>
     </w:p>
     <w:p>
       <w:pPr>
-        <w:spacing w:before="80" w:after="40" w:line="276" w:lineRule="auto"/>
+        <w:keepNext/>
+        <w:spacing w:before="100" w:after="40" w:line="300" w:lineRule="auto"/>
         <w:jc w:val="left"/>
-        <w:keepNext/>
-        <w:rPr/>
       </w:pPr>
       <w:r>
         <w:rPr>
@@ -13928,15 +13670,13 @@
     </w:p>
     <w:p>
       <w:pPr>
-        <w:spacing w:before="0" w:after="40" w:line="276" w:lineRule="auto"/>
+        <w:spacing w:before="0" w:after="60" w:line="300" w:lineRule="auto"/>
         <w:ind w:left="360"/>
         <w:jc w:val="both"/>
-        <w:rPr/>
       </w:pPr>
       <w:r>
         <w:rPr>
           <w:rFonts w:ascii="Georgia" w:cs="Georgia" w:eastAsia="Georgia" w:hAnsi="Georgia"/>
-          <w:b w:val="0"/>
           <w:bCs w:val="0"/>
           <w:i w:val="0"/>
           <w:iCs w:val="0"/>
@@ -14727,15 +14467,13 @@
     </w:tbl>
     <w:p>
       <w:pPr>
-        <w:spacing w:before="120" w:after="40" w:line="276" w:lineRule="auto"/>
+        <w:spacing w:before="160" w:after="60" w:line="300" w:lineRule="auto"/>
         <w:ind w:left="360"/>
         <w:jc w:val="both"/>
-        <w:rPr/>
-      </w:pPr>
-      <w:r>
-        <w:rPr>
-          <w:rFonts w:ascii="Georgia" w:hAnsi="Georgia" w:cs="Georgia" w:eastAsia="Georgia"/>
-          <w:b w:val="0"/>
+      </w:pPr>
+      <w:r>
+        <w:rPr>
+          <w:rFonts w:ascii="Georgia" w:hAnsi="Georgia" w:cs="Georgia" w:eastAsia="Georgia"/>
           <w:bCs w:val="0"/>
           <w:i w:val="1"/>
           <w:iCs w:val="1"/>
@@ -14749,7 +14487,6 @@
       <w:r>
         <w:rPr>
           <w:rFonts w:ascii="Georgia" w:cs="Georgia" w:eastAsia="Georgia" w:hAnsi="Georgia"/>
-          <w:b w:val="1"/>
           <w:bCs w:val="1"/>
           <w:i w:val="1"/>
           <w:iCs w:val="1"/>
@@ -14762,7 +14499,6 @@
       <w:r>
         <w:rPr>
           <w:rFonts w:ascii="Georgia" w:cs="Georgia" w:eastAsia="Georgia" w:hAnsi="Georgia"/>
-          <w:b w:val="0"/>
           <w:bCs w:val="0"/>
           <w:i w:val="1"/>
           <w:iCs w:val="1"/>
@@ -14783,203 +14519,24 @@
     </w:p>
     <w:p>
       <w:pPr>
-        <w:spacing w:before="0" w:after="40" w:line="276" w:lineRule="auto"/>
+        <w:spacing w:before="0" w:after="60" w:line="300" w:lineRule="auto"/>
         <w:ind w:left="360" w:hanging="360"/>
         <w:jc w:val="both"/>
-        <w:rPr/>
-      </w:pPr>
-      <w:r>
-        <w:rPr>
-          <w:rFonts w:ascii="Georgia" w:hAnsi="Georgia" w:cs="Georgia" w:eastAsia="Georgia"/>
-          <w:b w:val="0"/>
-          <w:i w:val="0"/>
-          <w:iCs w:val="0"/>
+      </w:pPr>
+      <w:r>
+        <w:rPr>
+          <w:rFonts w:ascii="Georgia" w:hAnsi="Georgia" w:cs="Georgia" w:eastAsia="Georgia"/>
           <w:sz w:val="20"/>
           <w:szCs w:val="20"/>
-          <w:rtl w:val="0"/>
-        </w:rPr>
-        <w:t>• imply / implies / implying = suggest. • can be concluded / derived / stated = inferential hedge (not capability can). • potentially = adverbial. • potential + noun: aim/methods topic-naming = FP-Gen. Results/conclusion qualifying a finding = Lexical EC. If removing potential changes commitment to a proposition, code Lexical EC.</w:t>
-      </w:r>
-      <w:r>
-        <w:rPr>
-          <w:rFonts w:ascii="Georgia" w:cs="Georgia" w:eastAsia="Georgia" w:hAnsi="Georgia"/>
-          <w:i w:val="1"/>
-          <w:iCs w:val="1"/>
-          <w:color w:val="000000"/>
-          <w:sz w:val="20"/>
-          <w:szCs w:val="20"/>
-          <w:rtl w:val="0"/>
-        </w:rPr>
-      </w:r>
-      <w:r>
-        <w:rPr>
-          <w:rFonts w:ascii="Georgia" w:cs="Georgia" w:eastAsia="Georgia" w:hAnsi="Georgia"/>
-          <w:i w:val="0"/>
-          <w:iCs w:val="0"/>
-          <w:color w:val="000000"/>
-          <w:sz w:val="20"/>
-          <w:szCs w:val="20"/>
-          <w:rtl w:val="0"/>
-        </w:rPr>
-      </w:r>
-      <w:r>
-        <w:rPr>
-          <w:rFonts w:ascii="Georgia" w:cs="Georgia" w:eastAsia="Georgia" w:hAnsi="Georgia"/>
-          <w:i w:val="1"/>
-          <w:iCs w:val="1"/>
-          <w:color w:val="000000"/>
-          <w:sz w:val="20"/>
-          <w:szCs w:val="20"/>
-          <w:rtl w:val="0"/>
-        </w:rPr>
-      </w:r>
-      <w:r>
-        <w:rPr>
-          <w:rFonts w:ascii="Georgia" w:cs="Georgia" w:eastAsia="Georgia" w:hAnsi="Georgia"/>
-          <w:i w:val="0"/>
-          <w:iCs w:val="0"/>
-          <w:color w:val="000000"/>
-          <w:sz w:val="20"/>
-          <w:szCs w:val="20"/>
-          <w:rtl w:val="0"/>
-        </w:rPr>
-      </w:r>
-      <w:r>
-        <w:rPr>
-          <w:rFonts w:ascii="Georgia" w:cs="Georgia" w:eastAsia="Georgia" w:hAnsi="Georgia"/>
-          <w:i w:val="1"/>
-          <w:iCs w:val="1"/>
-          <w:color w:val="000000"/>
-          <w:sz w:val="20"/>
-          <w:szCs w:val="20"/>
-          <w:rtl w:val="0"/>
-        </w:rPr>
-      </w:r>
-      <w:r>
-        <w:rPr>
-          <w:rFonts w:ascii="Georgia" w:cs="Georgia" w:eastAsia="Georgia" w:hAnsi="Georgia"/>
-          <w:i w:val="0"/>
-          <w:iCs w:val="0"/>
-          <w:color w:val="000000"/>
-          <w:sz w:val="20"/>
-          <w:szCs w:val="20"/>
-          <w:rtl w:val="0"/>
-        </w:rPr>
-      </w:r>
-      <w:r>
-        <w:rPr>
-          <w:rFonts w:ascii="Georgia" w:cs="Georgia" w:eastAsia="Georgia" w:hAnsi="Georgia"/>
-          <w:i w:val="1"/>
-          <w:iCs w:val="1"/>
-          <w:color w:val="000000"/>
-          <w:sz w:val="20"/>
-          <w:szCs w:val="20"/>
-          <w:rtl w:val="0"/>
-        </w:rPr>
-      </w:r>
-      <w:r>
-        <w:rPr>
-          <w:rFonts w:ascii="Georgia" w:cs="Georgia" w:eastAsia="Georgia" w:hAnsi="Georgia"/>
-          <w:i w:val="0"/>
-          <w:iCs w:val="0"/>
-          <w:color w:val="000000"/>
-          <w:sz w:val="20"/>
-          <w:szCs w:val="20"/>
-          <w:rtl w:val="0"/>
-        </w:rPr>
-      </w:r>
-      <w:r>
-        <w:rPr>
-          <w:rFonts w:ascii="Georgia" w:cs="Georgia" w:eastAsia="Georgia" w:hAnsi="Georgia"/>
-          <w:i w:val="1"/>
-          <w:iCs w:val="1"/>
-          <w:color w:val="000000"/>
-          <w:sz w:val="20"/>
-          <w:szCs w:val="20"/>
-          <w:rtl w:val="0"/>
-        </w:rPr>
-      </w:r>
-      <w:r>
-        <w:rPr>
-          <w:rFonts w:ascii="Georgia" w:cs="Georgia" w:eastAsia="Georgia" w:hAnsi="Georgia"/>
-          <w:i w:val="0"/>
-          <w:iCs w:val="0"/>
-          <w:color w:val="000000"/>
-          <w:sz w:val="20"/>
-          <w:szCs w:val="20"/>
-          <w:rtl w:val="0"/>
-        </w:rPr>
-      </w:r>
-      <w:r>
-        <w:rPr>
-          <w:rFonts w:ascii="Georgia" w:cs="Georgia" w:eastAsia="Georgia" w:hAnsi="Georgia"/>
-          <w:i w:val="1"/>
-          <w:iCs w:val="1"/>
-          <w:color w:val="000000"/>
-          <w:sz w:val="20"/>
-          <w:szCs w:val="20"/>
-          <w:rtl w:val="0"/>
-        </w:rPr>
-      </w:r>
-      <w:r>
-        <w:rPr>
-          <w:rFonts w:ascii="Georgia" w:cs="Georgia" w:eastAsia="Georgia" w:hAnsi="Georgia"/>
-          <w:i w:val="0"/>
-          <w:iCs w:val="0"/>
-          <w:color w:val="000000"/>
-          <w:sz w:val="20"/>
-          <w:szCs w:val="20"/>
-          <w:rtl w:val="0"/>
-        </w:rPr>
-      </w:r>
-      <w:r>
-        <w:rPr>
-          <w:rFonts w:ascii="Georgia" w:cs="Georgia" w:eastAsia="Georgia" w:hAnsi="Georgia"/>
-          <w:i w:val="1"/>
-          <w:iCs w:val="1"/>
-          <w:color w:val="000000"/>
-          <w:sz w:val="20"/>
-          <w:szCs w:val="20"/>
-          <w:rtl w:val="0"/>
-        </w:rPr>
-      </w:r>
-      <w:r>
-        <w:rPr>
-          <w:rFonts w:ascii="Georgia" w:cs="Georgia" w:eastAsia="Georgia" w:hAnsi="Georgia"/>
-          <w:i w:val="0"/>
-          <w:iCs w:val="0"/>
-          <w:color w:val="000000"/>
-          <w:sz w:val="20"/>
-          <w:szCs w:val="20"/>
-          <w:rtl w:val="0"/>
-        </w:rPr>
-      </w:r>
-      <w:r>
-        <w:rPr>
-          <w:rFonts w:ascii="Georgia" w:cs="Georgia" w:eastAsia="Georgia" w:hAnsi="Georgia"/>
-          <w:i w:val="1"/>
-          <w:iCs w:val="1"/>
-          <w:color w:val="000000"/>
-          <w:sz w:val="20"/>
-          <w:szCs w:val="20"/>
-          <w:rtl w:val="0"/>
-        </w:rPr>
-      </w:r>
-      <w:r>
-        <w:rPr>
-          <w:rFonts w:ascii="Georgia" w:hAnsi="Georgia" w:cs="Georgia" w:eastAsia="Georgia"/>
-          <w:rtl w:val="0"/>
-          <w:sz w:val="20"/>
-          <w:szCs w:val="20"/>
-        </w:rPr>
-      </w:r>
-    </w:p>
-    <w:p>
-      <w:pPr>
-        <w:spacing w:before="80" w:after="40" w:line="276" w:lineRule="auto"/>
+        </w:rPr>
+        <w:t xml:space="preserve">• imply / implies / implying = suggest. • can be concluded / derived / stated = inferential hedge (not capability can). • potentially = adverbial. • potential + noun: aim/methods topic-naming = FP-Gen. Results/conclusion qualifying a finding = Lexical EC. If removing potential changes commitment to a proposition, code Lexical EC.</w:t>
+      </w:r>
+    </w:p>
+    <w:p>
+      <w:pPr>
+        <w:keepNext/>
+        <w:spacing w:before="100" w:after="40" w:line="300" w:lineRule="auto"/>
         <w:jc w:val="left"/>
-        <w:keepNext/>
-        <w:rPr/>
       </w:pPr>
       <w:r>
         <w:rPr>
@@ -15715,10 +15272,9 @@
     </w:tbl>
     <w:p>
       <w:pPr>
-        <w:spacing w:before="120" w:after="40" w:line="276" w:lineRule="auto"/>
+        <w:keepNext/>
+        <w:spacing w:before="160" w:after="40" w:line="300" w:lineRule="auto"/>
         <w:jc w:val="left"/>
-        <w:keepNext/>
-        <w:rPr/>
       </w:pPr>
       <w:r>
         <w:rPr>
@@ -15743,15 +15299,13 @@
     </w:p>
     <w:p>
       <w:pPr>
-        <w:spacing w:before="0" w:after="40" w:line="276" w:lineRule="auto"/>
+        <w:spacing w:before="0" w:after="60" w:line="300" w:lineRule="auto"/>
         <w:ind w:left="360"/>
         <w:jc w:val="both"/>
-        <w:rPr/>
       </w:pPr>
       <w:r>
         <w:rPr>
           <w:rFonts w:ascii="Georgia" w:cs="Georgia" w:eastAsia="Georgia" w:hAnsi="Georgia"/>
-          <w:b w:val="0"/>
           <w:bCs w:val="0"/>
           <w:i w:val="0"/>
           <w:iCs w:val="0"/>
@@ -16630,145 +16184,135 @@
     </w:tbl>
     <w:p>
       <w:pPr>
-        <w:spacing w:before="120" w:after="40" w:line="276" w:lineRule="auto"/>
+        <w:spacing w:before="160" w:after="60" w:line="300" w:lineRule="auto"/>
         <w:ind w:left="360"/>
         <w:jc w:val="both"/>
-        <w:rPr/>
+      </w:pPr>
+      <w:r>
+        <w:rPr>
+          <w:rFonts w:ascii="Georgia" w:cs="Georgia" w:eastAsia="Georgia" w:hAnsi="Georgia"/>
+          <w:bCs w:val="1"/>
+          <w:i w:val="1"/>
+          <w:iCs w:val="1"/>
+          <w:color w:val="000000"/>
+          <w:sz w:val="20"/>
+          <w:szCs w:val="20"/>
+          <w:rtl w:val="0"/>
+        </w:rPr>
+        <w:t xml:space="preserve">General exclusions: </w:t>
+      </w:r>
+      <w:r>
+        <w:rPr>
+          <w:rFonts w:ascii="Georgia" w:cs="Georgia" w:eastAsia="Georgia" w:hAnsi="Georgia"/>
+          <w:bCs w:val="0"/>
+          <w:i w:val="1"/>
+          <w:iCs w:val="1"/>
+          <w:color w:val="000000"/>
+          <w:sz w:val="20"/>
+          <w:szCs w:val="20"/>
+          <w:rtl w:val="0"/>
+        </w:rPr>
+        <w:t xml:space="preserve">ability, future procedure, and procedural necessity (a step required by the procedure itself) are never coded as hedges.</w:t>
+      </w:r>
+      <w:r>
+        <w:rPr>
+          <w:rFonts w:ascii="Georgia" w:hAnsi="Georgia" w:cs="Georgia" w:eastAsia="Georgia"/>
+          <w:rtl w:val="0"/>
+          <w:sz w:val="20"/>
+          <w:szCs w:val="20"/>
+        </w:rPr>
+      </w:r>
+    </w:p>
+    <w:p>
+      <w:pPr>
+        <w:spacing w:before="0" w:after="60" w:line="300" w:lineRule="auto"/>
+        <w:ind w:left="360"/>
+        <w:jc w:val="both"/>
+      </w:pPr>
+      <w:r>
+        <w:rPr>
+          <w:rFonts w:ascii="Georgia" w:cs="Georgia" w:eastAsia="Georgia" w:hAnsi="Georgia"/>
+          <w:bCs w:val="0"/>
+          <w:i w:val="1"/>
+          <w:iCs w:val="1"/>
+          <w:color w:val="000000"/>
+          <w:sz w:val="20"/>
+          <w:szCs w:val="20"/>
+          <w:rtl w:val="0"/>
+        </w:rPr>
+        <w:t xml:space="preserve">Quick test for </w:t>
+      </w:r>
+      <w:r>
+        <w:rPr>
+          <w:rFonts w:ascii="Georgia" w:cs="Georgia" w:eastAsia="Georgia" w:hAnsi="Georgia"/>
+          <w:bCs w:val="1"/>
+          <w:i w:val="1"/>
+          <w:iCs w:val="1"/>
+          <w:color w:val="000000"/>
+          <w:sz w:val="20"/>
+          <w:szCs w:val="20"/>
+          <w:rtl w:val="0"/>
+        </w:rPr>
+        <w:t xml:space="preserve">suggest/indicate</w:t>
+      </w:r>
+      <w:r>
+        <w:rPr>
+          <w:rFonts w:ascii="Georgia" w:cs="Georgia" w:eastAsia="Georgia" w:hAnsi="Georgia"/>
+          <w:bCs w:val="0"/>
+          <w:i w:val="1"/>
+          <w:iCs w:val="1"/>
+          <w:color w:val="000000"/>
+          <w:sz w:val="20"/>
+          <w:szCs w:val="20"/>
+          <w:rtl w:val="0"/>
+        </w:rPr>
+        <w:t xml:space="preserve">: “Might this be true?” = hedge. “Should this be done?” = FP-Rec.</w:t>
+      </w:r>
+      <w:r>
+        <w:rPr>
+          <w:rFonts w:ascii="Georgia" w:hAnsi="Georgia" w:cs="Georgia" w:eastAsia="Georgia"/>
+          <w:rtl w:val="0"/>
+          <w:sz w:val="20"/>
+          <w:szCs w:val="20"/>
+        </w:rPr>
+      </w:r>
+    </w:p>
+    <w:p>
+      <w:pPr>
+        <w:keepNext/>
+        <w:spacing w:before="100" w:after="40" w:line="300" w:lineRule="auto"/>
+        <w:jc w:val="left"/>
       </w:pPr>
       <w:r>
         <w:rPr>
           <w:rFonts w:ascii="Georgia" w:cs="Georgia" w:eastAsia="Georgia" w:hAnsi="Georgia"/>
           <w:b w:val="1"/>
           <w:bCs w:val="1"/>
-          <w:i w:val="1"/>
-          <w:iCs w:val="1"/>
-          <w:color w:val="000000"/>
-          <w:sz w:val="20"/>
-          <w:szCs w:val="20"/>
-          <w:rtl w:val="0"/>
-        </w:rPr>
-        <w:t xml:space="preserve">General exclusions: </w:t>
-      </w:r>
-      <w:r>
-        <w:rPr>
-          <w:rFonts w:ascii="Georgia" w:cs="Georgia" w:eastAsia="Georgia" w:hAnsi="Georgia"/>
-          <w:b w:val="0"/>
-          <w:bCs w:val="0"/>
-          <w:i w:val="1"/>
-          <w:iCs w:val="1"/>
-          <w:color w:val="000000"/>
-          <w:sz w:val="20"/>
-          <w:szCs w:val="20"/>
-          <w:rtl w:val="0"/>
-        </w:rPr>
-        <w:t xml:space="preserve">ability, future procedure, and procedural necessity (a step required by the procedure itself) are never coded as hedges.</w:t>
-      </w:r>
-      <w:r>
-        <w:rPr>
-          <w:rFonts w:ascii="Georgia" w:hAnsi="Georgia" w:cs="Georgia" w:eastAsia="Georgia"/>
-          <w:rtl w:val="0"/>
-          <w:sz w:val="20"/>
-          <w:szCs w:val="20"/>
-        </w:rPr>
-      </w:r>
-    </w:p>
-    <w:p>
-      <w:pPr>
-        <w:spacing w:before="0" w:after="40" w:line="276" w:lineRule="auto"/>
+          <w:sz w:val="22"/>
+          <w:szCs w:val="22"/>
+          <w:rtl w:val="0"/>
+        </w:rPr>
+        <w:t xml:space="preserve">MARKING FALSE POSITIVES</w:t>
+      </w:r>
+      <w:r>
+        <w:rPr>
+          <w:rFonts w:ascii="Georgia" w:hAnsi="Georgia" w:cs="Georgia" w:eastAsia="Georgia"/>
+          <w:rtl w:val="0"/>
+          <w:sz w:val="22"/>
+          <w:szCs w:val="22"/>
+          <w:b/>
+        </w:rPr>
+      </w:r>
+    </w:p>
+    <w:p>
+      <w:pPr>
+        <w:spacing w:before="0" w:after="60" w:line="300" w:lineRule="auto"/>
         <w:ind w:left="360"/>
         <w:jc w:val="both"/>
-        <w:rPr/>
       </w:pPr>
       <w:r>
         <w:rPr>
           <w:rFonts w:ascii="Georgia" w:cs="Georgia" w:eastAsia="Georgia" w:hAnsi="Georgia"/>
-          <w:b w:val="0"/>
-          <w:bCs w:val="0"/>
-          <w:i w:val="1"/>
-          <w:iCs w:val="1"/>
-          <w:color w:val="000000"/>
-          <w:sz w:val="20"/>
-          <w:szCs w:val="20"/>
-          <w:rtl w:val="0"/>
-        </w:rPr>
-        <w:t xml:space="preserve">Quick test for </w:t>
-      </w:r>
-      <w:r>
-        <w:rPr>
-          <w:rFonts w:ascii="Georgia" w:cs="Georgia" w:eastAsia="Georgia" w:hAnsi="Georgia"/>
-          <w:b w:val="1"/>
-          <w:bCs w:val="1"/>
-          <w:i w:val="1"/>
-          <w:iCs w:val="1"/>
-          <w:color w:val="000000"/>
-          <w:sz w:val="20"/>
-          <w:szCs w:val="20"/>
-          <w:rtl w:val="0"/>
-        </w:rPr>
-        <w:t xml:space="preserve">suggest/indicate</w:t>
-      </w:r>
-      <w:r>
-        <w:rPr>
-          <w:rFonts w:ascii="Georgia" w:cs="Georgia" w:eastAsia="Georgia" w:hAnsi="Georgia"/>
-          <w:b w:val="0"/>
-          <w:bCs w:val="0"/>
-          <w:i w:val="1"/>
-          <w:iCs w:val="1"/>
-          <w:color w:val="000000"/>
-          <w:sz w:val="20"/>
-          <w:szCs w:val="20"/>
-          <w:rtl w:val="0"/>
-        </w:rPr>
-        <w:t xml:space="preserve">: “Might this be true?” = hedge. “Should this be done?” = FP-Rec.</w:t>
-      </w:r>
-      <w:r>
-        <w:rPr>
-          <w:rFonts w:ascii="Georgia" w:hAnsi="Georgia" w:cs="Georgia" w:eastAsia="Georgia"/>
-          <w:rtl w:val="0"/>
-          <w:sz w:val="20"/>
-          <w:szCs w:val="20"/>
-        </w:rPr>
-      </w:r>
-    </w:p>
-    <w:p>
-      <w:pPr>
-        <w:spacing w:before="80" w:after="40" w:line="276" w:lineRule="auto"/>
-        <w:jc w:val="left"/>
-        <w:keepNext/>
-        <w:rPr/>
-      </w:pPr>
-      <w:r>
-        <w:rPr>
-          <w:rFonts w:ascii="Georgia" w:cs="Georgia" w:eastAsia="Georgia" w:hAnsi="Georgia"/>
-          <w:b w:val="1"/>
-          <w:bCs w:val="1"/>
-          <w:sz w:val="22"/>
-          <w:szCs w:val="22"/>
-          <w:rtl w:val="0"/>
-        </w:rPr>
-        <w:t xml:space="preserve">MARKING FALSE POSITIVES</w:t>
-      </w:r>
-      <w:r>
-        <w:rPr>
-          <w:rFonts w:ascii="Georgia" w:hAnsi="Georgia" w:cs="Georgia" w:eastAsia="Georgia"/>
-          <w:rtl w:val="0"/>
-          <w:sz w:val="22"/>
-          <w:szCs w:val="22"/>
-          <w:b/>
-        </w:rPr>
-      </w:r>
-    </w:p>
-    <w:p>
-      <w:pPr>
-        <w:spacing w:before="0" w:after="40" w:line="276" w:lineRule="auto"/>
-        <w:ind w:left="360"/>
-        <w:jc w:val="both"/>
-        <w:rPr/>
-      </w:pPr>
-      <w:r>
-        <w:rPr>
-          <w:rFonts w:ascii="Georgia" w:cs="Georgia" w:eastAsia="Georgia" w:hAnsi="Georgia"/>
-          <w:b w:val="0"/>
           <w:bCs w:val="0"/>
           <w:i w:val="0"/>
           <w:iCs w:val="0"/>
@@ -17542,10 +17086,9 @@
     </w:tbl>
     <w:p>
       <w:pPr>
-        <w:spacing w:before="120" w:after="40" w:line="276" w:lineRule="auto"/>
+        <w:keepNext/>
+        <w:spacing w:before="160" w:after="40" w:line="300" w:lineRule="auto"/>
         <w:jc w:val="left"/>
-        <w:keepNext/>
-        <w:rPr/>
       </w:pPr>
       <w:r>
         <w:rPr>
@@ -17570,132 +17113,90 @@
     </w:p>
     <w:p>
       <w:pPr>
-        <w:spacing w:before="0" w:after="40" w:line="276" w:lineRule="auto"/>
+        <w:spacing w:before="0" w:after="60" w:line="300" w:lineRule="auto"/>
         <w:ind w:left="360" w:hanging="360"/>
         <w:jc w:val="both"/>
-        <w:rPr/>
-      </w:pPr>
-      <w:r>
-        <w:rPr>
-          <w:rFonts w:ascii="Georgia" w:hAnsi="Georgia" w:cs="Georgia" w:eastAsia="Georgia"/>
-          <w:b w:val="0"/>
-          <w:bCs w:val="0"/>
-          <w:i w:val="0"/>
-          <w:iCs w:val="0"/>
-          <w:color w:val="000000"/>
+      </w:pPr>
+      <w:r>
+        <w:rPr>
+          <w:rFonts w:ascii="Georgia" w:hAnsi="Georgia" w:cs="Georgia" w:eastAsia="Georgia"/>
           <w:sz w:val="20"/>
           <w:szCs w:val="20"/>
-          <w:rtl w:val="0"/>
         </w:rPr>
         <w:t xml:space="preserve">• Grey-highlight the main assertive verb; place [G] or [C] beside it (same placement as (EC) on hedges).</w:t>
       </w:r>
     </w:p>
     <w:p>
       <w:pPr>
-        <w:spacing w:before="0" w:after="40" w:line="276" w:lineRule="auto"/>
+        <w:spacing w:before="0" w:after="60" w:line="300" w:lineRule="auto"/>
         <w:ind w:left="360" w:hanging="360"/>
         <w:jc w:val="both"/>
-        <w:rPr/>
-      </w:pPr>
-      <w:r>
-        <w:rPr>
-          <w:rFonts w:ascii="Georgia" w:hAnsi="Georgia" w:cs="Georgia" w:eastAsia="Georgia"/>
-          <w:b w:val="0"/>
-          <w:bCs w:val="0"/>
-          <w:i w:val="0"/>
-          <w:iCs w:val="0"/>
-          <w:color w:val="000000"/>
+      </w:pPr>
+      <w:r>
+        <w:rPr>
+          <w:rFonts w:ascii="Georgia" w:hAnsi="Georgia" w:cs="Georgia" w:eastAsia="Georgia"/>
           <w:sz w:val="20"/>
           <w:szCs w:val="20"/>
-          <w:rtl w:val="0"/>
         </w:rPr>
         <w:t xml:space="preserve">• Mark only claims where caution was warranted but absent.</w:t>
       </w:r>
     </w:p>
     <w:p>
       <w:pPr>
-        <w:spacing w:before="0" w:after="40" w:line="276" w:lineRule="auto"/>
+        <w:spacing w:before="0" w:after="60" w:line="300" w:lineRule="auto"/>
         <w:ind w:left="360" w:hanging="360"/>
         <w:jc w:val="both"/>
-        <w:rPr/>
-      </w:pPr>
-      <w:r>
-        <w:rPr>
-          <w:rFonts w:ascii="Georgia" w:hAnsi="Georgia" w:cs="Georgia" w:eastAsia="Georgia"/>
-          <w:b w:val="0"/>
-          <w:bCs w:val="0"/>
-          <w:i w:val="0"/>
-          <w:iCs w:val="0"/>
-          <w:color w:val="000000"/>
+      </w:pPr>
+      <w:r>
+        <w:rPr>
+          <w:rFonts w:ascii="Georgia" w:hAnsi="Georgia" w:cs="Georgia" w:eastAsia="Georgia"/>
           <w:sz w:val="20"/>
           <w:szCs w:val="20"/>
-          <w:rtl w:val="0"/>
         </w:rPr>
         <w:t xml:space="preserve">• [G] = generalization or evaluative ranking beyond the data.</w:t>
       </w:r>
     </w:p>
     <w:p>
       <w:pPr>
-        <w:spacing w:before="0" w:after="40" w:line="276" w:lineRule="auto"/>
+        <w:spacing w:before="0" w:after="60" w:line="300" w:lineRule="auto"/>
         <w:ind w:left="360" w:hanging="360"/>
         <w:jc w:val="both"/>
-        <w:rPr/>
-      </w:pPr>
-      <w:r>
-        <w:rPr>
-          <w:rFonts w:ascii="Georgia" w:hAnsi="Georgia" w:cs="Georgia" w:eastAsia="Georgia"/>
-          <w:b w:val="0"/>
-          <w:bCs w:val="0"/>
-          <w:i w:val="0"/>
-          <w:iCs w:val="0"/>
-          <w:color w:val="000000"/>
+      </w:pPr>
+      <w:r>
+        <w:rPr>
+          <w:rFonts w:ascii="Georgia" w:hAnsi="Georgia" w:cs="Georgia" w:eastAsia="Georgia"/>
           <w:sz w:val="20"/>
           <w:szCs w:val="20"/>
-          <w:rtl w:val="0"/>
         </w:rPr>
         <w:t xml:space="preserve">• [C] = cause–effect or impact stronger than the design supports.</w:t>
       </w:r>
     </w:p>
     <w:p>
       <w:pPr>
-        <w:spacing w:before="0" w:after="40" w:line="276" w:lineRule="auto"/>
+        <w:spacing w:before="0" w:after="60" w:line="300" w:lineRule="auto"/>
         <w:ind w:left="360" w:hanging="360"/>
         <w:jc w:val="both"/>
-        <w:rPr/>
-      </w:pPr>
-      <w:r>
-        <w:rPr>
-          <w:rFonts w:ascii="Georgia" w:hAnsi="Georgia" w:cs="Georgia" w:eastAsia="Georgia"/>
-          <w:b w:val="0"/>
-          <w:bCs w:val="0"/>
-          <w:i w:val="0"/>
-          <w:iCs w:val="0"/>
-          <w:color w:val="000000"/>
+      </w:pPr>
+      <w:r>
+        <w:rPr>
+          <w:rFonts w:ascii="Georgia" w:hAnsi="Georgia" w:cs="Georgia" w:eastAsia="Georgia"/>
           <w:sz w:val="20"/>
           <w:szCs w:val="20"/>
-          <w:rtl w:val="0"/>
         </w:rPr>
         <w:t xml:space="preserve">• Do not mark bare trial results, measured findings, or procedural statements.</w:t>
       </w:r>
     </w:p>
     <w:p>
       <w:pPr>
-        <w:spacing w:before="0" w:after="40" w:line="276" w:lineRule="auto"/>
+        <w:spacing w:before="0" w:after="60" w:line="300" w:lineRule="auto"/>
         <w:ind w:left="360" w:hanging="360"/>
         <w:jc w:val="both"/>
-        <w:rPr/>
-      </w:pPr>
-      <w:r>
-        <w:rPr>
-          <w:rFonts w:ascii="Georgia" w:hAnsi="Georgia" w:cs="Georgia" w:eastAsia="Georgia"/>
-          <w:b w:val="0"/>
-          <w:bCs w:val="0"/>
-          <w:i w:val="0"/>
-          <w:iCs w:val="0"/>
-          <w:color w:val="000000"/>
+      </w:pPr>
+      <w:r>
+        <w:rPr>
+          <w:rFonts w:ascii="Georgia" w:hAnsi="Georgia" w:cs="Georgia" w:eastAsia="Georgia"/>
           <w:sz w:val="20"/>
           <w:szCs w:val="20"/>
-          <w:rtl w:val="0"/>
         </w:rPr>
         <w:t xml:space="preserve">• Record the full clause in the coding sheet.</w:t>
       </w:r>
@@ -18251,9 +17752,9 @@
     </w:tbl>
     <w:p>
       <w:pPr>
-        <w:spacing w:before="120" w:after="40" w:line="276" w:lineRule="auto"/>
+        <w:keepNext/>
+        <w:spacing w:before="160" w:after="40" w:line="300" w:lineRule="auto"/>
         <w:jc w:val="left"/>
-        <w:rPr/>
       </w:pPr>
       <w:r>
         <w:rPr>
@@ -19643,128 +19144,62 @@
     </w:tbl>
     <w:p>
       <w:pPr>
-        <w:spacing w:before="120" w:after="40" w:line="276" w:lineRule="auto"/>
+        <w:spacing w:before="160" w:after="60" w:line="300" w:lineRule="auto"/>
         <w:ind w:left="360" w:hanging="360"/>
         <w:jc w:val="both"/>
-        <w:rPr/>
-      </w:pPr>
-      <w:r>
-        <w:rPr>
-          <w:rFonts w:ascii="Georgia" w:hAnsi="Georgia" w:cs="Georgia" w:eastAsia="Georgia"/>
-          <w:b w:val="0"/>
-          <w:bCs w:val="0"/>
-          <w:i w:val="0"/>
-          <w:iCs w:val="0"/>
+      </w:pPr>
+      <w:r>
+        <w:rPr>
+          <w:rFonts w:ascii="Georgia" w:hAnsi="Georgia" w:cs="Georgia" w:eastAsia="Georgia"/>
           <w:sz w:val="20"/>
           <w:szCs w:val="20"/>
-          <w:rtl w:val="0"/>
-        </w:rPr>
-        <w:t>• Highlighted abstract = primary record. Spreadsheet = tallying and analysis only.</w:t>
-      </w:r>
-      <w:r>
-        <w:rPr>
-          <w:rFonts w:ascii="Georgia" w:hAnsi="Georgia" w:cs="Georgia" w:eastAsia="Georgia"/>
-          <w:rtl w:val="0"/>
+        </w:rPr>
+        <w:t xml:space="preserve">• Highlighted abstract = primary record. Spreadsheet = tallying and analysis only.</w:t>
+      </w:r>
+    </w:p>
+    <w:p>
+      <w:pPr>
+        <w:spacing w:before="0" w:after="60" w:line="300" w:lineRule="auto"/>
+        <w:ind w:left="360" w:hanging="360"/>
+        <w:jc w:val="both"/>
+      </w:pPr>
+      <w:r>
+        <w:rPr>
+          <w:rFonts w:ascii="Georgia" w:hAnsi="Georgia" w:cs="Georgia" w:eastAsia="Georgia"/>
           <w:sz w:val="20"/>
           <w:szCs w:val="20"/>
         </w:rPr>
-      </w:r>
-    </w:p>
-    <w:p>
-      <w:pPr>
-        <w:spacing w:before="0" w:after="40" w:line="276" w:lineRule="auto"/>
+        <w:t xml:space="preserve">• Codes: Acs1–Acs10, Aas1–Aas10 (Agriculture). VM1–VM20. B1–B20 (Biology).</w:t>
+      </w:r>
+    </w:p>
+    <w:p>
+      <w:pPr>
+        <w:spacing w:before="0" w:after="60" w:line="300" w:lineRule="auto"/>
         <w:ind w:left="360" w:hanging="360"/>
         <w:jc w:val="both"/>
-        <w:rPr/>
-      </w:pPr>
-      <w:r>
-        <w:rPr>
-          <w:rFonts w:ascii="Georgia" w:hAnsi="Georgia" w:cs="Georgia" w:eastAsia="Georgia"/>
-          <w:b w:val="0"/>
-          <w:bCs w:val="0"/>
-          <w:i w:val="1"/>
-          <w:iCs w:val="1"/>
-          <w:color w:val="000000"/>
+      </w:pPr>
+      <w:r>
+        <w:rPr>
+          <w:rFonts w:ascii="Georgia" w:hAnsi="Georgia" w:cs="Georgia" w:eastAsia="Georgia"/>
           <w:sz w:val="20"/>
           <w:szCs w:val="20"/>
-          <w:rtl w:val="0"/>
-        </w:rPr>
-        <w:t>• Codes: Acs1–Acs10, Aas1–Aas10 (Agriculture). VM1–VM20. B1–B20 (Biology).</w:t>
-      </w:r>
-      <w:r>
-        <w:rPr>
-          <w:rFonts w:ascii="Georgia" w:hAnsi="Georgia" w:cs="Georgia" w:eastAsia="Georgia"/>
-          <w:rtl w:val="0"/>
+        </w:rPr>
+        <w:t xml:space="preserve">• Unhedged rows separate from hedge tallies. [G]/[C] only for warranted-but-absent caution.</w:t>
+      </w:r>
+    </w:p>
+    <w:p>
+      <w:pPr>
+        <w:spacing w:before="0" w:after="60" w:line="300" w:lineRule="auto"/>
+        <w:ind w:left="360" w:hanging="360"/>
+        <w:jc w:val="both"/>
+      </w:pPr>
+      <w:r>
+        <w:rPr>
+          <w:rFonts w:ascii="Georgia" w:hAnsi="Georgia" w:cs="Georgia" w:eastAsia="Georgia"/>
           <w:sz w:val="20"/>
           <w:szCs w:val="20"/>
         </w:rPr>
-      </w:r>
-    </w:p>
-    <w:p>
-      <w:pPr>
-        <w:spacing w:before="0" w:after="40" w:line="276" w:lineRule="auto"/>
-        <w:ind w:left="360" w:hanging="360"/>
-        <w:jc w:val="both"/>
-        <w:rPr/>
-      </w:pPr>
-      <w:r>
-        <w:rPr>
-          <w:rFonts w:ascii="Georgia" w:hAnsi="Georgia" w:cs="Georgia" w:eastAsia="Georgia"/>
-          <w:b w:val="0"/>
-          <w:bCs w:val="0"/>
-          <w:i w:val="1"/>
-          <w:iCs w:val="1"/>
-          <w:color w:val="000000"/>
-          <w:sz w:val="20"/>
-          <w:szCs w:val="20"/>
-          <w:rtl w:val="0"/>
-        </w:rPr>
-        <w:t>• Unhedged rows separate from hedge tallies. [G]/[C] only for warranted-but-absent caution.</w:t>
-      </w:r>
-      <w:r>
-        <w:rPr>
-          <w:rFonts w:ascii="Georgia" w:hAnsi="Georgia" w:cs="Georgia" w:eastAsia="Georgia"/>
-          <w:rtl w:val="0"/>
-          <w:sz w:val="20"/>
-          <w:szCs w:val="20"/>
-        </w:rPr>
-      </w:r>
-    </w:p>
-    <w:p>
-      <w:pPr>
-        <w:spacing w:before="0" w:after="40" w:line="276" w:lineRule="auto"/>
-        <w:ind w:left="360" w:hanging="360"/>
-        <w:jc w:val="both"/>
-        <w:rPr/>
-        <w:sectPr>
-          <w:headerReference r:id="rId9" w:type="default"/>
-          <w:headerReference r:id="rId10" w:type="first"/>
-          <w:type w:val="nextPage"/>
-          <w:pgSz w:h="16838" w:w="11906" w:orient="portrait"/>
-          <w:pgMar w:bottom="1440" w:top="1440" w:left="2160" w:right="1440" w:header="720" w:footer="720"/>
-          <w:titlePg w:val="1"/>
-        </w:sectPr>
-      </w:pPr>
-      <w:r>
-        <w:rPr>
-          <w:rFonts w:ascii="Georgia" w:hAnsi="Georgia" w:cs="Georgia" w:eastAsia="Georgia"/>
-          <w:b w:val="0"/>
-          <w:bCs w:val="0"/>
-          <w:i w:val="1"/>
-          <w:iCs w:val="1"/>
-          <w:sz w:val="20"/>
-          <w:szCs w:val="20"/>
-          <w:rtl w:val="0"/>
-        </w:rPr>
-        <w:t>• Optional Rejected Candidates tab for FP traceability.</w:t>
-      </w:r>
-      <w:r>
-        <w:rPr>
-          <w:rFonts w:ascii="Georgia" w:hAnsi="Georgia" w:cs="Georgia" w:eastAsia="Georgia"/>
-          <w:rtl w:val="0"/>
-          <w:sz w:val="20"/>
-          <w:szCs w:val="20"/>
-        </w:rPr>
+        <w:t xml:space="preserve">• Optional Rejected Candidates tab for FP traceability.</w:t>
       </w:r>
     </w:p>
     <w:p>

</xml_diff>

<commit_message>
Draft_104: QR line spacing bump to fill page without Combined Example spill
</commit_message>
<xml_diff>
--- a/thesis/003_ThesisProposal_Draft_104.docx
+++ b/thesis/003_ThesisProposal_Draft_104.docx
@@ -12312,7 +12312,7 @@
     </w:p>
     <w:p>
       <w:pPr>
-        <w:spacing w:before="0" w:after="80" w:line="280" w:lineRule="auto"/>
+        <w:spacing w:before="0" w:after="80" w:line="320" w:lineRule="auto"/>
         <w:jc w:val="left"/>
       </w:pPr>
       <w:r>
@@ -12338,7 +12338,7 @@
     </w:p>
     <w:p>
       <w:pPr>
-        <w:spacing w:before="0" w:after="40" w:line="280" w:lineRule="auto"/>
+        <w:spacing w:before="0" w:after="60" w:line="320" w:lineRule="auto"/>
         <w:ind w:left="288" w:hanging="288"/>
         <w:jc w:val="both"/>
       </w:pPr>
@@ -12353,7 +12353,7 @@
     </w:p>
     <w:p>
       <w:pPr>
-        <w:spacing w:before="80" w:after="40" w:line="280" w:lineRule="auto"/>
+        <w:spacing w:before="100" w:after="40" w:line="320" w:lineRule="auto"/>
         <w:jc w:val="left"/>
       </w:pPr>
       <w:r>
@@ -12379,7 +12379,7 @@
     </w:p>
     <w:p>
       <w:pPr>
-        <w:spacing w:before="0" w:after="40" w:line="280" w:lineRule="auto"/>
+        <w:spacing w:before="0" w:after="60" w:line="320" w:lineRule="auto"/>
         <w:ind w:left="288" w:hanging="288"/>
         <w:jc w:val="both"/>
       </w:pPr>
@@ -12394,7 +12394,7 @@
     </w:p>
     <w:p>
       <w:pPr>
-        <w:spacing w:before="40" w:after="20" w:line="280" w:lineRule="auto"/>
+        <w:spacing w:before="40" w:after="20" w:line="320" w:lineRule="auto"/>
         <w:jc w:val="left"/>
       </w:pPr>
       <w:r>
@@ -12420,7 +12420,7 @@
     </w:p>
     <w:p>
       <w:pPr>
-        <w:spacing w:before="0" w:after="40" w:line="280" w:lineRule="auto"/>
+        <w:spacing w:before="0" w:after="60" w:line="320" w:lineRule="auto"/>
         <w:ind w:left="288" w:hanging="288"/>
         <w:jc w:val="both"/>
       </w:pPr>
@@ -12435,7 +12435,7 @@
     </w:p>
     <w:p>
       <w:pPr>
-        <w:spacing w:before="0" w:after="40" w:line="280" w:lineRule="auto"/>
+        <w:spacing w:before="0" w:after="60" w:line="320" w:lineRule="auto"/>
         <w:ind w:left="288" w:hanging="288"/>
         <w:jc w:val="both"/>
       </w:pPr>
@@ -12450,7 +12450,7 @@
     </w:p>
     <w:p>
       <w:pPr>
-        <w:spacing w:before="0" w:after="40" w:line="280" w:lineRule="auto"/>
+        <w:spacing w:before="0" w:after="60" w:line="320" w:lineRule="auto"/>
         <w:ind w:left="288" w:hanging="288"/>
         <w:jc w:val="both"/>
       </w:pPr>
@@ -12465,7 +12465,7 @@
     </w:p>
     <w:p>
       <w:pPr>
-        <w:spacing w:before="0" w:after="40" w:line="280" w:lineRule="auto"/>
+        <w:spacing w:before="0" w:after="60" w:line="320" w:lineRule="auto"/>
         <w:ind w:left="288" w:hanging="288"/>
         <w:jc w:val="both"/>
       </w:pPr>
@@ -12480,7 +12480,7 @@
     </w:p>
     <w:p>
       <w:pPr>
-        <w:spacing w:before="40" w:after="40" w:line="280" w:lineRule="auto"/>
+        <w:spacing w:before="40" w:after="40" w:line="320" w:lineRule="auto"/>
         <w:jc w:val="both"/>
       </w:pPr>
       <w:r>
@@ -12495,7 +12495,7 @@
     </w:p>
     <w:p>
       <w:pPr>
-        <w:spacing w:before="40" w:after="40" w:line="280" w:lineRule="auto"/>
+        <w:spacing w:before="40" w:after="40" w:line="320" w:lineRule="auto"/>
         <w:jc w:val="both"/>
       </w:pPr>
       <w:r>
@@ -12510,7 +12510,7 @@
     </w:p>
     <w:p>
       <w:pPr>
-        <w:spacing w:before="40" w:after="40" w:line="280" w:lineRule="auto"/>
+        <w:spacing w:before="40" w:after="40" w:line="320" w:lineRule="auto"/>
         <w:jc w:val="both"/>
       </w:pPr>
       <w:r>
@@ -12524,7 +12524,7 @@
     </w:p>
     <w:p>
       <w:pPr>
-        <w:spacing w:before="80" w:after="40" w:line="280" w:lineRule="auto"/>
+        <w:spacing w:before="100" w:after="40" w:line="320" w:lineRule="auto"/>
         <w:jc w:val="left"/>
       </w:pPr>
       <w:r>
@@ -12550,7 +12550,7 @@
     </w:p>
     <w:p>
       <w:pPr>
-        <w:spacing w:before="0" w:after="40" w:line="280" w:lineRule="auto"/>
+        <w:spacing w:before="0" w:after="60" w:line="320" w:lineRule="auto"/>
         <w:ind w:left="288" w:hanging="288"/>
         <w:jc w:val="both"/>
       </w:pPr>
@@ -13041,7 +13041,7 @@
     <w:p>
       <w:pPr>
         <w:keepNext/>
-        <w:spacing w:before="160" w:after="40" w:line="280" w:lineRule="auto"/>
+        <w:spacing w:before="100" w:after="40" w:line="320" w:lineRule="auto"/>
         <w:jc w:val="left"/>
       </w:pPr>
       <w:r>
@@ -13068,7 +13068,7 @@
     <w:p>
       <w:pPr>
         <w:keepNext/>
-        <w:spacing w:before="0" w:after="40" w:line="280" w:lineRule="auto"/>
+        <w:spacing w:before="0" w:after="40" w:line="320" w:lineRule="auto"/>
         <w:jc w:val="both"/>
       </w:pPr>
       <w:r>
@@ -13303,7 +13303,7 @@
     </w:p>
     <w:p>
       <w:pPr>
-        <w:spacing w:before="0" w:after="40" w:line="280" w:lineRule="auto"/>
+        <w:spacing w:before="0" w:after="40" w:line="320" w:lineRule="auto"/>
         <w:jc w:val="both"/>
       </w:pPr>
       <w:r>

</xml_diff>

<commit_message>
Draft_104: QR spacing balance (CE on p1) + clean FC bullets retained
</commit_message>
<xml_diff>
--- a/thesis/003_ThesisProposal_Draft_104.docx
+++ b/thesis/003_ThesisProposal_Draft_104.docx
@@ -12312,7 +12312,7 @@
     </w:p>
     <w:p>
       <w:pPr>
-        <w:spacing w:before="0" w:after="80" w:line="320" w:lineRule="auto"/>
+        <w:spacing w:before="0" w:after="60" w:line="280" w:lineRule="auto"/>
         <w:jc w:val="left"/>
       </w:pPr>
       <w:r>
@@ -12338,7 +12338,7 @@
     </w:p>
     <w:p>
       <w:pPr>
-        <w:spacing w:before="0" w:after="60" w:line="320" w:lineRule="auto"/>
+        <w:spacing w:before="0" w:after="40" w:line="280" w:lineRule="auto"/>
         <w:ind w:left="288" w:hanging="288"/>
         <w:jc w:val="both"/>
       </w:pPr>
@@ -12353,7 +12353,7 @@
     </w:p>
     <w:p>
       <w:pPr>
-        <w:spacing w:before="100" w:after="40" w:line="320" w:lineRule="auto"/>
+        <w:spacing w:before="80" w:after="40" w:line="280" w:lineRule="auto"/>
         <w:jc w:val="left"/>
       </w:pPr>
       <w:r>
@@ -12379,7 +12379,7 @@
     </w:p>
     <w:p>
       <w:pPr>
-        <w:spacing w:before="0" w:after="60" w:line="320" w:lineRule="auto"/>
+        <w:spacing w:before="0" w:after="40" w:line="280" w:lineRule="auto"/>
         <w:ind w:left="288" w:hanging="288"/>
         <w:jc w:val="both"/>
       </w:pPr>
@@ -12394,7 +12394,7 @@
     </w:p>
     <w:p>
       <w:pPr>
-        <w:spacing w:before="40" w:after="20" w:line="320" w:lineRule="auto"/>
+        <w:spacing w:before="40" w:after="40" w:line="280" w:lineRule="auto"/>
         <w:jc w:val="left"/>
       </w:pPr>
       <w:r>
@@ -12420,7 +12420,7 @@
     </w:p>
     <w:p>
       <w:pPr>
-        <w:spacing w:before="0" w:after="60" w:line="320" w:lineRule="auto"/>
+        <w:spacing w:before="0" w:after="40" w:line="280" w:lineRule="auto"/>
         <w:ind w:left="288" w:hanging="288"/>
         <w:jc w:val="both"/>
       </w:pPr>
@@ -12435,7 +12435,7 @@
     </w:p>
     <w:p>
       <w:pPr>
-        <w:spacing w:before="0" w:after="60" w:line="320" w:lineRule="auto"/>
+        <w:spacing w:before="0" w:after="40" w:line="280" w:lineRule="auto"/>
         <w:ind w:left="288" w:hanging="288"/>
         <w:jc w:val="both"/>
       </w:pPr>
@@ -12450,7 +12450,7 @@
     </w:p>
     <w:p>
       <w:pPr>
-        <w:spacing w:before="0" w:after="60" w:line="320" w:lineRule="auto"/>
+        <w:spacing w:before="0" w:after="40" w:line="280" w:lineRule="auto"/>
         <w:ind w:left="288" w:hanging="288"/>
         <w:jc w:val="both"/>
       </w:pPr>
@@ -12465,7 +12465,7 @@
     </w:p>
     <w:p>
       <w:pPr>
-        <w:spacing w:before="0" w:after="60" w:line="320" w:lineRule="auto"/>
+        <w:spacing w:before="0" w:after="40" w:line="280" w:lineRule="auto"/>
         <w:ind w:left="288" w:hanging="288"/>
         <w:jc w:val="both"/>
       </w:pPr>
@@ -12480,7 +12480,7 @@
     </w:p>
     <w:p>
       <w:pPr>
-        <w:spacing w:before="40" w:after="40" w:line="320" w:lineRule="auto"/>
+        <w:spacing w:before="40" w:after="40" w:line="280" w:lineRule="auto"/>
         <w:jc w:val="both"/>
       </w:pPr>
       <w:r>
@@ -12495,7 +12495,7 @@
     </w:p>
     <w:p>
       <w:pPr>
-        <w:spacing w:before="40" w:after="40" w:line="320" w:lineRule="auto"/>
+        <w:spacing w:before="40" w:after="40" w:line="280" w:lineRule="auto"/>
         <w:jc w:val="both"/>
       </w:pPr>
       <w:r>
@@ -12510,7 +12510,7 @@
     </w:p>
     <w:p>
       <w:pPr>
-        <w:spacing w:before="40" w:after="40" w:line="320" w:lineRule="auto"/>
+        <w:spacing w:before="40" w:after="40" w:line="280" w:lineRule="auto"/>
         <w:jc w:val="both"/>
       </w:pPr>
       <w:r>
@@ -12524,7 +12524,7 @@
     </w:p>
     <w:p>
       <w:pPr>
-        <w:spacing w:before="100" w:after="40" w:line="320" w:lineRule="auto"/>
+        <w:spacing w:before="80" w:after="40" w:line="280" w:lineRule="auto"/>
         <w:jc w:val="left"/>
       </w:pPr>
       <w:r>
@@ -12550,7 +12550,7 @@
     </w:p>
     <w:p>
       <w:pPr>
-        <w:spacing w:before="0" w:after="60" w:line="320" w:lineRule="auto"/>
+        <w:spacing w:before="0" w:after="40" w:line="280" w:lineRule="auto"/>
         <w:ind w:left="288" w:hanging="288"/>
         <w:jc w:val="both"/>
       </w:pPr>
@@ -13041,7 +13041,7 @@
     <w:p>
       <w:pPr>
         <w:keepNext/>
-        <w:spacing w:before="100" w:after="40" w:line="320" w:lineRule="auto"/>
+        <w:spacing w:before="60" w:after="40" w:line="280" w:lineRule="auto"/>
         <w:jc w:val="left"/>
       </w:pPr>
       <w:r>
@@ -13068,7 +13068,7 @@
     <w:p>
       <w:pPr>
         <w:keepNext/>
-        <w:spacing w:before="0" w:after="40" w:line="320" w:lineRule="auto"/>
+        <w:spacing w:before="0" w:after="40" w:line="280" w:lineRule="auto"/>
         <w:jc w:val="both"/>
       </w:pPr>
       <w:r>
@@ -13303,7 +13303,7 @@
     </w:p>
     <w:p>
       <w:pPr>
-        <w:spacing w:before="0" w:after="40" w:line="320" w:lineRule="auto"/>
+        <w:spacing w:before="0" w:after="40" w:line="280" w:lineRule="auto"/>
         <w:jc w:val="both"/>
       </w:pPr>
       <w:r>

</xml_diff>

<commit_message>
Draft_104: bullets left-indent only (no hanging); gap after App A tables
</commit_message>
<xml_diff>
--- a/thesis/003_ThesisProposal_Draft_104.docx
+++ b/thesis/003_ThesisProposal_Draft_104.docx
@@ -12339,7 +12339,7 @@
     <w:p>
       <w:pPr>
         <w:spacing w:before="0" w:after="40" w:line="280" w:lineRule="auto"/>
-        <w:ind w:left="288" w:hanging="288"/>
+        <w:ind w:left="360"/>
         <w:jc w:val="both"/>
       </w:pPr>
       <w:r>
@@ -12380,7 +12380,7 @@
     <w:p>
       <w:pPr>
         <w:spacing w:before="0" w:after="40" w:line="280" w:lineRule="auto"/>
-        <w:ind w:left="288" w:hanging="288"/>
+        <w:ind w:left="360"/>
         <w:jc w:val="both"/>
       </w:pPr>
       <w:r>
@@ -12421,7 +12421,7 @@
     <w:p>
       <w:pPr>
         <w:spacing w:before="0" w:after="40" w:line="280" w:lineRule="auto"/>
-        <w:ind w:left="288" w:hanging="288"/>
+        <w:ind w:left="360"/>
         <w:jc w:val="both"/>
       </w:pPr>
       <w:r>
@@ -12436,7 +12436,7 @@
     <w:p>
       <w:pPr>
         <w:spacing w:before="0" w:after="40" w:line="280" w:lineRule="auto"/>
-        <w:ind w:left="288" w:hanging="288"/>
+        <w:ind w:left="360"/>
         <w:jc w:val="both"/>
       </w:pPr>
       <w:r>
@@ -12451,7 +12451,7 @@
     <w:p>
       <w:pPr>
         <w:spacing w:before="0" w:after="40" w:line="280" w:lineRule="auto"/>
-        <w:ind w:left="288" w:hanging="288"/>
+        <w:ind w:left="360"/>
         <w:jc w:val="both"/>
       </w:pPr>
       <w:r>
@@ -12466,7 +12466,7 @@
     <w:p>
       <w:pPr>
         <w:spacing w:before="0" w:after="40" w:line="280" w:lineRule="auto"/>
-        <w:ind w:left="288" w:hanging="288"/>
+        <w:ind w:left="360"/>
         <w:jc w:val="both"/>
       </w:pPr>
       <w:r>
@@ -12551,7 +12551,7 @@
     <w:p>
       <w:pPr>
         <w:spacing w:before="0" w:after="40" w:line="280" w:lineRule="auto"/>
-        <w:ind w:left="288" w:hanging="288"/>
+        <w:ind w:left="360"/>
         <w:jc w:val="both"/>
       </w:pPr>
       <w:r>
@@ -13041,7 +13041,7 @@
     <w:p>
       <w:pPr>
         <w:keepNext/>
-        <w:spacing w:before="60" w:after="40" w:line="280" w:lineRule="auto"/>
+        <w:spacing w:before="200" w:after="40" w:line="280" w:lineRule="auto"/>
         <w:jc w:val="left"/>
       </w:pPr>
       <w:r>
@@ -13380,7 +13380,7 @@
     <w:p>
       <w:pPr>
         <w:spacing w:before="0" w:after="60" w:line="300" w:lineRule="auto"/>
-        <w:ind w:left="360" w:hanging="360"/>
+        <w:ind w:left="360"/>
         <w:jc w:val="both"/>
       </w:pPr>
       <w:r>
@@ -13421,7 +13421,7 @@
     <w:p>
       <w:pPr>
         <w:spacing w:before="0" w:after="60" w:line="300" w:lineRule="auto"/>
-        <w:ind w:left="360" w:hanging="360"/>
+        <w:ind w:left="360"/>
         <w:jc w:val="both"/>
       </w:pPr>
       <w:r>
@@ -13436,7 +13436,7 @@
     <w:p>
       <w:pPr>
         <w:spacing w:before="0" w:after="60" w:line="300" w:lineRule="auto"/>
-        <w:ind w:left="360" w:hanging="360"/>
+        <w:ind w:left="360"/>
         <w:jc w:val="both"/>
       </w:pPr>
       <w:r>
@@ -13451,7 +13451,7 @@
     <w:p>
       <w:pPr>
         <w:spacing w:before="0" w:after="60" w:line="300" w:lineRule="auto"/>
-        <w:ind w:left="360" w:hanging="360"/>
+        <w:ind w:left="360"/>
         <w:jc w:val="both"/>
       </w:pPr>
       <w:r>
@@ -13466,7 +13466,7 @@
     <w:p>
       <w:pPr>
         <w:spacing w:before="0" w:after="60" w:line="300" w:lineRule="auto"/>
-        <w:ind w:left="360" w:hanging="360"/>
+        <w:ind w:left="360"/>
         <w:jc w:val="both"/>
       </w:pPr>
       <w:r>
@@ -13481,7 +13481,7 @@
     <w:p>
       <w:pPr>
         <w:spacing w:before="0" w:after="60" w:line="300" w:lineRule="auto"/>
-        <w:ind w:left="360" w:hanging="360"/>
+        <w:ind w:left="360"/>
         <w:jc w:val="both"/>
       </w:pPr>
       <w:r>
@@ -13524,7 +13524,7 @@
     <w:p>
       <w:pPr>
         <w:spacing w:before="0" w:after="60" w:line="300" w:lineRule="auto"/>
-        <w:ind w:left="360" w:hanging="360"/>
+        <w:ind w:left="360"/>
         <w:jc w:val="both"/>
       </w:pPr>
       <w:r>
@@ -13539,7 +13539,7 @@
     <w:p>
       <w:pPr>
         <w:spacing w:before="0" w:after="60" w:line="300" w:lineRule="auto"/>
-        <w:ind w:left="360" w:hanging="360"/>
+        <w:ind w:left="360"/>
         <w:jc w:val="both"/>
       </w:pPr>
       <w:r>
@@ -13554,7 +13554,7 @@
     <w:p>
       <w:pPr>
         <w:spacing w:before="0" w:after="60" w:line="300" w:lineRule="auto"/>
-        <w:ind w:left="360" w:hanging="360"/>
+        <w:ind w:left="360"/>
         <w:jc w:val="both"/>
       </w:pPr>
       <w:r>
@@ -13569,7 +13569,7 @@
     <w:p>
       <w:pPr>
         <w:spacing w:before="0" w:after="60" w:line="300" w:lineRule="auto"/>
-        <w:ind w:left="360" w:hanging="360"/>
+        <w:ind w:left="360"/>
         <w:jc w:val="both"/>
       </w:pPr>
       <w:r>
@@ -13584,7 +13584,7 @@
     <w:p>
       <w:pPr>
         <w:spacing w:before="0" w:after="60" w:line="300" w:lineRule="auto"/>
-        <w:ind w:left="360" w:hanging="360"/>
+        <w:ind w:left="360"/>
         <w:jc w:val="both"/>
       </w:pPr>
       <w:r>
@@ -13599,7 +13599,7 @@
     <w:p>
       <w:pPr>
         <w:spacing w:before="0" w:after="60" w:line="300" w:lineRule="auto"/>
-        <w:ind w:left="360" w:hanging="360"/>
+        <w:ind w:left="360"/>
         <w:jc w:val="both"/>
       </w:pPr>
       <w:r>
@@ -13614,7 +13614,7 @@
     <w:p>
       <w:pPr>
         <w:spacing w:before="0" w:after="60" w:line="300" w:lineRule="auto"/>
-        <w:ind w:left="360" w:hanging="360"/>
+        <w:ind w:left="360"/>
         <w:jc w:val="both"/>
       </w:pPr>
       <w:r>
@@ -13629,7 +13629,7 @@
     <w:p>
       <w:pPr>
         <w:spacing w:before="0" w:after="60" w:line="300" w:lineRule="auto"/>
-        <w:ind w:left="360" w:hanging="360"/>
+        <w:ind w:left="360"/>
         <w:jc w:val="both"/>
       </w:pPr>
       <w:r>
@@ -14467,7 +14467,7 @@
     </w:tbl>
     <w:p>
       <w:pPr>
-        <w:spacing w:before="160" w:after="60" w:line="300" w:lineRule="auto"/>
+        <w:spacing w:before="200" w:after="60" w:line="300" w:lineRule="auto"/>
         <w:ind w:left="360"/>
         <w:jc w:val="both"/>
       </w:pPr>
@@ -14520,7 +14520,7 @@
     <w:p>
       <w:pPr>
         <w:spacing w:before="0" w:after="60" w:line="300" w:lineRule="auto"/>
-        <w:ind w:left="360" w:hanging="360"/>
+        <w:ind w:left="360"/>
         <w:jc w:val="both"/>
       </w:pPr>
       <w:r>
@@ -15273,7 +15273,7 @@
     <w:p>
       <w:pPr>
         <w:keepNext/>
-        <w:spacing w:before="160" w:after="40" w:line="300" w:lineRule="auto"/>
+        <w:spacing w:before="200" w:after="40" w:line="300" w:lineRule="auto"/>
         <w:jc w:val="left"/>
       </w:pPr>
       <w:r>
@@ -16184,7 +16184,7 @@
     </w:tbl>
     <w:p>
       <w:pPr>
-        <w:spacing w:before="160" w:after="60" w:line="300" w:lineRule="auto"/>
+        <w:spacing w:before="200" w:after="60" w:line="300" w:lineRule="auto"/>
         <w:ind w:left="360"/>
         <w:jc w:val="both"/>
       </w:pPr>
@@ -17087,7 +17087,7 @@
     <w:p>
       <w:pPr>
         <w:keepNext/>
-        <w:spacing w:before="160" w:after="40" w:line="300" w:lineRule="auto"/>
+        <w:spacing w:before="200" w:after="40" w:line="300" w:lineRule="auto"/>
         <w:jc w:val="left"/>
       </w:pPr>
       <w:r>
@@ -17114,7 +17114,7 @@
     <w:p>
       <w:pPr>
         <w:spacing w:before="0" w:after="60" w:line="300" w:lineRule="auto"/>
-        <w:ind w:left="360" w:hanging="360"/>
+        <w:ind w:left="360"/>
         <w:jc w:val="both"/>
       </w:pPr>
       <w:r>
@@ -17129,7 +17129,7 @@
     <w:p>
       <w:pPr>
         <w:spacing w:before="0" w:after="60" w:line="300" w:lineRule="auto"/>
-        <w:ind w:left="360" w:hanging="360"/>
+        <w:ind w:left="360"/>
         <w:jc w:val="both"/>
       </w:pPr>
       <w:r>
@@ -17144,7 +17144,7 @@
     <w:p>
       <w:pPr>
         <w:spacing w:before="0" w:after="60" w:line="300" w:lineRule="auto"/>
-        <w:ind w:left="360" w:hanging="360"/>
+        <w:ind w:left="360"/>
         <w:jc w:val="both"/>
       </w:pPr>
       <w:r>
@@ -17159,7 +17159,7 @@
     <w:p>
       <w:pPr>
         <w:spacing w:before="0" w:after="60" w:line="300" w:lineRule="auto"/>
-        <w:ind w:left="360" w:hanging="360"/>
+        <w:ind w:left="360"/>
         <w:jc w:val="both"/>
       </w:pPr>
       <w:r>
@@ -17174,7 +17174,7 @@
     <w:p>
       <w:pPr>
         <w:spacing w:before="0" w:after="60" w:line="300" w:lineRule="auto"/>
-        <w:ind w:left="360" w:hanging="360"/>
+        <w:ind w:left="360"/>
         <w:jc w:val="both"/>
       </w:pPr>
       <w:r>
@@ -17189,7 +17189,7 @@
     <w:p>
       <w:pPr>
         <w:spacing w:before="0" w:after="60" w:line="300" w:lineRule="auto"/>
-        <w:ind w:left="360" w:hanging="360"/>
+        <w:ind w:left="360"/>
         <w:jc w:val="both"/>
       </w:pPr>
       <w:r>
@@ -17753,7 +17753,7 @@
     <w:p>
       <w:pPr>
         <w:keepNext/>
-        <w:spacing w:before="160" w:after="40" w:line="300" w:lineRule="auto"/>
+        <w:spacing w:before="200" w:after="40" w:line="300" w:lineRule="auto"/>
         <w:jc w:val="left"/>
       </w:pPr>
       <w:r>
@@ -19144,8 +19144,8 @@
     </w:tbl>
     <w:p>
       <w:pPr>
-        <w:spacing w:before="160" w:after="60" w:line="300" w:lineRule="auto"/>
-        <w:ind w:left="360" w:hanging="360"/>
+        <w:spacing w:before="200" w:after="60" w:line="300" w:lineRule="auto"/>
+        <w:ind w:left="360"/>
         <w:jc w:val="both"/>
       </w:pPr>
       <w:r>
@@ -19160,7 +19160,7 @@
     <w:p>
       <w:pPr>
         <w:spacing w:before="0" w:after="60" w:line="300" w:lineRule="auto"/>
-        <w:ind w:left="360" w:hanging="360"/>
+        <w:ind w:left="360"/>
         <w:jc w:val="both"/>
       </w:pPr>
       <w:r>
@@ -19175,7 +19175,7 @@
     <w:p>
       <w:pPr>
         <w:spacing w:before="0" w:after="60" w:line="300" w:lineRule="auto"/>
-        <w:ind w:left="360" w:hanging="360"/>
+        <w:ind w:left="360"/>
         <w:jc w:val="both"/>
       </w:pPr>
       <w:r>
@@ -19190,7 +19190,7 @@
     <w:p>
       <w:pPr>
         <w:spacing w:before="0" w:after="60" w:line="300" w:lineRule="auto"/>
-        <w:ind w:left="360" w:hanging="360"/>
+        <w:ind w:left="360"/>
         <w:jc w:val="both"/>
       </w:pPr>
       <w:r>

</xml_diff>

<commit_message>
Draft_104: Appendix A subheads 1-line space before (before>=240)
</commit_message>
<xml_diff>
--- a/thesis/003_ThesisProposal_Draft_104.docx
+++ b/thesis/003_ThesisProposal_Draft_104.docx
@@ -12353,7 +12353,7 @@
     </w:p>
     <w:p>
       <w:pPr>
-        <w:spacing w:before="80" w:after="40" w:line="280" w:lineRule="auto"/>
+        <w:spacing w:before="240" w:after="40" w:line="280" w:lineRule="auto"/>
         <w:jc w:val="left"/>
       </w:pPr>
       <w:r>
@@ -12394,7 +12394,7 @@
     </w:p>
     <w:p>
       <w:pPr>
-        <w:spacing w:before="40" w:after="40" w:line="280" w:lineRule="auto"/>
+        <w:spacing w:before="240" w:after="40" w:line="280" w:lineRule="auto"/>
         <w:jc w:val="left"/>
       </w:pPr>
       <w:r>
@@ -12524,7 +12524,7 @@
     </w:p>
     <w:p>
       <w:pPr>
-        <w:spacing w:before="80" w:after="40" w:line="280" w:lineRule="auto"/>
+        <w:spacing w:before="240" w:after="40" w:line="280" w:lineRule="auto"/>
         <w:jc w:val="left"/>
       </w:pPr>
       <w:r>
@@ -13041,7 +13041,7 @@
     <w:p>
       <w:pPr>
         <w:keepNext/>
-        <w:spacing w:before="200" w:after="40" w:line="280" w:lineRule="auto"/>
+        <w:spacing w:before="240" w:after="40" w:line="280" w:lineRule="auto"/>
         <w:jc w:val="left"/>
       </w:pPr>
       <w:r>
@@ -13318,7 +13318,7 @@
     </w:p>
     <w:p>
       <w:pPr>
-        <w:spacing w:before="100" w:after="40" w:line="300" w:lineRule="auto"/>
+        <w:spacing w:before="240" w:after="40" w:line="300" w:lineRule="auto"/>
         <w:jc w:val="left"/>
       </w:pPr>
       <w:r>
@@ -13353,7 +13353,7 @@
     </w:p>
     <w:p>
       <w:pPr>
-        <w:spacing w:before="100" w:after="40" w:line="300" w:lineRule="auto"/>
+        <w:spacing w:before="240" w:after="40" w:line="300" w:lineRule="auto"/>
         <w:jc w:val="left"/>
       </w:pPr>
       <w:r>
@@ -13394,7 +13394,7 @@
     </w:p>
     <w:p>
       <w:pPr>
-        <w:spacing w:before="100" w:after="40" w:line="300" w:lineRule="auto"/>
+        <w:spacing w:before="240" w:after="40" w:line="300" w:lineRule="auto"/>
         <w:jc w:val="left"/>
       </w:pPr>
       <w:r>
@@ -13495,7 +13495,7 @@
     </w:p>
     <w:p>
       <w:pPr>
-        <w:spacing w:before="100" w:after="40" w:line="300" w:lineRule="auto"/>
+        <w:spacing w:before="240" w:after="40" w:line="300" w:lineRule="auto"/>
         <w:jc w:val="left"/>
       </w:pPr>
       <w:r>
@@ -13644,7 +13644,7 @@
     <w:p>
       <w:pPr>
         <w:keepNext/>
-        <w:spacing w:before="100" w:after="40" w:line="300" w:lineRule="auto"/>
+        <w:spacing w:before="240" w:after="40" w:line="300" w:lineRule="auto"/>
         <w:jc w:val="left"/>
       </w:pPr>
       <w:r>
@@ -14535,7 +14535,7 @@
     <w:p>
       <w:pPr>
         <w:keepNext/>
-        <w:spacing w:before="100" w:after="40" w:line="300" w:lineRule="auto"/>
+        <w:spacing w:before="240" w:after="40" w:line="300" w:lineRule="auto"/>
         <w:jc w:val="left"/>
       </w:pPr>
       <w:r>
@@ -15273,7 +15273,7 @@
     <w:p>
       <w:pPr>
         <w:keepNext/>
-        <w:spacing w:before="200" w:after="40" w:line="300" w:lineRule="auto"/>
+        <w:spacing w:before="240" w:after="40" w:line="300" w:lineRule="auto"/>
         <w:jc w:val="left"/>
       </w:pPr>
       <w:r>
@@ -16280,7 +16280,7 @@
     <w:p>
       <w:pPr>
         <w:keepNext/>
-        <w:spacing w:before="100" w:after="40" w:line="300" w:lineRule="auto"/>
+        <w:spacing w:before="240" w:after="40" w:line="300" w:lineRule="auto"/>
         <w:jc w:val="left"/>
       </w:pPr>
       <w:r>
@@ -17087,7 +17087,7 @@
     <w:p>
       <w:pPr>
         <w:keepNext/>
-        <w:spacing w:before="200" w:after="40" w:line="300" w:lineRule="auto"/>
+        <w:spacing w:before="240" w:after="40" w:line="300" w:lineRule="auto"/>
         <w:jc w:val="left"/>
       </w:pPr>
       <w:r>
@@ -17753,7 +17753,7 @@
     <w:p>
       <w:pPr>
         <w:keepNext/>
-        <w:spacing w:before="200" w:after="40" w:line="300" w:lineRule="auto"/>
+        <w:spacing w:before="240" w:after="40" w:line="300" w:lineRule="auto"/>
         <w:jc w:val="left"/>
       </w:pPr>
       <w:r>

</xml_diff>

<commit_message>
Draft_104: Full Codebook onward companion format (QR/QRL exempt only)
</commit_message>
<xml_diff>
--- a/thesis/003_ThesisProposal_Draft_104.docx
+++ b/thesis/003_ThesisProposal_Draft_104.docx
@@ -13318,14 +13318,15 @@
     </w:p>
     <w:p>
       <w:pPr>
-        <w:spacing w:before="240" w:after="40" w:line="300" w:lineRule="auto"/>
+        <w:pageBreakBefore/>
+        <w:spacing w:before="240" w:after="0" w:line="480" w:lineRule="auto"/>
         <w:jc w:val="left"/>
       </w:pPr>
       <w:r>
         <w:rPr>
           <w:rFonts w:ascii="Georgia" w:hAnsi="Georgia" w:cs="Georgia" w:eastAsia="Georgia"/>
-          <w:sz w:val="22"/>
-          <w:szCs w:val="22"/>
+          <w:sz w:val="24"/>
+          <w:szCs w:val="24"/>
           <w:b/>
         </w:rPr>
         <w:br w:type="page"/>
@@ -13335,8 +13336,8 @@
           <w:rFonts w:ascii="Georgia" w:hAnsi="Georgia" w:cs="Georgia" w:eastAsia="Georgia"/>
           <w:b/>
           <w:bCs w:val="1"/>
-          <w:sz w:val="22"/>
-          <w:szCs w:val="22"/>
+          <w:sz w:val="24"/>
+          <w:szCs w:val="24"/>
           <w:rtl w:val="0"/>
         </w:rPr>
         <w:t>FULL CODEBOOK</w:t>
@@ -13345,15 +13346,16 @@
         <w:rPr>
           <w:rFonts w:ascii="Georgia" w:hAnsi="Georgia" w:cs="Georgia" w:eastAsia="Georgia"/>
           <w:rtl w:val="0"/>
-          <w:sz w:val="22"/>
-          <w:szCs w:val="22"/>
+          <w:sz w:val="24"/>
+          <w:szCs w:val="24"/>
           <w:b/>
         </w:rPr>
       </w:r>
     </w:p>
     <w:p>
       <w:pPr>
-        <w:spacing w:before="240" w:after="40" w:line="300" w:lineRule="auto"/>
+        <w:keepNext/>
+        <w:spacing w:before="240" w:after="0" w:line="480" w:lineRule="auto"/>
         <w:jc w:val="left"/>
       </w:pPr>
       <w:r>
@@ -13361,8 +13363,8 @@
           <w:rFonts w:ascii="Georgia" w:hAnsi="Georgia" w:cs="Georgia" w:eastAsia="Georgia"/>
           <w:b/>
           <w:bCs w:val="1"/>
-          <w:sz w:val="22"/>
-          <w:szCs w:val="22"/>
+          <w:sz w:val="24"/>
+          <w:szCs w:val="24"/>
           <w:rtl w:val="0"/>
         </w:rPr>
         <w:t>PURPOSE</w:t>
@@ -13371,37 +13373,38 @@
         <w:rPr>
           <w:rFonts w:ascii="Georgia" w:hAnsi="Georgia" w:cs="Georgia" w:eastAsia="Georgia"/>
           <w:rtl w:val="0"/>
-          <w:sz w:val="22"/>
-          <w:szCs w:val="22"/>
+          <w:sz w:val="24"/>
+          <w:szCs w:val="24"/>
           <w:b/>
         </w:rPr>
       </w:r>
     </w:p>
     <w:p>
       <w:pPr>
-        <w:spacing w:before="0" w:after="60" w:line="300" w:lineRule="auto"/>
+        <w:spacing w:before="0" w:after="0" w:line="480" w:lineRule="auto"/>
         <w:ind w:left="360"/>
         <w:jc w:val="both"/>
       </w:pPr>
       <w:r>
         <w:rPr>
           <w:rFonts w:ascii="Georgia" w:hAnsi="Georgia" w:cs="Georgia" w:eastAsia="Georgia"/>
-          <w:sz w:val="20"/>
-          <w:szCs w:val="20"/>
+          <w:sz w:val="22"/>
+          <w:szCs w:val="22"/>
         </w:rPr>
         <w:t xml:space="preserve">• Coding scheme for the PSAU undergraduate thesis abstract corpus, adapted from Hyland (1998) as type instrument.</w:t>
       </w:r>
     </w:p>
     <w:p>
       <w:pPr>
-        <w:spacing w:before="240" w:after="40" w:line="300" w:lineRule="auto"/>
+        <w:keepNext/>
+        <w:spacing w:before="240" w:after="0" w:line="480" w:lineRule="auto"/>
         <w:jc w:val="left"/>
       </w:pPr>
       <w:r>
         <w:rPr>
           <w:rFonts w:ascii="Georgia" w:hAnsi="Georgia" w:cs="Georgia" w:eastAsia="Georgia"/>
-          <w:sz w:val="22"/>
-          <w:szCs w:val="22"/>
+          <w:sz w:val="24"/>
+          <w:szCs w:val="24"/>
           <w:rtl w:val="0"/>
           <w:b/>
           <w:bCs w:val="0"/>
@@ -13412,97 +13415,98 @@
         <w:rPr>
           <w:rFonts w:ascii="Georgia" w:hAnsi="Georgia" w:cs="Georgia" w:eastAsia="Georgia"/>
           <w:rtl w:val="0"/>
-          <w:sz w:val="22"/>
-          <w:szCs w:val="22"/>
+          <w:sz w:val="24"/>
+          <w:szCs w:val="24"/>
           <w:b/>
         </w:rPr>
       </w:r>
     </w:p>
     <w:p>
       <w:pPr>
-        <w:spacing w:before="0" w:after="60" w:line="300" w:lineRule="auto"/>
+        <w:spacing w:before="0" w:after="0" w:line="480" w:lineRule="auto"/>
         <w:ind w:left="360"/>
         <w:jc w:val="both"/>
       </w:pPr>
       <w:r>
         <w:rPr>
           <w:rFonts w:ascii="Georgia" w:hAnsi="Georgia" w:cs="Georgia" w:eastAsia="Georgia"/>
-          <w:sz w:val="20"/>
-          <w:szCs w:val="20"/>
+          <w:sz w:val="22"/>
+          <w:szCs w:val="22"/>
         </w:rPr>
         <w:t xml:space="preserve">• Step 1 (wide net). After the holistic read, mark all possible hedge candidates. This step does not count retained hedges.</w:t>
       </w:r>
     </w:p>
     <w:p>
       <w:pPr>
-        <w:spacing w:before="0" w:after="60" w:line="300" w:lineRule="auto"/>
+        <w:spacing w:before="0" w:after="0" w:line="480" w:lineRule="auto"/>
         <w:ind w:left="360"/>
         <w:jc w:val="both"/>
       </w:pPr>
       <w:r>
         <w:rPr>
           <w:rFonts w:ascii="Georgia" w:hAnsi="Georgia" w:cs="Georgia" w:eastAsia="Georgia"/>
-          <w:sz w:val="20"/>
-          <w:szCs w:val="20"/>
+          <w:sz w:val="22"/>
+          <w:szCs w:val="22"/>
         </w:rPr>
         <w:t xml:space="preserve">• Step 2 (function by paired removal checks). Claim condition (both tests): a device can only be a hedge if it attaches to a claim. A claim is a statement about data, the world, or prior work that evidence could show to be wrong. Aims, directives, and routine procedure are excluded by kind, not by loose truth-evaluability. If the clause is not a claim, log the token as FP (with a reason code when useful: FP-Rec, FP-Gen, FP-Proc, or FP-Cap). Working Test: remove the device. Does the writer’s commitment to the claim’s truth go up? If yes → EC. Reader Test: remove the device. Does commitment to the truth stay the same, but the claim now reaches the reader more bluntly, or the writer takes sole ownership of it against prior work? If yes → P. Neither → FP (not a function). Both may hold on one token (EC+P). There is no required category pre-filter before these checks. Category codes label residual rejects after the claim condition or both tests fail.</w:t>
       </w:r>
     </w:p>
     <w:p>
       <w:pPr>
-        <w:spacing w:before="0" w:after="60" w:line="300" w:lineRule="auto"/>
+        <w:spacing w:before="0" w:after="0" w:line="480" w:lineRule="auto"/>
         <w:ind w:left="360"/>
         <w:jc w:val="both"/>
       </w:pPr>
       <w:r>
         <w:rPr>
           <w:rFonts w:ascii="Georgia" w:hAnsi="Georgia" w:cs="Georgia" w:eastAsia="Georgia"/>
-          <w:sz w:val="20"/>
-          <w:szCs w:val="20"/>
+          <w:sz w:val="22"/>
+          <w:szCs w:val="22"/>
         </w:rPr>
         <w:t xml:space="preserve">• Working Test and Reader Test are the Step 2 function gate, after the claim condition. Every Step 1 candidate can be run through the claim condition and the two removal checks. Directives, aim statements, and procedural norms fail the claim condition and are logged FP without needing a prior sort. Category codes (FP-Rec, FP-Cap, FP-Proc, FP-Gen) explain the residual inventory. They do not replace the tests.</w:t>
       </w:r>
     </w:p>
     <w:p>
       <w:pPr>
-        <w:spacing w:before="0" w:after="60" w:line="300" w:lineRule="auto"/>
+        <w:spacing w:before="0" w:after="0" w:line="480" w:lineRule="auto"/>
         <w:ind w:left="360"/>
         <w:jc w:val="both"/>
       </w:pPr>
       <w:r>
         <w:rPr>
           <w:rFonts w:ascii="Georgia" w:hAnsi="Georgia" w:cs="Georgia" w:eastAsia="Georgia"/>
-          <w:sz w:val="20"/>
-          <w:szCs w:val="20"/>
+          <w:sz w:val="22"/>
+          <w:szCs w:val="22"/>
         </w:rPr>
         <w:t xml:space="preserve">• Step 3 (type). On retained P and EC tokens only, assign grammatical type (modal, lexical, adverbial, clause-level).</w:t>
       </w:r>
     </w:p>
     <w:p>
       <w:pPr>
-        <w:spacing w:before="0" w:after="60" w:line="300" w:lineRule="auto"/>
+        <w:spacing w:before="0" w:after="0" w:line="480" w:lineRule="auto"/>
         <w:ind w:left="360"/>
         <w:jc w:val="both"/>
       </w:pPr>
       <w:r>
         <w:rPr>
           <w:rFonts w:ascii="Georgia" w:hAnsi="Georgia" w:cs="Georgia" w:eastAsia="Georgia"/>
-          <w:sz w:val="20"/>
-          <w:szCs w:val="20"/>
+          <w:sz w:val="22"/>
+          <w:szCs w:val="22"/>
         </w:rPr>
         <w:t xml:space="preserve">• Order. Coding order: full abstract → Step 1 (wide net) → Step 2 (claim condition, then Working Test and Reader Test) → reason codes on rejects → Step 3 type on retained P and EC → Coder Notes. No mandatory category pre-filter before Step 2.</w:t>
       </w:r>
     </w:p>
     <w:p>
       <w:pPr>
-        <w:spacing w:before="240" w:after="40" w:line="300" w:lineRule="auto"/>
+        <w:keepNext/>
+        <w:spacing w:before="240" w:after="0" w:line="480" w:lineRule="auto"/>
         <w:jc w:val="left"/>
       </w:pPr>
       <w:r>
         <w:rPr>
           <w:rFonts w:ascii="Georgia" w:hAnsi="Georgia" w:cs="Georgia" w:eastAsia="Georgia"/>
-          <w:sz w:val="22"/>
-          <w:szCs w:val="22"/>
+          <w:sz w:val="24"/>
+          <w:szCs w:val="24"/>
           <w:rtl w:val="0"/>
           <w:b/>
           <w:bCs w:val="0"/>
@@ -13516,127 +13520,127 @@
           <w:rFonts w:ascii="Georgia" w:hAnsi="Georgia" w:cs="Georgia" w:eastAsia="Georgia"/>
           <w:rtl w:val="0"/>
           <w:b w:val="1"/>
-          <w:sz w:val="22"/>
-          <w:szCs w:val="22"/>
-        </w:rPr>
-      </w:r>
-    </w:p>
-    <w:p>
-      <w:pPr>
-        <w:spacing w:before="0" w:after="60" w:line="300" w:lineRule="auto"/>
+          <w:sz w:val="24"/>
+          <w:szCs w:val="24"/>
+        </w:rPr>
+      </w:r>
+    </w:p>
+    <w:p>
+      <w:pPr>
+        <w:spacing w:before="0" w:after="0" w:line="480" w:lineRule="auto"/>
         <w:ind w:left="360"/>
         <w:jc w:val="both"/>
       </w:pPr>
       <w:r>
         <w:rPr>
           <w:rFonts w:ascii="Georgia" w:hAnsi="Georgia" w:cs="Georgia" w:eastAsia="Georgia"/>
-          <w:sz w:val="20"/>
-          <w:szCs w:val="20"/>
+          <w:sz w:val="22"/>
+          <w:szCs w:val="22"/>
         </w:rPr>
         <w:t xml:space="preserve">• Function labels apply to retained hedges after Step 2. Only claim-attached devices can be EC or P. Working Test supports EC when commitment to the claim’s truth rises after removal. Reader Test supports P when truth commitment stays the same but the claim is blunter to the reader or the writer takes sole ownership against prior work.</w:t>
       </w:r>
     </w:p>
     <w:p>
       <w:pPr>
-        <w:spacing w:before="0" w:after="60" w:line="300" w:lineRule="auto"/>
+        <w:spacing w:before="0" w:after="0" w:line="480" w:lineRule="auto"/>
         <w:ind w:left="360"/>
         <w:jc w:val="both"/>
       </w:pPr>
       <w:r>
         <w:rPr>
           <w:rFonts w:ascii="Georgia" w:hAnsi="Georgia" w:cs="Georgia" w:eastAsia="Georgia"/>
-          <w:sz w:val="20"/>
-          <w:szCs w:val="20"/>
+          <w:sz w:val="22"/>
+          <w:szCs w:val="22"/>
         </w:rPr>
         <w:t xml:space="preserve">• EC (Working Test): “The treatment may reduce infection rates.” Host clause is a claim about data or the world. Removing may raises commitment to the claim’s truth → EC.</w:t>
       </w:r>
     </w:p>
     <w:p>
       <w:pPr>
-        <w:spacing w:before="0" w:after="60" w:line="300" w:lineRule="auto"/>
+        <w:spacing w:before="0" w:after="0" w:line="480" w:lineRule="auto"/>
         <w:ind w:left="360"/>
         <w:jc w:val="both"/>
       </w:pPr>
       <w:r>
         <w:rPr>
           <w:rFonts w:ascii="Georgia" w:hAnsi="Georgia" w:cs="Georgia" w:eastAsia="Georgia"/>
-          <w:sz w:val="20"/>
-          <w:szCs w:val="20"/>
+          <w:sz w:val="22"/>
+          <w:szCs w:val="22"/>
         </w:rPr>
         <w:t xml:space="preserve">• FP-Cap: “PCR can detect low concentrations.” can = capability, not uncertainty about a finding.</w:t>
       </w:r>
     </w:p>
     <w:p>
       <w:pPr>
-        <w:spacing w:before="0" w:after="60" w:line="300" w:lineRule="auto"/>
+        <w:spacing w:before="0" w:after="0" w:line="480" w:lineRule="auto"/>
         <w:ind w:left="360"/>
         <w:jc w:val="both"/>
       </w:pPr>
       <w:r>
         <w:rPr>
           <w:rFonts w:ascii="Georgia" w:hAnsi="Georgia" w:cs="Georgia" w:eastAsia="Georgia"/>
-          <w:sz w:val="20"/>
-          <w:szCs w:val="20"/>
+          <w:sz w:val="22"/>
+          <w:szCs w:val="22"/>
         </w:rPr>
         <w:t xml:space="preserve">• P (Reader Test): “As suggested by previous researchers, the treatment is effective.” Host clause is a claim. Removing the attribution leaves truth commitment the same but the writer takes sole ownership against prior work → P. By contrast, “Farmers should adopt the treatment” is a directive (excluded by kind) → FP-Rec.</w:t>
       </w:r>
     </w:p>
     <w:p>
       <w:pPr>
-        <w:spacing w:before="0" w:after="60" w:line="300" w:lineRule="auto"/>
+        <w:spacing w:before="0" w:after="0" w:line="480" w:lineRule="auto"/>
         <w:ind w:left="360"/>
         <w:jc w:val="both"/>
       </w:pPr>
       <w:r>
         <w:rPr>
           <w:rFonts w:ascii="Georgia" w:hAnsi="Georgia" w:cs="Georgia" w:eastAsia="Georgia"/>
-          <w:sz w:val="20"/>
-          <w:szCs w:val="20"/>
+          <w:sz w:val="22"/>
+          <w:szCs w:val="22"/>
         </w:rPr>
         <w:t xml:space="preserve">• P + EC: Both Working Test and Reader Test hold on one token → EC+P (or dominant label plus dual note in Coder Notes).</w:t>
       </w:r>
     </w:p>
     <w:p>
       <w:pPr>
-        <w:spacing w:before="0" w:after="60" w:line="300" w:lineRule="auto"/>
+        <w:spacing w:before="0" w:after="0" w:line="480" w:lineRule="auto"/>
         <w:ind w:left="360"/>
         <w:jc w:val="both"/>
       </w:pPr>
       <w:r>
         <w:rPr>
           <w:rFonts w:ascii="Georgia" w:hAnsi="Georgia" w:cs="Georgia" w:eastAsia="Georgia"/>
-          <w:sz w:val="20"/>
-          <w:szCs w:val="20"/>
+          <w:sz w:val="22"/>
+          <w:szCs w:val="22"/>
         </w:rPr>
         <w:t xml:space="preserve">• FP: “In conclusion, T3 produced the highest yield.” Removing the frame changes neither truth-commitment nor interpersonal imposition toward readers/prior work → FP. Not a function label.</w:t>
       </w:r>
     </w:p>
     <w:p>
       <w:pPr>
-        <w:spacing w:before="0" w:after="60" w:line="300" w:lineRule="auto"/>
+        <w:spacing w:before="0" w:after="0" w:line="480" w:lineRule="auto"/>
         <w:ind w:left="360"/>
         <w:jc w:val="both"/>
       </w:pPr>
       <w:r>
         <w:rPr>
           <w:rFonts w:ascii="Georgia" w:hAnsi="Georgia" w:cs="Georgia" w:eastAsia="Georgia"/>
-          <w:sz w:val="20"/>
-          <w:szCs w:val="20"/>
+          <w:sz w:val="22"/>
+          <w:szCs w:val="22"/>
         </w:rPr>
         <w:t xml:space="preserve">• Frame + separate EC: “It should be noted that the results may indicate growth.” Code may via Working Test as EC. The frame alone fails the claim condition or both checks and is not a second hedge.</w:t>
       </w:r>
     </w:p>
     <w:p>
       <w:pPr>
-        <w:spacing w:before="0" w:after="60" w:line="300" w:lineRule="auto"/>
+        <w:spacing w:before="0" w:after="0" w:line="480" w:lineRule="auto"/>
         <w:ind w:left="360"/>
         <w:jc w:val="both"/>
       </w:pPr>
       <w:r>
         <w:rPr>
           <w:rFonts w:ascii="Georgia" w:hAnsi="Georgia" w:cs="Georgia" w:eastAsia="Georgia"/>
-          <w:sz w:val="20"/>
-          <w:szCs w:val="20"/>
+          <w:sz w:val="22"/>
+          <w:szCs w:val="22"/>
         </w:rPr>
         <w:t xml:space="preserve">• Summary: Step 1 is wide. Step 2 uses a claim condition, then the Working Test (EC) and Reader Test (P). Non-claims fail the claim condition and are FP. Neither removal check met → FP (not a function). Step 3 assigns type to retained hedges only. In this corpus all 65 retained tokens were EC. No P forms appeared on claims. FP cases are inventoried separately with reason codes.</w:t>
       </w:r>
@@ -13644,7 +13648,7 @@
     <w:p>
       <w:pPr>
         <w:keepNext/>
-        <w:spacing w:before="240" w:after="40" w:line="300" w:lineRule="auto"/>
+        <w:spacing w:before="240" w:after="0" w:line="480" w:lineRule="auto"/>
         <w:jc w:val="left"/>
       </w:pPr>
       <w:r>
@@ -13652,8 +13656,8 @@
           <w:rFonts w:ascii="Georgia" w:hAnsi="Georgia" w:cs="Georgia" w:eastAsia="Georgia"/>
           <w:b/>
           <w:bCs w:val="1"/>
-          <w:sz w:val="22"/>
-          <w:szCs w:val="22"/>
+          <w:sz w:val="24"/>
+          <w:szCs w:val="24"/>
           <w:rtl w:val="0"/>
         </w:rPr>
         <w:t>HEDGE TYPE (PRIMARY COLORS)</w:t>
@@ -13662,16 +13666,16 @@
         <w:rPr>
           <w:rFonts w:ascii="Georgia" w:hAnsi="Georgia" w:cs="Georgia" w:eastAsia="Georgia"/>
           <w:rtl w:val="0"/>
-          <w:sz w:val="22"/>
-          <w:szCs w:val="22"/>
+          <w:sz w:val="24"/>
+          <w:szCs w:val="24"/>
           <w:b/>
         </w:rPr>
       </w:r>
     </w:p>
     <w:p>
       <w:pPr>
-        <w:spacing w:before="0" w:after="60" w:line="300" w:lineRule="auto"/>
-        <w:ind w:left="360"/>
+        <w:spacing w:before="0" w:after="0" w:line="480" w:lineRule="auto"/>
+        <w:ind w:firstLine="720"/>
         <w:jc w:val="both"/>
       </w:pPr>
       <w:r>
@@ -13680,8 +13684,8 @@
           <w:bCs w:val="0"/>
           <w:i w:val="0"/>
           <w:iCs w:val="0"/>
-          <w:sz w:val="20"/>
-          <w:szCs w:val="20"/>
+          <w:sz w:val="22"/>
+          <w:szCs w:val="22"/>
           <w:rtl w:val="0"/>
         </w:rPr>
         <w:t xml:space="preserve">Highlight each hedge token in the color matching its grammatical form.</w:t>
@@ -13690,8 +13694,8 @@
         <w:rPr>
           <w:rFonts w:ascii="Georgia" w:hAnsi="Georgia" w:cs="Georgia" w:eastAsia="Georgia"/>
           <w:rtl w:val="0"/>
-          <w:sz w:val="20"/>
-          <w:szCs w:val="20"/>
+          <w:sz w:val="22"/>
+          <w:szCs w:val="22"/>
         </w:rPr>
       </w:r>
     </w:p>
@@ -13740,7 +13744,7 @@
           </w:tcPr>
           <w:p>
             <w:pPr>
-              <w:spacing w:before="0" w:after="0" w:line="260" w:lineRule="auto"/>
+              <w:spacing w:before="0" w:after="0" w:line="240" w:lineRule="auto"/>
               <w:jc w:val="both"/>
               <w:rPr/>
             </w:pPr>
@@ -13760,7 +13764,7 @@
                 <w:rtl w:val="0"/>
                 <w:sz w:val="18"/>
                 <w:szCs w:val="18"/>
-                <w:rFonts w:ascii="Georgia" w:hAnsi="Georgia"/>
+                <w:rFonts w:ascii="Georgia" w:hAnsi="Georgia" w:cs="Georgia" w:eastAsia="Georgia"/>
               </w:rPr>
             </w:r>
           </w:p>
@@ -13774,7 +13778,7 @@
           </w:tcPr>
           <w:p>
             <w:pPr>
-              <w:spacing w:before="0" w:after="0" w:line="260" w:lineRule="auto"/>
+              <w:spacing w:before="0" w:after="0" w:line="240" w:lineRule="auto"/>
               <w:jc w:val="both"/>
               <w:rPr/>
             </w:pPr>
@@ -13794,7 +13798,7 @@
                 <w:rtl w:val="0"/>
                 <w:sz w:val="18"/>
                 <w:szCs w:val="18"/>
-                <w:rFonts w:ascii="Georgia" w:hAnsi="Georgia"/>
+                <w:rFonts w:ascii="Georgia" w:hAnsi="Georgia" w:cs="Georgia" w:eastAsia="Georgia"/>
               </w:rPr>
             </w:r>
           </w:p>
@@ -13808,7 +13812,7 @@
           </w:tcPr>
           <w:p>
             <w:pPr>
-              <w:spacing w:before="0" w:after="0" w:line="260" w:lineRule="auto"/>
+              <w:spacing w:before="0" w:after="0" w:line="240" w:lineRule="auto"/>
               <w:jc w:val="both"/>
               <w:rPr/>
             </w:pPr>
@@ -13828,7 +13832,7 @@
                 <w:rtl w:val="0"/>
                 <w:sz w:val="18"/>
                 <w:szCs w:val="18"/>
-                <w:rFonts w:ascii="Georgia" w:hAnsi="Georgia"/>
+                <w:rFonts w:ascii="Georgia" w:hAnsi="Georgia" w:cs="Georgia" w:eastAsia="Georgia"/>
               </w:rPr>
             </w:r>
           </w:p>
@@ -13842,7 +13846,7 @@
           </w:tcPr>
           <w:p>
             <w:pPr>
-              <w:spacing w:before="0" w:after="0" w:line="260" w:lineRule="auto"/>
+              <w:spacing w:before="0" w:after="0" w:line="240" w:lineRule="auto"/>
               <w:jc w:val="both"/>
               <w:rPr/>
             </w:pPr>
@@ -13862,7 +13866,7 @@
                 <w:rtl w:val="0"/>
                 <w:sz w:val="18"/>
                 <w:szCs w:val="18"/>
-                <w:rFonts w:ascii="Georgia" w:hAnsi="Georgia"/>
+                <w:rFonts w:ascii="Georgia" w:hAnsi="Georgia" w:cs="Georgia" w:eastAsia="Georgia"/>
               </w:rPr>
             </w:r>
           </w:p>
@@ -13878,7 +13882,7 @@
           </w:tcPr>
           <w:p>
             <w:pPr>
-              <w:spacing w:before="0" w:after="0" w:line="260" w:lineRule="auto"/>
+              <w:spacing w:before="0" w:after="0" w:line="240" w:lineRule="auto"/>
               <w:jc w:val="left"/>
               <w:rPr/>
             </w:pPr>
@@ -13897,7 +13901,7 @@
                 <w:rtl w:val="0"/>
                 <w:sz w:val="18"/>
                 <w:szCs w:val="18"/>
-                <w:rFonts w:ascii="Georgia" w:hAnsi="Georgia"/>
+                <w:rFonts w:ascii="Georgia" w:hAnsi="Georgia" w:cs="Georgia" w:eastAsia="Georgia"/>
               </w:rPr>
             </w:r>
           </w:p>
@@ -13906,7 +13910,7 @@
           <w:tcPr/>
           <w:p>
             <w:pPr>
-              <w:spacing w:before="0" w:after="0" w:line="260" w:lineRule="auto"/>
+              <w:spacing w:before="0" w:after="0" w:line="240" w:lineRule="auto"/>
               <w:jc w:val="both"/>
               <w:rPr/>
             </w:pPr>
@@ -13924,7 +13928,7 @@
                 <w:rtl w:val="0"/>
                 <w:sz w:val="18"/>
                 <w:szCs w:val="18"/>
-                <w:rFonts w:ascii="Georgia" w:hAnsi="Georgia"/>
+                <w:rFonts w:ascii="Georgia" w:hAnsi="Georgia" w:cs="Georgia" w:eastAsia="Georgia"/>
               </w:rPr>
             </w:r>
           </w:p>
@@ -13933,7 +13937,7 @@
           <w:tcPr/>
           <w:p>
             <w:pPr>
-              <w:spacing w:before="0" w:after="0" w:line="260" w:lineRule="auto"/>
+              <w:spacing w:before="0" w:after="0" w:line="240" w:lineRule="auto"/>
               <w:jc w:val="both"/>
               <w:rPr/>
             </w:pPr>
@@ -13951,7 +13955,7 @@
                 <w:rtl w:val="0"/>
                 <w:sz w:val="18"/>
                 <w:szCs w:val="18"/>
-                <w:rFonts w:ascii="Georgia" w:hAnsi="Georgia"/>
+                <w:rFonts w:ascii="Georgia" w:hAnsi="Georgia" w:cs="Georgia" w:eastAsia="Georgia"/>
               </w:rPr>
             </w:r>
           </w:p>
@@ -13960,7 +13964,7 @@
           <w:tcPr/>
           <w:p>
             <w:pPr>
-              <w:spacing w:before="0" w:after="0" w:line="260" w:lineRule="auto"/>
+              <w:spacing w:before="0" w:after="0" w:line="240" w:lineRule="auto"/>
               <w:jc w:val="both"/>
               <w:rPr/>
             </w:pPr>
@@ -14011,7 +14015,7 @@
                 <w:rtl w:val="0"/>
                 <w:sz w:val="18"/>
                 <w:szCs w:val="18"/>
-                <w:rFonts w:ascii="Georgia" w:hAnsi="Georgia"/>
+                <w:rFonts w:ascii="Georgia" w:hAnsi="Georgia" w:cs="Georgia" w:eastAsia="Georgia"/>
               </w:rPr>
             </w:r>
           </w:p>
@@ -14027,7 +14031,7 @@
           </w:tcPr>
           <w:p>
             <w:pPr>
-              <w:spacing w:before="0" w:after="0" w:line="260" w:lineRule="auto"/>
+              <w:spacing w:before="0" w:after="0" w:line="240" w:lineRule="auto"/>
               <w:jc w:val="left"/>
               <w:rPr/>
             </w:pPr>
@@ -14046,7 +14050,7 @@
                 <w:rtl w:val="0"/>
                 <w:sz w:val="18"/>
                 <w:szCs w:val="18"/>
-                <w:rFonts w:ascii="Georgia" w:hAnsi="Georgia"/>
+                <w:rFonts w:ascii="Georgia" w:hAnsi="Georgia" w:cs="Georgia" w:eastAsia="Georgia"/>
               </w:rPr>
             </w:r>
           </w:p>
@@ -14055,7 +14059,7 @@
           <w:tcPr/>
           <w:p>
             <w:pPr>
-              <w:spacing w:before="0" w:after="0" w:line="260" w:lineRule="auto"/>
+              <w:spacing w:before="0" w:after="0" w:line="240" w:lineRule="auto"/>
               <w:jc w:val="both"/>
               <w:rPr/>
             </w:pPr>
@@ -14073,7 +14077,7 @@
                 <w:rtl w:val="0"/>
                 <w:sz w:val="18"/>
                 <w:szCs w:val="18"/>
-                <w:rFonts w:ascii="Georgia" w:hAnsi="Georgia"/>
+                <w:rFonts w:ascii="Georgia" w:hAnsi="Georgia" w:cs="Georgia" w:eastAsia="Georgia"/>
               </w:rPr>
             </w:r>
           </w:p>
@@ -14082,7 +14086,7 @@
           <w:tcPr/>
           <w:p>
             <w:pPr>
-              <w:spacing w:before="0" w:after="0" w:line="260" w:lineRule="auto"/>
+              <w:spacing w:before="0" w:after="0" w:line="240" w:lineRule="auto"/>
               <w:jc w:val="both"/>
               <w:rPr/>
             </w:pPr>
@@ -14100,7 +14104,7 @@
                 <w:rtl w:val="0"/>
                 <w:sz w:val="18"/>
                 <w:szCs w:val="18"/>
-                <w:rFonts w:ascii="Georgia" w:hAnsi="Georgia"/>
+                <w:rFonts w:ascii="Georgia" w:hAnsi="Georgia" w:cs="Georgia" w:eastAsia="Georgia"/>
               </w:rPr>
             </w:r>
           </w:p>
@@ -14109,7 +14113,7 @@
           <w:tcPr/>
           <w:p>
             <w:pPr>
-              <w:spacing w:before="0" w:after="0" w:line="260" w:lineRule="auto"/>
+              <w:spacing w:before="0" w:after="0" w:line="240" w:lineRule="auto"/>
               <w:jc w:val="both"/>
               <w:rPr/>
             </w:pPr>
@@ -14160,7 +14164,7 @@
                 <w:rtl w:val="0"/>
                 <w:sz w:val="18"/>
                 <w:szCs w:val="18"/>
-                <w:rFonts w:ascii="Georgia" w:hAnsi="Georgia"/>
+                <w:rFonts w:ascii="Georgia" w:hAnsi="Georgia" w:cs="Georgia" w:eastAsia="Georgia"/>
               </w:rPr>
             </w:r>
           </w:p>
@@ -14176,7 +14180,7 @@
           </w:tcPr>
           <w:p>
             <w:pPr>
-              <w:spacing w:before="0" w:after="0" w:line="260" w:lineRule="auto"/>
+              <w:spacing w:before="0" w:after="0" w:line="240" w:lineRule="auto"/>
               <w:jc w:val="left"/>
               <w:rPr/>
             </w:pPr>
@@ -14195,7 +14199,7 @@
                 <w:rtl w:val="0"/>
                 <w:sz w:val="18"/>
                 <w:szCs w:val="18"/>
-                <w:rFonts w:ascii="Georgia" w:hAnsi="Georgia"/>
+                <w:rFonts w:ascii="Georgia" w:hAnsi="Georgia" w:cs="Georgia" w:eastAsia="Georgia"/>
               </w:rPr>
             </w:r>
           </w:p>
@@ -14204,7 +14208,7 @@
           <w:tcPr/>
           <w:p>
             <w:pPr>
-              <w:spacing w:before="0" w:after="0" w:line="260" w:lineRule="auto"/>
+              <w:spacing w:before="0" w:after="0" w:line="240" w:lineRule="auto"/>
               <w:jc w:val="both"/>
               <w:rPr/>
             </w:pPr>
@@ -14222,7 +14226,7 @@
                 <w:rtl w:val="0"/>
                 <w:sz w:val="18"/>
                 <w:szCs w:val="18"/>
-                <w:rFonts w:ascii="Georgia" w:hAnsi="Georgia"/>
+                <w:rFonts w:ascii="Georgia" w:hAnsi="Georgia" w:cs="Georgia" w:eastAsia="Georgia"/>
               </w:rPr>
             </w:r>
           </w:p>
@@ -14231,7 +14235,7 @@
           <w:tcPr/>
           <w:p>
             <w:pPr>
-              <w:spacing w:before="0" w:after="0" w:line="260" w:lineRule="auto"/>
+              <w:spacing w:before="0" w:after="0" w:line="240" w:lineRule="auto"/>
               <w:jc w:val="both"/>
               <w:rPr/>
             </w:pPr>
@@ -14249,7 +14253,7 @@
                 <w:rtl w:val="0"/>
                 <w:sz w:val="18"/>
                 <w:szCs w:val="18"/>
-                <w:rFonts w:ascii="Georgia" w:hAnsi="Georgia"/>
+                <w:rFonts w:ascii="Georgia" w:hAnsi="Georgia" w:cs="Georgia" w:eastAsia="Georgia"/>
               </w:rPr>
             </w:r>
           </w:p>
@@ -14258,7 +14262,7 @@
           <w:tcPr/>
           <w:p>
             <w:pPr>
-              <w:spacing w:before="0" w:after="0" w:line="260" w:lineRule="auto"/>
+              <w:spacing w:before="0" w:after="0" w:line="240" w:lineRule="auto"/>
               <w:jc w:val="both"/>
               <w:rPr/>
             </w:pPr>
@@ -14309,7 +14313,7 @@
                 <w:rtl w:val="0"/>
                 <w:sz w:val="18"/>
                 <w:szCs w:val="18"/>
-                <w:rFonts w:ascii="Georgia" w:hAnsi="Georgia"/>
+                <w:rFonts w:ascii="Georgia" w:hAnsi="Georgia" w:cs="Georgia" w:eastAsia="Georgia"/>
               </w:rPr>
             </w:r>
           </w:p>
@@ -14325,7 +14329,7 @@
           </w:tcPr>
           <w:p>
             <w:pPr>
-              <w:spacing w:before="0" w:after="0" w:line="260" w:lineRule="auto"/>
+              <w:spacing w:before="0" w:after="0" w:line="240" w:lineRule="auto"/>
               <w:jc w:val="left"/>
               <w:rPr/>
             </w:pPr>
@@ -14344,7 +14348,7 @@
                 <w:rtl w:val="0"/>
                 <w:sz w:val="18"/>
                 <w:szCs w:val="18"/>
-                <w:rFonts w:ascii="Georgia" w:hAnsi="Georgia"/>
+                <w:rFonts w:ascii="Georgia" w:hAnsi="Georgia" w:cs="Georgia" w:eastAsia="Georgia"/>
               </w:rPr>
             </w:r>
           </w:p>
@@ -14353,7 +14357,7 @@
           <w:tcPr/>
           <w:p>
             <w:pPr>
-              <w:spacing w:before="0" w:after="0" w:line="260" w:lineRule="auto"/>
+              <w:spacing w:before="0" w:after="0" w:line="240" w:lineRule="auto"/>
               <w:jc w:val="both"/>
               <w:rPr/>
             </w:pPr>
@@ -14371,7 +14375,7 @@
                 <w:rtl w:val="0"/>
                 <w:sz w:val="18"/>
                 <w:szCs w:val="18"/>
-                <w:rFonts w:ascii="Georgia" w:hAnsi="Georgia"/>
+                <w:rFonts w:ascii="Georgia" w:hAnsi="Georgia" w:cs="Georgia" w:eastAsia="Georgia"/>
               </w:rPr>
             </w:r>
           </w:p>
@@ -14380,7 +14384,7 @@
           <w:tcPr/>
           <w:p>
             <w:pPr>
-              <w:spacing w:before="0" w:after="0" w:line="260" w:lineRule="auto"/>
+              <w:spacing w:before="0" w:after="0" w:line="240" w:lineRule="auto"/>
               <w:jc w:val="both"/>
               <w:rPr/>
             </w:pPr>
@@ -14398,7 +14402,7 @@
                 <w:rtl w:val="0"/>
                 <w:sz w:val="18"/>
                 <w:szCs w:val="18"/>
-                <w:rFonts w:ascii="Georgia" w:hAnsi="Georgia"/>
+                <w:rFonts w:ascii="Georgia" w:hAnsi="Georgia" w:cs="Georgia" w:eastAsia="Georgia"/>
               </w:rPr>
             </w:r>
           </w:p>
@@ -14407,7 +14411,7 @@
           <w:tcPr/>
           <w:p>
             <w:pPr>
-              <w:spacing w:before="0" w:after="0" w:line="260" w:lineRule="auto"/>
+              <w:spacing w:before="0" w:after="0" w:line="240" w:lineRule="auto"/>
               <w:jc w:val="both"/>
               <w:rPr/>
             </w:pPr>
@@ -14458,7 +14462,7 @@
                 <w:rtl w:val="0"/>
                 <w:sz w:val="18"/>
                 <w:szCs w:val="18"/>
-                <w:rFonts w:ascii="Georgia" w:hAnsi="Georgia"/>
+                <w:rFonts w:ascii="Georgia" w:hAnsi="Georgia" w:cs="Georgia" w:eastAsia="Georgia"/>
               </w:rPr>
             </w:r>
           </w:p>
@@ -14467,8 +14471,8 @@
     </w:tbl>
     <w:p>
       <w:pPr>
-        <w:spacing w:before="200" w:after="60" w:line="300" w:lineRule="auto"/>
-        <w:ind w:left="360"/>
+        <w:spacing w:before="240" w:after="0" w:line="480" w:lineRule="auto"/>
+        <w:ind w:firstLine="720"/>
         <w:jc w:val="both"/>
       </w:pPr>
       <w:r>
@@ -14478,8 +14482,8 @@
           <w:i w:val="1"/>
           <w:iCs w:val="1"/>
           <w:color w:val="000000"/>
-          <w:sz w:val="20"/>
-          <w:szCs w:val="20"/>
+          <w:sz w:val="22"/>
+          <w:szCs w:val="22"/>
           <w:rtl w:val="0"/>
         </w:rPr>
         <w:t>Exclusions (capability, recommendation, procedural norm, location) are in the Decision Rules table.</w:t>
@@ -14491,8 +14495,8 @@
           <w:i w:val="1"/>
           <w:iCs w:val="1"/>
           <w:color w:val="000000"/>
-          <w:sz w:val="20"/>
-          <w:szCs w:val="20"/>
+          <w:sz w:val="22"/>
+          <w:szCs w:val="22"/>
           <w:rtl w:val="0"/>
         </w:rPr>
       </w:r>
@@ -14503,31 +14507,31 @@
           <w:i w:val="1"/>
           <w:iCs w:val="1"/>
           <w:color w:val="000000"/>
-          <w:sz w:val="20"/>
-          <w:szCs w:val="20"/>
-          <w:rtl w:val="0"/>
-        </w:rPr>
-      </w:r>
-      <w:r>
-        <w:rPr>
-          <w:rFonts w:ascii="Georgia" w:hAnsi="Georgia" w:cs="Georgia" w:eastAsia="Georgia"/>
-          <w:rtl w:val="0"/>
-          <w:sz w:val="20"/>
-          <w:szCs w:val="20"/>
-        </w:rPr>
-      </w:r>
-    </w:p>
-    <w:p>
-      <w:pPr>
-        <w:spacing w:before="0" w:after="60" w:line="300" w:lineRule="auto"/>
+          <w:sz w:val="22"/>
+          <w:szCs w:val="22"/>
+          <w:rtl w:val="0"/>
+        </w:rPr>
+      </w:r>
+      <w:r>
+        <w:rPr>
+          <w:rFonts w:ascii="Georgia" w:hAnsi="Georgia" w:cs="Georgia" w:eastAsia="Georgia"/>
+          <w:rtl w:val="0"/>
+          <w:sz w:val="22"/>
+          <w:szCs w:val="22"/>
+        </w:rPr>
+      </w:r>
+    </w:p>
+    <w:p>
+      <w:pPr>
+        <w:spacing w:before="0" w:after="0" w:line="480" w:lineRule="auto"/>
         <w:ind w:left="360"/>
         <w:jc w:val="both"/>
       </w:pPr>
       <w:r>
         <w:rPr>
           <w:rFonts w:ascii="Georgia" w:hAnsi="Georgia" w:cs="Georgia" w:eastAsia="Georgia"/>
-          <w:sz w:val="20"/>
-          <w:szCs w:val="20"/>
+          <w:sz w:val="22"/>
+          <w:szCs w:val="22"/>
         </w:rPr>
         <w:t xml:space="preserve">• imply / implies / implying = suggest. • can be concluded / derived / stated = inferential hedge (not capability can). • potentially = adverbial. • potential + noun: aim/methods topic-naming = FP-Gen. Results/conclusion qualifying a finding = Lexical EC. If removing potential changes commitment to a proposition, code Lexical EC.</w:t>
       </w:r>
@@ -14535,7 +14539,7 @@
     <w:p>
       <w:pPr>
         <w:keepNext/>
-        <w:spacing w:before="240" w:after="40" w:line="300" w:lineRule="auto"/>
+        <w:spacing w:before="240" w:after="0" w:line="480" w:lineRule="auto"/>
         <w:jc w:val="left"/>
       </w:pPr>
       <w:r>
@@ -14543,8 +14547,8 @@
           <w:rFonts w:ascii="Georgia" w:hAnsi="Georgia" w:cs="Georgia" w:eastAsia="Georgia"/>
           <w:b/>
           <w:bCs w:val="1"/>
-          <w:sz w:val="22"/>
-          <w:szCs w:val="22"/>
+          <w:sz w:val="24"/>
+          <w:szCs w:val="24"/>
           <w:rtl w:val="0"/>
         </w:rPr>
         <w:t>HEDGE FUNCTION (COLORED TEXT LABELS)</w:t>
@@ -14553,8 +14557,8 @@
         <w:rPr>
           <w:rFonts w:ascii="Georgia" w:hAnsi="Georgia" w:cs="Georgia" w:eastAsia="Georgia"/>
           <w:rtl w:val="0"/>
-          <w:sz w:val="22"/>
-          <w:szCs w:val="22"/>
+          <w:sz w:val="24"/>
+          <w:szCs w:val="24"/>
           <w:b/>
         </w:rPr>
       </w:r>
@@ -14604,7 +14608,7 @@
           </w:tcPr>
           <w:p>
             <w:pPr>
-              <w:spacing w:before="0" w:after="0" w:line="260" w:lineRule="auto"/>
+              <w:spacing w:before="0" w:after="0" w:line="240" w:lineRule="auto"/>
               <w:jc w:val="both"/>
               <w:rPr/>
             </w:pPr>
@@ -14624,7 +14628,7 @@
                 <w:rtl w:val="0"/>
                 <w:sz w:val="18"/>
                 <w:szCs w:val="18"/>
-                <w:rFonts w:ascii="Georgia" w:hAnsi="Georgia"/>
+                <w:rFonts w:ascii="Georgia" w:hAnsi="Georgia" w:cs="Georgia" w:eastAsia="Georgia"/>
               </w:rPr>
             </w:r>
           </w:p>
@@ -14638,7 +14642,7 @@
           </w:tcPr>
           <w:p>
             <w:pPr>
-              <w:spacing w:before="0" w:after="0" w:line="260" w:lineRule="auto"/>
+              <w:spacing w:before="0" w:after="0" w:line="240" w:lineRule="auto"/>
               <w:jc w:val="both"/>
               <w:rPr/>
             </w:pPr>
@@ -14658,7 +14662,7 @@
                 <w:rtl w:val="0"/>
                 <w:sz w:val="18"/>
                 <w:szCs w:val="18"/>
-                <w:rFonts w:ascii="Georgia" w:hAnsi="Georgia"/>
+                <w:rFonts w:ascii="Georgia" w:hAnsi="Georgia" w:cs="Georgia" w:eastAsia="Georgia"/>
               </w:rPr>
             </w:r>
           </w:p>
@@ -14672,7 +14676,7 @@
           </w:tcPr>
           <w:p>
             <w:pPr>
-              <w:spacing w:before="0" w:after="0" w:line="260" w:lineRule="auto"/>
+              <w:spacing w:before="0" w:after="0" w:line="240" w:lineRule="auto"/>
               <w:jc w:val="both"/>
               <w:rPr/>
             </w:pPr>
@@ -14692,7 +14696,7 @@
                 <w:rtl w:val="0"/>
                 <w:sz w:val="18"/>
                 <w:szCs w:val="18"/>
-                <w:rFonts w:ascii="Georgia" w:hAnsi="Georgia"/>
+                <w:rFonts w:ascii="Georgia" w:hAnsi="Georgia" w:cs="Georgia" w:eastAsia="Georgia"/>
               </w:rPr>
             </w:r>
           </w:p>
@@ -14706,7 +14710,7 @@
           </w:tcPr>
           <w:p>
             <w:pPr>
-              <w:spacing w:before="0" w:after="0" w:line="260" w:lineRule="auto"/>
+              <w:spacing w:before="0" w:after="0" w:line="240" w:lineRule="auto"/>
               <w:jc w:val="both"/>
               <w:rPr/>
             </w:pPr>
@@ -14726,7 +14730,7 @@
                 <w:rtl w:val="0"/>
                 <w:sz w:val="18"/>
                 <w:szCs w:val="18"/>
-                <w:rFonts w:ascii="Georgia" w:hAnsi="Georgia"/>
+                <w:rFonts w:ascii="Georgia" w:hAnsi="Georgia" w:cs="Georgia" w:eastAsia="Georgia"/>
               </w:rPr>
             </w:r>
           </w:p>
@@ -14740,7 +14744,7 @@
           <w:tcPr/>
           <w:p>
             <w:pPr>
-              <w:spacing w:before="0" w:after="0" w:line="260" w:lineRule="auto"/>
+              <w:spacing w:before="0" w:after="0" w:line="240" w:lineRule="auto"/>
               <w:jc w:val="left"/>
               <w:rPr/>
             </w:pPr>
@@ -14763,7 +14767,7 @@
                 <w:rtl w:val="0"/>
                 <w:sz w:val="18"/>
                 <w:szCs w:val="18"/>
-                <w:rFonts w:ascii="Georgia" w:hAnsi="Georgia"/>
+                <w:rFonts w:ascii="Georgia" w:hAnsi="Georgia" w:cs="Georgia" w:eastAsia="Georgia"/>
               </w:rPr>
             </w:r>
           </w:p>
@@ -14772,7 +14776,7 @@
           <w:tcPr/>
           <w:p>
             <w:pPr>
-              <w:spacing w:before="0" w:after="0" w:line="260" w:lineRule="auto"/>
+              <w:spacing w:before="0" w:after="0" w:line="240" w:lineRule="auto"/>
               <w:jc w:val="both"/>
               <w:rPr/>
             </w:pPr>
@@ -14790,7 +14794,7 @@
                 <w:rtl w:val="0"/>
                 <w:sz w:val="18"/>
                 <w:szCs w:val="18"/>
-                <w:rFonts w:ascii="Georgia" w:hAnsi="Georgia"/>
+                <w:rFonts w:ascii="Georgia" w:hAnsi="Georgia" w:cs="Georgia" w:eastAsia="Georgia"/>
               </w:rPr>
             </w:r>
           </w:p>
@@ -14799,7 +14803,7 @@
           <w:tcPr/>
           <w:p>
             <w:pPr>
-              <w:spacing w:before="0" w:after="0" w:line="260" w:lineRule="auto"/>
+              <w:spacing w:before="0" w:after="0" w:line="240" w:lineRule="auto"/>
               <w:jc w:val="both"/>
               <w:rPr/>
             </w:pPr>
@@ -14817,7 +14821,7 @@
                 <w:rtl w:val="0"/>
                 <w:sz w:val="18"/>
                 <w:szCs w:val="18"/>
-                <w:rFonts w:ascii="Georgia" w:hAnsi="Georgia"/>
+                <w:rFonts w:ascii="Georgia" w:hAnsi="Georgia" w:cs="Georgia" w:eastAsia="Georgia"/>
               </w:rPr>
             </w:r>
           </w:p>
@@ -14826,7 +14830,7 @@
           <w:tcPr/>
           <w:p>
             <w:pPr>
-              <w:spacing w:before="0" w:after="0" w:line="260" w:lineRule="auto"/>
+              <w:spacing w:before="0" w:after="0" w:line="240" w:lineRule="auto"/>
               <w:jc w:val="both"/>
               <w:rPr/>
             </w:pPr>
@@ -14905,7 +14909,7 @@
                 <w:rtl w:val="0"/>
                 <w:sz w:val="18"/>
                 <w:szCs w:val="18"/>
-                <w:rFonts w:ascii="Georgia" w:hAnsi="Georgia"/>
+                <w:rFonts w:ascii="Georgia" w:hAnsi="Georgia" w:cs="Georgia" w:eastAsia="Georgia"/>
               </w:rPr>
             </w:r>
           </w:p>
@@ -14919,7 +14923,7 @@
           <w:tcPr/>
           <w:p>
             <w:pPr>
-              <w:spacing w:before="0" w:after="0" w:line="260" w:lineRule="auto"/>
+              <w:spacing w:before="0" w:after="0" w:line="240" w:lineRule="auto"/>
               <w:jc w:val="left"/>
               <w:rPr/>
             </w:pPr>
@@ -14942,7 +14946,7 @@
                 <w:rtl w:val="0"/>
                 <w:sz w:val="18"/>
                 <w:szCs w:val="18"/>
-                <w:rFonts w:ascii="Georgia" w:hAnsi="Georgia"/>
+                <w:rFonts w:ascii="Georgia" w:hAnsi="Georgia" w:cs="Georgia" w:eastAsia="Georgia"/>
               </w:rPr>
             </w:r>
           </w:p>
@@ -14951,7 +14955,7 @@
           <w:tcPr/>
           <w:p>
             <w:pPr>
-              <w:spacing w:before="0" w:after="0" w:line="260" w:lineRule="auto"/>
+              <w:spacing w:before="0" w:after="0" w:line="240" w:lineRule="auto"/>
               <w:jc w:val="both"/>
               <w:rPr/>
             </w:pPr>
@@ -14969,7 +14973,7 @@
                 <w:rtl w:val="0"/>
                 <w:sz w:val="18"/>
                 <w:szCs w:val="18"/>
-                <w:rFonts w:ascii="Georgia" w:hAnsi="Georgia"/>
+                <w:rFonts w:ascii="Georgia" w:hAnsi="Georgia" w:cs="Georgia" w:eastAsia="Georgia"/>
               </w:rPr>
             </w:r>
           </w:p>
@@ -14978,7 +14982,7 @@
           <w:tcPr/>
           <w:p>
             <w:pPr>
-              <w:spacing w:before="0" w:after="0" w:line="260" w:lineRule="auto"/>
+              <w:spacing w:before="0" w:after="0" w:line="240" w:lineRule="auto"/>
               <w:jc w:val="both"/>
               <w:rPr/>
             </w:pPr>
@@ -14996,7 +15000,7 @@
                 <w:rtl w:val="0"/>
                 <w:sz w:val="18"/>
                 <w:szCs w:val="18"/>
-                <w:rFonts w:ascii="Georgia" w:hAnsi="Georgia"/>
+                <w:rFonts w:ascii="Georgia" w:hAnsi="Georgia" w:cs="Georgia" w:eastAsia="Georgia"/>
               </w:rPr>
             </w:r>
           </w:p>
@@ -15005,7 +15009,7 @@
           <w:tcPr/>
           <w:p>
             <w:pPr>
-              <w:spacing w:before="0" w:after="0" w:line="260" w:lineRule="auto"/>
+              <w:spacing w:before="0" w:after="0" w:line="240" w:lineRule="auto"/>
               <w:jc w:val="both"/>
               <w:rPr/>
             </w:pPr>
@@ -15084,7 +15088,7 @@
                 <w:rtl w:val="0"/>
                 <w:sz w:val="18"/>
                 <w:szCs w:val="18"/>
-                <w:rFonts w:ascii="Georgia" w:hAnsi="Georgia"/>
+                <w:rFonts w:ascii="Georgia" w:hAnsi="Georgia" w:cs="Georgia" w:eastAsia="Georgia"/>
               </w:rPr>
             </w:r>
           </w:p>
@@ -15098,7 +15102,7 @@
           <w:tcPr/>
           <w:p>
             <w:pPr>
-              <w:spacing w:before="0" w:after="0" w:line="260" w:lineRule="auto"/>
+              <w:spacing w:before="0" w:after="0" w:line="240" w:lineRule="auto"/>
               <w:jc w:val="left"/>
               <w:rPr/>
             </w:pPr>
@@ -15121,7 +15125,7 @@
                 <w:rtl w:val="0"/>
                 <w:sz w:val="18"/>
                 <w:szCs w:val="18"/>
-                <w:rFonts w:ascii="Georgia" w:hAnsi="Georgia"/>
+                <w:rFonts w:ascii="Georgia" w:hAnsi="Georgia" w:cs="Georgia" w:eastAsia="Georgia"/>
               </w:rPr>
             </w:r>
           </w:p>
@@ -15130,7 +15134,7 @@
           <w:tcPr/>
           <w:p>
             <w:pPr>
-              <w:spacing w:before="0" w:after="0" w:line="260" w:lineRule="auto"/>
+              <w:spacing w:before="0" w:after="0" w:line="240" w:lineRule="auto"/>
               <w:jc w:val="both"/>
               <w:rPr/>
             </w:pPr>
@@ -15148,7 +15152,7 @@
                 <w:rtl w:val="0"/>
                 <w:sz w:val="18"/>
                 <w:szCs w:val="18"/>
-                <w:rFonts w:ascii="Georgia" w:hAnsi="Georgia"/>
+                <w:rFonts w:ascii="Georgia" w:hAnsi="Georgia" w:cs="Georgia" w:eastAsia="Georgia"/>
               </w:rPr>
             </w:r>
           </w:p>
@@ -15157,7 +15161,7 @@
           <w:tcPr/>
           <w:p>
             <w:pPr>
-              <w:spacing w:before="0" w:after="0" w:line="260" w:lineRule="auto"/>
+              <w:spacing w:before="0" w:after="0" w:line="240" w:lineRule="auto"/>
               <w:jc w:val="both"/>
               <w:rPr/>
             </w:pPr>
@@ -15175,7 +15179,7 @@
                 <w:rtl w:val="0"/>
                 <w:sz w:val="18"/>
                 <w:szCs w:val="18"/>
-                <w:rFonts w:ascii="Georgia" w:hAnsi="Georgia"/>
+                <w:rFonts w:ascii="Georgia" w:hAnsi="Georgia" w:cs="Georgia" w:eastAsia="Georgia"/>
               </w:rPr>
             </w:r>
           </w:p>
@@ -15184,7 +15188,7 @@
           <w:tcPr/>
           <w:p>
             <w:pPr>
-              <w:spacing w:before="0" w:after="0" w:line="260" w:lineRule="auto"/>
+              <w:spacing w:before="0" w:after="0" w:line="240" w:lineRule="auto"/>
               <w:jc w:val="both"/>
               <w:rPr/>
             </w:pPr>
@@ -15263,7 +15267,7 @@
                 <w:rtl w:val="0"/>
                 <w:sz w:val="18"/>
                 <w:szCs w:val="18"/>
-                <w:rFonts w:ascii="Georgia" w:hAnsi="Georgia"/>
+                <w:rFonts w:ascii="Georgia" w:hAnsi="Georgia" w:cs="Georgia" w:eastAsia="Georgia"/>
               </w:rPr>
             </w:r>
           </w:p>
@@ -15273,7 +15277,7 @@
     <w:p>
       <w:pPr>
         <w:keepNext/>
-        <w:spacing w:before="240" w:after="40" w:line="300" w:lineRule="auto"/>
+        <w:spacing w:before="240" w:after="0" w:line="480" w:lineRule="auto"/>
         <w:jc w:val="left"/>
       </w:pPr>
       <w:r>
@@ -15281,8 +15285,8 @@
           <w:rFonts w:ascii="Georgia" w:cs="Georgia" w:eastAsia="Georgia" w:hAnsi="Georgia"/>
           <w:b w:val="1"/>
           <w:bCs w:val="1"/>
-          <w:sz w:val="22"/>
-          <w:szCs w:val="22"/>
+          <w:sz w:val="24"/>
+          <w:szCs w:val="24"/>
           <w:rtl w:val="0"/>
         </w:rPr>
         <w:t xml:space="preserve">DECISION RULES FOR AMBIGUOUS CASES</w:t>
@@ -15291,16 +15295,16 @@
         <w:rPr>
           <w:rFonts w:ascii="Georgia" w:hAnsi="Georgia" w:cs="Georgia" w:eastAsia="Georgia"/>
           <w:rtl w:val="0"/>
-          <w:sz w:val="22"/>
-          <w:szCs w:val="22"/>
+          <w:sz w:val="24"/>
+          <w:szCs w:val="24"/>
           <w:b/>
         </w:rPr>
       </w:r>
     </w:p>
     <w:p>
       <w:pPr>
-        <w:spacing w:before="0" w:after="60" w:line="300" w:lineRule="auto"/>
-        <w:ind w:left="360"/>
+        <w:spacing w:before="0" w:after="0" w:line="480" w:lineRule="auto"/>
+        <w:ind w:firstLine="720"/>
         <w:jc w:val="both"/>
       </w:pPr>
       <w:r>
@@ -15309,8 +15313,8 @@
           <w:bCs w:val="0"/>
           <w:i w:val="0"/>
           <w:iCs w:val="0"/>
-          <w:sz w:val="20"/>
-          <w:szCs w:val="20"/>
+          <w:sz w:val="22"/>
+          <w:szCs w:val="22"/>
           <w:rtl w:val="0"/>
         </w:rPr>
         <w:t xml:space="preserve">Reason codes for residual rejects after the claim condition or both removal checks fail. Use the table below when labeling an FP. These codes are not a pre-filter before Step 2.</w:t>
@@ -15359,7 +15363,7 @@
           </w:tcPr>
           <w:p>
             <w:pPr>
-              <w:spacing w:before="0" w:after="0" w:line="260" w:lineRule="auto"/>
+              <w:spacing w:before="0" w:after="0" w:line="240" w:lineRule="auto"/>
               <w:jc w:val="both"/>
               <w:rPr/>
             </w:pPr>
@@ -15379,7 +15383,7 @@
                 <w:rtl w:val="0"/>
                 <w:sz w:val="18"/>
                 <w:szCs w:val="18"/>
-                <w:rFonts w:ascii="Georgia" w:hAnsi="Georgia"/>
+                <w:rFonts w:ascii="Georgia" w:hAnsi="Georgia" w:cs="Georgia" w:eastAsia="Georgia"/>
               </w:rPr>
             </w:r>
           </w:p>
@@ -15393,7 +15397,7 @@
           </w:tcPr>
           <w:p>
             <w:pPr>
-              <w:spacing w:before="0" w:after="0" w:line="260" w:lineRule="auto"/>
+              <w:spacing w:before="0" w:after="0" w:line="240" w:lineRule="auto"/>
               <w:jc w:val="both"/>
               <w:rPr/>
             </w:pPr>
@@ -15413,7 +15417,7 @@
                 <w:rtl w:val="0"/>
                 <w:sz w:val="18"/>
                 <w:szCs w:val="18"/>
-                <w:rFonts w:ascii="Georgia" w:hAnsi="Georgia"/>
+                <w:rFonts w:ascii="Georgia" w:hAnsi="Georgia" w:cs="Georgia" w:eastAsia="Georgia"/>
               </w:rPr>
             </w:r>
           </w:p>
@@ -15427,7 +15431,7 @@
           </w:tcPr>
           <w:p>
             <w:pPr>
-              <w:spacing w:before="0" w:after="0" w:line="260" w:lineRule="auto"/>
+              <w:spacing w:before="0" w:after="0" w:line="240" w:lineRule="auto"/>
               <w:jc w:val="both"/>
               <w:rPr/>
             </w:pPr>
@@ -15447,7 +15451,7 @@
                 <w:rtl w:val="0"/>
                 <w:sz w:val="18"/>
                 <w:szCs w:val="18"/>
-                <w:rFonts w:ascii="Georgia" w:hAnsi="Georgia"/>
+                <w:rFonts w:ascii="Georgia" w:hAnsi="Georgia" w:cs="Georgia" w:eastAsia="Georgia"/>
               </w:rPr>
             </w:r>
           </w:p>
@@ -15461,7 +15465,7 @@
           <w:tcPr/>
           <w:p>
             <w:pPr>
-              <w:spacing w:before="0" w:after="0" w:line="260" w:lineRule="auto"/>
+              <w:spacing w:before="0" w:after="0" w:line="240" w:lineRule="auto"/>
               <w:jc w:val="both"/>
               <w:rPr/>
             </w:pPr>
@@ -15484,7 +15488,7 @@
                 <w:rtl w:val="0"/>
                 <w:sz w:val="18"/>
                 <w:szCs w:val="18"/>
-                <w:rFonts w:ascii="Georgia" w:hAnsi="Georgia"/>
+                <w:rFonts w:ascii="Georgia" w:hAnsi="Georgia" w:cs="Georgia" w:eastAsia="Georgia"/>
               </w:rPr>
             </w:r>
           </w:p>
@@ -15493,7 +15497,7 @@
           <w:tcPr/>
           <w:p>
             <w:pPr>
-              <w:spacing w:before="0" w:after="0" w:line="260" w:lineRule="auto"/>
+              <w:spacing w:before="0" w:after="0" w:line="240" w:lineRule="auto"/>
               <w:jc w:val="both"/>
               <w:rPr/>
             </w:pPr>
@@ -15511,7 +15515,7 @@
                 <w:rtl w:val="0"/>
                 <w:sz w:val="18"/>
                 <w:szCs w:val="18"/>
-                <w:rFonts w:ascii="Georgia" w:hAnsi="Georgia"/>
+                <w:rFonts w:ascii="Georgia" w:hAnsi="Georgia" w:cs="Georgia" w:eastAsia="Georgia"/>
               </w:rPr>
             </w:r>
           </w:p>
@@ -15520,7 +15524,7 @@
           <w:tcPr/>
           <w:p>
             <w:pPr>
-              <w:spacing w:before="0" w:after="0" w:line="260" w:lineRule="auto"/>
+              <w:spacing w:before="0" w:after="0" w:line="240" w:lineRule="auto"/>
               <w:jc w:val="both"/>
               <w:rPr/>
             </w:pPr>
@@ -15538,7 +15542,7 @@
                 <w:rtl w:val="0"/>
                 <w:sz w:val="18"/>
                 <w:szCs w:val="18"/>
-                <w:rFonts w:ascii="Georgia" w:hAnsi="Georgia"/>
+                <w:rFonts w:ascii="Georgia" w:hAnsi="Georgia" w:cs="Georgia" w:eastAsia="Georgia"/>
               </w:rPr>
             </w:r>
           </w:p>
@@ -15552,7 +15556,7 @@
           <w:tcPr/>
           <w:p>
             <w:pPr>
-              <w:spacing w:before="0" w:after="0" w:line="260" w:lineRule="auto"/>
+              <w:spacing w:before="0" w:after="0" w:line="240" w:lineRule="auto"/>
               <w:jc w:val="both"/>
               <w:rPr/>
             </w:pPr>
@@ -15575,7 +15579,7 @@
                 <w:rtl w:val="0"/>
                 <w:sz w:val="18"/>
                 <w:szCs w:val="18"/>
-                <w:rFonts w:ascii="Georgia" w:hAnsi="Georgia"/>
+                <w:rFonts w:ascii="Georgia" w:hAnsi="Georgia" w:cs="Georgia" w:eastAsia="Georgia"/>
               </w:rPr>
             </w:r>
           </w:p>
@@ -15584,7 +15588,7 @@
           <w:tcPr/>
           <w:p>
             <w:pPr>
-              <w:spacing w:before="0" w:after="0" w:line="260" w:lineRule="auto"/>
+              <w:spacing w:before="0" w:after="0" w:line="240" w:lineRule="auto"/>
               <w:jc w:val="both"/>
               <w:rPr/>
             </w:pPr>
@@ -15602,7 +15606,7 @@
                 <w:rtl w:val="0"/>
                 <w:sz w:val="18"/>
                 <w:szCs w:val="18"/>
-                <w:rFonts w:ascii="Georgia" w:hAnsi="Georgia"/>
+                <w:rFonts w:ascii="Georgia" w:hAnsi="Georgia" w:cs="Georgia" w:eastAsia="Georgia"/>
               </w:rPr>
             </w:r>
           </w:p>
@@ -15611,7 +15615,7 @@
           <w:tcPr/>
           <w:p>
             <w:pPr>
-              <w:spacing w:before="0" w:after="0" w:line="260" w:lineRule="auto"/>
+              <w:spacing w:before="0" w:after="0" w:line="240" w:lineRule="auto"/>
               <w:jc w:val="both"/>
               <w:rPr/>
             </w:pPr>
@@ -15629,7 +15633,7 @@
                 <w:rtl w:val="0"/>
                 <w:sz w:val="18"/>
                 <w:szCs w:val="18"/>
-                <w:rFonts w:ascii="Georgia" w:hAnsi="Georgia"/>
+                <w:rFonts w:ascii="Georgia" w:hAnsi="Georgia" w:cs="Georgia" w:eastAsia="Georgia"/>
               </w:rPr>
             </w:r>
           </w:p>
@@ -15643,7 +15647,7 @@
           <w:tcPr/>
           <w:p>
             <w:pPr>
-              <w:spacing w:before="0" w:after="0" w:line="260" w:lineRule="auto"/>
+              <w:spacing w:before="0" w:after="0" w:line="240" w:lineRule="auto"/>
               <w:jc w:val="both"/>
               <w:rPr/>
             </w:pPr>
@@ -15666,7 +15670,7 @@
                 <w:rtl w:val="0"/>
                 <w:sz w:val="18"/>
                 <w:szCs w:val="18"/>
-                <w:rFonts w:ascii="Georgia" w:hAnsi="Georgia"/>
+                <w:rFonts w:ascii="Georgia" w:hAnsi="Georgia" w:cs="Georgia" w:eastAsia="Georgia"/>
               </w:rPr>
             </w:r>
           </w:p>
@@ -15675,7 +15679,7 @@
           <w:tcPr/>
           <w:p>
             <w:pPr>
-              <w:spacing w:before="0" w:after="0" w:line="260" w:lineRule="auto"/>
+              <w:spacing w:before="0" w:after="0" w:line="240" w:lineRule="auto"/>
               <w:jc w:val="both"/>
               <w:rPr/>
             </w:pPr>
@@ -15693,7 +15697,7 @@
                 <w:rtl w:val="0"/>
                 <w:sz w:val="18"/>
                 <w:szCs w:val="18"/>
-                <w:rFonts w:ascii="Georgia" w:hAnsi="Georgia"/>
+                <w:rFonts w:ascii="Georgia" w:hAnsi="Georgia" w:cs="Georgia" w:eastAsia="Georgia"/>
               </w:rPr>
             </w:r>
           </w:p>
@@ -15702,7 +15706,7 @@
           <w:tcPr/>
           <w:p>
             <w:pPr>
-              <w:spacing w:before="0" w:after="0" w:line="260" w:lineRule="auto"/>
+              <w:spacing w:before="0" w:after="0" w:line="240" w:lineRule="auto"/>
               <w:jc w:val="both"/>
               <w:rPr/>
             </w:pPr>
@@ -15720,7 +15724,7 @@
                 <w:rtl w:val="0"/>
                 <w:sz w:val="18"/>
                 <w:szCs w:val="18"/>
-                <w:rFonts w:ascii="Georgia" w:hAnsi="Georgia"/>
+                <w:rFonts w:ascii="Georgia" w:hAnsi="Georgia" w:cs="Georgia" w:eastAsia="Georgia"/>
               </w:rPr>
             </w:r>
           </w:p>
@@ -15734,7 +15738,7 @@
           <w:tcPr/>
           <w:p>
             <w:pPr>
-              <w:spacing w:before="0" w:after="0" w:line="260" w:lineRule="auto"/>
+              <w:spacing w:before="0" w:after="0" w:line="240" w:lineRule="auto"/>
               <w:jc w:val="both"/>
               <w:rPr/>
             </w:pPr>
@@ -15757,7 +15761,7 @@
                 <w:rtl w:val="0"/>
                 <w:sz w:val="18"/>
                 <w:szCs w:val="18"/>
-                <w:rFonts w:ascii="Georgia" w:hAnsi="Georgia"/>
+                <w:rFonts w:ascii="Georgia" w:hAnsi="Georgia" w:cs="Georgia" w:eastAsia="Georgia"/>
               </w:rPr>
             </w:r>
           </w:p>
@@ -15766,7 +15770,7 @@
           <w:tcPr/>
           <w:p>
             <w:pPr>
-              <w:spacing w:before="0" w:after="0" w:line="260" w:lineRule="auto"/>
+              <w:spacing w:before="0" w:after="0" w:line="240" w:lineRule="auto"/>
               <w:jc w:val="both"/>
               <w:rPr/>
             </w:pPr>
@@ -15784,7 +15788,7 @@
                 <w:rtl w:val="0"/>
                 <w:sz w:val="18"/>
                 <w:szCs w:val="18"/>
-                <w:rFonts w:ascii="Georgia" w:hAnsi="Georgia"/>
+                <w:rFonts w:ascii="Georgia" w:hAnsi="Georgia" w:cs="Georgia" w:eastAsia="Georgia"/>
               </w:rPr>
             </w:r>
           </w:p>
@@ -15793,7 +15797,7 @@
           <w:tcPr/>
           <w:p>
             <w:pPr>
-              <w:spacing w:before="0" w:after="0" w:line="260" w:lineRule="auto"/>
+              <w:spacing w:before="0" w:after="0" w:line="240" w:lineRule="auto"/>
               <w:jc w:val="both"/>
               <w:rPr/>
             </w:pPr>
@@ -15811,7 +15815,7 @@
                 <w:rtl w:val="0"/>
                 <w:sz w:val="18"/>
                 <w:szCs w:val="18"/>
-                <w:rFonts w:ascii="Georgia" w:hAnsi="Georgia"/>
+                <w:rFonts w:ascii="Georgia" w:hAnsi="Georgia" w:cs="Georgia" w:eastAsia="Georgia"/>
               </w:rPr>
             </w:r>
           </w:p>
@@ -15825,7 +15829,7 @@
           <w:tcPr/>
           <w:p>
             <w:pPr>
-              <w:spacing w:before="0" w:after="0" w:line="260" w:lineRule="auto"/>
+              <w:spacing w:before="0" w:after="0" w:line="240" w:lineRule="auto"/>
               <w:jc w:val="both"/>
               <w:rPr/>
             </w:pPr>
@@ -15848,7 +15852,7 @@
                 <w:rtl w:val="0"/>
                 <w:sz w:val="18"/>
                 <w:szCs w:val="18"/>
-                <w:rFonts w:ascii="Georgia" w:hAnsi="Georgia"/>
+                <w:rFonts w:ascii="Georgia" w:hAnsi="Georgia" w:cs="Georgia" w:eastAsia="Georgia"/>
               </w:rPr>
             </w:r>
           </w:p>
@@ -15857,7 +15861,7 @@
           <w:tcPr/>
           <w:p>
             <w:pPr>
-              <w:spacing w:before="0" w:after="0" w:line="260" w:lineRule="auto"/>
+              <w:spacing w:before="0" w:after="0" w:line="240" w:lineRule="auto"/>
               <w:jc w:val="both"/>
               <w:rPr/>
             </w:pPr>
@@ -15875,7 +15879,7 @@
                 <w:rtl w:val="0"/>
                 <w:sz w:val="18"/>
                 <w:szCs w:val="18"/>
-                <w:rFonts w:ascii="Georgia" w:hAnsi="Georgia"/>
+                <w:rFonts w:ascii="Georgia" w:hAnsi="Georgia" w:cs="Georgia" w:eastAsia="Georgia"/>
               </w:rPr>
             </w:r>
           </w:p>
@@ -15884,7 +15888,7 @@
           <w:tcPr/>
           <w:p>
             <w:pPr>
-              <w:spacing w:before="0" w:after="0" w:line="260" w:lineRule="auto"/>
+              <w:spacing w:before="0" w:after="0" w:line="240" w:lineRule="auto"/>
               <w:jc w:val="both"/>
               <w:rPr/>
             </w:pPr>
@@ -15902,7 +15906,7 @@
                 <w:rtl w:val="0"/>
                 <w:sz w:val="18"/>
                 <w:szCs w:val="18"/>
-                <w:rFonts w:ascii="Georgia" w:hAnsi="Georgia"/>
+                <w:rFonts w:ascii="Georgia" w:hAnsi="Georgia" w:cs="Georgia" w:eastAsia="Georgia"/>
               </w:rPr>
             </w:r>
           </w:p>
@@ -15916,7 +15920,7 @@
           <w:tcPr/>
           <w:p>
             <w:pPr>
-              <w:spacing w:before="0" w:after="0" w:line="260" w:lineRule="auto"/>
+              <w:spacing w:before="0" w:after="0" w:line="240" w:lineRule="auto"/>
               <w:jc w:val="both"/>
               <w:rPr/>
             </w:pPr>
@@ -15939,7 +15943,7 @@
                 <w:rtl w:val="0"/>
                 <w:sz w:val="18"/>
                 <w:szCs w:val="18"/>
-                <w:rFonts w:ascii="Georgia" w:hAnsi="Georgia"/>
+                <w:rFonts w:ascii="Georgia" w:hAnsi="Georgia" w:cs="Georgia" w:eastAsia="Georgia"/>
               </w:rPr>
             </w:r>
           </w:p>
@@ -15948,7 +15952,7 @@
           <w:tcPr/>
           <w:p>
             <w:pPr>
-              <w:spacing w:before="0" w:after="0" w:line="260" w:lineRule="auto"/>
+              <w:spacing w:before="0" w:after="0" w:line="240" w:lineRule="auto"/>
               <w:jc w:val="both"/>
               <w:rPr/>
             </w:pPr>
@@ -15966,7 +15970,7 @@
                 <w:rtl w:val="0"/>
                 <w:sz w:val="18"/>
                 <w:szCs w:val="18"/>
-                <w:rFonts w:ascii="Georgia" w:hAnsi="Georgia"/>
+                <w:rFonts w:ascii="Georgia" w:hAnsi="Georgia" w:cs="Georgia" w:eastAsia="Georgia"/>
               </w:rPr>
             </w:r>
           </w:p>
@@ -15975,7 +15979,7 @@
           <w:tcPr/>
           <w:p>
             <w:pPr>
-              <w:spacing w:before="0" w:after="0" w:line="260" w:lineRule="auto"/>
+              <w:spacing w:before="0" w:after="0" w:line="240" w:lineRule="auto"/>
               <w:jc w:val="both"/>
               <w:rPr/>
             </w:pPr>
@@ -15993,7 +15997,7 @@
                 <w:rtl w:val="0"/>
                 <w:sz w:val="18"/>
                 <w:szCs w:val="18"/>
-                <w:rFonts w:ascii="Georgia" w:hAnsi="Georgia"/>
+                <w:rFonts w:ascii="Georgia" w:hAnsi="Georgia" w:cs="Georgia" w:eastAsia="Georgia"/>
               </w:rPr>
             </w:r>
           </w:p>
@@ -16007,7 +16011,7 @@
           <w:tcPr/>
           <w:p>
             <w:pPr>
-              <w:spacing w:before="0" w:after="0" w:line="260" w:lineRule="auto"/>
+              <w:spacing w:before="0" w:after="0" w:line="240" w:lineRule="auto"/>
               <w:jc w:val="both"/>
               <w:rPr/>
             </w:pPr>
@@ -16030,7 +16034,7 @@
                 <w:rtl w:val="0"/>
                 <w:sz w:val="18"/>
                 <w:szCs w:val="18"/>
-                <w:rFonts w:ascii="Georgia" w:hAnsi="Georgia"/>
+                <w:rFonts w:ascii="Georgia" w:hAnsi="Georgia" w:cs="Georgia" w:eastAsia="Georgia"/>
               </w:rPr>
             </w:r>
           </w:p>
@@ -16039,7 +16043,7 @@
           <w:tcPr/>
           <w:p>
             <w:pPr>
-              <w:spacing w:before="0" w:after="0" w:line="260" w:lineRule="auto"/>
+              <w:spacing w:before="0" w:after="0" w:line="240" w:lineRule="auto"/>
               <w:jc w:val="both"/>
               <w:rPr/>
             </w:pPr>
@@ -16057,7 +16061,7 @@
                 <w:rtl w:val="0"/>
                 <w:sz w:val="18"/>
                 <w:szCs w:val="18"/>
-                <w:rFonts w:ascii="Georgia" w:hAnsi="Georgia"/>
+                <w:rFonts w:ascii="Georgia" w:hAnsi="Georgia" w:cs="Georgia" w:eastAsia="Georgia"/>
               </w:rPr>
             </w:r>
           </w:p>
@@ -16066,7 +16070,7 @@
           <w:tcPr/>
           <w:p>
             <w:pPr>
-              <w:spacing w:before="0" w:after="0" w:line="260" w:lineRule="auto"/>
+              <w:spacing w:before="0" w:after="0" w:line="240" w:lineRule="auto"/>
               <w:jc w:val="both"/>
               <w:rPr/>
             </w:pPr>
@@ -16084,7 +16088,7 @@
                 <w:rtl w:val="0"/>
                 <w:sz w:val="18"/>
                 <w:szCs w:val="18"/>
-                <w:rFonts w:ascii="Georgia" w:hAnsi="Georgia"/>
+                <w:rFonts w:ascii="Georgia" w:hAnsi="Georgia" w:cs="Georgia" w:eastAsia="Georgia"/>
               </w:rPr>
             </w:r>
           </w:p>
@@ -16098,7 +16102,7 @@
           <w:tcPr/>
           <w:p>
             <w:pPr>
-              <w:spacing w:before="0" w:after="0" w:line="260" w:lineRule="auto"/>
+              <w:spacing w:before="0" w:after="0" w:line="240" w:lineRule="auto"/>
               <w:jc w:val="both"/>
               <w:rPr/>
             </w:pPr>
@@ -16121,7 +16125,7 @@
                 <w:rtl w:val="0"/>
                 <w:sz w:val="18"/>
                 <w:szCs w:val="18"/>
-                <w:rFonts w:ascii="Georgia" w:hAnsi="Georgia"/>
+                <w:rFonts w:ascii="Georgia" w:hAnsi="Georgia" w:cs="Georgia" w:eastAsia="Georgia"/>
               </w:rPr>
             </w:r>
           </w:p>
@@ -16130,7 +16134,7 @@
           <w:tcPr/>
           <w:p>
             <w:pPr>
-              <w:spacing w:before="0" w:after="0" w:line="260" w:lineRule="auto"/>
+              <w:spacing w:before="0" w:after="0" w:line="240" w:lineRule="auto"/>
               <w:jc w:val="both"/>
               <w:rPr/>
             </w:pPr>
@@ -16148,7 +16152,7 @@
                 <w:rtl w:val="0"/>
                 <w:sz w:val="18"/>
                 <w:szCs w:val="18"/>
-                <w:rFonts w:ascii="Georgia" w:hAnsi="Georgia"/>
+                <w:rFonts w:ascii="Georgia" w:hAnsi="Georgia" w:cs="Georgia" w:eastAsia="Georgia"/>
               </w:rPr>
             </w:r>
           </w:p>
@@ -16157,7 +16161,7 @@
           <w:tcPr/>
           <w:p>
             <w:pPr>
-              <w:spacing w:before="0" w:after="0" w:line="260" w:lineRule="auto"/>
+              <w:spacing w:before="0" w:after="0" w:line="240" w:lineRule="auto"/>
               <w:jc w:val="both"/>
               <w:rPr/>
             </w:pPr>
@@ -16175,7 +16179,7 @@
                 <w:rtl w:val="0"/>
                 <w:sz w:val="18"/>
                 <w:szCs w:val="18"/>
-                <w:rFonts w:ascii="Georgia" w:hAnsi="Georgia"/>
+                <w:rFonts w:ascii="Georgia" w:hAnsi="Georgia" w:cs="Georgia" w:eastAsia="Georgia"/>
               </w:rPr>
             </w:r>
           </w:p>
@@ -16184,8 +16188,8 @@
     </w:tbl>
     <w:p>
       <w:pPr>
-        <w:spacing w:before="200" w:after="60" w:line="300" w:lineRule="auto"/>
-        <w:ind w:left="360"/>
+        <w:spacing w:before="240" w:after="0" w:line="480" w:lineRule="auto"/>
+        <w:ind w:firstLine="720"/>
         <w:jc w:val="both"/>
       </w:pPr>
       <w:r>
@@ -16195,8 +16199,8 @@
           <w:i w:val="1"/>
           <w:iCs w:val="1"/>
           <w:color w:val="000000"/>
-          <w:sz w:val="20"/>
-          <w:szCs w:val="20"/>
+          <w:sz w:val="22"/>
+          <w:szCs w:val="22"/>
           <w:rtl w:val="0"/>
         </w:rPr>
         <w:t xml:space="preserve">General exclusions: </w:t>
@@ -16208,8 +16212,8 @@
           <w:i w:val="1"/>
           <w:iCs w:val="1"/>
           <w:color w:val="000000"/>
-          <w:sz w:val="20"/>
-          <w:szCs w:val="20"/>
+          <w:sz w:val="22"/>
+          <w:szCs w:val="22"/>
           <w:rtl w:val="0"/>
         </w:rPr>
         <w:t xml:space="preserve">ability, future procedure, and procedural necessity (a step required by the procedure itself) are never coded as hedges.</w:t>
@@ -16218,15 +16222,15 @@
         <w:rPr>
           <w:rFonts w:ascii="Georgia" w:hAnsi="Georgia" w:cs="Georgia" w:eastAsia="Georgia"/>
           <w:rtl w:val="0"/>
-          <w:sz w:val="20"/>
-          <w:szCs w:val="20"/>
-        </w:rPr>
-      </w:r>
-    </w:p>
-    <w:p>
-      <w:pPr>
-        <w:spacing w:before="0" w:after="60" w:line="300" w:lineRule="auto"/>
-        <w:ind w:left="360"/>
+          <w:sz w:val="22"/>
+          <w:szCs w:val="22"/>
+        </w:rPr>
+      </w:r>
+    </w:p>
+    <w:p>
+      <w:pPr>
+        <w:spacing w:before="0" w:after="0" w:line="480" w:lineRule="auto"/>
+        <w:ind w:firstLine="720"/>
         <w:jc w:val="both"/>
       </w:pPr>
       <w:r>
@@ -16236,8 +16240,8 @@
           <w:i w:val="1"/>
           <w:iCs w:val="1"/>
           <w:color w:val="000000"/>
-          <w:sz w:val="20"/>
-          <w:szCs w:val="20"/>
+          <w:sz w:val="22"/>
+          <w:szCs w:val="22"/>
           <w:rtl w:val="0"/>
         </w:rPr>
         <w:t xml:space="preserve">Quick test for </w:t>
@@ -16249,8 +16253,8 @@
           <w:i w:val="1"/>
           <w:iCs w:val="1"/>
           <w:color w:val="000000"/>
-          <w:sz w:val="20"/>
-          <w:szCs w:val="20"/>
+          <w:sz w:val="22"/>
+          <w:szCs w:val="22"/>
           <w:rtl w:val="0"/>
         </w:rPr>
         <w:t xml:space="preserve">suggest/indicate</w:t>
@@ -16262,8 +16266,8 @@
           <w:i w:val="1"/>
           <w:iCs w:val="1"/>
           <w:color w:val="000000"/>
-          <w:sz w:val="20"/>
-          <w:szCs w:val="20"/>
+          <w:sz w:val="22"/>
+          <w:szCs w:val="22"/>
           <w:rtl w:val="0"/>
         </w:rPr>
         <w:t xml:space="preserve">: “Might this be true?” = hedge. “Should this be done?” = FP-Rec.</w:t>
@@ -16272,15 +16276,15 @@
         <w:rPr>
           <w:rFonts w:ascii="Georgia" w:hAnsi="Georgia" w:cs="Georgia" w:eastAsia="Georgia"/>
           <w:rtl w:val="0"/>
-          <w:sz w:val="20"/>
-          <w:szCs w:val="20"/>
+          <w:sz w:val="22"/>
+          <w:szCs w:val="22"/>
         </w:rPr>
       </w:r>
     </w:p>
     <w:p>
       <w:pPr>
         <w:keepNext/>
-        <w:spacing w:before="240" w:after="40" w:line="300" w:lineRule="auto"/>
+        <w:spacing w:before="240" w:after="0" w:line="480" w:lineRule="auto"/>
         <w:jc w:val="left"/>
       </w:pPr>
       <w:r>
@@ -16288,8 +16292,8 @@
           <w:rFonts w:ascii="Georgia" w:cs="Georgia" w:eastAsia="Georgia" w:hAnsi="Georgia"/>
           <w:b w:val="1"/>
           <w:bCs w:val="1"/>
-          <w:sz w:val="22"/>
-          <w:szCs w:val="22"/>
+          <w:sz w:val="24"/>
+          <w:szCs w:val="24"/>
           <w:rtl w:val="0"/>
         </w:rPr>
         <w:t xml:space="preserve">MARKING FALSE POSITIVES</w:t>
@@ -16298,16 +16302,16 @@
         <w:rPr>
           <w:rFonts w:ascii="Georgia" w:hAnsi="Georgia" w:cs="Georgia" w:eastAsia="Georgia"/>
           <w:rtl w:val="0"/>
-          <w:sz w:val="22"/>
-          <w:szCs w:val="22"/>
+          <w:sz w:val="24"/>
+          <w:szCs w:val="24"/>
           <w:b/>
         </w:rPr>
       </w:r>
     </w:p>
     <w:p>
       <w:pPr>
-        <w:spacing w:before="0" w:after="60" w:line="300" w:lineRule="auto"/>
-        <w:ind w:left="360"/>
+        <w:spacing w:before="0" w:after="0" w:line="480" w:lineRule="auto"/>
+        <w:ind w:firstLine="720"/>
         <w:jc w:val="both"/>
       </w:pPr>
       <w:r>
@@ -16316,8 +16320,8 @@
           <w:bCs w:val="0"/>
           <w:i w:val="0"/>
           <w:iCs w:val="0"/>
-          <w:sz w:val="20"/>
-          <w:szCs w:val="20"/>
+          <w:sz w:val="22"/>
+          <w:szCs w:val="22"/>
           <w:rtl w:val="0"/>
         </w:rPr>
         <w:t xml:space="preserve">Strike through a hedge-like token that fails the Working Test. Write the reason code beside it in grey text.</w:t>
@@ -16326,8 +16330,8 @@
         <w:rPr>
           <w:rFonts w:ascii="Georgia" w:hAnsi="Georgia" w:cs="Georgia" w:eastAsia="Georgia"/>
           <w:rtl w:val="0"/>
-          <w:sz w:val="20"/>
-          <w:szCs w:val="20"/>
+          <w:sz w:val="22"/>
+          <w:szCs w:val="22"/>
         </w:rPr>
       </w:r>
     </w:p>
@@ -16374,7 +16378,7 @@
           </w:tcPr>
           <w:p>
             <w:pPr>
-              <w:spacing w:before="0" w:after="0" w:line="260" w:lineRule="auto"/>
+              <w:spacing w:before="0" w:after="0" w:line="240" w:lineRule="auto"/>
               <w:jc w:val="both"/>
               <w:rPr/>
             </w:pPr>
@@ -16394,7 +16398,7 @@
                 <w:rtl w:val="0"/>
                 <w:sz w:val="18"/>
                 <w:szCs w:val="18"/>
-                <w:rFonts w:ascii="Georgia" w:hAnsi="Georgia"/>
+                <w:rFonts w:ascii="Georgia" w:hAnsi="Georgia" w:cs="Georgia" w:eastAsia="Georgia"/>
               </w:rPr>
             </w:r>
           </w:p>
@@ -16408,7 +16412,7 @@
           </w:tcPr>
           <w:p>
             <w:pPr>
-              <w:spacing w:before="0" w:after="0" w:line="260" w:lineRule="auto"/>
+              <w:spacing w:before="0" w:after="0" w:line="240" w:lineRule="auto"/>
               <w:jc w:val="both"/>
               <w:rPr/>
             </w:pPr>
@@ -16428,7 +16432,7 @@
                 <w:rtl w:val="0"/>
                 <w:sz w:val="18"/>
                 <w:szCs w:val="18"/>
-                <w:rFonts w:ascii="Georgia" w:hAnsi="Georgia"/>
+                <w:rFonts w:ascii="Georgia" w:hAnsi="Georgia" w:cs="Georgia" w:eastAsia="Georgia"/>
               </w:rPr>
             </w:r>
           </w:p>
@@ -16442,7 +16446,7 @@
           </w:tcPr>
           <w:p>
             <w:pPr>
-              <w:spacing w:before="0" w:after="0" w:line="260" w:lineRule="auto"/>
+              <w:spacing w:before="0" w:after="0" w:line="240" w:lineRule="auto"/>
               <w:jc w:val="both"/>
               <w:rPr/>
             </w:pPr>
@@ -16462,7 +16466,7 @@
                 <w:rtl w:val="0"/>
                 <w:sz w:val="18"/>
                 <w:szCs w:val="18"/>
-                <w:rFonts w:ascii="Georgia" w:hAnsi="Georgia"/>
+                <w:rFonts w:ascii="Georgia" w:hAnsi="Georgia" w:cs="Georgia" w:eastAsia="Georgia"/>
               </w:rPr>
             </w:r>
           </w:p>
@@ -16476,7 +16480,7 @@
           <w:tcPr/>
           <w:p>
             <w:pPr>
-              <w:spacing w:before="0" w:after="0" w:line="260" w:lineRule="auto"/>
+              <w:spacing w:before="0" w:after="0" w:line="240" w:lineRule="auto"/>
               <w:jc w:val="both"/>
               <w:rPr/>
             </w:pPr>
@@ -16499,7 +16503,7 @@
                 <w:rtl w:val="0"/>
                 <w:sz w:val="18"/>
                 <w:szCs w:val="18"/>
-                <w:rFonts w:ascii="Georgia" w:hAnsi="Georgia"/>
+                <w:rFonts w:ascii="Georgia" w:hAnsi="Georgia" w:cs="Georgia" w:eastAsia="Georgia"/>
               </w:rPr>
             </w:r>
           </w:p>
@@ -16508,7 +16512,7 @@
           <w:tcPr/>
           <w:p>
             <w:pPr>
-              <w:spacing w:before="0" w:after="0" w:line="260" w:lineRule="auto"/>
+              <w:spacing w:before="0" w:after="0" w:line="240" w:lineRule="auto"/>
               <w:jc w:val="both"/>
               <w:rPr/>
             </w:pPr>
@@ -16526,7 +16530,7 @@
                 <w:rtl w:val="0"/>
                 <w:sz w:val="18"/>
                 <w:szCs w:val="18"/>
-                <w:rFonts w:ascii="Georgia" w:hAnsi="Georgia"/>
+                <w:rFonts w:ascii="Georgia" w:hAnsi="Georgia" w:cs="Georgia" w:eastAsia="Georgia"/>
               </w:rPr>
             </w:r>
           </w:p>
@@ -16535,7 +16539,7 @@
           <w:tcPr/>
           <w:p>
             <w:pPr>
-              <w:spacing w:before="0" w:after="0" w:line="260" w:lineRule="auto"/>
+              <w:spacing w:before="0" w:after="0" w:line="240" w:lineRule="auto"/>
               <w:jc w:val="both"/>
               <w:rPr/>
             </w:pPr>
@@ -16585,7 +16589,7 @@
                 <w:rtl w:val="0"/>
                 <w:sz w:val="18"/>
                 <w:szCs w:val="18"/>
-                <w:rFonts w:ascii="Georgia" w:hAnsi="Georgia"/>
+                <w:rFonts w:ascii="Georgia" w:hAnsi="Georgia" w:cs="Georgia" w:eastAsia="Georgia"/>
               </w:rPr>
             </w:r>
           </w:p>
@@ -16599,7 +16603,7 @@
           <w:tcPr/>
           <w:p>
             <w:pPr>
-              <w:spacing w:before="0" w:after="0" w:line="260" w:lineRule="auto"/>
+              <w:spacing w:before="0" w:after="0" w:line="240" w:lineRule="auto"/>
               <w:jc w:val="both"/>
               <w:rPr/>
             </w:pPr>
@@ -16622,7 +16626,7 @@
                 <w:rtl w:val="0"/>
                 <w:sz w:val="18"/>
                 <w:szCs w:val="18"/>
-                <w:rFonts w:ascii="Georgia" w:hAnsi="Georgia"/>
+                <w:rFonts w:ascii="Georgia" w:hAnsi="Georgia" w:cs="Georgia" w:eastAsia="Georgia"/>
               </w:rPr>
             </w:r>
           </w:p>
@@ -16631,7 +16635,7 @@
           <w:tcPr/>
           <w:p>
             <w:pPr>
-              <w:spacing w:before="0" w:after="0" w:line="260" w:lineRule="auto"/>
+              <w:spacing w:before="0" w:after="0" w:line="240" w:lineRule="auto"/>
               <w:jc w:val="both"/>
               <w:rPr/>
             </w:pPr>
@@ -16649,7 +16653,7 @@
                 <w:rtl w:val="0"/>
                 <w:sz w:val="18"/>
                 <w:szCs w:val="18"/>
-                <w:rFonts w:ascii="Georgia" w:hAnsi="Georgia"/>
+                <w:rFonts w:ascii="Georgia" w:hAnsi="Georgia" w:cs="Georgia" w:eastAsia="Georgia"/>
               </w:rPr>
             </w:r>
           </w:p>
@@ -16658,7 +16662,7 @@
           <w:tcPr/>
           <w:p>
             <w:pPr>
-              <w:spacing w:before="0" w:after="0" w:line="260" w:lineRule="auto"/>
+              <w:spacing w:before="0" w:after="0" w:line="240" w:lineRule="auto"/>
               <w:jc w:val="both"/>
               <w:rPr/>
             </w:pPr>
@@ -16708,7 +16712,7 @@
                 <w:rtl w:val="0"/>
                 <w:sz w:val="18"/>
                 <w:szCs w:val="18"/>
-                <w:rFonts w:ascii="Georgia" w:hAnsi="Georgia"/>
+                <w:rFonts w:ascii="Georgia" w:hAnsi="Georgia" w:cs="Georgia" w:eastAsia="Georgia"/>
               </w:rPr>
             </w:r>
           </w:p>
@@ -16722,7 +16726,7 @@
           <w:tcPr/>
           <w:p>
             <w:pPr>
-              <w:spacing w:before="0" w:after="0" w:line="260" w:lineRule="auto"/>
+              <w:spacing w:before="0" w:after="0" w:line="240" w:lineRule="auto"/>
               <w:jc w:val="both"/>
               <w:rPr/>
             </w:pPr>
@@ -16745,7 +16749,7 @@
                 <w:rtl w:val="0"/>
                 <w:sz w:val="18"/>
                 <w:szCs w:val="18"/>
-                <w:rFonts w:ascii="Georgia" w:hAnsi="Georgia"/>
+                <w:rFonts w:ascii="Georgia" w:hAnsi="Georgia" w:cs="Georgia" w:eastAsia="Georgia"/>
               </w:rPr>
             </w:r>
           </w:p>
@@ -16754,7 +16758,7 @@
           <w:tcPr/>
           <w:p>
             <w:pPr>
-              <w:spacing w:before="0" w:after="0" w:line="260" w:lineRule="auto"/>
+              <w:spacing w:before="0" w:after="0" w:line="240" w:lineRule="auto"/>
               <w:jc w:val="both"/>
               <w:rPr/>
             </w:pPr>
@@ -16772,7 +16776,7 @@
                 <w:rtl w:val="0"/>
                 <w:sz w:val="18"/>
                 <w:szCs w:val="18"/>
-                <w:rFonts w:ascii="Georgia" w:hAnsi="Georgia"/>
+                <w:rFonts w:ascii="Georgia" w:hAnsi="Georgia" w:cs="Georgia" w:eastAsia="Georgia"/>
               </w:rPr>
             </w:r>
           </w:p>
@@ -16781,7 +16785,7 @@
           <w:tcPr/>
           <w:p>
             <w:pPr>
-              <w:spacing w:before="0" w:after="0" w:line="260" w:lineRule="auto"/>
+              <w:spacing w:before="0" w:after="0" w:line="240" w:lineRule="auto"/>
               <w:jc w:val="both"/>
               <w:rPr/>
             </w:pPr>
@@ -16831,7 +16835,7 @@
                 <w:rtl w:val="0"/>
                 <w:sz w:val="18"/>
                 <w:szCs w:val="18"/>
-                <w:rFonts w:ascii="Georgia" w:hAnsi="Georgia"/>
+                <w:rFonts w:ascii="Georgia" w:hAnsi="Georgia" w:cs="Georgia" w:eastAsia="Georgia"/>
               </w:rPr>
             </w:r>
           </w:p>
@@ -16845,7 +16849,7 @@
           <w:tcPr/>
           <w:p>
             <w:pPr>
-              <w:spacing w:before="0" w:after="0" w:line="260" w:lineRule="auto"/>
+              <w:spacing w:before="0" w:after="0" w:line="240" w:lineRule="auto"/>
               <w:jc w:val="both"/>
               <w:rPr/>
             </w:pPr>
@@ -16868,7 +16872,7 @@
                 <w:rtl w:val="0"/>
                 <w:sz w:val="18"/>
                 <w:szCs w:val="18"/>
-                <w:rFonts w:ascii="Georgia" w:hAnsi="Georgia"/>
+                <w:rFonts w:ascii="Georgia" w:hAnsi="Georgia" w:cs="Georgia" w:eastAsia="Georgia"/>
               </w:rPr>
             </w:r>
           </w:p>
@@ -16877,7 +16881,7 @@
           <w:tcPr/>
           <w:p>
             <w:pPr>
-              <w:spacing w:before="0" w:after="0" w:line="260" w:lineRule="auto"/>
+              <w:spacing w:before="0" w:after="0" w:line="240" w:lineRule="auto"/>
               <w:jc w:val="both"/>
               <w:rPr/>
             </w:pPr>
@@ -16895,7 +16899,7 @@
                 <w:rtl w:val="0"/>
                 <w:sz w:val="18"/>
                 <w:szCs w:val="18"/>
-                <w:rFonts w:ascii="Georgia" w:hAnsi="Georgia"/>
+                <w:rFonts w:ascii="Georgia" w:hAnsi="Georgia" w:cs="Georgia" w:eastAsia="Georgia"/>
               </w:rPr>
             </w:r>
           </w:p>
@@ -16904,7 +16908,7 @@
           <w:tcPr/>
           <w:p>
             <w:pPr>
-              <w:spacing w:before="0" w:after="0" w:line="260" w:lineRule="auto"/>
+              <w:spacing w:before="0" w:after="0" w:line="240" w:lineRule="auto"/>
               <w:jc w:val="both"/>
               <w:rPr/>
             </w:pPr>
@@ -16954,7 +16958,7 @@
                 <w:rtl w:val="0"/>
                 <w:sz w:val="18"/>
                 <w:szCs w:val="18"/>
-                <w:rFonts w:ascii="Georgia" w:hAnsi="Georgia"/>
+                <w:rFonts w:ascii="Georgia" w:hAnsi="Georgia" w:cs="Georgia" w:eastAsia="Georgia"/>
               </w:rPr>
             </w:r>
           </w:p>
@@ -16968,7 +16972,7 @@
           <w:tcPr/>
           <w:p>
             <w:pPr>
-              <w:spacing w:before="0" w:after="0" w:line="260" w:lineRule="auto"/>
+              <w:spacing w:before="0" w:after="0" w:line="240" w:lineRule="auto"/>
               <w:jc w:val="both"/>
               <w:rPr/>
             </w:pPr>
@@ -16991,7 +16995,7 @@
                 <w:rtl w:val="0"/>
                 <w:sz w:val="18"/>
                 <w:szCs w:val="18"/>
-                <w:rFonts w:ascii="Georgia" w:hAnsi="Georgia"/>
+                <w:rFonts w:ascii="Georgia" w:hAnsi="Georgia" w:cs="Georgia" w:eastAsia="Georgia"/>
               </w:rPr>
             </w:r>
           </w:p>
@@ -17000,7 +17004,7 @@
           <w:tcPr/>
           <w:p>
             <w:pPr>
-              <w:spacing w:before="0" w:after="0" w:line="260" w:lineRule="auto"/>
+              <w:spacing w:before="0" w:after="0" w:line="240" w:lineRule="auto"/>
               <w:jc w:val="both"/>
               <w:rPr/>
             </w:pPr>
@@ -17018,7 +17022,7 @@
                 <w:rtl w:val="0"/>
                 <w:sz w:val="18"/>
                 <w:szCs w:val="18"/>
-                <w:rFonts w:ascii="Georgia" w:hAnsi="Georgia"/>
+                <w:rFonts w:ascii="Georgia" w:hAnsi="Georgia" w:cs="Georgia" w:eastAsia="Georgia"/>
               </w:rPr>
             </w:r>
           </w:p>
@@ -17027,7 +17031,7 @@
           <w:tcPr/>
           <w:p>
             <w:pPr>
-              <w:spacing w:before="0" w:after="0" w:line="260" w:lineRule="auto"/>
+              <w:spacing w:before="0" w:after="0" w:line="240" w:lineRule="auto"/>
               <w:jc w:val="both"/>
               <w:rPr/>
             </w:pPr>
@@ -17077,7 +17081,7 @@
                 <w:rtl w:val="0"/>
                 <w:sz w:val="18"/>
                 <w:szCs w:val="18"/>
-                <w:rFonts w:ascii="Georgia" w:hAnsi="Georgia"/>
+                <w:rFonts w:ascii="Georgia" w:hAnsi="Georgia" w:cs="Georgia" w:eastAsia="Georgia"/>
               </w:rPr>
             </w:r>
           </w:p>
@@ -17087,7 +17091,7 @@
     <w:p>
       <w:pPr>
         <w:keepNext/>
-        <w:spacing w:before="240" w:after="40" w:line="300" w:lineRule="auto"/>
+        <w:spacing w:before="240" w:after="0" w:line="480" w:lineRule="auto"/>
         <w:jc w:val="left"/>
       </w:pPr>
       <w:r>
@@ -17095,8 +17099,8 @@
           <w:rFonts w:ascii="Georgia" w:hAnsi="Georgia" w:cs="Georgia" w:eastAsia="Georgia"/>
           <w:b/>
           <w:bCs w:val="1"/>
-          <w:sz w:val="22"/>
-          <w:szCs w:val="22"/>
+          <w:sz w:val="24"/>
+          <w:szCs w:val="24"/>
           <w:rtl w:val="0"/>
         </w:rPr>
         <w:t>UNHEDGED ASSERTIONS (WARRANTED CAUTION, NEUTRAL GREY)</w:t>
@@ -17105,98 +17109,98 @@
         <w:rPr>
           <w:rFonts w:ascii="Georgia" w:hAnsi="Georgia" w:cs="Georgia" w:eastAsia="Georgia"/>
           <w:rtl w:val="0"/>
-          <w:sz w:val="22"/>
-          <w:szCs w:val="22"/>
+          <w:sz w:val="24"/>
+          <w:szCs w:val="24"/>
           <w:b/>
         </w:rPr>
       </w:r>
     </w:p>
     <w:p>
       <w:pPr>
-        <w:spacing w:before="0" w:after="60" w:line="300" w:lineRule="auto"/>
+        <w:spacing w:before="0" w:after="0" w:line="480" w:lineRule="auto"/>
         <w:ind w:left="360"/>
         <w:jc w:val="both"/>
       </w:pPr>
       <w:r>
         <w:rPr>
           <w:rFonts w:ascii="Georgia" w:hAnsi="Georgia" w:cs="Georgia" w:eastAsia="Georgia"/>
-          <w:sz w:val="20"/>
-          <w:szCs w:val="20"/>
+          <w:sz w:val="22"/>
+          <w:szCs w:val="22"/>
         </w:rPr>
         <w:t xml:space="preserve">• Grey-highlight the main assertive verb; place [G] or [C] beside it (same placement as (EC) on hedges).</w:t>
       </w:r>
     </w:p>
     <w:p>
       <w:pPr>
-        <w:spacing w:before="0" w:after="60" w:line="300" w:lineRule="auto"/>
+        <w:spacing w:before="0" w:after="0" w:line="480" w:lineRule="auto"/>
         <w:ind w:left="360"/>
         <w:jc w:val="both"/>
       </w:pPr>
       <w:r>
         <w:rPr>
           <w:rFonts w:ascii="Georgia" w:hAnsi="Georgia" w:cs="Georgia" w:eastAsia="Georgia"/>
-          <w:sz w:val="20"/>
-          <w:szCs w:val="20"/>
+          <w:sz w:val="22"/>
+          <w:szCs w:val="22"/>
         </w:rPr>
         <w:t xml:space="preserve">• Mark only claims where caution was warranted but absent.</w:t>
       </w:r>
     </w:p>
     <w:p>
       <w:pPr>
-        <w:spacing w:before="0" w:after="60" w:line="300" w:lineRule="auto"/>
+        <w:spacing w:before="0" w:after="0" w:line="480" w:lineRule="auto"/>
         <w:ind w:left="360"/>
         <w:jc w:val="both"/>
       </w:pPr>
       <w:r>
         <w:rPr>
           <w:rFonts w:ascii="Georgia" w:hAnsi="Georgia" w:cs="Georgia" w:eastAsia="Georgia"/>
-          <w:sz w:val="20"/>
-          <w:szCs w:val="20"/>
+          <w:sz w:val="22"/>
+          <w:szCs w:val="22"/>
         </w:rPr>
         <w:t xml:space="preserve">• [G] = generalization or evaluative ranking beyond the data.</w:t>
       </w:r>
     </w:p>
     <w:p>
       <w:pPr>
-        <w:spacing w:before="0" w:after="60" w:line="300" w:lineRule="auto"/>
+        <w:spacing w:before="0" w:after="0" w:line="480" w:lineRule="auto"/>
         <w:ind w:left="360"/>
         <w:jc w:val="both"/>
       </w:pPr>
       <w:r>
         <w:rPr>
           <w:rFonts w:ascii="Georgia" w:hAnsi="Georgia" w:cs="Georgia" w:eastAsia="Georgia"/>
-          <w:sz w:val="20"/>
-          <w:szCs w:val="20"/>
+          <w:sz w:val="22"/>
+          <w:szCs w:val="22"/>
         </w:rPr>
         <w:t xml:space="preserve">• [C] = cause–effect or impact stronger than the design supports.</w:t>
       </w:r>
     </w:p>
     <w:p>
       <w:pPr>
-        <w:spacing w:before="0" w:after="60" w:line="300" w:lineRule="auto"/>
+        <w:spacing w:before="0" w:after="0" w:line="480" w:lineRule="auto"/>
         <w:ind w:left="360"/>
         <w:jc w:val="both"/>
       </w:pPr>
       <w:r>
         <w:rPr>
           <w:rFonts w:ascii="Georgia" w:hAnsi="Georgia" w:cs="Georgia" w:eastAsia="Georgia"/>
-          <w:sz w:val="20"/>
-          <w:szCs w:val="20"/>
+          <w:sz w:val="22"/>
+          <w:szCs w:val="22"/>
         </w:rPr>
         <w:t xml:space="preserve">• Do not mark bare trial results, measured findings, or procedural statements.</w:t>
       </w:r>
     </w:p>
     <w:p>
       <w:pPr>
-        <w:spacing w:before="0" w:after="60" w:line="300" w:lineRule="auto"/>
+        <w:spacing w:before="0" w:after="0" w:line="480" w:lineRule="auto"/>
         <w:ind w:left="360"/>
         <w:jc w:val="both"/>
       </w:pPr>
       <w:r>
         <w:rPr>
           <w:rFonts w:ascii="Georgia" w:hAnsi="Georgia" w:cs="Georgia" w:eastAsia="Georgia"/>
-          <w:sz w:val="20"/>
-          <w:szCs w:val="20"/>
+          <w:sz w:val="22"/>
+          <w:szCs w:val="22"/>
         </w:rPr>
         <w:t xml:space="preserve">• Record the full clause in the coding sheet.</w:t>
       </w:r>
@@ -17246,7 +17250,7 @@
           </w:tcPr>
           <w:p>
             <w:pPr>
-              <w:spacing w:before="0" w:after="0" w:line="260" w:lineRule="auto"/>
+              <w:spacing w:before="0" w:after="0" w:line="240" w:lineRule="auto"/>
               <w:jc w:val="both"/>
               <w:rPr/>
             </w:pPr>
@@ -17266,7 +17270,7 @@
                 <w:rtl w:val="0"/>
                 <w:sz w:val="18"/>
                 <w:szCs w:val="18"/>
-                <w:rFonts w:ascii="Georgia" w:hAnsi="Georgia"/>
+                <w:rFonts w:ascii="Georgia" w:hAnsi="Georgia" w:cs="Georgia" w:eastAsia="Georgia"/>
               </w:rPr>
             </w:r>
           </w:p>
@@ -17280,7 +17284,7 @@
           </w:tcPr>
           <w:p>
             <w:pPr>
-              <w:spacing w:before="0" w:after="0" w:line="260" w:lineRule="auto"/>
+              <w:spacing w:before="0" w:after="0" w:line="240" w:lineRule="auto"/>
               <w:jc w:val="both"/>
               <w:rPr/>
             </w:pPr>
@@ -17300,7 +17304,7 @@
                 <w:rtl w:val="0"/>
                 <w:sz w:val="18"/>
                 <w:szCs w:val="18"/>
-                <w:rFonts w:ascii="Georgia" w:hAnsi="Georgia"/>
+                <w:rFonts w:ascii="Georgia" w:hAnsi="Georgia" w:cs="Georgia" w:eastAsia="Georgia"/>
               </w:rPr>
             </w:r>
           </w:p>
@@ -17314,7 +17318,7 @@
           </w:tcPr>
           <w:p>
             <w:pPr>
-              <w:spacing w:before="0" w:after="0" w:line="260" w:lineRule="auto"/>
+              <w:spacing w:before="0" w:after="0" w:line="240" w:lineRule="auto"/>
               <w:jc w:val="both"/>
               <w:rPr/>
             </w:pPr>
@@ -17334,7 +17338,7 @@
                 <w:rtl w:val="0"/>
                 <w:sz w:val="18"/>
                 <w:szCs w:val="18"/>
-                <w:rFonts w:ascii="Georgia" w:hAnsi="Georgia"/>
+                <w:rFonts w:ascii="Georgia" w:hAnsi="Georgia" w:cs="Georgia" w:eastAsia="Georgia"/>
               </w:rPr>
             </w:r>
           </w:p>
@@ -17348,7 +17352,7 @@
           </w:tcPr>
           <w:p>
             <w:pPr>
-              <w:spacing w:before="0" w:after="0" w:line="260" w:lineRule="auto"/>
+              <w:spacing w:before="0" w:after="0" w:line="240" w:lineRule="auto"/>
               <w:jc w:val="both"/>
               <w:rPr/>
             </w:pPr>
@@ -17368,7 +17372,7 @@
                 <w:rtl w:val="0"/>
                 <w:sz w:val="18"/>
                 <w:szCs w:val="18"/>
-                <w:rFonts w:ascii="Georgia" w:hAnsi="Georgia"/>
+                <w:rFonts w:ascii="Georgia" w:hAnsi="Georgia" w:cs="Georgia" w:eastAsia="Georgia"/>
               </w:rPr>
             </w:r>
           </w:p>
@@ -17384,7 +17388,7 @@
           </w:tcPr>
           <w:p>
             <w:pPr>
-              <w:spacing w:before="0" w:after="0" w:line="260" w:lineRule="auto"/>
+              <w:spacing w:before="0" w:after="0" w:line="240" w:lineRule="auto"/>
               <w:jc w:val="left"/>
               <w:rPr/>
             </w:pPr>
@@ -17403,7 +17407,7 @@
                 <w:rtl w:val="0"/>
                 <w:sz w:val="18"/>
                 <w:szCs w:val="18"/>
-                <w:rFonts w:ascii="Georgia" w:hAnsi="Georgia"/>
+                <w:rFonts w:ascii="Georgia" w:hAnsi="Georgia" w:cs="Georgia" w:eastAsia="Georgia"/>
                 <w:shd w:val="clear" w:color="auto" w:fill="bfbfbf"/>
               </w:rPr>
             </w:r>
@@ -17413,7 +17417,7 @@
           <w:tcPr/>
           <w:p>
             <w:pPr>
-              <w:spacing w:before="0" w:after="0" w:line="260" w:lineRule="auto"/>
+              <w:spacing w:before="0" w:after="0" w:line="240" w:lineRule="auto"/>
               <w:jc w:val="both"/>
               <w:rPr/>
             </w:pPr>
@@ -17431,7 +17435,7 @@
                 <w:rtl w:val="0"/>
                 <w:sz w:val="18"/>
                 <w:szCs w:val="18"/>
-                <w:rFonts w:ascii="Georgia" w:hAnsi="Georgia"/>
+                <w:rFonts w:ascii="Georgia" w:hAnsi="Georgia" w:cs="Georgia" w:eastAsia="Georgia"/>
               </w:rPr>
             </w:r>
           </w:p>
@@ -17440,7 +17444,7 @@
           <w:tcPr/>
           <w:p>
             <w:pPr>
-              <w:spacing w:before="0" w:after="0" w:line="260" w:lineRule="auto"/>
+              <w:spacing w:before="0" w:after="0" w:line="240" w:lineRule="auto"/>
               <w:jc w:val="both"/>
               <w:rPr/>
             </w:pPr>
@@ -17458,7 +17462,7 @@
                 <w:rtl w:val="0"/>
                 <w:sz w:val="18"/>
                 <w:szCs w:val="18"/>
-                <w:rFonts w:ascii="Georgia" w:hAnsi="Georgia"/>
+                <w:rFonts w:ascii="Georgia" w:hAnsi="Georgia" w:cs="Georgia" w:eastAsia="Georgia"/>
               </w:rPr>
             </w:r>
           </w:p>
@@ -17467,13 +17471,13 @@
           <w:tcPr/>
           <w:p>
             <w:pPr>
-              <w:spacing w:before="0" w:after="0" w:line="260" w:lineRule="auto"/>
+              <w:spacing w:before="0" w:after="0" w:line="240" w:lineRule="auto"/>
               <w:jc w:val="both"/>
               <w:rPr/>
             </w:pPr>
             <w:r>
               <w:rPr>
-                <w:rFonts w:ascii="Georgia" w:hAnsi="Georgia"/>
+                <w:rFonts w:ascii="Georgia" w:hAnsi="Georgia" w:cs="Georgia" w:eastAsia="Georgia"/>
                 <w:sz w:val="18"/>
                 <w:szCs w:val="18"/>
               </w:rPr>
@@ -17481,7 +17485,7 @@
             </w:r>
             <w:r>
               <w:rPr>
-                <w:rFonts w:ascii="Georgia" w:hAnsi="Georgia"/>
+                <w:rFonts w:ascii="Georgia" w:hAnsi="Georgia" w:cs="Georgia" w:eastAsia="Georgia"/>
                 <w:sz w:val="18"/>
                 <w:szCs w:val="18"/>
                 <w:shd w:val="clear" w:color="auto" w:fill="bfbfbf"/>
@@ -17490,7 +17494,7 @@
             </w:r>
             <w:r>
               <w:rPr>
-                <w:rFonts w:ascii="Georgia" w:hAnsi="Georgia"/>
+                <w:rFonts w:ascii="Georgia" w:hAnsi="Georgia" w:cs="Georgia" w:eastAsia="Georgia"/>
                 <w:sz w:val="18"/>
                 <w:szCs w:val="18"/>
               </w:rPr>
@@ -17509,7 +17513,7 @@
           </w:tcPr>
           <w:p>
             <w:pPr>
-              <w:spacing w:before="0" w:after="0" w:line="260" w:lineRule="auto"/>
+              <w:spacing w:before="0" w:after="0" w:line="240" w:lineRule="auto"/>
               <w:jc w:val="left"/>
               <w:rPr/>
             </w:pPr>
@@ -17528,7 +17532,7 @@
                 <w:rtl w:val="0"/>
                 <w:sz w:val="18"/>
                 <w:szCs w:val="18"/>
-                <w:rFonts w:ascii="Georgia" w:hAnsi="Georgia"/>
+                <w:rFonts w:ascii="Georgia" w:hAnsi="Georgia" w:cs="Georgia" w:eastAsia="Georgia"/>
                 <w:shd w:val="clear" w:color="auto" w:fill="bfbfbf"/>
               </w:rPr>
             </w:r>
@@ -17538,7 +17542,7 @@
           <w:tcPr/>
           <w:p>
             <w:pPr>
-              <w:spacing w:before="0" w:after="0" w:line="260" w:lineRule="auto"/>
+              <w:spacing w:before="0" w:after="0" w:line="240" w:lineRule="auto"/>
               <w:jc w:val="both"/>
               <w:rPr/>
             </w:pPr>
@@ -17556,7 +17560,7 @@
                 <w:rtl w:val="0"/>
                 <w:sz w:val="18"/>
                 <w:szCs w:val="18"/>
-                <w:rFonts w:ascii="Georgia" w:hAnsi="Georgia"/>
+                <w:rFonts w:ascii="Georgia" w:hAnsi="Georgia" w:cs="Georgia" w:eastAsia="Georgia"/>
               </w:rPr>
             </w:r>
           </w:p>
@@ -17565,7 +17569,7 @@
           <w:tcPr/>
           <w:p>
             <w:pPr>
-              <w:spacing w:before="0" w:after="0" w:line="260" w:lineRule="auto"/>
+              <w:spacing w:before="0" w:after="0" w:line="240" w:lineRule="auto"/>
               <w:jc w:val="both"/>
               <w:rPr/>
             </w:pPr>
@@ -17583,7 +17587,7 @@
                 <w:rtl w:val="0"/>
                 <w:sz w:val="18"/>
                 <w:szCs w:val="18"/>
-                <w:rFonts w:ascii="Georgia" w:hAnsi="Georgia"/>
+                <w:rFonts w:ascii="Georgia" w:hAnsi="Georgia" w:cs="Georgia" w:eastAsia="Georgia"/>
               </w:rPr>
             </w:r>
           </w:p>
@@ -17592,13 +17596,13 @@
           <w:tcPr/>
           <w:p>
             <w:pPr>
-              <w:spacing w:before="0" w:after="0" w:line="260" w:lineRule="auto"/>
+              <w:spacing w:before="0" w:after="0" w:line="240" w:lineRule="auto"/>
               <w:jc w:val="both"/>
               <w:rPr/>
             </w:pPr>
             <w:r>
               <w:rPr>
-                <w:rFonts w:ascii="Georgia" w:hAnsi="Georgia"/>
+                <w:rFonts w:ascii="Georgia" w:hAnsi="Georgia" w:cs="Georgia" w:eastAsia="Georgia"/>
                 <w:sz w:val="18"/>
                 <w:szCs w:val="18"/>
               </w:rPr>
@@ -17606,7 +17610,7 @@
             </w:r>
             <w:r>
               <w:rPr>
-                <w:rFonts w:ascii="Georgia" w:hAnsi="Georgia"/>
+                <w:rFonts w:ascii="Georgia" w:hAnsi="Georgia" w:cs="Georgia" w:eastAsia="Georgia"/>
                 <w:sz w:val="18"/>
                 <w:szCs w:val="18"/>
                 <w:shd w:val="clear" w:color="auto" w:fill="bfbfbf"/>
@@ -17615,7 +17619,7 @@
             </w:r>
             <w:r>
               <w:rPr>
-                <w:rFonts w:ascii="Georgia" w:hAnsi="Georgia"/>
+                <w:rFonts w:ascii="Georgia" w:hAnsi="Georgia" w:cs="Georgia" w:eastAsia="Georgia"/>
                 <w:sz w:val="18"/>
                 <w:szCs w:val="18"/>
               </w:rPr>
@@ -17634,7 +17638,7 @@
           </w:tcPr>
           <w:p>
             <w:pPr>
-              <w:spacing w:before="0" w:after="0" w:line="260" w:lineRule="auto"/>
+              <w:spacing w:before="0" w:after="0" w:line="240" w:lineRule="auto"/>
               <w:jc w:val="left"/>
               <w:rPr/>
             </w:pPr>
@@ -17653,7 +17657,7 @@
                 <w:rtl w:val="0"/>
                 <w:sz w:val="18"/>
                 <w:szCs w:val="18"/>
-                <w:rFonts w:ascii="Georgia" w:hAnsi="Georgia"/>
+                <w:rFonts w:ascii="Georgia" w:hAnsi="Georgia" w:cs="Georgia" w:eastAsia="Georgia"/>
                 <w:shd w:val="clear" w:color="auto" w:fill="bfbfbf"/>
               </w:rPr>
             </w:r>
@@ -17663,7 +17667,7 @@
           <w:tcPr/>
           <w:p>
             <w:pPr>
-              <w:spacing w:before="0" w:after="0" w:line="260" w:lineRule="auto"/>
+              <w:spacing w:before="0" w:after="0" w:line="240" w:lineRule="auto"/>
               <w:jc w:val="both"/>
               <w:rPr/>
             </w:pPr>
@@ -17681,7 +17685,7 @@
                 <w:rtl w:val="0"/>
                 <w:sz w:val="18"/>
                 <w:szCs w:val="18"/>
-                <w:rFonts w:ascii="Georgia" w:hAnsi="Georgia"/>
+                <w:rFonts w:ascii="Georgia" w:hAnsi="Georgia" w:cs="Georgia" w:eastAsia="Georgia"/>
               </w:rPr>
             </w:r>
           </w:p>
@@ -17690,7 +17694,7 @@
           <w:tcPr/>
           <w:p>
             <w:pPr>
-              <w:spacing w:before="0" w:after="0" w:line="260" w:lineRule="auto"/>
+              <w:spacing w:before="0" w:after="0" w:line="240" w:lineRule="auto"/>
               <w:jc w:val="both"/>
               <w:rPr/>
             </w:pPr>
@@ -17708,7 +17712,7 @@
                 <w:rtl w:val="0"/>
                 <w:sz w:val="18"/>
                 <w:szCs w:val="18"/>
-                <w:rFonts w:ascii="Georgia" w:hAnsi="Georgia"/>
+                <w:rFonts w:ascii="Georgia" w:hAnsi="Georgia" w:cs="Georgia" w:eastAsia="Georgia"/>
               </w:rPr>
             </w:r>
           </w:p>
@@ -17717,13 +17721,13 @@
           <w:tcPr/>
           <w:p>
             <w:pPr>
-              <w:spacing w:before="0" w:after="0" w:line="260" w:lineRule="auto"/>
+              <w:spacing w:before="0" w:after="0" w:line="240" w:lineRule="auto"/>
               <w:jc w:val="both"/>
               <w:rPr/>
             </w:pPr>
             <w:r>
               <w:rPr>
-                <w:rFonts w:ascii="Georgia" w:hAnsi="Georgia"/>
+                <w:rFonts w:ascii="Georgia" w:hAnsi="Georgia" w:cs="Georgia" w:eastAsia="Georgia"/>
                 <w:sz w:val="18"/>
                 <w:szCs w:val="18"/>
               </w:rPr>
@@ -17731,7 +17735,7 @@
             </w:r>
             <w:r>
               <w:rPr>
-                <w:rFonts w:ascii="Georgia" w:hAnsi="Georgia"/>
+                <w:rFonts w:ascii="Georgia" w:hAnsi="Georgia" w:cs="Georgia" w:eastAsia="Georgia"/>
                 <w:sz w:val="18"/>
                 <w:szCs w:val="18"/>
                 <w:shd w:val="clear" w:color="auto" w:fill="bfbfbf"/>
@@ -17740,7 +17744,7 @@
             </w:r>
             <w:r>
               <w:rPr>
-                <w:rFonts w:ascii="Georgia" w:hAnsi="Georgia"/>
+                <w:rFonts w:ascii="Georgia" w:hAnsi="Georgia" w:cs="Georgia" w:eastAsia="Georgia"/>
                 <w:sz w:val="18"/>
                 <w:szCs w:val="18"/>
               </w:rPr>
@@ -17753,7 +17757,7 @@
     <w:p>
       <w:pPr>
         <w:keepNext/>
-        <w:spacing w:before="240" w:after="40" w:line="300" w:lineRule="auto"/>
+        <w:spacing w:before="240" w:after="0" w:line="480" w:lineRule="auto"/>
         <w:jc w:val="left"/>
       </w:pPr>
       <w:r>
@@ -17761,8 +17765,8 @@
           <w:rFonts w:ascii="Georgia" w:hAnsi="Georgia" w:cs="Georgia" w:eastAsia="Georgia"/>
           <w:b/>
           <w:bCs w:val="1"/>
-          <w:sz w:val="22"/>
-          <w:szCs w:val="22"/>
+          <w:sz w:val="24"/>
+          <w:szCs w:val="24"/>
           <w:rtl w:val="0"/>
         </w:rPr>
         <w:t>CODING SHEET COLUMNS</w:t>
@@ -17771,8 +17775,8 @@
         <w:rPr>
           <w:rFonts w:ascii="Georgia" w:hAnsi="Georgia" w:cs="Georgia" w:eastAsia="Georgia"/>
           <w:rtl w:val="0"/>
-          <w:sz w:val="22"/>
-          <w:szCs w:val="22"/>
+          <w:sz w:val="24"/>
+          <w:szCs w:val="24"/>
           <w:b/>
         </w:rPr>
       </w:r>
@@ -17826,7 +17830,7 @@
           </w:tcPr>
           <w:p>
             <w:pPr>
-              <w:spacing w:before="0" w:after="0" w:line="260" w:lineRule="auto"/>
+              <w:spacing w:before="0" w:after="0" w:line="240" w:lineRule="auto"/>
               <w:jc w:val="both"/>
               <w:rPr/>
             </w:pPr>
@@ -17846,7 +17850,7 @@
                 <w:rtl w:val="0"/>
                 <w:sz w:val="18"/>
                 <w:szCs w:val="18"/>
-                <w:rFonts w:ascii="Georgia" w:hAnsi="Georgia"/>
+                <w:rFonts w:ascii="Georgia" w:hAnsi="Georgia" w:cs="Georgia" w:eastAsia="Georgia"/>
               </w:rPr>
             </w:r>
           </w:p>
@@ -17860,7 +17864,7 @@
           </w:tcPr>
           <w:p>
             <w:pPr>
-              <w:spacing w:before="0" w:after="0" w:line="260" w:lineRule="auto"/>
+              <w:spacing w:before="0" w:after="0" w:line="240" w:lineRule="auto"/>
               <w:jc w:val="both"/>
               <w:rPr/>
             </w:pPr>
@@ -17880,7 +17884,7 @@
                 <w:rtl w:val="0"/>
                 <w:sz w:val="18"/>
                 <w:szCs w:val="18"/>
-                <w:rFonts w:ascii="Georgia" w:hAnsi="Georgia"/>
+                <w:rFonts w:ascii="Georgia" w:hAnsi="Georgia" w:cs="Georgia" w:eastAsia="Georgia"/>
               </w:rPr>
             </w:r>
           </w:p>
@@ -17894,7 +17898,7 @@
           </w:tcPr>
           <w:p>
             <w:pPr>
-              <w:spacing w:before="0" w:after="0" w:line="260" w:lineRule="auto"/>
+              <w:spacing w:before="0" w:after="0" w:line="240" w:lineRule="auto"/>
               <w:jc w:val="both"/>
               <w:rPr/>
             </w:pPr>
@@ -17914,7 +17918,7 @@
                 <w:rtl w:val="0"/>
                 <w:sz w:val="18"/>
                 <w:szCs w:val="18"/>
-                <w:rFonts w:ascii="Georgia" w:hAnsi="Georgia"/>
+                <w:rFonts w:ascii="Georgia" w:hAnsi="Georgia" w:cs="Georgia" w:eastAsia="Georgia"/>
               </w:rPr>
             </w:r>
           </w:p>
@@ -17928,7 +17932,7 @@
           </w:tcPr>
           <w:p>
             <w:pPr>
-              <w:spacing w:before="0" w:after="0" w:line="260" w:lineRule="auto"/>
+              <w:spacing w:before="0" w:after="0" w:line="240" w:lineRule="auto"/>
               <w:jc w:val="both"/>
               <w:rPr/>
             </w:pPr>
@@ -17948,7 +17952,7 @@
                 <w:rtl w:val="0"/>
                 <w:sz w:val="18"/>
                 <w:szCs w:val="18"/>
-                <w:rFonts w:ascii="Georgia" w:hAnsi="Georgia"/>
+                <w:rFonts w:ascii="Georgia" w:hAnsi="Georgia" w:cs="Georgia" w:eastAsia="Georgia"/>
               </w:rPr>
             </w:r>
           </w:p>
@@ -17962,7 +17966,7 @@
           </w:tcPr>
           <w:p>
             <w:pPr>
-              <w:spacing w:before="0" w:after="0" w:line="260" w:lineRule="auto"/>
+              <w:spacing w:before="0" w:after="0" w:line="240" w:lineRule="auto"/>
               <w:jc w:val="both"/>
               <w:rPr/>
             </w:pPr>
@@ -17982,7 +17986,7 @@
                 <w:rtl w:val="0"/>
                 <w:sz w:val="18"/>
                 <w:szCs w:val="18"/>
-                <w:rFonts w:ascii="Georgia" w:hAnsi="Georgia"/>
+                <w:rFonts w:ascii="Georgia" w:hAnsi="Georgia" w:cs="Georgia" w:eastAsia="Georgia"/>
               </w:rPr>
             </w:r>
           </w:p>
@@ -17996,7 +18000,7 @@
           </w:tcPr>
           <w:p>
             <w:pPr>
-              <w:spacing w:before="0" w:after="0" w:line="260" w:lineRule="auto"/>
+              <w:spacing w:before="0" w:after="0" w:line="240" w:lineRule="auto"/>
               <w:jc w:val="both"/>
               <w:rPr/>
             </w:pPr>
@@ -18016,7 +18020,7 @@
                 <w:rtl w:val="0"/>
                 <w:sz w:val="18"/>
                 <w:szCs w:val="18"/>
-                <w:rFonts w:ascii="Georgia" w:hAnsi="Georgia"/>
+                <w:rFonts w:ascii="Georgia" w:hAnsi="Georgia" w:cs="Georgia" w:eastAsia="Georgia"/>
               </w:rPr>
             </w:r>
           </w:p>
@@ -18030,7 +18034,7 @@
           <w:tcPr/>
           <w:p>
             <w:pPr>
-              <w:spacing w:before="0" w:after="0" w:line="260" w:lineRule="auto"/>
+              <w:spacing w:before="0" w:after="0" w:line="240" w:lineRule="auto"/>
               <w:jc w:val="left"/>
               <w:rPr/>
             </w:pPr>
@@ -18048,7 +18052,7 @@
                 <w:rtl w:val="0"/>
                 <w:sz w:val="18"/>
                 <w:szCs w:val="18"/>
-                <w:rFonts w:ascii="Georgia" w:hAnsi="Georgia"/>
+                <w:rFonts w:ascii="Georgia" w:hAnsi="Georgia" w:cs="Georgia" w:eastAsia="Georgia"/>
               </w:rPr>
             </w:r>
           </w:p>
@@ -18057,7 +18061,7 @@
           <w:tcPr/>
           <w:p>
             <w:pPr>
-              <w:spacing w:before="0" w:after="0" w:line="260" w:lineRule="auto"/>
+              <w:spacing w:before="0" w:after="0" w:line="240" w:lineRule="auto"/>
               <w:jc w:val="left"/>
               <w:rPr/>
             </w:pPr>
@@ -18075,7 +18079,7 @@
                 <w:rtl w:val="0"/>
                 <w:sz w:val="18"/>
                 <w:szCs w:val="18"/>
-                <w:rFonts w:ascii="Georgia" w:hAnsi="Georgia"/>
+                <w:rFonts w:ascii="Georgia" w:hAnsi="Georgia" w:cs="Georgia" w:eastAsia="Georgia"/>
               </w:rPr>
             </w:r>
           </w:p>
@@ -18084,7 +18088,7 @@
           <w:tcPr/>
           <w:p>
             <w:pPr>
-              <w:spacing w:before="0" w:after="0" w:line="260" w:lineRule="auto"/>
+              <w:spacing w:before="0" w:after="0" w:line="240" w:lineRule="auto"/>
               <w:jc w:val="left"/>
               <w:rPr/>
             </w:pPr>
@@ -18102,7 +18106,7 @@
                 <w:rtl w:val="0"/>
                 <w:sz w:val="18"/>
                 <w:szCs w:val="18"/>
-                <w:rFonts w:ascii="Georgia" w:hAnsi="Georgia"/>
+                <w:rFonts w:ascii="Georgia" w:hAnsi="Georgia" w:cs="Georgia" w:eastAsia="Georgia"/>
               </w:rPr>
             </w:r>
           </w:p>
@@ -18111,7 +18115,7 @@
           <w:tcPr/>
           <w:p>
             <w:pPr>
-              <w:spacing w:before="0" w:after="0" w:line="260" w:lineRule="auto"/>
+              <w:spacing w:before="0" w:after="0" w:line="240" w:lineRule="auto"/>
               <w:jc w:val="left"/>
               <w:rPr/>
             </w:pPr>
@@ -18129,7 +18133,7 @@
                 <w:rtl w:val="0"/>
                 <w:sz w:val="18"/>
                 <w:szCs w:val="18"/>
-                <w:rFonts w:ascii="Georgia" w:hAnsi="Georgia"/>
+                <w:rFonts w:ascii="Georgia" w:hAnsi="Georgia" w:cs="Georgia" w:eastAsia="Georgia"/>
               </w:rPr>
             </w:r>
           </w:p>
@@ -18138,7 +18142,7 @@
           <w:tcPr/>
           <w:p>
             <w:pPr>
-              <w:spacing w:before="0" w:after="0" w:line="260" w:lineRule="auto"/>
+              <w:spacing w:before="0" w:after="0" w:line="240" w:lineRule="auto"/>
               <w:jc w:val="left"/>
               <w:rPr/>
             </w:pPr>
@@ -18156,7 +18160,7 @@
                 <w:rtl w:val="0"/>
                 <w:sz w:val="18"/>
                 <w:szCs w:val="18"/>
-                <w:rFonts w:ascii="Georgia" w:hAnsi="Georgia"/>
+                <w:rFonts w:ascii="Georgia" w:hAnsi="Georgia" w:cs="Georgia" w:eastAsia="Georgia"/>
               </w:rPr>
             </w:r>
           </w:p>
@@ -18165,7 +18169,7 @@
           <w:tcPr/>
           <w:p>
             <w:pPr>
-              <w:spacing w:before="0" w:after="0" w:line="260" w:lineRule="auto"/>
+              <w:spacing w:before="0" w:after="0" w:line="240" w:lineRule="auto"/>
               <w:jc w:val="left"/>
               <w:rPr/>
             </w:pPr>
@@ -18183,7 +18187,7 @@
                 <w:rtl w:val="0"/>
                 <w:sz w:val="18"/>
                 <w:szCs w:val="18"/>
-                <w:rFonts w:ascii="Georgia" w:hAnsi="Georgia"/>
+                <w:rFonts w:ascii="Georgia" w:hAnsi="Georgia" w:cs="Georgia" w:eastAsia="Georgia"/>
               </w:rPr>
             </w:r>
           </w:p>
@@ -18239,7 +18243,7 @@
           </w:tcPr>
           <w:p>
             <w:pPr>
-              <w:spacing w:before="0" w:after="0" w:line="260" w:lineRule="auto"/>
+              <w:spacing w:before="0" w:after="0" w:line="240" w:lineRule="auto"/>
               <w:jc w:val="both"/>
               <w:rPr/>
             </w:pPr>
@@ -18259,7 +18263,7 @@
                 <w:rtl w:val="0"/>
                 <w:sz w:val="18"/>
                 <w:szCs w:val="18"/>
-                <w:rFonts w:ascii="Georgia" w:hAnsi="Georgia"/>
+                <w:rFonts w:ascii="Georgia" w:hAnsi="Georgia" w:cs="Georgia" w:eastAsia="Georgia"/>
               </w:rPr>
             </w:r>
           </w:p>
@@ -18273,7 +18277,7 @@
           </w:tcPr>
           <w:p>
             <w:pPr>
-              <w:spacing w:before="0" w:after="0" w:line="260" w:lineRule="auto"/>
+              <w:spacing w:before="0" w:after="0" w:line="240" w:lineRule="auto"/>
               <w:jc w:val="both"/>
               <w:rPr/>
             </w:pPr>
@@ -18293,7 +18297,7 @@
                 <w:rtl w:val="0"/>
                 <w:sz w:val="18"/>
                 <w:szCs w:val="18"/>
-                <w:rFonts w:ascii="Georgia" w:hAnsi="Georgia"/>
+                <w:rFonts w:ascii="Georgia" w:hAnsi="Georgia" w:cs="Georgia" w:eastAsia="Georgia"/>
               </w:rPr>
             </w:r>
           </w:p>
@@ -18307,7 +18311,7 @@
           </w:tcPr>
           <w:p>
             <w:pPr>
-              <w:spacing w:before="0" w:after="0" w:line="260" w:lineRule="auto"/>
+              <w:spacing w:before="0" w:after="0" w:line="240" w:lineRule="auto"/>
               <w:jc w:val="both"/>
               <w:rPr/>
             </w:pPr>
@@ -18327,7 +18331,7 @@
                 <w:rtl w:val="0"/>
                 <w:sz w:val="18"/>
                 <w:szCs w:val="18"/>
-                <w:rFonts w:ascii="Georgia" w:hAnsi="Georgia"/>
+                <w:rFonts w:ascii="Georgia" w:hAnsi="Georgia" w:cs="Georgia" w:eastAsia="Georgia"/>
               </w:rPr>
             </w:r>
           </w:p>
@@ -18341,7 +18345,7 @@
           </w:tcPr>
           <w:p>
             <w:pPr>
-              <w:spacing w:before="0" w:after="0" w:line="260" w:lineRule="auto"/>
+              <w:spacing w:before="0" w:after="0" w:line="240" w:lineRule="auto"/>
               <w:jc w:val="both"/>
               <w:rPr/>
             </w:pPr>
@@ -18361,7 +18365,7 @@
                 <w:rtl w:val="0"/>
                 <w:sz w:val="18"/>
                 <w:szCs w:val="18"/>
-                <w:rFonts w:ascii="Georgia" w:hAnsi="Georgia"/>
+                <w:rFonts w:ascii="Georgia" w:hAnsi="Georgia" w:cs="Georgia" w:eastAsia="Georgia"/>
               </w:rPr>
             </w:r>
           </w:p>
@@ -18375,7 +18379,7 @@
           </w:tcPr>
           <w:p>
             <w:pPr>
-              <w:spacing w:before="0" w:after="0" w:line="260" w:lineRule="auto"/>
+              <w:spacing w:before="0" w:after="0" w:line="240" w:lineRule="auto"/>
               <w:jc w:val="both"/>
               <w:rPr/>
             </w:pPr>
@@ -18395,7 +18399,7 @@
                 <w:rtl w:val="0"/>
                 <w:sz w:val="18"/>
                 <w:szCs w:val="18"/>
-                <w:rFonts w:ascii="Georgia" w:hAnsi="Georgia"/>
+                <w:rFonts w:ascii="Georgia" w:hAnsi="Georgia" w:cs="Georgia" w:eastAsia="Georgia"/>
               </w:rPr>
             </w:r>
           </w:p>
@@ -18409,7 +18413,7 @@
           </w:tcPr>
           <w:p>
             <w:pPr>
-              <w:spacing w:before="0" w:after="0" w:line="260" w:lineRule="auto"/>
+              <w:spacing w:before="0" w:after="0" w:line="240" w:lineRule="auto"/>
               <w:jc w:val="both"/>
               <w:rPr/>
             </w:pPr>
@@ -18429,7 +18433,7 @@
                 <w:rtl w:val="0"/>
                 <w:sz w:val="18"/>
                 <w:szCs w:val="18"/>
-                <w:rFonts w:ascii="Georgia" w:hAnsi="Georgia"/>
+                <w:rFonts w:ascii="Georgia" w:hAnsi="Georgia" w:cs="Georgia" w:eastAsia="Georgia"/>
               </w:rPr>
             </w:r>
           </w:p>
@@ -18443,7 +18447,7 @@
           <w:tcPr/>
           <w:p>
             <w:pPr>
-              <w:spacing w:before="0" w:after="0" w:line="260" w:lineRule="auto"/>
+              <w:spacing w:before="0" w:after="0" w:line="240" w:lineRule="auto"/>
               <w:jc w:val="left"/>
               <w:rPr/>
             </w:pPr>
@@ -18461,7 +18465,7 @@
                 <w:rtl w:val="0"/>
                 <w:sz w:val="18"/>
                 <w:szCs w:val="18"/>
-                <w:rFonts w:ascii="Georgia" w:hAnsi="Georgia"/>
+                <w:rFonts w:ascii="Georgia" w:hAnsi="Georgia" w:cs="Georgia" w:eastAsia="Georgia"/>
               </w:rPr>
             </w:r>
           </w:p>
@@ -18470,7 +18474,7 @@
           <w:tcPr/>
           <w:p>
             <w:pPr>
-              <w:spacing w:before="0" w:after="0" w:line="260" w:lineRule="auto"/>
+              <w:spacing w:before="0" w:after="0" w:line="240" w:lineRule="auto"/>
               <w:jc w:val="left"/>
               <w:rPr/>
             </w:pPr>
@@ -18488,7 +18492,7 @@
                 <w:rtl w:val="0"/>
                 <w:sz w:val="18"/>
                 <w:szCs w:val="18"/>
-                <w:rFonts w:ascii="Georgia" w:hAnsi="Georgia"/>
+                <w:rFonts w:ascii="Georgia" w:hAnsi="Georgia" w:cs="Georgia" w:eastAsia="Georgia"/>
               </w:rPr>
             </w:r>
           </w:p>
@@ -18497,7 +18501,7 @@
           <w:tcPr/>
           <w:p>
             <w:pPr>
-              <w:spacing w:before="0" w:after="0" w:line="260" w:lineRule="auto"/>
+              <w:spacing w:before="0" w:after="0" w:line="240" w:lineRule="auto"/>
               <w:jc w:val="left"/>
               <w:rPr/>
             </w:pPr>
@@ -18515,7 +18519,7 @@
                 <w:rtl w:val="0"/>
                 <w:sz w:val="18"/>
                 <w:szCs w:val="18"/>
-                <w:rFonts w:ascii="Georgia" w:hAnsi="Georgia"/>
+                <w:rFonts w:ascii="Georgia" w:hAnsi="Georgia" w:cs="Georgia" w:eastAsia="Georgia"/>
               </w:rPr>
             </w:r>
           </w:p>
@@ -18524,7 +18528,7 @@
           <w:tcPr/>
           <w:p>
             <w:pPr>
-              <w:spacing w:before="0" w:after="0" w:line="260" w:lineRule="auto"/>
+              <w:spacing w:before="0" w:after="0" w:line="240" w:lineRule="auto"/>
               <w:jc w:val="left"/>
               <w:rPr/>
             </w:pPr>
@@ -18542,7 +18546,7 @@
                 <w:rtl w:val="0"/>
                 <w:sz w:val="18"/>
                 <w:szCs w:val="18"/>
-                <w:rFonts w:ascii="Georgia" w:hAnsi="Georgia"/>
+                <w:rFonts w:ascii="Georgia" w:hAnsi="Georgia" w:cs="Georgia" w:eastAsia="Georgia"/>
               </w:rPr>
             </w:r>
           </w:p>
@@ -18551,7 +18555,7 @@
           <w:tcPr/>
           <w:p>
             <w:pPr>
-              <w:spacing w:before="0" w:after="0" w:line="260" w:lineRule="auto"/>
+              <w:spacing w:before="0" w:after="0" w:line="240" w:lineRule="auto"/>
               <w:jc w:val="left"/>
               <w:rPr/>
             </w:pPr>
@@ -18569,7 +18573,7 @@
                 <w:rtl w:val="0"/>
                 <w:sz w:val="18"/>
                 <w:szCs w:val="18"/>
-                <w:rFonts w:ascii="Georgia" w:hAnsi="Georgia"/>
+                <w:rFonts w:ascii="Georgia" w:hAnsi="Georgia" w:cs="Georgia" w:eastAsia="Georgia"/>
               </w:rPr>
             </w:r>
           </w:p>
@@ -18578,7 +18582,7 @@
           <w:tcPr/>
           <w:p>
             <w:pPr>
-              <w:spacing w:before="0" w:after="0" w:line="260" w:lineRule="auto"/>
+              <w:spacing w:before="0" w:after="0" w:line="240" w:lineRule="auto"/>
               <w:jc w:val="left"/>
               <w:rPr/>
             </w:pPr>
@@ -18596,7 +18600,7 @@
                 <w:rtl w:val="0"/>
                 <w:sz w:val="18"/>
                 <w:szCs w:val="18"/>
-                <w:rFonts w:ascii="Georgia" w:hAnsi="Georgia"/>
+                <w:rFonts w:ascii="Georgia" w:hAnsi="Georgia" w:cs="Georgia" w:eastAsia="Georgia"/>
               </w:rPr>
             </w:r>
           </w:p>
@@ -18656,7 +18660,7 @@
           </w:tcPr>
           <w:p>
             <w:pPr>
-              <w:spacing w:before="0" w:after="0" w:line="260" w:lineRule="auto"/>
+              <w:spacing w:before="0" w:after="0" w:line="240" w:lineRule="auto"/>
               <w:jc w:val="both"/>
               <w:rPr/>
             </w:pPr>
@@ -18676,7 +18680,7 @@
                 <w:rtl w:val="0"/>
                 <w:sz w:val="18"/>
                 <w:szCs w:val="18"/>
-                <w:rFonts w:ascii="Georgia" w:hAnsi="Georgia"/>
+                <w:rFonts w:ascii="Georgia" w:hAnsi="Georgia" w:cs="Georgia" w:eastAsia="Georgia"/>
               </w:rPr>
             </w:r>
           </w:p>
@@ -18690,7 +18694,7 @@
           </w:tcPr>
           <w:p>
             <w:pPr>
-              <w:spacing w:before="0" w:after="0" w:line="260" w:lineRule="auto"/>
+              <w:spacing w:before="0" w:after="0" w:line="240" w:lineRule="auto"/>
               <w:jc w:val="both"/>
               <w:rPr/>
             </w:pPr>
@@ -18710,7 +18714,7 @@
                 <w:rtl w:val="0"/>
                 <w:sz w:val="18"/>
                 <w:szCs w:val="18"/>
-                <w:rFonts w:ascii="Georgia" w:hAnsi="Georgia"/>
+                <w:rFonts w:ascii="Georgia" w:hAnsi="Georgia" w:cs="Georgia" w:eastAsia="Georgia"/>
               </w:rPr>
             </w:r>
           </w:p>
@@ -18724,7 +18728,7 @@
           </w:tcPr>
           <w:p>
             <w:pPr>
-              <w:spacing w:before="0" w:after="0" w:line="260" w:lineRule="auto"/>
+              <w:spacing w:before="0" w:after="0" w:line="240" w:lineRule="auto"/>
               <w:jc w:val="both"/>
               <w:rPr/>
             </w:pPr>
@@ -18744,7 +18748,7 @@
                 <w:rtl w:val="0"/>
                 <w:sz w:val="18"/>
                 <w:szCs w:val="18"/>
-                <w:rFonts w:ascii="Georgia" w:hAnsi="Georgia"/>
+                <w:rFonts w:ascii="Georgia" w:hAnsi="Georgia" w:cs="Georgia" w:eastAsia="Georgia"/>
               </w:rPr>
             </w:r>
           </w:p>
@@ -18758,7 +18762,7 @@
           </w:tcPr>
           <w:p>
             <w:pPr>
-              <w:spacing w:before="0" w:after="0" w:line="260" w:lineRule="auto"/>
+              <w:spacing w:before="0" w:after="0" w:line="240" w:lineRule="auto"/>
               <w:jc w:val="both"/>
               <w:rPr/>
             </w:pPr>
@@ -18778,7 +18782,7 @@
                 <w:rtl w:val="0"/>
                 <w:sz w:val="18"/>
                 <w:szCs w:val="18"/>
-                <w:rFonts w:ascii="Georgia" w:hAnsi="Georgia"/>
+                <w:rFonts w:ascii="Georgia" w:hAnsi="Georgia" w:cs="Georgia" w:eastAsia="Georgia"/>
               </w:rPr>
             </w:r>
           </w:p>
@@ -18792,7 +18796,7 @@
           </w:tcPr>
           <w:p>
             <w:pPr>
-              <w:spacing w:before="0" w:after="0" w:line="260" w:lineRule="auto"/>
+              <w:spacing w:before="0" w:after="0" w:line="240" w:lineRule="auto"/>
               <w:jc w:val="both"/>
               <w:rPr/>
             </w:pPr>
@@ -18812,7 +18816,7 @@
                 <w:rtl w:val="0"/>
                 <w:sz w:val="18"/>
                 <w:szCs w:val="18"/>
-                <w:rFonts w:ascii="Georgia" w:hAnsi="Georgia"/>
+                <w:rFonts w:ascii="Georgia" w:hAnsi="Georgia" w:cs="Georgia" w:eastAsia="Georgia"/>
               </w:rPr>
             </w:r>
           </w:p>
@@ -18826,7 +18830,7 @@
           </w:tcPr>
           <w:p>
             <w:pPr>
-              <w:spacing w:before="0" w:after="0" w:line="260" w:lineRule="auto"/>
+              <w:spacing w:before="0" w:after="0" w:line="240" w:lineRule="auto"/>
               <w:jc w:val="both"/>
               <w:rPr/>
             </w:pPr>
@@ -18846,7 +18850,7 @@
                 <w:rtl w:val="0"/>
                 <w:sz w:val="18"/>
                 <w:szCs w:val="18"/>
-                <w:rFonts w:ascii="Georgia" w:hAnsi="Georgia"/>
+                <w:rFonts w:ascii="Georgia" w:hAnsi="Georgia" w:cs="Georgia" w:eastAsia="Georgia"/>
               </w:rPr>
             </w:r>
           </w:p>
@@ -18860,7 +18864,7 @@
           </w:tcPr>
           <w:p>
             <w:pPr>
-              <w:spacing w:before="0" w:after="0" w:line="260" w:lineRule="auto"/>
+              <w:spacing w:before="0" w:after="0" w:line="240" w:lineRule="auto"/>
               <w:jc w:val="both"/>
               <w:rPr/>
             </w:pPr>
@@ -18880,7 +18884,7 @@
                 <w:rtl w:val="0"/>
                 <w:sz w:val="18"/>
                 <w:szCs w:val="18"/>
-                <w:rFonts w:ascii="Georgia" w:hAnsi="Georgia"/>
+                <w:rFonts w:ascii="Georgia" w:hAnsi="Georgia" w:cs="Georgia" w:eastAsia="Georgia"/>
               </w:rPr>
             </w:r>
           </w:p>
@@ -18894,7 +18898,7 @@
           </w:tcPr>
           <w:p>
             <w:pPr>
-              <w:spacing w:before="0" w:after="0" w:line="260" w:lineRule="auto"/>
+              <w:spacing w:before="0" w:after="0" w:line="240" w:lineRule="auto"/>
               <w:jc w:val="both"/>
               <w:rPr/>
             </w:pPr>
@@ -18914,7 +18918,7 @@
                 <w:rtl w:val="0"/>
                 <w:sz w:val="18"/>
                 <w:szCs w:val="18"/>
-                <w:rFonts w:ascii="Georgia" w:hAnsi="Georgia"/>
+                <w:rFonts w:ascii="Georgia" w:hAnsi="Georgia" w:cs="Georgia" w:eastAsia="Georgia"/>
               </w:rPr>
             </w:r>
           </w:p>
@@ -18928,7 +18932,7 @@
           <w:tcPr/>
           <w:p>
             <w:pPr>
-              <w:spacing w:before="0" w:after="0" w:line="260" w:lineRule="auto"/>
+              <w:spacing w:before="0" w:after="0" w:line="240" w:lineRule="auto"/>
               <w:jc w:val="left"/>
               <w:rPr/>
             </w:pPr>
@@ -18946,7 +18950,7 @@
                 <w:rtl w:val="0"/>
                 <w:sz w:val="18"/>
                 <w:szCs w:val="18"/>
-                <w:rFonts w:ascii="Georgia" w:hAnsi="Georgia"/>
+                <w:rFonts w:ascii="Georgia" w:hAnsi="Georgia" w:cs="Georgia" w:eastAsia="Georgia"/>
               </w:rPr>
             </w:r>
           </w:p>
@@ -18955,7 +18959,7 @@
           <w:tcPr/>
           <w:p>
             <w:pPr>
-              <w:spacing w:before="0" w:after="0" w:line="260" w:lineRule="auto"/>
+              <w:spacing w:before="0" w:after="0" w:line="240" w:lineRule="auto"/>
               <w:jc w:val="left"/>
               <w:rPr/>
             </w:pPr>
@@ -18973,7 +18977,7 @@
                 <w:rtl w:val="0"/>
                 <w:sz w:val="18"/>
                 <w:szCs w:val="18"/>
-                <w:rFonts w:ascii="Georgia" w:hAnsi="Georgia"/>
+                <w:rFonts w:ascii="Georgia" w:hAnsi="Georgia" w:cs="Georgia" w:eastAsia="Georgia"/>
               </w:rPr>
             </w:r>
           </w:p>
@@ -18982,7 +18986,7 @@
           <w:tcPr/>
           <w:p>
             <w:pPr>
-              <w:spacing w:before="0" w:after="0" w:line="260" w:lineRule="auto"/>
+              <w:spacing w:before="0" w:after="0" w:line="240" w:lineRule="auto"/>
               <w:jc w:val="left"/>
               <w:rPr/>
             </w:pPr>
@@ -19000,7 +19004,7 @@
                 <w:rtl w:val="0"/>
                 <w:sz w:val="18"/>
                 <w:szCs w:val="18"/>
-                <w:rFonts w:ascii="Georgia" w:hAnsi="Georgia"/>
+                <w:rFonts w:ascii="Georgia" w:hAnsi="Georgia" w:cs="Georgia" w:eastAsia="Georgia"/>
               </w:rPr>
             </w:r>
           </w:p>
@@ -19009,7 +19013,7 @@
           <w:tcPr/>
           <w:p>
             <w:pPr>
-              <w:spacing w:before="0" w:after="0" w:line="260" w:lineRule="auto"/>
+              <w:spacing w:before="0" w:after="0" w:line="240" w:lineRule="auto"/>
               <w:jc w:val="left"/>
               <w:rPr/>
             </w:pPr>
@@ -19027,7 +19031,7 @@
                 <w:rtl w:val="0"/>
                 <w:sz w:val="18"/>
                 <w:szCs w:val="18"/>
-                <w:rFonts w:ascii="Georgia" w:hAnsi="Georgia"/>
+                <w:rFonts w:ascii="Georgia" w:hAnsi="Georgia" w:cs="Georgia" w:eastAsia="Georgia"/>
               </w:rPr>
             </w:r>
           </w:p>
@@ -19036,7 +19040,7 @@
           <w:tcPr/>
           <w:p>
             <w:pPr>
-              <w:spacing w:before="0" w:after="0" w:line="260" w:lineRule="auto"/>
+              <w:spacing w:before="0" w:after="0" w:line="240" w:lineRule="auto"/>
               <w:jc w:val="left"/>
               <w:rPr/>
             </w:pPr>
@@ -19054,7 +19058,7 @@
                 <w:rtl w:val="0"/>
                 <w:sz w:val="18"/>
                 <w:szCs w:val="18"/>
-                <w:rFonts w:ascii="Georgia" w:hAnsi="Georgia"/>
+                <w:rFonts w:ascii="Georgia" w:hAnsi="Georgia" w:cs="Georgia" w:eastAsia="Georgia"/>
               </w:rPr>
             </w:r>
           </w:p>
@@ -19063,7 +19067,7 @@
           <w:tcPr/>
           <w:p>
             <w:pPr>
-              <w:spacing w:before="0" w:after="0" w:line="260" w:lineRule="auto"/>
+              <w:spacing w:before="0" w:after="0" w:line="240" w:lineRule="auto"/>
               <w:jc w:val="left"/>
               <w:rPr/>
             </w:pPr>
@@ -19081,7 +19085,7 @@
                 <w:rtl w:val="0"/>
                 <w:sz w:val="18"/>
                 <w:szCs w:val="18"/>
-                <w:rFonts w:ascii="Georgia" w:hAnsi="Georgia"/>
+                <w:rFonts w:ascii="Georgia" w:hAnsi="Georgia" w:cs="Georgia" w:eastAsia="Georgia"/>
               </w:rPr>
             </w:r>
           </w:p>
@@ -19090,7 +19094,7 @@
           <w:tcPr/>
           <w:p>
             <w:pPr>
-              <w:spacing w:before="0" w:after="0" w:line="260" w:lineRule="auto"/>
+              <w:spacing w:before="0" w:after="0" w:line="240" w:lineRule="auto"/>
               <w:jc w:val="left"/>
               <w:rPr/>
             </w:pPr>
@@ -19108,7 +19112,7 @@
                 <w:rtl w:val="0"/>
                 <w:sz w:val="18"/>
                 <w:szCs w:val="18"/>
-                <w:rFonts w:ascii="Georgia" w:hAnsi="Georgia"/>
+                <w:rFonts w:ascii="Georgia" w:hAnsi="Georgia" w:cs="Georgia" w:eastAsia="Georgia"/>
               </w:rPr>
             </w:r>
           </w:p>
@@ -19117,7 +19121,7 @@
           <w:tcPr/>
           <w:p>
             <w:pPr>
-              <w:spacing w:before="0" w:after="0" w:line="260" w:lineRule="auto"/>
+              <w:spacing w:before="0" w:after="0" w:line="240" w:lineRule="auto"/>
               <w:jc w:val="left"/>
               <w:rPr/>
             </w:pPr>
@@ -19135,7 +19139,7 @@
                 <w:rtl w:val="0"/>
                 <w:sz w:val="18"/>
                 <w:szCs w:val="18"/>
-                <w:rFonts w:ascii="Georgia" w:hAnsi="Georgia"/>
+                <w:rFonts w:ascii="Georgia" w:hAnsi="Georgia" w:cs="Georgia" w:eastAsia="Georgia"/>
               </w:rPr>
             </w:r>
           </w:p>
@@ -19144,60 +19148,60 @@
     </w:tbl>
     <w:p>
       <w:pPr>
-        <w:spacing w:before="200" w:after="60" w:line="300" w:lineRule="auto"/>
+        <w:spacing w:before="240" w:after="0" w:line="480" w:lineRule="auto"/>
         <w:ind w:left="360"/>
         <w:jc w:val="both"/>
       </w:pPr>
       <w:r>
         <w:rPr>
           <w:rFonts w:ascii="Georgia" w:hAnsi="Georgia" w:cs="Georgia" w:eastAsia="Georgia"/>
-          <w:sz w:val="20"/>
-          <w:szCs w:val="20"/>
+          <w:sz w:val="22"/>
+          <w:szCs w:val="22"/>
         </w:rPr>
         <w:t xml:space="preserve">• Highlighted abstract = primary record. Spreadsheet = tallying and analysis only.</w:t>
       </w:r>
     </w:p>
     <w:p>
       <w:pPr>
-        <w:spacing w:before="0" w:after="60" w:line="300" w:lineRule="auto"/>
+        <w:spacing w:before="0" w:after="0" w:line="480" w:lineRule="auto"/>
         <w:ind w:left="360"/>
         <w:jc w:val="both"/>
       </w:pPr>
       <w:r>
         <w:rPr>
           <w:rFonts w:ascii="Georgia" w:hAnsi="Georgia" w:cs="Georgia" w:eastAsia="Georgia"/>
-          <w:sz w:val="20"/>
-          <w:szCs w:val="20"/>
+          <w:sz w:val="22"/>
+          <w:szCs w:val="22"/>
         </w:rPr>
         <w:t xml:space="preserve">• Codes: Acs1–Acs10, Aas1–Aas10 (Agriculture). VM1–VM20. B1–B20 (Biology).</w:t>
       </w:r>
     </w:p>
     <w:p>
       <w:pPr>
-        <w:spacing w:before="0" w:after="60" w:line="300" w:lineRule="auto"/>
+        <w:spacing w:before="0" w:after="0" w:line="480" w:lineRule="auto"/>
         <w:ind w:left="360"/>
         <w:jc w:val="both"/>
       </w:pPr>
       <w:r>
         <w:rPr>
           <w:rFonts w:ascii="Georgia" w:hAnsi="Georgia" w:cs="Georgia" w:eastAsia="Georgia"/>
-          <w:sz w:val="20"/>
-          <w:szCs w:val="20"/>
+          <w:sz w:val="22"/>
+          <w:szCs w:val="22"/>
         </w:rPr>
         <w:t xml:space="preserve">• Unhedged rows separate from hedge tallies. [G]/[C] only for warranted-but-absent caution.</w:t>
       </w:r>
     </w:p>
     <w:p>
       <w:pPr>
-        <w:spacing w:before="0" w:after="60" w:line="300" w:lineRule="auto"/>
+        <w:spacing w:before="0" w:after="0" w:line="480" w:lineRule="auto"/>
         <w:ind w:left="360"/>
         <w:jc w:val="both"/>
       </w:pPr>
       <w:r>
         <w:rPr>
           <w:rFonts w:ascii="Georgia" w:hAnsi="Georgia" w:cs="Georgia" w:eastAsia="Georgia"/>
-          <w:sz w:val="20"/>
-          <w:szCs w:val="20"/>
+          <w:sz w:val="22"/>
+          <w:szCs w:val="22"/>
         </w:rPr>
         <w:t xml:space="preserve">• Optional Rejected Candidates tab for FP traceability.</w:t>
       </w:r>

</xml_diff>

<commit_message>
Draft_104: Full Codebook bullets no left indent
</commit_message>
<xml_diff>
--- a/thesis/003_ThesisProposal_Draft_104.docx
+++ b/thesis/003_ThesisProposal_Draft_104.docx
@@ -13382,7 +13382,6 @@
     <w:p>
       <w:pPr>
         <w:spacing w:before="0" w:after="0" w:line="480" w:lineRule="auto"/>
-        <w:ind w:left="360"/>
         <w:jc w:val="both"/>
       </w:pPr>
       <w:r>
@@ -13424,7 +13423,6 @@
     <w:p>
       <w:pPr>
         <w:spacing w:before="0" w:after="0" w:line="480" w:lineRule="auto"/>
-        <w:ind w:left="360"/>
         <w:jc w:val="both"/>
       </w:pPr>
       <w:r>
@@ -13439,7 +13437,6 @@
     <w:p>
       <w:pPr>
         <w:spacing w:before="0" w:after="0" w:line="480" w:lineRule="auto"/>
-        <w:ind w:left="360"/>
         <w:jc w:val="both"/>
       </w:pPr>
       <w:r>
@@ -13454,7 +13451,6 @@
     <w:p>
       <w:pPr>
         <w:spacing w:before="0" w:after="0" w:line="480" w:lineRule="auto"/>
-        <w:ind w:left="360"/>
         <w:jc w:val="both"/>
       </w:pPr>
       <w:r>
@@ -13469,7 +13465,6 @@
     <w:p>
       <w:pPr>
         <w:spacing w:before="0" w:after="0" w:line="480" w:lineRule="auto"/>
-        <w:ind w:left="360"/>
         <w:jc w:val="both"/>
       </w:pPr>
       <w:r>
@@ -13484,7 +13479,6 @@
     <w:p>
       <w:pPr>
         <w:spacing w:before="0" w:after="0" w:line="480" w:lineRule="auto"/>
-        <w:ind w:left="360"/>
         <w:jc w:val="both"/>
       </w:pPr>
       <w:r>
@@ -13528,7 +13522,6 @@
     <w:p>
       <w:pPr>
         <w:spacing w:before="0" w:after="0" w:line="480" w:lineRule="auto"/>
-        <w:ind w:left="360"/>
         <w:jc w:val="both"/>
       </w:pPr>
       <w:r>
@@ -13543,7 +13536,6 @@
     <w:p>
       <w:pPr>
         <w:spacing w:before="0" w:after="0" w:line="480" w:lineRule="auto"/>
-        <w:ind w:left="360"/>
         <w:jc w:val="both"/>
       </w:pPr>
       <w:r>
@@ -13558,7 +13550,6 @@
     <w:p>
       <w:pPr>
         <w:spacing w:before="0" w:after="0" w:line="480" w:lineRule="auto"/>
-        <w:ind w:left="360"/>
         <w:jc w:val="both"/>
       </w:pPr>
       <w:r>
@@ -13573,7 +13564,6 @@
     <w:p>
       <w:pPr>
         <w:spacing w:before="0" w:after="0" w:line="480" w:lineRule="auto"/>
-        <w:ind w:left="360"/>
         <w:jc w:val="both"/>
       </w:pPr>
       <w:r>
@@ -13588,7 +13578,6 @@
     <w:p>
       <w:pPr>
         <w:spacing w:before="0" w:after="0" w:line="480" w:lineRule="auto"/>
-        <w:ind w:left="360"/>
         <w:jc w:val="both"/>
       </w:pPr>
       <w:r>
@@ -13603,7 +13592,6 @@
     <w:p>
       <w:pPr>
         <w:spacing w:before="0" w:after="0" w:line="480" w:lineRule="auto"/>
-        <w:ind w:left="360"/>
         <w:jc w:val="both"/>
       </w:pPr>
       <w:r>
@@ -13618,7 +13606,6 @@
     <w:p>
       <w:pPr>
         <w:spacing w:before="0" w:after="0" w:line="480" w:lineRule="auto"/>
-        <w:ind w:left="360"/>
         <w:jc w:val="both"/>
       </w:pPr>
       <w:r>
@@ -13633,7 +13620,6 @@
     <w:p>
       <w:pPr>
         <w:spacing w:before="0" w:after="0" w:line="480" w:lineRule="auto"/>
-        <w:ind w:left="360"/>
         <w:jc w:val="both"/>
       </w:pPr>
       <w:r>
@@ -14524,7 +14510,6 @@
     <w:p>
       <w:pPr>
         <w:spacing w:before="0" w:after="0" w:line="480" w:lineRule="auto"/>
-        <w:ind w:left="360"/>
         <w:jc w:val="both"/>
       </w:pPr>
       <w:r>
@@ -17118,7 +17103,6 @@
     <w:p>
       <w:pPr>
         <w:spacing w:before="0" w:after="0" w:line="480" w:lineRule="auto"/>
-        <w:ind w:left="360"/>
         <w:jc w:val="both"/>
       </w:pPr>
       <w:r>
@@ -17133,7 +17117,6 @@
     <w:p>
       <w:pPr>
         <w:spacing w:before="0" w:after="0" w:line="480" w:lineRule="auto"/>
-        <w:ind w:left="360"/>
         <w:jc w:val="both"/>
       </w:pPr>
       <w:r>
@@ -17148,7 +17131,6 @@
     <w:p>
       <w:pPr>
         <w:spacing w:before="0" w:after="0" w:line="480" w:lineRule="auto"/>
-        <w:ind w:left="360"/>
         <w:jc w:val="both"/>
       </w:pPr>
       <w:r>
@@ -17163,7 +17145,6 @@
     <w:p>
       <w:pPr>
         <w:spacing w:before="0" w:after="0" w:line="480" w:lineRule="auto"/>
-        <w:ind w:left="360"/>
         <w:jc w:val="both"/>
       </w:pPr>
       <w:r>
@@ -17178,7 +17159,6 @@
     <w:p>
       <w:pPr>
         <w:spacing w:before="0" w:after="0" w:line="480" w:lineRule="auto"/>
-        <w:ind w:left="360"/>
         <w:jc w:val="both"/>
       </w:pPr>
       <w:r>
@@ -17193,7 +17173,6 @@
     <w:p>
       <w:pPr>
         <w:spacing w:before="0" w:after="0" w:line="480" w:lineRule="auto"/>
-        <w:ind w:left="360"/>
         <w:jc w:val="both"/>
       </w:pPr>
       <w:r>
@@ -19149,7 +19128,6 @@
     <w:p>
       <w:pPr>
         <w:spacing w:before="240" w:after="0" w:line="480" w:lineRule="auto"/>
-        <w:ind w:left="360"/>
         <w:jc w:val="both"/>
       </w:pPr>
       <w:r>
@@ -19164,7 +19142,6 @@
     <w:p>
       <w:pPr>
         <w:spacing w:before="0" w:after="0" w:line="480" w:lineRule="auto"/>
-        <w:ind w:left="360"/>
         <w:jc w:val="both"/>
       </w:pPr>
       <w:r>
@@ -19179,7 +19156,6 @@
     <w:p>
       <w:pPr>
         <w:spacing w:before="0" w:after="0" w:line="480" w:lineRule="auto"/>
-        <w:ind w:left="360"/>
         <w:jc w:val="both"/>
       </w:pPr>
       <w:r>
@@ -19194,7 +19170,6 @@
     <w:p>
       <w:pPr>
         <w:spacing w:before="0" w:after="0" w:line="480" w:lineRule="auto"/>
-        <w:ind w:left="360"/>
         <w:jc w:val="both"/>
       </w:pPr>
       <w:r>

</xml_diff>

<commit_message>
Draft_104: clean WORKING EXAMPLES; keep Combined Example on QR page
Remove bloated whitespace in WORKING EXAMPLES heading (line spacing
was already cleared; residual paste whitespace inflated the gap).
Pull Combined Example onto the Quick-Reference page. Keep Rejected
Candidates with coding-sheet bullets; Appendix B starts next page.
</commit_message>
<xml_diff>
--- a/thesis/003_ThesisProposal_Draft_104.docx
+++ b/thesis/003_ThesisProposal_Draft_104.docx
@@ -13025,6 +13025,7 @@
             <w:pPr>
               <w:spacing w:before="0" w:after="0" w:line="220" w:lineRule="auto"/>
               <w:jc w:val="both"/>
+              <w:keepNext w:val="1"/>
             </w:pPr>
             <w:r>
               <w:rPr>
@@ -13040,8 +13041,8 @@
     </w:tbl>
     <w:p>
       <w:pPr>
-        <w:keepNext/>
-        <w:spacing w:before="240" w:after="40" w:line="280" w:lineRule="auto"/>
+        <w:keepNext w:val="1"/>
+        <w:spacing w:before="120" w:after="40" w:line="280" w:lineRule="auto"/>
         <w:jc w:val="left"/>
       </w:pPr>
       <w:r>
@@ -13067,7 +13068,7 @@
     </w:p>
     <w:p>
       <w:pPr>
-        <w:keepNext/>
+        <w:keepNext w:val="1"/>
         <w:spacing w:before="0" w:after="40" w:line="280" w:lineRule="auto"/>
         <w:jc w:val="both"/>
       </w:pPr>
@@ -13305,6 +13306,7 @@
       <w:pPr>
         <w:spacing w:before="0" w:after="40" w:line="280" w:lineRule="auto"/>
         <w:jc w:val="both"/>
+        <w:keepNext w:val="1"/>
       </w:pPr>
       <w:r>
         <w:rPr>
@@ -13498,25 +13500,12 @@
       </w:pPr>
       <w:r>
         <w:rPr>
-          <w:rFonts w:ascii="Georgia" w:hAnsi="Georgia" w:cs="Georgia" w:eastAsia="Georgia"/>
+          <w:b/>
           <w:sz w:val="24"/>
           <w:szCs w:val="24"/>
-          <w:rtl w:val="0"/>
-          <w:b/>
-          <w:bCs w:val="0"/>
-        </w:rPr>
-        <w:t xml:space="preserve">
-        WORKING EXAMPLES: STEP 2 (WORKING TEST + READER TEST) AND STEP 3 TYPE
-    </w:t>
-      </w:r>
-      <w:r>
-        <w:rPr>
-          <w:rFonts w:ascii="Georgia" w:hAnsi="Georgia" w:cs="Georgia" w:eastAsia="Georgia"/>
-          <w:rtl w:val="0"/>
-          <w:b w:val="1"/>
-          <w:sz w:val="24"/>
-          <w:szCs w:val="24"/>
-        </w:rPr>
+          <w:rFonts w:ascii="Times New Roman" w:hAnsi="Times New Roman"/>
+        </w:rPr>
+        <w:t xml:space="preserve">WORKING EXAMPLES: STEP 2 (WORKING TEST + READER TEST) AND STEP 3 TYPE</w:t>
       </w:r>
     </w:p>
     <w:p>
@@ -19103,6 +19092,7 @@
               <w:spacing w:before="0" w:after="0" w:line="240" w:lineRule="auto"/>
               <w:jc w:val="left"/>
               <w:rPr/>
+              <w:keepNext w:val="1"/>
             </w:pPr>
             <w:r>
               <w:rPr>
@@ -19129,6 +19119,7 @@
       <w:pPr>
         <w:spacing w:before="240" w:after="0" w:line="480" w:lineRule="auto"/>
         <w:jc w:val="both"/>
+        <w:keepNext w:val="1"/>
       </w:pPr>
       <w:r>
         <w:rPr>
@@ -19143,6 +19134,7 @@
       <w:pPr>
         <w:spacing w:before="0" w:after="0" w:line="480" w:lineRule="auto"/>
         <w:jc w:val="both"/>
+        <w:keepNext w:val="1"/>
       </w:pPr>
       <w:r>
         <w:rPr>
@@ -19157,6 +19149,7 @@
       <w:pPr>
         <w:spacing w:before="0" w:after="0" w:line="480" w:lineRule="auto"/>
         <w:jc w:val="both"/>
+        <w:keepNext w:val="1"/>
       </w:pPr>
       <w:r>
         <w:rPr>
@@ -19171,6 +19164,7 @@
       <w:pPr>
         <w:spacing w:before="0" w:after="0" w:line="480" w:lineRule="auto"/>
         <w:jc w:val="both"/>
+        <w:keepNext w:val="1"/>
       </w:pPr>
       <w:r>
         <w:rPr>
@@ -19183,7 +19177,7 @@
     </w:p>
     <w:p>
       <w:pPr>
-        <w:pageBreakBefore/>
+        <w:pageBreakBefore w:val="1"/>
         <w:spacing w:before="120" w:after="0" w:line="456" w:lineRule="auto"/>
         <w:jc w:val="center"/>
         <w:rPr/>

</xml_diff>

<commit_message>
Draft_104: remove keepNext that orphaned coding-sheet bullets onto new page
</commit_message>
<xml_diff>
--- a/thesis/003_ThesisProposal_Draft_104.docx
+++ b/thesis/003_ThesisProposal_Draft_104.docx
@@ -19092,7 +19092,6 @@
               <w:spacing w:before="0" w:after="0" w:line="240" w:lineRule="auto"/>
               <w:jc w:val="left"/>
               <w:rPr/>
-              <w:keepNext w:val="1"/>
             </w:pPr>
             <w:r>
               <w:rPr>
@@ -19119,7 +19118,6 @@
       <w:pPr>
         <w:spacing w:before="240" w:after="0" w:line="480" w:lineRule="auto"/>
         <w:jc w:val="both"/>
-        <w:keepNext w:val="1"/>
       </w:pPr>
       <w:r>
         <w:rPr>
@@ -19134,7 +19132,6 @@
       <w:pPr>
         <w:spacing w:before="0" w:after="0" w:line="480" w:lineRule="auto"/>
         <w:jc w:val="both"/>
-        <w:keepNext w:val="1"/>
       </w:pPr>
       <w:r>
         <w:rPr>
@@ -19149,7 +19146,6 @@
       <w:pPr>
         <w:spacing w:before="0" w:after="0" w:line="480" w:lineRule="auto"/>
         <w:jc w:val="both"/>
-        <w:keepNext w:val="1"/>
       </w:pPr>
       <w:r>
         <w:rPr>
@@ -19164,7 +19160,6 @@
       <w:pPr>
         <w:spacing w:before="0" w:after="0" w:line="480" w:lineRule="auto"/>
         <w:jc w:val="both"/>
-        <w:keepNext w:val="1"/>
       </w:pPr>
       <w:r>
         <w:rPr>

</xml_diff>

<commit_message>
Draft_104: fit coding-sheet end bullets on prior page (no orphan page)
</commit_message>
<xml_diff>
--- a/thesis/003_ThesisProposal_Draft_104.docx
+++ b/thesis/003_ThesisProposal_Draft_104.docx
@@ -18898,225 +18898,33 @@
         </w:trPr>
         <w:tc>
           <w:tcPr/>
-          <w:p>
-            <w:pPr>
-              <w:spacing w:before="0" w:after="0" w:line="240" w:lineRule="auto"/>
-              <w:jc w:val="left"/>
-              <w:rPr/>
-            </w:pPr>
-            <w:r>
-              <w:rPr>
-                <w:rFonts w:ascii="Georgia" w:cs="Georgia" w:eastAsia="Georgia" w:hAnsi="Georgia"/>
-                <w:sz w:val="18"/>
-                <w:szCs w:val="18"/>
-                <w:rtl w:val="0"/>
-              </w:rPr>
-              <w:t xml:space="preserve"> </w:t>
-            </w:r>
-            <w:r>
-              <w:rPr>
-                <w:rtl w:val="0"/>
-                <w:sz w:val="18"/>
-                <w:szCs w:val="18"/>
-                <w:rFonts w:ascii="Georgia" w:hAnsi="Georgia" w:cs="Georgia" w:eastAsia="Georgia"/>
-              </w:rPr>
-            </w:r>
-          </w:p>
         </w:tc>
         <w:tc>
           <w:tcPr/>
-          <w:p>
-            <w:pPr>
-              <w:spacing w:before="0" w:after="0" w:line="240" w:lineRule="auto"/>
-              <w:jc w:val="left"/>
-              <w:rPr/>
-            </w:pPr>
-            <w:r>
-              <w:rPr>
-                <w:rFonts w:ascii="Georgia" w:cs="Georgia" w:eastAsia="Georgia" w:hAnsi="Georgia"/>
-                <w:sz w:val="18"/>
-                <w:szCs w:val="18"/>
-                <w:rtl w:val="0"/>
-              </w:rPr>
-              <w:t xml:space="preserve"> </w:t>
-            </w:r>
-            <w:r>
-              <w:rPr>
-                <w:rtl w:val="0"/>
-                <w:sz w:val="18"/>
-                <w:szCs w:val="18"/>
-                <w:rFonts w:ascii="Georgia" w:hAnsi="Georgia" w:cs="Georgia" w:eastAsia="Georgia"/>
-              </w:rPr>
-            </w:r>
-          </w:p>
         </w:tc>
         <w:tc>
           <w:tcPr/>
-          <w:p>
-            <w:pPr>
-              <w:spacing w:before="0" w:after="0" w:line="240" w:lineRule="auto"/>
-              <w:jc w:val="left"/>
-              <w:rPr/>
-            </w:pPr>
-            <w:r>
-              <w:rPr>
-                <w:rFonts w:ascii="Georgia" w:cs="Georgia" w:eastAsia="Georgia" w:hAnsi="Georgia"/>
-                <w:sz w:val="18"/>
-                <w:szCs w:val="18"/>
-                <w:rtl w:val="0"/>
-              </w:rPr>
-              <w:t xml:space="preserve"> </w:t>
-            </w:r>
-            <w:r>
-              <w:rPr>
-                <w:rtl w:val="0"/>
-                <w:sz w:val="18"/>
-                <w:szCs w:val="18"/>
-                <w:rFonts w:ascii="Georgia" w:hAnsi="Georgia" w:cs="Georgia" w:eastAsia="Georgia"/>
-              </w:rPr>
-            </w:r>
-          </w:p>
         </w:tc>
         <w:tc>
           <w:tcPr/>
-          <w:p>
-            <w:pPr>
-              <w:spacing w:before="0" w:after="0" w:line="240" w:lineRule="auto"/>
-              <w:jc w:val="left"/>
-              <w:rPr/>
-            </w:pPr>
-            <w:r>
-              <w:rPr>
-                <w:rFonts w:ascii="Georgia" w:cs="Georgia" w:eastAsia="Georgia" w:hAnsi="Georgia"/>
-                <w:sz w:val="18"/>
-                <w:szCs w:val="18"/>
-                <w:rtl w:val="0"/>
-              </w:rPr>
-              <w:t xml:space="preserve"> </w:t>
-            </w:r>
-            <w:r>
-              <w:rPr>
-                <w:rtl w:val="0"/>
-                <w:sz w:val="18"/>
-                <w:szCs w:val="18"/>
-                <w:rFonts w:ascii="Georgia" w:hAnsi="Georgia" w:cs="Georgia" w:eastAsia="Georgia"/>
-              </w:rPr>
-            </w:r>
-          </w:p>
         </w:tc>
         <w:tc>
           <w:tcPr/>
-          <w:p>
-            <w:pPr>
-              <w:spacing w:before="0" w:after="0" w:line="240" w:lineRule="auto"/>
-              <w:jc w:val="left"/>
-              <w:rPr/>
-            </w:pPr>
-            <w:r>
-              <w:rPr>
-                <w:rFonts w:ascii="Georgia" w:cs="Georgia" w:eastAsia="Georgia" w:hAnsi="Georgia"/>
-                <w:sz w:val="18"/>
-                <w:szCs w:val="18"/>
-                <w:rtl w:val="0"/>
-              </w:rPr>
-              <w:t xml:space="preserve"> </w:t>
-            </w:r>
-            <w:r>
-              <w:rPr>
-                <w:rtl w:val="0"/>
-                <w:sz w:val="18"/>
-                <w:szCs w:val="18"/>
-                <w:rFonts w:ascii="Georgia" w:hAnsi="Georgia" w:cs="Georgia" w:eastAsia="Georgia"/>
-              </w:rPr>
-            </w:r>
-          </w:p>
         </w:tc>
         <w:tc>
           <w:tcPr/>
-          <w:p>
-            <w:pPr>
-              <w:spacing w:before="0" w:after="0" w:line="240" w:lineRule="auto"/>
-              <w:jc w:val="left"/>
-              <w:rPr/>
-            </w:pPr>
-            <w:r>
-              <w:rPr>
-                <w:rFonts w:ascii="Georgia" w:cs="Georgia" w:eastAsia="Georgia" w:hAnsi="Georgia"/>
-                <w:sz w:val="18"/>
-                <w:szCs w:val="18"/>
-                <w:rtl w:val="0"/>
-              </w:rPr>
-              <w:t xml:space="preserve"> </w:t>
-            </w:r>
-            <w:r>
-              <w:rPr>
-                <w:rtl w:val="0"/>
-                <w:sz w:val="18"/>
-                <w:szCs w:val="18"/>
-                <w:rFonts w:ascii="Georgia" w:hAnsi="Georgia" w:cs="Georgia" w:eastAsia="Georgia"/>
-              </w:rPr>
-            </w:r>
-          </w:p>
         </w:tc>
         <w:tc>
           <w:tcPr/>
-          <w:p>
-            <w:pPr>
-              <w:spacing w:before="0" w:after="0" w:line="240" w:lineRule="auto"/>
-              <w:jc w:val="left"/>
-              <w:rPr/>
-            </w:pPr>
-            <w:r>
-              <w:rPr>
-                <w:rFonts w:ascii="Georgia" w:cs="Georgia" w:eastAsia="Georgia" w:hAnsi="Georgia"/>
-                <w:sz w:val="18"/>
-                <w:szCs w:val="18"/>
-                <w:rtl w:val="0"/>
-              </w:rPr>
-              <w:t xml:space="preserve"> </w:t>
-            </w:r>
-            <w:r>
-              <w:rPr>
-                <w:rtl w:val="0"/>
-                <w:sz w:val="18"/>
-                <w:szCs w:val="18"/>
-                <w:rFonts w:ascii="Georgia" w:hAnsi="Georgia" w:cs="Georgia" w:eastAsia="Georgia"/>
-              </w:rPr>
-            </w:r>
-          </w:p>
         </w:tc>
         <w:tc>
           <w:tcPr/>
-          <w:p>
-            <w:pPr>
-              <w:spacing w:before="0" w:after="0" w:line="240" w:lineRule="auto"/>
-              <w:jc w:val="left"/>
-              <w:rPr/>
-            </w:pPr>
-            <w:r>
-              <w:rPr>
-                <w:rFonts w:ascii="Georgia" w:cs="Georgia" w:eastAsia="Georgia" w:hAnsi="Georgia"/>
-                <w:sz w:val="18"/>
-                <w:szCs w:val="18"/>
-                <w:rtl w:val="0"/>
-              </w:rPr>
-              <w:t xml:space="preserve"> </w:t>
-            </w:r>
-            <w:r>
-              <w:rPr>
-                <w:rtl w:val="0"/>
-                <w:sz w:val="18"/>
-                <w:szCs w:val="18"/>
-                <w:rFonts w:ascii="Georgia" w:hAnsi="Georgia" w:cs="Georgia" w:eastAsia="Georgia"/>
-              </w:rPr>
-            </w:r>
-          </w:p>
         </w:tc>
       </w:tr>
     </w:tbl>
     <w:p>
       <w:pPr>
-        <w:spacing w:before="240" w:after="0" w:line="480" w:lineRule="auto"/>
+        <w:spacing w:before="0" w:after="0" w:line="280" w:lineRule="auto"/>
         <w:jc w:val="both"/>
       </w:pPr>
       <w:r>
@@ -19130,7 +18938,7 @@
     </w:p>
     <w:p>
       <w:pPr>
-        <w:spacing w:before="0" w:after="0" w:line="480" w:lineRule="auto"/>
+        <w:spacing w:before="0" w:after="0" w:line="280" w:lineRule="auto"/>
         <w:jc w:val="both"/>
       </w:pPr>
       <w:r>
@@ -19144,7 +18952,7 @@
     </w:p>
     <w:p>
       <w:pPr>
-        <w:spacing w:before="0" w:after="0" w:line="480" w:lineRule="auto"/>
+        <w:spacing w:before="0" w:after="0" w:line="280" w:lineRule="auto"/>
         <w:jc w:val="both"/>
       </w:pPr>
       <w:r>
@@ -19158,7 +18966,7 @@
     </w:p>
     <w:p>
       <w:pPr>
-        <w:spacing w:before="0" w:after="0" w:line="480" w:lineRule="auto"/>
+        <w:spacing w:before="0" w:after="0" w:line="280" w:lineRule="auto"/>
         <w:jc w:val="both"/>
       </w:pPr>
       <w:r>

</xml_diff>

<commit_message>
Draft_104: restore coding-sheet column tables corrupted by empty-para cleanup
</commit_message>
<xml_diff>
--- a/thesis/003_ThesisProposal_Draft_104.docx
+++ b/thesis/003_ThesisProposal_Draft_104.docx
@@ -17798,7 +17798,7 @@
           </w:tcPr>
           <w:p>
             <w:pPr>
-              <w:spacing w:before="0" w:after="0" w:line="240" w:lineRule="auto"/>
+              <w:spacing w:before="0" w:after="0" w:line="260" w:lineRule="auto"/>
               <w:jc w:val="both"/>
               <w:rPr/>
             </w:pPr>
@@ -17818,7 +17818,7 @@
                 <w:rtl w:val="0"/>
                 <w:sz w:val="18"/>
                 <w:szCs w:val="18"/>
-                <w:rFonts w:ascii="Georgia" w:hAnsi="Georgia" w:cs="Georgia" w:eastAsia="Georgia"/>
+                <w:rFonts w:ascii="Georgia" w:hAnsi="Georgia"/>
               </w:rPr>
             </w:r>
           </w:p>
@@ -17832,7 +17832,7 @@
           </w:tcPr>
           <w:p>
             <w:pPr>
-              <w:spacing w:before="0" w:after="0" w:line="240" w:lineRule="auto"/>
+              <w:spacing w:before="0" w:after="0" w:line="260" w:lineRule="auto"/>
               <w:jc w:val="both"/>
               <w:rPr/>
             </w:pPr>
@@ -17852,7 +17852,7 @@
                 <w:rtl w:val="0"/>
                 <w:sz w:val="18"/>
                 <w:szCs w:val="18"/>
-                <w:rFonts w:ascii="Georgia" w:hAnsi="Georgia" w:cs="Georgia" w:eastAsia="Georgia"/>
+                <w:rFonts w:ascii="Georgia" w:hAnsi="Georgia"/>
               </w:rPr>
             </w:r>
           </w:p>
@@ -17866,7 +17866,7 @@
           </w:tcPr>
           <w:p>
             <w:pPr>
-              <w:spacing w:before="0" w:after="0" w:line="240" w:lineRule="auto"/>
+              <w:spacing w:before="0" w:after="0" w:line="260" w:lineRule="auto"/>
               <w:jc w:val="both"/>
               <w:rPr/>
             </w:pPr>
@@ -17886,7 +17886,7 @@
                 <w:rtl w:val="0"/>
                 <w:sz w:val="18"/>
                 <w:szCs w:val="18"/>
-                <w:rFonts w:ascii="Georgia" w:hAnsi="Georgia" w:cs="Georgia" w:eastAsia="Georgia"/>
+                <w:rFonts w:ascii="Georgia" w:hAnsi="Georgia"/>
               </w:rPr>
             </w:r>
           </w:p>
@@ -17900,7 +17900,7 @@
           </w:tcPr>
           <w:p>
             <w:pPr>
-              <w:spacing w:before="0" w:after="0" w:line="240" w:lineRule="auto"/>
+              <w:spacing w:before="0" w:after="0" w:line="260" w:lineRule="auto"/>
               <w:jc w:val="both"/>
               <w:rPr/>
             </w:pPr>
@@ -17920,7 +17920,7 @@
                 <w:rtl w:val="0"/>
                 <w:sz w:val="18"/>
                 <w:szCs w:val="18"/>
-                <w:rFonts w:ascii="Georgia" w:hAnsi="Georgia" w:cs="Georgia" w:eastAsia="Georgia"/>
+                <w:rFonts w:ascii="Georgia" w:hAnsi="Georgia"/>
               </w:rPr>
             </w:r>
           </w:p>
@@ -17934,7 +17934,7 @@
           </w:tcPr>
           <w:p>
             <w:pPr>
-              <w:spacing w:before="0" w:after="0" w:line="240" w:lineRule="auto"/>
+              <w:spacing w:before="0" w:after="0" w:line="260" w:lineRule="auto"/>
               <w:jc w:val="both"/>
               <w:rPr/>
             </w:pPr>
@@ -17954,7 +17954,7 @@
                 <w:rtl w:val="0"/>
                 <w:sz w:val="18"/>
                 <w:szCs w:val="18"/>
-                <w:rFonts w:ascii="Georgia" w:hAnsi="Georgia" w:cs="Georgia" w:eastAsia="Georgia"/>
+                <w:rFonts w:ascii="Georgia" w:hAnsi="Georgia"/>
               </w:rPr>
             </w:r>
           </w:p>
@@ -17968,7 +17968,7 @@
           </w:tcPr>
           <w:p>
             <w:pPr>
-              <w:spacing w:before="0" w:after="0" w:line="240" w:lineRule="auto"/>
+              <w:spacing w:before="0" w:after="0" w:line="260" w:lineRule="auto"/>
               <w:jc w:val="both"/>
               <w:rPr/>
             </w:pPr>
@@ -17988,7 +17988,7 @@
                 <w:rtl w:val="0"/>
                 <w:sz w:val="18"/>
                 <w:szCs w:val="18"/>
-                <w:rFonts w:ascii="Georgia" w:hAnsi="Georgia" w:cs="Georgia" w:eastAsia="Georgia"/>
+                <w:rFonts w:ascii="Georgia" w:hAnsi="Georgia"/>
               </w:rPr>
             </w:r>
           </w:p>
@@ -18002,7 +18002,7 @@
           <w:tcPr/>
           <w:p>
             <w:pPr>
-              <w:spacing w:before="0" w:after="0" w:line="240" w:lineRule="auto"/>
+              <w:spacing w:before="0" w:after="0" w:line="260" w:lineRule="auto"/>
               <w:jc w:val="left"/>
               <w:rPr/>
             </w:pPr>
@@ -18020,7 +18020,7 @@
                 <w:rtl w:val="0"/>
                 <w:sz w:val="18"/>
                 <w:szCs w:val="18"/>
-                <w:rFonts w:ascii="Georgia" w:hAnsi="Georgia" w:cs="Georgia" w:eastAsia="Georgia"/>
+                <w:rFonts w:ascii="Georgia" w:hAnsi="Georgia"/>
               </w:rPr>
             </w:r>
           </w:p>
@@ -18029,7 +18029,7 @@
           <w:tcPr/>
           <w:p>
             <w:pPr>
-              <w:spacing w:before="0" w:after="0" w:line="240" w:lineRule="auto"/>
+              <w:spacing w:before="0" w:after="0" w:line="260" w:lineRule="auto"/>
               <w:jc w:val="left"/>
               <w:rPr/>
             </w:pPr>
@@ -18047,7 +18047,7 @@
                 <w:rtl w:val="0"/>
                 <w:sz w:val="18"/>
                 <w:szCs w:val="18"/>
-                <w:rFonts w:ascii="Georgia" w:hAnsi="Georgia" w:cs="Georgia" w:eastAsia="Georgia"/>
+                <w:rFonts w:ascii="Georgia" w:hAnsi="Georgia"/>
               </w:rPr>
             </w:r>
           </w:p>
@@ -18056,7 +18056,7 @@
           <w:tcPr/>
           <w:p>
             <w:pPr>
-              <w:spacing w:before="0" w:after="0" w:line="240" w:lineRule="auto"/>
+              <w:spacing w:before="0" w:after="0" w:line="260" w:lineRule="auto"/>
               <w:jc w:val="left"/>
               <w:rPr/>
             </w:pPr>
@@ -18074,7 +18074,7 @@
                 <w:rtl w:val="0"/>
                 <w:sz w:val="18"/>
                 <w:szCs w:val="18"/>
-                <w:rFonts w:ascii="Georgia" w:hAnsi="Georgia" w:cs="Georgia" w:eastAsia="Georgia"/>
+                <w:rFonts w:ascii="Georgia" w:hAnsi="Georgia"/>
               </w:rPr>
             </w:r>
           </w:p>
@@ -18083,7 +18083,7 @@
           <w:tcPr/>
           <w:p>
             <w:pPr>
-              <w:spacing w:before="0" w:after="0" w:line="240" w:lineRule="auto"/>
+              <w:spacing w:before="0" w:after="0" w:line="260" w:lineRule="auto"/>
               <w:jc w:val="left"/>
               <w:rPr/>
             </w:pPr>
@@ -18101,7 +18101,7 @@
                 <w:rtl w:val="0"/>
                 <w:sz w:val="18"/>
                 <w:szCs w:val="18"/>
-                <w:rFonts w:ascii="Georgia" w:hAnsi="Georgia" w:cs="Georgia" w:eastAsia="Georgia"/>
+                <w:rFonts w:ascii="Georgia" w:hAnsi="Georgia"/>
               </w:rPr>
             </w:r>
           </w:p>
@@ -18110,7 +18110,7 @@
           <w:tcPr/>
           <w:p>
             <w:pPr>
-              <w:spacing w:before="0" w:after="0" w:line="240" w:lineRule="auto"/>
+              <w:spacing w:before="0" w:after="0" w:line="260" w:lineRule="auto"/>
               <w:jc w:val="left"/>
               <w:rPr/>
             </w:pPr>
@@ -18128,7 +18128,7 @@
                 <w:rtl w:val="0"/>
                 <w:sz w:val="18"/>
                 <w:szCs w:val="18"/>
-                <w:rFonts w:ascii="Georgia" w:hAnsi="Georgia" w:cs="Georgia" w:eastAsia="Georgia"/>
+                <w:rFonts w:ascii="Georgia" w:hAnsi="Georgia"/>
               </w:rPr>
             </w:r>
           </w:p>
@@ -18137,7 +18137,7 @@
           <w:tcPr/>
           <w:p>
             <w:pPr>
-              <w:spacing w:before="0" w:after="0" w:line="240" w:lineRule="auto"/>
+              <w:spacing w:before="0" w:after="0" w:line="260" w:lineRule="auto"/>
               <w:jc w:val="left"/>
               <w:rPr/>
             </w:pPr>
@@ -18155,7 +18155,7 @@
                 <w:rtl w:val="0"/>
                 <w:sz w:val="18"/>
                 <w:szCs w:val="18"/>
-                <w:rFonts w:ascii="Georgia" w:hAnsi="Georgia" w:cs="Georgia" w:eastAsia="Georgia"/>
+                <w:rFonts w:ascii="Georgia" w:hAnsi="Georgia"/>
               </w:rPr>
             </w:r>
           </w:p>
@@ -18211,7 +18211,7 @@
           </w:tcPr>
           <w:p>
             <w:pPr>
-              <w:spacing w:before="0" w:after="0" w:line="240" w:lineRule="auto"/>
+              <w:spacing w:before="0" w:after="0" w:line="260" w:lineRule="auto"/>
               <w:jc w:val="both"/>
               <w:rPr/>
             </w:pPr>
@@ -18231,7 +18231,7 @@
                 <w:rtl w:val="0"/>
                 <w:sz w:val="18"/>
                 <w:szCs w:val="18"/>
-                <w:rFonts w:ascii="Georgia" w:hAnsi="Georgia" w:cs="Georgia" w:eastAsia="Georgia"/>
+                <w:rFonts w:ascii="Georgia" w:hAnsi="Georgia"/>
               </w:rPr>
             </w:r>
           </w:p>
@@ -18245,7 +18245,7 @@
           </w:tcPr>
           <w:p>
             <w:pPr>
-              <w:spacing w:before="0" w:after="0" w:line="240" w:lineRule="auto"/>
+              <w:spacing w:before="0" w:after="0" w:line="260" w:lineRule="auto"/>
               <w:jc w:val="both"/>
               <w:rPr/>
             </w:pPr>
@@ -18265,7 +18265,7 @@
                 <w:rtl w:val="0"/>
                 <w:sz w:val="18"/>
                 <w:szCs w:val="18"/>
-                <w:rFonts w:ascii="Georgia" w:hAnsi="Georgia" w:cs="Georgia" w:eastAsia="Georgia"/>
+                <w:rFonts w:ascii="Georgia" w:hAnsi="Georgia"/>
               </w:rPr>
             </w:r>
           </w:p>
@@ -18279,7 +18279,7 @@
           </w:tcPr>
           <w:p>
             <w:pPr>
-              <w:spacing w:before="0" w:after="0" w:line="240" w:lineRule="auto"/>
+              <w:spacing w:before="0" w:after="0" w:line="260" w:lineRule="auto"/>
               <w:jc w:val="both"/>
               <w:rPr/>
             </w:pPr>
@@ -18299,7 +18299,7 @@
                 <w:rtl w:val="0"/>
                 <w:sz w:val="18"/>
                 <w:szCs w:val="18"/>
-                <w:rFonts w:ascii="Georgia" w:hAnsi="Georgia" w:cs="Georgia" w:eastAsia="Georgia"/>
+                <w:rFonts w:ascii="Georgia" w:hAnsi="Georgia"/>
               </w:rPr>
             </w:r>
           </w:p>
@@ -18313,7 +18313,7 @@
           </w:tcPr>
           <w:p>
             <w:pPr>
-              <w:spacing w:before="0" w:after="0" w:line="240" w:lineRule="auto"/>
+              <w:spacing w:before="0" w:after="0" w:line="260" w:lineRule="auto"/>
               <w:jc w:val="both"/>
               <w:rPr/>
             </w:pPr>
@@ -18333,7 +18333,7 @@
                 <w:rtl w:val="0"/>
                 <w:sz w:val="18"/>
                 <w:szCs w:val="18"/>
-                <w:rFonts w:ascii="Georgia" w:hAnsi="Georgia" w:cs="Georgia" w:eastAsia="Georgia"/>
+                <w:rFonts w:ascii="Georgia" w:hAnsi="Georgia"/>
               </w:rPr>
             </w:r>
           </w:p>
@@ -18347,7 +18347,7 @@
           </w:tcPr>
           <w:p>
             <w:pPr>
-              <w:spacing w:before="0" w:after="0" w:line="240" w:lineRule="auto"/>
+              <w:spacing w:before="0" w:after="0" w:line="260" w:lineRule="auto"/>
               <w:jc w:val="both"/>
               <w:rPr/>
             </w:pPr>
@@ -18367,7 +18367,7 @@
                 <w:rtl w:val="0"/>
                 <w:sz w:val="18"/>
                 <w:szCs w:val="18"/>
-                <w:rFonts w:ascii="Georgia" w:hAnsi="Georgia" w:cs="Georgia" w:eastAsia="Georgia"/>
+                <w:rFonts w:ascii="Georgia" w:hAnsi="Georgia"/>
               </w:rPr>
             </w:r>
           </w:p>
@@ -18381,7 +18381,7 @@
           </w:tcPr>
           <w:p>
             <w:pPr>
-              <w:spacing w:before="0" w:after="0" w:line="240" w:lineRule="auto"/>
+              <w:spacing w:before="0" w:after="0" w:line="260" w:lineRule="auto"/>
               <w:jc w:val="both"/>
               <w:rPr/>
             </w:pPr>
@@ -18401,7 +18401,7 @@
                 <w:rtl w:val="0"/>
                 <w:sz w:val="18"/>
                 <w:szCs w:val="18"/>
-                <w:rFonts w:ascii="Georgia" w:hAnsi="Georgia" w:cs="Georgia" w:eastAsia="Georgia"/>
+                <w:rFonts w:ascii="Georgia" w:hAnsi="Georgia"/>
               </w:rPr>
             </w:r>
           </w:p>
@@ -18415,7 +18415,7 @@
           <w:tcPr/>
           <w:p>
             <w:pPr>
-              <w:spacing w:before="0" w:after="0" w:line="240" w:lineRule="auto"/>
+              <w:spacing w:before="0" w:after="0" w:line="260" w:lineRule="auto"/>
               <w:jc w:val="left"/>
               <w:rPr/>
             </w:pPr>
@@ -18433,7 +18433,7 @@
                 <w:rtl w:val="0"/>
                 <w:sz w:val="18"/>
                 <w:szCs w:val="18"/>
-                <w:rFonts w:ascii="Georgia" w:hAnsi="Georgia" w:cs="Georgia" w:eastAsia="Georgia"/>
+                <w:rFonts w:ascii="Georgia" w:hAnsi="Georgia"/>
               </w:rPr>
             </w:r>
           </w:p>
@@ -18442,7 +18442,7 @@
           <w:tcPr/>
           <w:p>
             <w:pPr>
-              <w:spacing w:before="0" w:after="0" w:line="240" w:lineRule="auto"/>
+              <w:spacing w:before="0" w:after="0" w:line="260" w:lineRule="auto"/>
               <w:jc w:val="left"/>
               <w:rPr/>
             </w:pPr>
@@ -18460,7 +18460,7 @@
                 <w:rtl w:val="0"/>
                 <w:sz w:val="18"/>
                 <w:szCs w:val="18"/>
-                <w:rFonts w:ascii="Georgia" w:hAnsi="Georgia" w:cs="Georgia" w:eastAsia="Georgia"/>
+                <w:rFonts w:ascii="Georgia" w:hAnsi="Georgia"/>
               </w:rPr>
             </w:r>
           </w:p>
@@ -18469,7 +18469,7 @@
           <w:tcPr/>
           <w:p>
             <w:pPr>
-              <w:spacing w:before="0" w:after="0" w:line="240" w:lineRule="auto"/>
+              <w:spacing w:before="0" w:after="0" w:line="260" w:lineRule="auto"/>
               <w:jc w:val="left"/>
               <w:rPr/>
             </w:pPr>
@@ -18487,7 +18487,7 @@
                 <w:rtl w:val="0"/>
                 <w:sz w:val="18"/>
                 <w:szCs w:val="18"/>
-                <w:rFonts w:ascii="Georgia" w:hAnsi="Georgia" w:cs="Georgia" w:eastAsia="Georgia"/>
+                <w:rFonts w:ascii="Georgia" w:hAnsi="Georgia"/>
               </w:rPr>
             </w:r>
           </w:p>
@@ -18496,7 +18496,7 @@
           <w:tcPr/>
           <w:p>
             <w:pPr>
-              <w:spacing w:before="0" w:after="0" w:line="240" w:lineRule="auto"/>
+              <w:spacing w:before="0" w:after="0" w:line="260" w:lineRule="auto"/>
               <w:jc w:val="left"/>
               <w:rPr/>
             </w:pPr>
@@ -18514,7 +18514,7 @@
                 <w:rtl w:val="0"/>
                 <w:sz w:val="18"/>
                 <w:szCs w:val="18"/>
-                <w:rFonts w:ascii="Georgia" w:hAnsi="Georgia" w:cs="Georgia" w:eastAsia="Georgia"/>
+                <w:rFonts w:ascii="Georgia" w:hAnsi="Georgia"/>
               </w:rPr>
             </w:r>
           </w:p>
@@ -18523,7 +18523,7 @@
           <w:tcPr/>
           <w:p>
             <w:pPr>
-              <w:spacing w:before="0" w:after="0" w:line="240" w:lineRule="auto"/>
+              <w:spacing w:before="0" w:after="0" w:line="260" w:lineRule="auto"/>
               <w:jc w:val="left"/>
               <w:rPr/>
             </w:pPr>
@@ -18541,7 +18541,7 @@
                 <w:rtl w:val="0"/>
                 <w:sz w:val="18"/>
                 <w:szCs w:val="18"/>
-                <w:rFonts w:ascii="Georgia" w:hAnsi="Georgia" w:cs="Georgia" w:eastAsia="Georgia"/>
+                <w:rFonts w:ascii="Georgia" w:hAnsi="Georgia"/>
               </w:rPr>
             </w:r>
           </w:p>
@@ -18550,7 +18550,7 @@
           <w:tcPr/>
           <w:p>
             <w:pPr>
-              <w:spacing w:before="0" w:after="0" w:line="240" w:lineRule="auto"/>
+              <w:spacing w:before="0" w:after="0" w:line="260" w:lineRule="auto"/>
               <w:jc w:val="left"/>
               <w:rPr/>
             </w:pPr>
@@ -18568,7 +18568,7 @@
                 <w:rtl w:val="0"/>
                 <w:sz w:val="18"/>
                 <w:szCs w:val="18"/>
-                <w:rFonts w:ascii="Georgia" w:hAnsi="Georgia" w:cs="Georgia" w:eastAsia="Georgia"/>
+                <w:rFonts w:ascii="Georgia" w:hAnsi="Georgia"/>
               </w:rPr>
             </w:r>
           </w:p>
@@ -18628,7 +18628,7 @@
           </w:tcPr>
           <w:p>
             <w:pPr>
-              <w:spacing w:before="0" w:after="0" w:line="240" w:lineRule="auto"/>
+              <w:spacing w:before="0" w:after="0" w:line="260" w:lineRule="auto"/>
               <w:jc w:val="both"/>
               <w:rPr/>
             </w:pPr>
@@ -18648,7 +18648,7 @@
                 <w:rtl w:val="0"/>
                 <w:sz w:val="18"/>
                 <w:szCs w:val="18"/>
-                <w:rFonts w:ascii="Georgia" w:hAnsi="Georgia" w:cs="Georgia" w:eastAsia="Georgia"/>
+                <w:rFonts w:ascii="Georgia" w:hAnsi="Georgia"/>
               </w:rPr>
             </w:r>
           </w:p>
@@ -18662,7 +18662,7 @@
           </w:tcPr>
           <w:p>
             <w:pPr>
-              <w:spacing w:before="0" w:after="0" w:line="240" w:lineRule="auto"/>
+              <w:spacing w:before="0" w:after="0" w:line="260" w:lineRule="auto"/>
               <w:jc w:val="both"/>
               <w:rPr/>
             </w:pPr>
@@ -18682,7 +18682,7 @@
                 <w:rtl w:val="0"/>
                 <w:sz w:val="18"/>
                 <w:szCs w:val="18"/>
-                <w:rFonts w:ascii="Georgia" w:hAnsi="Georgia" w:cs="Georgia" w:eastAsia="Georgia"/>
+                <w:rFonts w:ascii="Georgia" w:hAnsi="Georgia"/>
               </w:rPr>
             </w:r>
           </w:p>
@@ -18696,7 +18696,7 @@
           </w:tcPr>
           <w:p>
             <w:pPr>
-              <w:spacing w:before="0" w:after="0" w:line="240" w:lineRule="auto"/>
+              <w:spacing w:before="0" w:after="0" w:line="260" w:lineRule="auto"/>
               <w:jc w:val="both"/>
               <w:rPr/>
             </w:pPr>
@@ -18716,7 +18716,7 @@
                 <w:rtl w:val="0"/>
                 <w:sz w:val="18"/>
                 <w:szCs w:val="18"/>
-                <w:rFonts w:ascii="Georgia" w:hAnsi="Georgia" w:cs="Georgia" w:eastAsia="Georgia"/>
+                <w:rFonts w:ascii="Georgia" w:hAnsi="Georgia"/>
               </w:rPr>
             </w:r>
           </w:p>
@@ -18730,7 +18730,7 @@
           </w:tcPr>
           <w:p>
             <w:pPr>
-              <w:spacing w:before="0" w:after="0" w:line="240" w:lineRule="auto"/>
+              <w:spacing w:before="0" w:after="0" w:line="260" w:lineRule="auto"/>
               <w:jc w:val="both"/>
               <w:rPr/>
             </w:pPr>
@@ -18750,7 +18750,7 @@
                 <w:rtl w:val="0"/>
                 <w:sz w:val="18"/>
                 <w:szCs w:val="18"/>
-                <w:rFonts w:ascii="Georgia" w:hAnsi="Georgia" w:cs="Georgia" w:eastAsia="Georgia"/>
+                <w:rFonts w:ascii="Georgia" w:hAnsi="Georgia"/>
               </w:rPr>
             </w:r>
           </w:p>
@@ -18764,7 +18764,7 @@
           </w:tcPr>
           <w:p>
             <w:pPr>
-              <w:spacing w:before="0" w:after="0" w:line="240" w:lineRule="auto"/>
+              <w:spacing w:before="0" w:after="0" w:line="260" w:lineRule="auto"/>
               <w:jc w:val="both"/>
               <w:rPr/>
             </w:pPr>
@@ -18784,7 +18784,7 @@
                 <w:rtl w:val="0"/>
                 <w:sz w:val="18"/>
                 <w:szCs w:val="18"/>
-                <w:rFonts w:ascii="Georgia" w:hAnsi="Georgia" w:cs="Georgia" w:eastAsia="Georgia"/>
+                <w:rFonts w:ascii="Georgia" w:hAnsi="Georgia"/>
               </w:rPr>
             </w:r>
           </w:p>
@@ -18798,7 +18798,7 @@
           </w:tcPr>
           <w:p>
             <w:pPr>
-              <w:spacing w:before="0" w:after="0" w:line="240" w:lineRule="auto"/>
+              <w:spacing w:before="0" w:after="0" w:line="260" w:lineRule="auto"/>
               <w:jc w:val="both"/>
               <w:rPr/>
             </w:pPr>
@@ -18818,7 +18818,7 @@
                 <w:rtl w:val="0"/>
                 <w:sz w:val="18"/>
                 <w:szCs w:val="18"/>
-                <w:rFonts w:ascii="Georgia" w:hAnsi="Georgia" w:cs="Georgia" w:eastAsia="Georgia"/>
+                <w:rFonts w:ascii="Georgia" w:hAnsi="Georgia"/>
               </w:rPr>
             </w:r>
           </w:p>
@@ -18832,7 +18832,7 @@
           </w:tcPr>
           <w:p>
             <w:pPr>
-              <w:spacing w:before="0" w:after="0" w:line="240" w:lineRule="auto"/>
+              <w:spacing w:before="0" w:after="0" w:line="260" w:lineRule="auto"/>
               <w:jc w:val="both"/>
               <w:rPr/>
             </w:pPr>
@@ -18852,7 +18852,7 @@
                 <w:rtl w:val="0"/>
                 <w:sz w:val="18"/>
                 <w:szCs w:val="18"/>
-                <w:rFonts w:ascii="Georgia" w:hAnsi="Georgia" w:cs="Georgia" w:eastAsia="Georgia"/>
+                <w:rFonts w:ascii="Georgia" w:hAnsi="Georgia"/>
               </w:rPr>
             </w:r>
           </w:p>
@@ -18866,7 +18866,7 @@
           </w:tcPr>
           <w:p>
             <w:pPr>
-              <w:spacing w:before="0" w:after="0" w:line="240" w:lineRule="auto"/>
+              <w:spacing w:before="0" w:after="0" w:line="260" w:lineRule="auto"/>
               <w:jc w:val="both"/>
               <w:rPr/>
             </w:pPr>
@@ -18886,7 +18886,7 @@
                 <w:rtl w:val="0"/>
                 <w:sz w:val="18"/>
                 <w:szCs w:val="18"/>
-                <w:rFonts w:ascii="Georgia" w:hAnsi="Georgia" w:cs="Georgia" w:eastAsia="Georgia"/>
+                <w:rFonts w:ascii="Georgia" w:hAnsi="Georgia"/>
               </w:rPr>
             </w:r>
           </w:p>
@@ -18898,27 +18898,219 @@
         </w:trPr>
         <w:tc>
           <w:tcPr/>
+          <w:p>
+            <w:pPr>
+              <w:spacing w:before="0" w:after="0" w:line="260" w:lineRule="auto"/>
+              <w:jc w:val="left"/>
+              <w:rPr/>
+            </w:pPr>
+            <w:r>
+              <w:rPr>
+                <w:rFonts w:ascii="Georgia" w:cs="Georgia" w:eastAsia="Georgia" w:hAnsi="Georgia"/>
+                <w:sz w:val="18"/>
+                <w:szCs w:val="18"/>
+                <w:rtl w:val="0"/>
+              </w:rPr>
+              <w:t xml:space="preserve"> </w:t>
+            </w:r>
+            <w:r>
+              <w:rPr>
+                <w:rtl w:val="0"/>
+                <w:sz w:val="18"/>
+                <w:szCs w:val="18"/>
+                <w:rFonts w:ascii="Georgia" w:hAnsi="Georgia"/>
+              </w:rPr>
+            </w:r>
+          </w:p>
         </w:tc>
         <w:tc>
           <w:tcPr/>
+          <w:p>
+            <w:pPr>
+              <w:spacing w:before="0" w:after="0" w:line="260" w:lineRule="auto"/>
+              <w:jc w:val="left"/>
+              <w:rPr/>
+            </w:pPr>
+            <w:r>
+              <w:rPr>
+                <w:rFonts w:ascii="Georgia" w:cs="Georgia" w:eastAsia="Georgia" w:hAnsi="Georgia"/>
+                <w:sz w:val="18"/>
+                <w:szCs w:val="18"/>
+                <w:rtl w:val="0"/>
+              </w:rPr>
+              <w:t xml:space="preserve"> </w:t>
+            </w:r>
+            <w:r>
+              <w:rPr>
+                <w:rtl w:val="0"/>
+                <w:sz w:val="18"/>
+                <w:szCs w:val="18"/>
+                <w:rFonts w:ascii="Georgia" w:hAnsi="Georgia"/>
+              </w:rPr>
+            </w:r>
+          </w:p>
         </w:tc>
         <w:tc>
           <w:tcPr/>
+          <w:p>
+            <w:pPr>
+              <w:spacing w:before="0" w:after="0" w:line="260" w:lineRule="auto"/>
+              <w:jc w:val="left"/>
+              <w:rPr/>
+            </w:pPr>
+            <w:r>
+              <w:rPr>
+                <w:rFonts w:ascii="Georgia" w:cs="Georgia" w:eastAsia="Georgia" w:hAnsi="Georgia"/>
+                <w:sz w:val="18"/>
+                <w:szCs w:val="18"/>
+                <w:rtl w:val="0"/>
+              </w:rPr>
+              <w:t xml:space="preserve"> </w:t>
+            </w:r>
+            <w:r>
+              <w:rPr>
+                <w:rtl w:val="0"/>
+                <w:sz w:val="18"/>
+                <w:szCs w:val="18"/>
+                <w:rFonts w:ascii="Georgia" w:hAnsi="Georgia"/>
+              </w:rPr>
+            </w:r>
+          </w:p>
         </w:tc>
         <w:tc>
           <w:tcPr/>
+          <w:p>
+            <w:pPr>
+              <w:spacing w:before="0" w:after="0" w:line="260" w:lineRule="auto"/>
+              <w:jc w:val="left"/>
+              <w:rPr/>
+            </w:pPr>
+            <w:r>
+              <w:rPr>
+                <w:rFonts w:ascii="Georgia" w:cs="Georgia" w:eastAsia="Georgia" w:hAnsi="Georgia"/>
+                <w:sz w:val="18"/>
+                <w:szCs w:val="18"/>
+                <w:rtl w:val="0"/>
+              </w:rPr>
+              <w:t xml:space="preserve"> </w:t>
+            </w:r>
+            <w:r>
+              <w:rPr>
+                <w:rtl w:val="0"/>
+                <w:sz w:val="18"/>
+                <w:szCs w:val="18"/>
+                <w:rFonts w:ascii="Georgia" w:hAnsi="Georgia"/>
+              </w:rPr>
+            </w:r>
+          </w:p>
         </w:tc>
         <w:tc>
           <w:tcPr/>
+          <w:p>
+            <w:pPr>
+              <w:spacing w:before="0" w:after="0" w:line="260" w:lineRule="auto"/>
+              <w:jc w:val="left"/>
+              <w:rPr/>
+            </w:pPr>
+            <w:r>
+              <w:rPr>
+                <w:rFonts w:ascii="Georgia" w:cs="Georgia" w:eastAsia="Georgia" w:hAnsi="Georgia"/>
+                <w:sz w:val="18"/>
+                <w:szCs w:val="18"/>
+                <w:rtl w:val="0"/>
+              </w:rPr>
+              <w:t xml:space="preserve"> </w:t>
+            </w:r>
+            <w:r>
+              <w:rPr>
+                <w:rtl w:val="0"/>
+                <w:sz w:val="18"/>
+                <w:szCs w:val="18"/>
+                <w:rFonts w:ascii="Georgia" w:hAnsi="Georgia"/>
+              </w:rPr>
+            </w:r>
+          </w:p>
         </w:tc>
         <w:tc>
           <w:tcPr/>
+          <w:p>
+            <w:pPr>
+              <w:spacing w:before="0" w:after="0" w:line="260" w:lineRule="auto"/>
+              <w:jc w:val="left"/>
+              <w:rPr/>
+            </w:pPr>
+            <w:r>
+              <w:rPr>
+                <w:rFonts w:ascii="Georgia" w:cs="Georgia" w:eastAsia="Georgia" w:hAnsi="Georgia"/>
+                <w:sz w:val="18"/>
+                <w:szCs w:val="18"/>
+                <w:rtl w:val="0"/>
+              </w:rPr>
+              <w:t xml:space="preserve"> </w:t>
+            </w:r>
+            <w:r>
+              <w:rPr>
+                <w:rtl w:val="0"/>
+                <w:sz w:val="18"/>
+                <w:szCs w:val="18"/>
+                <w:rFonts w:ascii="Georgia" w:hAnsi="Georgia"/>
+              </w:rPr>
+            </w:r>
+          </w:p>
         </w:tc>
         <w:tc>
           <w:tcPr/>
+          <w:p>
+            <w:pPr>
+              <w:spacing w:before="0" w:after="0" w:line="260" w:lineRule="auto"/>
+              <w:jc w:val="left"/>
+              <w:rPr/>
+            </w:pPr>
+            <w:r>
+              <w:rPr>
+                <w:rFonts w:ascii="Georgia" w:cs="Georgia" w:eastAsia="Georgia" w:hAnsi="Georgia"/>
+                <w:sz w:val="18"/>
+                <w:szCs w:val="18"/>
+                <w:rtl w:val="0"/>
+              </w:rPr>
+              <w:t xml:space="preserve"> </w:t>
+            </w:r>
+            <w:r>
+              <w:rPr>
+                <w:rtl w:val="0"/>
+                <w:sz w:val="18"/>
+                <w:szCs w:val="18"/>
+                <w:rFonts w:ascii="Georgia" w:hAnsi="Georgia"/>
+              </w:rPr>
+            </w:r>
+          </w:p>
         </w:tc>
         <w:tc>
           <w:tcPr/>
+          <w:p>
+            <w:pPr>
+              <w:spacing w:before="0" w:after="0" w:line="260" w:lineRule="auto"/>
+              <w:jc w:val="left"/>
+              <w:rPr/>
+            </w:pPr>
+            <w:r>
+              <w:rPr>
+                <w:rFonts w:ascii="Georgia" w:cs="Georgia" w:eastAsia="Georgia" w:hAnsi="Georgia"/>
+                <w:sz w:val="18"/>
+                <w:szCs w:val="18"/>
+                <w:rtl w:val="0"/>
+              </w:rPr>
+              <w:t xml:space="preserve"> </w:t>
+            </w:r>
+            <w:r>
+              <w:rPr>
+                <w:rtl w:val="0"/>
+                <w:sz w:val="18"/>
+                <w:szCs w:val="18"/>
+                <w:rFonts w:ascii="Georgia" w:hAnsi="Georgia"/>
+              </w:rPr>
+            </w:r>
+          </w:p>
         </w:tc>
       </w:tr>
     </w:tbl>

</xml_diff>

<commit_message>
Draft_104: tighten Research Framework, drop defensive restatement
Remove pre-filter/license-to-count armoring. State type, function, source
jobs, procedure, and figure path once each without repeating FP/EC/P.
</commit_message>
<xml_diff>
--- a/thesis/003_ThesisProposal_Draft_104.docx
+++ b/thesis/003_ThesisProposal_Draft_104.docx
@@ -993,21 +993,11 @@
       </w:pPr>
       <w:r>
         <w:rPr>
-          <w:rFonts w:ascii="Georgia" w:hAnsi="Georgia" w:cs="Georgia" w:eastAsia="Georgia"/>
-          <w:i w:val="0"/>
-          <w:iCs w:val="0"/>
-          <w:sz w:val="22"/>
-          <w:szCs w:val="22"/>
-          <w:rtl w:val="0"/>
-          <w:b w:val="0"/>
-          <w:bCs w:val="0"/>
-        </w:rPr>
-        <w:t xml:space="preserve">This study is grounded in a coding scheme adapted from Hyland’s (1998) classification of hedging forms. Hyland (1998) is the instrument for this project. It supplies the grammatical types coded in the corpus (consolidated here as lexical hedges, modal verbs, adverbial hedges, and clause-level hedges) and the starting point for functional reading of retained hedges. Two function labels map onto that starting point. Epistemic Caution covers reduced commitment to the truth of a knowledge claim. Politeness/Deference covers interpersonal softening toward readers or prior work. Those two align roughly with content-oriented and reader-oriented concerns in the hedging literature. False positives are not a function label; they record candidates that fail both the Working Test and the Reader Test. The scheme is adapted for this corpus. It is not a fixed published taxonomy.</w:t>
-      </w:r>
-      <w:r>
-        <w:rPr>
-          <w:rtl w:val="0"/>
-        </w:rPr>
+          <w:rFonts w:ascii="Georgia" w:hAnsi="Georgia" w:eastAsia="Georgia" w:cs="Georgia"/>
+          <w:b w:val="0"/>
+          <w:sz w:val="24"/>
+        </w:rPr>
+        <w:t>This study is grounded in a coding scheme adapted from Hyland’s (1998) classification of hedging forms. Hyland (1998) supplies the grammatical types coded in the corpus (lexical hedges, modal verbs, adverbial hedges, and clause-level hedges) and the starting point for functional reading of retained hedges. Two function labels are used. Epistemic Caution (EC) covers reduced commitment to the truth of a knowledge claim. Politeness/Deference (P) covers interpersonal softening toward readers or prior work. False positives are a residual record of candidates that fail the claim condition or neither removal check. They are not a function label. The scheme is adapted for this corpus rather than treated as a fixed published taxonomy.</w:t>
       </w:r>
     </w:p>
     <w:p>
@@ -1019,23 +1009,11 @@
       </w:pPr>
       <w:r>
         <w:rPr>
-          <w:rFonts w:ascii="Georgia" w:hAnsi="Georgia" w:cs="Georgia" w:eastAsia="Georgia"/>
-          <w:i w:val="0"/>
-          <w:iCs w:val="0"/>
-          <w:sz w:val="22"/>
-          <w:szCs w:val="22"/>
-          <w:rtl w:val="0"/>
-          <w:b w:val="0"/>
-          <w:bCs w:val="0"/>
-        </w:rPr>
-        <w:t xml:space="preserve">
-        Each source used in the framework has a distinct job. Hyland (1998) is the coding instrument for hedge types and the broad start for function labels EC and P. Crompton (1997) is the boundary rule for Epistemic Caution alone. His restatement test (whether the claim could be restated with greater author commitment) operationalizes the Working Test for EC at Step 2. The study does not adopt Crompton’s full taxonomy or his narrower view of what may enter the retained set. Salager-Meyer (1994) is an interpretive lens used in Part IV. Her claim-responsibility account helps read why density may differ across programs. Her taxonomy is not used for coding. Hyland (2005) is a second interpretive lens. The stance model helps read what fewer hedges mean where results turn into implications. It is not an operational coding criterion. Together, the two lenses frame hedging as both an epistemic and an interpersonal resource without treating either lens as a tested finding.
-    </w:t>
-      </w:r>
-      <w:r>
-        <w:rPr>
-          <w:rtl w:val="0"/>
-        </w:rPr>
+          <w:rFonts w:ascii="Georgia" w:hAnsi="Georgia" w:eastAsia="Georgia" w:cs="Georgia"/>
+          <w:b w:val="0"/>
+          <w:sz w:val="24"/>
+        </w:rPr>
+        <w:t>Each source has a distinct job. Hyland (1998) is the type instrument and the broad start for EC and P. Crompton (1997) supplies the boundary rule for Epistemic Caution alone: his restatement test operationalizes the Working Test for EC at Step 2. The study does not adopt Crompton’s full taxonomy. Salager-Meyer (1994) is an interpretive lens in Part IV. Her claim-responsibility account helps read density differences across programs. Hyland (2005) is a second interpretive lens. The stance model helps read what fewer hedges mean where results turn into implications. Neither interpretive lens is an operational coding criterion.</w:t>
       </w:r>
     </w:p>
     <w:p>
@@ -1047,16 +1025,11 @@
       </w:pPr>
       <w:r>
         <w:rPr>
-          <w:rFonts w:ascii="Georgia" w:hAnsi="Georgia" w:cs="Georgia" w:eastAsia="Georgia"/>
-          <w:i w:val="0"/>
-          <w:iCs w:val="0"/>
-          <w:sz w:val="22"/>
-          <w:szCs w:val="22"/>
-          <w:rtl w:val="0"/>
-          <w:b w:val="0"/>
-          <w:bCs w:val="0"/>
-        </w:rPr>
-        <w:t xml:space="preserve">In practice, the coding scheme was adapted from Hyland (1998) as the type instrument and operationalized through the decision rules in Appendix A. After a holistic reading of each abstract, coding followed three stages. Step 1 marked all possible hedge candidates (wide net). This step did not yet count retained hedges. Step 2 identified function with a claim condition and two paired removal checks. Claim condition: a device can only be a hedge if it attaches to a claim—a statement about data, the world, or prior work that evidence could show to be wrong. Aims, directives, and routine procedure are excluded by kind. Non-claims are logged FP. Working Test: remove the device. If the writer’s commitment to the claim’s truth goes up → EC. Reader Test: remove the device. If commitment to the truth stays the same, but the claim reaches the reader more bluntly or the writer takes sole ownership of it against prior work → P. Neither check met → FP (not a function). There is no required category pre-filter before Step 2. Step 3 assigned grammatical type only to retained P and EC tokens. Reason codes (FP-Rec, FP-Cap, FP-Proc, FP-Gen) label residual rejects in the inventory.</w:t>
+          <w:rFonts w:ascii="Georgia" w:hAnsi="Georgia" w:eastAsia="Georgia" w:cs="Georgia"/>
+          <w:b w:val="0"/>
+          <w:sz w:val="24"/>
+        </w:rPr>
+        <w:t>Coding followed the decision rules in Appendix A. After a holistic reading of each abstract, Step 1 marked all possible hedge candidates without counting retained hedges. Step 2 applied a claim condition and two removal checks. A device can be a hedge only if it attaches to a claim—a statement about data, the world, or prior work that evidence could show to be wrong. Aims, directives, and routine procedure are excluded by kind. Working Test: remove the device. If the writer’s commitment to the claim’s truth rises → EC. Reader Test: remove the device. If commitment stays the same but the claim reaches the reader more bluntly or the writer takes sole ownership against prior work → P. Neither check met → FP. EC and P may co-occur on one token when both tests hold. Step 3 assigned grammatical type only to retained EC and P tokens. Reason codes (FP-Rec, FP-Cap, FP-Proc, FP-Gen) label residual rejects.</w:t>
       </w:r>
     </w:p>
     <w:p>
@@ -1068,42 +1041,11 @@
       </w:pPr>
       <w:r>
         <w:rPr>
-          <w:rFonts w:ascii="Georgia" w:hAnsi="Georgia" w:cs="Georgia" w:eastAsia="Georgia"/>
-          <w:i w:val="0"/>
-          <w:sz w:val="22"/>
-          <w:szCs w:val="22"/>
-          <w:b w:val="0"/>
-          <w:bCs w:val="0"/>
-        </w:rPr>
-        <w:t xml:space="preserve">The only function labels in this study are Epistemic Caution (EC) and Politeness/Deference (P). False positives are not a function. They are a residual record of candidates that fail the claim condition or meet neither removal check at Step 2. EC and P may co-occur on one retained token (EC+P) when both the Working Test and the Reader Test hold. Connectors, framing forms, directives, and aim statements may appear in the Step 1 net. If the claim condition fails or neither test is met, they are recorded as FP, not as a third function. It is not a license to count every soft-sounding word. Recommendations do not become P by sounding polite: they fail the claim condition.</w:t>
-      </w:r>
-    </w:p>
-    <w:p>
-      <w:pPr>
-        <w:spacing w:before="0" w:after="0" w:line="480" w:lineRule="auto"/>
-        <w:ind w:firstLine="720"/>
-        <w:jc w:val="both"/>
-        <w:rPr/>
-      </w:pPr>
-      <w:r>
-        <w:rPr>
-          <w:rFonts w:ascii="Georgia" w:hAnsi="Georgia" w:cs="Georgia" w:eastAsia="Georgia"/>
-          <w:i w:val="0"/>
-          <w:iCs w:val="0"/>
-          <w:sz w:val="22"/>
-          <w:szCs w:val="22"/>
-          <w:rtl w:val="0"/>
-          <w:b w:val="0"/>
-          <w:bCs w:val="0"/>
-        </w:rPr>
-        <w:t xml:space="preserve">
-        The conceptual framework is presented in Figure 1. The grouping variable is discipline (Agriculture, Veterinary Medicine, and Biology). The outcome measures are hedge type frequency, distribution, and function. Figure 1 shows the study’s type and function categories in that pipeline. The analytical path moves from Step 1 and Step 2 through frequency analysis and cross-disciplinary comparison to functional and interpretive reading. Source jobs are stated in the framework text: Hyland (1998) supplies the type instrument and the starting point for EC and P on retained hedges, Crompton (1997) supports the Working Test for EC, Salager-Meyer (1994) is the Part IV claim-responsibility lens, and Hyland (2005) is the stance lens for implications. Figure 1 shows functions as Epistemic Caution and Politeness only; false positives are a residual coding record, not a function category in the figure. Two boundary conditions are acknowledged throughout. The texts are produced by developing researchers whose work may not yet reflect discipline-specific norms. The institutional context at PSAU includes L2 English use, but language proficiency is not measured as a variable in this design. These factors bound how far the findings may be generalized.
-    </w:t>
-      </w:r>
-      <w:r>
-        <w:rPr>
-          <w:rtl w:val="0"/>
-        </w:rPr>
+          <w:rFonts w:ascii="Georgia" w:hAnsi="Georgia" w:eastAsia="Georgia" w:cs="Georgia"/>
+          <w:b w:val="0"/>
+          <w:sz w:val="24"/>
+        </w:rPr>
+        <w:t>The conceptual framework is presented in Figure 1. The grouping variable is discipline (Agriculture, Veterinary Medicine, and Biology). The outcome measures are hedge type frequency, distribution, and function. The analytical path moves from Steps 1–3 through frequency analysis and cross-disciplinary comparison to functional and interpretive reading. Two boundary conditions limit generalization. The texts are produced by developing researchers whose work may not yet reflect discipline-specific norms. The institutional context at PSAU includes L2 English use, but language proficiency is not measured as a variable in this design.</w:t>
       </w:r>
     </w:p>
     <w:p>

</xml_diff>

<commit_message>
Draft_104: remove em-dashes and semicolons from main prose
</commit_message>
<xml_diff>
--- a/thesis/003_ThesisProposal_Draft_104.docx
+++ b/thesis/003_ThesisProposal_Draft_104.docx
@@ -1029,7 +1029,7 @@
           <w:b w:val="0"/>
           <w:sz w:val="24"/>
         </w:rPr>
-        <w:t>Coding followed the decision rules in Appendix A. After a holistic reading of each abstract, Step 1 marked all possible hedge candidates without counting retained hedges. Step 2 applied a claim condition and two removal checks. A device can be a hedge only if it attaches to a claim—a statement about data, the world, or prior work that evidence could show to be wrong. Aims, directives, and routine procedure are excluded by kind. Working Test: remove the device. If the writer’s commitment to the claim’s truth rises → EC. Reader Test: remove the device. If commitment stays the same but the claim reaches the reader more bluntly or the writer takes sole ownership against prior work → P. Neither check met → FP. EC and P may co-occur on one token when both tests hold. Step 3 assigned grammatical type only to retained EC and P tokens. Reason codes (FP-Rec, FP-Cap, FP-Proc, FP-Gen) label residual rejects.</w:t>
+        <w:t>Coding followed the decision rules in Appendix A. After a holistic reading of each abstract, Step 1 marked all possible hedge candidates without counting retained hedges. Step 2 applied a claim condition and two removal checks. A device can be a hedge only if it attaches to a claim: a statement about data, the world, or prior work that evidence could show to be wrong. Aims, directives, and routine procedure are excluded by kind. Working Test: remove the device. If the writer’s commitment to the claim’s truth rises → EC. Reader Test: remove the device. If commitment stays the same but the claim reaches the reader more bluntly or the writer takes sole ownership against prior work → P. Neither check met → FP. EC and P may co-occur on one token when both tests hold. Step 3 assigned grammatical type only to retained EC and P tokens. Reason codes (FP-Rec, FP-Cap, FP-Proc, FP-Gen) label residual rejects.</w:t>
       </w:r>
     </w:p>
     <w:p>
@@ -1045,7 +1045,7 @@
           <w:b w:val="0"/>
           <w:sz w:val="24"/>
         </w:rPr>
-        <w:t>The conceptual framework is presented in Figure 1. The grouping variable is discipline (Agriculture, Veterinary Medicine, and Biology). The outcome measures are hedge type frequency, distribution, and function. The analytical path moves from Steps 1–3 through frequency analysis and cross-disciplinary comparison to functional and interpretive reading. Two boundary conditions limit generalization. The texts are produced by developing researchers whose work may not yet reflect discipline-specific norms. The institutional context at PSAU includes L2 English use, but language proficiency is not measured as a variable in this design.</w:t>
+        <w:t>The conceptual framework is presented in Figure 1. The grouping variable is discipline (Agriculture, Veterinary Medicine, and Biology). The outcome measures are hedge type frequency, distribution, and function. The analytical path moves from Steps 1-3 through frequency analysis and cross-disciplinary comparison to functional and interpretive reading. Two boundary conditions limit generalization. The texts are produced by developing researchers whose work may not yet reflect discipline-specific norms. The institutional context at PSAU includes L2 English use, but language proficiency is not measured as a variable in this design.</w:t>
       </w:r>
     </w:p>
     <w:p>
@@ -1306,6 +1306,21 @@
       </w:pPr>
       <w:r>
         <w:rPr>
+          <w:rFonts w:ascii="Georgia" w:hAnsi="Georgia" w:eastAsia="Georgia" w:cs="Georgia"/>
+          <w:sz w:val="24"/>
+        </w:rPr>
+        <w:t>This study focused on undergraduate thesis abstracts from Agriculture, Veterinary Medicine, and Biology at PSAU. The inclusion window refers to the year of hard-bound submission as recorded in the PSAU library catalog, not the year the research was conducted. Theses conducted earlier but bound and catalogued in 2023-2025 are included. This reflects institutional practice in which submission date, particularly for irregular students, may postdate the research period by several years. The corpus consisted of 60 abstracts (20 per discipline, with Agriculture split evenly between Crop Science and Animal Science). Sampling design, stratum intervals, and inclusion/exclusion criteria are detailed under Research Corpus. Table 1 reports population and sample sizes. Sub-programs are analyzed as a single “Agriculture” discipline for cross-disciplinary comparison. No separate inferential comparison between them is undertaken.</w:t>
+      </w:r>
+    </w:p>
+    <w:p>
+      <w:pPr>
+        <w:spacing w:before="0" w:after="0" w:line="480" w:lineRule="auto"/>
+        <w:ind w:firstLine="720"/>
+        <w:jc w:val="both"/>
+        <w:rPr/>
+      </w:pPr>
+      <w:r>
+        <w:rPr>
           <w:rFonts w:ascii="Georgia" w:cs="Georgia" w:eastAsia="Georgia" w:hAnsi="Georgia"/>
           <w:b w:val="0"/>
           <w:bCs w:val="0"/>
@@ -1315,7 +1330,7 @@
           <w:szCs w:val="22"/>
           <w:rtl w:val="0"/>
         </w:rPr>
-        <w:t xml:space="preserve">This study focused on undergraduate thesis abstracts from Agriculture, Veterinary Medicine, and Biology at PSAU. The inclusion window refers to the year of hard-bound submission as recorded in the PSAU library catalog, not the year the research was conducted. Theses conducted earlier but bound and catalogued in 2023–2025 are included. This reflects institutional practice in which submission date, particularly for irregular students, may postdate the research period by several years. The corpus consisted of 60 abstracts (20 per discipline, with Agriculture split evenly between Crop Science and Animal Science). Sampling design, stratum intervals, and inclusion/exclusion criteria are detailed under Research Corpus. Table 1 reports population and sample sizes. Sub-programs are analyzed as a single “Agriculture” discipline for cross-disciplinary comparison. No separate inferential comparison between them is undertaken.</w:t>
+        <w:t>For a manually coded functional analysis within a single institution, 60 texts are treated as sufficient for identifying patterns within the limits of a BA thesis. Findings are indicative patterns in the PSAU context. Exploratory inferential analyses (chi-square, Kruskal-Wallis) are reported transparently and should not be treated as confirmatory given the small sample and zero inflation. Comparable undergraduate corpus sizes and the larger multi-field MICUSP work are noted under Research Corpus. The pilot comparison appears in Appendix B.</w:t>
       </w:r>
       <w:r>
         <w:rPr>
@@ -1341,7 +1356,7 @@
           <w:szCs w:val="22"/>
           <w:rtl w:val="0"/>
         </w:rPr>
-        <w:t>For a manually coded functional analysis within a single institution, 60 texts are treated as sufficient for identifying patterns within the limits of a BA thesis. Findings are indicative patterns in the PSAU context. Exploratory inferential analyses (chi-square, Kruskal-Wallis) are reported transparently and should not be treated as confirmatory given the small sample and zero inflation. Comparable undergraduate corpus sizes and the larger multi-field MICUSP work are noted under Research Corpus. The pilot comparison appears in Appendix B.</w:t>
+        <w:t xml:space="preserve">The study is delimited to complete English-language abstracts. Abstracts with significant Filipino code-switching are excluded to maintain linguistic consistency. Disciplinary classification followed the degree program under which each thesis was officially submitted, not a research topic, to ensure objective categorization. L2 proficiency is not measured as a variable. Where patterns suggest proficiency effects alongside disciplinary ones, this is noted as a limitation requiring future research with proficiency controls.</w:t>
       </w:r>
       <w:r>
         <w:rPr>
@@ -1367,7 +1382,7 @@
           <w:szCs w:val="22"/>
           <w:rtl w:val="0"/>
         </w:rPr>
-        <w:t xml:space="preserve">The study is delimited to complete English-language abstracts. Abstracts with significant Filipino code-switching are excluded to maintain linguistic consistency. Disciplinary classification followed the degree program under which each thesis was officially submitted, not a research topic, to ensure objective categorization. L2 proficiency is not measured as a variable. Where patterns suggest proficiency effects alongside disciplinary ones, this is noted as a limitation requiring future research with proficiency controls.</w:t>
+        <w:t>The abstract genre’s rhetorical compression may suppress hedging variety compared to full-text discussions. Findings reflect hedging in this constrained genre only and should not be extrapolated to developing researchers’ hedging competence in longer texts without further research. Additionally, this study is primarily delimited to hedging devices. A limited count of assertive reporting forms was performed only on the 25 zero-hedge abstracts. No comparison with hedged abstracts was made, and a full booster analysis was not undertaken. That count is descriptive of the zero-hedge subset only. While credibility in academic writing involves a balance of caution and certainty, this study focuses specifically on the management of uncertainty, which is often the more challenging rhetorical skill for developing L2 researchers to acquire.</w:t>
       </w:r>
       <w:r>
         <w:rPr>
@@ -1380,40 +1395,14 @@
         <w:spacing w:before="0" w:after="0" w:line="480" w:lineRule="auto"/>
         <w:ind w:firstLine="720"/>
         <w:jc w:val="both"/>
-        <w:rPr/>
-      </w:pPr>
-      <w:r>
-        <w:rPr>
-          <w:rFonts w:ascii="Georgia" w:cs="Georgia" w:eastAsia="Georgia" w:hAnsi="Georgia"/>
-          <w:b w:val="0"/>
-          <w:bCs w:val="0"/>
-          <w:i w:val="0"/>
-          <w:iCs w:val="0"/>
-          <w:sz w:val="22"/>
-          <w:szCs w:val="22"/>
-          <w:rtl w:val="0"/>
-        </w:rPr>
-        <w:t>The abstract genre’s rhetorical compression may suppress hedging variety compared to full-text discussions. Findings reflect hedging in this constrained genre only and should not be extrapolated to developing researchers’ hedging competence in longer texts without further research. Additionally, this study is primarily delimited to hedging devices. A limited count of assertive reporting forms was performed only on the 25 zero-hedge abstracts. No comparison with hedged abstracts was made, and a full booster analysis was not undertaken. That count is descriptive of the zero-hedge subset only. While credibility in academic writing involves a balance of caution and certainty, this study focuses specifically on the management of uncertainty, which is often the more challenging rhetorical skill for developing L2 researchers to acquire.</w:t>
-      </w:r>
-      <w:r>
-        <w:rPr>
-          <w:rtl w:val="0"/>
-        </w:rPr>
-      </w:r>
-    </w:p>
-    <w:p>
-      <w:pPr>
-        <w:spacing w:before="0" w:after="0" w:line="480" w:lineRule="auto"/>
-        <w:ind w:firstLine="720"/>
-        <w:jc w:val="both"/>
-      </w:pPr>
-      <w:r>
-        <w:rPr>
-          <w:rFonts w:ascii="Georgia" w:hAnsi="Georgia" w:cs="Georgia" w:eastAsia="Georgia"/>
-          <w:sz w:val="22"/>
-          <w:szCs w:val="22"/>
-        </w:rPr>
-        <w:t xml:space="preserve">Reliability was assessed through intra-rater agreement only. A second coder was not available for inter-rater reliability testing, which limits how far the coding scheme can be verified against an independent application of the same decision rules. That limit bears especially on the functional findings in Part III. Assigning all 65 retained hedges to Epistemic Caution may reflect one coder’s frame as much as a property of the corpus. Inter-rater coding on at least a subset of the corpus is needed before those functional results can be treated as established. Related work could apply the same Step 1–3 coding scheme to longer genres where P may appear more often and where framing-only candidates can be compared across genres.</w:t>
+      </w:pPr>
+      <w:r>
+        <w:rPr>
+          <w:rFonts w:ascii="Georgia" w:hAnsi="Georgia" w:cs="Georgia" w:eastAsia="Georgia"/>
+          <w:sz w:val="22"/>
+          <w:szCs w:val="22"/>
+        </w:rPr>
+        <w:t>Reliability was assessed through intra-rater agreement only. A second coder was not available for inter-rater reliability testing, which limits how far the coding scheme can be verified against an independent application of the same decision rules. That limit bears especially on the functional findings in Part III. Assigning all 65 retained hedges to Epistemic Caution may reflect one coder’s frame as much as a property of the corpus. Inter-rater coding on at least a subset of the corpus is needed before those functional results can be treated as established. Related work could apply the same Step 1-3 coding scheme to longer genres where P may appear more often and where framing-only candidates can be compared across genres.</w:t>
       </w:r>
     </w:p>
     <w:p>
@@ -1428,7 +1417,7 @@
           <w:rFonts w:ascii="Georgia" w:hAnsi="Georgia" w:eastAsia="Georgia" w:cs="Georgia"/>
           <w:sz w:val="24"/>
         </w:rPr>
-        <w:t>The study also lacks a comparable expert-abstract corpus against which to compare the functional findings. Among retained hedges, no tokens were independently labeled Politeness (P = 0). That null is empirical and genre-linked, not built into Step 2: the Reader Test can retain pure P on a claim. P = 0 refers to reader-oriented softening of claims. Softened directives were out of scope under the claim condition and were logged as FP-Rec, not as P. Lead support is the Non-retained inventory scan of interpersonal candidates. Framing forms in that inventory failed the claim condition or both removal checks. False positives (n = 58) are residual rejects with reason codes. Genre compression in abstracts is a plausible account of why P items on claims did not appear. Expert abstracts in the same three disciplines, coded with the same Step 1–3 coding scheme, would help separate genre effects from writer-competence effects.</w:t>
+        <w:t>The study also lacks a comparable expert-abstract corpus against which to compare the functional findings. Among retained hedges, no tokens were independently labeled Politeness (P = 0). That null is empirical and genre-linked, not built into Step 2: the Reader Test can retain pure P on a claim. P = 0 refers to reader-oriented softening of claims. Softened directives were out of scope under the claim condition and were logged as FP-Rec, not as P. Lead support is the Non-retained inventory scan of interpersonal candidates. Framing forms in that inventory failed the claim condition or both removal checks. False positives (n = 58) are residual rejects with reason codes. Genre compression in abstracts is a plausible account of why P items on claims did not appear. Expert abstracts in the same three disciplines, coded with the same Step 1-3 coding scheme, would help separate genre effects from writer-competence effects.</w:t>
       </w:r>
     </w:p>
     <w:p>
@@ -1676,21 +1665,10 @@
       </w:pPr>
       <w:r>
         <w:rPr>
-          <w:rFonts w:ascii="Georgia" w:hAnsi="Georgia" w:cs="Georgia" w:eastAsia="Georgia"/>
-          <w:sz w:val="22"/>
-          <w:b w:val="1"/>
-          <w:bCs w:val="1"/>
-        </w:rPr>
-        <w:t>Cohen’s Kappa (κ),</w:t>
-      </w:r>
-      <w:r>
-        <w:rPr>
-          <w:rFonts w:ascii="Georgia" w:hAnsi="Georgia" w:cs="Georgia" w:eastAsia="Georgia"/>
-          <w:sz w:val="22"/>
-          <w:b w:val="0"/>
-          <w:bCs w:val="0"/>
-        </w:rPr>
-        <w:t xml:space="preserve"> conceptually, measures inter- or intra-rater agreement for categorical coding beyond chance. Operationally, this study used it for intra-rater reliability on a second pass of six abstracts. The formula is κ = (Pₒ − Pₑ) / (1 − Pₑ), where Pₒ is the observed proportion of agreement and Pₑ is the expected agreement by chance. Landis and Koch (1977) interpret κ values as: &lt;0.00 poor, 0.00–0.20 slight, 0.21–0.40 fair, 0.41–0.60 moderate, 0.61–0.80 substantial, 0.81–1.00 almost perfect. The intra-rater result was κ = 0.89.</w:t>
+          <w:rFonts w:ascii="Georgia" w:hAnsi="Georgia" w:eastAsia="Georgia" w:cs="Georgia"/>
+          <w:sz w:val="24"/>
+        </w:rPr>
+        <w:t>Cohen’s Kappa (κ), conceptually, measures inter- or intra-rater agreement for categorical coding beyond chance. Operationally, this study used it for intra-rater reliability on a second pass of six abstracts. The formula is κ = (Pₒ − Pₑ) / (1 − Pₑ), where Pₒ is the observed proportion of agreement and Pₑ is the expected agreement by chance. Landis and Koch (1977) interpret κ values as: &lt;0.00 poor, 0.00-0.20 slight, 0.21-0.40 fair, 0.41-0.60 moderate, 0.61-0.80 substantial, 0.81-1.00 almost perfect. The intra-rater result was κ = 0.89.</w:t>
       </w:r>
     </w:p>
     <w:p>
@@ -2353,21 +2331,10 @@
       </w:pPr>
       <w:r>
         <w:rPr>
-          <w:rFonts w:ascii="Georgia" w:hAnsi="Georgia" w:cs="Georgia" w:eastAsia="Georgia"/>
-          <w:sz w:val="22"/>
-          <w:b w:val="1"/>
-          <w:bCs w:val="1"/>
-        </w:rPr>
-        <w:t xml:space="preserve">b. Corpus Construction. </w:t>
-      </w:r>
-      <w:r>
-        <w:rPr>
-          <w:rFonts w:ascii="Georgia" w:hAnsi="Georgia" w:cs="Georgia" w:eastAsia="Georgia"/>
-          <w:sz w:val="22"/>
-          <w:b w:val="0"/>
-          <w:bCs w:val="0"/>
-        </w:rPr>
-        <w:t>Disproportionate stratified systematic sampling was used, with discipline as the stratification variable and fixed analytical targets per stratum to ensure equal representation regardless of population size. The target sample sizes were n=20 for Biology, n=20 for Veterinary Medicine, n=10 for Agriculture, Animal Science, and n=10 for Agriculture, Crop Science, totaling 60 abstracts. Within each stratum, a sampling interval k was calculated as k = N/n, where N is the stratum’s target pool size (theses completed 2023–2025) and n is the required sample size. The intervals were as follows: Biology k=7 (145÷20=7.25), Veterinary Medicine k=5 (104÷20=5.2), Animal Science k=4 (38÷10=3.8), and Crop Science k=9 (94÷10=9.4). Sampling began from a randomly selected position around the middle of each stratum’s catalog and proceeded forward by taking every kth thesis. Where the end of the stratum was reached before the required sample size, counting wrapped around to the beginning of the catalog and continued until the target sample was met. Disciplinary classification followed the degree program under which each thesis was officially submitted (e.g., B.S. Agriculture, B.S. Biology, D.V.M.), not a research topic, to ensure objective categorization.</w:t>
+          <w:rFonts w:ascii="Georgia" w:hAnsi="Georgia" w:eastAsia="Georgia" w:cs="Georgia"/>
+          <w:sz w:val="24"/>
+        </w:rPr>
+        <w:t>b. Corpus Construction. Disproportionate stratified systematic sampling was used, with discipline as the stratification variable and fixed analytical targets per stratum to ensure equal representation regardless of population size. The target sample sizes were n=20 for Biology, n=20 for Veterinary Medicine, n=10 for Agriculture, Animal Science, and n=10 for Agriculture, Crop Science, totaling 60 abstracts. Within each stratum, a sampling interval k was calculated as k = N/n, where N is the stratum’s target pool size (theses completed 2023-2025) and n is the required sample size. The intervals were as follows: Biology k=7 (145÷20=7.25), Veterinary Medicine k=5 (104÷20=5.2), Animal Science k=4 (38÷10=3.8), and Crop Science k=9 (94÷10=9.4). Sampling began from a randomly selected position around the middle of each stratum’s catalog and proceeded forward by taking every kth thesis. Where the end of the stratum was reached before the required sample size, counting wrapped around to the beginning of the catalog and continued until the target sample was met. Disciplinary classification followed the degree program under which each thesis was officially submitted (e.g., B.S. Agriculture, B.S. Biology, D.V.M.), not a research topic, to ensure objective categorization.</w:t>
       </w:r>
     </w:p>
     <w:p>
@@ -2379,21 +2346,10 @@
       </w:pPr>
       <w:r>
         <w:rPr>
-          <w:rFonts w:ascii="Georgia" w:hAnsi="Georgia" w:cs="Georgia" w:eastAsia="Georgia"/>
-          <w:sz w:val="22"/>
-          <w:b w:val="1"/>
-          <w:bCs w:val="1"/>
-        </w:rPr>
-        <w:t xml:space="preserve">c. Text Extraction. </w:t>
-      </w:r>
-      <w:r>
-        <w:rPr>
-          <w:rFonts w:ascii="Georgia" w:hAnsi="Georgia" w:cs="Georgia" w:eastAsia="Georgia"/>
-          <w:sz w:val="22"/>
-          <w:b w:val="0"/>
-          <w:bCs w:val="0"/>
-        </w:rPr>
-        <w:t>Abstracts were captured through on-site photography of the hard-bound thesis copies. These images were then converted to plain text using Optical Character Recognition (OCR) tools such as Google Drive or Adobe Scan. Each converted text was manually verified against the original photographs to correct transcription errors. Particular attention was paid to verifying sentences containing potential hedge tokens, as OCR errors in these sentences would directly affect the coding results. Text files were anonymized using discipline codes (Acs1–Acs10, Aas1–Aas10, VM1–VM20, B1–B20) and organized by discipline.</w:t>
+          <w:rFonts w:ascii="Georgia" w:hAnsi="Georgia" w:eastAsia="Georgia" w:cs="Georgia"/>
+          <w:sz w:val="24"/>
+        </w:rPr>
+        <w:t>c. Text Extraction. Abstracts were captured through on-site photography of the hard-bound thesis copies. These images were then converted to plain text using Optical Character Recognition (OCR) tools such as Google Drive or Adobe Scan. Each converted text was manually verified against the original photographs to correct transcription errors. Particular attention was paid to verifying sentences containing potential hedge tokens, as OCR errors in these sentences would directly affect the coding results. Text files were anonymized using discipline codes (Acs1-Acs10, Aas1-Aas10, VM1-VM20, B1-B20) and organized by discipline.</w:t>
       </w:r>
     </w:p>
     <w:p>
@@ -2516,7 +2472,7 @@
           <w:szCs w:val="22"/>
           <w:rtl w:val="0"/>
         </w:rPr>
-        <w:t xml:space="preserve">Ambiguous forms such as can, potential, indicating, and possibility may function either as epistemic hedges or as non-epistemic lexical items depending on context. The following decision rules show how the claim condition and removal checks apply. First, “can” combined with an active content verb describing a treatment effect (enhance, promote, reduce, help) fails as a claim-mitigator when it only marks capability (FP-Cap), because removing “can” does not raise commitment to a claim’s truth when the host is ability rather than a finding under doubt. Second, the “indicating” tautology test covers not only numeric restatement but also field-standard interpretive thresholds: “non-toxic” from no mortality observed, “limited benefits” from poor performance, and “superior feed efficiency” from lower feed conversion ratio are treated as operational restatements (FP-Gen) rather than inferential hedges. Third, for “potential + noun,” structural position is how the claim condition applies, not a pre-filter before Step 2. Aim and methods clauses are non-claims (what the study set out to do), so “potential” there fails the claim condition and is coded FP-Gen, as when an abstract “explores the potential antifungal properties” of a plant or names “potential pharmaceutical applications” as the object of further study. Results and conclusion frames that qualify a finding-claim remain claims, so “potential” can pass the claim condition and, if the Working Test holds, is coded Lexical EC. When removing the token clearly changes commitment to a proposition—for example when “presence of potential mycobacterial infections” becomes an asserted presence claim without the modifier—the token is coded Lexical EC. The same claim-condition treatment applies to “possibility + noun” in aim and method sentences. Fourth, when a sentence contains multiple hedge-like tokens, each is tested on its own host clause under the claim condition and the two removal checks.</w:t>
+        <w:t>Ambiguous forms such as can, potential, indicating, and possibility may function either as epistemic hedges or as non-epistemic lexical items depending on context. The following decision rules show how the claim condition and removal checks apply. First, “can” combined with an active content verb describing a treatment effect (enhance, promote, reduce, help) fails as a claim-mitigator when it only marks capability (FP-Cap), because removing “can” does not raise commitment to a claim’s truth when the host is ability rather than a finding under doubt. Second, the “indicating” tautology test covers not only numeric restatement but also field-standard interpretive thresholds: “non-toxic” from no mortality observed, “limited benefits” from poor performance, and “superior feed efficiency” from lower feed conversion ratio are treated as operational restatements (FP-Gen) rather than inferential hedges. Third, for “potential + noun,” structural position is how the claim condition applies, not a pre-filter before Step 2. Aim and methods clauses are non-claims (what the study set out to do), so “potential” there fails the claim condition and is coded FP-Gen, as when an abstract “explores the potential antifungal properties” of a plant or names “potential pharmaceutical applications” as the object of further study. Results and conclusion frames that qualify a finding-claim remain claims, so “potential” can pass the claim condition and, if the Working Test holds, is coded Lexical EC. When removing the token clearly changes commitment to a proposition, for example when “presence of potential mycobacterial infections” becomes an asserted presence claim without the modifier, the token is coded Lexical EC. The same claim-condition treatment applies to “possibility + noun” in aim and method sentences. Fourth, when a sentence contains multiple hedge-like tokens, each is tested on its own host clause under the claim condition and the two removal checks.</w:t>
       </w:r>
     </w:p>
     <w:p>
@@ -3045,24 +3001,10 @@
             </w:pPr>
             <w:r>
               <w:rPr>
-                <w:rFonts w:ascii="Georgia" w:cs="Georgia" w:eastAsia="Georgia" w:hAnsi="Georgia"/>
-                <w:b w:val="0"/>
-                <w:bCs w:val="0"/>
-                <w:i w:val="0"/>
-                <w:iCs w:val="0"/>
-                <w:sz w:val="18"/>
-                <w:szCs w:val="18"/>
-                <w:rtl w:val="0"/>
-              </w:rPr>
-              <w:t xml:space="preserve">2023–2025 (target pool)</w:t>
-            </w:r>
-            <w:r>
-              <w:rPr>
-                <w:rtl w:val="0"/>
-                <w:sz w:val="18"/>
-                <w:szCs w:val="18"/>
-                <w:rFonts w:ascii="Georgia" w:hAnsi="Georgia"/>
-              </w:rPr>
+                <w:rFonts w:ascii="Georgia" w:hAnsi="Georgia" w:eastAsia="Georgia" w:cs="Georgia"/>
+                <w:sz w:val="24"/>
+              </w:rPr>
+              <w:t>2023-2025 (target pool)</w:t>
             </w:r>
           </w:p>
         </w:tc>
@@ -3782,21 +3724,10 @@
       </w:pPr>
       <w:r>
         <w:rPr>
-          <w:rFonts w:ascii="Georgia" w:cs="Georgia" w:eastAsia="Georgia" w:hAnsi="Georgia"/>
-          <w:b w:val="0"/>
-          <w:bCs w:val="0"/>
-          <w:i w:val="0"/>
-          <w:iCs w:val="0"/>
-          <w:sz w:val="22"/>
-          <w:szCs w:val="22"/>
-          <w:rtl w:val="0"/>
-        </w:rPr>
-        <w:t xml:space="preserve">Table 1 presents the repository populations and the final sample distribution. The target pool for 2023–2025 totals 381 theses. The equal allocation strategy ensures that each discipline provides a robust sample size for cross-disciplinary comparison, preventing the smaller Animal Science population from being underrepresented in the analysis. Pre-2023 theses (n=447) serve as the source pool for pilot abstracts to keep them distinct from the main study period.</w:t>
-      </w:r>
-      <w:r>
-        <w:rPr>
-          <w:rtl w:val="0"/>
-        </w:rPr>
+          <w:rFonts w:ascii="Georgia" w:hAnsi="Georgia" w:eastAsia="Georgia" w:cs="Georgia"/>
+          <w:sz w:val="24"/>
+        </w:rPr>
+        <w:t>Table 1 presents the repository populations and the final sample distribution. The target pool for 2023-2025 totals 381 theses. The equal allocation strategy ensures that each discipline provides a robust sample size for cross-disciplinary comparison, preventing the smaller Animal Science population from being underrepresented in the analysis. Pre-2023 theses (n=447) serve as the source pool for pilot abstracts to keep them distinct from the main study period.</w:t>
       </w:r>
     </w:p>
     <w:p>
@@ -3869,21 +3800,10 @@
       </w:pPr>
       <w:r>
         <w:rPr>
-          <w:rFonts w:ascii="Georgia" w:hAnsi="Georgia" w:cs="Georgia" w:eastAsia="Georgia"/>
-          <w:sz w:val="22"/>
-          <w:b w:val="1"/>
-          <w:bCs w:val="1"/>
-        </w:rPr>
-        <w:t xml:space="preserve">Ethical Considerations. </w:t>
-      </w:r>
-      <w:r>
-        <w:rPr>
-          <w:rFonts w:ascii="Georgia" w:hAnsi="Georgia" w:cs="Georgia" w:eastAsia="Georgia"/>
-          <w:sz w:val="22"/>
-          <w:b w:val="0"/>
-          <w:bCs w:val="0"/>
-        </w:rPr>
-        <w:t>Abstracts were accessed on-site at the PSAU Library with proper authorization. Student names were fully anonymized using discipline codes (Acs1–Acs10, Aas1–Aas10, VM1–VM20, B1–B20) before analysis began. Thesis titles that appear as quoted wording inside an abstract (source text) were redacted in the coded appendix where they identified the work. Residual title fragments, if any, do not include student names. The study analyzed linguistic patterns in text, not student performance or personal information. All data files were stored on password-protected devices and encrypted cloud storage accessible only to the researcher and thesis adviser. These files are retained for five years to support verification of coding decisions by future researchers and to allow for follow-up comparative studies, after which they are permanently deleted in line with standard academic data retention practice.</w:t>
+          <w:rFonts w:ascii="Georgia" w:hAnsi="Georgia" w:eastAsia="Georgia" w:cs="Georgia"/>
+          <w:sz w:val="24"/>
+        </w:rPr>
+        <w:t>Ethical Considerations. Abstracts were accessed on-site at the PSAU Library with proper authorization. Student names were fully anonymized using discipline codes (Acs1-Acs10, Aas1-Aas10, VM1-VM20, B1-B20) before analysis began. Thesis titles that appear as quoted wording inside an abstract (source text) were redacted in the coded appendix where they identified the work. Residual title fragments, if any, do not include student names. The study analyzed linguistic patterns in text, not student performance or personal information. All data files were stored on password-protected devices and encrypted cloud storage accessible only to the researcher and thesis adviser. These files are retained for five years to support verification of coding decisions by future researchers and to allow for follow-up comparative studies, after which they are permanently deleted in line with standard academic data retention practice.</w:t>
       </w:r>
     </w:p>
     <w:p>
@@ -7594,6 +7514,21 @@
       </w:pPr>
       <w:r>
         <w:rPr>
+          <w:rFonts w:ascii="Georgia" w:hAnsi="Georgia" w:eastAsia="Georgia" w:cs="Georgia"/>
+          <w:sz w:val="24"/>
+        </w:rPr>
+        <w:t>Table 4 shows that Agriculture has a nearly balanced type mix (14 modal verbs, 51.9% vs. 13 lexical hedges, 48.1%), while Biology is heavily lexical (20 of 28 hedges, 71.4%, with only 5 modal verbs). Veterinary Medicine, with only 10 total hedges, is also predominantly lexical (8 of 10, 80.0%). Agriculture is the only discipline in which modal verbs approach half of the hedge tokens. Biology and Veterinary Medicine lean lexical. That contrast is real in the counts, but the Ag-Bio difference in overall density is marginal and outlier-sensitive (Part II), so type-mix differences should not be read as a stable Agriculture-versus-Biology profile. The near-absence of adverbial hedges across all three disciplines (only 3 instances, all in Biology) points instead to a shared, narrow repertoire.</w:t>
+      </w:r>
+    </w:p>
+    <w:p>
+      <w:pPr>
+        <w:spacing w:before="0" w:after="0" w:line="480" w:lineRule="auto"/>
+        <w:ind w:firstLine="720"/>
+        <w:jc w:val="both"/>
+        <w:rPr/>
+      </w:pPr>
+      <w:r>
+        <w:rPr>
           <w:rFonts w:ascii="Georgia" w:hAnsi="Georgia" w:cs="Georgia" w:eastAsia="Georgia"/>
           <w:b w:val="0"/>
           <w:bCs w:val="0"/>
@@ -7603,7 +7538,7 @@
           <w:sz w:val="22"/>
           <w:szCs w:val="22"/>
         </w:rPr>
-        <w:t>Table 4 shows that Agriculture has a nearly balanced type mix (14 modal verbs, 51.9% vs. 13 lexical hedges, 48.1%), while Biology is heavily lexical (20 of 28 hedges, 71.4%, with only 5 modal verbs). Veterinary Medicine, with only 10 total hedges, is also predominantly lexical (8 of 10, 80.0%). Agriculture is the only discipline in which modal verbs approach half of the hedge tokens. Biology and Veterinary Medicine lean lexical. That contrast is real in the counts, but the Ag–Bio difference in overall density is marginal and outlier-sensitive (Part II), so type-mix differences should not be read as a stable Agriculture-versus-Biology profile. The near-absence of adverbial hedges across all three disciplines (only 3 instances, all in Biology) points instead to a shared, narrow repertoire.</w:t>
+        <w:t>The absence of clause-level hedges is consistent with the compressed abstract genre and with the supervised character of the corpus. Science abstracts favor impersonal, compact reporting. Clause-level frames that foreground the writer’s stance (including first-person forms such as “I think” or “in our view,” and more impersonal ones such as “it seems that”) are uncommon in that register. The Scope and Limitations section notes that the texts are ratified products shaped by adviser feedback, so the zero count is better read as a feature of the genre and of departmental practice than as evidence that these writers lack the syntactic means to hedge at clause level. The same restricted range of devices has been observed in other developing-writer corpora (Hyland &amp; Milton, 1997). Here the institutional and genre setting supplies the more proximate explanation.</w:t>
       </w:r>
       <w:r>
         <w:rPr>
@@ -7625,37 +7560,11 @@
           <w:bCs w:val="0"/>
           <w:i w:val="0"/>
           <w:iCs w:val="0"/>
+          <w:sz w:val="22"/>
+          <w:szCs w:val="22"/>
           <w:rtl w:val="0"/>
-          <w:sz w:val="22"/>
-          <w:szCs w:val="22"/>
-        </w:rPr>
-        <w:t>The absence of clause-level hedges is consistent with the compressed abstract genre and with the supervised character of the corpus. Science abstracts favor impersonal, compact reporting. Clause-level frames that foreground the writer’s stance (including first-person forms such as “I think” or “in our view,” and more impersonal ones such as “it seems that”) are uncommon in that register. The Scope and Limitations section notes that the texts are ratified products shaped by adviser feedback, so the zero count is better read as a feature of the genre and of departmental practice than as evidence that these writers lack the syntactic means to hedge at clause level. The same restricted range of devices has been observed in other developing-writer corpora (Hyland &amp; Milton, 1997). Here the institutional and genre setting supplies the more proximate explanation.</w:t>
-      </w:r>
-      <w:r>
-        <w:rPr>
-          <w:rtl w:val="0"/>
-        </w:rPr>
-      </w:r>
-    </w:p>
-    <w:p>
-      <w:pPr>
-        <w:spacing w:before="0" w:after="0" w:line="480" w:lineRule="auto"/>
-        <w:ind w:firstLine="720"/>
-        <w:jc w:val="both"/>
-        <w:rPr/>
-      </w:pPr>
-      <w:r>
-        <w:rPr>
-          <w:rFonts w:ascii="Georgia" w:hAnsi="Georgia" w:cs="Georgia" w:eastAsia="Georgia"/>
-          <w:b w:val="0"/>
-          <w:bCs w:val="0"/>
-          <w:i w:val="0"/>
-          <w:iCs w:val="0"/>
-          <w:sz w:val="22"/>
-          <w:szCs w:val="22"/>
-          <w:rtl w:val="0"/>
-        </w:rPr>
-        <w:t xml:space="preserve">Alongside the 65 retained EC hedges (and P = 0), the corpus yielded 58 false positive tokens—hedge-like words that failed the claim condition or both removal checks at Step 2. Table 6 places these totals side by side. The false positive breakdown shows FP-Gen (general exclusion, including topic-naming and evidential pointers) at 33 instances, FP-Rec (recommendations) at 15, FP-Proc (procedural norms) at 2, and FP-Cap (capability) at 8. The high number of FP-Gen tokens reflects topic-naming potential and similar non-claim frames rather than a pre-filter applied before Step 2.</w:t>
+        </w:rPr>
+        <w:t>Alongside the 65 retained EC hedges (and P = 0), the corpus yielded 58 false positive tokens, hedge-like words that failed the claim condition or both removal checks at Step 2. Table 6 places these totals side by side. The false positive breakdown shows FP-Gen (general exclusion, including topic-naming and evidential pointers) at 33 instances, FP-Rec (recommendations) at 15, FP-Proc (procedural norms) at 2, and FP-Cap (capability) at 8. The high number of FP-Gen tokens reflects topic-naming potential and similar non-claim frames rather than a pre-filter applied before Step 2.</w:t>
       </w:r>
     </w:p>
     <w:p>
@@ -9281,7 +9190,7 @@
           <w:rFonts w:ascii="Georgia" w:hAnsi="Georgia" w:eastAsia="Georgia" w:cs="Georgia"/>
           <w:sz w:val="24"/>
         </w:rPr>
-        <w:t>Per-abstract hedge distributions reveal substantial skew. Agriculture abstracts averaged 1.35 hedges (median = 1, SD = 1.84, range = 0–8), Biology averaged 1.40 (median = 1, SD = 1.31, range = 0–5), and Veterinary Medicine averaged 0.50 (median = 0, SD = 0.76, range = 0–3). The high standard deviation in Agriculture reflects the influence of Acs2, which contained 8 hedges alone. When Acs2 is excluded as a sensitivity check, Agriculture's density drops to 0.46 per 100 words, below Biology's 0.62, suggesting that the Agriculture &gt; Biology ranking is partly driven by a single outlier abstract. An exploratory Kruskal-Wallis test on per-abstract hedge rates (per 100 words) yielded H = 7.44, p =.024. Post hoc Mann-Whitney tests on the same rates give Veterinary Medicine versus Biology p =.011, Veterinary Medicine versus Agriculture p =.034, and Agriculture versus Biology p =.72. With a Bonferroni correction for three pairwise tests (α =.017), only the Biology–Veterinary Medicine contrast remains significant. Agriculture and Biology are statistically indistinguishable on this measure. After correction, the only supported pairwise difference is between Biology and Veterinary Medicine; Veterinary Medicine does not differ from Agriculture at the corrected threshold. Abstracts within a program may share advisers, so observations are not fully independent, and within-discipline spread remains larger than the gaps between means. With a small, zero-inflated sample, the Kruskal-Wallis result and the pairwise follow-ups are treated as exploratory. A sensitivity check that removes all 19 instances of "potential" leaves 46 hedges. The Kruskal-Wallis contrast remains in the same direction, and Veterinary Medicine’s zero-hedge share rises further. The same directional pattern holds without those tokens.</w:t>
+        <w:t>Per-abstract hedge distributions reveal substantial skew. Agriculture abstracts averaged 1.35 hedges (median = 1, SD = 1.84, range = 0-8), Biology averaged 1.40 (median = 1, SD = 1.31, range = 0-5), and Veterinary Medicine averaged 0.50 (median = 0, SD = 0.76, range = 0-3). The high standard deviation in Agriculture reflects the influence of Acs2, which contained 8 hedges alone. When Acs2 is excluded as a sensitivity check, Agriculture's density drops to 0.46 per 100 words, below Biology's 0.62, suggesting that the Agriculture &gt; Biology ranking is partly driven by a single outlier abstract. An exploratory Kruskal-Wallis test on per-abstract hedge rates (per 100 words) yielded H = 7.44, p =.024. Post hoc Mann-Whitney tests on the same rates give Veterinary Medicine versus Biology p =.011, Veterinary Medicine versus Agriculture p =.034, and Agriculture versus Biology p =.72. With a Bonferroni correction for three pairwise tests (α =.017), only the Biology-Veterinary Medicine contrast remains significant. Agriculture and Biology are statistically indistinguishable on this measure. After correction, the only supported pairwise difference is between Biology and Veterinary Medicine. Veterinary Medicine does not differ from Agriculture at the corrected threshold. Abstracts within a program may share advisers, so observations are not fully independent, and within-discipline spread remains larger than the gaps between means. With a small, zero-inflated sample, the Kruskal-Wallis result and the pairwise follow-ups are treated as exploratory. A sensitivity check that removes all 19 instances of "potential" leaves 46 hedges. The Kruskal-Wallis contrast remains in the same direction, and Veterinary Medicine’s zero-hedge share rises further. The same directional pattern holds without those tokens.</w:t>
       </w:r>
     </w:p>
     <w:p>
@@ -9400,7 +9309,7 @@
           <w:rFonts w:ascii="Georgia" w:hAnsi="Georgia" w:eastAsia="Georgia" w:cs="Georgia"/>
           <w:sz w:val="24"/>
         </w:rPr>
-        <w:t>Table 6 summarizes Step 2 outcomes for the coding pool. Of the retained hedges, all 65 were coded Epistemic Caution (EC). Politeness/Deference is null (P = 0). False positives totaled 58 (FP-Gen 33, FP-Rec 15, FP-Cap 8, FP-Proc 2). FP is ; the 58 failed the claim condition or both removal checks (reason codes: FP-Gen, FP-Rec, FP-Cap, FP-Proc). The direct comparison is therefore EC = 65, P = 0, FP = 58.</w:t>
+        <w:t>Table 6 summarizes Step 2 outcomes for the coding pool. Of the retained hedges, all 65 were coded Epistemic Caution (EC). Politeness/Deference is null (P = 0). False positives totaled 58 (FP-Gen 33, FP-Rec 15, FP-Cap 8, FP-Proc 2). FP is , the 58 failed the claim condition or both removal checks (reason codes: FP-Gen, FP-Rec, FP-Cap, FP-Proc). The direct comparison is therefore EC = 65, P = 0, FP = 58.</w:t>
       </w:r>
     </w:p>
     <w:p>
@@ -9584,24 +9493,10 @@
             </w:pPr>
             <w:r>
               <w:rPr>
-                <w:rFonts w:ascii="Georgia" w:cs="Georgia" w:eastAsia="Georgia" w:hAnsi="Georgia"/>
-                <w:b w:val="0"/>
-                <w:bCs w:val="0"/>
-                <w:i w:val="0"/>
-                <w:iCs w:val="0"/>
-                <w:sz w:val="18"/>
-                <w:szCs w:val="18"/>
-                <w:rtl w:val="0"/>
-              </w:rPr>
-              <w:t xml:space="preserve">Epistemic Caution (EC) — retained</w:t>
-            </w:r>
-            <w:r>
-              <w:rPr>
-                <w:rtl w:val="0"/>
-                <w:sz w:val="18"/>
-                <w:szCs w:val="18"/>
-                <w:rFonts w:ascii="Georgia" w:hAnsi="Georgia"/>
-              </w:rPr>
+                <w:rFonts w:ascii="Georgia" w:hAnsi="Georgia" w:eastAsia="Georgia" w:cs="Georgia"/>
+                <w:sz w:val="24"/>
+              </w:rPr>
+              <w:t>Epistemic Caution (EC) , retained</w:t>
             </w:r>
           </w:p>
         </w:tc>
@@ -9679,24 +9574,10 @@
             </w:pPr>
             <w:r>
               <w:rPr>
-                <w:rFonts w:ascii="Georgia" w:cs="Georgia" w:eastAsia="Georgia" w:hAnsi="Georgia"/>
-                <w:b w:val="0"/>
-                <w:bCs w:val="0"/>
-                <w:i w:val="0"/>
-                <w:iCs w:val="0"/>
-                <w:sz w:val="18"/>
-                <w:szCs w:val="18"/>
-                <w:rtl w:val="0"/>
-              </w:rPr>
-              <w:t xml:space="preserve">Politeness/Deference (P) — retained</w:t>
-            </w:r>
-            <w:r>
-              <w:rPr>
-                <w:rtl w:val="0"/>
-                <w:sz w:val="18"/>
-                <w:szCs w:val="18"/>
-                <w:rFonts w:ascii="Georgia" w:hAnsi="Georgia"/>
-              </w:rPr>
+                <w:rFonts w:ascii="Georgia" w:hAnsi="Georgia" w:eastAsia="Georgia" w:cs="Georgia"/>
+                <w:sz w:val="24"/>
+              </w:rPr>
+              <w:t>Politeness/Deference (P) , retained</w:t>
             </w:r>
           </w:p>
         </w:tc>
@@ -9834,24 +9715,10 @@
             </w:pPr>
             <w:r>
               <w:rPr>
-                <w:rFonts w:ascii="Georgia" w:cs="Georgia" w:eastAsia="Georgia" w:hAnsi="Georgia"/>
-                <w:b w:val="0"/>
-                <w:bCs w:val="0"/>
-                <w:i w:val="0"/>
-                <w:iCs w:val="0"/>
-                <w:sz w:val="18"/>
-                <w:szCs w:val="18"/>
-                <w:rtl w:val="0"/>
-              </w:rPr>
-              <w:t xml:space="preserve">Not retained; not a function</w:t>
-            </w:r>
-            <w:r>
-              <w:rPr>
-                <w:rtl w:val="0"/>
-                <w:sz w:val="18"/>
-                <w:szCs w:val="18"/>
-                <w:rFonts w:ascii="Georgia" w:hAnsi="Georgia"/>
-              </w:rPr>
+                <w:rFonts w:ascii="Georgia" w:hAnsi="Georgia" w:eastAsia="Georgia" w:cs="Georgia"/>
+                <w:sz w:val="24"/>
+              </w:rPr>
+              <w:t>Not retained, not a function</w:t>
             </w:r>
           </w:p>
         </w:tc>
@@ -9967,7 +9834,7 @@
           <w:sz w:val="22"/>
           <w:szCs w:val="22"/>
         </w:rPr>
-        <w:t xml:space="preserve">No retained hedge was independently labeled Politeness. Under the Step 2 rule (claim condition, then Working Test and Reader Test), only tokens attached to claims that pass at least one removal check enter the retained hedge set. Candidates that fail the claim condition or both checks—including recommendations and other non-claims—are logged as false positives and do not count in the 65. P = 0 refers to reader-oriented softening of claims. Softened directives were out of scope under the claim condition. P-only mitigation could in principle have been retained if the Reader Test held on a claim without a truth-commitment change. In this corpus no such P forms appeared (P = 0).</w:t>
+        <w:t>No retained hedge was independently labeled Politeness. Under the Step 2 rule (claim condition, then Working Test and Reader Test), only tokens attached to claims that pass at least one removal check enter the retained hedge set. Candidates that fail the claim condition or both checks, including recommendations and other non-claims, are logged as false positives and do not count in the 65. P = 0 refers to reader-oriented softening of claims. Softened directives were out of scope under the claim condition. P-only mitigation could in principle have been retained if the Reader Test held on a claim without a truth-commitment change. In this corpus no such P forms appeared (P = 0).</w:t>
       </w:r>
     </w:p>
     <w:p>
@@ -10008,7 +9875,7 @@
           <w:sz w:val="22"/>
           <w:szCs w:val="22"/>
         </w:rPr>
-        <w:t xml:space="preserve">The relationship between hedge type and function further illuminates the patterns. Modal verbs (21 instances, all EC) were used almost exclusively to express possibility about results or implications, as in “the biosynthesis.. may affect the overall development.” Lexical hedges (41 instances, all EC) were used to qualify the strength of findings, as in “results suggest that fermented banana peel.. can significantly enhance growth.” All retained hedges were coded Epistemic Caution at Step 2. In this sample no P candidates entered the retained set. Framing and sequencing forms that failed both removal checks sit outside the retained set. They are not included in the 58 category-coded FPs (FP-Gen, FP-Rec, FP-Cap, FP-Proc). The data support a claim about the functional profile of the retained set, not a claim that writers never mitigate interpersonally outside that set.</w:t>
+        <w:t>The relationship between hedge type and function further illuminates the patterns. Modal verbs (21 instances, all EC) were used almost exclusively to express possibility about results or implications, as in “the biosynthesis. may affect the overall development.” Lexical hedges (41 instances, all EC) were used to qualify the strength of findings, as in “results suggest that fermented banana peel. can significantly enhance growth.” All retained hedges were coded Epistemic Caution at Step 2. In this sample no P candidates entered the retained set. Framing and sequencing forms that failed both removal checks sit outside the retained set. They are not included in the 58 category-coded FPs (FP-Gen, FP-Rec, FP-Cap, FP-Proc). The data support a claim about the functional profile of the retained set, not a claim that writers never mitigate interpersonally outside that set.</w:t>
       </w:r>
     </w:p>
     <w:p>
@@ -10870,7 +10737,7 @@
           <w:b w:val="0"/>
           <w:bCs w:val="0"/>
         </w:rPr>
-        <w:t xml:space="preserve">An informal reading of the tokens suggests hedges cluster in implication and conclusion sentences more than in direct results reporting. That pattern is strongest in Agriculture and weakest in Veterinary Medicine. A formal move analysis would be needed to quantify it. Under Salager-Meyer’s (1994) claim-responsibility account, writers who hedge implications take partial distance from conclusions that go beyond the measured finding, and writers who state implications flatly take fuller responsibility for those claims. Veterinary Medicine’s lower hedge density is therefore readable as less explicit softening where abstracts turn from results to implications. That is a density pattern only. It is not the same as higher overclaiming: unhedged assertions were 4 in Veterinary Medicine, 4 in Biology, and 6 in Agriculture (Table 5), so Veterinary Medicine does not lead the corpus in sites where caution was warranted but absent. The study does not claim that Veterinary Medicine writers overclaim more—only that they hedge less in this sample. Hyland’s (2005) stance model is consistent with the density reading (fewer hedges mean less explicit softening of authorial commitment) without converting it into a finding about field-wide norms.</w:t>
+        <w:t>An informal reading of the tokens suggests hedges cluster in implication and conclusion sentences more than in direct results reporting. That pattern is strongest in Agriculture and weakest in Veterinary Medicine. A formal move analysis would be needed to quantify it. Under Salager-Meyer’s (1994) claim-responsibility account, writers who hedge implications take partial distance from conclusions that go beyond the measured finding, and writers who state implications flatly take fuller responsibility for those claims. Veterinary Medicine’s lower hedge density is therefore readable as less explicit softening where abstracts turn from results to implications. That is a density pattern only. It is not the same as higher overclaiming: unhedged assertions were 4 in Veterinary Medicine, 4 in Biology, and 6 in Agriculture (Table 5), so Veterinary Medicine does not lead the corpus in sites where caution was warranted but absent. The study does not claim that Veterinary Medicine writers overclaim more, only that they hedge less in this sample. Hyland’s (2005) stance model is consistent with the density reading (fewer hedges mean less explicit softening of authorial commitment) without converting it into a finding about field-wide norms.</w:t>
       </w:r>
     </w:p>
     <w:p>
@@ -10912,7 +10779,7 @@
           <w:sz w:val="22"/>
           <w:szCs w:val="22"/>
         </w:rPr>
-        <w:t xml:space="preserve">The study cannot separate genuine field norms from adviser-enforced conventions. The findings describe the ratified abstracts, not individual cognition. Read as a local baseline, the corpus supports a limited claim: among these three PSAU programs, the only pairwise density contrast that survives correction is Biology versus Veterinary Medicine, and that contrast is not reducible to outcome type in the Binary cell comparison above. Whether that pattern reflects program practice, adviser feedback, or other institutional factors cannot be decided from abstract text alone; the present study maps the textual result, not its causes.</w:t>
+        <w:t>The study cannot separate genuine field norms from adviser-enforced conventions. The findings describe the ratified abstracts, not individual cognition. Read as a local baseline, the corpus supports a limited claim: among these three PSAU programs, the only pairwise density contrast that survives correction is Biology versus Veterinary Medicine, and that contrast is not reducible to outcome type in the Binary cell comparison above. Whether that pattern reflects program practice, adviser feedback, or other institutional factors cannot be decided from abstract text alone, the present study maps the textual result, not its causes.</w:t>
       </w:r>
     </w:p>
     <w:p>
@@ -11257,6 +11124,21 @@
     <w:p>
       <w:pPr>
         <w:spacing w:before="0" w:after="0" w:line="480" w:lineRule="auto"/>
+        <w:ind w:left="720" w:firstLine="720"/>
+        <w:jc w:val="both"/>
+        <w:rPr/>
+      </w:pPr>
+      <w:r>
+        <w:rPr>
+          <w:rFonts w:ascii="Georgia" w:hAnsi="Georgia" w:eastAsia="Georgia" w:cs="Georgia"/>
+          <w:sz w:val="24"/>
+        </w:rPr>
+        <w:t>Afshar, H. S., Moradi, M., &amp; Hamzavi, R. (2014). Frequency and type of hedging devices used in the research articles of humanities, basic sciences and agriculture. Procedia - Social and Behavioral Sciences, 136, 70-74. https://doi.org/10.1016/j.sbspro.2014.05.290</w:t>
+      </w:r>
+    </w:p>
+    <w:p>
+      <w:pPr>
+        <w:spacing w:before="0" w:after="0" w:line="480" w:lineRule="auto"/>
         <w:ind w:left="720" w:hanging="720"/>
         <w:jc w:val="left"/>
         <w:rPr/>
@@ -11268,7 +11150,7 @@
           <w:sz w:val="22"/>
           <w:szCs w:val="22"/>
         </w:rPr>
-        <w:t xml:space="preserve">Afshar, H. S., Moradi, M., &amp; Hamzavi, R. (2014). Frequency and type of hedging devices used in the research articles of humanities, basic sciences and agriculture. </w:t>
+        <w:t xml:space="preserve">Biber, D., Conrad, S., &amp; Reppen, R. (1998). </w:t>
       </w:r>
       <w:r>
         <w:rPr>
@@ -11277,7 +11159,7 @@
           <w:sz w:val="22"/>
           <w:szCs w:val="22"/>
         </w:rPr>
-        <w:t>Procedia – Social and Behavioral Sciences, 136</w:t>
+        <w:t>Corpus linguistics: Investigating language structure and use</w:t>
       </w:r>
       <w:r>
         <w:rPr>
@@ -11286,7 +11168,67 @@
           <w:sz w:val="22"/>
           <w:szCs w:val="22"/>
         </w:rPr>
-        <w:t>, 70–74. https://doi.org/10.1016/j.sbspro.2014.05.290</w:t>
+        <w:t>. Cambridge University Press.</w:t>
+      </w:r>
+    </w:p>
+    <w:p>
+      <w:pPr>
+        <w:spacing w:before="0" w:after="0" w:line="480" w:lineRule="auto"/>
+        <w:ind w:left="720" w:firstLine="720"/>
+        <w:jc w:val="both"/>
+        <w:rPr/>
+      </w:pPr>
+      <w:r>
+        <w:rPr>
+          <w:rFonts w:ascii="Georgia" w:hAnsi="Georgia" w:eastAsia="Georgia" w:cs="Georgia"/>
+          <w:sz w:val="24"/>
+        </w:rPr>
+        <w:t>Crompton, P. (1997). Hedging in academic writing: Some theoretical problems. English for Specific Purposes, 16(4), 271-287. https://doi.org/10.1016/S0889-4906(97)00007-0</w:t>
+      </w:r>
+    </w:p>
+    <w:p>
+      <w:pPr>
+        <w:spacing w:before="0" w:after="0" w:line="480" w:lineRule="auto"/>
+        <w:ind w:left="720" w:firstLine="720"/>
+        <w:jc w:val="both"/>
+        <w:rPr/>
+      </w:pPr>
+      <w:r>
+        <w:rPr>
+          <w:rFonts w:ascii="Georgia" w:hAnsi="Georgia" w:eastAsia="Georgia" w:cs="Georgia"/>
+          <w:sz w:val="24"/>
+        </w:rPr>
+        <w:t>Demir, C. (2018). Hedging and academic writing: An analysis of lexical hedges. Journal of Language and Linguistic Studies, 14(4), 74-92. https://files.eric.ed.gov/fulltext/EJ1201945.pdf</w:t>
+      </w:r>
+    </w:p>
+    <w:p>
+      <w:pPr>
+        <w:spacing w:before="0" w:after="0" w:line="480" w:lineRule="auto"/>
+        <w:ind w:left="720" w:firstLine="720"/>
+        <w:jc w:val="both"/>
+        <w:rPr/>
+      </w:pPr>
+      <w:r>
+        <w:rPr>
+          <w:rFonts w:ascii="Georgia" w:hAnsi="Georgia" w:eastAsia="Georgia" w:cs="Georgia"/>
+          <w:sz w:val="24"/>
+        </w:rPr>
+        <w:t>Escalona, S. L. (2025). Hedges and boosters in college essays: A study of linguistic modulation in student writing. International Journal of English Literature and Social Sciences, 10(1), 7-17. https://doi.org/10.22161/ijels.101.2</w:t>
+      </w:r>
+    </w:p>
+    <w:p>
+      <w:pPr>
+        <w:spacing w:before="0" w:after="0" w:line="480" w:lineRule="auto"/>
+        <w:ind w:left="720" w:firstLine="720"/>
+        <w:jc w:val="both"/>
+        <w:rPr/>
+      </w:pPr>
+      <w:r>
+        <w:rPr>
+          <w:rFonts w:ascii="Georgia" w:hAnsi="Georgia" w:eastAsia="Georgia" w:cs="Georgia"/>
+          <w:sz w:val="24"/>
+        </w:rPr>
+        <w:t>Ghia, E., Petrocelli, E., &amp; Pizziconi, S. (2022). Data possibly suggest… Hedging in second language writing: A study on advanced Italian EFL learners. Belgrade English Language and Literature Studies, 14, 47-72. https://doi.org/10.18485/bells.2022.14.2</w:t>
       </w:r>
     </w:p>
     <w:p>
@@ -11303,7 +11245,7 @@
           <w:sz w:val="22"/>
           <w:szCs w:val="22"/>
         </w:rPr>
-        <w:t xml:space="preserve">Biber, D., Conrad, S., &amp; Reppen, R. (1998). </w:t>
+        <w:t xml:space="preserve">Hamidi, H., Najafi Sarem, S., &amp; Lotfi, A. H. (2025). Exploring hedging devices in scientific research papers: A content analysis study of the Medical Journal of the Islamic Republic of Iran. </w:t>
       </w:r>
       <w:r>
         <w:rPr>
@@ -11312,7 +11254,7 @@
           <w:sz w:val="22"/>
           <w:szCs w:val="22"/>
         </w:rPr>
-        <w:t>Corpus linguistics: Investigating language structure and use</w:t>
+        <w:t>Medical Journal of the Islamic Republic of Iran, 39</w:t>
       </w:r>
       <w:r>
         <w:rPr>
@@ -11321,7 +11263,37 @@
           <w:sz w:val="22"/>
           <w:szCs w:val="22"/>
         </w:rPr>
-        <w:t>. Cambridge University Press.</w:t>
+        <w:t>, Article 125. https://pmc.ncbi.nlm.nih.gov/articles/PMC12584097/</w:t>
+      </w:r>
+    </w:p>
+    <w:p>
+      <w:pPr>
+        <w:spacing w:before="0" w:after="0" w:line="480" w:lineRule="auto"/>
+        <w:ind w:left="720" w:firstLine="720"/>
+        <w:jc w:val="both"/>
+        <w:rPr/>
+      </w:pPr>
+      <w:r>
+        <w:rPr>
+          <w:rFonts w:ascii="Georgia" w:hAnsi="Georgia" w:eastAsia="Georgia" w:cs="Georgia"/>
+          <w:sz w:val="24"/>
+        </w:rPr>
+        <w:t>Hu, G., &amp; Cao, F. (2011). Hedging and boosting in abstracts of applied linguistics articles: A comparative study of English- and Chinese-medium journals. Journal of Pragmatics, 43(11), 2795-2809. https://doi.org/10.1016/j.pragma.2011.04.007</w:t>
+      </w:r>
+    </w:p>
+    <w:p>
+      <w:pPr>
+        <w:spacing w:before="0" w:after="0" w:line="480" w:lineRule="auto"/>
+        <w:ind w:left="720" w:firstLine="720"/>
+        <w:jc w:val="both"/>
+        <w:rPr/>
+      </w:pPr>
+      <w:r>
+        <w:rPr>
+          <w:rFonts w:ascii="Georgia" w:hAnsi="Georgia" w:eastAsia="Georgia" w:cs="Georgia"/>
+          <w:sz w:val="24"/>
+        </w:rPr>
+        <w:t>Hyland, K. (1996). Writing without conviction? Hedging in science research articles. Applied Linguistics, 17(4), 433-454. https://doi.org/10.1093/applin/17.4.433</w:t>
       </w:r>
     </w:p>
     <w:p>
@@ -11338,7 +11310,7 @@
           <w:sz w:val="22"/>
           <w:szCs w:val="22"/>
         </w:rPr>
-        <w:t xml:space="preserve">Crompton, P. (1997). Hedging in academic writing: Some theoretical problems. </w:t>
+        <w:t xml:space="preserve">Hyland, K. (1998). </w:t>
       </w:r>
       <w:r>
         <w:rPr>
@@ -11347,7 +11319,7 @@
           <w:sz w:val="22"/>
           <w:szCs w:val="22"/>
         </w:rPr>
-        <w:t>English for Specific Purposes, 16</w:t>
+        <w:t>Hedging in scientific research articles</w:t>
       </w:r>
       <w:r>
         <w:rPr>
@@ -11356,7 +11328,112 @@
           <w:sz w:val="22"/>
           <w:szCs w:val="22"/>
         </w:rPr>
-        <w:t>(4), 271–287. https://doi.org/10.1016/S0889-4906(97)00007-0</w:t>
+        <w:t>. John Benjamins Publishing.</w:t>
+      </w:r>
+    </w:p>
+    <w:p>
+      <w:pPr>
+        <w:spacing w:before="0" w:after="0" w:line="480" w:lineRule="auto"/>
+        <w:ind w:left="720" w:firstLine="720"/>
+        <w:jc w:val="both"/>
+        <w:rPr/>
+      </w:pPr>
+      <w:r>
+        <w:rPr>
+          <w:rFonts w:ascii="Georgia" w:hAnsi="Georgia" w:eastAsia="Georgia" w:cs="Georgia"/>
+          <w:sz w:val="24"/>
+        </w:rPr>
+        <w:t>Hyland, K. (2005). Stance and engagement: A model of interaction in academic discourse. Discourse Studies, 7(2), 173-192. https://doi.org/10.1177/1461445605050365</w:t>
+      </w:r>
+    </w:p>
+    <w:p>
+      <w:pPr>
+        <w:spacing w:before="0" w:after="0" w:line="480" w:lineRule="auto"/>
+        <w:ind w:left="720" w:firstLine="720"/>
+        <w:jc w:val="both"/>
+        <w:rPr/>
+      </w:pPr>
+      <w:r>
+        <w:rPr>
+          <w:rFonts w:ascii="Georgia" w:hAnsi="Georgia" w:eastAsia="Georgia" w:cs="Georgia"/>
+          <w:sz w:val="24"/>
+        </w:rPr>
+        <w:t>Hyland, K., &amp; Milton, J. (1997). Qualification and certainty in L1 and L2 students’ writing. Journal of Second Language Writing, 6(2), 183-205. https://doi.org/10.1016/S1060-3743(97)90033-3</w:t>
+      </w:r>
+    </w:p>
+    <w:p>
+      <w:pPr>
+        <w:spacing w:before="0" w:after="0" w:line="480" w:lineRule="auto"/>
+        <w:ind w:left="720" w:firstLine="720"/>
+        <w:jc w:val="both"/>
+        <w:rPr/>
+      </w:pPr>
+      <w:r>
+        <w:rPr>
+          <w:rFonts w:ascii="Georgia" w:hAnsi="Georgia" w:eastAsia="Georgia" w:cs="Georgia"/>
+          <w:sz w:val="24"/>
+        </w:rPr>
+        <w:t>Imataki, N., &amp; Kobayashi, Y. (2024). Analyzing disciplinary variation in abstracts: Linguistic features across scientific and technical fields. Linguistics and Literature Studies, 12(3), 19-28. https://doi.org/10.13189/lls.2024.120301</w:t>
+      </w:r>
+    </w:p>
+    <w:p>
+      <w:pPr>
+        <w:spacing w:before="0" w:after="0" w:line="480" w:lineRule="auto"/>
+        <w:ind w:left="720" w:firstLine="720"/>
+        <w:jc w:val="both"/>
+        <w:rPr/>
+      </w:pPr>
+      <w:r>
+        <w:rPr>
+          <w:rFonts w:ascii="Georgia" w:hAnsi="Georgia" w:eastAsia="Georgia" w:cs="Georgia"/>
+          <w:sz w:val="24"/>
+        </w:rPr>
+        <w:t>Khunasathitchai, K., Sittironnarit, S., Sinturat, T., &amp; Kumdee, S. (2025). Move analysis and hedge use in the research paper abstracts of Thai EFL English-majored undergraduates. rEFLections, 32(2), 951-973. https://doi.org/10.61508/refl.v32i2.282512</w:t>
+      </w:r>
+    </w:p>
+    <w:p>
+      <w:pPr>
+        <w:spacing w:before="0" w:after="0" w:line="480" w:lineRule="auto"/>
+        <w:ind w:left="720" w:firstLine="720"/>
+        <w:jc w:val="both"/>
+        <w:rPr/>
+      </w:pPr>
+      <w:r>
+        <w:rPr>
+          <w:rFonts w:ascii="Georgia" w:hAnsi="Georgia" w:eastAsia="Georgia" w:cs="Georgia"/>
+          <w:sz w:val="24"/>
+        </w:rPr>
+        <w:t>Landis, J. R., &amp; Koch, G. G. (1977). The measurement of observer agreement for categorical data. Biometrics, 33(1), 159-174. https://doi.org/10.2307/2529310</w:t>
+      </w:r>
+    </w:p>
+    <w:p>
+      <w:pPr>
+        <w:spacing w:before="0" w:after="0" w:line="480" w:lineRule="auto"/>
+        <w:ind w:left="720" w:firstLine="720"/>
+        <w:jc w:val="both"/>
+        <w:rPr/>
+      </w:pPr>
+      <w:r>
+        <w:rPr>
+          <w:rFonts w:ascii="Georgia" w:hAnsi="Georgia" w:eastAsia="Georgia" w:cs="Georgia"/>
+          <w:sz w:val="24"/>
+        </w:rPr>
+        <w:t>Lopez, R. M. C., Pedida, J. A., Alzate, L. J. A., &amp; Eustaquio, M. T. L. (2025). Language of caution and certainty: Writing proficiency in hedges and boosters in student essays. International Journal of Research and Innovation in Social Science, 9(11), 6176-6196. https://doi.org/10.47772/IJRISS.2025.91100485</w:t>
+      </w:r>
+    </w:p>
+    <w:p>
+      <w:pPr>
+        <w:spacing w:before="0" w:after="0" w:line="480" w:lineRule="auto"/>
+        <w:ind w:left="720" w:firstLine="720"/>
+        <w:jc w:val="both"/>
+        <w:rPr/>
+      </w:pPr>
+      <w:r>
+        <w:rPr>
+          <w:rFonts w:ascii="Georgia" w:hAnsi="Georgia" w:eastAsia="Georgia" w:cs="Georgia"/>
+          <w:sz w:val="24"/>
+        </w:rPr>
+        <w:t>Mazidah, E. N., Cahyani, W. I., &amp; Masruroh, L. (2022). Hedges and boosters in undergraduate thesis abstracts of Qomaruddin University students. Journal of Education, Humaniora and Social Sciences (JEHSS), 4(3), 1657-1663. https://doi.org/10.34007/jehss.v4i3.925</w:t>
       </w:r>
     </w:p>
     <w:p>
@@ -11373,7 +11450,7 @@
           <w:sz w:val="22"/>
           <w:szCs w:val="22"/>
         </w:rPr>
-        <w:t xml:space="preserve">Demir, C. (2018). Hedging and academic writing: An analysis of lexical hedges. </w:t>
+        <w:t xml:space="preserve">Mohammed, S. J. (2011). </w:t>
       </w:r>
       <w:r>
         <w:rPr>
@@ -11382,7 +11459,7 @@
           <w:sz w:val="22"/>
           <w:szCs w:val="22"/>
         </w:rPr>
-        <w:t>Journal of Language and Linguistic Studies, 14</w:t>
+        <w:t>Lexical hedges: A study of cultural and disciplinary variation in academic research articles</w:t>
       </w:r>
       <w:r>
         <w:rPr>
@@ -11391,7 +11468,97 @@
           <w:sz w:val="22"/>
           <w:szCs w:val="22"/>
         </w:rPr>
-        <w:t>(4), 74–92. https://files.eric.ed.gov/fulltext/EJ1201945.pdf</w:t>
+        <w:t xml:space="preserve"> [Master’s thesis, Universiti Teknologi MARA]. CORE. https://core.ac.uk/download/78277430.pdf</w:t>
+      </w:r>
+    </w:p>
+    <w:p>
+      <w:pPr>
+        <w:spacing w:before="0" w:after="0" w:line="480" w:lineRule="auto"/>
+        <w:ind w:left="720" w:firstLine="720"/>
+        <w:jc w:val="both"/>
+        <w:rPr/>
+      </w:pPr>
+      <w:r>
+        <w:rPr>
+          <w:rFonts w:ascii="Georgia" w:hAnsi="Georgia" w:eastAsia="Georgia" w:cs="Georgia"/>
+          <w:sz w:val="24"/>
+        </w:rPr>
+        <w:t>Ningrum, S., Puspita, H., &amp; Mulyadi, A. I. (2024). Hedges and boosters in academic writing of ASEAN EFL learners. Journal of English Education and Teaching, 8(1), 202-218. https://doi.org/10.33369/jeet.8.1.202-218</w:t>
+      </w:r>
+    </w:p>
+    <w:p>
+      <w:pPr>
+        <w:spacing w:before="0" w:after="0" w:line="480" w:lineRule="auto"/>
+        <w:ind w:left="720" w:firstLine="720"/>
+        <w:jc w:val="both"/>
+        <w:rPr/>
+      </w:pPr>
+      <w:r>
+        <w:rPr>
+          <w:rFonts w:ascii="Georgia" w:hAnsi="Georgia" w:eastAsia="Georgia" w:cs="Georgia"/>
+          <w:sz w:val="24"/>
+        </w:rPr>
+        <w:t>Petchkij, W. (2019). Explicit teaching of hedges: Bringing hedging in academic writing into the Thai EFL classroom. Electronic Journal of Foreign Language Teaching, 16(1), 95-113. https://e-flt.nus.edu.sg/wp-content/uploads/2020/09/petchkij.pdf</w:t>
+      </w:r>
+    </w:p>
+    <w:p>
+      <w:pPr>
+        <w:spacing w:before="0" w:after="0" w:line="480" w:lineRule="auto"/>
+        <w:ind w:left="720" w:firstLine="720"/>
+        <w:jc w:val="both"/>
+        <w:rPr/>
+      </w:pPr>
+      <w:r>
+        <w:rPr>
+          <w:rFonts w:ascii="Georgia" w:hAnsi="Georgia" w:eastAsia="Georgia" w:cs="Georgia"/>
+          <w:sz w:val="24"/>
+        </w:rPr>
+        <w:t>Salager-Meyer, F. (1994). Hedges and textual communicative function in medical English written discourse. English for Specific Purposes, 13(2), 149-170. https://doi.org/10.1016/0889-4906(94)90013-2</w:t>
+      </w:r>
+    </w:p>
+    <w:p>
+      <w:pPr>
+        <w:spacing w:before="0" w:after="0" w:line="480" w:lineRule="auto"/>
+        <w:ind w:left="720" w:firstLine="720"/>
+        <w:jc w:val="both"/>
+        <w:rPr/>
+      </w:pPr>
+      <w:r>
+        <w:rPr>
+          <w:rFonts w:ascii="Georgia" w:hAnsi="Georgia" w:eastAsia="Georgia" w:cs="Georgia"/>
+          <w:sz w:val="24"/>
+        </w:rPr>
+        <w:t>Souici, F., &amp; Slougui, D. (2022). Hedges in biology research articles: What types and frequency do Algerian authors use? Journal of Human Sciences, 33(4), 49-59. https://revue.umc.edu.dz/h/article/view/4015</w:t>
+      </w:r>
+    </w:p>
+    <w:p>
+      <w:pPr>
+        <w:spacing w:before="0" w:after="0" w:line="480" w:lineRule="auto"/>
+        <w:ind w:left="720" w:firstLine="720"/>
+        <w:jc w:val="both"/>
+        <w:rPr/>
+      </w:pPr>
+      <w:r>
+        <w:rPr>
+          <w:rFonts w:ascii="Georgia" w:hAnsi="Georgia" w:eastAsia="Georgia" w:cs="Georgia"/>
+          <w:sz w:val="24"/>
+        </w:rPr>
+        <w:t>Suratno, A., &amp; Aydawati, E. N. (2025). Hedging strategies in non-science theses: A corpus-based analysis of discussion sections. ETERNAL (English Teaching Journal), 16(1), 37-52. https://journal2.upgris.ac.id/index.php/eternal/article/view/1059</w:t>
+      </w:r>
+    </w:p>
+    <w:p>
+      <w:pPr>
+        <w:spacing w:before="0" w:after="0" w:line="480" w:lineRule="auto"/>
+        <w:ind w:left="720" w:firstLine="720"/>
+        <w:jc w:val="both"/>
+        <w:rPr/>
+      </w:pPr>
+      <w:r>
+        <w:rPr>
+          <w:rFonts w:ascii="Georgia" w:hAnsi="Georgia" w:eastAsia="Georgia" w:cs="Georgia"/>
+          <w:sz w:val="24"/>
+        </w:rPr>
+        <w:t>Villanueva, V. S. (2014). Hedging devices in Philippine newspaper editorials. Asian Journal of English Language Studies, 2, 103-117. https://doi.org/10.59960/2.a5</w:t>
       </w:r>
     </w:p>
     <w:p>
@@ -11400,6 +11567,8 @@
         <w:ind w:left="720" w:hanging="720"/>
         <w:jc w:val="left"/>
         <w:rPr/>
+        <w:keepNext w:val="1"/>
+        <w:keepLines w:val="1"/>
       </w:pPr>
       <w:r>
         <w:rPr>
@@ -11408,7 +11577,7 @@
           <w:sz w:val="22"/>
           <w:szCs w:val="22"/>
         </w:rPr>
-        <w:t xml:space="preserve">Escalona, S. L. (2025). Hedges and boosters in college essays: A study of linguistic modulation in student writing. </w:t>
+        <w:t xml:space="preserve">Wang, X. (2022). </w:t>
       </w:r>
       <w:r>
         <w:rPr>
@@ -11417,7 +11586,7 @@
           <w:sz w:val="22"/>
           <w:szCs w:val="22"/>
         </w:rPr>
-        <w:t>International Journal of English Literature and Social Sciences, 10</w:t>
+        <w:t>Hedging in academic writing: Cross-disciplinary comparisons in the Michigan Corpus of Upper-Level Student Papers (MICUSP)</w:t>
       </w:r>
       <w:r>
         <w:rPr>
@@ -11426,716 +11595,14 @@
           <w:sz w:val="22"/>
           <w:szCs w:val="22"/>
         </w:rPr>
-        <w:t>(1), 7–17. https://doi.org/10.22161/ijels.101.2</w:t>
-      </w:r>
-    </w:p>
-    <w:p>
-      <w:pPr>
-        <w:spacing w:before="0" w:after="0" w:line="480" w:lineRule="auto"/>
-        <w:ind w:left="720" w:hanging="720"/>
-        <w:jc w:val="left"/>
-        <w:rPr/>
-      </w:pPr>
-      <w:r>
-        <w:rPr>
-          <w:rFonts w:ascii="Georgia" w:hAnsi="Georgia" w:eastAsia="Georgia" w:cs="Georgia"/>
-          <w:i w:val="0"/>
-          <w:sz w:val="22"/>
-          <w:szCs w:val="22"/>
-        </w:rPr>
-        <w:t xml:space="preserve">Ghia, E., Petrocelli, E., &amp; Pizziconi, S. (2022). Data possibly suggest… Hedging in second language writing: A study on advanced Italian EFL learners. </w:t>
-      </w:r>
-      <w:r>
-        <w:rPr>
-          <w:rFonts w:ascii="Georgia" w:hAnsi="Georgia" w:eastAsia="Georgia" w:cs="Georgia"/>
-          <w:i/>
-          <w:sz w:val="22"/>
-          <w:szCs w:val="22"/>
-        </w:rPr>
-        <w:t>Belgrade English Language and Literature Studies, 14</w:t>
-      </w:r>
-      <w:r>
-        <w:rPr>
-          <w:rFonts w:ascii="Georgia" w:hAnsi="Georgia" w:eastAsia="Georgia" w:cs="Georgia"/>
-          <w:i w:val="0"/>
-          <w:sz w:val="22"/>
-          <w:szCs w:val="22"/>
-        </w:rPr>
-        <w:t>, 47–72. https://doi.org/10.18485/bells.2022.14.2</w:t>
-      </w:r>
-    </w:p>
-    <w:p>
-      <w:pPr>
-        <w:spacing w:before="0" w:after="0" w:line="480" w:lineRule="auto"/>
-        <w:ind w:left="720" w:hanging="720"/>
-        <w:jc w:val="left"/>
-        <w:rPr/>
-      </w:pPr>
-      <w:r>
-        <w:rPr>
-          <w:rFonts w:ascii="Georgia" w:hAnsi="Georgia" w:eastAsia="Georgia" w:cs="Georgia"/>
-          <w:i w:val="0"/>
-          <w:sz w:val="22"/>
-          <w:szCs w:val="22"/>
-        </w:rPr>
-        <w:t xml:space="preserve">Hamidi, H., Najafi Sarem, S., &amp; Lotfi, A. H. (2025). Exploring hedging devices in scientific research papers: A content analysis study of the Medical Journal of the Islamic Republic of Iran. </w:t>
-      </w:r>
-      <w:r>
-        <w:rPr>
-          <w:rFonts w:ascii="Georgia" w:hAnsi="Georgia" w:eastAsia="Georgia" w:cs="Georgia"/>
-          <w:i/>
-          <w:sz w:val="22"/>
-          <w:szCs w:val="22"/>
-        </w:rPr>
-        <w:t>Medical Journal of the Islamic Republic of Iran, 39</w:t>
-      </w:r>
-      <w:r>
-        <w:rPr>
-          <w:rFonts w:ascii="Georgia" w:hAnsi="Georgia" w:eastAsia="Georgia" w:cs="Georgia"/>
-          <w:i w:val="0"/>
-          <w:sz w:val="22"/>
-          <w:szCs w:val="22"/>
-        </w:rPr>
-        <w:t>, Article 125. https://pmc.ncbi.nlm.nih.gov/articles/PMC12584097/</w:t>
-      </w:r>
-    </w:p>
-    <w:p>
-      <w:pPr>
-        <w:spacing w:before="0" w:after="0" w:line="480" w:lineRule="auto"/>
-        <w:ind w:left="720" w:hanging="720"/>
-        <w:jc w:val="left"/>
-        <w:rPr/>
-      </w:pPr>
-      <w:r>
-        <w:rPr>
-          <w:rFonts w:ascii="Georgia" w:hAnsi="Georgia" w:eastAsia="Georgia" w:cs="Georgia"/>
-          <w:i w:val="0"/>
-          <w:sz w:val="22"/>
-          <w:szCs w:val="22"/>
-        </w:rPr>
-        <w:t xml:space="preserve">Hu, G., &amp; Cao, F. (2011). Hedging and boosting in abstracts of applied linguistics articles: A comparative study of English- and Chinese-medium journals. </w:t>
-      </w:r>
-      <w:r>
-        <w:rPr>
-          <w:rFonts w:ascii="Georgia" w:hAnsi="Georgia" w:eastAsia="Georgia" w:cs="Georgia"/>
-          <w:i/>
-          <w:sz w:val="22"/>
-          <w:szCs w:val="22"/>
-        </w:rPr>
-        <w:t>Journal of Pragmatics, 43</w:t>
-      </w:r>
-      <w:r>
-        <w:rPr>
-          <w:rFonts w:ascii="Georgia" w:hAnsi="Georgia" w:eastAsia="Georgia" w:cs="Georgia"/>
-          <w:i w:val="0"/>
-          <w:sz w:val="22"/>
-          <w:szCs w:val="22"/>
-        </w:rPr>
-        <w:t>(11), 2795–2809. https://doi.org/10.1016/j.pragma.2011.04.007</w:t>
-      </w:r>
-    </w:p>
-    <w:p>
-      <w:pPr>
-        <w:spacing w:before="0" w:after="0" w:line="480" w:lineRule="auto"/>
-        <w:ind w:left="720" w:hanging="720"/>
-        <w:jc w:val="left"/>
-        <w:rPr/>
-      </w:pPr>
-      <w:r>
-        <w:rPr>
-          <w:rFonts w:ascii="Georgia" w:hAnsi="Georgia" w:eastAsia="Georgia" w:cs="Georgia"/>
-          <w:i w:val="0"/>
-          <w:sz w:val="22"/>
-          <w:szCs w:val="22"/>
-        </w:rPr>
-        <w:t xml:space="preserve">Hyland, K. (1996). Writing without conviction? Hedging in science research articles. </w:t>
-      </w:r>
-      <w:r>
-        <w:rPr>
-          <w:rFonts w:ascii="Georgia" w:hAnsi="Georgia" w:eastAsia="Georgia" w:cs="Georgia"/>
-          <w:i/>
-          <w:sz w:val="22"/>
-          <w:szCs w:val="22"/>
-        </w:rPr>
-        <w:t>Applied Linguistics, 17</w:t>
-      </w:r>
-      <w:r>
-        <w:rPr>
-          <w:rFonts w:ascii="Georgia" w:hAnsi="Georgia" w:eastAsia="Georgia" w:cs="Georgia"/>
-          <w:i w:val="0"/>
-          <w:sz w:val="22"/>
-          <w:szCs w:val="22"/>
-        </w:rPr>
-        <w:t>(4), 433–454. https://doi.org/10.1093/applin/17.4.433</w:t>
-      </w:r>
-    </w:p>
-    <w:p>
-      <w:pPr>
-        <w:spacing w:before="0" w:after="0" w:line="480" w:lineRule="auto"/>
-        <w:ind w:left="720" w:hanging="720"/>
-        <w:jc w:val="left"/>
-        <w:rPr/>
-      </w:pPr>
-      <w:r>
-        <w:rPr>
-          <w:rFonts w:ascii="Georgia" w:hAnsi="Georgia" w:eastAsia="Georgia" w:cs="Georgia"/>
-          <w:i w:val="0"/>
-          <w:sz w:val="22"/>
-          <w:szCs w:val="22"/>
-        </w:rPr>
-        <w:t xml:space="preserve">Hyland, K. (1998). </w:t>
-      </w:r>
-      <w:r>
-        <w:rPr>
-          <w:rFonts w:ascii="Georgia" w:hAnsi="Georgia" w:eastAsia="Georgia" w:cs="Georgia"/>
-          <w:i/>
-          <w:sz w:val="22"/>
-          <w:szCs w:val="22"/>
-        </w:rPr>
-        <w:t>Hedging in scientific research articles</w:t>
-      </w:r>
-      <w:r>
-        <w:rPr>
-          <w:rFonts w:ascii="Georgia" w:hAnsi="Georgia" w:eastAsia="Georgia" w:cs="Georgia"/>
-          <w:i w:val="0"/>
-          <w:sz w:val="22"/>
-          <w:szCs w:val="22"/>
-        </w:rPr>
-        <w:t>. John Benjamins Publishing.</w:t>
-      </w:r>
-    </w:p>
-    <w:p>
-      <w:pPr>
-        <w:spacing w:before="0" w:after="0" w:line="480" w:lineRule="auto"/>
-        <w:ind w:left="720" w:hanging="720"/>
-        <w:jc w:val="left"/>
-        <w:rPr/>
-      </w:pPr>
-      <w:r>
-        <w:rPr>
-          <w:rFonts w:ascii="Georgia" w:hAnsi="Georgia" w:eastAsia="Georgia" w:cs="Georgia"/>
-          <w:i w:val="0"/>
-          <w:sz w:val="22"/>
-          <w:szCs w:val="22"/>
-        </w:rPr>
-        <w:t xml:space="preserve">Hyland, K. (2005). Stance and engagement: A model of interaction in academic discourse. </w:t>
-      </w:r>
-      <w:r>
-        <w:rPr>
-          <w:rFonts w:ascii="Georgia" w:hAnsi="Georgia" w:eastAsia="Georgia" w:cs="Georgia"/>
-          <w:i/>
-          <w:sz w:val="22"/>
-          <w:szCs w:val="22"/>
-        </w:rPr>
-        <w:t>Discourse Studies, 7</w:t>
-      </w:r>
-      <w:r>
-        <w:rPr>
-          <w:rFonts w:ascii="Georgia" w:hAnsi="Georgia" w:eastAsia="Georgia" w:cs="Georgia"/>
-          <w:i w:val="0"/>
-          <w:sz w:val="22"/>
-          <w:szCs w:val="22"/>
-        </w:rPr>
-        <w:t>(2), 173–192. https://doi.org/10.1177/1461445605050365</w:t>
-      </w:r>
-    </w:p>
-    <w:p>
-      <w:pPr>
-        <w:spacing w:before="0" w:after="0" w:line="480" w:lineRule="auto"/>
-        <w:ind w:left="720" w:hanging="720"/>
-        <w:jc w:val="left"/>
-        <w:rPr/>
-      </w:pPr>
-      <w:r>
-        <w:rPr>
-          <w:rFonts w:ascii="Georgia" w:hAnsi="Georgia" w:eastAsia="Georgia" w:cs="Georgia"/>
-          <w:i w:val="0"/>
-          <w:sz w:val="22"/>
-          <w:szCs w:val="22"/>
-        </w:rPr>
-        <w:t xml:space="preserve">Hyland, K., &amp; Milton, J. (1997). Qualification and certainty in L1 and L2 students’ writing. </w:t>
-      </w:r>
-      <w:r>
-        <w:rPr>
-          <w:rFonts w:ascii="Georgia" w:hAnsi="Georgia" w:eastAsia="Georgia" w:cs="Georgia"/>
-          <w:i/>
-          <w:sz w:val="22"/>
-          <w:szCs w:val="22"/>
-        </w:rPr>
-        <w:t>Journal of Second Language Writing, 6</w:t>
-      </w:r>
-      <w:r>
-        <w:rPr>
-          <w:rFonts w:ascii="Georgia" w:hAnsi="Georgia" w:eastAsia="Georgia" w:cs="Georgia"/>
-          <w:i w:val="0"/>
-          <w:sz w:val="22"/>
-          <w:szCs w:val="22"/>
-        </w:rPr>
-        <w:t>(2), 183–205. https://doi.org/10.1016/S1060-3743(97)90033-3</w:t>
-      </w:r>
-    </w:p>
-    <w:p>
-      <w:pPr>
-        <w:spacing w:before="0" w:after="0" w:line="480" w:lineRule="auto"/>
-        <w:ind w:left="720" w:hanging="720"/>
-        <w:jc w:val="left"/>
-        <w:rPr/>
-      </w:pPr>
-      <w:r>
-        <w:rPr>
-          <w:rFonts w:ascii="Georgia" w:hAnsi="Georgia" w:eastAsia="Georgia" w:cs="Georgia"/>
-          <w:i w:val="0"/>
-          <w:sz w:val="22"/>
-          <w:szCs w:val="22"/>
-        </w:rPr>
-        <w:t xml:space="preserve">Imataki, N., &amp; Kobayashi, Y. (2024). Analyzing disciplinary variation in abstracts: Linguistic features across scientific and technical fields. </w:t>
-      </w:r>
-      <w:r>
-        <w:rPr>
-          <w:rFonts w:ascii="Georgia" w:hAnsi="Georgia" w:eastAsia="Georgia" w:cs="Georgia"/>
-          <w:i/>
-          <w:sz w:val="22"/>
-          <w:szCs w:val="22"/>
-        </w:rPr>
-        <w:t>Linguistics and Literature Studies, 12</w:t>
-      </w:r>
-      <w:r>
-        <w:rPr>
-          <w:rFonts w:ascii="Georgia" w:hAnsi="Georgia" w:eastAsia="Georgia" w:cs="Georgia"/>
-          <w:i w:val="0"/>
-          <w:sz w:val="22"/>
-          <w:szCs w:val="22"/>
-        </w:rPr>
-        <w:t>(3), 19–28. https://doi.org/10.13189/lls.2024.120301</w:t>
-      </w:r>
-    </w:p>
-    <w:p>
-      <w:pPr>
-        <w:spacing w:before="0" w:after="0" w:line="480" w:lineRule="auto"/>
-        <w:ind w:left="720" w:hanging="720"/>
-        <w:jc w:val="left"/>
-        <w:rPr/>
-      </w:pPr>
-      <w:r>
-        <w:rPr>
-          <w:rFonts w:ascii="Georgia" w:hAnsi="Georgia" w:eastAsia="Georgia" w:cs="Georgia"/>
-          <w:i w:val="0"/>
-          <w:sz w:val="22"/>
-          <w:szCs w:val="22"/>
-        </w:rPr>
-        <w:t xml:space="preserve">Khunasathitchai, K., Sittironnarit, S., Sinturat, T., &amp; Kumdee, S. (2025). Move analysis and hedge use in the research paper abstracts of Thai EFL English-majored undergraduates. </w:t>
-      </w:r>
-      <w:r>
-        <w:rPr>
-          <w:rFonts w:ascii="Georgia" w:hAnsi="Georgia" w:eastAsia="Georgia" w:cs="Georgia"/>
-          <w:i/>
-          <w:sz w:val="22"/>
-          <w:szCs w:val="22"/>
-        </w:rPr>
-        <w:t>rEFLections, 32</w:t>
-      </w:r>
-      <w:r>
-        <w:rPr>
-          <w:rFonts w:ascii="Georgia" w:hAnsi="Georgia" w:eastAsia="Georgia" w:cs="Georgia"/>
-          <w:i w:val="0"/>
-          <w:sz w:val="22"/>
-          <w:szCs w:val="22"/>
-        </w:rPr>
-        <w:t>(2), 951–973. https://doi.org/10.61508/refl.v32i2.282512</w:t>
-      </w:r>
-    </w:p>
-    <w:p>
-      <w:pPr>
-        <w:spacing w:before="0" w:after="0" w:line="480" w:lineRule="auto"/>
-        <w:ind w:left="720" w:hanging="720"/>
-        <w:jc w:val="left"/>
-        <w:rPr/>
-      </w:pPr>
-      <w:r>
-        <w:rPr>
-          <w:rFonts w:ascii="Georgia" w:hAnsi="Georgia" w:eastAsia="Georgia" w:cs="Georgia"/>
-          <w:i w:val="0"/>
-          <w:sz w:val="22"/>
-          <w:szCs w:val="22"/>
-        </w:rPr>
-        <w:t xml:space="preserve">Landis, J. R., &amp; Koch, G. G. (1977). The measurement of observer agreement for categorical data. </w:t>
-      </w:r>
-      <w:r>
-        <w:rPr>
-          <w:rFonts w:ascii="Georgia" w:hAnsi="Georgia" w:eastAsia="Georgia" w:cs="Georgia"/>
-          <w:i/>
-          <w:sz w:val="22"/>
-          <w:szCs w:val="22"/>
-        </w:rPr>
-        <w:t>Biometrics, 33</w:t>
-      </w:r>
-      <w:r>
-        <w:rPr>
-          <w:rFonts w:ascii="Georgia" w:hAnsi="Georgia" w:eastAsia="Georgia" w:cs="Georgia"/>
-          <w:i w:val="0"/>
-          <w:sz w:val="22"/>
-          <w:szCs w:val="22"/>
-        </w:rPr>
-        <w:t>(1), 159–174. https://doi.org/10.2307/2529310</w:t>
-      </w:r>
-    </w:p>
-    <w:p>
-      <w:pPr>
-        <w:spacing w:before="0" w:after="0" w:line="480" w:lineRule="auto"/>
-        <w:ind w:left="720" w:hanging="720"/>
-        <w:jc w:val="left"/>
-        <w:rPr/>
-      </w:pPr>
-      <w:r>
-        <w:rPr>
-          <w:rFonts w:ascii="Georgia" w:hAnsi="Georgia" w:eastAsia="Georgia" w:cs="Georgia"/>
-          <w:i w:val="0"/>
-          <w:sz w:val="22"/>
-          <w:szCs w:val="22"/>
-        </w:rPr>
-        <w:t xml:space="preserve">Lopez, R. M. C., Pedida, J. A., Alzate, L. J. A., &amp; Eustaquio, M. T. L. (2025). Language of caution and certainty: Writing proficiency in hedges and boosters in student essays. </w:t>
-      </w:r>
-      <w:r>
-        <w:rPr>
-          <w:rFonts w:ascii="Georgia" w:hAnsi="Georgia" w:eastAsia="Georgia" w:cs="Georgia"/>
-          <w:i/>
-          <w:sz w:val="22"/>
-          <w:szCs w:val="22"/>
-        </w:rPr>
-        <w:t>International Journal of Research and Innovation in Social Science, 9</w:t>
-      </w:r>
-      <w:r>
-        <w:rPr>
-          <w:rFonts w:ascii="Georgia" w:hAnsi="Georgia" w:eastAsia="Georgia" w:cs="Georgia"/>
-          <w:i w:val="0"/>
-          <w:sz w:val="22"/>
-          <w:szCs w:val="22"/>
-        </w:rPr>
-        <w:t>(11), 6176–6196. https://doi.org/10.47772/IJRISS.2025.91100485</w:t>
-      </w:r>
-    </w:p>
-    <w:p>
-      <w:pPr>
-        <w:spacing w:before="0" w:after="0" w:line="480" w:lineRule="auto"/>
-        <w:ind w:left="720" w:hanging="720"/>
-        <w:jc w:val="left"/>
-        <w:rPr/>
-      </w:pPr>
-      <w:r>
-        <w:rPr>
-          <w:rFonts w:ascii="Georgia" w:hAnsi="Georgia" w:eastAsia="Georgia" w:cs="Georgia"/>
-          <w:i w:val="0"/>
-          <w:sz w:val="22"/>
-          <w:szCs w:val="22"/>
-        </w:rPr>
-        <w:t xml:space="preserve">Mazidah, E. N., Cahyani, W. I., &amp; Masruroh, L. (2022). Hedges and boosters in undergraduate thesis abstracts of Qomaruddin University students. </w:t>
-      </w:r>
-      <w:r>
-        <w:rPr>
-          <w:rFonts w:ascii="Georgia" w:hAnsi="Georgia" w:eastAsia="Georgia" w:cs="Georgia"/>
-          <w:i/>
-          <w:sz w:val="22"/>
-          <w:szCs w:val="22"/>
-        </w:rPr>
-        <w:t>Journal of Education, Humaniora and Social Sciences (JEHSS), 4</w:t>
-      </w:r>
-      <w:r>
-        <w:rPr>
-          <w:rFonts w:ascii="Georgia" w:hAnsi="Georgia" w:eastAsia="Georgia" w:cs="Georgia"/>
-          <w:i w:val="0"/>
-          <w:sz w:val="22"/>
-          <w:szCs w:val="22"/>
-        </w:rPr>
-        <w:t>(3), 1657–1663. https://doi.org/10.34007/jehss.v4i3.925</w:t>
-      </w:r>
-    </w:p>
-    <w:p>
-      <w:pPr>
-        <w:spacing w:before="0" w:after="0" w:line="480" w:lineRule="auto"/>
-        <w:ind w:left="720" w:hanging="720"/>
-        <w:jc w:val="left"/>
-        <w:rPr/>
-      </w:pPr>
-      <w:r>
-        <w:rPr>
-          <w:rFonts w:ascii="Georgia" w:hAnsi="Georgia" w:eastAsia="Georgia" w:cs="Georgia"/>
-          <w:i w:val="0"/>
-          <w:sz w:val="22"/>
-          <w:szCs w:val="22"/>
-        </w:rPr>
-        <w:t xml:space="preserve">Mohammed, S. J. (2011). </w:t>
-      </w:r>
-      <w:r>
-        <w:rPr>
-          <w:rFonts w:ascii="Georgia" w:hAnsi="Georgia" w:eastAsia="Georgia" w:cs="Georgia"/>
-          <w:i/>
-          <w:sz w:val="22"/>
-          <w:szCs w:val="22"/>
-        </w:rPr>
-        <w:t>Lexical hedges: A study of cultural and disciplinary variation in academic research articles</w:t>
-      </w:r>
-      <w:r>
-        <w:rPr>
-          <w:rFonts w:ascii="Georgia" w:hAnsi="Georgia" w:eastAsia="Georgia" w:cs="Georgia"/>
-          <w:i w:val="0"/>
-          <w:sz w:val="22"/>
-          <w:szCs w:val="22"/>
-        </w:rPr>
-        <w:t xml:space="preserve"> [Master’s thesis, Universiti Teknologi MARA]. CORE. https://core.ac.uk/download/78277430.pdf</w:t>
-      </w:r>
-    </w:p>
-    <w:p>
-      <w:pPr>
-        <w:spacing w:before="0" w:after="0" w:line="480" w:lineRule="auto"/>
-        <w:ind w:left="720" w:hanging="720"/>
-        <w:jc w:val="left"/>
-        <w:rPr/>
-      </w:pPr>
-      <w:r>
-        <w:rPr>
-          <w:rFonts w:ascii="Georgia" w:hAnsi="Georgia" w:eastAsia="Georgia" w:cs="Georgia"/>
-          <w:i w:val="0"/>
-          <w:sz w:val="22"/>
-          <w:szCs w:val="22"/>
-        </w:rPr>
-        <w:t xml:space="preserve">Ningrum, S., Puspita, H., &amp; Mulyadi, A. I. (2024). Hedges and boosters in academic writing of ASEAN EFL learners. </w:t>
-      </w:r>
-      <w:r>
-        <w:rPr>
-          <w:rFonts w:ascii="Georgia" w:hAnsi="Georgia" w:eastAsia="Georgia" w:cs="Georgia"/>
-          <w:i/>
-          <w:sz w:val="22"/>
-          <w:szCs w:val="22"/>
-        </w:rPr>
-        <w:t>Journal of English Education and Teaching, 8</w:t>
-      </w:r>
-      <w:r>
-        <w:rPr>
-          <w:rFonts w:ascii="Georgia" w:hAnsi="Georgia" w:eastAsia="Georgia" w:cs="Georgia"/>
-          <w:i w:val="0"/>
-          <w:sz w:val="22"/>
-          <w:szCs w:val="22"/>
-        </w:rPr>
-        <w:t>(1), 202–218. https://doi.org/10.33369/jeet.8.1.202-218</w:t>
-      </w:r>
-    </w:p>
-    <w:p>
-      <w:pPr>
-        <w:spacing w:before="0" w:after="0" w:line="480" w:lineRule="auto"/>
-        <w:ind w:left="720" w:hanging="720"/>
-        <w:jc w:val="left"/>
-        <w:rPr/>
-      </w:pPr>
-      <w:r>
-        <w:rPr>
-          <w:rFonts w:ascii="Georgia" w:hAnsi="Georgia" w:eastAsia="Georgia" w:cs="Georgia"/>
-          <w:i w:val="0"/>
-          <w:sz w:val="22"/>
-          <w:szCs w:val="22"/>
-        </w:rPr>
-        <w:t xml:space="preserve">Petchkij, W. (2019). Explicit teaching of hedges: Bringing hedging in academic writing into the Thai EFL classroom. </w:t>
-      </w:r>
-      <w:r>
-        <w:rPr>
-          <w:rFonts w:ascii="Georgia" w:hAnsi="Georgia" w:eastAsia="Georgia" w:cs="Georgia"/>
-          <w:i/>
-          <w:sz w:val="22"/>
-          <w:szCs w:val="22"/>
-        </w:rPr>
-        <w:t>Electronic Journal of Foreign Language Teaching, 16</w:t>
-      </w:r>
-      <w:r>
-        <w:rPr>
-          <w:rFonts w:ascii="Georgia" w:hAnsi="Georgia" w:eastAsia="Georgia" w:cs="Georgia"/>
-          <w:i w:val="0"/>
-          <w:sz w:val="22"/>
-          <w:szCs w:val="22"/>
-        </w:rPr>
-        <w:t>(1), 95–113. https://e-flt.nus.edu.sg/wp-content/uploads/2020/09/petchkij.pdf</w:t>
-      </w:r>
-    </w:p>
-    <w:p>
-      <w:pPr>
-        <w:spacing w:before="0" w:after="0" w:line="480" w:lineRule="auto"/>
-        <w:ind w:left="720" w:hanging="720"/>
-        <w:jc w:val="left"/>
-        <w:rPr/>
-      </w:pPr>
-      <w:r>
-        <w:rPr>
-          <w:rFonts w:ascii="Georgia" w:hAnsi="Georgia" w:eastAsia="Georgia" w:cs="Georgia"/>
-          <w:i w:val="0"/>
-          <w:sz w:val="22"/>
-          <w:szCs w:val="22"/>
-        </w:rPr>
-        <w:t xml:space="preserve">Salager-Meyer, F. (1994). Hedges and textual communicative function in medical English written discourse. </w:t>
-      </w:r>
-      <w:r>
-        <w:rPr>
-          <w:rFonts w:ascii="Georgia" w:hAnsi="Georgia" w:eastAsia="Georgia" w:cs="Georgia"/>
-          <w:i/>
-          <w:sz w:val="22"/>
-          <w:szCs w:val="22"/>
-        </w:rPr>
-        <w:t>English for Specific Purposes, 13</w:t>
-      </w:r>
-      <w:r>
-        <w:rPr>
-          <w:rFonts w:ascii="Georgia" w:hAnsi="Georgia" w:eastAsia="Georgia" w:cs="Georgia"/>
-          <w:i w:val="0"/>
-          <w:sz w:val="22"/>
-          <w:szCs w:val="22"/>
-        </w:rPr>
-        <w:t>(2), 149–170. https://doi.org/10.1016/0889-4906(94)90013-2</w:t>
-      </w:r>
-    </w:p>
-    <w:p>
-      <w:pPr>
-        <w:spacing w:before="0" w:after="0" w:line="480" w:lineRule="auto"/>
-        <w:ind w:left="720" w:hanging="720"/>
-        <w:jc w:val="left"/>
-        <w:rPr/>
-      </w:pPr>
-      <w:r>
-        <w:rPr>
-          <w:rFonts w:ascii="Georgia" w:hAnsi="Georgia" w:eastAsia="Georgia" w:cs="Georgia"/>
-          <w:i w:val="0"/>
-          <w:sz w:val="22"/>
-          <w:szCs w:val="22"/>
-        </w:rPr>
-        <w:t xml:space="preserve">Souici, F., &amp; Slougui, D. (2022). Hedges in biology research articles: What types and frequency do Algerian authors use? </w:t>
-      </w:r>
-      <w:r>
-        <w:rPr>
-          <w:rFonts w:ascii="Georgia" w:hAnsi="Georgia" w:eastAsia="Georgia" w:cs="Georgia"/>
-          <w:i/>
-          <w:sz w:val="22"/>
-          <w:szCs w:val="22"/>
-        </w:rPr>
-        <w:t>Journal of Human Sciences, 33</w:t>
-      </w:r>
-      <w:r>
-        <w:rPr>
-          <w:rFonts w:ascii="Georgia" w:hAnsi="Georgia" w:eastAsia="Georgia" w:cs="Georgia"/>
-          <w:i w:val="0"/>
-          <w:sz w:val="22"/>
-          <w:szCs w:val="22"/>
-        </w:rPr>
-        <w:t>(4), 49–59. https://revue.umc.edu.dz/h/article/view/4015</w:t>
-      </w:r>
-    </w:p>
-    <w:p>
-      <w:pPr>
-        <w:spacing w:before="0" w:after="0" w:line="480" w:lineRule="auto"/>
-        <w:ind w:left="720" w:hanging="720"/>
-        <w:jc w:val="left"/>
-        <w:rPr/>
-      </w:pPr>
-      <w:r>
-        <w:rPr>
-          <w:rFonts w:ascii="Georgia" w:hAnsi="Georgia" w:eastAsia="Georgia" w:cs="Georgia"/>
-          <w:i w:val="0"/>
-          <w:sz w:val="22"/>
-          <w:szCs w:val="22"/>
-        </w:rPr>
-        <w:t xml:space="preserve">Suratno, A., &amp; Aydawati, E. N. (2025). Hedging strategies in non-science theses: A corpus-based analysis of discussion sections. </w:t>
-      </w:r>
-      <w:r>
-        <w:rPr>
-          <w:rFonts w:ascii="Georgia" w:hAnsi="Georgia" w:eastAsia="Georgia" w:cs="Georgia"/>
-          <w:i/>
-          <w:sz w:val="22"/>
-          <w:szCs w:val="22"/>
-        </w:rPr>
-        <w:t>ETERNAL (English Teaching Journal), 16</w:t>
-      </w:r>
-      <w:r>
-        <w:rPr>
-          <w:rFonts w:ascii="Georgia" w:hAnsi="Georgia" w:eastAsia="Georgia" w:cs="Georgia"/>
-          <w:i w:val="0"/>
-          <w:sz w:val="22"/>
-          <w:szCs w:val="22"/>
-        </w:rPr>
-        <w:t>(1), 37–52. https://journal2.upgris.ac.id/index.php/eternal/article/view/1059</w:t>
-      </w:r>
-    </w:p>
-    <w:p>
-      <w:pPr>
-        <w:spacing w:before="0" w:after="0" w:line="480" w:lineRule="auto"/>
-        <w:ind w:left="720" w:hanging="720"/>
-        <w:jc w:val="left"/>
-        <w:rPr/>
-      </w:pPr>
-      <w:r>
-        <w:rPr>
-          <w:rFonts w:ascii="Georgia" w:hAnsi="Georgia" w:eastAsia="Georgia" w:cs="Georgia"/>
-          <w:i w:val="0"/>
-          <w:sz w:val="22"/>
-          <w:szCs w:val="22"/>
-        </w:rPr>
-        <w:t xml:space="preserve">Villanueva, V. S. (2014). Hedging devices in Philippine newspaper editorials. </w:t>
-      </w:r>
-      <w:r>
-        <w:rPr>
-          <w:rFonts w:ascii="Georgia" w:hAnsi="Georgia" w:eastAsia="Georgia" w:cs="Georgia"/>
-          <w:i/>
-          <w:sz w:val="22"/>
-          <w:szCs w:val="22"/>
-        </w:rPr>
-        <w:t>Asian Journal of English Language Studies, 2</w:t>
-      </w:r>
-      <w:r>
-        <w:rPr>
-          <w:rFonts w:ascii="Georgia" w:hAnsi="Georgia" w:eastAsia="Georgia" w:cs="Georgia"/>
-          <w:i w:val="0"/>
-          <w:sz w:val="22"/>
-          <w:szCs w:val="22"/>
-        </w:rPr>
-        <w:t>, 103–117. https://doi.org/10.59960/2.a5</w:t>
-      </w:r>
-    </w:p>
-    <w:p>
-      <w:pPr>
-        <w:spacing w:before="0" w:after="0" w:line="480" w:lineRule="auto"/>
-        <w:ind w:left="720" w:hanging="720"/>
-        <w:jc w:val="left"/>
-        <w:rPr/>
-        <w:keepNext w:val="1"/>
-        <w:keepLines w:val="1"/>
-      </w:pPr>
-      <w:r>
-        <w:rPr>
-          <w:rFonts w:ascii="Georgia" w:hAnsi="Georgia" w:eastAsia="Georgia" w:cs="Georgia"/>
-          <w:i w:val="0"/>
-          <w:sz w:val="22"/>
-          <w:szCs w:val="22"/>
-        </w:rPr>
-        <w:t xml:space="preserve">Wang, X. (2022). </w:t>
-      </w:r>
-      <w:r>
-        <w:rPr>
-          <w:rFonts w:ascii="Georgia" w:hAnsi="Georgia" w:eastAsia="Georgia" w:cs="Georgia"/>
-          <w:i/>
-          <w:sz w:val="22"/>
-          <w:szCs w:val="22"/>
-        </w:rPr>
-        <w:t>Hedging in academic writing: Cross-disciplinary comparisons in the Michigan Corpus of Upper-Level Student Papers (MICUSP)</w:t>
-      </w:r>
-      <w:r>
-        <w:rPr>
-          <w:rFonts w:ascii="Georgia" w:hAnsi="Georgia" w:eastAsia="Georgia" w:cs="Georgia"/>
-          <w:i w:val="0"/>
-          <w:sz w:val="22"/>
-          <w:szCs w:val="22"/>
-        </w:rPr>
         <w:t xml:space="preserve"> [Preprint]. OSF Preprints. https://osf.io/preprints/edarxiv/5xj27</w:t>
       </w:r>
     </w:p>
     <w:p>
       <w:pPr>
         <w:spacing w:before="0" w:after="0" w:line="480" w:lineRule="auto"/>
-        <w:ind w:left="720" w:hanging="720"/>
-        <w:jc w:val="left"/>
+        <w:ind w:left="720" w:firstLine="720"/>
+        <w:jc w:val="both"/>
         <w:rPr/>
         <w:keepLines w:val="1"/>
         <w:widowControl w:val="1"/>
@@ -12151,29 +11618,9 @@
       <w:r>
         <w:rPr>
           <w:rFonts w:ascii="Georgia" w:hAnsi="Georgia" w:eastAsia="Georgia" w:cs="Georgia"/>
-          <w:i w:val="0"/>
-          <w:sz w:val="22"/>
-          <w:szCs w:val="22"/>
-        </w:rPr>
-        <w:t xml:space="preserve">Xie, S., &amp; Mi, C. (2023). Promotion and caution in research article abstracts: The use of positive, negative and hedge words across disciplines and rankings. </w:t>
-      </w:r>
-      <w:r>
-        <w:rPr>
-          <w:rFonts w:ascii="Georgia" w:hAnsi="Georgia" w:eastAsia="Georgia" w:cs="Georgia"/>
-          <w:i/>
-          <w:sz w:val="22"/>
-          <w:szCs w:val="22"/>
-        </w:rPr>
-        <w:t>Learned Publishing, 36</w:t>
-      </w:r>
-      <w:r>
-        <w:rPr>
-          <w:rFonts w:ascii="Georgia" w:hAnsi="Georgia" w:eastAsia="Georgia" w:cs="Georgia"/>
-          <w:i w:val="0"/>
-          <w:sz w:val="22"/>
-          <w:szCs w:val="22"/>
-        </w:rPr>
-        <w:t>(2), 249–265. https://doi.org/10.1002/leap.1515</w:t>
+          <w:sz w:val="24"/>
+        </w:rPr>
+        <w:t>Xie, S., &amp; Mi, C. (2023). Promotion and caution in research article abstracts: The use of positive, negative and hedge words across disciplines and rankings. Learned Publishing, 36(2), 249-265. https://doi.org/10.1002/leap.1515</w:t>
       </w:r>
     </w:p>
     <w:p>
@@ -12396,7 +11843,7 @@
           <w:szCs w:val="20"/>
           <w:rtl w:val="0"/>
         </w:rPr>
-        <w:t>Core rules: suggest/indicate finding→hedge, recommendation→FP-Rec; can/may possibility→hedge, capability→FP-Cap; generally/typically claim-limit→hedge, procedural→FP-Proc; appear/seem result-uncertainty→hedge, location→FP-Gen.</w:t>
+        <w:t>Core rules: suggest/indicate finding→hedge, recommendation→FP-Rec, can/may possibility→hedge, capability→FP-Cap, generally/typically claim-limit→hedge, procedural→FP-Proc, appear/seem result-uncertainty→hedge, location→FP-Gen.</w:t>
       </w:r>
     </w:p>
     <w:p>
@@ -12410,7 +11857,7 @@
           <w:sz w:val="20"/>
           <w:szCs w:val="20"/>
         </w:rPr>
-        <w:t xml:space="preserve">Steps 1–3: Step 1 wide-net candidates. Step 2 = claim condition, then Working Test + Reader Test → EC, P, or FP. Step 3 = type on retained P and EC only.</w:t>
+        <w:t>Steps 1-3: Step 1 wide-net candidates. Step 2 = claim condition, then Working Test + Reader Test → EC, P, or FP. Step 3 = type on retained P and EC only.</w:t>
       </w:r>
     </w:p>
     <w:p>
@@ -12798,35 +12245,10 @@
             </w:pPr>
             <w:r>
               <w:rPr>
-                <w:rFonts w:ascii="Georgia" w:cs="Georgia" w:eastAsia="Georgia" w:hAnsi="Georgia"/>
-                <w:i w:val="0"/>
-                <w:iCs w:val="0"/>
-                <w:color w:val="8B4513"/>
-                <w:sz w:val="18"/>
-                <w:szCs w:val="18"/>
-                <w:rtl w:val="0"/>
-              </w:rPr>
-              <w:t xml:space="preserve">—</w:t>
-            </w:r>
-            <w:r>
-              <w:rPr>
-                <w:rFonts w:ascii="Georgia" w:cs="Georgia" w:eastAsia="Georgia" w:hAnsi="Georgia"/>
-                <w:i w:val="0"/>
-                <w:iCs w:val="0"/>
-                <w:color w:val="000000"/>
-                <w:sz w:val="18"/>
-                <w:szCs w:val="18"/>
-                <w:rtl w:val="0"/>
-              </w:rPr>
-              <w:t xml:space="preserve">  </w:t>
-            </w:r>
-            <w:r>
-              <w:rPr>
-                <w:rtl w:val="0"/>
-                <w:sz w:val="18"/>
-                <w:szCs w:val="18"/>
-                <w:rFonts w:ascii="Georgia" w:hAnsi="Georgia"/>
-              </w:rPr>
+                <w:rFonts w:ascii="Georgia" w:hAnsi="Georgia" w:eastAsia="Georgia" w:cs="Georgia"/>
+                <w:sz w:val="24"/>
+              </w:rPr>
+              <w:t xml:space="preserve">, </w:t>
             </w:r>
           </w:p>
         </w:tc>
@@ -13206,7 +12628,7 @@
           <w:szCs w:val="20"/>
           <w:color w:val="404040"/>
         </w:rPr>
-        <w:t xml:space="preserve">Shows: Lexical+Modal types; EC and P functions; FP-Cap, FP-Rec, and framing FP. Type = highlight on the token; function = colored label (EC/P); FP = strike + reason code. Not every abstract will contain P; the P slot is illustrated for coding practice.</w:t>
+        <w:t>Shows: Lexical+Modal types. EC and P functions. FP-Cap, FP-Rec, and framing FP. Type = highlight on the token, function = colored label (EC/P). FP = strike + reason code. Not every abstract will contain P, the P slot is illustrated for coding practice.</w:t>
       </w:r>
     </w:p>
     <w:p>
@@ -16991,7 +16413,7 @@
           <w:sz w:val="22"/>
           <w:szCs w:val="22"/>
         </w:rPr>
-        <w:t xml:space="preserve">• Grey-highlight the main assertive verb; place [G] or [C] beside it (same placement as (EC) on hedges).</w:t>
+        <w:t>• Grey-highlight the main assertive verb, place [G] or [C] beside it (same placement as (EC) on hedges).</w:t>
       </w:r>
     </w:p>
     <w:p>
@@ -17033,7 +16455,7 @@
           <w:sz w:val="22"/>
           <w:szCs w:val="22"/>
         </w:rPr>
-        <w:t xml:space="preserve">• [C] = cause–effect or impact stronger than the design supports.</w:t>
+        <w:t>• [C] = cause-effect or impact stronger than the design supports.</w:t>
       </w:r>
     </w:p>
     <w:p>
@@ -17282,20 +16704,10 @@
             </w:pPr>
             <w:r>
               <w:rPr>
-                <w:rFonts w:ascii="Georgia" w:cs="Georgia" w:eastAsia="Georgia" w:hAnsi="Georgia"/>
-                <w:sz w:val="18"/>
-                <w:szCs w:val="18"/>
-                <w:rtl w:val="0"/>
-              </w:rPr>
-              <w:t xml:space="preserve">Result Claim [R] — Not markable (bare results).</w:t>
-            </w:r>
-            <w:r>
-              <w:rPr>
-                <w:rtl w:val="0"/>
-                <w:sz w:val="18"/>
-                <w:szCs w:val="18"/>
-                <w:rFonts w:ascii="Georgia" w:hAnsi="Georgia" w:cs="Georgia" w:eastAsia="Georgia"/>
-              </w:rPr>
+                <w:rFonts w:ascii="Georgia" w:hAnsi="Georgia" w:eastAsia="Georgia" w:cs="Georgia"/>
+                <w:sz w:val="24"/>
+              </w:rPr>
+              <w:t>Result Claim [R] , Not markable (bare results).</w:t>
             </w:r>
           </w:p>
         </w:tc>
@@ -17559,20 +16971,10 @@
             </w:pPr>
             <w:r>
               <w:rPr>
-                <w:rFonts w:ascii="Georgia" w:cs="Georgia" w:eastAsia="Georgia" w:hAnsi="Georgia"/>
-                <w:sz w:val="18"/>
-                <w:szCs w:val="18"/>
-                <w:rtl w:val="0"/>
-              </w:rPr>
-              <w:t xml:space="preserve">Cause–effect stated as established.</w:t>
-            </w:r>
-            <w:r>
-              <w:rPr>
-                <w:rtl w:val="0"/>
-                <w:sz w:val="18"/>
-                <w:szCs w:val="18"/>
-                <w:rFonts w:ascii="Georgia" w:hAnsi="Georgia" w:cs="Georgia" w:eastAsia="Georgia"/>
-              </w:rPr>
+                <w:rFonts w:ascii="Georgia" w:hAnsi="Georgia" w:eastAsia="Georgia" w:cs="Georgia"/>
+                <w:sz w:val="24"/>
+              </w:rPr>
+              <w:t>Cause-effect stated as established.</w:t>
             </w:r>
           </w:p>
         </w:tc>
@@ -19030,7 +18432,7 @@
           <w:sz w:val="22"/>
           <w:szCs w:val="22"/>
         </w:rPr>
-        <w:t xml:space="preserve">• Codes: Acs1–Acs10, Aas1–Aas10 (Agriculture). VM1–VM20. B1–B20 (Biology).</w:t>
+        <w:t>• Codes: Acs1-Acs10, Aas1-Aas10 (Agriculture). VM1-VM20. B1-B20 (Biology).</w:t>
       </w:r>
     </w:p>
     <w:p>
@@ -19162,28 +18564,17 @@
     </w:p>
     <w:p>
       <w:pPr>
-        <w:spacing w:before="0" w:after="0" w:line="456" w:lineRule="auto"/>
+        <w:spacing w:before="0" w:after="0" w:line="480" w:lineRule="auto"/>
         <w:ind w:firstLine="720"/>
         <w:jc w:val="both"/>
         <w:rPr/>
       </w:pPr>
       <w:r>
         <w:rPr>
-          <w:rFonts w:ascii="Georgia" w:cs="Georgia" w:eastAsia="Georgia" w:hAnsi="Georgia"/>
-          <w:b w:val="0"/>
-          <w:bCs w:val="0"/>
-          <w:i w:val="0"/>
-          <w:iCs w:val="0"/>
-          <w:sz w:val="22"/>
-          <w:szCs w:val="22"/>
-          <w:rtl w:val="0"/>
-        </w:rPr>
-        <w:t xml:space="preserve">A total of 33 samples were used in this study to compare the results of Nested Polymerase Chain Reaction and Micro-Insulated Isothermal Polymerase Chain Reaction (POCKIT) in monitoring Acute Hepatopancreatic Necrosis Disease-causing Vibrio parahaemolyticus. The study used collected shrimp samples, pre-detected samples, and positive and negative standards for the detection of Acute Hepatopancreatic Necrosis Disease-causing Vibrio parahaemolyticus on shrimp samples; bacterial culture for vibrio sp. was also conducted as well as dna sequencing for the confirmation of the results. The result showed negative results on all the shrimp samples that led to the conclusion that all shrimp farms were free from Acute Hepatopancreatic Necrosis Disease-causing Vibrio parahaemolyticus.</w:t>
-      </w:r>
-      <w:r>
-        <w:rPr>
-          <w:rtl w:val="0"/>
-        </w:rPr>
+          <w:rFonts w:ascii="Georgia" w:hAnsi="Georgia" w:eastAsia="Georgia" w:cs="Georgia"/>
+          <w:sz w:val="24"/>
+        </w:rPr>
+        <w:t>A total of 33 samples were used in this study to compare the results of Nested Polymerase Chain Reaction and Micro-Insulated Isothermal Polymerase Chain Reaction (POCKIT) in monitoring Acute Hepatopancreatic Necrosis Disease-causing Vibrio parahaemolyticus. The study used collected shrimp samples, pre-detected samples, and positive and negative standards for the detection of Acute Hepatopancreatic Necrosis Disease-causing Vibrio parahaemolyticus on shrimp samples, bacterial culture for vibrio sp. was also conducted as well as dna sequencing for the confirmation of the results. The result showed negative results on all the shrimp samples that led to the conclusion that all shrimp farms were free from Acute Hepatopancreatic Necrosis Disease-causing Vibrio parahaemolyticus.</w:t>
       </w:r>
     </w:p>
     <w:p>
@@ -19308,28 +18699,17 @@
     </w:p>
     <w:p>
       <w:pPr>
-        <w:spacing w:before="0" w:after="0" w:line="456" w:lineRule="auto"/>
+        <w:spacing w:before="0" w:after="0" w:line="480" w:lineRule="auto"/>
         <w:ind w:firstLine="720"/>
         <w:jc w:val="both"/>
         <w:rPr/>
       </w:pPr>
       <w:r>
         <w:rPr>
-          <w:rFonts w:ascii="Georgia" w:cs="Georgia" w:eastAsia="Georgia" w:hAnsi="Georgia"/>
-          <w:b w:val="0"/>
-          <w:bCs w:val="0"/>
-          <w:i w:val="0"/>
-          <w:iCs w:val="0"/>
-          <w:sz w:val="22"/>
-          <w:szCs w:val="22"/>
-          <w:rtl w:val="0"/>
-        </w:rPr>
-        <w:t xml:space="preserve">The study was conducted to determine and compare the staining effect of C. longa, I. batatas and M. acuminata aqueous extracts for gonad examination of Nile tilapia. Twelve Nile tilapia fingerlings, with approximately two and one-half to four-inch size, were divided into four treatments with three replicates each. Treatment 1 was assigned as the positive control, which were stained with malachite green, while Treatments 2, 3 and 4 were stained with C. longa, I. batatas and M. acuminata extracts, respectively. The prepared slides of stained gonads were randomly distributed on the microscopes using completely randomized design (CRD). Blind examination and evaluation by five faculty members was done on the stained unlabeled tissues under the microscopes. The tissues were evaluated according to five parameters: hue, saturation, contrast, clarity and overall appearance. A scoring scheme was followed, i.e. 1 to 2 – very poor; 3 to 4 – poor; 5 to 6 – average; 7 to 8 – good; and 9 to 10 – excellent. Data gathered were subjected to one-way analysis of variance (ANOVA). The results suggested that C. longa, I. batatas and M. acuminata extracts are potential alternative stains for gonadal examination of Nile tilapia with M. acuminata as the most preferred.</w:t>
-      </w:r>
-      <w:r>
-        <w:rPr>
-          <w:rtl w:val="0"/>
-        </w:rPr>
+          <w:rFonts w:ascii="Georgia" w:hAnsi="Georgia" w:eastAsia="Georgia" w:cs="Georgia"/>
+          <w:sz w:val="24"/>
+        </w:rPr>
+        <w:t>The study was conducted to determine and compare the staining effect of C. longa, I. batatas and M. acuminata aqueous extracts for gonad examination of Nile tilapia. Twelve Nile tilapia fingerlings, with approximately two and one-half to four-inch size, were divided into four treatments with three replicates each. Treatment 1 was assigned as the positive control, which were stained with malachite green, while Treatments 2, 3 and 4 were stained with C. longa, I. batatas and M. acuminata extracts, respectively. The prepared slides of stained gonads were randomly distributed on the microscopes using completely randomized design (CRD). Blind examination and evaluation by five faculty members was done on the stained unlabeled tissues under the microscopes. The tissues were evaluated according to five parameters: hue, saturation, contrast, clarity and overall appearance. A scoring scheme was followed, i.e. 1 to 2 - very poor, 3 to 4 - poor, 5 to 6 - average, 7 to 8 - good, and 9 to 10 - excellent. Data gathered were subjected to one-way analysis of variance (ANOVA). The results suggested that C. longa, I. batatas and M. acuminata extracts are potential alternative stains for gonadal examination of Nile tilapia with M. acuminata as the most preferred.</w:t>
       </w:r>
     </w:p>
     <w:p>
@@ -19416,56 +18796,32 @@
     </w:p>
     <w:p>
       <w:pPr>
-        <w:spacing w:before="0" w:after="0" w:line="456" w:lineRule="auto"/>
-        <w:jc w:val="both"/>
-        <w:rPr/>
-      </w:pPr>
-      <w:r>
-        <w:rPr>
-          <w:rFonts w:ascii="Georgia" w:cs="Georgia" w:eastAsia="Georgia" w:hAnsi="Georgia"/>
-          <w:b w:val="0"/>
-          <w:bCs w:val="0"/>
-          <w:i w:val="0"/>
-          <w:iCs w:val="0"/>
+        <w:spacing w:before="0" w:after="0" w:line="480" w:lineRule="auto"/>
+        <w:ind w:firstLine="720"/>
+        <w:jc w:val="both"/>
+        <w:rPr/>
+      </w:pPr>
+      <w:r>
+        <w:rPr>
+          <w:rFonts w:ascii="Georgia" w:hAnsi="Georgia" w:eastAsia="Georgia" w:cs="Georgia"/>
           <w:sz w:val="24"/>
-          <w:szCs w:val="24"/>
-          <w:rtl w:val="0"/>
-        </w:rPr>
-        <w:t xml:space="preserve">“The results suggested that...” (Lexical Verb - Epistemic Caution)</w:t>
-      </w:r>
-      <w:r>
-        <w:rPr>
-          <w:rtl w:val="0"/>
+        </w:rPr>
+        <w:t>“The results suggested that..” (Lexical Verb - Epistemic Caution)</w:t>
+      </w:r>
+    </w:p>
+    <w:p>
+      <w:pPr>
+        <w:spacing w:before="0" w:after="0" w:line="480" w:lineRule="auto"/>
+        <w:ind w:firstLine="720"/>
+        <w:jc w:val="both"/>
+        <w:rPr/>
+      </w:pPr>
+      <w:r>
+        <w:rPr>
+          <w:rFonts w:ascii="Georgia" w:hAnsi="Georgia" w:eastAsia="Georgia" w:cs="Georgia"/>
           <w:sz w:val="24"/>
-          <w:szCs w:val="24"/>
-        </w:rPr>
-      </w:r>
-    </w:p>
-    <w:p>
-      <w:pPr>
-        <w:spacing w:before="0" w:after="0" w:line="456" w:lineRule="auto"/>
-        <w:jc w:val="both"/>
-        <w:rPr/>
-      </w:pPr>
-      <w:r>
-        <w:rPr>
-          <w:rFonts w:ascii="Georgia" w:cs="Georgia" w:eastAsia="Georgia" w:hAnsi="Georgia"/>
-          <w:b w:val="0"/>
-          <w:bCs w:val="0"/>
-          <w:i w:val="0"/>
-          <w:iCs w:val="0"/>
-          <w:sz w:val="24"/>
-          <w:szCs w:val="24"/>
-          <w:rtl w:val="0"/>
-        </w:rPr>
-        <w:t xml:space="preserve">“...extracts are potential alternative stains...” (Lexical Adjective - Epistemic Caution)</w:t>
-      </w:r>
-      <w:r>
-        <w:rPr>
-          <w:rtl w:val="0"/>
-          <w:sz w:val="24"/>
-          <w:szCs w:val="24"/>
-        </w:rPr>
+        </w:rPr>
+        <w:t>“..extracts are potential alternative stains..” (Lexical Adjective - Epistemic Caution)</w:t>
       </w:r>
     </w:p>
     <w:p>
@@ -19538,28 +18894,17 @@
     </w:p>
     <w:p>
       <w:pPr>
-        <w:spacing w:before="0" w:after="0" w:line="456" w:lineRule="auto"/>
+        <w:spacing w:before="0" w:after="0" w:line="480" w:lineRule="auto"/>
         <w:ind w:firstLine="720"/>
         <w:jc w:val="both"/>
         <w:rPr/>
       </w:pPr>
       <w:r>
         <w:rPr>
-          <w:rFonts w:ascii="Georgia" w:cs="Georgia" w:eastAsia="Georgia" w:hAnsi="Georgia"/>
-          <w:b w:val="0"/>
-          <w:bCs w:val="0"/>
-          <w:i w:val="0"/>
-          <w:iCs w:val="0"/>
-          <w:sz w:val="22"/>
-          <w:szCs w:val="22"/>
-          <w:rtl w:val="0"/>
-        </w:rPr>
-        <w:t xml:space="preserve">The study was conducted for 7 days from July 07 to July 13, 2022 at [REDACTED]. The general objective of the study was to determine the acceptability and palatability of duck ham subjected to different curing process. Specifically, it aimed to find the sensory evaluation: appearance; aroma; taste/ flavor; texture; and over-all acceptability. A total of eight (8) Muscovy ducks were used in this study. The study used Hedonic Likert Scale and was subjected to Desriptive analysis. Factor A = Type of curing and Factor B = Spice rub. The treatments used in this study are the following. A₁ B₁ - Dry curing + Oregano, A₁ B₂ - Dry curing + Lemon grass, A₂ B₁ - Liquid curing + Oregano and A₁ B₂ - Liquid curing + Lemon grass. The sensory evaluation was conducted at Pampanga State Agricultural University, PAC, Magalang, Pampanga. Ten (10) college students, ten (10) teachers and ten (10) people who don’t eat duck were selected as respondents to evaluate the sample treatments. The data collected from the sensory evaluation were analysed using descriptive statistics.</w:t>
-      </w:r>
-      <w:r>
-        <w:rPr>
-          <w:rtl w:val="0"/>
-        </w:rPr>
+          <w:rFonts w:ascii="Georgia" w:hAnsi="Georgia" w:eastAsia="Georgia" w:cs="Georgia"/>
+          <w:sz w:val="24"/>
+        </w:rPr>
+        <w:t>The study was conducted for 7 days from July 07 to July 13, 2022 at [REDACTED]. The general objective of the study was to determine the acceptability and palatability of duck ham subjected to different curing process. Specifically, it aimed to find the sensory evaluation: appearance, aroma, taste/ flavor, texture, and over-all acceptability. A total of eight (8) Muscovy ducks were used in this study. The study used Hedonic Likert Scale and was subjected to Desriptive analysis. Factor A = Type of curing and Factor B = Spice rub. The treatments used in this study are the following. A₁ B₁ - Dry curing + Oregano, A₁ B₂ - Dry curing + Lemon grass, A₂ B₁ - Liquid curing + Oregano and A₁ B₂ - Liquid curing + Lemon grass. The sensory evaluation was conducted at Pampanga State Agricultural University, PAC, Magalang, Pampanga. Ten (10) college students, ten (10) teachers and ten (10) people who don’t eat duck were selected as respondents to evaluate the sample treatments. The data collected from the sensory evaluation were analysed using descriptive statistics.</w:t>
       </w:r>
     </w:p>
     <w:p>
@@ -19712,28 +19057,17 @@
     </w:p>
     <w:p>
       <w:pPr>
-        <w:spacing w:before="0" w:after="0" w:line="456" w:lineRule="auto"/>
+        <w:spacing w:before="0" w:after="0" w:line="480" w:lineRule="auto"/>
         <w:ind w:firstLine="720"/>
         <w:jc w:val="both"/>
         <w:rPr/>
       </w:pPr>
       <w:r>
         <w:rPr>
-          <w:rFonts w:ascii="Georgia" w:cs="Georgia" w:eastAsia="Georgia" w:hAnsi="Georgia"/>
-          <w:b w:val="0"/>
-          <w:bCs w:val="0"/>
-          <w:i w:val="0"/>
-          <w:iCs w:val="0"/>
-          <w:sz w:val="22"/>
-          <w:szCs w:val="22"/>
-          <w:rtl w:val="0"/>
-        </w:rPr>
-        <w:t xml:space="preserve">The study was conducted from June to July 2022 to determine the influence of the different sources of nutrients to rice straw mushrooms. The field experiment was conducted in [REDACTED]. The experiment was laid out using Complete Randomize Design (CRD), with four treatments replicated four times. The treatments were as follows: T₀- Untreated banana leaves substrate submerged in 55 gallon of water (Control); T₁- Banana leaves substrate submerged in mixture of 100 grams of Urea and 55 gallons of water; T₂- Banana leaves substrate submerged in mixture of 250 ml of fish amino acid and 55 gallons of water; and, T₃- Banana leaves substrate submerged in mixture of 250 ml of fermented plant juice and 55 gallons of water.</w:t>
-      </w:r>
-      <w:r>
-        <w:rPr>
-          <w:rtl w:val="0"/>
-        </w:rPr>
+          <w:rFonts w:ascii="Georgia" w:hAnsi="Georgia" w:eastAsia="Georgia" w:cs="Georgia"/>
+          <w:sz w:val="24"/>
+        </w:rPr>
+        <w:t>The study was conducted from June to July 2022 to determine the influence of the different sources of nutrients to rice straw mushrooms. The field experiment was conducted in [REDACTED]. The experiment was laid out using Complete Randomize Design (CRD), with four treatments replicated four times. The treatments were as follows: T₀- Untreated banana leaves substrate submerged in 55 gallon of water (Control). T₁- Banana leaves substrate submerged in mixture of 100 grams of Urea and 55 gallons of water. T₂- Banana leaves substrate submerged in mixture of 250 ml of fish amino acid and 55 gallons of water, and, T₃- Banana leaves substrate submerged in mixture of 250 ml of fermented plant juice and 55 gallons of water.</w:t>
       </w:r>
     </w:p>
     <w:p>
@@ -19818,41 +19152,17 @@
     </w:p>
     <w:p>
       <w:pPr>
-        <w:spacing w:before="0" w:after="0" w:line="456" w:lineRule="auto"/>
+        <w:spacing w:before="0" w:after="0" w:line="480" w:lineRule="auto"/>
         <w:ind w:firstLine="720"/>
         <w:jc w:val="both"/>
         <w:rPr/>
       </w:pPr>
       <w:r>
         <w:rPr>
-          <w:rFonts w:ascii="Georgia" w:cs="Georgia" w:eastAsia="Georgia" w:hAnsi="Georgia"/>
-          <w:b w:val="1"/>
-          <w:bCs w:val="1"/>
-          <w:i w:val="0"/>
-          <w:iCs w:val="0"/>
-          <w:sz w:val="22"/>
-          <w:szCs w:val="22"/>
-          <w:rtl w:val="0"/>
-        </w:rPr>
-        <w:t xml:space="preserve">Key Excerpt: </w:t>
-      </w:r>
-      <w:r>
-        <w:rPr>
-          <w:rFonts w:ascii="Georgia" w:cs="Georgia" w:eastAsia="Georgia" w:hAnsi="Georgia"/>
-          <w:b w:val="0"/>
-          <w:bCs w:val="0"/>
-          <w:i w:val="0"/>
-          <w:iCs w:val="0"/>
-          <w:sz w:val="22"/>
-          <w:szCs w:val="22"/>
-          <w:rtl w:val="0"/>
-        </w:rPr>
-        <w:t xml:space="preserve">“Results of the study revealed significant differences... The highest ROI was obtained…”</w:t>
-      </w:r>
-      <w:r>
-        <w:rPr>
-          <w:rtl w:val="0"/>
-        </w:rPr>
+          <w:rFonts w:ascii="Georgia" w:hAnsi="Georgia" w:eastAsia="Georgia" w:cs="Georgia"/>
+          <w:sz w:val="24"/>
+        </w:rPr>
+        <w:t>Key Excerpt: “Results of the study revealed significant differences.. The highest ROI was obtained…”</w:t>
       </w:r>
     </w:p>
     <w:p>

</xml_diff>

<commit_message>
Draft_104: uniform 9pt font in QRL and legend tables
</commit_message>
<xml_diff>
--- a/thesis/003_ThesisProposal_Draft_104.docx
+++ b/thesis/003_ThesisProposal_Draft_104.docx
@@ -11962,7 +11962,7 @@
                 <w:rtl w:val="0"/>
                 <w:sz w:val="18"/>
                 <w:szCs w:val="18"/>
-                <w:rFonts w:ascii="Georgia" w:hAnsi="Georgia"/>
+                <w:rFonts w:ascii="Georgia" w:hAnsi="Georgia" w:eastAsia="Georgia" w:cs="Georgia"/>
               </w:rPr>
             </w:r>
           </w:p>
@@ -11996,7 +11996,7 @@
                 <w:rtl w:val="0"/>
                 <w:sz w:val="18"/>
                 <w:szCs w:val="18"/>
-                <w:rFonts w:ascii="Georgia" w:hAnsi="Georgia"/>
+                <w:rFonts w:ascii="Georgia" w:hAnsi="Georgia" w:eastAsia="Georgia" w:cs="Georgia"/>
               </w:rPr>
             </w:r>
           </w:p>
@@ -12041,7 +12041,7 @@
                 <w:rtl w:val="0"/>
                 <w:sz w:val="18"/>
                 <w:szCs w:val="18"/>
-                <w:rFonts w:ascii="Georgia" w:hAnsi="Georgia"/>
+                <w:rFonts w:ascii="Georgia" w:hAnsi="Georgia" w:eastAsia="Georgia" w:cs="Georgia"/>
               </w:rPr>
             </w:r>
           </w:p>
@@ -12078,7 +12078,7 @@
                 <w:rtl w:val="0"/>
                 <w:sz w:val="18"/>
                 <w:szCs w:val="18"/>
-                <w:rFonts w:ascii="Georgia" w:hAnsi="Georgia"/>
+                <w:rFonts w:ascii="Georgia" w:hAnsi="Georgia" w:eastAsia="Georgia" w:cs="Georgia"/>
               </w:rPr>
             </w:r>
           </w:p>
@@ -12115,7 +12115,7 @@
                 <w:rtl w:val="0"/>
                 <w:sz w:val="18"/>
                 <w:szCs w:val="18"/>
-                <w:rFonts w:ascii="Georgia" w:hAnsi="Georgia"/>
+                <w:rFonts w:ascii="Georgia" w:hAnsi="Georgia" w:eastAsia="Georgia" w:cs="Georgia"/>
               </w:rPr>
             </w:r>
           </w:p>
@@ -12152,7 +12152,7 @@
                 <w:rtl w:val="0"/>
                 <w:sz w:val="18"/>
                 <w:szCs w:val="18"/>
-                <w:rFonts w:ascii="Georgia" w:hAnsi="Georgia"/>
+                <w:rFonts w:ascii="Georgia" w:hAnsi="Georgia" w:eastAsia="Georgia" w:cs="Georgia"/>
               </w:rPr>
             </w:r>
           </w:p>
@@ -12194,7 +12194,7 @@
                 <w:rtl w:val="0"/>
                 <w:sz w:val="18"/>
                 <w:szCs w:val="18"/>
-                <w:rFonts w:ascii="Georgia" w:hAnsi="Georgia"/>
+                <w:rFonts w:ascii="Georgia" w:hAnsi="Georgia" w:eastAsia="Georgia" w:cs="Georgia"/>
               </w:rPr>
             </w:r>
           </w:p>
@@ -12233,7 +12233,7 @@
                 <w:rtl w:val="0"/>
                 <w:sz w:val="18"/>
                 <w:szCs w:val="18"/>
-                <w:rFonts w:ascii="Georgia" w:hAnsi="Georgia"/>
+                <w:rFonts w:ascii="Georgia" w:hAnsi="Georgia" w:eastAsia="Georgia" w:cs="Georgia"/>
               </w:rPr>
             </w:r>
           </w:p>
@@ -12246,7 +12246,8 @@
             <w:r>
               <w:rPr>
                 <w:rFonts w:ascii="Georgia" w:hAnsi="Georgia" w:eastAsia="Georgia" w:cs="Georgia"/>
-                <w:sz w:val="24"/>
+                <w:sz w:val="18"/>
+                <w:szCs w:val="18"/>
               </w:rPr>
               <w:t xml:space="preserve">, </w:t>
             </w:r>
@@ -12284,7 +12285,7 @@
                 <w:rtl w:val="0"/>
                 <w:sz w:val="18"/>
                 <w:szCs w:val="18"/>
-                <w:rFonts w:ascii="Georgia" w:hAnsi="Georgia"/>
+                <w:rFonts w:ascii="Georgia" w:hAnsi="Georgia" w:eastAsia="Georgia" w:cs="Georgia"/>
               </w:rPr>
             </w:r>
           </w:p>
@@ -12296,8 +12297,8 @@
             <w:r>
               <w:rPr>
                 <w:rFonts w:ascii="Georgia" w:hAnsi="Georgia" w:cs="Georgia" w:eastAsia="Georgia"/>
-                <w:sz w:val="24"/>
-                <w:szCs w:val="24"/>
+                <w:sz w:val="18"/>
+                <w:szCs w:val="18"/>
               </w:rPr>
               <w:t xml:space="preserve">R = Result, G = Generalization, C = Causal. Bracket the subtype beside the mark.</w:t>
             </w:r>
@@ -12330,7 +12331,7 @@
                 <w:rtl w:val="0"/>
                 <w:sz w:val="18"/>
                 <w:szCs w:val="18"/>
-                <w:rFonts w:ascii="Georgia" w:hAnsi="Georgia"/>
+                <w:rFonts w:ascii="Georgia" w:hAnsi="Georgia" w:eastAsia="Georgia" w:cs="Georgia"/>
               </w:rPr>
             </w:r>
           </w:p>
@@ -12343,8 +12344,8 @@
             <w:r>
               <w:rPr>
                 <w:rFonts w:ascii="Georgia" w:hAnsi="Georgia" w:cs="Georgia" w:eastAsia="Georgia"/>
-                <w:sz w:val="24"/>
-                <w:szCs w:val="24"/>
+                <w:sz w:val="18"/>
+                <w:szCs w:val="18"/>
               </w:rPr>
               <w:t xml:space="preserve">No highlight. Strike through the token and write the reason code in grey text.</w:t>
             </w:r>
@@ -16705,7 +16706,8 @@
             <w:r>
               <w:rPr>
                 <w:rFonts w:ascii="Georgia" w:hAnsi="Georgia" w:eastAsia="Georgia" w:cs="Georgia"/>
-                <w:sz w:val="24"/>
+                <w:sz w:val="18"/>
+                <w:szCs w:val="18"/>
               </w:rPr>
               <w:t>Result Claim [R] , Not markable (bare results).</w:t>
             </w:r>
@@ -16972,7 +16974,8 @@
             <w:r>
               <w:rPr>
                 <w:rFonts w:ascii="Georgia" w:hAnsi="Georgia" w:eastAsia="Georgia" w:cs="Georgia"/>
-                <w:sz w:val="24"/>
+                <w:sz w:val="18"/>
+                <w:szCs w:val="18"/>
               </w:rPr>
               <w:t>Cause-effect stated as established.</w:t>
             </w:r>

</xml_diff>

<commit_message>
Draft_104: CE on QR page, body 11pt, definition/codebook bold leads
Uniform body 11pt. Definition term leads bold only. Codebook step leads
bold only. Table 7 cleaned and kept intact. Combined Example back with
Quick-Reference Legend on same page.
</commit_message>
<xml_diff>
--- a/thesis/003_ThesisProposal_Draft_104.docx
+++ b/thesis/003_ThesisProposal_Draft_104.docx
@@ -290,10 +290,10 @@
       <w:r>
         <w:rPr>
           <w:rFonts w:ascii="Georgia" w:cs="Georgia" w:eastAsia="Georgia" w:hAnsi="Georgia"/>
-          <w:b w:val="1"/>
+          <w:b/>
           <w:bCs w:val="1"/>
-          <w:sz w:val="28"/>
-          <w:szCs w:val="28"/>
+          <w:sz w:val="22"/>
+          <w:szCs w:val="22"/>
           <w:rtl w:val="0"/>
         </w:rPr>
         <w:t xml:space="preserve">INTRODUCTION</w:t>
@@ -316,10 +316,10 @@
       <w:r>
         <w:rPr>
           <w:rFonts w:ascii="Georgia" w:cs="Georgia" w:eastAsia="Georgia" w:hAnsi="Georgia"/>
-          <w:b w:val="1"/>
+          <w:b/>
           <w:bCs w:val="1"/>
-          <w:sz w:val="24"/>
-          <w:szCs w:val="24"/>
+          <w:sz w:val="22"/>
+          <w:szCs w:val="22"/>
           <w:rtl w:val="0"/>
         </w:rPr>
         <w:t xml:space="preserve">BACKGROUND OF THE STUDY</w:t>
@@ -371,6 +371,7 @@
       <w:r>
         <w:rPr>
           <w:rFonts w:ascii="Georgia" w:hAnsi="Georgia" w:cs="Georgia" w:eastAsia="Georgia"/>
+          <w:b w:val="0"/>
           <w:sz w:val="22"/>
           <w:szCs w:val="22"/>
         </w:rPr>
@@ -443,8 +444,8 @@
           <w:bCs w:val="0"/>
           <w:i w:val="1"/>
           <w:iCs w:val="1"/>
-          <w:sz w:val="24"/>
-          <w:szCs w:val="24"/>
+          <w:sz w:val="22"/>
+          <w:szCs w:val="22"/>
           <w:rtl w:val="0"/>
         </w:rPr>
         <w:t xml:space="preserve">Hedging in Undergraduate Writing</w:t>
@@ -467,6 +468,7 @@
       <w:r>
         <w:rPr>
           <w:rFonts w:ascii="Georgia" w:hAnsi="Georgia" w:cs="Georgia" w:eastAsia="Georgia"/>
+          <w:b w:val="0"/>
           <w:sz w:val="22"/>
           <w:szCs w:val="22"/>
         </w:rPr>
@@ -477,6 +479,7 @@
           <w:rFonts w:ascii="Georgia" w:hAnsi="Georgia" w:cs="Georgia" w:eastAsia="Georgia"/>
           <w:sz w:val="22"/>
           <w:szCs w:val="22"/>
+          <w:b w:val="0"/>
           <w:i/>
           <w:iCs/>
         </w:rPr>
@@ -485,6 +488,7 @@
       <w:r>
         <w:rPr>
           <w:rFonts w:ascii="Georgia" w:hAnsi="Georgia" w:cs="Georgia" w:eastAsia="Georgia"/>
+          <w:b w:val="0"/>
           <w:sz w:val="22"/>
           <w:szCs w:val="22"/>
         </w:rPr>
@@ -501,6 +505,7 @@
       <w:r>
         <w:rPr>
           <w:rFonts w:ascii="Georgia" w:hAnsi="Georgia" w:cs="Georgia" w:eastAsia="Georgia"/>
+          <w:b w:val="0"/>
           <w:sz w:val="22"/>
           <w:szCs w:val="22"/>
         </w:rPr>
@@ -521,8 +526,8 @@
           <w:bCs w:val="0"/>
           <w:i w:val="1"/>
           <w:iCs w:val="1"/>
-          <w:sz w:val="24"/>
-          <w:szCs w:val="24"/>
+          <w:sz w:val="22"/>
+          <w:szCs w:val="22"/>
           <w:rtl w:val="0"/>
         </w:rPr>
         <w:t xml:space="preserve">Disciplinary Variation in Scientific and Medical Writing</w:t>
@@ -545,6 +550,7 @@
       <w:r>
         <w:rPr>
           <w:rFonts w:ascii="Georgia" w:hAnsi="Georgia" w:cs="Georgia" w:eastAsia="Georgia"/>
+          <w:b w:val="0"/>
           <w:sz w:val="22"/>
           <w:szCs w:val="22"/>
         </w:rPr>
@@ -591,8 +597,8 @@
           <w:bCs w:val="0"/>
           <w:i w:val="1"/>
           <w:iCs w:val="1"/>
-          <w:sz w:val="24"/>
-          <w:szCs w:val="24"/>
+          <w:sz w:val="22"/>
+          <w:szCs w:val="22"/>
           <w:rtl w:val="0"/>
         </w:rPr>
         <w:t xml:space="preserve">Hedging in L2 and EFL Contexts</w:t>
@@ -615,6 +621,7 @@
       <w:r>
         <w:rPr>
           <w:rFonts w:ascii="Georgia" w:hAnsi="Georgia" w:cs="Georgia" w:eastAsia="Georgia"/>
+          <w:b w:val="0"/>
           <w:sz w:val="22"/>
           <w:szCs w:val="22"/>
         </w:rPr>
@@ -661,8 +668,8 @@
           <w:bCs w:val="0"/>
           <w:i w:val="1"/>
           <w:iCs w:val="1"/>
-          <w:sz w:val="24"/>
-          <w:szCs w:val="24"/>
+          <w:sz w:val="22"/>
+          <w:szCs w:val="22"/>
           <w:rtl w:val="0"/>
         </w:rPr>
         <w:t xml:space="preserve">Hedging in Philippine Academic Writing Contexts</w:t>
@@ -685,6 +692,7 @@
       <w:r>
         <w:rPr>
           <w:rFonts w:ascii="Georgia" w:hAnsi="Georgia" w:cs="Georgia" w:eastAsia="Georgia"/>
+          <w:b w:val="0"/>
           <w:sz w:val="22"/>
           <w:szCs w:val="22"/>
         </w:rPr>
@@ -705,8 +713,8 @@
           <w:bCs w:val="0"/>
           <w:i w:val="1"/>
           <w:iCs w:val="1"/>
-          <w:sz w:val="24"/>
-          <w:szCs w:val="24"/>
+          <w:sz w:val="22"/>
+          <w:szCs w:val="22"/>
           <w:rtl w:val="0"/>
         </w:rPr>
         <w:t xml:space="preserve">Disciplinary Variation in Abstracts and Undergraduate Theses</w:t>
@@ -729,6 +737,7 @@
       <w:r>
         <w:rPr>
           <w:rFonts w:ascii="Georgia" w:hAnsi="Georgia" w:cs="Georgia" w:eastAsia="Georgia"/>
+          <w:b w:val="0"/>
           <w:sz w:val="22"/>
           <w:szCs w:val="22"/>
         </w:rPr>
@@ -745,6 +754,7 @@
       <w:r>
         <w:rPr>
           <w:rFonts w:ascii="Georgia" w:hAnsi="Georgia" w:cs="Georgia" w:eastAsia="Georgia"/>
+          <w:b w:val="0"/>
           <w:sz w:val="22"/>
           <w:szCs w:val="22"/>
         </w:rPr>
@@ -787,10 +797,10 @@
       <w:r>
         <w:rPr>
           <w:rFonts w:ascii="Georgia" w:cs="Georgia" w:eastAsia="Georgia" w:hAnsi="Georgia"/>
-          <w:b w:val="1"/>
+          <w:b/>
           <w:bCs w:val="1"/>
-          <w:sz w:val="24"/>
-          <w:szCs w:val="24"/>
+          <w:sz w:val="22"/>
+          <w:szCs w:val="22"/>
           <w:rtl w:val="0"/>
         </w:rPr>
         <w:t xml:space="preserve">STATEMENT OF THE PROBLEM</w:t>
@@ -968,10 +978,10 @@
       <w:r>
         <w:rPr>
           <w:rFonts w:ascii="Georgia" w:cs="Georgia" w:eastAsia="Georgia" w:hAnsi="Georgia"/>
-          <w:b w:val="1"/>
+          <w:b/>
           <w:bCs w:val="1"/>
-          <w:sz w:val="24"/>
-          <w:szCs w:val="24"/>
+          <w:sz w:val="22"/>
+          <w:szCs w:val="22"/>
           <w:rtl w:val="0"/>
         </w:rPr>
         <w:t xml:space="preserve">RESEARCH FRAMEWORK</w:t>
@@ -995,7 +1005,8 @@
         <w:rPr>
           <w:rFonts w:ascii="Georgia" w:hAnsi="Georgia" w:eastAsia="Georgia" w:cs="Georgia"/>
           <w:b w:val="0"/>
-          <w:sz w:val="24"/>
+          <w:sz w:val="22"/>
+          <w:szCs w:val="22"/>
         </w:rPr>
         <w:t>This study is grounded in a coding scheme adapted from Hyland’s (1998) classification of hedging forms. Hyland (1998) supplies the grammatical types coded in the corpus (lexical hedges, modal verbs, adverbial hedges, and clause-level hedges) and the starting point for functional reading of retained hedges. Two function labels are used. Epistemic Caution (EC) covers reduced commitment to the truth of a knowledge claim. Politeness/Deference (P) covers interpersonal softening toward readers or prior work. False positives are a residual record of candidates that fail the claim condition or neither removal check. They are not a function label. The scheme is adapted for this corpus rather than treated as a fixed published taxonomy.</w:t>
       </w:r>
@@ -1011,7 +1022,8 @@
         <w:rPr>
           <w:rFonts w:ascii="Georgia" w:hAnsi="Georgia" w:eastAsia="Georgia" w:cs="Georgia"/>
           <w:b w:val="0"/>
-          <w:sz w:val="24"/>
+          <w:sz w:val="22"/>
+          <w:szCs w:val="22"/>
         </w:rPr>
         <w:t>Each source has a distinct job. Hyland (1998) is the type instrument and the broad start for EC and P. Crompton (1997) supplies the boundary rule for Epistemic Caution alone: his restatement test operationalizes the Working Test for EC at Step 2. The study does not adopt Crompton’s full taxonomy. Salager-Meyer (1994) is an interpretive lens in Part IV. Her claim-responsibility account helps read density differences across programs. Hyland (2005) is a second interpretive lens. The stance model helps read what fewer hedges mean where results turn into implications. Neither interpretive lens is an operational coding criterion.</w:t>
       </w:r>
@@ -1027,7 +1039,8 @@
         <w:rPr>
           <w:rFonts w:ascii="Georgia" w:hAnsi="Georgia" w:eastAsia="Georgia" w:cs="Georgia"/>
           <w:b w:val="0"/>
-          <w:sz w:val="24"/>
+          <w:sz w:val="22"/>
+          <w:szCs w:val="22"/>
         </w:rPr>
         <w:t>Coding followed the decision rules in Appendix A. After a holistic reading of each abstract, Step 1 marked all possible hedge candidates without counting retained hedges. Step 2 applied a claim condition and two removal checks. A device can be a hedge only if it attaches to a claim: a statement about data, the world, or prior work that evidence could show to be wrong. Aims, directives, and routine procedure are excluded by kind. Working Test: remove the device. If the writer’s commitment to the claim’s truth rises → EC. Reader Test: remove the device. If commitment stays the same but the claim reaches the reader more bluntly or the writer takes sole ownership against prior work → P. Neither check met → FP. EC and P may co-occur on one token when both tests hold. Step 3 assigned grammatical type only to retained EC and P tokens. Reason codes (FP-Rec, FP-Cap, FP-Proc, FP-Gen) label residual rejects.</w:t>
       </w:r>
@@ -1043,7 +1056,8 @@
         <w:rPr>
           <w:rFonts w:ascii="Georgia" w:hAnsi="Georgia" w:eastAsia="Georgia" w:cs="Georgia"/>
           <w:b w:val="0"/>
-          <w:sz w:val="24"/>
+          <w:sz w:val="22"/>
+          <w:szCs w:val="22"/>
         </w:rPr>
         <w:t>The conceptual framework is presented in Figure 1. The grouping variable is discipline (Agriculture, Veterinary Medicine, and Biology). The outcome measures are hedge type frequency, distribution, and function. The analytical path moves from Steps 1-3 through frequency analysis and cross-disciplinary comparison to functional and interpretive reading. Two boundary conditions limit generalization. The texts are produced by developing researchers whose work may not yet reflect discipline-specific norms. The institutional context at PSAU includes L2 English use, but language proficiency is not measured as a variable in this design.</w:t>
       </w:r>
@@ -1058,7 +1072,7 @@
       <w:r>
         <w:rPr>
           <w:rFonts w:ascii="Georgia" w:cs="Georgia" w:eastAsia="Georgia" w:hAnsi="Georgia"/>
-          <w:b w:val="1"/>
+          <w:b/>
           <w:bCs w:val="1"/>
           <w:i w:val="0"/>
           <w:iCs w:val="0"/>
@@ -1127,8 +1141,8 @@
           <w:bCs w:val="0"/>
           <w:i w:val="1"/>
           <w:iCs w:val="1"/>
-          <w:sz w:val="24"/>
-          <w:szCs w:val="24"/>
+          <w:sz w:val="22"/>
+          <w:szCs w:val="22"/>
           <w:rtl w:val="0"/>
         </w:rPr>
         <w:t xml:space="preserve">Conceptual Framework of the Study</w:t>
@@ -1151,10 +1165,10 @@
       <w:r>
         <w:rPr>
           <w:rFonts w:ascii="Georgia" w:cs="Georgia" w:eastAsia="Georgia" w:hAnsi="Georgia"/>
-          <w:b w:val="1"/>
+          <w:b/>
           <w:bCs w:val="1"/>
-          <w:sz w:val="24"/>
-          <w:szCs w:val="24"/>
+          <w:sz w:val="22"/>
+          <w:szCs w:val="22"/>
           <w:rtl w:val="0"/>
         </w:rPr>
         <w:t xml:space="preserve">SIGNIFICANCE OF THE STUDY</w:t>
@@ -1178,8 +1192,9 @@
         <w:rPr>
           <w:rFonts w:ascii="Georgia" w:hAnsi="Georgia" w:cs="Georgia" w:eastAsia="Georgia"/>
           <w:sz w:val="22"/>
-          <w:b w:val="1"/>
+          <w:b/>
           <w:bCs w:val="1"/>
+          <w:szCs w:val="22"/>
         </w:rPr>
         <w:t xml:space="preserve">For writing instructors and thesis advisers at PSAU, </w:t>
       </w:r>
@@ -1189,6 +1204,7 @@
           <w:sz w:val="22"/>
           <w:b w:val="0"/>
           <w:bCs w:val="0"/>
+          <w:szCs w:val="22"/>
         </w:rPr>
         <w:t>the study provides an empirical baseline of how uncertainty is managed in the ratified abstracts of three applied life sciences programs. That baseline can support more targeted feedback than generic advice to “be cautious.”</w:t>
       </w:r>
@@ -1204,8 +1220,9 @@
         <w:rPr>
           <w:rFonts w:ascii="Georgia" w:hAnsi="Georgia" w:cs="Georgia" w:eastAsia="Georgia"/>
           <w:sz w:val="22"/>
-          <w:b w:val="1"/>
+          <w:b/>
           <w:bCs w:val="1"/>
+          <w:szCs w:val="22"/>
         </w:rPr>
         <w:t xml:space="preserve">For academic writing researchers, </w:t>
       </w:r>
@@ -1215,6 +1232,7 @@
           <w:sz w:val="22"/>
           <w:b w:val="0"/>
           <w:bCs w:val="0"/>
+          <w:szCs w:val="22"/>
         </w:rPr>
         <w:t>it adds Philippine applied-science abstract data to a body of work that has drawn mainly from other regional and disciplinary settings.</w:t>
       </w:r>
@@ -1230,8 +1248,9 @@
         <w:rPr>
           <w:rFonts w:ascii="Georgia" w:hAnsi="Georgia" w:cs="Georgia" w:eastAsia="Georgia"/>
           <w:sz w:val="22"/>
-          <w:b w:val="1"/>
+          <w:b/>
           <w:bCs w:val="1"/>
+          <w:szCs w:val="22"/>
         </w:rPr>
         <w:t xml:space="preserve">For the BAELS program, </w:t>
       </w:r>
@@ -1241,6 +1260,7 @@
           <w:sz w:val="22"/>
           <w:b w:val="0"/>
           <w:bCs w:val="0"/>
+          <w:szCs w:val="22"/>
         </w:rPr>
         <w:t>it shows that corpus-assisted discourse analysis is a viable undergraduate thesis methodology and yields findings usable in local writing pedagogy.</w:t>
       </w:r>
@@ -1256,8 +1276,9 @@
         <w:rPr>
           <w:rFonts w:ascii="Georgia" w:hAnsi="Georgia" w:cs="Georgia" w:eastAsia="Georgia"/>
           <w:sz w:val="22"/>
-          <w:b w:val="1"/>
+          <w:b/>
           <w:bCs w:val="1"/>
+          <w:szCs w:val="22"/>
         </w:rPr>
         <w:t xml:space="preserve">For future researchers, </w:t>
       </w:r>
@@ -1267,6 +1288,7 @@
           <w:sz w:val="22"/>
           <w:b w:val="0"/>
           <w:bCs w:val="0"/>
+          <w:szCs w:val="22"/>
         </w:rPr>
         <w:t>the sampling design, coding decision rules, and false-positive log offer a replicable protocol for similar corpus studies.</w:t>
       </w:r>
@@ -1281,10 +1303,10 @@
       <w:r>
         <w:rPr>
           <w:rFonts w:ascii="Georgia" w:cs="Georgia" w:eastAsia="Georgia" w:hAnsi="Georgia"/>
-          <w:b w:val="1"/>
+          <w:b/>
           <w:bCs w:val="1"/>
-          <w:sz w:val="24"/>
-          <w:szCs w:val="24"/>
+          <w:sz w:val="22"/>
+          <w:szCs w:val="22"/>
           <w:rtl w:val="0"/>
         </w:rPr>
         <w:t xml:space="preserve">SCOPE AND LIMITATIONS</w:t>
@@ -1307,7 +1329,9 @@
       <w:r>
         <w:rPr>
           <w:rFonts w:ascii="Georgia" w:hAnsi="Georgia" w:eastAsia="Georgia" w:cs="Georgia"/>
-          <w:sz w:val="24"/>
+          <w:b w:val="0"/>
+          <w:sz w:val="22"/>
+          <w:szCs w:val="22"/>
         </w:rPr>
         <w:t>This study focused on undergraduate thesis abstracts from Agriculture, Veterinary Medicine, and Biology at PSAU. The inclusion window refers to the year of hard-bound submission as recorded in the PSAU library catalog, not the year the research was conducted. Theses conducted earlier but bound and catalogued in 2023-2025 are included. This reflects institutional practice in which submission date, particularly for irregular students, may postdate the research period by several years. The corpus consisted of 60 abstracts (20 per discipline, with Agriculture split evenly between Crop Science and Animal Science). Sampling design, stratum intervals, and inclusion/exclusion criteria are detailed under Research Corpus. Table 1 reports population and sample sizes. Sub-programs are analyzed as a single “Agriculture” discipline for cross-disciplinary comparison. No separate inferential comparison between them is undertaken.</w:t>
       </w:r>
@@ -1399,6 +1423,7 @@
       <w:r>
         <w:rPr>
           <w:rFonts w:ascii="Georgia" w:hAnsi="Georgia" w:cs="Georgia" w:eastAsia="Georgia"/>
+          <w:b w:val="0"/>
           <w:sz w:val="22"/>
           <w:szCs w:val="22"/>
         </w:rPr>
@@ -1415,7 +1440,9 @@
       <w:r>
         <w:rPr>
           <w:rFonts w:ascii="Georgia" w:hAnsi="Georgia" w:eastAsia="Georgia" w:cs="Georgia"/>
-          <w:sz w:val="24"/>
+          <w:b w:val="0"/>
+          <w:sz w:val="22"/>
+          <w:szCs w:val="22"/>
         </w:rPr>
         <w:t>The study also lacks a comparable expert-abstract corpus against which to compare the functional findings. Among retained hedges, no tokens were independently labeled Politeness (P = 0). That null is empirical and genre-linked, not built into Step 2: the Reader Test can retain pure P on a claim. P = 0 refers to reader-oriented softening of claims. Softened directives were out of scope under the claim condition and were logged as FP-Rec, not as P. Lead support is the Non-retained inventory scan of interpersonal candidates. Framing forms in that inventory failed the claim condition or both removal checks. False positives (n = 58) are residual rejects with reason codes. Genre compression in abstracts is a plausible account of why P items on claims did not appear. Expert abstracts in the same three disciplines, coded with the same Step 1-3 coding scheme, would help separate genre effects from writer-competence effects.</w:t>
       </w:r>
@@ -1456,10 +1483,10 @@
       <w:r>
         <w:rPr>
           <w:rFonts w:ascii="Georgia" w:cs="Georgia" w:eastAsia="Georgia" w:hAnsi="Georgia"/>
-          <w:b w:val="1"/>
+          <w:b/>
           <w:bCs w:val="1"/>
-          <w:sz w:val="24"/>
-          <w:szCs w:val="24"/>
+          <w:sz w:val="22"/>
+          <w:szCs w:val="22"/>
           <w:rtl w:val="0"/>
         </w:rPr>
         <w:t xml:space="preserve">DEFINITION OF TERMS</w:t>
@@ -1511,21 +1538,21 @@
       </w:pPr>
       <w:r>
         <w:rPr>
-          <w:rFonts w:ascii="Georgia" w:hAnsi="Georgia" w:cs="Georgia" w:eastAsia="Georgia"/>
-          <w:sz w:val="22"/>
-          <w:b w:val="1"/>
-          <w:bCs w:val="1"/>
-        </w:rPr>
-        <w:t>Abstract,</w:t>
-      </w:r>
-      <w:r>
-        <w:rPr>
-          <w:rFonts w:ascii="Georgia" w:hAnsi="Georgia" w:cs="Georgia" w:eastAsia="Georgia"/>
-          <w:sz w:val="22"/>
-          <w:b w:val="0"/>
-          <w:bCs w:val="0"/>
-        </w:rPr>
-        <w:t xml:space="preserve"> conceptually, is a concise, self-contained summary of a research work. Operationally, this refers to the complete English-language summary section of undergraduate theses archived in the PSAU institutional repository from 2023 to 2025. It contains research objectives, methods, results, and conclusions.</w:t>
+          <w:rFonts w:ascii="Georgia" w:hAnsi="Georgia" w:eastAsia="Georgia" w:cs="Georgia"/>
+          <w:b/>
+          <w:sz w:val="22"/>
+          <w:szCs w:val="22"/>
+        </w:rPr>
+        <w:t>Abstract</w:t>
+      </w:r>
+      <w:r>
+        <w:rPr>
+          <w:rFonts w:ascii="Georgia" w:hAnsi="Georgia" w:eastAsia="Georgia" w:cs="Georgia"/>
+          <w:b w:val="0"/>
+          <w:sz w:val="22"/>
+          <w:szCs w:val="22"/>
+        </w:rPr>
+        <w:t>, conceptually, is a concise, self-contained summary of a research work. Operationally, this refers to the complete English-language summary section of undergraduate theses archived in the PSAU institutional repository from 2023 to 2025. It contains research objectives, methods, results, and conclusions.</w:t>
       </w:r>
     </w:p>
     <w:p>
@@ -1537,21 +1564,21 @@
       </w:pPr>
       <w:r>
         <w:rPr>
-          <w:rFonts w:ascii="Georgia" w:hAnsi="Georgia" w:cs="Georgia" w:eastAsia="Georgia"/>
-          <w:sz w:val="22"/>
-          <w:b w:val="1"/>
-          <w:bCs w:val="1"/>
-        </w:rPr>
-        <w:t>Adverbial Hedges,</w:t>
-      </w:r>
-      <w:r>
-        <w:rPr>
-          <w:rFonts w:ascii="Georgia" w:hAnsi="Georgia" w:cs="Georgia" w:eastAsia="Georgia"/>
-          <w:sz w:val="22"/>
-          <w:b w:val="0"/>
-          <w:bCs w:val="0"/>
-        </w:rPr>
-        <w:t xml:space="preserve"> conceptually, are adverbs or adverbial expressions that qualify the scope, frequency, or certainty of a proposition. Operationally, these include generally, typically, possibly, probably, relatively, and essentially. These are coded in this study when they restrict the generalizability of a claim rather than describe a procedural norm.</w:t>
+          <w:rFonts w:ascii="Georgia" w:hAnsi="Georgia" w:eastAsia="Georgia" w:cs="Georgia"/>
+          <w:b/>
+          <w:sz w:val="22"/>
+          <w:szCs w:val="22"/>
+        </w:rPr>
+        <w:t>Adverbial Hedges</w:t>
+      </w:r>
+      <w:r>
+        <w:rPr>
+          <w:rFonts w:ascii="Georgia" w:hAnsi="Georgia" w:eastAsia="Georgia" w:cs="Georgia"/>
+          <w:b w:val="0"/>
+          <w:sz w:val="22"/>
+          <w:szCs w:val="22"/>
+        </w:rPr>
+        <w:t>, conceptually, are adverbs or adverbial expressions that qualify the scope, frequency, or certainty of a proposition. Operationally, these include generally, typically, possibly, probably, relatively, and essentially. These are coded in this study when they restrict the generalizability of a claim rather than describe a procedural norm.</w:t>
       </w:r>
     </w:p>
     <w:p>
@@ -1563,21 +1590,21 @@
       </w:pPr>
       <w:r>
         <w:rPr>
-          <w:rFonts w:ascii="Georgia" w:hAnsi="Georgia" w:cs="Georgia" w:eastAsia="Georgia"/>
-          <w:sz w:val="22"/>
-          <w:b w:val="1"/>
-          <w:bCs w:val="1"/>
-        </w:rPr>
-        <w:t>Applied Life Sciences,</w:t>
-      </w:r>
-      <w:r>
-        <w:rPr>
-          <w:rFonts w:ascii="Georgia" w:hAnsi="Georgia" w:cs="Georgia" w:eastAsia="Georgia"/>
-          <w:sz w:val="22"/>
-          <w:b w:val="0"/>
-          <w:bCs w:val="0"/>
-        </w:rPr>
-        <w:t xml:space="preserve"> conceptually, refer to disciplines that apply scientific knowledge to the study and management of living organisms and biological systems. Operationally, this refers to the three specific undergraduate programs at PSAU included in the study: Agriculture, Biology, and Veterinary Medicine.</w:t>
+          <w:rFonts w:ascii="Georgia" w:hAnsi="Georgia" w:eastAsia="Georgia" w:cs="Georgia"/>
+          <w:b/>
+          <w:sz w:val="22"/>
+          <w:szCs w:val="22"/>
+        </w:rPr>
+        <w:t>Applied Life Sciences</w:t>
+      </w:r>
+      <w:r>
+        <w:rPr>
+          <w:rFonts w:ascii="Georgia" w:hAnsi="Georgia" w:eastAsia="Georgia" w:cs="Georgia"/>
+          <w:b w:val="0"/>
+          <w:sz w:val="22"/>
+          <w:szCs w:val="22"/>
+        </w:rPr>
+        <w:t>, conceptually, refer to disciplines that apply scientific knowledge to the study and management of living organisms and biological systems. Operationally, this refers to the three specific undergraduate programs at PSAU included in the study: Agriculture, Biology, and Veterinary Medicine.</w:t>
       </w:r>
     </w:p>
     <w:p>
@@ -1589,21 +1616,21 @@
       </w:pPr>
       <w:r>
         <w:rPr>
-          <w:rFonts w:ascii="Georgia" w:hAnsi="Georgia" w:cs="Georgia" w:eastAsia="Georgia"/>
-          <w:sz w:val="22"/>
-          <w:b w:val="1"/>
-          <w:bCs w:val="1"/>
-        </w:rPr>
-        <w:t>Claim Responsibility,</w:t>
-      </w:r>
-      <w:r>
-        <w:rPr>
-          <w:rFonts w:ascii="Georgia" w:hAnsi="Georgia" w:cs="Georgia" w:eastAsia="Georgia"/>
-          <w:sz w:val="22"/>
-          <w:b w:val="0"/>
-          <w:bCs w:val="0"/>
-        </w:rPr>
-        <w:t xml:space="preserve"> conceptually, refers to the epistemic obligation a writer accepts for the accuracy, truth, or limitations of a statement (Salager-Meyer, 1994). Writers use hedges to distribute this responsibility between themselves, their data, or external factors. Operationally, this serves as the interpretive lens for analyzing why specific hedges were chosen in the abstracts.</w:t>
+          <w:rFonts w:ascii="Georgia" w:hAnsi="Georgia" w:eastAsia="Georgia" w:cs="Georgia"/>
+          <w:b/>
+          <w:sz w:val="22"/>
+          <w:szCs w:val="22"/>
+        </w:rPr>
+        <w:t>Claim Responsibility</w:t>
+      </w:r>
+      <w:r>
+        <w:rPr>
+          <w:rFonts w:ascii="Georgia" w:hAnsi="Georgia" w:eastAsia="Georgia" w:cs="Georgia"/>
+          <w:b w:val="0"/>
+          <w:sz w:val="22"/>
+          <w:szCs w:val="22"/>
+        </w:rPr>
+        <w:t>, conceptually, refers to the epistemic obligation a writer accepts for the accuracy, truth, or limitations of a statement (Salager-Meyer, 1994). Writers use hedges to distribute this responsibility between themselves, their data, or external factors. Operationally, this serves as the interpretive lens for analyzing why specific hedges were chosen in the abstracts.</w:t>
       </w:r>
     </w:p>
     <w:p>
@@ -1614,20 +1641,21 @@
       </w:pPr>
       <w:r>
         <w:rPr>
-          <w:rFonts w:ascii="Georgia" w:hAnsi="Georgia" w:cs="Georgia" w:eastAsia="Georgia"/>
-          <w:sz w:val="22"/>
-          <w:szCs w:val="22"/>
+          <w:rFonts w:ascii="Georgia" w:hAnsi="Georgia" w:eastAsia="Georgia" w:cs="Georgia"/>
           <w:b/>
-        </w:rPr>
-        <w:t xml:space="preserve">Chi-Square Test of Independence</w:t>
-      </w:r>
-      <w:r>
-        <w:rPr>
-          <w:rFonts w:ascii="Georgia" w:hAnsi="Georgia" w:cs="Georgia" w:eastAsia="Georgia"/>
-          <w:sz w:val="22"/>
-          <w:szCs w:val="22"/>
-        </w:rPr>
-        <w:t xml:space="preserve">, conceptually, evaluates whether two categorical variables are associated. Operationally, this study used it to test the association between discipline and zero-hedge status (zero vs. nonzero). The test statistic is χ² = Σ [(Oᵢ − Eᵢ)² / Eᵢ], where Oᵢ is the observed frequency in cell i and Eᵢ is the expected frequency under independence. Degrees of freedom = (rows − 1) × (columns − 1). Reported values appear in the Results chapter.</w:t>
+          <w:sz w:val="22"/>
+          <w:szCs w:val="22"/>
+        </w:rPr>
+        <w:t>Chi-Square Test of Independence</w:t>
+      </w:r>
+      <w:r>
+        <w:rPr>
+          <w:rFonts w:ascii="Georgia" w:hAnsi="Georgia" w:eastAsia="Georgia" w:cs="Georgia"/>
+          <w:b w:val="0"/>
+          <w:sz w:val="22"/>
+          <w:szCs w:val="22"/>
+        </w:rPr>
+        <w:t>, conceptually, evaluates whether two categorical variables are associated. Operationally, this study used it to test the association between discipline and zero-hedge status (zero vs. nonzero). The test statistic is χ² = Σ [(Oᵢ − Eᵢ)² / Eᵢ], where Oᵢ is the observed frequency in cell i and Eᵢ is the expected frequency under independence. Degrees of freedom = (rows − 1) × (columns − 1). Reported values appear in the Results chapter.</w:t>
       </w:r>
     </w:p>
     <w:p>
@@ -1639,21 +1667,21 @@
       </w:pPr>
       <w:r>
         <w:rPr>
-          <w:rFonts w:ascii="Georgia" w:hAnsi="Georgia" w:cs="Georgia" w:eastAsia="Georgia"/>
-          <w:sz w:val="22"/>
-          <w:b w:val="1"/>
-          <w:bCs w:val="1"/>
-        </w:rPr>
-        <w:t>Clause-Level Hedges,</w:t>
-      </w:r>
-      <w:r>
-        <w:rPr>
-          <w:rFonts w:ascii="Georgia" w:hAnsi="Georgia" w:cs="Georgia" w:eastAsia="Georgia"/>
-          <w:sz w:val="22"/>
-          <w:b w:val="0"/>
-          <w:bCs w:val="0"/>
-        </w:rPr>
-        <w:t xml:space="preserve"> conceptually, are syntactic structures that frame a proposition as tentative, approximate, or subject to qualification. Operationally, these include expressions such as it seems that, it is possible that, to some extent, and in our view. These are coded in this study when the entire clause functions to express the writer’s epistemic reservation about the following or embedded proposition.</w:t>
+          <w:rFonts w:ascii="Georgia" w:hAnsi="Georgia" w:eastAsia="Georgia" w:cs="Georgia"/>
+          <w:b/>
+          <w:sz w:val="22"/>
+          <w:szCs w:val="22"/>
+        </w:rPr>
+        <w:t>Clause-Level Hedges</w:t>
+      </w:r>
+      <w:r>
+        <w:rPr>
+          <w:rFonts w:ascii="Georgia" w:hAnsi="Georgia" w:eastAsia="Georgia" w:cs="Georgia"/>
+          <w:b w:val="0"/>
+          <w:sz w:val="22"/>
+          <w:szCs w:val="22"/>
+        </w:rPr>
+        <w:t>, conceptually, are syntactic structures that frame a proposition as tentative, approximate, or subject to qualification. Operationally, these include expressions such as it seems that, it is possible that, to some extent, and in our view. These are coded in this study when the entire clause functions to express the writer’s epistemic reservation about the following or embedded proposition.</w:t>
       </w:r>
     </w:p>
     <w:p>
@@ -1666,9 +1694,20 @@
       <w:r>
         <w:rPr>
           <w:rFonts w:ascii="Georgia" w:hAnsi="Georgia" w:eastAsia="Georgia" w:cs="Georgia"/>
-          <w:sz w:val="24"/>
-        </w:rPr>
-        <w:t>Cohen’s Kappa (κ), conceptually, measures inter- or intra-rater agreement for categorical coding beyond chance. Operationally, this study used it for intra-rater reliability on a second pass of six abstracts. The formula is κ = (Pₒ − Pₑ) / (1 − Pₑ), where Pₒ is the observed proportion of agreement and Pₑ is the expected agreement by chance. Landis and Koch (1977) interpret κ values as: &lt;0.00 poor, 0.00-0.20 slight, 0.21-0.40 fair, 0.41-0.60 moderate, 0.61-0.80 substantial, 0.81-1.00 almost perfect. The intra-rater result was κ = 0.89.</w:t>
+          <w:b/>
+          <w:sz w:val="22"/>
+          <w:szCs w:val="22"/>
+        </w:rPr>
+        <w:t>Cohen’s Kappa (κ)</w:t>
+      </w:r>
+      <w:r>
+        <w:rPr>
+          <w:rFonts w:ascii="Georgia" w:hAnsi="Georgia" w:eastAsia="Georgia" w:cs="Georgia"/>
+          <w:b w:val="0"/>
+          <w:sz w:val="22"/>
+          <w:szCs w:val="22"/>
+        </w:rPr>
+        <w:t>, conceptually, measures inter- or intra-rater agreement for categorical coding beyond chance. Operationally, this study used it for intra-rater reliability on a second pass of six abstracts. The formula is κ = (Pₒ − Pₑ) / (1 − Pₑ), where Pₒ is the observed proportion of agreement and Pₑ is the expected agreement by chance. Landis and Koch (1977) interpret κ values as: &lt;0.00 poor, 0.00-0.20 slight, 0.21-0.40 fair, 0.41-0.60 moderate, 0.61-0.80 substantial, 0.81-1.00 almost perfect. The intra-rater result was κ = 0.89.</w:t>
       </w:r>
     </w:p>
     <w:p>
@@ -1680,21 +1719,21 @@
       </w:pPr>
       <w:r>
         <w:rPr>
-          <w:rFonts w:ascii="Georgia" w:hAnsi="Georgia" w:cs="Georgia" w:eastAsia="Georgia"/>
-          <w:sz w:val="22"/>
-          <w:b w:val="1"/>
-          <w:bCs w:val="1"/>
-        </w:rPr>
-        <w:t>Corpus-Assisted Discourse Analysis,</w:t>
-      </w:r>
-      <w:r>
-        <w:rPr>
-          <w:rFonts w:ascii="Georgia" w:hAnsi="Georgia" w:cs="Georgia" w:eastAsia="Georgia"/>
-          <w:sz w:val="22"/>
-          <w:b w:val="0"/>
-          <w:bCs w:val="0"/>
-        </w:rPr>
-        <w:t xml:space="preserve"> conceptually, uses systematic text collections to identify linguistic patterns, combining quantitative frequency measures with qualitative functional interpretation. Operationally, this refers to the manual frequency counting, functional coding, and cross-disciplinary comparison of hedging devices across 60 PSAU thesis abstracts using a Google Sheets coding template.</w:t>
+          <w:rFonts w:ascii="Georgia" w:hAnsi="Georgia" w:eastAsia="Georgia" w:cs="Georgia"/>
+          <w:b/>
+          <w:sz w:val="22"/>
+          <w:szCs w:val="22"/>
+        </w:rPr>
+        <w:t>Corpus-Assisted Discourse Analysis</w:t>
+      </w:r>
+      <w:r>
+        <w:rPr>
+          <w:rFonts w:ascii="Georgia" w:hAnsi="Georgia" w:eastAsia="Georgia" w:cs="Georgia"/>
+          <w:b w:val="0"/>
+          <w:sz w:val="22"/>
+          <w:szCs w:val="22"/>
+        </w:rPr>
+        <w:t>, conceptually, uses systematic text collections to identify linguistic patterns, combining quantitative frequency measures with qualitative functional interpretation. Operationally, this refers to the manual frequency counting, functional coding, and cross-disciplinary comparison of hedging devices across 60 PSAU thesis abstracts using a Google Sheets coding template.</w:t>
       </w:r>
     </w:p>
     <w:p>
@@ -1706,21 +1745,21 @@
       </w:pPr>
       <w:r>
         <w:rPr>
-          <w:rFonts w:ascii="Georgia" w:hAnsi="Georgia" w:cs="Georgia" w:eastAsia="Georgia"/>
-          <w:sz w:val="22"/>
-          <w:b w:val="1"/>
-          <w:bCs w:val="1"/>
-        </w:rPr>
-        <w:t>Disciplinary Variation,</w:t>
-      </w:r>
-      <w:r>
-        <w:rPr>
-          <w:rFonts w:ascii="Georgia" w:hAnsi="Georgia" w:cs="Georgia" w:eastAsia="Georgia"/>
-          <w:sz w:val="22"/>
-          <w:b w:val="0"/>
-          <w:bCs w:val="0"/>
-        </w:rPr>
-        <w:t xml:space="preserve"> conceptually, refers to systematic differences in language use across academic fields arising from different epistemic norms, evidence types, and rhetorical conventions. Operationally, this refers to observable differences in hedging frequency, type, and function across Agriculture, Veterinary Medicine, and Biology abstracts in this corpus.</w:t>
+          <w:rFonts w:ascii="Georgia" w:hAnsi="Georgia" w:eastAsia="Georgia" w:cs="Georgia"/>
+          <w:b/>
+          <w:sz w:val="22"/>
+          <w:szCs w:val="22"/>
+        </w:rPr>
+        <w:t>Disciplinary Variation</w:t>
+      </w:r>
+      <w:r>
+        <w:rPr>
+          <w:rFonts w:ascii="Georgia" w:hAnsi="Georgia" w:eastAsia="Georgia" w:cs="Georgia"/>
+          <w:b w:val="0"/>
+          <w:sz w:val="22"/>
+          <w:szCs w:val="22"/>
+        </w:rPr>
+        <w:t>, conceptually, refers to systematic differences in language use across academic fields arising from different epistemic norms, evidence types, and rhetorical conventions. Operationally, this refers to observable differences in hedging frequency, type, and function across Agriculture, Veterinary Medicine, and Biology abstracts in this corpus.</w:t>
       </w:r>
     </w:p>
     <w:p>
@@ -1732,21 +1771,21 @@
       </w:pPr>
       <w:r>
         <w:rPr>
-          <w:rFonts w:ascii="Georgia" w:hAnsi="Georgia" w:cs="Georgia" w:eastAsia="Georgia"/>
-          <w:sz w:val="22"/>
-          <w:b w:val="1"/>
-          <w:bCs w:val="1"/>
-        </w:rPr>
-        <w:t>Epistemic Stance,</w:t>
-      </w:r>
-      <w:r>
-        <w:rPr>
-          <w:rFonts w:ascii="Georgia" w:hAnsi="Georgia" w:cs="Georgia" w:eastAsia="Georgia"/>
-          <w:sz w:val="22"/>
-          <w:b w:val="0"/>
-          <w:bCs w:val="0"/>
-        </w:rPr>
-        <w:t xml:space="preserve"> conceptually, refers to the linguistic expression of a writer’s degree of commitment to the truth, certainty, or reliability of a proposition. It signals the writer’s judgment about the status of the knowledge they are presenting. Operationally, this refers to the aggregate pattern of hedging devices used in an abstract. A high frequency of hedges indicates a cautious or tentative stance, while a low frequency or absence of hedges records fewer overt markers of caution. It does not by itself establish absolute commitment, especially where findings are binary or measured.</w:t>
+          <w:rFonts w:ascii="Georgia" w:hAnsi="Georgia" w:eastAsia="Georgia" w:cs="Georgia"/>
+          <w:b/>
+          <w:sz w:val="22"/>
+          <w:szCs w:val="22"/>
+        </w:rPr>
+        <w:t>Epistemic Stance</w:t>
+      </w:r>
+      <w:r>
+        <w:rPr>
+          <w:rFonts w:ascii="Georgia" w:hAnsi="Georgia" w:eastAsia="Georgia" w:cs="Georgia"/>
+          <w:b w:val="0"/>
+          <w:sz w:val="22"/>
+          <w:szCs w:val="22"/>
+        </w:rPr>
+        <w:t>, conceptually, refers to the linguistic expression of a writer’s degree of commitment to the truth, certainty, or reliability of a proposition. It signals the writer’s judgment about the status of the knowledge they are presenting. Operationally, this refers to the aggregate pattern of hedging devices used in an abstract. A high frequency of hedges indicates a cautious or tentative stance, while a low frequency or absence of hedges records fewer overt markers of caution. It does not by itself establish absolute commitment, especially where findings are binary or measured.</w:t>
       </w:r>
     </w:p>
     <w:p>
@@ -1758,9 +1797,20 @@
       <w:r>
         <w:rPr>
           <w:rFonts w:ascii="Georgia" w:hAnsi="Georgia" w:eastAsia="Georgia" w:cs="Georgia"/>
-          <w:sz w:val="24"/>
-        </w:rPr>
-        <w:t>Epistemic Weight, conceptually, is the strength of the writer’s commitment to the truth of a proposition (how certain or tentative the claim is). Operationally, Step 2 first requires a claim: a statement about data, the world, or prior work that evidence could show to be wrong. Aims, directives, and routine procedure are excluded by kind. The Working Test then asks whether removing the device raises commitment to that claim’s truth (EC). The Reader Test asks whether commitment stays the same but the claim reaches the reader more bluntly or the writer takes sole ownership against prior work (P). Non-claims and tokens that meet neither check are logged as FP.</w:t>
+          <w:b/>
+          <w:sz w:val="22"/>
+          <w:szCs w:val="22"/>
+        </w:rPr>
+        <w:t>Epistemic Weight</w:t>
+      </w:r>
+      <w:r>
+        <w:rPr>
+          <w:rFonts w:ascii="Georgia" w:hAnsi="Georgia" w:eastAsia="Georgia" w:cs="Georgia"/>
+          <w:b w:val="0"/>
+          <w:sz w:val="22"/>
+          <w:szCs w:val="22"/>
+        </w:rPr>
+        <w:t>, conceptually, is the strength of the writer’s commitment to the truth of a proposition (how certain or tentative the claim is). Operationally, Step 2 first requires a claim: a statement about data, the world, or prior work that evidence could show to be wrong. Aims, directives, and routine procedure are excluded by kind. The Working Test then asks whether removing the device raises commitment to that claim’s truth (EC). The Reader Test asks whether commitment stays the same but the claim reaches the reader more bluntly or the writer takes sole ownership against prior work (P). Non-claims and tokens that meet neither check are logged as FP.</w:t>
       </w:r>
     </w:p>
     <w:p>
@@ -1772,9 +1822,20 @@
       <w:r>
         <w:rPr>
           <w:rFonts w:ascii="Georgia" w:hAnsi="Georgia" w:eastAsia="Georgia" w:cs="Georgia"/>
-          <w:sz w:val="24"/>
-        </w:rPr>
-        <w:t>Hedge Function, conceptually, refers to the rhetorical purpose a hedging device serves in its discourse context. Operationally, this study uses two function labels only, adapted from Hyland’s (1998) discussion of hedging functions (not a fixed published taxonomy): Epistemic Caution (EC), which expresses reduced commitment to a claim’s truth or accuracy, and Politeness/Deference (P), which shows interpersonal softening toward readers or prior research. False positives are residual rejects recorded with reason codes.</w:t>
+          <w:b/>
+          <w:sz w:val="22"/>
+          <w:szCs w:val="22"/>
+        </w:rPr>
+        <w:t>Hedge Function</w:t>
+      </w:r>
+      <w:r>
+        <w:rPr>
+          <w:rFonts w:ascii="Georgia" w:hAnsi="Georgia" w:eastAsia="Georgia" w:cs="Georgia"/>
+          <w:b w:val="0"/>
+          <w:sz w:val="22"/>
+          <w:szCs w:val="22"/>
+        </w:rPr>
+        <w:t>, conceptually, refers to the rhetorical purpose a hedging device serves in its discourse context. Operationally, this study uses two function labels only, adapted from Hyland’s (1998) discussion of hedging functions (not a fixed published taxonomy): Epistemic Caution (EC), which expresses reduced commitment to a claim’s truth or accuracy, and Politeness/Deference (P), which shows interpersonal softening toward readers or prior research. False positives are residual rejects recorded with reason codes.</w:t>
       </w:r>
     </w:p>
     <w:p>
@@ -1786,21 +1847,21 @@
       </w:pPr>
       <w:r>
         <w:rPr>
-          <w:rFonts w:ascii="Georgia" w:hAnsi="Georgia" w:cs="Georgia" w:eastAsia="Georgia"/>
-          <w:sz w:val="22"/>
-          <w:b w:val="1"/>
-          <w:bCs w:val="1"/>
-        </w:rPr>
-        <w:t>Hedging,</w:t>
-      </w:r>
-      <w:r>
-        <w:rPr>
-          <w:rFonts w:ascii="Georgia" w:hAnsi="Georgia" w:cs="Georgia" w:eastAsia="Georgia"/>
-          <w:sz w:val="22"/>
-          <w:b w:val="0"/>
-          <w:bCs w:val="0"/>
-        </w:rPr>
-        <w:t xml:space="preserve"> conceptually, is the use of linguistic devices to express caution or tentativeness in academic writing, serving as a mechanism for managing claim responsibility (Salager-Meyer, 1994). Operationally, this refers to four device categories identified in the corpus following Hyland’s (1998) taxonomy. These categories are lexical hedges, modal verbs, adverbial hedges, and clause-level hedges.</w:t>
+          <w:rFonts w:ascii="Georgia" w:hAnsi="Georgia" w:eastAsia="Georgia" w:cs="Georgia"/>
+          <w:b/>
+          <w:sz w:val="22"/>
+          <w:szCs w:val="22"/>
+        </w:rPr>
+        <w:t>Hedging</w:t>
+      </w:r>
+      <w:r>
+        <w:rPr>
+          <w:rFonts w:ascii="Georgia" w:hAnsi="Georgia" w:eastAsia="Georgia" w:cs="Georgia"/>
+          <w:b w:val="0"/>
+          <w:sz w:val="22"/>
+          <w:szCs w:val="22"/>
+        </w:rPr>
+        <w:t>, conceptually, is the use of linguistic devices to express caution or tentativeness in academic writing, serving as a mechanism for managing claim responsibility (Salager-Meyer, 1994). Operationally, this refers to four device categories identified in the corpus following Hyland’s (1998) taxonomy. These categories are lexical hedges, modal verbs, adverbial hedges, and clause-level hedges.</w:t>
       </w:r>
     </w:p>
     <w:p>
@@ -1811,20 +1872,21 @@
       </w:pPr>
       <w:r>
         <w:rPr>
-          <w:rFonts w:ascii="Georgia" w:hAnsi="Georgia" w:cs="Georgia" w:eastAsia="Georgia"/>
-          <w:sz w:val="22"/>
-          <w:szCs w:val="22"/>
+          <w:rFonts w:ascii="Georgia" w:hAnsi="Georgia" w:eastAsia="Georgia" w:cs="Georgia"/>
           <w:b/>
-        </w:rPr>
-        <w:t xml:space="preserve">Kruskal-Wallis Test</w:t>
-      </w:r>
-      <w:r>
-        <w:rPr>
-          <w:rFonts w:ascii="Georgia" w:hAnsi="Georgia" w:cs="Georgia" w:eastAsia="Georgia"/>
-          <w:sz w:val="22"/>
-          <w:szCs w:val="22"/>
-        </w:rPr>
-        <w:t xml:space="preserve">, conceptually, is a non-parametric rank-based alternative to one-way ANOVA for comparing distributions across three or more independent groups. Operationally, this study applied it to per-abstract hedge rates (hedges per 100 words) across the three disciplines. The test statistic is H = [12 / (N(N+1))] × Σ (Rⱼ² / nⱼ) − 3(N+1), where N is the total number of observations, nⱼ is the size of group j, and Rⱼ is the sum of ranks for group j. Reported values appear in the Results chapter.</w:t>
+          <w:sz w:val="22"/>
+          <w:szCs w:val="22"/>
+        </w:rPr>
+        <w:t>Kruskal-Wallis Test</w:t>
+      </w:r>
+      <w:r>
+        <w:rPr>
+          <w:rFonts w:ascii="Georgia" w:hAnsi="Georgia" w:eastAsia="Georgia" w:cs="Georgia"/>
+          <w:b w:val="0"/>
+          <w:sz w:val="22"/>
+          <w:szCs w:val="22"/>
+        </w:rPr>
+        <w:t>, conceptually, is a non-parametric rank-based alternative to one-way ANOVA for comparing distributions across three or more independent groups. Operationally, this study applied it to per-abstract hedge rates (hedges per 100 words) across the three disciplines. The test statistic is H = [12 / (N(N+1))] × Σ (Rⱼ² / nⱼ) − 3(N+1), where N is the total number of observations, nⱼ is the size of group j, and Rⱼ is the sum of ranks for group j. Reported values appear in the Results chapter.</w:t>
       </w:r>
     </w:p>
     <w:p>
@@ -1836,21 +1898,21 @@
       </w:pPr>
       <w:r>
         <w:rPr>
-          <w:rFonts w:ascii="Georgia" w:hAnsi="Georgia" w:cs="Georgia" w:eastAsia="Georgia"/>
-          <w:sz w:val="22"/>
-          <w:b w:val="1"/>
-          <w:bCs w:val="1"/>
-        </w:rPr>
-        <w:t>Lexical Hedges,</w:t>
-      </w:r>
-      <w:r>
-        <w:rPr>
-          <w:rFonts w:ascii="Georgia" w:hAnsi="Georgia" w:cs="Georgia" w:eastAsia="Georgia"/>
-          <w:sz w:val="22"/>
-          <w:b w:val="0"/>
-          <w:bCs w:val="0"/>
-        </w:rPr>
-        <w:t xml:space="preserve"> conceptually, are verbs, adjectives, or nouns that introduce uncertainty or tentativeness at the propositional level. Operationally, these include verbs such as suggest, indicate, appear, and seem. They also include adjectives such as possible, probable, and likely, and nouns such as possibility and assumption. These are coded in this study when they express epistemic qualification of a claim rather than description or recommendation.</w:t>
+          <w:rFonts w:ascii="Georgia" w:hAnsi="Georgia" w:eastAsia="Georgia" w:cs="Georgia"/>
+          <w:b/>
+          <w:sz w:val="22"/>
+          <w:szCs w:val="22"/>
+        </w:rPr>
+        <w:t>Lexical Hedges</w:t>
+      </w:r>
+      <w:r>
+        <w:rPr>
+          <w:rFonts w:ascii="Georgia" w:hAnsi="Georgia" w:eastAsia="Georgia" w:cs="Georgia"/>
+          <w:b w:val="0"/>
+          <w:sz w:val="22"/>
+          <w:szCs w:val="22"/>
+        </w:rPr>
+        <w:t>, conceptually, are verbs, adjectives, or nouns that introduce uncertainty or tentativeness at the propositional level. Operationally, these include verbs such as suggest, indicate, appear, and seem. They also include adjectives such as possible, probable, and likely, and nouns such as possibility and assumption. These are coded in this study when they express epistemic qualification of a claim rather than description or recommendation.</w:t>
       </w:r>
     </w:p>
     <w:p>
@@ -1862,9 +1924,20 @@
       <w:r>
         <w:rPr>
           <w:rFonts w:ascii="Georgia" w:hAnsi="Georgia" w:eastAsia="Georgia" w:cs="Georgia"/>
-          <w:sz w:val="24"/>
-        </w:rPr>
-        <w:t>Mann-Whitney U Test, conceptually, is a non-parametric test that compares the distributions of a continuous or ordinal variable between two independent groups. Operationally, this study used it as a post hoc follow-up after the Kruskal-Wallis test, comparing per-abstract hedge rates (hedges per 100 words) for each pair of disciplines. The test statistic is U = n₁n₂ + [n₁(n₁+1)]/2 − R₁, where n₁ and n₂ are the sample sizes of the two groups and R₁ is the sum of ranks for group 1. A Bonferroni correction for three pairwise tests set α =.017. Reported pairwise results appear in the Results chapter.</w:t>
+          <w:b/>
+          <w:sz w:val="22"/>
+          <w:szCs w:val="22"/>
+        </w:rPr>
+        <w:t>Mann-Whitney U Test</w:t>
+      </w:r>
+      <w:r>
+        <w:rPr>
+          <w:rFonts w:ascii="Georgia" w:hAnsi="Georgia" w:eastAsia="Georgia" w:cs="Georgia"/>
+          <w:b w:val="0"/>
+          <w:sz w:val="22"/>
+          <w:szCs w:val="22"/>
+        </w:rPr>
+        <w:t>, conceptually, is a non-parametric test that compares the distributions of a continuous or ordinal variable between two independent groups. Operationally, this study used it as a post hoc follow-up after the Kruskal-Wallis test, comparing per-abstract hedge rates (hedges per 100 words) for each pair of disciplines. The test statistic is U = n₁n₂ + [n₁(n₁+1)]/2 − R₁, where n₁ and n₂ are the sample sizes of the two groups and R₁ is the sum of ranks for group 1. A Bonferroni correction for three pairwise tests set α =.017. Reported pairwise results appear in the Results chapter.</w:t>
       </w:r>
     </w:p>
     <w:p>
@@ -1876,21 +1949,21 @@
       </w:pPr>
       <w:r>
         <w:rPr>
-          <w:rFonts w:ascii="Georgia" w:hAnsi="Georgia" w:cs="Georgia" w:eastAsia="Georgia"/>
-          <w:sz w:val="22"/>
-          <w:b w:val="1"/>
-          <w:bCs w:val="1"/>
-        </w:rPr>
-        <w:t>Modal Verbs,</w:t>
-      </w:r>
-      <w:r>
-        <w:rPr>
-          <w:rFonts w:ascii="Georgia" w:hAnsi="Georgia" w:cs="Georgia" w:eastAsia="Georgia"/>
-          <w:sz w:val="22"/>
-          <w:b w:val="0"/>
-          <w:bCs w:val="0"/>
-        </w:rPr>
-        <w:t xml:space="preserve"> conceptually, are auxiliary verbs that express degrees of possibility, probability, or conditionality. Operationally, these include may, might, could, would, should, and can. These are coded in this study when they signal epistemic uncertainty about a claim rather than capability, obligation, or future procedure.</w:t>
+          <w:rFonts w:ascii="Georgia" w:hAnsi="Georgia" w:eastAsia="Georgia" w:cs="Georgia"/>
+          <w:b/>
+          <w:sz w:val="22"/>
+          <w:szCs w:val="22"/>
+        </w:rPr>
+        <w:t>Modal Verbs</w:t>
+      </w:r>
+      <w:r>
+        <w:rPr>
+          <w:rFonts w:ascii="Georgia" w:hAnsi="Georgia" w:eastAsia="Georgia" w:cs="Georgia"/>
+          <w:b w:val="0"/>
+          <w:sz w:val="22"/>
+          <w:szCs w:val="22"/>
+        </w:rPr>
+        <w:t>, conceptually, are auxiliary verbs that express degrees of possibility, probability, or conditionality. Operationally, these include may, might, could, would, should, and can. These are coded in this study when they signal epistemic uncertainty about a claim rather than capability, obligation, or future procedure.</w:t>
       </w:r>
     </w:p>
     <w:p>
@@ -1902,21 +1975,21 @@
       </w:pPr>
       <w:r>
         <w:rPr>
-          <w:rFonts w:ascii="Georgia" w:hAnsi="Georgia" w:cs="Georgia" w:eastAsia="Georgia"/>
-          <w:sz w:val="22"/>
-          <w:b w:val="1"/>
-          <w:bCs w:val="1"/>
-        </w:rPr>
-        <w:t>Normalized Frequency,</w:t>
-      </w:r>
-      <w:r>
-        <w:rPr>
-          <w:rFonts w:ascii="Georgia" w:hAnsi="Georgia" w:cs="Georgia" w:eastAsia="Georgia"/>
-          <w:sz w:val="22"/>
-          <w:b w:val="0"/>
-          <w:bCs w:val="0"/>
-        </w:rPr>
-        <w:t xml:space="preserve"> conceptually, is a statistical method used to compare linguistic features across texts of different lengths by standardizing the count to a base unit. Operationally, this refers to the formula used in this study to compare hedge usage: Normalized Frequency = (Total Hedges / Total Word Count) x 100. For example, if an abstract contains 3 hedges and 258 words, the normalized frequency is (3/258) x 100 = 1.16 hedges per 100 words.</w:t>
+          <w:rFonts w:ascii="Georgia" w:hAnsi="Georgia" w:eastAsia="Georgia" w:cs="Georgia"/>
+          <w:b/>
+          <w:sz w:val="22"/>
+          <w:szCs w:val="22"/>
+        </w:rPr>
+        <w:t>Normalized Frequency</w:t>
+      </w:r>
+      <w:r>
+        <w:rPr>
+          <w:rFonts w:ascii="Georgia" w:hAnsi="Georgia" w:eastAsia="Georgia" w:cs="Georgia"/>
+          <w:b w:val="0"/>
+          <w:sz w:val="22"/>
+          <w:szCs w:val="22"/>
+        </w:rPr>
+        <w:t>, conceptually, is a statistical method used to compare linguistic features across texts of different lengths by standardizing the count to a base unit. Operationally, this refers to the formula used in this study to compare hedge usage: Normalized Frequency = (Total Hedges / Total Word Count) x 100. For example, if an abstract contains 3 hedges and 258 words, the normalized frequency is (3/258) x 100 = 1.16 hedges per 100 words.</w:t>
       </w:r>
     </w:p>
     <w:p>
@@ -1928,21 +2001,21 @@
       </w:pPr>
       <w:r>
         <w:rPr>
-          <w:rFonts w:ascii="Georgia" w:hAnsi="Georgia" w:cs="Georgia" w:eastAsia="Georgia"/>
-          <w:sz w:val="22"/>
-          <w:b w:val="1"/>
-          <w:bCs w:val="1"/>
-        </w:rPr>
-        <w:t>Operational Restatement (Threshold Restatement),</w:t>
-      </w:r>
-      <w:r>
-        <w:rPr>
-          <w:rFonts w:ascii="Georgia" w:hAnsi="Georgia" w:cs="Georgia" w:eastAsia="Georgia"/>
-          <w:sz w:val="22"/>
-          <w:b w:val="0"/>
-          <w:bCs w:val="0"/>
-        </w:rPr>
-        <w:t xml:space="preserve"> conceptually, a phrase that only restates a result already fixed by the measure or a field-standard threshold, without a further uncertain inference. Operationally, evidential verbs used this way (especially indicating) are coded FP-Gen rather than as lexical hedges. In Results this rule is also called the “indicating” tautology test.</w:t>
+          <w:rFonts w:ascii="Georgia" w:hAnsi="Georgia" w:eastAsia="Georgia" w:cs="Georgia"/>
+          <w:b/>
+          <w:sz w:val="22"/>
+          <w:szCs w:val="22"/>
+        </w:rPr>
+        <w:t>Operational Restatement (Threshold Restatement)</w:t>
+      </w:r>
+      <w:r>
+        <w:rPr>
+          <w:rFonts w:ascii="Georgia" w:hAnsi="Georgia" w:eastAsia="Georgia" w:cs="Georgia"/>
+          <w:b w:val="0"/>
+          <w:sz w:val="22"/>
+          <w:szCs w:val="22"/>
+        </w:rPr>
+        <w:t>, conceptually, a phrase that only restates a result already fixed by the measure or a field-standard threshold, without a further uncertain inference. Operationally, evidential verbs used this way (especially indicating) are coded FP-Gen rather than as lexical hedges. In Results this rule is also called the “indicating” tautology test.</w:t>
       </w:r>
     </w:p>
     <w:p>
@@ -1954,21 +2027,21 @@
       </w:pPr>
       <w:r>
         <w:rPr>
-          <w:rFonts w:ascii="Georgia" w:hAnsi="Georgia" w:cs="Georgia" w:eastAsia="Georgia"/>
-          <w:sz w:val="22"/>
-          <w:b w:val="1"/>
-          <w:bCs w:val="1"/>
-        </w:rPr>
-        <w:t>Rescue-Hedging (Rescue Framing),</w:t>
-      </w:r>
-      <w:r>
-        <w:rPr>
-          <w:rFonts w:ascii="Georgia" w:hAnsi="Georgia" w:cs="Georgia" w:eastAsia="Georgia"/>
-          <w:sz w:val="22"/>
-          <w:b w:val="0"/>
-          <w:bCs w:val="0"/>
-        </w:rPr>
-        <w:t xml:space="preserve"> conceptually, the use of hedges after an explicit non-significant result so that a treatment or finding is still presented as potentially beneficial. Operationally, the term is used in this study as a descriptive label for that pattern.</w:t>
+          <w:rFonts w:ascii="Georgia" w:hAnsi="Georgia" w:eastAsia="Georgia" w:cs="Georgia"/>
+          <w:b/>
+          <w:sz w:val="22"/>
+          <w:szCs w:val="22"/>
+        </w:rPr>
+        <w:t>Rescue-Hedging (Rescue Framing)</w:t>
+      </w:r>
+      <w:r>
+        <w:rPr>
+          <w:rFonts w:ascii="Georgia" w:hAnsi="Georgia" w:eastAsia="Georgia" w:cs="Georgia"/>
+          <w:b w:val="0"/>
+          <w:sz w:val="22"/>
+          <w:szCs w:val="22"/>
+        </w:rPr>
+        <w:t>, conceptually, the use of hedges after an explicit non-significant result so that a treatment or finding is still presented as potentially beneficial. Operationally, the term is used in this study as a descriptive label for that pattern.</w:t>
       </w:r>
     </w:p>
     <w:p>
@@ -1980,9 +2053,20 @@
       <w:r>
         <w:rPr>
           <w:rFonts w:ascii="Georgia" w:hAnsi="Georgia" w:eastAsia="Georgia" w:cs="Georgia"/>
-          <w:sz w:val="24"/>
-        </w:rPr>
-        <w:t>Softening, conceptually, is the reduction of force, directness, imposition, or interpersonal impact in a statement. Operationally, Step 2 tracks softening only on claims (statements about data, the world, or prior work that evidence could show to be wrong). Retained hedges are labeled EC and/or P only, by the Working Test and Reader Test after the claim condition. FP is Aims, directives, and routine procedure fail the claim condition by kind and are logged FP even if no category pre-filter is applied. P = 0 in this study refers to reader-oriented softening of claims, not to softened directives.</w:t>
+          <w:b/>
+          <w:sz w:val="22"/>
+          <w:szCs w:val="22"/>
+        </w:rPr>
+        <w:t>Softening</w:t>
+      </w:r>
+      <w:r>
+        <w:rPr>
+          <w:rFonts w:ascii="Georgia" w:hAnsi="Georgia" w:eastAsia="Georgia" w:cs="Georgia"/>
+          <w:b w:val="0"/>
+          <w:sz w:val="22"/>
+          <w:szCs w:val="22"/>
+        </w:rPr>
+        <w:t>, conceptually, is the reduction of force, directness, imposition, or interpersonal impact in a statement. Operationally, Step 2 tracks softening only on claims (statements about data, the world, or prior work that evidence could show to be wrong). Retained hedges are labeled EC and/or P only, by the Working Test and Reader Test after the claim condition. FP is Aims, directives, and routine procedure fail the claim condition by kind and are logged FP even if no category pre-filter is applied. P = 0 in this study refers to reader-oriented softening of claims, not to softened directives.</w:t>
       </w:r>
     </w:p>
     <w:p>
@@ -2041,10 +2125,10 @@
       <w:r>
         <w:rPr>
           <w:rFonts w:ascii="Georgia" w:cs="Georgia" w:eastAsia="Georgia" w:hAnsi="Georgia"/>
-          <w:b w:val="1"/>
+          <w:b/>
           <w:bCs w:val="1"/>
-          <w:sz w:val="28"/>
-          <w:szCs w:val="28"/>
+          <w:sz w:val="22"/>
+          <w:szCs w:val="22"/>
           <w:rtl w:val="0"/>
         </w:rPr>
         <w:t xml:space="preserve">METHODOLOGY</w:t>
@@ -2093,10 +2177,10 @@
       <w:r>
         <w:rPr>
           <w:rFonts w:ascii="Georgia" w:cs="Georgia" w:eastAsia="Georgia" w:hAnsi="Georgia"/>
-          <w:b w:val="1"/>
+          <w:b/>
           <w:bCs w:val="1"/>
-          <w:sz w:val="24"/>
-          <w:szCs w:val="24"/>
+          <w:sz w:val="22"/>
+          <w:szCs w:val="22"/>
           <w:rtl w:val="0"/>
         </w:rPr>
         <w:t xml:space="preserve">RESEARCH CONTEXT</w:t>
@@ -2197,10 +2281,10 @@
       <w:r>
         <w:rPr>
           <w:rFonts w:ascii="Georgia" w:cs="Georgia" w:eastAsia="Georgia" w:hAnsi="Georgia"/>
-          <w:b w:val="1"/>
+          <w:b/>
           <w:bCs w:val="1"/>
-          <w:sz w:val="24"/>
-          <w:szCs w:val="24"/>
+          <w:sz w:val="22"/>
+          <w:szCs w:val="22"/>
           <w:rtl w:val="0"/>
         </w:rPr>
         <w:t xml:space="preserve">RESEARCH DESIGN</w:t>
@@ -2249,10 +2333,10 @@
       <w:r>
         <w:rPr>
           <w:rFonts w:ascii="Georgia" w:cs="Georgia" w:eastAsia="Georgia" w:hAnsi="Georgia"/>
-          <w:b w:val="1"/>
+          <w:b/>
           <w:bCs w:val="1"/>
-          <w:sz w:val="24"/>
-          <w:szCs w:val="24"/>
+          <w:sz w:val="22"/>
+          <w:szCs w:val="22"/>
           <w:rtl w:val="0"/>
         </w:rPr>
         <w:t xml:space="preserve">RESEARCH PROCESS</w:t>
@@ -2277,8 +2361,8 @@
           <w:rFonts w:ascii="Georgia" w:hAnsi="Georgia" w:cs="Georgia" w:eastAsia="Georgia"/>
           <w:i w:val="0"/>
           <w:iCs w:val="0"/>
-          <w:sz w:val="24"/>
-          <w:szCs w:val="24"/>
+          <w:sz w:val="22"/>
+          <w:szCs w:val="22"/>
           <w:rtl w:val="0"/>
           <w:b w:val="0"/>
           <w:bCs w:val="0"/>
@@ -2307,8 +2391,9 @@
         <w:rPr>
           <w:rFonts w:ascii="Georgia" w:hAnsi="Georgia" w:cs="Georgia" w:eastAsia="Georgia"/>
           <w:sz w:val="22"/>
-          <w:b w:val="1"/>
+          <w:b/>
           <w:bCs w:val="1"/>
+          <w:szCs w:val="22"/>
         </w:rPr>
         <w:t xml:space="preserve">a. Requesting Permission. </w:t>
       </w:r>
@@ -2318,6 +2403,7 @@
           <w:sz w:val="22"/>
           <w:b w:val="0"/>
           <w:bCs w:val="0"/>
+          <w:szCs w:val="22"/>
         </w:rPr>
         <w:t>The researcher secured written permission from the PSAU Library administration to access the physical archives of undergraduate theses. Due to institutional policies on intellectual property, soft copies of theses are restricted and cannot be provided electronically. Access is limited to on-site reading of hard-bound copies. The researcher obtained specific authorization to photograph the abstract sections of the selected theses for research purposes.</w:t>
       </w:r>
@@ -2332,7 +2418,9 @@
       <w:r>
         <w:rPr>
           <w:rFonts w:ascii="Georgia" w:hAnsi="Georgia" w:eastAsia="Georgia" w:cs="Georgia"/>
-          <w:sz w:val="24"/>
+          <w:b w:val="0"/>
+          <w:sz w:val="22"/>
+          <w:szCs w:val="22"/>
         </w:rPr>
         <w:t>b. Corpus Construction. Disproportionate stratified systematic sampling was used, with discipline as the stratification variable and fixed analytical targets per stratum to ensure equal representation regardless of population size. The target sample sizes were n=20 for Biology, n=20 for Veterinary Medicine, n=10 for Agriculture, Animal Science, and n=10 for Agriculture, Crop Science, totaling 60 abstracts. Within each stratum, a sampling interval k was calculated as k = N/n, where N is the stratum’s target pool size (theses completed 2023-2025) and n is the required sample size. The intervals were as follows: Biology k=7 (145÷20=7.25), Veterinary Medicine k=5 (104÷20=5.2), Animal Science k=4 (38÷10=3.8), and Crop Science k=9 (94÷10=9.4). Sampling began from a randomly selected position around the middle of each stratum’s catalog and proceeded forward by taking every kth thesis. Where the end of the stratum was reached before the required sample size, counting wrapped around to the beginning of the catalog and continued until the target sample was met. Disciplinary classification followed the degree program under which each thesis was officially submitted (e.g., B.S. Agriculture, B.S. Biology, D.V.M.), not a research topic, to ensure objective categorization.</w:t>
       </w:r>
@@ -2347,7 +2435,9 @@
       <w:r>
         <w:rPr>
           <w:rFonts w:ascii="Georgia" w:hAnsi="Georgia" w:eastAsia="Georgia" w:cs="Georgia"/>
-          <w:sz w:val="24"/>
+          <w:b w:val="0"/>
+          <w:sz w:val="22"/>
+          <w:szCs w:val="22"/>
         </w:rPr>
         <w:t>c. Text Extraction. Abstracts were captured through on-site photography of the hard-bound thesis copies. These images were then converted to plain text using Optical Character Recognition (OCR) tools such as Google Drive or Adobe Scan. Each converted text was manually verified against the original photographs to correct transcription errors. Particular attention was paid to verifying sentences containing potential hedge tokens, as OCR errors in these sentences would directly affect the coding results. Text files were anonymized using discipline codes (Acs1-Acs10, Aas1-Aas10, VM1-VM20, B1-B20) and organized by discipline.</w:t>
       </w:r>
@@ -2370,6 +2460,7 @@
       <w:r>
         <w:rPr>
           <w:rFonts w:ascii="Georgia" w:hAnsi="Georgia" w:cs="Georgia" w:eastAsia="Georgia"/>
+          <w:b w:val="0"/>
           <w:sz w:val="22"/>
           <w:szCs w:val="22"/>
         </w:rPr>
@@ -2387,8 +2478,9 @@
         <w:rPr>
           <w:rFonts w:ascii="Georgia" w:hAnsi="Georgia" w:cs="Georgia" w:eastAsia="Georgia"/>
           <w:sz w:val="22"/>
-          <w:b w:val="1"/>
+          <w:b/>
           <w:bCs w:val="1"/>
+          <w:szCs w:val="22"/>
         </w:rPr>
         <w:t xml:space="preserve">e. Data Analysis. </w:t>
       </w:r>
@@ -2398,6 +2490,7 @@
           <w:sz w:val="22"/>
           <w:b w:val="0"/>
           <w:bCs w:val="0"/>
+          <w:szCs w:val="22"/>
         </w:rPr>
         <w:t>Hedge identification, type classification, and functional coding were all conducted manually using a Google Sheets coding template. Each abstract was read in full before coding began to ensure hedges were interpreted in context rather than flagged as isolated tokens. Ambiguous cases were resolved using the predefined decision tree in Appendix A. Frequency counts were normalized per 100 words to enable comparison across abstracts of varying length. In a separate pass, each abstract was also coded for outcome type from its results language (Binary, Continuous, Mixed, Null/NS, Other), so that density patterns could be read against the kind of finding reported. Those codes are recorded in the coding spreadsheet and discussed in Part IV. While the quantitative analysis identified what hedges were used, the qualitative interpretation applied Salager-Meyer’s (1994) claim-responsibility framework and Hyland’s (2005) stance model to explain why these patterns occurred. Given the corpus size, findings were interpreted as indicative patterns within the PSAU context, supplemented by inferential analyses (chi-square, Kruskal-Wallis) whose results are reported transparently but should not be treated as confirmatory given the small, zero-inflated sample.</w:t>
       </w:r>
@@ -2413,8 +2506,9 @@
         <w:rPr>
           <w:rFonts w:ascii="Georgia" w:hAnsi="Georgia" w:cs="Georgia" w:eastAsia="Georgia"/>
           <w:sz w:val="22"/>
-          <w:b w:val="1"/>
+          <w:b/>
           <w:bCs w:val="1"/>
+          <w:szCs w:val="22"/>
         </w:rPr>
         <w:t xml:space="preserve">f. Timeline. </w:t>
       </w:r>
@@ -2424,6 +2518,7 @@
           <w:sz w:val="22"/>
           <w:b w:val="0"/>
           <w:bCs w:val="0"/>
+          <w:szCs w:val="22"/>
         </w:rPr>
         <w:t>Permission and library access: 1 week. Corpus construction and on-site photography: 3 weeks. OCR verification and text preparation: 2 weeks. Pilot testing and coding finalization: 2 weeks. Full coding and frequency analysis: 8 weeks (approximately 10 hours per week). Writing and revision: 8 weeks. Total timeframe: approximately 5.5 months (24 weeks).</w:t>
       </w:r>
@@ -2438,10 +2533,10 @@
       <w:r>
         <w:rPr>
           <w:rFonts w:ascii="Georgia" w:cs="Georgia" w:eastAsia="Georgia" w:hAnsi="Georgia"/>
-          <w:b w:val="1"/>
+          <w:b/>
           <w:bCs w:val="1"/>
-          <w:sz w:val="24"/>
-          <w:szCs w:val="24"/>
+          <w:sz w:val="22"/>
+          <w:szCs w:val="22"/>
           <w:rtl w:val="0"/>
         </w:rPr>
         <w:t xml:space="preserve">CODING DECISION RULES FOR AMBIGUOUS CASES</w:t>
@@ -2485,10 +2580,10 @@
       <w:r>
         <w:rPr>
           <w:rFonts w:ascii="Georgia" w:cs="Georgia" w:eastAsia="Georgia" w:hAnsi="Georgia"/>
-          <w:b w:val="1"/>
+          <w:b/>
           <w:bCs w:val="1"/>
-          <w:sz w:val="24"/>
-          <w:szCs w:val="24"/>
+          <w:sz w:val="22"/>
+          <w:szCs w:val="22"/>
           <w:rtl w:val="0"/>
         </w:rPr>
         <w:t xml:space="preserve">RESEARCH CORPUS</w:t>
@@ -2552,6 +2647,7 @@
       <w:r>
         <w:rPr>
           <w:rFonts w:ascii="Georgia" w:hAnsi="Georgia" w:cs="Georgia" w:eastAsia="Georgia"/>
+          <w:b w:val="0"/>
           <w:sz w:val="22"/>
           <w:szCs w:val="22"/>
         </w:rPr>
@@ -3725,7 +3821,9 @@
       <w:r>
         <w:rPr>
           <w:rFonts w:ascii="Georgia" w:hAnsi="Georgia" w:eastAsia="Georgia" w:cs="Georgia"/>
-          <w:sz w:val="24"/>
+          <w:b w:val="0"/>
+          <w:sz w:val="22"/>
+          <w:szCs w:val="22"/>
         </w:rPr>
         <w:t>Table 1 presents the repository populations and the final sample distribution. The target pool for 2023-2025 totals 381 theses. The equal allocation strategy ensures that each discipline provides a robust sample size for cross-disciplinary comparison, preventing the smaller Animal Science population from being underrepresented in the analysis. Pre-2023 theses (n=447) serve as the source pool for pilot abstracts to keep them distinct from the main study period.</w:t>
       </w:r>
@@ -3741,8 +3839,9 @@
         <w:rPr>
           <w:rFonts w:ascii="Georgia" w:hAnsi="Georgia" w:cs="Georgia" w:eastAsia="Georgia"/>
           <w:sz w:val="22"/>
-          <w:b w:val="1"/>
+          <w:b/>
           <w:bCs w:val="1"/>
+          <w:szCs w:val="22"/>
         </w:rPr>
         <w:t xml:space="preserve">Inclusion Criteria. </w:t>
       </w:r>
@@ -3752,6 +3851,7 @@
           <w:sz w:val="22"/>
           <w:b w:val="0"/>
           <w:bCs w:val="0"/>
+          <w:szCs w:val="22"/>
         </w:rPr>
         <w:t>English-language undergraduate thesis abstracts. Complete abstracts available in the PSAU library archives. Clear disciplinary classification based on official degree program. Hard-bound submission year (as recorded in the PSAU library catalog) between 2023 and 2025.</w:t>
       </w:r>
@@ -3768,8 +3868,9 @@
         <w:rPr>
           <w:rFonts w:ascii="Georgia" w:hAnsi="Georgia" w:cs="Georgia" w:eastAsia="Georgia"/>
           <w:sz w:val="22"/>
-          <w:b w:val="1"/>
+          <w:b/>
           <w:bCs w:val="1"/>
+          <w:szCs w:val="22"/>
         </w:rPr>
         <w:t xml:space="preserve">Exclusion Criteria. </w:t>
       </w:r>
@@ -3779,6 +3880,7 @@
           <w:sz w:val="22"/>
           <w:b w:val="0"/>
           <w:bCs w:val="0"/>
+          <w:szCs w:val="22"/>
         </w:rPr>
         <w:t>Non-English abstracts or abstracts with significant Filipino code-switching. Graduate-level theses. Theses submitted under interdisciplinary degree programs (e.g., Environmental Science) where a single disciplinary affiliation cannot be determined. Theses whose hard-bound submission year (library catalog) is before 2023.</w:t>
       </w:r>
@@ -3801,7 +3903,9 @@
       <w:r>
         <w:rPr>
           <w:rFonts w:ascii="Georgia" w:hAnsi="Georgia" w:eastAsia="Georgia" w:cs="Georgia"/>
-          <w:sz w:val="24"/>
+          <w:b w:val="0"/>
+          <w:sz w:val="22"/>
+          <w:szCs w:val="22"/>
         </w:rPr>
         <w:t>Ethical Considerations. Abstracts were accessed on-site at the PSAU Library with proper authorization. Student names were fully anonymized using discipline codes (Acs1-Acs10, Aas1-Aas10, VM1-VM20, B1-B20) before analysis began. Thesis titles that appear as quoted wording inside an abstract (source text) were redacted in the coded appendix where they identified the work. Residual title fragments, if any, do not include student names. The study analyzed linguistic patterns in text, not student performance or personal information. All data files were stored on password-protected devices and encrypted cloud storage accessible only to the researcher and thesis adviser. These files are retained for five years to support verification of coding decisions by future researchers and to allow for follow-up comparative studies, after which they are permanently deleted in line with standard academic data retention practice.</w:t>
       </w:r>
@@ -3815,10 +3919,10 @@
       <w:r>
         <w:rPr>
           <w:rFonts w:ascii="Georgia" w:cs="Georgia" w:eastAsia="Georgia" w:hAnsi="Georgia"/>
-          <w:b w:val="1"/>
+          <w:b/>
           <w:bCs w:val="1"/>
-          <w:sz w:val="28"/>
-          <w:szCs w:val="28"/>
+          <w:sz w:val="22"/>
+          <w:szCs w:val="22"/>
           <w:rtl w:val="0"/>
         </w:rPr>
         <w:t xml:space="preserve">RESULTS, ANALYSIS, AND DISCUSSION</w:t>
@@ -3867,10 +3971,10 @@
       <w:r>
         <w:rPr>
           <w:rFonts w:ascii="Georgia" w:cs="Georgia" w:eastAsia="Georgia" w:hAnsi="Georgia"/>
-          <w:b w:val="1"/>
+          <w:b/>
           <w:bCs w:val="1"/>
-          <w:sz w:val="24"/>
-          <w:szCs w:val="24"/>
+          <w:sz w:val="22"/>
+          <w:szCs w:val="22"/>
           <w:rtl w:val="0"/>
         </w:rPr>
         <w:t xml:space="preserve">PART I: HEDGE TYPES ACROSS THE THREE DISCIPLINES</w:t>
@@ -3893,6 +3997,7 @@
       <w:r>
         <w:rPr>
           <w:rFonts w:ascii="Georgia" w:hAnsi="Georgia" w:cs="Georgia" w:eastAsia="Georgia"/>
+          <w:b w:val="0"/>
           <w:sz w:val="22"/>
           <w:szCs w:val="22"/>
         </w:rPr>
@@ -3924,6 +4029,7 @@
       <w:r>
         <w:rPr>
           <w:rFonts w:ascii="Georgia" w:hAnsi="Georgia" w:cs="Georgia" w:eastAsia="Georgia"/>
+          <w:b w:val="0"/>
           <w:sz w:val="22"/>
           <w:szCs w:val="22"/>
         </w:rPr>
@@ -4620,6 +4726,7 @@
       <w:r>
         <w:rPr>
           <w:rFonts w:ascii="Georgia" w:hAnsi="Georgia" w:cs="Georgia" w:eastAsia="Georgia"/>
+          <w:b w:val="0"/>
           <w:sz w:val="22"/>
           <w:szCs w:val="22"/>
         </w:rPr>
@@ -6486,6 +6593,7 @@
       <w:r>
         <w:rPr>
           <w:rFonts w:ascii="Georgia" w:hAnsi="Georgia" w:cs="Georgia" w:eastAsia="Georgia"/>
+          <w:b w:val="0"/>
           <w:sz w:val="22"/>
           <w:szCs w:val="22"/>
         </w:rPr>
@@ -7515,7 +7623,9 @@
       <w:r>
         <w:rPr>
           <w:rFonts w:ascii="Georgia" w:hAnsi="Georgia" w:eastAsia="Georgia" w:cs="Georgia"/>
-          <w:sz w:val="24"/>
+          <w:b w:val="0"/>
+          <w:sz w:val="22"/>
+          <w:szCs w:val="22"/>
         </w:rPr>
         <w:t>Table 4 shows that Agriculture has a nearly balanced type mix (14 modal verbs, 51.9% vs. 13 lexical hedges, 48.1%), while Biology is heavily lexical (20 of 28 hedges, 71.4%, with only 5 modal verbs). Veterinary Medicine, with only 10 total hedges, is also predominantly lexical (8 of 10, 80.0%). Agriculture is the only discipline in which modal verbs approach half of the hedge tokens. Biology and Veterinary Medicine lean lexical. That contrast is real in the counts, but the Ag-Bio difference in overall density is marginal and outlier-sensitive (Part II), so type-mix differences should not be read as a stable Agriculture-versus-Biology profile. The near-absence of adverbial hedges across all three disciplines (only 3 instances, all in Biology) points instead to a shared, narrow repertoire.</w:t>
       </w:r>
@@ -7629,10 +7739,10 @@
       <w:r>
         <w:rPr>
           <w:rFonts w:ascii="Georgia" w:cs="Georgia" w:eastAsia="Georgia" w:hAnsi="Georgia"/>
-          <w:b w:val="1"/>
+          <w:b/>
           <w:bCs w:val="1"/>
-          <w:sz w:val="24"/>
-          <w:szCs w:val="24"/>
+          <w:sz w:val="22"/>
+          <w:szCs w:val="22"/>
           <w:rtl w:val="0"/>
         </w:rPr>
         <w:t xml:space="preserve">PART II: HEDGE FREQUENCY ACROSS DISCIPLINES</w:t>
@@ -7696,6 +7806,7 @@
       <w:r>
         <w:rPr>
           <w:rFonts w:ascii="Georgia" w:hAnsi="Georgia" w:cs="Georgia" w:eastAsia="Georgia"/>
+          <w:b w:val="0"/>
           <w:sz w:val="22"/>
           <w:szCs w:val="22"/>
         </w:rPr>
@@ -9188,7 +9299,9 @@
       <w:r>
         <w:rPr>
           <w:rFonts w:ascii="Georgia" w:hAnsi="Georgia" w:eastAsia="Georgia" w:cs="Georgia"/>
-          <w:sz w:val="24"/>
+          <w:b w:val="0"/>
+          <w:sz w:val="22"/>
+          <w:szCs w:val="22"/>
         </w:rPr>
         <w:t>Per-abstract hedge distributions reveal substantial skew. Agriculture abstracts averaged 1.35 hedges (median = 1, SD = 1.84, range = 0-8), Biology averaged 1.40 (median = 1, SD = 1.31, range = 0-5), and Veterinary Medicine averaged 0.50 (median = 0, SD = 0.76, range = 0-3). The high standard deviation in Agriculture reflects the influence of Acs2, which contained 8 hedges alone. When Acs2 is excluded as a sensitivity check, Agriculture's density drops to 0.46 per 100 words, below Biology's 0.62, suggesting that the Agriculture &gt; Biology ranking is partly driven by a single outlier abstract. An exploratory Kruskal-Wallis test on per-abstract hedge rates (per 100 words) yielded H = 7.44, p =.024. Post hoc Mann-Whitney tests on the same rates give Veterinary Medicine versus Biology p =.011, Veterinary Medicine versus Agriculture p =.034, and Agriculture versus Biology p =.72. With a Bonferroni correction for three pairwise tests (α =.017), only the Biology-Veterinary Medicine contrast remains significant. Agriculture and Biology are statistically indistinguishable on this measure. After correction, the only supported pairwise difference is between Biology and Veterinary Medicine. Veterinary Medicine does not differ from Agriculture at the corrected threshold. Abstracts within a program may share advisers, so observations are not fully independent, and within-discipline spread remains larger than the gaps between means. With a small, zero-inflated sample, the Kruskal-Wallis result and the pairwise follow-ups are treated as exploratory. A sensitivity check that removes all 19 instances of "potential" leaves 46 hedges. The Kruskal-Wallis contrast remains in the same direction, and Veterinary Medicine’s zero-hedge share rises further. The same directional pattern holds without those tokens.</w:t>
       </w:r>
@@ -9281,10 +9394,10 @@
       <w:r>
         <w:rPr>
           <w:rFonts w:ascii="Georgia" w:cs="Georgia" w:eastAsia="Georgia" w:hAnsi="Georgia"/>
-          <w:b w:val="1"/>
+          <w:b/>
           <w:bCs w:val="1"/>
-          <w:sz w:val="24"/>
-          <w:szCs w:val="24"/>
+          <w:sz w:val="22"/>
+          <w:szCs w:val="22"/>
           <w:rtl w:val="0"/>
         </w:rPr>
         <w:t xml:space="preserve">PART III: RHETORICAL FUNCTIONS OF HEDGING DEVICES</w:t>
@@ -9307,7 +9420,9 @@
       <w:r>
         <w:rPr>
           <w:rFonts w:ascii="Georgia" w:hAnsi="Georgia" w:eastAsia="Georgia" w:cs="Georgia"/>
-          <w:sz w:val="24"/>
+          <w:b w:val="0"/>
+          <w:sz w:val="22"/>
+          <w:szCs w:val="22"/>
         </w:rPr>
         <w:t>Table 6 summarizes Step 2 outcomes for the coding pool. Of the retained hedges, all 65 were coded Epistemic Caution (EC). Politeness/Deference is null (P = 0). False positives totaled 58 (FP-Gen 33, FP-Rec 15, FP-Cap 8, FP-Proc 2). FP is , the 58 failed the claim condition or both removal checks (reason codes: FP-Gen, FP-Rec, FP-Cap, FP-Proc). The direct comparison is therefore EC = 65, P = 0, FP = 58.</w:t>
       </w:r>
@@ -9337,6 +9452,7 @@
       <w:r>
         <w:rPr>
           <w:rFonts w:ascii="Georgia" w:hAnsi="Georgia" w:cs="Georgia" w:eastAsia="Georgia"/>
+          <w:b w:val="0"/>
           <w:sz w:val="22"/>
           <w:szCs w:val="22"/>
         </w:rPr>
@@ -9872,6 +9988,7 @@
       <w:r>
         <w:rPr>
           <w:rFonts w:ascii="Georgia" w:hAnsi="Georgia" w:cs="Georgia" w:eastAsia="Georgia"/>
+          <w:b w:val="0"/>
           <w:sz w:val="22"/>
           <w:szCs w:val="22"/>
         </w:rPr>
@@ -9888,10 +10005,10 @@
       <w:r>
         <w:rPr>
           <w:rFonts w:ascii="Georgia" w:cs="Georgia" w:eastAsia="Georgia" w:hAnsi="Georgia"/>
-          <w:b w:val="1"/>
+          <w:b/>
           <w:bCs w:val="1"/>
-          <w:sz w:val="24"/>
-          <w:szCs w:val="24"/>
+          <w:sz w:val="22"/>
+          <w:szCs w:val="22"/>
           <w:rtl w:val="0"/>
         </w:rPr>
         <w:t>PART IV: CROSS-DISCIPLINARY CONTRASTS</w:t>
@@ -9931,7 +10048,7 @@
       <w:r>
         <w:rPr>
           <w:rFonts w:ascii="Georgia" w:hAnsi="Georgia" w:cs="Georgia" w:eastAsia="Georgia"/>
-          <w:b w:val="1"/>
+          <w:b/>
           <w:bCs w:val="1"/>
           <w:sz w:val="22"/>
           <w:szCs w:val="22"/>
@@ -9949,8 +10066,8 @@
         <w:rPr>
           <w:rFonts w:ascii="Georgia" w:hAnsi="Georgia" w:cs="Georgia" w:eastAsia="Georgia"/>
           <w:b w:val="0"/>
-          <w:sz w:val="24"/>
-          <w:szCs w:val="24"/>
+          <w:sz w:val="22"/>
+          <w:szCs w:val="22"/>
         </w:rPr>
         <w:t xml:space="preserve">Outcome Type by Discipline</w:t>
       </w:r>
@@ -10821,10 +10938,10 @@
       <w:r>
         <w:rPr>
           <w:rFonts w:ascii="Georgia" w:cs="Georgia" w:eastAsia="Georgia" w:hAnsi="Georgia"/>
-          <w:b w:val="1"/>
+          <w:b/>
           <w:bCs w:val="1"/>
-          <w:sz w:val="28"/>
-          <w:szCs w:val="28"/>
+          <w:sz w:val="22"/>
+          <w:szCs w:val="22"/>
           <w:rtl w:val="0"/>
         </w:rPr>
         <w:t xml:space="preserve">CONCLUSIONS AND RECOMMENDATIONS</w:t>
@@ -10873,10 +10990,10 @@
       <w:r>
         <w:rPr>
           <w:rFonts w:ascii="Georgia" w:cs="Georgia" w:eastAsia="Georgia" w:hAnsi="Georgia"/>
-          <w:b w:val="1"/>
+          <w:b/>
           <w:bCs w:val="1"/>
-          <w:sz w:val="24"/>
-          <w:szCs w:val="24"/>
+          <w:sz w:val="22"/>
+          <w:szCs w:val="22"/>
           <w:rtl w:val="0"/>
         </w:rPr>
         <w:t xml:space="preserve">CONCLUSIONS</w:t>
@@ -10967,10 +11084,10 @@
       <w:r>
         <w:rPr>
           <w:rFonts w:ascii="Georgia" w:cs="Georgia" w:eastAsia="Georgia" w:hAnsi="Georgia"/>
-          <w:b w:val="1"/>
+          <w:b/>
           <w:bCs w:val="1"/>
-          <w:sz w:val="24"/>
-          <w:szCs w:val="24"/>
+          <w:sz w:val="22"/>
+          <w:szCs w:val="22"/>
           <w:rtl w:val="0"/>
         </w:rPr>
         <w:t xml:space="preserve">RECOMMENDATIONS</w:t>
@@ -11105,10 +11222,10 @@
       <w:r>
         <w:rPr>
           <w:rFonts w:ascii="Georgia" w:cs="Georgia" w:eastAsia="Georgia" w:hAnsi="Georgia"/>
-          <w:b w:val="1"/>
+          <w:b/>
           <w:bCs w:val="1"/>
-          <w:sz w:val="28"/>
-          <w:szCs w:val="28"/>
+          <w:sz w:val="22"/>
+          <w:szCs w:val="22"/>
           <w:rtl w:val="0"/>
         </w:rPr>
         <w:t xml:space="preserve">REFERENCES</w:t>
@@ -11131,7 +11248,9 @@
       <w:r>
         <w:rPr>
           <w:rFonts w:ascii="Georgia" w:hAnsi="Georgia" w:eastAsia="Georgia" w:cs="Georgia"/>
-          <w:sz w:val="24"/>
+          <w:b w:val="0"/>
+          <w:sz w:val="22"/>
+          <w:szCs w:val="22"/>
         </w:rPr>
         <w:t>Afshar, H. S., Moradi, M., &amp; Hamzavi, R. (2014). Frequency and type of hedging devices used in the research articles of humanities, basic sciences and agriculture. Procedia - Social and Behavioral Sciences, 136, 70-74. https://doi.org/10.1016/j.sbspro.2014.05.290</w:t>
       </w:r>
@@ -11146,6 +11265,7 @@
       <w:r>
         <w:rPr>
           <w:rFonts w:ascii="Georgia" w:hAnsi="Georgia" w:eastAsia="Georgia" w:cs="Georgia"/>
+          <w:b w:val="0"/>
           <w:i w:val="0"/>
           <w:sz w:val="22"/>
           <w:szCs w:val="22"/>
@@ -11155,6 +11275,7 @@
       <w:r>
         <w:rPr>
           <w:rFonts w:ascii="Georgia" w:hAnsi="Georgia" w:eastAsia="Georgia" w:cs="Georgia"/>
+          <w:b w:val="0"/>
           <w:i/>
           <w:sz w:val="22"/>
           <w:szCs w:val="22"/>
@@ -11164,6 +11285,7 @@
       <w:r>
         <w:rPr>
           <w:rFonts w:ascii="Georgia" w:hAnsi="Georgia" w:eastAsia="Georgia" w:cs="Georgia"/>
+          <w:b w:val="0"/>
           <w:i w:val="0"/>
           <w:sz w:val="22"/>
           <w:szCs w:val="22"/>
@@ -11181,7 +11303,9 @@
       <w:r>
         <w:rPr>
           <w:rFonts w:ascii="Georgia" w:hAnsi="Georgia" w:eastAsia="Georgia" w:cs="Georgia"/>
-          <w:sz w:val="24"/>
+          <w:b w:val="0"/>
+          <w:sz w:val="22"/>
+          <w:szCs w:val="22"/>
         </w:rPr>
         <w:t>Crompton, P. (1997). Hedging in academic writing: Some theoretical problems. English for Specific Purposes, 16(4), 271-287. https://doi.org/10.1016/S0889-4906(97)00007-0</w:t>
       </w:r>
@@ -11196,7 +11320,9 @@
       <w:r>
         <w:rPr>
           <w:rFonts w:ascii="Georgia" w:hAnsi="Georgia" w:eastAsia="Georgia" w:cs="Georgia"/>
-          <w:sz w:val="24"/>
+          <w:b w:val="0"/>
+          <w:sz w:val="22"/>
+          <w:szCs w:val="22"/>
         </w:rPr>
         <w:t>Demir, C. (2018). Hedging and academic writing: An analysis of lexical hedges. Journal of Language and Linguistic Studies, 14(4), 74-92. https://files.eric.ed.gov/fulltext/EJ1201945.pdf</w:t>
       </w:r>
@@ -11211,7 +11337,9 @@
       <w:r>
         <w:rPr>
           <w:rFonts w:ascii="Georgia" w:hAnsi="Georgia" w:eastAsia="Georgia" w:cs="Georgia"/>
-          <w:sz w:val="24"/>
+          <w:b w:val="0"/>
+          <w:sz w:val="22"/>
+          <w:szCs w:val="22"/>
         </w:rPr>
         <w:t>Escalona, S. L. (2025). Hedges and boosters in college essays: A study of linguistic modulation in student writing. International Journal of English Literature and Social Sciences, 10(1), 7-17. https://doi.org/10.22161/ijels.101.2</w:t>
       </w:r>
@@ -11226,7 +11354,9 @@
       <w:r>
         <w:rPr>
           <w:rFonts w:ascii="Georgia" w:hAnsi="Georgia" w:eastAsia="Georgia" w:cs="Georgia"/>
-          <w:sz w:val="24"/>
+          <w:b w:val="0"/>
+          <w:sz w:val="22"/>
+          <w:szCs w:val="22"/>
         </w:rPr>
         <w:t>Ghia, E., Petrocelli, E., &amp; Pizziconi, S. (2022). Data possibly suggest… Hedging in second language writing: A study on advanced Italian EFL learners. Belgrade English Language and Literature Studies, 14, 47-72. https://doi.org/10.18485/bells.2022.14.2</w:t>
       </w:r>
@@ -11241,6 +11371,7 @@
       <w:r>
         <w:rPr>
           <w:rFonts w:ascii="Georgia" w:hAnsi="Georgia" w:eastAsia="Georgia" w:cs="Georgia"/>
+          <w:b w:val="0"/>
           <w:i w:val="0"/>
           <w:sz w:val="22"/>
           <w:szCs w:val="22"/>
@@ -11250,6 +11381,7 @@
       <w:r>
         <w:rPr>
           <w:rFonts w:ascii="Georgia" w:hAnsi="Georgia" w:eastAsia="Georgia" w:cs="Georgia"/>
+          <w:b w:val="0"/>
           <w:i/>
           <w:sz w:val="22"/>
           <w:szCs w:val="22"/>
@@ -11259,6 +11391,7 @@
       <w:r>
         <w:rPr>
           <w:rFonts w:ascii="Georgia" w:hAnsi="Georgia" w:eastAsia="Georgia" w:cs="Georgia"/>
+          <w:b w:val="0"/>
           <w:i w:val="0"/>
           <w:sz w:val="22"/>
           <w:szCs w:val="22"/>
@@ -11276,7 +11409,9 @@
       <w:r>
         <w:rPr>
           <w:rFonts w:ascii="Georgia" w:hAnsi="Georgia" w:eastAsia="Georgia" w:cs="Georgia"/>
-          <w:sz w:val="24"/>
+          <w:b w:val="0"/>
+          <w:sz w:val="22"/>
+          <w:szCs w:val="22"/>
         </w:rPr>
         <w:t>Hu, G., &amp; Cao, F. (2011). Hedging and boosting in abstracts of applied linguistics articles: A comparative study of English- and Chinese-medium journals. Journal of Pragmatics, 43(11), 2795-2809. https://doi.org/10.1016/j.pragma.2011.04.007</w:t>
       </w:r>
@@ -11291,7 +11426,9 @@
       <w:r>
         <w:rPr>
           <w:rFonts w:ascii="Georgia" w:hAnsi="Georgia" w:eastAsia="Georgia" w:cs="Georgia"/>
-          <w:sz w:val="24"/>
+          <w:b w:val="0"/>
+          <w:sz w:val="22"/>
+          <w:szCs w:val="22"/>
         </w:rPr>
         <w:t>Hyland, K. (1996). Writing without conviction? Hedging in science research articles. Applied Linguistics, 17(4), 433-454. https://doi.org/10.1093/applin/17.4.433</w:t>
       </w:r>
@@ -11306,6 +11443,7 @@
       <w:r>
         <w:rPr>
           <w:rFonts w:ascii="Georgia" w:hAnsi="Georgia" w:eastAsia="Georgia" w:cs="Georgia"/>
+          <w:b w:val="0"/>
           <w:i w:val="0"/>
           <w:sz w:val="22"/>
           <w:szCs w:val="22"/>
@@ -11315,6 +11453,7 @@
       <w:r>
         <w:rPr>
           <w:rFonts w:ascii="Georgia" w:hAnsi="Georgia" w:eastAsia="Georgia" w:cs="Georgia"/>
+          <w:b w:val="0"/>
           <w:i/>
           <w:sz w:val="22"/>
           <w:szCs w:val="22"/>
@@ -11324,6 +11463,7 @@
       <w:r>
         <w:rPr>
           <w:rFonts w:ascii="Georgia" w:hAnsi="Georgia" w:eastAsia="Georgia" w:cs="Georgia"/>
+          <w:b w:val="0"/>
           <w:i w:val="0"/>
           <w:sz w:val="22"/>
           <w:szCs w:val="22"/>
@@ -11341,7 +11481,9 @@
       <w:r>
         <w:rPr>
           <w:rFonts w:ascii="Georgia" w:hAnsi="Georgia" w:eastAsia="Georgia" w:cs="Georgia"/>
-          <w:sz w:val="24"/>
+          <w:b w:val="0"/>
+          <w:sz w:val="22"/>
+          <w:szCs w:val="22"/>
         </w:rPr>
         <w:t>Hyland, K. (2005). Stance and engagement: A model of interaction in academic discourse. Discourse Studies, 7(2), 173-192. https://doi.org/10.1177/1461445605050365</w:t>
       </w:r>
@@ -11356,7 +11498,9 @@
       <w:r>
         <w:rPr>
           <w:rFonts w:ascii="Georgia" w:hAnsi="Georgia" w:eastAsia="Georgia" w:cs="Georgia"/>
-          <w:sz w:val="24"/>
+          <w:b w:val="0"/>
+          <w:sz w:val="22"/>
+          <w:szCs w:val="22"/>
         </w:rPr>
         <w:t>Hyland, K., &amp; Milton, J. (1997). Qualification and certainty in L1 and L2 students’ writing. Journal of Second Language Writing, 6(2), 183-205. https://doi.org/10.1016/S1060-3743(97)90033-3</w:t>
       </w:r>
@@ -11371,7 +11515,9 @@
       <w:r>
         <w:rPr>
           <w:rFonts w:ascii="Georgia" w:hAnsi="Georgia" w:eastAsia="Georgia" w:cs="Georgia"/>
-          <w:sz w:val="24"/>
+          <w:b w:val="0"/>
+          <w:sz w:val="22"/>
+          <w:szCs w:val="22"/>
         </w:rPr>
         <w:t>Imataki, N., &amp; Kobayashi, Y. (2024). Analyzing disciplinary variation in abstracts: Linguistic features across scientific and technical fields. Linguistics and Literature Studies, 12(3), 19-28. https://doi.org/10.13189/lls.2024.120301</w:t>
       </w:r>
@@ -11386,7 +11532,9 @@
       <w:r>
         <w:rPr>
           <w:rFonts w:ascii="Georgia" w:hAnsi="Georgia" w:eastAsia="Georgia" w:cs="Georgia"/>
-          <w:sz w:val="24"/>
+          <w:b w:val="0"/>
+          <w:sz w:val="22"/>
+          <w:szCs w:val="22"/>
         </w:rPr>
         <w:t>Khunasathitchai, K., Sittironnarit, S., Sinturat, T., &amp; Kumdee, S. (2025). Move analysis and hedge use in the research paper abstracts of Thai EFL English-majored undergraduates. rEFLections, 32(2), 951-973. https://doi.org/10.61508/refl.v32i2.282512</w:t>
       </w:r>
@@ -11401,7 +11549,9 @@
       <w:r>
         <w:rPr>
           <w:rFonts w:ascii="Georgia" w:hAnsi="Georgia" w:eastAsia="Georgia" w:cs="Georgia"/>
-          <w:sz w:val="24"/>
+          <w:b w:val="0"/>
+          <w:sz w:val="22"/>
+          <w:szCs w:val="22"/>
         </w:rPr>
         <w:t>Landis, J. R., &amp; Koch, G. G. (1977). The measurement of observer agreement for categorical data. Biometrics, 33(1), 159-174. https://doi.org/10.2307/2529310</w:t>
       </w:r>
@@ -11416,7 +11566,9 @@
       <w:r>
         <w:rPr>
           <w:rFonts w:ascii="Georgia" w:hAnsi="Georgia" w:eastAsia="Georgia" w:cs="Georgia"/>
-          <w:sz w:val="24"/>
+          <w:b w:val="0"/>
+          <w:sz w:val="22"/>
+          <w:szCs w:val="22"/>
         </w:rPr>
         <w:t>Lopez, R. M. C., Pedida, J. A., Alzate, L. J. A., &amp; Eustaquio, M. T. L. (2025). Language of caution and certainty: Writing proficiency in hedges and boosters in student essays. International Journal of Research and Innovation in Social Science, 9(11), 6176-6196. https://doi.org/10.47772/IJRISS.2025.91100485</w:t>
       </w:r>
@@ -11431,7 +11583,9 @@
       <w:r>
         <w:rPr>
           <w:rFonts w:ascii="Georgia" w:hAnsi="Georgia" w:eastAsia="Georgia" w:cs="Georgia"/>
-          <w:sz w:val="24"/>
+          <w:b w:val="0"/>
+          <w:sz w:val="22"/>
+          <w:szCs w:val="22"/>
         </w:rPr>
         <w:t>Mazidah, E. N., Cahyani, W. I., &amp; Masruroh, L. (2022). Hedges and boosters in undergraduate thesis abstracts of Qomaruddin University students. Journal of Education, Humaniora and Social Sciences (JEHSS), 4(3), 1657-1663. https://doi.org/10.34007/jehss.v4i3.925</w:t>
       </w:r>
@@ -11446,6 +11600,7 @@
       <w:r>
         <w:rPr>
           <w:rFonts w:ascii="Georgia" w:hAnsi="Georgia" w:eastAsia="Georgia" w:cs="Georgia"/>
+          <w:b w:val="0"/>
           <w:i w:val="0"/>
           <w:sz w:val="22"/>
           <w:szCs w:val="22"/>
@@ -11455,6 +11610,7 @@
       <w:r>
         <w:rPr>
           <w:rFonts w:ascii="Georgia" w:hAnsi="Georgia" w:eastAsia="Georgia" w:cs="Georgia"/>
+          <w:b w:val="0"/>
           <w:i/>
           <w:sz w:val="22"/>
           <w:szCs w:val="22"/>
@@ -11464,6 +11620,7 @@
       <w:r>
         <w:rPr>
           <w:rFonts w:ascii="Georgia" w:hAnsi="Georgia" w:eastAsia="Georgia" w:cs="Georgia"/>
+          <w:b w:val="0"/>
           <w:i w:val="0"/>
           <w:sz w:val="22"/>
           <w:szCs w:val="22"/>
@@ -11481,7 +11638,9 @@
       <w:r>
         <w:rPr>
           <w:rFonts w:ascii="Georgia" w:hAnsi="Georgia" w:eastAsia="Georgia" w:cs="Georgia"/>
-          <w:sz w:val="24"/>
+          <w:b w:val="0"/>
+          <w:sz w:val="22"/>
+          <w:szCs w:val="22"/>
         </w:rPr>
         <w:t>Ningrum, S., Puspita, H., &amp; Mulyadi, A. I. (2024). Hedges and boosters in academic writing of ASEAN EFL learners. Journal of English Education and Teaching, 8(1), 202-218. https://doi.org/10.33369/jeet.8.1.202-218</w:t>
       </w:r>
@@ -11496,7 +11655,9 @@
       <w:r>
         <w:rPr>
           <w:rFonts w:ascii="Georgia" w:hAnsi="Georgia" w:eastAsia="Georgia" w:cs="Georgia"/>
-          <w:sz w:val="24"/>
+          <w:b w:val="0"/>
+          <w:sz w:val="22"/>
+          <w:szCs w:val="22"/>
         </w:rPr>
         <w:t>Petchkij, W. (2019). Explicit teaching of hedges: Bringing hedging in academic writing into the Thai EFL classroom. Electronic Journal of Foreign Language Teaching, 16(1), 95-113. https://e-flt.nus.edu.sg/wp-content/uploads/2020/09/petchkij.pdf</w:t>
       </w:r>
@@ -11511,7 +11672,9 @@
       <w:r>
         <w:rPr>
           <w:rFonts w:ascii="Georgia" w:hAnsi="Georgia" w:eastAsia="Georgia" w:cs="Georgia"/>
-          <w:sz w:val="24"/>
+          <w:b w:val="0"/>
+          <w:sz w:val="22"/>
+          <w:szCs w:val="22"/>
         </w:rPr>
         <w:t>Salager-Meyer, F. (1994). Hedges and textual communicative function in medical English written discourse. English for Specific Purposes, 13(2), 149-170. https://doi.org/10.1016/0889-4906(94)90013-2</w:t>
       </w:r>
@@ -11526,7 +11689,9 @@
       <w:r>
         <w:rPr>
           <w:rFonts w:ascii="Georgia" w:hAnsi="Georgia" w:eastAsia="Georgia" w:cs="Georgia"/>
-          <w:sz w:val="24"/>
+          <w:b w:val="0"/>
+          <w:sz w:val="22"/>
+          <w:szCs w:val="22"/>
         </w:rPr>
         <w:t>Souici, F., &amp; Slougui, D. (2022). Hedges in biology research articles: What types and frequency do Algerian authors use? Journal of Human Sciences, 33(4), 49-59. https://revue.umc.edu.dz/h/article/view/4015</w:t>
       </w:r>
@@ -11541,7 +11706,9 @@
       <w:r>
         <w:rPr>
           <w:rFonts w:ascii="Georgia" w:hAnsi="Georgia" w:eastAsia="Georgia" w:cs="Georgia"/>
-          <w:sz w:val="24"/>
+          <w:b w:val="0"/>
+          <w:sz w:val="22"/>
+          <w:szCs w:val="22"/>
         </w:rPr>
         <w:t>Suratno, A., &amp; Aydawati, E. N. (2025). Hedging strategies in non-science theses: A corpus-based analysis of discussion sections. ETERNAL (English Teaching Journal), 16(1), 37-52. https://journal2.upgris.ac.id/index.php/eternal/article/view/1059</w:t>
       </w:r>
@@ -11556,7 +11723,9 @@
       <w:r>
         <w:rPr>
           <w:rFonts w:ascii="Georgia" w:hAnsi="Georgia" w:eastAsia="Georgia" w:cs="Georgia"/>
-          <w:sz w:val="24"/>
+          <w:b w:val="0"/>
+          <w:sz w:val="22"/>
+          <w:szCs w:val="22"/>
         </w:rPr>
         <w:t>Villanueva, V. S. (2014). Hedging devices in Philippine newspaper editorials. Asian Journal of English Language Studies, 2, 103-117. https://doi.org/10.59960/2.a5</w:t>
       </w:r>
@@ -11573,6 +11742,7 @@
       <w:r>
         <w:rPr>
           <w:rFonts w:ascii="Georgia" w:hAnsi="Georgia" w:eastAsia="Georgia" w:cs="Georgia"/>
+          <w:b w:val="0"/>
           <w:i w:val="0"/>
           <w:sz w:val="22"/>
           <w:szCs w:val="22"/>
@@ -11582,6 +11752,7 @@
       <w:r>
         <w:rPr>
           <w:rFonts w:ascii="Georgia" w:hAnsi="Georgia" w:eastAsia="Georgia" w:cs="Georgia"/>
+          <w:b w:val="0"/>
           <w:i/>
           <w:sz w:val="22"/>
           <w:szCs w:val="22"/>
@@ -11591,6 +11762,7 @@
       <w:r>
         <w:rPr>
           <w:rFonts w:ascii="Georgia" w:hAnsi="Georgia" w:eastAsia="Georgia" w:cs="Georgia"/>
+          <w:b w:val="0"/>
           <w:i w:val="0"/>
           <w:sz w:val="22"/>
           <w:szCs w:val="22"/>
@@ -11618,7 +11790,9 @@
       <w:r>
         <w:rPr>
           <w:rFonts w:ascii="Georgia" w:hAnsi="Georgia" w:eastAsia="Georgia" w:cs="Georgia"/>
-          <w:sz w:val="24"/>
+          <w:b w:val="0"/>
+          <w:sz w:val="22"/>
+          <w:szCs w:val="22"/>
         </w:rPr>
         <w:t>Xie, S., &amp; Mi, C. (2023). Promotion and caution in research article abstracts: The use of positive, negative and hedge words across disciplines and rankings. Learned Publishing, 36(2), 249-265. https://doi.org/10.1002/leap.1515</w:t>
       </w:r>
@@ -11626,17 +11800,17 @@
     <w:p>
       <w:pPr>
         <w:keepNext w:val="1"/>
-        <w:spacing w:before="0" w:after="120" w:line="240" w:lineRule="auto"/>
+        <w:spacing w:before="0" w:after="40" w:line="240" w:lineRule="auto"/>
         <w:jc w:val="center"/>
         <w:rPr/>
       </w:pPr>
       <w:r>
         <w:rPr>
           <w:rFonts w:ascii="Georgia" w:cs="Georgia" w:eastAsia="Georgia" w:hAnsi="Georgia"/>
-          <w:b w:val="1"/>
+          <w:b/>
           <w:bCs w:val="1"/>
-          <w:sz w:val="28"/>
-          <w:szCs w:val="28"/>
+          <w:sz w:val="22"/>
+          <w:szCs w:val="22"/>
           <w:rtl w:val="0"/>
         </w:rPr>
         <w:t xml:space="preserve">APPENDICES</w:t>
@@ -11651,7 +11825,7 @@
     </w:p>
     <w:p>
       <w:pPr>
-        <w:spacing w:before="0" w:after="60" w:line="280" w:lineRule="auto"/>
+        <w:spacing w:before="0" w:after="40" w:line="240" w:lineRule="auto"/>
         <w:jc w:val="left"/>
       </w:pPr>
       <w:r>
@@ -11677,22 +11851,32 @@
     </w:p>
     <w:p>
       <w:pPr>
-        <w:spacing w:before="0" w:after="40" w:line="280" w:lineRule="auto"/>
-        <w:ind w:left="360"/>
-        <w:jc w:val="both"/>
-      </w:pPr>
-      <w:r>
-        <w:rPr>
-          <w:rFonts w:ascii="Georgia" w:hAnsi="Georgia" w:cs="Georgia" w:eastAsia="Georgia"/>
-          <w:sz w:val="20"/>
-          <w:szCs w:val="20"/>
-        </w:rPr>
-        <w:t xml:space="preserve">• Lookup: Quick-Reference + Legend (p. 1). Full Codebook from p. 2. Coding sheet columns at end.</w:t>
-      </w:r>
-    </w:p>
-    <w:p>
-      <w:pPr>
-        <w:spacing w:before="240" w:after="40" w:line="280" w:lineRule="auto"/>
+        <w:spacing w:before="0" w:after="20" w:line="240" w:lineRule="auto"/>
+        <w:ind w:left="360" w:firstLine="0"/>
+        <w:jc w:val="both"/>
+      </w:pPr>
+      <w:r>
+        <w:rPr>
+          <w:rFonts w:ascii="Georgia" w:hAnsi="Georgia" w:eastAsia="Georgia" w:cs="Georgia"/>
+          <w:b/>
+          <w:sz w:val="22"/>
+          <w:szCs w:val="22"/>
+        </w:rPr>
+        <w:t xml:space="preserve">• Lookup: </w:t>
+      </w:r>
+      <w:r>
+        <w:rPr>
+          <w:rFonts w:ascii="Georgia" w:hAnsi="Georgia" w:eastAsia="Georgia" w:cs="Georgia"/>
+          <w:b w:val="0"/>
+          <w:sz w:val="22"/>
+          <w:szCs w:val="22"/>
+        </w:rPr>
+        <w:t>Quick-Reference + Legend (p. 1). Full Codebook from p. 2. Coding sheet columns at end.</w:t>
+      </w:r>
+    </w:p>
+    <w:p>
+      <w:pPr>
+        <w:spacing w:before="120" w:after="20" w:line="240" w:lineRule="auto"/>
         <w:jc w:val="left"/>
       </w:pPr>
       <w:r>
@@ -11718,22 +11902,32 @@
     </w:p>
     <w:p>
       <w:pPr>
-        <w:spacing w:before="0" w:after="40" w:line="280" w:lineRule="auto"/>
-        <w:ind w:left="360"/>
-        <w:jc w:val="both"/>
-      </w:pPr>
-      <w:r>
-        <w:rPr>
-          <w:rFonts w:ascii="Georgia" w:hAnsi="Georgia" w:cs="Georgia" w:eastAsia="Georgia"/>
-          <w:sz w:val="20"/>
-          <w:szCs w:val="20"/>
-        </w:rPr>
-        <w:t xml:space="preserve">• Context decides. A listed word is a hedge only when it works as one in the sentence.</w:t>
-      </w:r>
-    </w:p>
-    <w:p>
-      <w:pPr>
-        <w:spacing w:before="240" w:after="40" w:line="280" w:lineRule="auto"/>
+        <w:spacing w:before="0" w:after="20" w:line="240" w:lineRule="auto"/>
+        <w:ind w:left="360" w:firstLine="0"/>
+        <w:jc w:val="both"/>
+      </w:pPr>
+      <w:r>
+        <w:rPr>
+          <w:rFonts w:ascii="Georgia" w:hAnsi="Georgia" w:eastAsia="Georgia" w:cs="Georgia"/>
+          <w:b/>
+          <w:sz w:val="22"/>
+          <w:szCs w:val="22"/>
+        </w:rPr>
+        <w:t xml:space="preserve">• Context decides. </w:t>
+      </w:r>
+      <w:r>
+        <w:rPr>
+          <w:rFonts w:ascii="Georgia" w:hAnsi="Georgia" w:eastAsia="Georgia" w:cs="Georgia"/>
+          <w:b w:val="0"/>
+          <w:sz w:val="22"/>
+          <w:szCs w:val="22"/>
+        </w:rPr>
+        <w:t>A listed word is a hedge only when it works as one in the sentence.</w:t>
+      </w:r>
+    </w:p>
+    <w:p>
+      <w:pPr>
+        <w:spacing w:before="0" w:after="20" w:line="240" w:lineRule="auto"/>
         <w:jc w:val="left"/>
       </w:pPr>
       <w:r>
@@ -11759,81 +11953,123 @@
     </w:p>
     <w:p>
       <w:pPr>
-        <w:spacing w:before="0" w:after="40" w:line="280" w:lineRule="auto"/>
-        <w:ind w:left="360"/>
-        <w:jc w:val="both"/>
-      </w:pPr>
-      <w:r>
-        <w:rPr>
-          <w:rFonts w:ascii="Georgia" w:hAnsi="Georgia" w:cs="Georgia" w:eastAsia="Georgia"/>
-          <w:sz w:val="20"/>
-          <w:szCs w:val="20"/>
-        </w:rPr>
-        <w:t xml:space="preserve">• Modal: may, might, could, would, should, can (possibility only, not capability or obligation).</w:t>
-      </w:r>
-    </w:p>
-    <w:p>
-      <w:pPr>
-        <w:spacing w:before="0" w:after="40" w:line="280" w:lineRule="auto"/>
-        <w:ind w:left="360"/>
-        <w:jc w:val="both"/>
-      </w:pPr>
-      <w:r>
-        <w:rPr>
-          <w:rFonts w:ascii="Georgia" w:hAnsi="Georgia" w:cs="Georgia" w:eastAsia="Georgia"/>
-          <w:sz w:val="20"/>
-          <w:szCs w:val="20"/>
-        </w:rPr>
-        <w:t xml:space="preserve">• Lexical: suggest, indicate, appear, seem, possible, likely, potential (when they qualify a claim and pass Step 2).</w:t>
-      </w:r>
-    </w:p>
-    <w:p>
-      <w:pPr>
-        <w:spacing w:before="0" w:after="40" w:line="280" w:lineRule="auto"/>
-        <w:ind w:left="360"/>
-        <w:jc w:val="both"/>
-      </w:pPr>
-      <w:r>
-        <w:rPr>
-          <w:rFonts w:ascii="Georgia" w:hAnsi="Georgia" w:cs="Georgia" w:eastAsia="Georgia"/>
-          <w:sz w:val="20"/>
-          <w:szCs w:val="20"/>
-        </w:rPr>
-        <w:t xml:space="preserve">• Adverbial: generally, typically, possibly, probably (scope or certainty, not procedural routine).</w:t>
-      </w:r>
-    </w:p>
-    <w:p>
-      <w:pPr>
-        <w:spacing w:before="0" w:after="40" w:line="280" w:lineRule="auto"/>
-        <w:ind w:left="360"/>
-        <w:jc w:val="both"/>
-      </w:pPr>
-      <w:r>
-        <w:rPr>
-          <w:rFonts w:ascii="Georgia" w:hAnsi="Georgia" w:cs="Georgia" w:eastAsia="Georgia"/>
-          <w:sz w:val="20"/>
-          <w:szCs w:val="20"/>
-        </w:rPr>
-        <w:t xml:space="preserve">• Clause-level: it seems that, it is possible that, to some extent.</w:t>
-      </w:r>
-    </w:p>
-    <w:p>
-      <w:pPr>
-        <w:spacing w:before="0" w:after="0" w:line="480" w:lineRule="auto"/>
+        <w:spacing w:before="0" w:after="20" w:line="240" w:lineRule="auto"/>
+        <w:ind w:left="360" w:firstLine="0"/>
+        <w:jc w:val="both"/>
+      </w:pPr>
+      <w:r>
+        <w:rPr>
+          <w:rFonts w:ascii="Georgia" w:hAnsi="Georgia" w:eastAsia="Georgia" w:cs="Georgia"/>
+          <w:b/>
+          <w:sz w:val="22"/>
+          <w:szCs w:val="22"/>
+        </w:rPr>
+        <w:t xml:space="preserve">• Modal: </w:t>
+      </w:r>
+      <w:r>
+        <w:rPr>
+          <w:rFonts w:ascii="Georgia" w:hAnsi="Georgia" w:eastAsia="Georgia" w:cs="Georgia"/>
+          <w:b w:val="0"/>
+          <w:sz w:val="22"/>
+          <w:szCs w:val="22"/>
+        </w:rPr>
+        <w:t>may, might, could, would, should, can (possibility only, not capability or obligation).</w:t>
+      </w:r>
+    </w:p>
+    <w:p>
+      <w:pPr>
+        <w:spacing w:before="0" w:after="20" w:line="240" w:lineRule="auto"/>
+        <w:ind w:left="360" w:firstLine="0"/>
+        <w:jc w:val="both"/>
+      </w:pPr>
+      <w:r>
+        <w:rPr>
+          <w:rFonts w:ascii="Georgia" w:hAnsi="Georgia" w:eastAsia="Georgia" w:cs="Georgia"/>
+          <w:b/>
+          <w:sz w:val="22"/>
+          <w:szCs w:val="22"/>
+        </w:rPr>
+        <w:t xml:space="preserve">• Lexical: </w:t>
+      </w:r>
+      <w:r>
+        <w:rPr>
+          <w:rFonts w:ascii="Georgia" w:hAnsi="Georgia" w:eastAsia="Georgia" w:cs="Georgia"/>
+          <w:b w:val="0"/>
+          <w:sz w:val="22"/>
+          <w:szCs w:val="22"/>
+        </w:rPr>
+        <w:t>suggest, indicate, appear, seem, possible, likely, potential (when they qualify a claim and pass Step 2).</w:t>
+      </w:r>
+    </w:p>
+    <w:p>
+      <w:pPr>
+        <w:spacing w:before="0" w:after="20" w:line="240" w:lineRule="auto"/>
+        <w:ind w:left="360" w:firstLine="0"/>
+        <w:jc w:val="both"/>
+      </w:pPr>
+      <w:r>
+        <w:rPr>
+          <w:rFonts w:ascii="Georgia" w:hAnsi="Georgia" w:eastAsia="Georgia" w:cs="Georgia"/>
+          <w:b/>
+          <w:sz w:val="22"/>
+          <w:szCs w:val="22"/>
+        </w:rPr>
+        <w:t xml:space="preserve">• Adverbial: </w:t>
+      </w:r>
+      <w:r>
+        <w:rPr>
+          <w:rFonts w:ascii="Georgia" w:hAnsi="Georgia" w:eastAsia="Georgia" w:cs="Georgia"/>
+          <w:b w:val="0"/>
+          <w:sz w:val="22"/>
+          <w:szCs w:val="22"/>
+        </w:rPr>
+        <w:t>generally, typically, possibly, probably (scope or certainty, not procedural routine).</w:t>
+      </w:r>
+    </w:p>
+    <w:p>
+      <w:pPr>
+        <w:spacing w:before="0" w:after="20" w:line="240" w:lineRule="auto"/>
+        <w:ind w:left="360" w:firstLine="0"/>
+        <w:jc w:val="both"/>
+      </w:pPr>
+      <w:r>
+        <w:rPr>
+          <w:rFonts w:ascii="Georgia" w:hAnsi="Georgia" w:eastAsia="Georgia" w:cs="Georgia"/>
+          <w:b/>
+          <w:sz w:val="22"/>
+          <w:szCs w:val="22"/>
+        </w:rPr>
+        <w:t xml:space="preserve">• Clause-level: </w:t>
+      </w:r>
+      <w:r>
+        <w:rPr>
+          <w:rFonts w:ascii="Georgia" w:hAnsi="Georgia" w:eastAsia="Georgia" w:cs="Georgia"/>
+          <w:b w:val="0"/>
+          <w:sz w:val="22"/>
+          <w:szCs w:val="22"/>
+        </w:rPr>
+        <w:t>it seems that, it is possible that, to some extent.</w:t>
+      </w:r>
+    </w:p>
+    <w:p>
+      <w:pPr>
+        <w:spacing w:before="0" w:after="20" w:line="240" w:lineRule="auto"/>
         <w:ind w:firstLine="0"/>
         <w:jc w:val="both"/>
       </w:pPr>
       <w:r>
         <w:rPr>
           <w:rFonts w:ascii="Georgia" w:hAnsi="Georgia" w:eastAsia="Georgia" w:cs="Georgia"/>
-          <w:sz w:val="24"/>
+          <w:b w:val="0"/>
+          <w:sz w:val="22"/>
+          <w:szCs w:val="22"/>
         </w:rPr>
         <w:t>Functions: EC = uncertainty about a claim’s truth. P = interpersonal softening of a claim. FP = fails the claim condition or both checks.</w:t>
       </w:r>
     </w:p>
     <w:p>
       <w:pPr>
-        <w:spacing w:before="40" w:after="40" w:line="280" w:lineRule="auto"/>
+        <w:spacing w:before="0" w:after="20" w:line="240" w:lineRule="auto"/>
         <w:jc w:val="both"/>
       </w:pPr>
       <w:r>
@@ -11848,7 +12084,7 @@
     </w:p>
     <w:p>
       <w:pPr>
-        <w:spacing w:before="40" w:after="40" w:line="280" w:lineRule="auto"/>
+        <w:spacing w:before="0" w:after="20" w:line="240" w:lineRule="auto"/>
         <w:jc w:val="both"/>
       </w:pPr>
       <w:r>
@@ -11862,7 +12098,7 @@
     </w:p>
     <w:p>
       <w:pPr>
-        <w:spacing w:before="240" w:after="40" w:line="280" w:lineRule="auto"/>
+        <w:spacing w:before="120" w:after="20" w:line="240" w:lineRule="auto"/>
         <w:jc w:val="left"/>
       </w:pPr>
       <w:r>
@@ -11888,17 +12124,27 @@
     </w:p>
     <w:p>
       <w:pPr>
-        <w:spacing w:before="0" w:after="40" w:line="280" w:lineRule="auto"/>
-        <w:ind w:left="360"/>
-        <w:jc w:val="both"/>
-      </w:pPr>
-      <w:r>
-        <w:rPr>
-          <w:rFonts w:ascii="Georgia" w:hAnsi="Georgia" w:cs="Georgia" w:eastAsia="Georgia"/>
-          <w:sz w:val="20"/>
-          <w:szCs w:val="20"/>
-        </w:rPr>
-        <w:t xml:space="preserve">• Highlights = type background on the token. Colored text labels = function. Grey = unhedged verb. Strike + grey code = FP.</w:t>
+        <w:spacing w:before="0" w:after="20" w:line="240" w:lineRule="auto"/>
+        <w:ind w:left="360" w:firstLine="0"/>
+        <w:jc w:val="both"/>
+      </w:pPr>
+      <w:r>
+        <w:rPr>
+          <w:rFonts w:ascii="Georgia" w:hAnsi="Georgia" w:eastAsia="Georgia" w:cs="Georgia"/>
+          <w:b/>
+          <w:sz w:val="22"/>
+          <w:szCs w:val="22"/>
+        </w:rPr>
+        <w:t xml:space="preserve">• Highlights = type background on the token. </w:t>
+      </w:r>
+      <w:r>
+        <w:rPr>
+          <w:rFonts w:ascii="Georgia" w:hAnsi="Georgia" w:eastAsia="Georgia" w:cs="Georgia"/>
+          <w:b w:val="0"/>
+          <w:sz w:val="22"/>
+          <w:szCs w:val="22"/>
+        </w:rPr>
+        <w:t>Colored text labels = function. Grey = unhedged verb. Strike + grey code = FP.</w:t>
       </w:r>
     </w:p>
     <w:tbl>
@@ -11942,9 +12188,10 @@
           </w:tcPr>
           <w:p>
             <w:pPr>
-              <w:spacing w:before="20" w:after="0" w:line="240" w:lineRule="auto"/>
+              <w:spacing w:before="0" w:after="0" w:line="220" w:lineRule="auto"/>
               <w:jc w:val="both"/>
               <w:rPr/>
+              <w:keepNext/>
             </w:pPr>
             <w:r>
               <w:rPr>
@@ -11960,6 +12207,7 @@
             <w:r>
               <w:rPr>
                 <w:rtl w:val="0"/>
+                <w:b w:val="0"/>
                 <w:sz w:val="18"/>
                 <w:szCs w:val="18"/>
                 <w:rFonts w:ascii="Georgia" w:hAnsi="Georgia" w:eastAsia="Georgia" w:cs="Georgia"/>
@@ -11976,9 +12224,10 @@
           </w:tcPr>
           <w:p>
             <w:pPr>
-              <w:spacing w:before="20" w:after="0" w:line="240" w:lineRule="auto"/>
+              <w:spacing w:before="0" w:after="0" w:line="220" w:lineRule="auto"/>
               <w:jc w:val="both"/>
               <w:rPr/>
+              <w:keepNext/>
             </w:pPr>
             <w:r>
               <w:rPr>
@@ -11994,6 +12243,7 @@
             <w:r>
               <w:rPr>
                 <w:rtl w:val="0"/>
+                <w:b w:val="0"/>
                 <w:sz w:val="18"/>
                 <w:szCs w:val="18"/>
                 <w:rFonts w:ascii="Georgia" w:hAnsi="Georgia" w:eastAsia="Georgia" w:cs="Georgia"/>
@@ -12010,13 +12260,15 @@
           <w:tcPr/>
           <w:p>
             <w:pPr>
-              <w:spacing w:before="0" w:after="0" w:line="240" w:lineRule="auto"/>
+              <w:spacing w:before="0" w:after="0" w:line="220" w:lineRule="auto"/>
               <w:jc w:val="both"/>
               <w:rPr/>
-            </w:pPr>
-            <w:r>
-              <w:rPr>
-                <w:rFonts w:ascii="Georgia" w:cs="Georgia" w:eastAsia="Georgia" w:hAnsi="Georgia"/>
+              <w:keepNext/>
+            </w:pPr>
+            <w:r>
+              <w:rPr>
+                <w:rFonts w:ascii="Georgia" w:cs="Georgia" w:eastAsia="Georgia" w:hAnsi="Georgia"/>
+                <w:b w:val="0"/>
                 <w:sz w:val="18"/>
                 <w:szCs w:val="18"/>
                 <w:shd w:fill="00b0f0" w:val="clear"/>
@@ -12027,6 +12279,7 @@
             <w:r>
               <w:rPr>
                 <w:rFonts w:ascii="Georgia" w:cs="Georgia" w:eastAsia="Georgia" w:hAnsi="Georgia"/>
+                <w:b w:val="0"/>
                 <w:i w:val="0"/>
                 <w:iCs w:val="0"/>
                 <w:color w:val="000000"/>
@@ -12039,6 +12292,7 @@
             <w:r>
               <w:rPr>
                 <w:rtl w:val="0"/>
+                <w:b w:val="0"/>
                 <w:sz w:val="18"/>
                 <w:szCs w:val="18"/>
                 <w:rFonts w:ascii="Georgia" w:hAnsi="Georgia" w:eastAsia="Georgia" w:cs="Georgia"/>
@@ -12047,13 +12301,15 @@
           </w:p>
           <w:p>
             <w:pPr>
-              <w:spacing w:before="0" w:after="0" w:line="240" w:lineRule="auto"/>
+              <w:spacing w:before="0" w:after="0" w:line="220" w:lineRule="auto"/>
               <w:jc w:val="both"/>
               <w:rPr/>
-            </w:pPr>
-            <w:r>
-              <w:rPr>
-                <w:rFonts w:ascii="Georgia" w:cs="Georgia" w:eastAsia="Georgia" w:hAnsi="Georgia"/>
+              <w:keepNext/>
+            </w:pPr>
+            <w:r>
+              <w:rPr>
+                <w:rFonts w:ascii="Georgia" w:cs="Georgia" w:eastAsia="Georgia" w:hAnsi="Georgia"/>
+                <w:b w:val="0"/>
                 <w:sz w:val="18"/>
                 <w:szCs w:val="18"/>
                 <w:highlight w:val="red"/>
@@ -12064,6 +12320,7 @@
             <w:r>
               <w:rPr>
                 <w:rFonts w:ascii="Georgia" w:cs="Georgia" w:eastAsia="Georgia" w:hAnsi="Georgia"/>
+                <w:b w:val="0"/>
                 <w:i w:val="0"/>
                 <w:iCs w:val="0"/>
                 <w:color w:val="000000"/>
@@ -12076,6 +12333,7 @@
             <w:r>
               <w:rPr>
                 <w:rtl w:val="0"/>
+                <w:b w:val="0"/>
                 <w:sz w:val="18"/>
                 <w:szCs w:val="18"/>
                 <w:rFonts w:ascii="Georgia" w:hAnsi="Georgia" w:eastAsia="Georgia" w:cs="Georgia"/>
@@ -12084,13 +12342,15 @@
           </w:p>
           <w:p>
             <w:pPr>
-              <w:spacing w:before="0" w:after="0" w:line="240" w:lineRule="auto"/>
+              <w:spacing w:before="0" w:after="0" w:line="220" w:lineRule="auto"/>
               <w:jc w:val="both"/>
               <w:rPr/>
-            </w:pPr>
-            <w:r>
-              <w:rPr>
-                <w:rFonts w:ascii="Georgia" w:cs="Georgia" w:eastAsia="Georgia" w:hAnsi="Georgia"/>
+              <w:keepNext/>
+            </w:pPr>
+            <w:r>
+              <w:rPr>
+                <w:rFonts w:ascii="Georgia" w:cs="Georgia" w:eastAsia="Georgia" w:hAnsi="Georgia"/>
+                <w:b w:val="0"/>
                 <w:sz w:val="18"/>
                 <w:szCs w:val="18"/>
                 <w:highlight w:val="yellow"/>
@@ -12101,6 +12361,7 @@
             <w:r>
               <w:rPr>
                 <w:rFonts w:ascii="Georgia" w:cs="Georgia" w:eastAsia="Georgia" w:hAnsi="Georgia"/>
+                <w:b w:val="0"/>
                 <w:i w:val="0"/>
                 <w:iCs w:val="0"/>
                 <w:color w:val="000000"/>
@@ -12113,6 +12374,7 @@
             <w:r>
               <w:rPr>
                 <w:rtl w:val="0"/>
+                <w:b w:val="0"/>
                 <w:sz w:val="18"/>
                 <w:szCs w:val="18"/>
                 <w:rFonts w:ascii="Georgia" w:hAnsi="Georgia" w:eastAsia="Georgia" w:cs="Georgia"/>
@@ -12121,13 +12383,15 @@
           </w:p>
           <w:p>
             <w:pPr>
-              <w:spacing w:before="0" w:after="0" w:line="240" w:lineRule="auto"/>
+              <w:spacing w:before="0" w:after="0" w:line="220" w:lineRule="auto"/>
               <w:jc w:val="both"/>
               <w:rPr/>
-            </w:pPr>
-            <w:r>
-              <w:rPr>
-                <w:rFonts w:ascii="Georgia" w:cs="Georgia" w:eastAsia="Georgia" w:hAnsi="Georgia"/>
+              <w:keepNext/>
+            </w:pPr>
+            <w:r>
+              <w:rPr>
+                <w:rFonts w:ascii="Georgia" w:cs="Georgia" w:eastAsia="Georgia" w:hAnsi="Georgia"/>
+                <w:b w:val="0"/>
                 <w:sz w:val="18"/>
                 <w:szCs w:val="18"/>
                 <w:shd w:fill="00b050" w:val="clear"/>
@@ -12138,6 +12402,7 @@
             <w:r>
               <w:rPr>
                 <w:rFonts w:ascii="Georgia" w:cs="Georgia" w:eastAsia="Georgia" w:hAnsi="Georgia"/>
+                <w:b w:val="0"/>
                 <w:i w:val="0"/>
                 <w:iCs w:val="0"/>
                 <w:color w:val="000000"/>
@@ -12150,6 +12415,7 @@
             <w:r>
               <w:rPr>
                 <w:rtl w:val="0"/>
+                <w:b w:val="0"/>
                 <w:sz w:val="18"/>
                 <w:szCs w:val="18"/>
                 <w:rFonts w:ascii="Georgia" w:hAnsi="Georgia" w:eastAsia="Georgia" w:cs="Georgia"/>
@@ -12161,13 +12427,15 @@
           <w:tcPr/>
           <w:p>
             <w:pPr>
-              <w:spacing w:before="0" w:after="0" w:line="240" w:lineRule="auto"/>
+              <w:spacing w:before="0" w:after="0" w:line="220" w:lineRule="auto"/>
               <w:jc w:val="both"/>
               <w:rPr/>
-            </w:pPr>
-            <w:r>
-              <w:rPr>
-                <w:rFonts w:ascii="Georgia" w:cs="Georgia" w:eastAsia="Georgia" w:hAnsi="Georgia"/>
+              <w:keepNext/>
+            </w:pPr>
+            <w:r>
+              <w:rPr>
+                <w:rFonts w:ascii="Georgia" w:cs="Georgia" w:eastAsia="Georgia" w:hAnsi="Georgia"/>
+                <w:b w:val="0"/>
                 <w:i w:val="0"/>
                 <w:iCs w:val="0"/>
                 <w:color w:val="ed7d31"/>
@@ -12180,6 +12448,7 @@
             <w:r>
               <w:rPr>
                 <w:rFonts w:ascii="Georgia" w:cs="Georgia" w:eastAsia="Georgia" w:hAnsi="Georgia"/>
+                <w:b w:val="0"/>
                 <w:i w:val="0"/>
                 <w:iCs w:val="0"/>
                 <w:color w:val="000000"/>
@@ -12192,6 +12461,7 @@
             <w:r>
               <w:rPr>
                 <w:rtl w:val="0"/>
+                <w:b w:val="0"/>
                 <w:sz w:val="18"/>
                 <w:szCs w:val="18"/>
                 <w:rFonts w:ascii="Georgia" w:hAnsi="Georgia" w:eastAsia="Georgia" w:cs="Georgia"/>
@@ -12200,13 +12470,15 @@
           </w:p>
           <w:p>
             <w:pPr>
-              <w:spacing w:before="0" w:after="0" w:line="240" w:lineRule="auto"/>
+              <w:spacing w:before="0" w:after="0" w:line="220" w:lineRule="auto"/>
               <w:jc w:val="both"/>
               <w:rPr/>
-            </w:pPr>
-            <w:r>
-              <w:rPr>
-                <w:rFonts w:ascii="Georgia" w:cs="Georgia" w:eastAsia="Georgia" w:hAnsi="Georgia"/>
+              <w:keepNext/>
+            </w:pPr>
+            <w:r>
+              <w:rPr>
+                <w:rFonts w:ascii="Georgia" w:cs="Georgia" w:eastAsia="Georgia" w:hAnsi="Georgia"/>
+                <w:b w:val="0"/>
                 <w:i w:val="0"/>
                 <w:iCs w:val="0"/>
                 <w:color w:val="7030a0"/>
@@ -12219,6 +12491,7 @@
             <w:r>
               <w:rPr>
                 <w:rFonts w:ascii="Georgia" w:cs="Georgia" w:eastAsia="Georgia" w:hAnsi="Georgia"/>
+                <w:b w:val="0"/>
                 <w:i w:val="0"/>
                 <w:iCs w:val="0"/>
                 <w:color w:val="000000"/>
@@ -12231,6 +12504,7 @@
             <w:r>
               <w:rPr>
                 <w:rtl w:val="0"/>
+                <w:b w:val="0"/>
                 <w:sz w:val="18"/>
                 <w:szCs w:val="18"/>
                 <w:rFonts w:ascii="Georgia" w:hAnsi="Georgia" w:eastAsia="Georgia" w:cs="Georgia"/>
@@ -12239,17 +12513,18 @@
           </w:p>
           <w:p>
             <w:pPr>
-              <w:spacing w:before="0" w:after="0" w:line="240" w:lineRule="auto"/>
+              <w:spacing w:before="0" w:after="0" w:line="220" w:lineRule="auto"/>
               <w:jc w:val="both"/>
               <w:rPr/>
+              <w:keepNext/>
             </w:pPr>
             <w:r>
               <w:rPr>
                 <w:rFonts w:ascii="Georgia" w:hAnsi="Georgia" w:eastAsia="Georgia" w:cs="Georgia"/>
-                <w:sz w:val="18"/>
-                <w:szCs w:val="18"/>
-              </w:rPr>
-              <w:t xml:space="preserve">, </w:t>
+                <w:b w:val="0"/>
+                <w:sz w:val="18"/>
+                <w:szCs w:val="18"/>
+              </w:rPr>
             </w:r>
           </w:p>
         </w:tc>
@@ -12262,7 +12537,7 @@
           <w:tcPr/>
           <w:p>
             <w:pPr>
-              <w:spacing w:before="20" w:after="0" w:line="240" w:lineRule="auto"/>
+              <w:spacing w:before="0" w:after="0" w:line="220" w:lineRule="auto"/>
               <w:jc w:val="left"/>
               <w:rPr/>
             </w:pPr>
@@ -12283,6 +12558,7 @@
             <w:r>
               <w:rPr>
                 <w:rtl w:val="0"/>
+                <w:b w:val="0"/>
                 <w:sz w:val="18"/>
                 <w:szCs w:val="18"/>
                 <w:rFonts w:ascii="Georgia" w:hAnsi="Georgia" w:eastAsia="Georgia" w:cs="Georgia"/>
@@ -12293,10 +12569,12 @@
             <w:pPr>
               <w:spacing w:before="0" w:after="0" w:line="220" w:lineRule="auto"/>
               <w:jc w:val="both"/>
+              <w:keepNext/>
             </w:pPr>
             <w:r>
               <w:rPr>
                 <w:rFonts w:ascii="Georgia" w:hAnsi="Georgia" w:cs="Georgia" w:eastAsia="Georgia"/>
+                <w:b w:val="0"/>
                 <w:sz w:val="18"/>
                 <w:szCs w:val="18"/>
               </w:rPr>
@@ -12308,9 +12586,10 @@
           <w:tcPr/>
           <w:p>
             <w:pPr>
-              <w:spacing w:before="20" w:after="0" w:line="240" w:lineRule="auto"/>
+              <w:spacing w:before="0" w:after="0" w:line="220" w:lineRule="auto"/>
               <w:jc w:val="left"/>
               <w:rPr/>
+              <w:keepNext/>
             </w:pPr>
             <w:r>
               <w:rPr>
@@ -12329,6 +12608,7 @@
             <w:r>
               <w:rPr>
                 <w:rtl w:val="0"/>
+                <w:b w:val="0"/>
                 <w:sz w:val="18"/>
                 <w:szCs w:val="18"/>
                 <w:rFonts w:ascii="Georgia" w:hAnsi="Georgia" w:eastAsia="Georgia" w:cs="Georgia"/>
@@ -12344,6 +12624,7 @@
             <w:r>
               <w:rPr>
                 <w:rFonts w:ascii="Georgia" w:hAnsi="Georgia" w:cs="Georgia" w:eastAsia="Georgia"/>
+                <w:b w:val="0"/>
                 <w:sz w:val="18"/>
                 <w:szCs w:val="18"/>
               </w:rPr>
@@ -12356,7 +12637,7 @@
     <w:p>
       <w:pPr>
         <w:keepNext w:val="1"/>
-        <w:spacing w:before="120" w:after="40" w:line="280" w:lineRule="auto"/>
+        <w:spacing w:before="60" w:after="20" w:line="240" w:lineRule="auto"/>
         <w:jc w:val="left"/>
       </w:pPr>
       <w:r>
@@ -12383,7 +12664,7 @@
     <w:p>
       <w:pPr>
         <w:keepNext w:val="1"/>
-        <w:spacing w:before="0" w:after="40" w:line="280" w:lineRule="auto"/>
+        <w:spacing w:before="0" w:after="20" w:line="240" w:lineRule="auto"/>
         <w:jc w:val="both"/>
       </w:pPr>
       <w:r>
@@ -12618,7 +12899,7 @@
     </w:p>
     <w:p>
       <w:pPr>
-        <w:spacing w:before="0" w:after="40" w:line="280" w:lineRule="auto"/>
+        <w:spacing w:before="0" w:after="40" w:line="240" w:lineRule="auto"/>
         <w:jc w:val="both"/>
         <w:keepNext w:val="1"/>
       </w:pPr>
@@ -12652,8 +12933,8 @@
           <w:rFonts w:ascii="Georgia" w:hAnsi="Georgia" w:cs="Georgia" w:eastAsia="Georgia"/>
           <w:b/>
           <w:bCs w:val="1"/>
-          <w:sz w:val="24"/>
-          <w:szCs w:val="24"/>
+          <w:sz w:val="22"/>
+          <w:szCs w:val="22"/>
           <w:rtl w:val="0"/>
         </w:rPr>
         <w:t>FULL CODEBOOK</w:t>
@@ -12679,8 +12960,8 @@
           <w:rFonts w:ascii="Georgia" w:hAnsi="Georgia" w:cs="Georgia" w:eastAsia="Georgia"/>
           <w:b/>
           <w:bCs w:val="1"/>
-          <w:sz w:val="24"/>
-          <w:szCs w:val="24"/>
+          <w:sz w:val="22"/>
+          <w:szCs w:val="22"/>
           <w:rtl w:val="0"/>
         </w:rPr>
         <w:t>PURPOSE</w:t>
@@ -12697,16 +12978,26 @@
     </w:p>
     <w:p>
       <w:pPr>
-        <w:spacing w:before="0" w:after="0" w:line="480" w:lineRule="auto"/>
-        <w:jc w:val="both"/>
-      </w:pPr>
-      <w:r>
-        <w:rPr>
-          <w:rFonts w:ascii="Georgia" w:hAnsi="Georgia" w:cs="Georgia" w:eastAsia="Georgia"/>
-          <w:sz w:val="22"/>
-          <w:szCs w:val="22"/>
-        </w:rPr>
-        <w:t xml:space="preserve">• Coding scheme for the PSAU undergraduate thesis abstract corpus, adapted from Hyland (1998) as type instrument.</w:t>
+        <w:spacing w:before="0" w:after="0" w:line="276" w:lineRule="auto"/>
+        <w:ind w:firstLine="0"/>
+        <w:jc w:val="both"/>
+      </w:pPr>
+      <w:r>
+        <w:rPr>
+          <w:rFonts w:ascii="Georgia" w:hAnsi="Georgia" w:eastAsia="Georgia" w:cs="Georgia"/>
+          <w:b/>
+          <w:sz w:val="22"/>
+          <w:szCs w:val="22"/>
+        </w:rPr>
+        <w:t xml:space="preserve">• Coding scheme for the PSAU undergraduate thesis abstract corpus, adapted from Hyland (1998) as type instrument. </w:t>
+      </w:r>
+      <w:r>
+        <w:rPr>
+          <w:rFonts w:ascii="Georgia" w:hAnsi="Georgia" w:eastAsia="Georgia" w:cs="Georgia"/>
+          <w:b w:val="0"/>
+          <w:sz w:val="22"/>
+          <w:szCs w:val="22"/>
+        </w:rPr>
       </w:r>
     </w:p>
     <w:p>
@@ -12718,8 +13009,8 @@
       <w:r>
         <w:rPr>
           <w:rFonts w:ascii="Georgia" w:hAnsi="Georgia" w:cs="Georgia" w:eastAsia="Georgia"/>
-          <w:sz w:val="24"/>
-          <w:szCs w:val="24"/>
+          <w:sz w:val="22"/>
+          <w:szCs w:val="22"/>
           <w:rtl w:val="0"/>
           <w:b/>
           <w:bCs w:val="0"/>
@@ -12738,16 +13029,27 @@
     </w:p>
     <w:p>
       <w:pPr>
-        <w:spacing w:before="0" w:after="0" w:line="480" w:lineRule="auto"/>
-        <w:jc w:val="both"/>
-      </w:pPr>
-      <w:r>
-        <w:rPr>
-          <w:rFonts w:ascii="Georgia" w:hAnsi="Georgia" w:cs="Georgia" w:eastAsia="Georgia"/>
-          <w:sz w:val="22"/>
-          <w:szCs w:val="22"/>
-        </w:rPr>
-        <w:t xml:space="preserve">• Step 1 (wide net). After the holistic read, mark all possible hedge candidates. This step does not count retained hedges.</w:t>
+        <w:spacing w:before="0" w:after="0" w:line="276" w:lineRule="auto"/>
+        <w:ind w:firstLine="0"/>
+        <w:jc w:val="both"/>
+      </w:pPr>
+      <w:r>
+        <w:rPr>
+          <w:rFonts w:ascii="Georgia" w:hAnsi="Georgia" w:eastAsia="Georgia" w:cs="Georgia"/>
+          <w:b/>
+          <w:sz w:val="22"/>
+          <w:szCs w:val="22"/>
+        </w:rPr>
+        <w:t xml:space="preserve">• Step 1 (wide net). </w:t>
+      </w:r>
+      <w:r>
+        <w:rPr>
+          <w:rFonts w:ascii="Georgia" w:hAnsi="Georgia" w:eastAsia="Georgia" w:cs="Georgia"/>
+          <w:b w:val="0"/>
+          <w:sz w:val="22"/>
+          <w:szCs w:val="22"/>
+        </w:rPr>
+        <w:t>After the holistic read, mark all possible hedge candidates. This step does not count retained hedges.</w:t>
       </w:r>
     </w:p>
     <w:p>
@@ -12759,51 +13061,95 @@
       <w:r>
         <w:rPr>
           <w:rFonts w:ascii="Georgia" w:hAnsi="Georgia" w:eastAsia="Georgia" w:cs="Georgia"/>
-          <w:sz w:val="24"/>
-        </w:rPr>
-        <w:t>• Step 2 (function by paired removal checks). Claim condition (both tests): a device can only be a hedge if it attaches to a claim. A claim is a statement about data, the world, or prior work that evidence could show to be wrong. Aims, directives, and routine procedure are excluded by kind, not by loose truth-evaluability. If the clause is not a claim, log the token as FP (with a reason code when useful: FP-Rec, FP-Gen, FP-Proc, or FP-Cap). Working Test: remove the device. Does the writer’s commitment to the claim’s truth go up? If yes → EC. Reader Test: remove the device. Does commitment to the truth stay the same, but the claim now reaches the reader more bluntly, or the writer takes sole ownership of it against prior work? If yes → P. Neither → FP. Both may hold on one token (EC+P). There is no required category pre-filter before these checks. Category codes label residual rejects after the claim condition or both tests fail.</w:t>
+          <w:b/>
+          <w:sz w:val="22"/>
+          <w:szCs w:val="22"/>
+        </w:rPr>
+        <w:t xml:space="preserve">• Step 2 (function by paired removal checks). </w:t>
+      </w:r>
+      <w:r>
+        <w:rPr>
+          <w:rFonts w:ascii="Georgia" w:hAnsi="Georgia" w:eastAsia="Georgia" w:cs="Georgia"/>
+          <w:b w:val="0"/>
+          <w:sz w:val="22"/>
+          <w:szCs w:val="22"/>
+        </w:rPr>
+        <w:t>Claim condition (both tests): a device can only be a hedge if it attaches to a claim. A claim is a statement about data, the world, or prior work that evidence could show to be wrong. Aims, directives, and routine procedure are excluded by kind, not by loose truth-evaluability. If the clause is not a claim, log the token as FP (with a reason code when useful: FP-Rec, FP-Gen, FP-Proc, or FP-Cap). Working Test: remove the device. Does the writer’s commitment to the claim’s truth go up? If yes → EC. Reader Test: remove the device. Does commitment to the truth stay the same, but the claim now reaches the reader more bluntly, or the writer takes sole ownership of it against prior work? If yes → P. Neither → FP. Both may hold on one token (EC+P). There is no required category pre-filter before these checks. Category codes label residual rejects after the claim condition or both tests fail.</w:t>
       </w:r>
     </w:p>
     <w:p>
       <w:pPr>
         <w:spacing w:before="0" w:after="0" w:line="480" w:lineRule="auto"/>
-        <w:jc w:val="both"/>
-      </w:pPr>
-      <w:r>
-        <w:rPr>
-          <w:rFonts w:ascii="Georgia" w:hAnsi="Georgia" w:cs="Georgia" w:eastAsia="Georgia"/>
-          <w:sz w:val="22"/>
-          <w:szCs w:val="22"/>
-        </w:rPr>
-        <w:t xml:space="preserve">• Working Test and Reader Test are the Step 2 function gate, after the claim condition. Every Step 1 candidate can be run through the claim condition and the two removal checks. Directives, aim statements, and procedural norms fail the claim condition and are logged FP without needing a prior sort. Category codes (FP-Rec, FP-Cap, FP-Proc, FP-Gen) explain the residual inventory. They do not replace the tests.</w:t>
+        <w:ind w:firstLine="0"/>
+        <w:jc w:val="both"/>
+      </w:pPr>
+      <w:r>
+        <w:rPr>
+          <w:rFonts w:ascii="Georgia" w:hAnsi="Georgia" w:eastAsia="Georgia" w:cs="Georgia"/>
+          <w:b/>
+          <w:sz w:val="22"/>
+          <w:szCs w:val="22"/>
+        </w:rPr>
+        <w:t xml:space="preserve">• Working Test and Reader Test are the Step 2 function gate, after the claim condition. </w:t>
+      </w:r>
+      <w:r>
+        <w:rPr>
+          <w:rFonts w:ascii="Georgia" w:hAnsi="Georgia" w:eastAsia="Georgia" w:cs="Georgia"/>
+          <w:b w:val="0"/>
+          <w:sz w:val="22"/>
+          <w:szCs w:val="22"/>
+        </w:rPr>
+        <w:t>Every Step 1 candidate can be run through the claim condition and the two removal checks. Directives, aim statements, and procedural norms fail the claim condition and are logged FP without needing a prior sort. Category codes (FP-Rec, FP-Cap, FP-Proc, FP-Gen) explain the residual inventory. They do not replace the tests.</w:t>
+      </w:r>
+    </w:p>
+    <w:p>
+      <w:pPr>
+        <w:spacing w:before="0" w:after="0" w:line="276" w:lineRule="auto"/>
+        <w:ind w:firstLine="0"/>
+        <w:jc w:val="both"/>
+      </w:pPr>
+      <w:r>
+        <w:rPr>
+          <w:rFonts w:ascii="Georgia" w:hAnsi="Georgia" w:eastAsia="Georgia" w:cs="Georgia"/>
+          <w:b/>
+          <w:sz w:val="22"/>
+          <w:szCs w:val="22"/>
+        </w:rPr>
+        <w:t xml:space="preserve">• Step 3 (type). </w:t>
+      </w:r>
+      <w:r>
+        <w:rPr>
+          <w:rFonts w:ascii="Georgia" w:hAnsi="Georgia" w:eastAsia="Georgia" w:cs="Georgia"/>
+          <w:b w:val="0"/>
+          <w:sz w:val="22"/>
+          <w:szCs w:val="22"/>
+        </w:rPr>
+        <w:t>On retained P and EC tokens only, assign grammatical type (modal, lexical, adverbial, clause-level).</w:t>
       </w:r>
     </w:p>
     <w:p>
       <w:pPr>
         <w:spacing w:before="0" w:after="0" w:line="480" w:lineRule="auto"/>
-        <w:jc w:val="both"/>
-      </w:pPr>
-      <w:r>
-        <w:rPr>
-          <w:rFonts w:ascii="Georgia" w:hAnsi="Georgia" w:cs="Georgia" w:eastAsia="Georgia"/>
-          <w:sz w:val="22"/>
-          <w:szCs w:val="22"/>
-        </w:rPr>
-        <w:t xml:space="preserve">• Step 3 (type). On retained P and EC tokens only, assign grammatical type (modal, lexical, adverbial, clause-level).</w:t>
-      </w:r>
-    </w:p>
-    <w:p>
-      <w:pPr>
-        <w:spacing w:before="0" w:after="0" w:line="480" w:lineRule="auto"/>
-        <w:jc w:val="both"/>
-      </w:pPr>
-      <w:r>
-        <w:rPr>
-          <w:rFonts w:ascii="Georgia" w:hAnsi="Georgia" w:cs="Georgia" w:eastAsia="Georgia"/>
-          <w:sz w:val="22"/>
-          <w:szCs w:val="22"/>
-        </w:rPr>
-        <w:t xml:space="preserve">• Order. Coding order: full abstract → Step 1 (wide net) → Step 2 (claim condition, then Working Test and Reader Test) → reason codes on rejects → Step 3 type on retained P and EC → Coder Notes. No mandatory category pre-filter before Step 2.</w:t>
+        <w:ind w:firstLine="0"/>
+        <w:jc w:val="both"/>
+      </w:pPr>
+      <w:r>
+        <w:rPr>
+          <w:rFonts w:ascii="Georgia" w:hAnsi="Georgia" w:eastAsia="Georgia" w:cs="Georgia"/>
+          <w:b/>
+          <w:sz w:val="22"/>
+          <w:szCs w:val="22"/>
+        </w:rPr>
+        <w:t xml:space="preserve">• Order. </w:t>
+      </w:r>
+      <w:r>
+        <w:rPr>
+          <w:rFonts w:ascii="Georgia" w:hAnsi="Georgia" w:eastAsia="Georgia" w:cs="Georgia"/>
+          <w:b w:val="0"/>
+          <w:sz w:val="22"/>
+          <w:szCs w:val="22"/>
+        </w:rPr>
+        <w:t>Coding order: full abstract → Step 1 (wide net) → Step 2 (claim condition, then Working Test and Reader Test) → reason codes on rejects → Step 3 type on retained P and EC → Coder Notes. No mandatory category pre-filter before Step 2.</w:t>
       </w:r>
     </w:p>
     <w:p>
@@ -12815,81 +13161,11 @@
       <w:r>
         <w:rPr>
           <w:b/>
-          <w:sz w:val="24"/>
-          <w:szCs w:val="24"/>
+          <w:sz w:val="22"/>
+          <w:szCs w:val="22"/>
           <w:rFonts w:ascii="Georgia" w:hAnsi="Georgia" w:eastAsia="Georgia" w:cs="Georgia"/>
         </w:rPr>
         <w:t xml:space="preserve">WORKING EXAMPLES: STEP 2 (WORKING TEST + READER TEST) AND STEP 3 TYPE</w:t>
-      </w:r>
-    </w:p>
-    <w:p>
-      <w:pPr>
-        <w:spacing w:before="0" w:after="0" w:line="480" w:lineRule="auto"/>
-        <w:jc w:val="both"/>
-      </w:pPr>
-      <w:r>
-        <w:rPr>
-          <w:rFonts w:ascii="Georgia" w:hAnsi="Georgia" w:cs="Georgia" w:eastAsia="Georgia"/>
-          <w:sz w:val="22"/>
-          <w:szCs w:val="22"/>
-        </w:rPr>
-        <w:t xml:space="preserve">• Function labels apply to retained hedges after Step 2. Only claim-attached devices can be EC or P. Working Test supports EC when commitment to the claim’s truth rises after removal. Reader Test supports P when truth commitment stays the same but the claim is blunter to the reader or the writer takes sole ownership against prior work.</w:t>
-      </w:r>
-    </w:p>
-    <w:p>
-      <w:pPr>
-        <w:spacing w:before="0" w:after="0" w:line="480" w:lineRule="auto"/>
-        <w:jc w:val="both"/>
-      </w:pPr>
-      <w:r>
-        <w:rPr>
-          <w:rFonts w:ascii="Georgia" w:hAnsi="Georgia" w:cs="Georgia" w:eastAsia="Georgia"/>
-          <w:sz w:val="22"/>
-          <w:szCs w:val="22"/>
-        </w:rPr>
-        <w:t xml:space="preserve">• EC (Working Test): “The treatment may reduce infection rates.” Host clause is a claim about data or the world. Removing may raises commitment to the claim’s truth → EC.</w:t>
-      </w:r>
-    </w:p>
-    <w:p>
-      <w:pPr>
-        <w:spacing w:before="0" w:after="0" w:line="480" w:lineRule="auto"/>
-        <w:jc w:val="both"/>
-      </w:pPr>
-      <w:r>
-        <w:rPr>
-          <w:rFonts w:ascii="Georgia" w:hAnsi="Georgia" w:cs="Georgia" w:eastAsia="Georgia"/>
-          <w:sz w:val="22"/>
-          <w:szCs w:val="22"/>
-        </w:rPr>
-        <w:t xml:space="preserve">• FP-Cap: “PCR can detect low concentrations.” can = capability, not uncertainty about a finding.</w:t>
-      </w:r>
-    </w:p>
-    <w:p>
-      <w:pPr>
-        <w:spacing w:before="0" w:after="0" w:line="480" w:lineRule="auto"/>
-        <w:jc w:val="both"/>
-      </w:pPr>
-      <w:r>
-        <w:rPr>
-          <w:rFonts w:ascii="Georgia" w:hAnsi="Georgia" w:cs="Georgia" w:eastAsia="Georgia"/>
-          <w:sz w:val="22"/>
-          <w:szCs w:val="22"/>
-        </w:rPr>
-        <w:t xml:space="preserve">• P (Reader Test): “As suggested by previous researchers, the treatment is effective.” Host clause is a claim. Removing the attribution leaves truth commitment the same but the writer takes sole ownership against prior work → P. By contrast, “Farmers should adopt the treatment” is a directive (excluded by kind) → FP-Rec.</w:t>
-      </w:r>
-    </w:p>
-    <w:p>
-      <w:pPr>
-        <w:spacing w:before="0" w:after="0" w:line="480" w:lineRule="auto"/>
-        <w:jc w:val="both"/>
-      </w:pPr>
-      <w:r>
-        <w:rPr>
-          <w:rFonts w:ascii="Georgia" w:hAnsi="Georgia" w:cs="Georgia" w:eastAsia="Georgia"/>
-          <w:sz w:val="22"/>
-          <w:szCs w:val="22"/>
-        </w:rPr>
-        <w:t xml:space="preserve">• P + EC: Both Working Test and Reader Test hold on one token → EC+P (or dominant label plus dual note in Coder Notes).</w:t>
       </w:r>
     </w:p>
     <w:p>
@@ -12901,23 +13177,70 @@
       <w:r>
         <w:rPr>
           <w:rFonts w:ascii="Georgia" w:hAnsi="Georgia" w:eastAsia="Georgia" w:cs="Georgia"/>
-          <w:sz w:val="24"/>
-        </w:rPr>
-        <w:t>• FP: “In conclusion, T3 produced the highest yield.” Removing the frame changes neither truth-commitment nor interpersonal imposition toward readers/prior work → FP.</w:t>
-      </w:r>
-    </w:p>
-    <w:p>
-      <w:pPr>
-        <w:spacing w:before="0" w:after="0" w:line="480" w:lineRule="auto"/>
-        <w:jc w:val="both"/>
-      </w:pPr>
-      <w:r>
-        <w:rPr>
-          <w:rFonts w:ascii="Georgia" w:hAnsi="Georgia" w:cs="Georgia" w:eastAsia="Georgia"/>
-          <w:sz w:val="22"/>
-          <w:szCs w:val="22"/>
-        </w:rPr>
-        <w:t xml:space="preserve">• Frame + separate EC: “It should be noted that the results may indicate growth.” Code may via Working Test as EC. The frame alone fails the claim condition or both checks and is not a second hedge.</w:t>
+          <w:b/>
+          <w:sz w:val="22"/>
+          <w:szCs w:val="22"/>
+        </w:rPr>
+        <w:t xml:space="preserve">• Function labels apply to retained hedges after Step 2. </w:t>
+      </w:r>
+      <w:r>
+        <w:rPr>
+          <w:rFonts w:ascii="Georgia" w:hAnsi="Georgia" w:eastAsia="Georgia" w:cs="Georgia"/>
+          <w:b w:val="0"/>
+          <w:sz w:val="22"/>
+          <w:szCs w:val="22"/>
+        </w:rPr>
+        <w:t>Only claim-attached devices can be EC or P. Working Test supports EC when commitment to the claim’s truth rises after removal. Reader Test supports P when truth commitment stays the same but the claim is blunter to the reader or the writer takes sole ownership against prior work.</w:t>
+      </w:r>
+    </w:p>
+    <w:p>
+      <w:pPr>
+        <w:spacing w:before="0" w:after="0" w:line="276" w:lineRule="auto"/>
+        <w:ind w:firstLine="0"/>
+        <w:jc w:val="both"/>
+      </w:pPr>
+      <w:r>
+        <w:rPr>
+          <w:rFonts w:ascii="Georgia" w:hAnsi="Georgia" w:eastAsia="Georgia" w:cs="Georgia"/>
+          <w:b/>
+          <w:sz w:val="22"/>
+          <w:szCs w:val="22"/>
+        </w:rPr>
+        <w:t xml:space="preserve">• EC (Working Test): </w:t>
+      </w:r>
+      <w:r>
+        <w:rPr>
+          <w:rFonts w:ascii="Georgia" w:hAnsi="Georgia" w:eastAsia="Georgia" w:cs="Georgia"/>
+          <w:b w:val="0"/>
+          <w:sz w:val="22"/>
+          <w:szCs w:val="22"/>
+        </w:rPr>
+        <w:t>“The treatment may reduce infection rates.” Host clause is a claim about data or the world. Removing may raises commitment to the claim’s truth → EC.</w:t>
+      </w:r>
+    </w:p>
+    <w:p>
+      <w:pPr>
+        <w:spacing w:before="0" w:after="0" w:line="276" w:lineRule="auto"/>
+        <w:ind w:firstLine="0"/>
+        <w:jc w:val="both"/>
+      </w:pPr>
+      <w:r>
+        <w:rPr>
+          <w:rFonts w:ascii="Georgia" w:hAnsi="Georgia" w:eastAsia="Georgia" w:cs="Georgia"/>
+          <w:b/>
+          <w:sz w:val="22"/>
+          <w:szCs w:val="22"/>
+        </w:rPr>
+        <w:t xml:space="preserve">• FP-Cap: </w:t>
+      </w:r>
+      <w:r>
+        <w:rPr>
+          <w:rFonts w:ascii="Georgia" w:hAnsi="Georgia" w:eastAsia="Georgia" w:cs="Georgia"/>
+          <w:b w:val="0"/>
+          <w:sz w:val="22"/>
+          <w:szCs w:val="22"/>
+        </w:rPr>
+        <w:t>“PCR can detect low concentrations.” can = capability, not uncertainty about a finding.</w:t>
       </w:r>
     </w:p>
     <w:p>
@@ -12929,9 +13252,120 @@
       <w:r>
         <w:rPr>
           <w:rFonts w:ascii="Georgia" w:hAnsi="Georgia" w:eastAsia="Georgia" w:cs="Georgia"/>
-          <w:sz w:val="24"/>
-        </w:rPr>
-        <w:t>• Summary: Step 1 is wide. Step 2 uses a claim condition, then the Working Test (EC) and Reader Test (P). Non-claims fail the claim condition and are FP. Neither removal check met → FP. Step 3 assigns type to retained hedges only. In this corpus all 65 retained tokens were EC. No P forms appeared on claims. FP cases are inventoried separately with reason codes.</w:t>
+          <w:b/>
+          <w:sz w:val="22"/>
+          <w:szCs w:val="22"/>
+        </w:rPr>
+        <w:t xml:space="preserve">• P (Reader Test): </w:t>
+      </w:r>
+      <w:r>
+        <w:rPr>
+          <w:rFonts w:ascii="Georgia" w:hAnsi="Georgia" w:eastAsia="Georgia" w:cs="Georgia"/>
+          <w:b w:val="0"/>
+          <w:sz w:val="22"/>
+          <w:szCs w:val="22"/>
+        </w:rPr>
+        <w:t>“As suggested by previous researchers, the treatment is effective.” Host clause is a claim. Removing the attribution leaves truth commitment the same but the writer takes sole ownership against prior work → P. By contrast, “Farmers should adopt the treatment” is a directive (excluded by kind) → FP-Rec.</w:t>
+      </w:r>
+    </w:p>
+    <w:p>
+      <w:pPr>
+        <w:spacing w:before="0" w:after="0" w:line="276" w:lineRule="auto"/>
+        <w:ind w:firstLine="0"/>
+        <w:jc w:val="both"/>
+      </w:pPr>
+      <w:r>
+        <w:rPr>
+          <w:rFonts w:ascii="Georgia" w:hAnsi="Georgia" w:eastAsia="Georgia" w:cs="Georgia"/>
+          <w:b/>
+          <w:sz w:val="22"/>
+          <w:szCs w:val="22"/>
+        </w:rPr>
+        <w:t xml:space="preserve">• P + EC: </w:t>
+      </w:r>
+      <w:r>
+        <w:rPr>
+          <w:rFonts w:ascii="Georgia" w:hAnsi="Georgia" w:eastAsia="Georgia" w:cs="Georgia"/>
+          <w:b w:val="0"/>
+          <w:sz w:val="22"/>
+          <w:szCs w:val="22"/>
+        </w:rPr>
+        <w:t>Both Working Test and Reader Test hold on one token → EC+P (or dominant label plus dual note in Coder Notes).</w:t>
+      </w:r>
+    </w:p>
+    <w:p>
+      <w:pPr>
+        <w:spacing w:before="0" w:after="0" w:line="276" w:lineRule="auto"/>
+        <w:ind w:firstLine="0"/>
+        <w:jc w:val="both"/>
+      </w:pPr>
+      <w:r>
+        <w:rPr>
+          <w:rFonts w:ascii="Georgia" w:hAnsi="Georgia" w:eastAsia="Georgia" w:cs="Georgia"/>
+          <w:b/>
+          <w:sz w:val="22"/>
+          <w:szCs w:val="22"/>
+        </w:rPr>
+        <w:t xml:space="preserve">• FP: </w:t>
+      </w:r>
+      <w:r>
+        <w:rPr>
+          <w:rFonts w:ascii="Georgia" w:hAnsi="Georgia" w:eastAsia="Georgia" w:cs="Georgia"/>
+          <w:b w:val="0"/>
+          <w:sz w:val="22"/>
+          <w:szCs w:val="22"/>
+        </w:rPr>
+        <w:t>“In conclusion, T3 produced the highest yield.” Removing the frame changes neither truth-commitment nor interpersonal imposition toward readers/prior work → FP.</w:t>
+      </w:r>
+    </w:p>
+    <w:p>
+      <w:pPr>
+        <w:spacing w:before="0" w:after="0" w:line="276" w:lineRule="auto"/>
+        <w:ind w:firstLine="0"/>
+        <w:jc w:val="both"/>
+      </w:pPr>
+      <w:r>
+        <w:rPr>
+          <w:rFonts w:ascii="Georgia" w:hAnsi="Georgia" w:eastAsia="Georgia" w:cs="Georgia"/>
+          <w:b/>
+          <w:sz w:val="22"/>
+          <w:szCs w:val="22"/>
+        </w:rPr>
+        <w:t xml:space="preserve">• Frame + separate EC: </w:t>
+      </w:r>
+      <w:r>
+        <w:rPr>
+          <w:rFonts w:ascii="Georgia" w:hAnsi="Georgia" w:eastAsia="Georgia" w:cs="Georgia"/>
+          <w:b w:val="0"/>
+          <w:sz w:val="22"/>
+          <w:szCs w:val="22"/>
+        </w:rPr>
+        <w:t>“It should be noted that the results may indicate growth.” Code may via Working Test as EC. The frame alone fails the claim condition or both checks and is not a second hedge.</w:t>
+      </w:r>
+    </w:p>
+    <w:p>
+      <w:pPr>
+        <w:spacing w:before="0" w:after="0" w:line="480" w:lineRule="auto"/>
+        <w:ind w:firstLine="0"/>
+        <w:jc w:val="both"/>
+      </w:pPr>
+      <w:r>
+        <w:rPr>
+          <w:rFonts w:ascii="Georgia" w:hAnsi="Georgia" w:eastAsia="Georgia" w:cs="Georgia"/>
+          <w:b/>
+          <w:sz w:val="22"/>
+          <w:szCs w:val="22"/>
+        </w:rPr>
+        <w:t xml:space="preserve">• Summary: </w:t>
+      </w:r>
+      <w:r>
+        <w:rPr>
+          <w:rFonts w:ascii="Georgia" w:hAnsi="Georgia" w:eastAsia="Georgia" w:cs="Georgia"/>
+          <w:b w:val="0"/>
+          <w:sz w:val="22"/>
+          <w:szCs w:val="22"/>
+        </w:rPr>
+        <w:t>Step 1 is wide. Step 2 uses a claim condition, then the Working Test (EC) and Reader Test (P). Non-claims fail the claim condition and are FP. Neither removal check met → FP. Step 3 assigns type to retained hedges only. In this corpus all 65 retained tokens were EC. No P forms appeared on claims. FP cases are inventoried separately with reason codes.</w:t>
       </w:r>
     </w:p>
     <w:p>
@@ -12945,8 +13379,8 @@
           <w:rFonts w:ascii="Georgia" w:hAnsi="Georgia" w:cs="Georgia" w:eastAsia="Georgia"/>
           <w:b/>
           <w:bCs w:val="1"/>
-          <w:sz w:val="24"/>
-          <w:szCs w:val="24"/>
+          <w:sz w:val="22"/>
+          <w:szCs w:val="22"/>
           <w:rtl w:val="0"/>
         </w:rPr>
         <w:t>HEDGE TYPE (PRIMARY COLORS)</w:t>
@@ -12970,6 +13404,7 @@
       <w:r>
         <w:rPr>
           <w:rFonts w:ascii="Georgia" w:cs="Georgia" w:eastAsia="Georgia" w:hAnsi="Georgia"/>
+          <w:b w:val="0"/>
           <w:bCs w:val="0"/>
           <w:i w:val="0"/>
           <w:iCs w:val="0"/>
@@ -13767,6 +14202,7 @@
       <w:r>
         <w:rPr>
           <w:rFonts w:ascii="Georgia" w:hAnsi="Georgia" w:cs="Georgia" w:eastAsia="Georgia"/>
+          <w:b w:val="0"/>
           <w:bCs w:val="0"/>
           <w:i w:val="1"/>
           <w:iCs w:val="1"/>
@@ -13813,15 +14249,26 @@
     <w:p>
       <w:pPr>
         <w:spacing w:before="0" w:after="0" w:line="480" w:lineRule="auto"/>
-        <w:jc w:val="both"/>
-      </w:pPr>
-      <w:r>
-        <w:rPr>
-          <w:rFonts w:ascii="Georgia" w:hAnsi="Georgia" w:cs="Georgia" w:eastAsia="Georgia"/>
-          <w:sz w:val="22"/>
-          <w:szCs w:val="22"/>
-        </w:rPr>
-        <w:t xml:space="preserve">• imply / implies / implying = suggest. • can be concluded / derived / stated = inferential hedge (not capability can). • potentially = adverbial. • potential + noun: aim/methods topic-naming = FP-Gen. Results/conclusion qualifying a finding = Lexical EC. If removing potential changes commitment to a proposition, code Lexical EC.</w:t>
+        <w:ind w:firstLine="0"/>
+        <w:jc w:val="both"/>
+      </w:pPr>
+      <w:r>
+        <w:rPr>
+          <w:rFonts w:ascii="Georgia" w:hAnsi="Georgia" w:eastAsia="Georgia" w:cs="Georgia"/>
+          <w:b/>
+          <w:sz w:val="22"/>
+          <w:szCs w:val="22"/>
+        </w:rPr>
+        <w:t xml:space="preserve">• imply / implies / implying = suggest. </w:t>
+      </w:r>
+      <w:r>
+        <w:rPr>
+          <w:rFonts w:ascii="Georgia" w:hAnsi="Georgia" w:eastAsia="Georgia" w:cs="Georgia"/>
+          <w:b w:val="0"/>
+          <w:sz w:val="22"/>
+          <w:szCs w:val="22"/>
+        </w:rPr>
+        <w:t>• can be concluded / derived / stated = inferential hedge (not capability can). • potentially = adverbial. • potential + noun: aim/methods topic-naming = FP-Gen. Results/conclusion qualifying a finding = Lexical EC. If removing potential changes commitment to a proposition, code Lexical EC.</w:t>
       </w:r>
     </w:p>
     <w:p>
@@ -13835,8 +14282,8 @@
           <w:rFonts w:ascii="Georgia" w:hAnsi="Georgia" w:cs="Georgia" w:eastAsia="Georgia"/>
           <w:b/>
           <w:bCs w:val="1"/>
-          <w:sz w:val="24"/>
-          <w:szCs w:val="24"/>
+          <w:sz w:val="22"/>
+          <w:szCs w:val="22"/>
           <w:rtl w:val="0"/>
         </w:rPr>
         <w:t>HEDGE FUNCTION (COLORED TEXT LABELS)</w:t>
@@ -14571,10 +15018,10 @@
       <w:r>
         <w:rPr>
           <w:rFonts w:ascii="Georgia" w:cs="Georgia" w:eastAsia="Georgia" w:hAnsi="Georgia"/>
-          <w:b w:val="1"/>
+          <w:b/>
           <w:bCs w:val="1"/>
-          <w:sz w:val="24"/>
-          <w:szCs w:val="24"/>
+          <w:sz w:val="22"/>
+          <w:szCs w:val="22"/>
           <w:rtl w:val="0"/>
         </w:rPr>
         <w:t xml:space="preserve">DECISION RULES FOR AMBIGUOUS CASES</w:t>
@@ -14598,6 +15045,7 @@
       <w:r>
         <w:rPr>
           <w:rFonts w:ascii="Georgia" w:cs="Georgia" w:eastAsia="Georgia" w:hAnsi="Georgia"/>
+          <w:b w:val="0"/>
           <w:bCs w:val="0"/>
           <w:i w:val="0"/>
           <w:iCs w:val="0"/>
@@ -15483,6 +15931,7 @@
       <w:r>
         <w:rPr>
           <w:rFonts w:ascii="Georgia" w:cs="Georgia" w:eastAsia="Georgia" w:hAnsi="Georgia"/>
+          <w:b w:val="0"/>
           <w:bCs w:val="1"/>
           <w:i w:val="1"/>
           <w:iCs w:val="1"/>
@@ -15496,6 +15945,7 @@
       <w:r>
         <w:rPr>
           <w:rFonts w:ascii="Georgia" w:cs="Georgia" w:eastAsia="Georgia" w:hAnsi="Georgia"/>
+          <w:b w:val="0"/>
           <w:bCs w:val="0"/>
           <w:i w:val="1"/>
           <w:iCs w:val="1"/>
@@ -15524,6 +15974,7 @@
       <w:r>
         <w:rPr>
           <w:rFonts w:ascii="Georgia" w:cs="Georgia" w:eastAsia="Georgia" w:hAnsi="Georgia"/>
+          <w:b w:val="0"/>
           <w:bCs w:val="0"/>
           <w:i w:val="1"/>
           <w:iCs w:val="1"/>
@@ -15537,6 +15988,7 @@
       <w:r>
         <w:rPr>
           <w:rFonts w:ascii="Georgia" w:cs="Georgia" w:eastAsia="Georgia" w:hAnsi="Georgia"/>
+          <w:b w:val="0"/>
           <w:bCs w:val="1"/>
           <w:i w:val="1"/>
           <w:iCs w:val="1"/>
@@ -15550,6 +16002,7 @@
       <w:r>
         <w:rPr>
           <w:rFonts w:ascii="Georgia" w:cs="Georgia" w:eastAsia="Georgia" w:hAnsi="Georgia"/>
+          <w:b w:val="0"/>
           <w:bCs w:val="0"/>
           <w:i w:val="1"/>
           <w:iCs w:val="1"/>
@@ -15578,10 +16031,10 @@
       <w:r>
         <w:rPr>
           <w:rFonts w:ascii="Georgia" w:cs="Georgia" w:eastAsia="Georgia" w:hAnsi="Georgia"/>
-          <w:b w:val="1"/>
+          <w:b/>
           <w:bCs w:val="1"/>
-          <w:sz w:val="24"/>
-          <w:szCs w:val="24"/>
+          <w:sz w:val="22"/>
+          <w:szCs w:val="22"/>
           <w:rtl w:val="0"/>
         </w:rPr>
         <w:t xml:space="preserve">MARKING FALSE POSITIVES</w:t>
@@ -15605,6 +16058,7 @@
       <w:r>
         <w:rPr>
           <w:rFonts w:ascii="Georgia" w:cs="Georgia" w:eastAsia="Georgia" w:hAnsi="Georgia"/>
+          <w:b w:val="0"/>
           <w:bCs w:val="0"/>
           <w:i w:val="0"/>
           <w:iCs w:val="0"/>
@@ -16387,8 +16841,8 @@
           <w:rFonts w:ascii="Georgia" w:hAnsi="Georgia" w:cs="Georgia" w:eastAsia="Georgia"/>
           <w:b/>
           <w:bCs w:val="1"/>
-          <w:sz w:val="24"/>
-          <w:szCs w:val="24"/>
+          <w:sz w:val="22"/>
+          <w:szCs w:val="22"/>
           <w:rtl w:val="0"/>
         </w:rPr>
         <w:t>UNHEDGED ASSERTIONS (WARRANTED CAUTION, NEUTRAL GREY)</w:t>
@@ -16405,86 +16859,146 @@
     </w:p>
     <w:p>
       <w:pPr>
-        <w:spacing w:before="0" w:after="0" w:line="480" w:lineRule="auto"/>
-        <w:jc w:val="both"/>
-      </w:pPr>
-      <w:r>
-        <w:rPr>
-          <w:rFonts w:ascii="Georgia" w:hAnsi="Georgia" w:cs="Georgia" w:eastAsia="Georgia"/>
-          <w:sz w:val="22"/>
-          <w:szCs w:val="22"/>
-        </w:rPr>
-        <w:t>• Grey-highlight the main assertive verb, place [G] or [C] beside it (same placement as (EC) on hedges).</w:t>
-      </w:r>
-    </w:p>
-    <w:p>
-      <w:pPr>
-        <w:spacing w:before="0" w:after="0" w:line="480" w:lineRule="auto"/>
-        <w:jc w:val="both"/>
-      </w:pPr>
-      <w:r>
-        <w:rPr>
-          <w:rFonts w:ascii="Georgia" w:hAnsi="Georgia" w:cs="Georgia" w:eastAsia="Georgia"/>
-          <w:sz w:val="22"/>
-          <w:szCs w:val="22"/>
-        </w:rPr>
-        <w:t xml:space="preserve">• Mark only claims where caution was warranted but absent.</w:t>
-      </w:r>
-    </w:p>
-    <w:p>
-      <w:pPr>
-        <w:spacing w:before="0" w:after="0" w:line="480" w:lineRule="auto"/>
-        <w:jc w:val="both"/>
-      </w:pPr>
-      <w:r>
-        <w:rPr>
-          <w:rFonts w:ascii="Georgia" w:hAnsi="Georgia" w:cs="Georgia" w:eastAsia="Georgia"/>
-          <w:sz w:val="22"/>
-          <w:szCs w:val="22"/>
-        </w:rPr>
-        <w:t xml:space="preserve">• [G] = generalization or evaluative ranking beyond the data.</w:t>
-      </w:r>
-    </w:p>
-    <w:p>
-      <w:pPr>
-        <w:spacing w:before="0" w:after="0" w:line="480" w:lineRule="auto"/>
-        <w:jc w:val="both"/>
-      </w:pPr>
-      <w:r>
-        <w:rPr>
-          <w:rFonts w:ascii="Georgia" w:hAnsi="Georgia" w:cs="Georgia" w:eastAsia="Georgia"/>
-          <w:sz w:val="22"/>
-          <w:szCs w:val="22"/>
-        </w:rPr>
-        <w:t>• [C] = cause-effect or impact stronger than the design supports.</w:t>
-      </w:r>
-    </w:p>
-    <w:p>
-      <w:pPr>
-        <w:spacing w:before="0" w:after="0" w:line="480" w:lineRule="auto"/>
-        <w:jc w:val="both"/>
-      </w:pPr>
-      <w:r>
-        <w:rPr>
-          <w:rFonts w:ascii="Georgia" w:hAnsi="Georgia" w:cs="Georgia" w:eastAsia="Georgia"/>
-          <w:sz w:val="22"/>
-          <w:szCs w:val="22"/>
-        </w:rPr>
-        <w:t xml:space="preserve">• Do not mark bare trial results, measured findings, or procedural statements.</w:t>
-      </w:r>
-    </w:p>
-    <w:p>
-      <w:pPr>
-        <w:spacing w:before="0" w:after="0" w:line="480" w:lineRule="auto"/>
-        <w:jc w:val="both"/>
-      </w:pPr>
-      <w:r>
-        <w:rPr>
-          <w:rFonts w:ascii="Georgia" w:hAnsi="Georgia" w:cs="Georgia" w:eastAsia="Georgia"/>
-          <w:sz w:val="22"/>
-          <w:szCs w:val="22"/>
-        </w:rPr>
-        <w:t xml:space="preserve">• Record the full clause in the coding sheet.</w:t>
+        <w:spacing w:before="0" w:after="0" w:line="276" w:lineRule="auto"/>
+        <w:ind w:firstLine="0"/>
+        <w:jc w:val="both"/>
+      </w:pPr>
+      <w:r>
+        <w:rPr>
+          <w:rFonts w:ascii="Georgia" w:hAnsi="Georgia" w:eastAsia="Georgia" w:cs="Georgia"/>
+          <w:b/>
+          <w:sz w:val="22"/>
+          <w:szCs w:val="22"/>
+        </w:rPr>
+        <w:t xml:space="preserve">• Grey-highlight the main assertive verb, place [G] or [C] beside it (same placement as (EC) on hedges). </w:t>
+      </w:r>
+      <w:r>
+        <w:rPr>
+          <w:rFonts w:ascii="Georgia" w:hAnsi="Georgia" w:eastAsia="Georgia" w:cs="Georgia"/>
+          <w:b w:val="0"/>
+          <w:sz w:val="22"/>
+          <w:szCs w:val="22"/>
+        </w:rPr>
+      </w:r>
+    </w:p>
+    <w:p>
+      <w:pPr>
+        <w:spacing w:before="0" w:after="0" w:line="276" w:lineRule="auto"/>
+        <w:ind w:firstLine="0"/>
+        <w:jc w:val="both"/>
+      </w:pPr>
+      <w:r>
+        <w:rPr>
+          <w:rFonts w:ascii="Georgia" w:hAnsi="Georgia" w:eastAsia="Georgia" w:cs="Georgia"/>
+          <w:b/>
+          <w:sz w:val="22"/>
+          <w:szCs w:val="22"/>
+        </w:rPr>
+        <w:t xml:space="preserve">• Mark only claims where caution was warranted but absent. </w:t>
+      </w:r>
+      <w:r>
+        <w:rPr>
+          <w:rFonts w:ascii="Georgia" w:hAnsi="Georgia" w:eastAsia="Georgia" w:cs="Georgia"/>
+          <w:b w:val="0"/>
+          <w:sz w:val="22"/>
+          <w:szCs w:val="22"/>
+        </w:rPr>
+      </w:r>
+    </w:p>
+    <w:p>
+      <w:pPr>
+        <w:spacing w:before="0" w:after="0" w:line="276" w:lineRule="auto"/>
+        <w:ind w:firstLine="0"/>
+        <w:jc w:val="both"/>
+      </w:pPr>
+      <w:r>
+        <w:rPr>
+          <w:rFonts w:ascii="Georgia" w:hAnsi="Georgia" w:eastAsia="Georgia" w:cs="Georgia"/>
+          <w:b/>
+          <w:sz w:val="22"/>
+          <w:szCs w:val="22"/>
+        </w:rPr>
+        <w:t xml:space="preserve">• [G] = generalization or evaluative ranking beyond the data. </w:t>
+      </w:r>
+      <w:r>
+        <w:rPr>
+          <w:rFonts w:ascii="Georgia" w:hAnsi="Georgia" w:eastAsia="Georgia" w:cs="Georgia"/>
+          <w:b w:val="0"/>
+          <w:sz w:val="22"/>
+          <w:szCs w:val="22"/>
+        </w:rPr>
+      </w:r>
+    </w:p>
+    <w:p>
+      <w:pPr>
+        <w:spacing w:before="0" w:after="0" w:line="276" w:lineRule="auto"/>
+        <w:ind w:firstLine="0"/>
+        <w:jc w:val="both"/>
+      </w:pPr>
+      <w:r>
+        <w:rPr>
+          <w:rFonts w:ascii="Georgia" w:hAnsi="Georgia" w:eastAsia="Georgia" w:cs="Georgia"/>
+          <w:b/>
+          <w:sz w:val="22"/>
+          <w:szCs w:val="22"/>
+        </w:rPr>
+        <w:t xml:space="preserve">• [C] = cause-effect or impact stronger than the design supports. </w:t>
+      </w:r>
+      <w:r>
+        <w:rPr>
+          <w:rFonts w:ascii="Georgia" w:hAnsi="Georgia" w:eastAsia="Georgia" w:cs="Georgia"/>
+          <w:b w:val="0"/>
+          <w:sz w:val="22"/>
+          <w:szCs w:val="22"/>
+        </w:rPr>
+      </w:r>
+    </w:p>
+    <w:p>
+      <w:pPr>
+        <w:spacing w:before="0" w:after="0" w:line="276" w:lineRule="auto"/>
+        <w:ind w:firstLine="0"/>
+        <w:jc w:val="both"/>
+      </w:pPr>
+      <w:r>
+        <w:rPr>
+          <w:rFonts w:ascii="Georgia" w:hAnsi="Georgia" w:eastAsia="Georgia" w:cs="Georgia"/>
+          <w:b/>
+          <w:sz w:val="22"/>
+          <w:szCs w:val="22"/>
+        </w:rPr>
+        <w:t xml:space="preserve">• Do not mark bare trial results, measured findings, or procedural statements. </w:t>
+      </w:r>
+      <w:r>
+        <w:rPr>
+          <w:rFonts w:ascii="Georgia" w:hAnsi="Georgia" w:eastAsia="Georgia" w:cs="Georgia"/>
+          <w:b w:val="0"/>
+          <w:sz w:val="22"/>
+          <w:szCs w:val="22"/>
+        </w:rPr>
+      </w:r>
+    </w:p>
+    <w:p>
+      <w:pPr>
+        <w:spacing w:before="0" w:after="0" w:line="276" w:lineRule="auto"/>
+        <w:ind w:firstLine="0"/>
+        <w:jc w:val="both"/>
+      </w:pPr>
+      <w:r>
+        <w:rPr>
+          <w:rFonts w:ascii="Georgia" w:hAnsi="Georgia" w:eastAsia="Georgia" w:cs="Georgia"/>
+          <w:b/>
+          <w:sz w:val="22"/>
+          <w:szCs w:val="22"/>
+        </w:rPr>
+        <w:t xml:space="preserve">• Record the full clause in the coding sheet. </w:t>
+      </w:r>
+      <w:r>
+        <w:rPr>
+          <w:rFonts w:ascii="Georgia" w:hAnsi="Georgia" w:eastAsia="Georgia" w:cs="Georgia"/>
+          <w:b w:val="0"/>
+          <w:sz w:val="22"/>
+          <w:szCs w:val="22"/>
+        </w:rPr>
       </w:r>
     </w:p>
     <w:tbl>
@@ -17029,8 +17543,8 @@
           <w:rFonts w:ascii="Georgia" w:hAnsi="Georgia" w:cs="Georgia" w:eastAsia="Georgia"/>
           <w:b/>
           <w:bCs w:val="1"/>
-          <w:sz w:val="24"/>
-          <w:szCs w:val="24"/>
+          <w:sz w:val="22"/>
+          <w:szCs w:val="22"/>
           <w:rtl w:val="0"/>
         </w:rPr>
         <w:t>CODING SHEET COLUMNS</w:t>
@@ -18412,58 +18926,101 @@
     </w:tbl>
     <w:p>
       <w:pPr>
-        <w:spacing w:before="0" w:after="0" w:line="280" w:lineRule="auto"/>
-        <w:jc w:val="both"/>
-      </w:pPr>
-      <w:r>
-        <w:rPr>
-          <w:rFonts w:ascii="Georgia" w:hAnsi="Georgia" w:cs="Georgia" w:eastAsia="Georgia"/>
-          <w:sz w:val="22"/>
-          <w:szCs w:val="22"/>
-        </w:rPr>
-        <w:t xml:space="preserve">• Highlighted abstract = primary record. Spreadsheet = tallying and analysis only.</w:t>
-      </w:r>
-    </w:p>
-    <w:p>
-      <w:pPr>
-        <w:spacing w:before="0" w:after="0" w:line="280" w:lineRule="auto"/>
-        <w:jc w:val="both"/>
-      </w:pPr>
-      <w:r>
-        <w:rPr>
-          <w:rFonts w:ascii="Georgia" w:hAnsi="Georgia" w:cs="Georgia" w:eastAsia="Georgia"/>
-          <w:sz w:val="22"/>
-          <w:szCs w:val="22"/>
-        </w:rPr>
-        <w:t>• Codes: Acs1-Acs10, Aas1-Aas10 (Agriculture). VM1-VM20. B1-B20 (Biology).</w:t>
-      </w:r>
-    </w:p>
-    <w:p>
-      <w:pPr>
-        <w:spacing w:before="0" w:after="0" w:line="280" w:lineRule="auto"/>
-        <w:jc w:val="both"/>
-      </w:pPr>
-      <w:r>
-        <w:rPr>
-          <w:rFonts w:ascii="Georgia" w:hAnsi="Georgia" w:cs="Georgia" w:eastAsia="Georgia"/>
-          <w:sz w:val="22"/>
-          <w:szCs w:val="22"/>
-        </w:rPr>
-        <w:t xml:space="preserve">• Unhedged rows separate from hedge tallies. [G]/[C] only for warranted-but-absent caution.</w:t>
-      </w:r>
-    </w:p>
-    <w:p>
-      <w:pPr>
-        <w:spacing w:before="0" w:after="0" w:line="280" w:lineRule="auto"/>
-        <w:jc w:val="both"/>
-      </w:pPr>
-      <w:r>
-        <w:rPr>
-          <w:rFonts w:ascii="Georgia" w:hAnsi="Georgia" w:cs="Georgia" w:eastAsia="Georgia"/>
-          <w:sz w:val="22"/>
-          <w:szCs w:val="22"/>
-        </w:rPr>
-        <w:t xml:space="preserve">• Optional Rejected Candidates tab for FP traceability.</w:t>
+        <w:spacing w:before="0" w:after="0" w:line="276" w:lineRule="auto"/>
+        <w:ind w:firstLine="0"/>
+        <w:jc w:val="both"/>
+      </w:pPr>
+      <w:r>
+        <w:rPr>
+          <w:rFonts w:ascii="Georgia" w:hAnsi="Georgia" w:eastAsia="Georgia" w:cs="Georgia"/>
+          <w:b/>
+          <w:sz w:val="22"/>
+          <w:szCs w:val="22"/>
+        </w:rPr>
+        <w:t xml:space="preserve">• Highlighted abstract = primary record. </w:t>
+      </w:r>
+      <w:r>
+        <w:rPr>
+          <w:rFonts w:ascii="Georgia" w:hAnsi="Georgia" w:eastAsia="Georgia" w:cs="Georgia"/>
+          <w:b w:val="0"/>
+          <w:sz w:val="22"/>
+          <w:szCs w:val="22"/>
+        </w:rPr>
+        <w:t>Spreadsheet = tallying and analysis only.</w:t>
+      </w:r>
+    </w:p>
+    <w:p>
+      <w:pPr>
+        <w:spacing w:before="0" w:after="0" w:line="276" w:lineRule="auto"/>
+        <w:ind w:firstLine="0"/>
+        <w:jc w:val="both"/>
+      </w:pPr>
+      <w:r>
+        <w:rPr>
+          <w:rFonts w:ascii="Georgia" w:hAnsi="Georgia" w:eastAsia="Georgia" w:cs="Georgia"/>
+          <w:b/>
+          <w:sz w:val="22"/>
+          <w:szCs w:val="22"/>
+        </w:rPr>
+        <w:t xml:space="preserve">• Codes: </w:t>
+      </w:r>
+      <w:r>
+        <w:rPr>
+          <w:rFonts w:ascii="Georgia" w:hAnsi="Georgia" w:eastAsia="Georgia" w:cs="Georgia"/>
+          <w:b w:val="0"/>
+          <w:sz w:val="22"/>
+          <w:szCs w:val="22"/>
+        </w:rPr>
+        <w:t>Acs1-Acs10, Aas1-Aas10 (Agriculture). VM1-VM20. B1-B20 (Biology).</w:t>
+      </w:r>
+    </w:p>
+    <w:p>
+      <w:pPr>
+        <w:spacing w:before="0" w:after="0" w:line="276" w:lineRule="auto"/>
+        <w:ind w:firstLine="0"/>
+        <w:jc w:val="both"/>
+      </w:pPr>
+      <w:r>
+        <w:rPr>
+          <w:rFonts w:ascii="Georgia" w:hAnsi="Georgia" w:eastAsia="Georgia" w:cs="Georgia"/>
+          <w:b/>
+          <w:sz w:val="22"/>
+          <w:szCs w:val="22"/>
+        </w:rPr>
+        <w:t xml:space="preserve">• Unhedged rows separate from hedge tallies. </w:t>
+      </w:r>
+      <w:r>
+        <w:rPr>
+          <w:rFonts w:ascii="Georgia" w:hAnsi="Georgia" w:eastAsia="Georgia" w:cs="Georgia"/>
+          <w:b w:val="0"/>
+          <w:sz w:val="22"/>
+          <w:szCs w:val="22"/>
+        </w:rPr>
+        <w:t>[G]/[C] only for warranted-but-absent caution.</w:t>
+      </w:r>
+    </w:p>
+    <w:p>
+      <w:pPr>
+        <w:spacing w:before="0" w:after="0" w:line="276" w:lineRule="auto"/>
+        <w:ind w:firstLine="0"/>
+        <w:jc w:val="both"/>
+      </w:pPr>
+      <w:r>
+        <w:rPr>
+          <w:rFonts w:ascii="Georgia" w:hAnsi="Georgia" w:eastAsia="Georgia" w:cs="Georgia"/>
+          <w:b/>
+          <w:sz w:val="22"/>
+          <w:szCs w:val="22"/>
+        </w:rPr>
+        <w:t xml:space="preserve">• Optional Rejected Candidates tab for FP traceability. </w:t>
+      </w:r>
+      <w:r>
+        <w:rPr>
+          <w:rFonts w:ascii="Georgia" w:hAnsi="Georgia" w:eastAsia="Georgia" w:cs="Georgia"/>
+          <w:b w:val="0"/>
+          <w:sz w:val="22"/>
+          <w:szCs w:val="22"/>
+        </w:rPr>
       </w:r>
     </w:p>
     <w:p>
@@ -18476,10 +19033,10 @@
       <w:r>
         <w:rPr>
           <w:rFonts w:ascii="Georgia" w:cs="Georgia" w:eastAsia="Georgia" w:hAnsi="Georgia"/>
-          <w:b w:val="1"/>
+          <w:b/>
           <w:bCs w:val="1"/>
-          <w:sz w:val="28"/>
-          <w:szCs w:val="28"/>
+          <w:sz w:val="22"/>
+          <w:szCs w:val="22"/>
           <w:rtl w:val="0"/>
         </w:rPr>
         <w:t xml:space="preserve">APPENDIX B: PILOT SAMPLE ANALYSIS AND CODING VERIFICATION</w:t>
@@ -18525,6 +19082,7 @@
       <w:r>
         <w:rPr>
           <w:rFonts w:ascii="Georgia" w:hAnsi="Georgia" w:cs="Georgia" w:eastAsia="Georgia"/>
+          <w:b w:val="0"/>
           <w:i w:val="1"/>
           <w:iCs w:val="1"/>
           <w:rtl w:val="0"/>
@@ -18575,7 +19133,9 @@
       <w:r>
         <w:rPr>
           <w:rFonts w:ascii="Georgia" w:hAnsi="Georgia" w:eastAsia="Georgia" w:cs="Georgia"/>
-          <w:sz w:val="24"/>
+          <w:b w:val="0"/>
+          <w:sz w:val="22"/>
+          <w:szCs w:val="22"/>
         </w:rPr>
         <w:t>A total of 33 samples were used in this study to compare the results of Nested Polymerase Chain Reaction and Micro-Insulated Isothermal Polymerase Chain Reaction (POCKIT) in monitoring Acute Hepatopancreatic Necrosis Disease-causing Vibrio parahaemolyticus. The study used collected shrimp samples, pre-detected samples, and positive and negative standards for the detection of Acute Hepatopancreatic Necrosis Disease-causing Vibrio parahaemolyticus on shrimp samples, bacterial culture for vibrio sp. was also conducted as well as dna sequencing for the confirmation of the results. The result showed negative results on all the shrimp samples that led to the conclusion that all shrimp farms were free from Acute Hepatopancreatic Necrosis Disease-causing Vibrio parahaemolyticus.</w:t>
       </w:r>
@@ -18590,12 +19150,12 @@
       <w:r>
         <w:rPr>
           <w:rFonts w:ascii="Georgia" w:cs="Georgia" w:eastAsia="Georgia" w:hAnsi="Georgia"/>
-          <w:b w:val="1"/>
+          <w:b/>
           <w:bCs w:val="1"/>
           <w:i w:val="0"/>
           <w:iCs w:val="0"/>
-          <w:sz w:val="24"/>
-          <w:szCs w:val="24"/>
+          <w:sz w:val="22"/>
+          <w:szCs w:val="22"/>
           <w:rtl w:val="0"/>
         </w:rPr>
         <w:t xml:space="preserve">Hedge Count: 0</w:t>
@@ -18644,7 +19204,7 @@
       <w:r>
         <w:rPr>
           <w:rFonts w:ascii="Georgia" w:cs="Georgia" w:eastAsia="Georgia" w:hAnsi="Georgia"/>
-          <w:b w:val="1"/>
+          <w:b/>
           <w:bCs w:val="1"/>
           <w:i w:val="0"/>
           <w:iCs w:val="0"/>
@@ -18686,8 +19246,8 @@
           <w:bCs w:val="0"/>
           <w:i w:val="1"/>
           <w:iCs w:val="1"/>
-          <w:sz w:val="24"/>
-          <w:szCs w:val="24"/>
+          <w:sz w:val="22"/>
+          <w:szCs w:val="22"/>
           <w:rtl w:val="0"/>
         </w:rPr>
         <w:t xml:space="preserve">Sample 2: Veterinary Medicine</w:t>
@@ -18710,7 +19270,9 @@
       <w:r>
         <w:rPr>
           <w:rFonts w:ascii="Georgia" w:hAnsi="Georgia" w:eastAsia="Georgia" w:cs="Georgia"/>
-          <w:sz w:val="24"/>
+          <w:b w:val="0"/>
+          <w:sz w:val="22"/>
+          <w:szCs w:val="22"/>
         </w:rPr>
         <w:t>The study was conducted to determine and compare the staining effect of C. longa, I. batatas and M. acuminata aqueous extracts for gonad examination of Nile tilapia. Twelve Nile tilapia fingerlings, with approximately two and one-half to four-inch size, were divided into four treatments with three replicates each. Treatment 1 was assigned as the positive control, which were stained with malachite green, while Treatments 2, 3 and 4 were stained with C. longa, I. batatas and M. acuminata extracts, respectively. The prepared slides of stained gonads were randomly distributed on the microscopes using completely randomized design (CRD). Blind examination and evaluation by five faculty members was done on the stained unlabeled tissues under the microscopes. The tissues were evaluated according to five parameters: hue, saturation, contrast, clarity and overall appearance. A scoring scheme was followed, i.e. 1 to 2 - very poor, 3 to 4 - poor, 5 to 6 - average, 7 to 8 - good, and 9 to 10 - excellent. Data gathered were subjected to one-way analysis of variance (ANOVA). The results suggested that C. longa, I. batatas and M. acuminata extracts are potential alternative stains for gonadal examination of Nile tilapia with M. acuminata as the most preferred.</w:t>
       </w:r>
@@ -18725,12 +19287,12 @@
       <w:r>
         <w:rPr>
           <w:rFonts w:ascii="Georgia" w:cs="Georgia" w:eastAsia="Georgia" w:hAnsi="Georgia"/>
-          <w:b w:val="1"/>
+          <w:b/>
           <w:bCs w:val="1"/>
           <w:i w:val="0"/>
           <w:iCs w:val="0"/>
-          <w:sz w:val="24"/>
-          <w:szCs w:val="24"/>
+          <w:sz w:val="22"/>
+          <w:szCs w:val="22"/>
           <w:rtl w:val="0"/>
         </w:rPr>
         <w:t xml:space="preserve">Hedge Count: 2</w:t>
@@ -18779,12 +19341,12 @@
       <w:r>
         <w:rPr>
           <w:rFonts w:ascii="Georgia" w:cs="Georgia" w:eastAsia="Georgia" w:hAnsi="Georgia"/>
-          <w:b w:val="1"/>
+          <w:b/>
           <w:bCs w:val="1"/>
           <w:i w:val="0"/>
           <w:iCs w:val="0"/>
-          <w:sz w:val="24"/>
-          <w:szCs w:val="24"/>
+          <w:sz w:val="22"/>
+          <w:szCs w:val="22"/>
           <w:rtl w:val="0"/>
         </w:rPr>
         <w:t xml:space="preserve">Coded Instances:</w:t>
@@ -18807,7 +19369,9 @@
       <w:r>
         <w:rPr>
           <w:rFonts w:ascii="Georgia" w:hAnsi="Georgia" w:eastAsia="Georgia" w:cs="Georgia"/>
-          <w:sz w:val="24"/>
+          <w:b w:val="0"/>
+          <w:sz w:val="22"/>
+          <w:szCs w:val="22"/>
         </w:rPr>
         <w:t>“The results suggested that..” (Lexical Verb - Epistemic Caution)</w:t>
       </w:r>
@@ -18822,7 +19386,9 @@
       <w:r>
         <w:rPr>
           <w:rFonts w:ascii="Georgia" w:hAnsi="Georgia" w:eastAsia="Georgia" w:cs="Georgia"/>
-          <w:sz w:val="24"/>
+          <w:b w:val="0"/>
+          <w:sz w:val="22"/>
+          <w:szCs w:val="22"/>
         </w:rPr>
         <w:t>“..extracts are potential alternative stains..” (Lexical Adjective - Epistemic Caution)</w:t>
       </w:r>
@@ -18837,12 +19403,12 @@
       <w:r>
         <w:rPr>
           <w:rFonts w:ascii="Georgia" w:cs="Georgia" w:eastAsia="Georgia" w:hAnsi="Georgia"/>
-          <w:b w:val="1"/>
+          <w:b/>
           <w:bCs w:val="1"/>
           <w:i w:val="0"/>
           <w:iCs w:val="0"/>
-          <w:sz w:val="24"/>
-          <w:szCs w:val="24"/>
+          <w:sz w:val="22"/>
+          <w:szCs w:val="22"/>
           <w:rtl w:val="0"/>
         </w:rPr>
         <w:t xml:space="preserve">Excluded: </w:t>
@@ -18854,8 +19420,8 @@
           <w:bCs w:val="0"/>
           <w:i w:val="0"/>
           <w:iCs w:val="0"/>
-          <w:sz w:val="24"/>
-          <w:szCs w:val="24"/>
+          <w:sz w:val="22"/>
+          <w:szCs w:val="22"/>
           <w:rtl w:val="0"/>
         </w:rPr>
         <w:t xml:space="preserve">“approximately two and one-half” (Procedural measurement, not epistemic).</w:t>
@@ -18881,8 +19447,8 @@
           <w:bCs w:val="0"/>
           <w:i w:val="1"/>
           <w:iCs w:val="1"/>
-          <w:sz w:val="24"/>
-          <w:szCs w:val="24"/>
+          <w:sz w:val="22"/>
+          <w:szCs w:val="22"/>
           <w:rtl w:val="0"/>
         </w:rPr>
         <w:t xml:space="preserve">Sample 3: Agriculture (Animal Science)</w:t>
@@ -18905,7 +19471,9 @@
       <w:r>
         <w:rPr>
           <w:rFonts w:ascii="Georgia" w:hAnsi="Georgia" w:eastAsia="Georgia" w:cs="Georgia"/>
-          <w:sz w:val="24"/>
+          <w:b w:val="0"/>
+          <w:sz w:val="22"/>
+          <w:szCs w:val="22"/>
         </w:rPr>
         <w:t>The study was conducted for 7 days from July 07 to July 13, 2022 at [REDACTED]. The general objective of the study was to determine the acceptability and palatability of duck ham subjected to different curing process. Specifically, it aimed to find the sensory evaluation: appearance, aroma, taste/ flavor, texture, and over-all acceptability. A total of eight (8) Muscovy ducks were used in this study. The study used Hedonic Likert Scale and was subjected to Desriptive analysis. Factor A = Type of curing and Factor B = Spice rub. The treatments used in this study are the following. A₁ B₁ - Dry curing + Oregano, A₁ B₂ - Dry curing + Lemon grass, A₂ B₁ - Liquid curing + Oregano and A₁ B₂ - Liquid curing + Lemon grass. The sensory evaluation was conducted at Pampanga State Agricultural University, PAC, Magalang, Pampanga. Ten (10) college students, ten (10) teachers and ten (10) people who don’t eat duck were selected as respondents to evaluate the sample treatments. The data collected from the sensory evaluation were analysed using descriptive statistics.</w:t>
       </w:r>
@@ -18946,12 +19514,12 @@
       <w:r>
         <w:rPr>
           <w:rFonts w:ascii="Georgia" w:cs="Georgia" w:eastAsia="Georgia" w:hAnsi="Georgia"/>
-          <w:b w:val="1"/>
+          <w:b/>
           <w:bCs w:val="1"/>
           <w:i w:val="0"/>
           <w:iCs w:val="0"/>
-          <w:sz w:val="24"/>
-          <w:szCs w:val="24"/>
+          <w:sz w:val="22"/>
+          <w:szCs w:val="22"/>
           <w:rtl w:val="0"/>
         </w:rPr>
         <w:t xml:space="preserve">Hedge Count: 0</w:t>
@@ -19000,12 +19568,12 @@
       <w:r>
         <w:rPr>
           <w:rFonts w:ascii="Georgia" w:cs="Georgia" w:eastAsia="Georgia" w:hAnsi="Georgia"/>
-          <w:b w:val="1"/>
+          <w:b/>
           <w:bCs w:val="1"/>
           <w:i w:val="0"/>
           <w:iCs w:val="0"/>
-          <w:sz w:val="24"/>
-          <w:szCs w:val="24"/>
+          <w:sz w:val="22"/>
+          <w:szCs w:val="22"/>
           <w:rtl w:val="0"/>
         </w:rPr>
         <w:t xml:space="preserve">Key Excerpt: </w:t>
@@ -19017,8 +19585,8 @@
           <w:bCs w:val="0"/>
           <w:i w:val="0"/>
           <w:iCs w:val="0"/>
-          <w:sz w:val="24"/>
-          <w:szCs w:val="24"/>
+          <w:sz w:val="22"/>
+          <w:szCs w:val="22"/>
           <w:rtl w:val="0"/>
         </w:rPr>
         <w:t xml:space="preserve">“Results of the study showed that Comparison on Curing Methods…”</w:t>
@@ -19044,8 +19612,8 @@
           <w:bCs w:val="0"/>
           <w:i w:val="1"/>
           <w:iCs w:val="1"/>
-          <w:sz w:val="24"/>
-          <w:szCs w:val="24"/>
+          <w:sz w:val="22"/>
+          <w:szCs w:val="22"/>
           <w:rtl w:val="0"/>
         </w:rPr>
         <w:t xml:space="preserve">Sample 4: Agriculture (Crop Science)</w:t>
@@ -19068,7 +19636,9 @@
       <w:r>
         <w:rPr>
           <w:rFonts w:ascii="Georgia" w:hAnsi="Georgia" w:eastAsia="Georgia" w:cs="Georgia"/>
-          <w:sz w:val="24"/>
+          <w:b w:val="0"/>
+          <w:sz w:val="22"/>
+          <w:szCs w:val="22"/>
         </w:rPr>
         <w:t>The study was conducted from June to July 2022 to determine the influence of the different sources of nutrients to rice straw mushrooms. The field experiment was conducted in [REDACTED]. The experiment was laid out using Complete Randomize Design (CRD), with four treatments replicated four times. The treatments were as follows: T₀- Untreated banana leaves substrate submerged in 55 gallon of water (Control). T₁- Banana leaves substrate submerged in mixture of 100 grams of Urea and 55 gallons of water. T₂- Banana leaves substrate submerged in mixture of 250 ml of fish amino acid and 55 gallons of water, and, T₃- Banana leaves substrate submerged in mixture of 250 ml of fermented plant juice and 55 gallons of water.</w:t>
       </w:r>
@@ -19109,12 +19679,12 @@
       <w:r>
         <w:rPr>
           <w:rFonts w:ascii="Georgia" w:cs="Georgia" w:eastAsia="Georgia" w:hAnsi="Georgia"/>
-          <w:b w:val="1"/>
+          <w:b/>
           <w:bCs w:val="1"/>
           <w:i w:val="0"/>
           <w:iCs w:val="0"/>
-          <w:sz w:val="24"/>
-          <w:szCs w:val="24"/>
+          <w:sz w:val="22"/>
+          <w:szCs w:val="22"/>
           <w:rtl w:val="0"/>
         </w:rPr>
         <w:t xml:space="preserve">Hedge Count: 0</w:t>
@@ -19163,7 +19733,9 @@
       <w:r>
         <w:rPr>
           <w:rFonts w:ascii="Georgia" w:hAnsi="Georgia" w:eastAsia="Georgia" w:cs="Georgia"/>
-          <w:sz w:val="24"/>
+          <w:b w:val="0"/>
+          <w:sz w:val="22"/>
+          <w:szCs w:val="22"/>
         </w:rPr>
         <w:t>Key Excerpt: “Results of the study revealed significant differences.. The highest ROI was obtained…”</w:t>
       </w:r>
@@ -19177,10 +19749,10 @@
       <w:r>
         <w:rPr>
           <w:rFonts w:ascii="Georgia" w:cs="Georgia" w:eastAsia="Georgia" w:hAnsi="Georgia"/>
-          <w:b w:val="1"/>
+          <w:b/>
           <w:bCs w:val="1"/>
-          <w:sz w:val="24"/>
-          <w:szCs w:val="24"/>
+          <w:sz w:val="22"/>
+          <w:szCs w:val="22"/>
           <w:rtl w:val="0"/>
         </w:rPr>
         <w:t xml:space="preserve">General observation from the pilot</w:t>
@@ -19236,10 +19808,10 @@
       <w:r>
         <w:rPr>
           <w:rFonts w:ascii="Georgia" w:cs="Georgia" w:eastAsia="Georgia" w:hAnsi="Georgia"/>
-          <w:b w:val="1"/>
+          <w:b/>
           <w:bCs w:val="1"/>
-          <w:sz w:val="28"/>
-          <w:szCs w:val="28"/>
+          <w:sz w:val="22"/>
+          <w:szCs w:val="22"/>
           <w:rtl w:val="0"/>
         </w:rPr>
         <w:t xml:space="preserve">APPENDIX C: CODED CORPUS WITH HIGHLIGHTS</w:t>
@@ -19262,7 +19834,9 @@
       <w:r>
         <w:rPr>
           <w:rFonts w:ascii="Georgia" w:hAnsi="Georgia" w:eastAsia="Georgia" w:cs="Georgia"/>
-          <w:sz w:val="24"/>
+          <w:b w:val="0"/>
+          <w:sz w:val="22"/>
+          <w:szCs w:val="22"/>
         </w:rPr>
         <w:t>This appendix presents the 60 abstracts with all coding marks applied. Type marks = color highlight on hedge tokens (blue = Modal Verbs, red = Lexical Hedges, yellow = Adverbial Hedges, green = Clause-Level Hedges). Function marks = function label in colored text (EC = orange, P = purple). Function labels in this appendix are only EC and P. False positives = strikethrough + reason code in grey (e.g. FP-Rec = recommendation). Unhedged assertions = grey highlight + [G]/[C] bracket (warranted-but-absent caution only).</w:t>
       </w:r>
@@ -19281,8 +19855,8 @@
           <w:rFonts w:ascii="Georgia" w:hAnsi="Georgia" w:cs="Georgia" w:eastAsia="Georgia"/>
           <w:i w:val="0"/>
           <w:iCs w:val="0"/>
-          <w:sz w:val="24"/>
-          <w:szCs w:val="24"/>
+          <w:sz w:val="22"/>
+          <w:szCs w:val="22"/>
           <w:rtl w:val="0"/>
           <w:b/>
           <w:bCs/>
@@ -19308,7 +19882,9 @@
       <w:r>
         <w:rPr>
           <w:rFonts w:ascii="Georgia" w:hAnsi="Georgia" w:eastAsia="Georgia" w:cs="Georgia"/>
-          <w:sz w:val="24"/>
+          <w:b w:val="0"/>
+          <w:sz w:val="22"/>
+          <w:szCs w:val="22"/>
         </w:rPr>
         <w:t>B1 · 258 words · 2 hedges · 0.78 per 100 words</w:t>
       </w:r>
@@ -19489,7 +20065,9 @@
       <w:r>
         <w:rPr>
           <w:rFonts w:ascii="Georgia" w:hAnsi="Georgia" w:eastAsia="Georgia" w:cs="Georgia"/>
-          <w:sz w:val="24"/>
+          <w:b w:val="0"/>
+          <w:sz w:val="22"/>
+          <w:szCs w:val="22"/>
         </w:rPr>
         <w:t>B2 · 189 words · 0 hedges · 0.0 per 100 words</w:t>
       </w:r>
@@ -19596,7 +20174,9 @@
       <w:r>
         <w:rPr>
           <w:rFonts w:ascii="Georgia" w:hAnsi="Georgia" w:eastAsia="Georgia" w:cs="Georgia"/>
-          <w:sz w:val="24"/>
+          <w:b w:val="0"/>
+          <w:sz w:val="22"/>
+          <w:szCs w:val="22"/>
         </w:rPr>
         <w:t>B3 · 142 words · 1 hedges · 0.7 per 100 words</w:t>
       </w:r>
@@ -19668,7 +20248,9 @@
       <w:r>
         <w:rPr>
           <w:rFonts w:ascii="Georgia" w:hAnsi="Georgia" w:eastAsia="Georgia" w:cs="Georgia"/>
-          <w:sz w:val="24"/>
+          <w:b w:val="0"/>
+          <w:sz w:val="22"/>
+          <w:szCs w:val="22"/>
         </w:rPr>
         <w:t>B4 · 231 words · 3 hedges · 1.3 per 100 words</w:t>
       </w:r>
@@ -19922,7 +20504,9 @@
       <w:r>
         <w:rPr>
           <w:rFonts w:ascii="Georgia" w:hAnsi="Georgia" w:eastAsia="Georgia" w:cs="Georgia"/>
-          <w:sz w:val="24"/>
+          <w:b w:val="0"/>
+          <w:sz w:val="22"/>
+          <w:szCs w:val="22"/>
         </w:rPr>
         <w:t>B5 · 245 words · 1 hedges · 0.41 per 100 words</w:t>
       </w:r>
@@ -20066,7 +20650,9 @@
       <w:r>
         <w:rPr>
           <w:rFonts w:ascii="Georgia" w:hAnsi="Georgia" w:eastAsia="Georgia" w:cs="Georgia"/>
-          <w:sz w:val="24"/>
+          <w:b w:val="0"/>
+          <w:sz w:val="22"/>
+          <w:szCs w:val="22"/>
         </w:rPr>
         <w:t>B6 · 232 words · 0 hedges · 0.0 per 100 words</w:t>
       </w:r>
@@ -20246,7 +20832,9 @@
       <w:r>
         <w:rPr>
           <w:rFonts w:ascii="Georgia" w:hAnsi="Georgia" w:eastAsia="Georgia" w:cs="Georgia"/>
-          <w:sz w:val="24"/>
+          <w:b w:val="0"/>
+          <w:sz w:val="22"/>
+          <w:szCs w:val="22"/>
         </w:rPr>
         <w:t>B7 · 266 words · 3 hedges · 1.13 per 100 words</w:t>
       </w:r>
@@ -20476,7 +21064,9 @@
       <w:r>
         <w:rPr>
           <w:rFonts w:ascii="Georgia" w:hAnsi="Georgia" w:eastAsia="Georgia" w:cs="Georgia"/>
-          <w:sz w:val="24"/>
+          <w:b w:val="0"/>
+          <w:sz w:val="22"/>
+          <w:szCs w:val="22"/>
         </w:rPr>
         <w:t>B8 · 241 words · 2 hedges · 0.83 per 100 words</w:t>
       </w:r>
@@ -20621,7 +21211,9 @@
       <w:r>
         <w:rPr>
           <w:rFonts w:ascii="Georgia" w:hAnsi="Georgia" w:eastAsia="Georgia" w:cs="Georgia"/>
-          <w:sz w:val="24"/>
+          <w:b w:val="0"/>
+          <w:sz w:val="22"/>
+          <w:szCs w:val="22"/>
         </w:rPr>
         <w:t>B9 · 212 words · 0 hedges · 0.0 per 100 words</w:t>
       </w:r>
@@ -20717,7 +21309,9 @@
       <w:r>
         <w:rPr>
           <w:rFonts w:ascii="Georgia" w:hAnsi="Georgia" w:eastAsia="Georgia" w:cs="Georgia"/>
-          <w:sz w:val="24"/>
+          <w:b w:val="0"/>
+          <w:sz w:val="22"/>
+          <w:szCs w:val="22"/>
         </w:rPr>
         <w:t>B10 · 302 words · 1 hedges · 0.33 per 100 words</w:t>
       </w:r>
@@ -20732,7 +21326,9 @@
       <w:r>
         <w:rPr>
           <w:rFonts w:ascii="Georgia" w:hAnsi="Georgia" w:eastAsia="Georgia" w:cs="Georgia"/>
-          <w:sz w:val="24"/>
+          <w:b w:val="0"/>
+          <w:sz w:val="22"/>
+          <w:szCs w:val="22"/>
         </w:rPr>
         <w:t>It is well recognized that heavy metals harm human health through the food chain. The danger to human health associated with consuming fish contaminated with heavy metals were assessed. This study aimed to determine the presence of lead in the flesh part of selected fish species, Common carp (Cyprinus carpio), Roho labeo (Labeo rohita), and Silver carp (Hypophthalmichthys molitrix), in addition to determine the Knowledge, Attitude, and Practices (KAP) of fishers along the Pampanga River. A test method used is Inductively Coupled Plasma — Optical Emission Spectrometry (ICP-OES) in identifying heavy metals in biota. The self-administered questionnaires were distributed to 20 respondents, questionnaires compromised of socio-demographic characteristics and the KAP’s of fishers along the Pampanga River. Data analyses were done using SPSS (version 23). Data were explored using descriptive statistics. The results show that lead in any of the selected fish, with a &lt;0.013 mg/kg result is below the FAO and WHO’s allowed limits of 2 mg/kg and 0.5 mg/kg, respectively. Based on the result from KAP Analysis, knowledge scored M=1.7200 with SD equivalent to 0.10052 which is interpreted as poor knowledge. The attitude score M=3.1150 and SD=0.093330 which means a moderate attitude and lastly, practices score M = 2.8850 and SD =.13485 which is equivalent to have good practices. Thus, the researcher provided a policy proposal to focus on issues that needed to be addressed in the community. In terms of practices, proper waste management should (FP-Rec) be established to avoid the high danger of heavy metal contamination. Certain local habits, such as waste dumping and other communal activities, may (EC) contribute to the spread of heavy metals. As a result, some community or local government-adopted measures are proposed (FP-Gen). These precautions are intended to prevent heavy metal contamination, particularly in the river system and the aquatic life in the area.</w:t>
       </w:r>
@@ -20748,7 +21344,9 @@
       <w:r>
         <w:rPr>
           <w:rFonts w:ascii="Georgia" w:hAnsi="Georgia" w:eastAsia="Georgia" w:cs="Georgia"/>
-          <w:sz w:val="24"/>
+          <w:b w:val="0"/>
+          <w:sz w:val="22"/>
+          <w:szCs w:val="22"/>
         </w:rPr>
         <w:t>B11 · 256 words · 1 hedges · 0.39 per 100 words</w:t>
       </w:r>
@@ -20905,7 +21503,9 @@
       <w:r>
         <w:rPr>
           <w:rFonts w:ascii="Georgia" w:hAnsi="Georgia" w:eastAsia="Georgia" w:cs="Georgia"/>
-          <w:sz w:val="24"/>
+          <w:b w:val="0"/>
+          <w:sz w:val="22"/>
+          <w:szCs w:val="22"/>
         </w:rPr>
         <w:t>B12 · 149 words · 1 hedges · 0.67 per 100 words</w:t>
       </w:r>
@@ -21026,7 +21626,9 @@
       <w:r>
         <w:rPr>
           <w:rFonts w:ascii="Georgia" w:hAnsi="Georgia" w:eastAsia="Georgia" w:cs="Georgia"/>
-          <w:sz w:val="24"/>
+          <w:b w:val="0"/>
+          <w:sz w:val="22"/>
+          <w:szCs w:val="22"/>
         </w:rPr>
         <w:t>B13 · 148 words · 0 hedges · 0.0 per 100 words</w:t>
       </w:r>
@@ -21097,7 +21699,9 @@
       <w:r>
         <w:rPr>
           <w:rFonts w:ascii="Georgia" w:hAnsi="Georgia" w:eastAsia="Georgia" w:cs="Georgia"/>
-          <w:sz w:val="24"/>
+          <w:b w:val="0"/>
+          <w:sz w:val="22"/>
+          <w:szCs w:val="22"/>
         </w:rPr>
         <w:t>B14 · 242 words · 3 hedges · 1.24 per 100 words</w:t>
       </w:r>
@@ -21351,7 +21955,9 @@
       <w:r>
         <w:rPr>
           <w:rFonts w:ascii="Georgia" w:hAnsi="Georgia" w:eastAsia="Georgia" w:cs="Georgia"/>
-          <w:sz w:val="24"/>
+          <w:b w:val="0"/>
+          <w:sz w:val="22"/>
+          <w:szCs w:val="22"/>
         </w:rPr>
         <w:t>B15 · 131 words · 0 hedges · 0.0 per 100 words</w:t>
       </w:r>
@@ -21422,7 +22028,9 @@
       <w:r>
         <w:rPr>
           <w:rFonts w:ascii="Georgia" w:hAnsi="Georgia" w:eastAsia="Georgia" w:cs="Georgia"/>
-          <w:sz w:val="24"/>
+          <w:b w:val="0"/>
+          <w:sz w:val="22"/>
+          <w:szCs w:val="22"/>
         </w:rPr>
         <w:t>B16 · 223 words · 5 hedges · 2.24 per 100 words</w:t>
       </w:r>
@@ -21726,7 +22334,9 @@
       <w:r>
         <w:rPr>
           <w:rFonts w:ascii="Georgia" w:hAnsi="Georgia" w:eastAsia="Georgia" w:cs="Georgia"/>
-          <w:sz w:val="24"/>
+          <w:b w:val="0"/>
+          <w:sz w:val="22"/>
+          <w:szCs w:val="22"/>
         </w:rPr>
         <w:t>B17 · 243 words · 2 hedges · 0.82 per 100 words</w:t>
       </w:r>
@@ -21979,7 +22589,9 @@
       <w:r>
         <w:rPr>
           <w:rFonts w:ascii="Georgia" w:hAnsi="Georgia" w:eastAsia="Georgia" w:cs="Georgia"/>
-          <w:sz w:val="24"/>
+          <w:b w:val="0"/>
+          <w:sz w:val="22"/>
+          <w:szCs w:val="22"/>
         </w:rPr>
         <w:t>B18 · 286 words · 1 hedges · 0.35 per 100 words</w:t>
       </w:r>
@@ -22051,7 +22663,9 @@
       <w:r>
         <w:rPr>
           <w:rFonts w:ascii="Georgia" w:hAnsi="Georgia" w:eastAsia="Georgia" w:cs="Georgia"/>
-          <w:sz w:val="24"/>
+          <w:b w:val="0"/>
+          <w:sz w:val="22"/>
+          <w:szCs w:val="22"/>
         </w:rPr>
         <w:t>B19 · 290 words · 1 hedges · 0.34 per 100 words</w:t>
       </w:r>
@@ -22243,7 +22857,9 @@
       <w:r>
         <w:rPr>
           <w:rFonts w:ascii="Georgia" w:hAnsi="Georgia" w:eastAsia="Georgia" w:cs="Georgia"/>
-          <w:sz w:val="24"/>
+          <w:b w:val="0"/>
+          <w:sz w:val="22"/>
+          <w:szCs w:val="22"/>
         </w:rPr>
         <w:t>B20 · 223 words · 1 hedges · 0.45 per 100 words</w:t>
       </w:r>
@@ -22474,8 +23090,8 @@
           <w:rFonts w:ascii="Georgia" w:hAnsi="Georgia" w:cs="Georgia" w:eastAsia="Georgia"/>
           <w:i w:val="0"/>
           <w:iCs w:val="0"/>
-          <w:sz w:val="24"/>
-          <w:szCs w:val="24"/>
+          <w:sz w:val="22"/>
+          <w:szCs w:val="22"/>
           <w:rtl w:val="0"/>
           <w:b/>
           <w:bCs/>
@@ -22501,7 +23117,9 @@
       <w:r>
         <w:rPr>
           <w:rFonts w:ascii="Georgia" w:hAnsi="Georgia" w:eastAsia="Georgia" w:cs="Georgia"/>
-          <w:sz w:val="24"/>
+          <w:b w:val="0"/>
+          <w:sz w:val="22"/>
+          <w:szCs w:val="22"/>
         </w:rPr>
         <w:t>VM1 · 211 words · 0 hedges · 0.0 per 100 words</w:t>
       </w:r>
@@ -22561,7 +23179,9 @@
       <w:r>
         <w:rPr>
           <w:rFonts w:ascii="Georgia" w:hAnsi="Georgia" w:eastAsia="Georgia" w:cs="Georgia"/>
-          <w:sz w:val="24"/>
+          <w:b w:val="0"/>
+          <w:sz w:val="22"/>
+          <w:szCs w:val="22"/>
         </w:rPr>
         <w:t>VM2 · 358 words · 3 hedges · 0.84 per 100 words</w:t>
       </w:r>
@@ -22707,7 +23327,9 @@
       <w:r>
         <w:rPr>
           <w:rFonts w:ascii="Georgia" w:hAnsi="Georgia" w:eastAsia="Georgia" w:cs="Georgia"/>
-          <w:sz w:val="24"/>
+          <w:b w:val="0"/>
+          <w:sz w:val="22"/>
+          <w:szCs w:val="22"/>
         </w:rPr>
         <w:t>VM3 · 296 words · 0 hedges · 0.0 per 100 words</w:t>
       </w:r>
@@ -22803,7 +23425,9 @@
       <w:r>
         <w:rPr>
           <w:rFonts w:ascii="Georgia" w:hAnsi="Georgia" w:eastAsia="Georgia" w:cs="Georgia"/>
-          <w:sz w:val="24"/>
+          <w:b w:val="0"/>
+          <w:sz w:val="22"/>
+          <w:szCs w:val="22"/>
         </w:rPr>
         <w:t>VM4 · 250 words · 0 hedges · 0.0 per 100 words</w:t>
       </w:r>
@@ -22874,7 +23498,9 @@
       <w:r>
         <w:rPr>
           <w:rFonts w:ascii="Georgia" w:hAnsi="Georgia" w:eastAsia="Georgia" w:cs="Georgia"/>
-          <w:sz w:val="24"/>
+          <w:b w:val="0"/>
+          <w:sz w:val="22"/>
+          <w:szCs w:val="22"/>
         </w:rPr>
         <w:t>VM5 · 256 words · 1 hedges · 0.39 per 100 words</w:t>
       </w:r>
@@ -22982,7 +23608,9 @@
       <w:r>
         <w:rPr>
           <w:rFonts w:ascii="Georgia" w:hAnsi="Georgia" w:eastAsia="Georgia" w:cs="Georgia"/>
-          <w:sz w:val="24"/>
+          <w:b w:val="0"/>
+          <w:sz w:val="22"/>
+          <w:szCs w:val="22"/>
         </w:rPr>
         <w:t>VM6 · 278 words · 0 hedges · 0.0 per 100 words</w:t>
       </w:r>
@@ -23017,7 +23645,9 @@
       <w:r>
         <w:rPr>
           <w:rFonts w:ascii="Georgia" w:hAnsi="Georgia" w:eastAsia="Georgia" w:cs="Georgia"/>
-          <w:sz w:val="24"/>
+          <w:b w:val="0"/>
+          <w:sz w:val="22"/>
+          <w:szCs w:val="22"/>
         </w:rPr>
         <w:t>VM7 · 174 words · 1 hedges · 0.57 per 100 words</w:t>
       </w:r>
@@ -23185,7 +23815,9 @@
       <w:r>
         <w:rPr>
           <w:rFonts w:ascii="Georgia" w:hAnsi="Georgia" w:eastAsia="Georgia" w:cs="Georgia"/>
-          <w:sz w:val="24"/>
+          <w:b w:val="0"/>
+          <w:sz w:val="22"/>
+          <w:szCs w:val="22"/>
         </w:rPr>
         <w:t>VM8 · 253 words · 1 hedges · 0.4 per 100 words</w:t>
       </w:r>
@@ -23257,7 +23889,9 @@
       <w:r>
         <w:rPr>
           <w:rFonts w:ascii="Georgia" w:hAnsi="Georgia" w:eastAsia="Georgia" w:cs="Georgia"/>
-          <w:sz w:val="24"/>
+          <w:b w:val="0"/>
+          <w:sz w:val="22"/>
+          <w:szCs w:val="22"/>
         </w:rPr>
         <w:t>VM9 · 430 words · 1 hedges · 0.23 per 100 words</w:t>
       </w:r>
@@ -23389,7 +24023,9 @@
       <w:r>
         <w:rPr>
           <w:rFonts w:ascii="Georgia" w:hAnsi="Georgia" w:eastAsia="Georgia" w:cs="Georgia"/>
-          <w:sz w:val="24"/>
+          <w:b w:val="0"/>
+          <w:sz w:val="22"/>
+          <w:szCs w:val="22"/>
         </w:rPr>
         <w:t>VM10 · 277 words · 0 hedges · 0.0 per 100 words</w:t>
       </w:r>
@@ -23449,7 +24085,9 @@
       <w:r>
         <w:rPr>
           <w:rFonts w:ascii="Georgia" w:hAnsi="Georgia" w:eastAsia="Georgia" w:cs="Georgia"/>
-          <w:sz w:val="24"/>
+          <w:b w:val="0"/>
+          <w:sz w:val="22"/>
+          <w:szCs w:val="22"/>
         </w:rPr>
         <w:t>VM11 · 236 words · 0 hedges · 0.0 per 100 words</w:t>
       </w:r>
@@ -23520,7 +24158,9 @@
       <w:r>
         <w:rPr>
           <w:rFonts w:ascii="Georgia" w:hAnsi="Georgia" w:eastAsia="Georgia" w:cs="Georgia"/>
-          <w:sz w:val="24"/>
+          <w:b w:val="0"/>
+          <w:sz w:val="22"/>
+          <w:szCs w:val="22"/>
         </w:rPr>
         <w:t>VM12 · 182 words · 1 hedges · 0.55 per 100 words</w:t>
       </w:r>
@@ -23652,7 +24292,9 @@
       <w:r>
         <w:rPr>
           <w:rFonts w:ascii="Georgia" w:hAnsi="Georgia" w:eastAsia="Georgia" w:cs="Georgia"/>
-          <w:sz w:val="24"/>
+          <w:b w:val="0"/>
+          <w:sz w:val="22"/>
+          <w:szCs w:val="22"/>
         </w:rPr>
         <w:t>VM13 · 215 words · 0 hedges · 0.0 per 100 words</w:t>
       </w:r>
@@ -23687,7 +24329,9 @@
       <w:r>
         <w:rPr>
           <w:rFonts w:ascii="Georgia" w:hAnsi="Georgia" w:eastAsia="Georgia" w:cs="Georgia"/>
-          <w:sz w:val="24"/>
+          <w:b w:val="0"/>
+          <w:sz w:val="22"/>
+          <w:szCs w:val="22"/>
         </w:rPr>
         <w:t>VM14 · 183 words · 0 hedges · 0.0 per 100 words</w:t>
       </w:r>
@@ -23758,7 +24402,9 @@
       <w:r>
         <w:rPr>
           <w:rFonts w:ascii="Georgia" w:hAnsi="Georgia" w:eastAsia="Georgia" w:cs="Georgia"/>
-          <w:sz w:val="24"/>
+          <w:b w:val="0"/>
+          <w:sz w:val="22"/>
+          <w:szCs w:val="22"/>
         </w:rPr>
         <w:t>VM15 · 258 words · 1 hedges · 0.39 per 100 words</w:t>
       </w:r>
@@ -23866,7 +24512,9 @@
       <w:r>
         <w:rPr>
           <w:rFonts w:ascii="Georgia" w:hAnsi="Georgia" w:eastAsia="Georgia" w:cs="Georgia"/>
-          <w:sz w:val="24"/>
+          <w:b w:val="0"/>
+          <w:sz w:val="22"/>
+          <w:szCs w:val="22"/>
         </w:rPr>
         <w:t>VM16 · 261 words · 0 hedges · 0.0 per 100 words</w:t>
       </w:r>
@@ -23926,7 +24574,9 @@
       <w:r>
         <w:rPr>
           <w:rFonts w:ascii="Georgia" w:hAnsi="Georgia" w:eastAsia="Georgia" w:cs="Georgia"/>
-          <w:sz w:val="24"/>
+          <w:b w:val="0"/>
+          <w:sz w:val="22"/>
+          <w:szCs w:val="22"/>
         </w:rPr>
         <w:t>VM17 · 232 words · 1 hedges · 0.43 per 100 words</w:t>
       </w:r>
@@ -23998,7 +24648,9 @@
       <w:r>
         <w:rPr>
           <w:rFonts w:ascii="Georgia" w:hAnsi="Georgia" w:eastAsia="Georgia" w:cs="Georgia"/>
-          <w:sz w:val="24"/>
+          <w:b w:val="0"/>
+          <w:sz w:val="22"/>
+          <w:szCs w:val="22"/>
         </w:rPr>
         <w:t>VM18 · 267 words · 0 hedges · 0.0 per 100 words</w:t>
       </w:r>
@@ -24069,7 +24721,9 @@
       <w:r>
         <w:rPr>
           <w:rFonts w:ascii="Georgia" w:hAnsi="Georgia" w:eastAsia="Georgia" w:cs="Georgia"/>
-          <w:sz w:val="24"/>
+          <w:b w:val="0"/>
+          <w:sz w:val="22"/>
+          <w:szCs w:val="22"/>
         </w:rPr>
         <w:t>VM19 · 172 words · 0 hedges · 0.0 per 100 words</w:t>
       </w:r>
@@ -24104,7 +24758,9 @@
       <w:r>
         <w:rPr>
           <w:rFonts w:ascii="Georgia" w:hAnsi="Georgia" w:eastAsia="Georgia" w:cs="Georgia"/>
-          <w:sz w:val="24"/>
+          <w:b w:val="0"/>
+          <w:sz w:val="22"/>
+          <w:szCs w:val="22"/>
         </w:rPr>
         <w:t>VM20 · 271 words · 0 hedges · 0.0 per 100 words</w:t>
       </w:r>
@@ -24178,8 +24834,8 @@
           <w:rFonts w:ascii="Georgia" w:hAnsi="Georgia" w:cs="Georgia" w:eastAsia="Georgia"/>
           <w:i w:val="0"/>
           <w:iCs w:val="0"/>
-          <w:sz w:val="24"/>
-          <w:szCs w:val="24"/>
+          <w:sz w:val="22"/>
+          <w:szCs w:val="22"/>
           <w:rtl w:val="0"/>
           <w:b/>
           <w:bCs/>
@@ -24205,7 +24861,9 @@
       <w:r>
         <w:rPr>
           <w:rFonts w:ascii="Georgia" w:hAnsi="Georgia" w:eastAsia="Georgia" w:cs="Georgia"/>
-          <w:sz w:val="24"/>
+          <w:b w:val="0"/>
+          <w:sz w:val="22"/>
+          <w:szCs w:val="22"/>
         </w:rPr>
         <w:t>Acs1 · 203 words · 1 hedges · 0.49 per 100 words</w:t>
       </w:r>
@@ -24313,7 +24971,9 @@
       <w:r>
         <w:rPr>
           <w:rFonts w:ascii="Georgia" w:hAnsi="Georgia" w:eastAsia="Georgia" w:cs="Georgia"/>
-          <w:sz w:val="24"/>
+          <w:b w:val="0"/>
+          <w:sz w:val="22"/>
+          <w:szCs w:val="22"/>
         </w:rPr>
         <w:t>Acs2 · 184 words · 8 hedges · 4.35 per 100 words</w:t>
       </w:r>
@@ -24680,7 +25340,9 @@
       <w:r>
         <w:rPr>
           <w:rFonts w:ascii="Georgia" w:hAnsi="Georgia" w:eastAsia="Georgia" w:cs="Georgia"/>
-          <w:sz w:val="24"/>
+          <w:b w:val="0"/>
+          <w:sz w:val="22"/>
+          <w:szCs w:val="22"/>
         </w:rPr>
         <w:t>Acs3 · 235 words · 2 hedges · 0.85 per 100 words</w:t>
       </w:r>
@@ -24849,7 +25511,9 @@
       <w:r>
         <w:rPr>
           <w:rFonts w:ascii="Georgia" w:hAnsi="Georgia" w:eastAsia="Georgia" w:cs="Georgia"/>
-          <w:sz w:val="24"/>
+          <w:b w:val="0"/>
+          <w:sz w:val="22"/>
+          <w:szCs w:val="22"/>
         </w:rPr>
         <w:t>Acs4 · 221 words · 0 hedges · 0.0 per 100 words</w:t>
       </w:r>
@@ -24944,7 +25608,9 @@
       <w:r>
         <w:rPr>
           <w:rFonts w:ascii="Georgia" w:hAnsi="Georgia" w:eastAsia="Georgia" w:cs="Georgia"/>
-          <w:sz w:val="24"/>
+          <w:b w:val="0"/>
+          <w:sz w:val="22"/>
+          <w:szCs w:val="22"/>
         </w:rPr>
         <w:t>Acs5 · 199 words · 2 hedges · 1.01 per 100 words</w:t>
       </w:r>
@@ -25053,7 +25719,9 @@
       <w:r>
         <w:rPr>
           <w:rFonts w:ascii="Georgia" w:hAnsi="Georgia" w:eastAsia="Georgia" w:cs="Georgia"/>
-          <w:sz w:val="24"/>
+          <w:b w:val="0"/>
+          <w:sz w:val="22"/>
+          <w:szCs w:val="22"/>
         </w:rPr>
         <w:t>Acs6 · 245 words · 1 hedges · 0.41 per 100 words</w:t>
       </w:r>
@@ -25185,7 +25853,9 @@
       <w:r>
         <w:rPr>
           <w:rFonts w:ascii="Georgia" w:hAnsi="Georgia" w:eastAsia="Georgia" w:cs="Georgia"/>
-          <w:sz w:val="24"/>
+          <w:b w:val="0"/>
+          <w:sz w:val="22"/>
+          <w:szCs w:val="22"/>
         </w:rPr>
         <w:t>Acs7 · 207 words · 1 hedges · 0.48 per 100 words</w:t>
       </w:r>
@@ -25257,7 +25927,9 @@
       <w:r>
         <w:rPr>
           <w:rFonts w:ascii="Georgia" w:hAnsi="Georgia" w:eastAsia="Georgia" w:cs="Georgia"/>
-          <w:sz w:val="24"/>
+          <w:b w:val="0"/>
+          <w:sz w:val="22"/>
+          <w:szCs w:val="22"/>
         </w:rPr>
         <w:t>Acs8 · 164 words · 0 hedges · 0.0 per 100 words</w:t>
       </w:r>
@@ -25272,7 +25944,9 @@
       <w:r>
         <w:rPr>
           <w:rFonts w:ascii="Georgia" w:hAnsi="Georgia" w:eastAsia="Georgia" w:cs="Georgia"/>
-          <w:sz w:val="24"/>
+          <w:b w:val="0"/>
+          <w:sz w:val="22"/>
+          <w:szCs w:val="22"/>
         </w:rPr>
         <w:t>The study on the performance of eggplant applied with different methods of Kuhol Amino Acid Application was conducted at [REDACTED], from December 2024 to March 2024. The Mucho F1 eggplant variety was used as an experimental crop in the study. The experiment was laid out following Randomized Complete Block Design (RCBD) with three replications and four treatments, namely: T1 – Negative Control T2 – Foliar Application of Kuhol Amino Acid; T3 – Drenching Application of Kuhol Amino Acid; T4 – Inorganic Fertilizer (RR). Based on the results, there was no significant difference among the different methods of kuhol amino acid app in terms of plant height, weight of marketable and weight of non-marketable fruit, number of marketable and non-marketable fruits, and computed yield. Different methods of kuhol amino acid application influenced [G] the plant height, weight of fruits, number of marketable and non-marketable fruits, and computed yield. The researcher recommends (FP-Rec) foliar and drenching application of kuhol amino acid. because, numerically, it consistently produced the highest yield performance.</w:t>
       </w:r>
@@ -25288,7 +25962,9 @@
       <w:r>
         <w:rPr>
           <w:rFonts w:ascii="Georgia" w:hAnsi="Georgia" w:eastAsia="Georgia" w:cs="Georgia"/>
-          <w:sz w:val="24"/>
+          <w:b w:val="0"/>
+          <w:sz w:val="22"/>
+          <w:szCs w:val="22"/>
         </w:rPr>
         <w:t>Acs9 · 170 words · 2 hedges · 1.18 per 100 words</w:t>
       </w:r>
@@ -25397,7 +26073,9 @@
       <w:r>
         <w:rPr>
           <w:rFonts w:ascii="Georgia" w:hAnsi="Georgia" w:eastAsia="Georgia" w:cs="Georgia"/>
-          <w:sz w:val="24"/>
+          <w:b w:val="0"/>
+          <w:sz w:val="22"/>
+          <w:szCs w:val="22"/>
         </w:rPr>
         <w:t>Acs10 · 246 words · 0 hedges · 0.0 per 100 words</w:t>
       </w:r>
@@ -25484,8 +26162,8 @@
           <w:rFonts w:ascii="Georgia" w:hAnsi="Georgia" w:cs="Georgia" w:eastAsia="Georgia"/>
           <w:i w:val="0"/>
           <w:iCs w:val="0"/>
-          <w:sz w:val="24"/>
-          <w:szCs w:val="24"/>
+          <w:sz w:val="22"/>
+          <w:szCs w:val="22"/>
           <w:rtl w:val="0"/>
           <w:b/>
           <w:bCs/>
@@ -25511,7 +26189,9 @@
       <w:r>
         <w:rPr>
           <w:rFonts w:ascii="Georgia" w:hAnsi="Georgia" w:eastAsia="Georgia" w:cs="Georgia"/>
-          <w:sz w:val="24"/>
+          <w:b w:val="0"/>
+          <w:sz w:val="22"/>
+          <w:szCs w:val="22"/>
         </w:rPr>
         <w:t>Aas1 · 203 words · 0 hedges · 0.0 per 100 words</w:t>
       </w:r>
@@ -25571,7 +26251,9 @@
       <w:r>
         <w:rPr>
           <w:rFonts w:ascii="Georgia" w:hAnsi="Georgia" w:eastAsia="Georgia" w:cs="Georgia"/>
-          <w:sz w:val="24"/>
+          <w:b w:val="0"/>
+          <w:sz w:val="22"/>
+          <w:szCs w:val="22"/>
         </w:rPr>
         <w:t>Aas2 · 182 words · 0 hedges · 0.0 per 100 words</w:t>
       </w:r>
@@ -25656,7 +26338,9 @@
       <w:r>
         <w:rPr>
           <w:rFonts w:ascii="Georgia" w:hAnsi="Georgia" w:eastAsia="Georgia" w:cs="Georgia"/>
-          <w:sz w:val="24"/>
+          <w:b w:val="0"/>
+          <w:sz w:val="22"/>
+          <w:szCs w:val="22"/>
         </w:rPr>
         <w:t>Aas3 · 296 words · 2 hedges · 0.68 per 100 words</w:t>
       </w:r>
@@ -25825,7 +26509,9 @@
       <w:r>
         <w:rPr>
           <w:rFonts w:ascii="Georgia" w:hAnsi="Georgia" w:eastAsia="Georgia" w:cs="Georgia"/>
-          <w:sz w:val="24"/>
+          <w:b w:val="0"/>
+          <w:sz w:val="22"/>
+          <w:szCs w:val="22"/>
         </w:rPr>
         <w:t>Aas4 · 161 words · 1 hedges · 0.62 per 100 words</w:t>
       </w:r>
@@ -25897,7 +26583,9 @@
       <w:r>
         <w:rPr>
           <w:rFonts w:ascii="Georgia" w:hAnsi="Georgia" w:eastAsia="Georgia" w:cs="Georgia"/>
-          <w:sz w:val="24"/>
+          <w:b w:val="0"/>
+          <w:sz w:val="22"/>
+          <w:szCs w:val="22"/>
         </w:rPr>
         <w:t>Aas5 · 316 words · 2 hedges · 0.63 per 100 words</w:t>
       </w:r>
@@ -26042,7 +26730,9 @@
       <w:r>
         <w:rPr>
           <w:rFonts w:ascii="Georgia" w:hAnsi="Georgia" w:eastAsia="Georgia" w:cs="Georgia"/>
-          <w:sz w:val="24"/>
+          <w:b w:val="0"/>
+          <w:sz w:val="22"/>
+          <w:szCs w:val="22"/>
         </w:rPr>
         <w:t>Aas6 · 209 words · 0 hedges · 0.0 per 100 words</w:t>
       </w:r>
@@ -26102,7 +26792,9 @@
       <w:r>
         <w:rPr>
           <w:rFonts w:ascii="Georgia" w:hAnsi="Georgia" w:eastAsia="Georgia" w:cs="Georgia"/>
-          <w:sz w:val="24"/>
+          <w:b w:val="0"/>
+          <w:sz w:val="22"/>
+          <w:szCs w:val="22"/>
         </w:rPr>
         <w:t>Aas7 · 202 words · 3 hedges · 1.49 per 100 words</w:t>
       </w:r>
@@ -26272,7 +26964,9 @@
       <w:r>
         <w:rPr>
           <w:rFonts w:ascii="Georgia" w:hAnsi="Georgia" w:eastAsia="Georgia" w:cs="Georgia"/>
-          <w:sz w:val="24"/>
+          <w:b w:val="0"/>
+          <w:sz w:val="22"/>
+          <w:szCs w:val="22"/>
         </w:rPr>
         <w:t>Aas8 · 186 words · 0 hedges · 0.0 per 100 words</w:t>
       </w:r>
@@ -26415,7 +27109,9 @@
       <w:r>
         <w:rPr>
           <w:rFonts w:ascii="Georgia" w:hAnsi="Georgia" w:eastAsia="Georgia" w:cs="Georgia"/>
-          <w:sz w:val="24"/>
+          <w:b w:val="0"/>
+          <w:sz w:val="22"/>
+          <w:szCs w:val="22"/>
         </w:rPr>
         <w:t>Aas9 · 188 words · 0 hedges · 0.0 per 100 words</w:t>
       </w:r>
@@ -26510,7 +27206,9 @@
       <w:r>
         <w:rPr>
           <w:rFonts w:ascii="Georgia" w:hAnsi="Georgia" w:eastAsia="Georgia" w:cs="Georgia"/>
-          <w:sz w:val="24"/>
+          <w:b w:val="0"/>
+          <w:sz w:val="22"/>
+          <w:szCs w:val="22"/>
         </w:rPr>
         <w:t>Aas10 · 283 words · 2 hedges · 0.71 per 100 words</w:t>
       </w:r>

</xml_diff>

<commit_message>
Draft_104: concise Full Codebook (drop restatement, keep rules and tables)
</commit_message>
<xml_diff>
--- a/thesis/003_ThesisProposal_Draft_104.docx
+++ b/thesis/003_ThesisProposal_Draft_104.docx
@@ -12952,475 +12952,333 @@
     <w:p>
       <w:pPr>
         <w:keepNext/>
-        <w:spacing w:before="240" w:after="0" w:line="480" w:lineRule="auto"/>
+        <w:spacing w:before="200" w:after="40" w:line="276" w:lineRule="auto"/>
+        <w:ind w:firstLine="0"/>
         <w:jc w:val="left"/>
-      </w:pPr>
-      <w:r>
-        <w:rPr>
-          <w:rFonts w:ascii="Georgia" w:hAnsi="Georgia" w:cs="Georgia" w:eastAsia="Georgia"/>
-          <w:b/>
-          <w:bCs w:val="1"/>
-          <w:sz w:val="22"/>
-          <w:szCs w:val="22"/>
-          <w:rtl w:val="0"/>
-        </w:rPr>
-        <w:t>PURPOSE</w:t>
-      </w:r>
-      <w:r>
-        <w:rPr>
-          <w:rFonts w:ascii="Georgia" w:hAnsi="Georgia" w:cs="Georgia" w:eastAsia="Georgia"/>
-          <w:rtl w:val="0"/>
-          <w:sz w:val="24"/>
-          <w:szCs w:val="24"/>
-          <w:b/>
-        </w:rPr>
-      </w:r>
-    </w:p>
-    <w:p>
-      <w:pPr>
-        <w:spacing w:before="0" w:after="0" w:line="276" w:lineRule="auto"/>
-        <w:ind w:firstLine="0"/>
-        <w:jc w:val="both"/>
       </w:pPr>
       <w:r>
         <w:rPr>
           <w:rFonts w:ascii="Georgia" w:hAnsi="Georgia" w:eastAsia="Georgia" w:cs="Georgia"/>
           <w:b/>
           <w:sz w:val="22"/>
-          <w:szCs w:val="22"/>
-        </w:rPr>
-        <w:t xml:space="preserve">• Coding scheme for the PSAU undergraduate thesis abstract corpus, adapted from Hyland (1998) as type instrument. </w:t>
-      </w:r>
-      <w:r>
-        <w:rPr>
-          <w:rFonts w:ascii="Georgia" w:hAnsi="Georgia" w:eastAsia="Georgia" w:cs="Georgia"/>
-          <w:b w:val="0"/>
-          <w:sz w:val="22"/>
-          <w:szCs w:val="22"/>
-        </w:rPr>
-      </w:r>
-    </w:p>
-    <w:p>
-      <w:pPr>
-        <w:keepNext/>
-        <w:spacing w:before="240" w:after="0" w:line="480" w:lineRule="auto"/>
+        </w:rPr>
+        <w:t>PURPOSE</w:t>
+      </w:r>
+    </w:p>
+    <w:p>
+      <w:pPr>
+        <w:spacing w:before="0" w:after="40" w:line="276" w:lineRule="auto"/>
+        <w:ind w:firstLine="0"/>
         <w:jc w:val="left"/>
-      </w:pPr>
-      <w:r>
-        <w:rPr>
-          <w:rFonts w:ascii="Georgia" w:hAnsi="Georgia" w:cs="Georgia" w:eastAsia="Georgia"/>
-          <w:sz w:val="22"/>
-          <w:szCs w:val="22"/>
-          <w:rtl w:val="0"/>
-          <w:b/>
-          <w:bCs w:val="0"/>
-        </w:rPr>
-        <w:t>STEP 1, STEP 2, STEP 3, AND WORKING TEST</w:t>
-      </w:r>
-      <w:r>
-        <w:rPr>
-          <w:rFonts w:ascii="Georgia" w:hAnsi="Georgia" w:cs="Georgia" w:eastAsia="Georgia"/>
-          <w:rtl w:val="0"/>
-          <w:sz w:val="24"/>
-          <w:szCs w:val="24"/>
-          <w:b/>
-        </w:rPr>
-      </w:r>
-    </w:p>
-    <w:p>
-      <w:pPr>
-        <w:spacing w:before="0" w:after="0" w:line="276" w:lineRule="auto"/>
-        <w:ind w:firstLine="0"/>
-        <w:jc w:val="both"/>
       </w:pPr>
       <w:r>
         <w:rPr>
           <w:rFonts w:ascii="Georgia" w:hAnsi="Georgia" w:eastAsia="Georgia" w:cs="Georgia"/>
           <w:b/>
           <w:sz w:val="22"/>
-          <w:szCs w:val="22"/>
-        </w:rPr>
-        <w:t xml:space="preserve">• Step 1 (wide net). </w:t>
+        </w:rPr>
+        <w:t xml:space="preserve">• Purpose. </w:t>
       </w:r>
       <w:r>
         <w:rPr>
           <w:rFonts w:ascii="Georgia" w:hAnsi="Georgia" w:eastAsia="Georgia" w:cs="Georgia"/>
           <w:b w:val="0"/>
           <w:sz w:val="22"/>
-          <w:szCs w:val="22"/>
-        </w:rPr>
-        <w:t>After the holistic read, mark all possible hedge candidates. This step does not count retained hedges.</w:t>
-      </w:r>
-    </w:p>
-    <w:p>
-      <w:pPr>
-        <w:spacing w:before="0" w:after="0" w:line="480" w:lineRule="auto"/>
+        </w:rPr>
+        <w:t>Coding scheme for the PSAU undergraduate thesis abstract corpus, adapted from Hyland (1998) for type.</w:t>
+      </w:r>
+    </w:p>
+    <w:p>
+      <w:pPr>
+        <w:keepNext/>
+        <w:spacing w:before="200" w:after="40" w:line="276" w:lineRule="auto"/>
         <w:ind w:firstLine="0"/>
-        <w:jc w:val="both"/>
+        <w:jc w:val="left"/>
       </w:pPr>
       <w:r>
         <w:rPr>
           <w:rFonts w:ascii="Georgia" w:hAnsi="Georgia" w:eastAsia="Georgia" w:cs="Georgia"/>
           <w:b/>
           <w:sz w:val="22"/>
-          <w:szCs w:val="22"/>
-        </w:rPr>
-        <w:t xml:space="preserve">• Step 2 (function by paired removal checks). </w:t>
-      </w:r>
-      <w:r>
-        <w:rPr>
-          <w:rFonts w:ascii="Georgia" w:hAnsi="Georgia" w:eastAsia="Georgia" w:cs="Georgia"/>
-          <w:b w:val="0"/>
-          <w:sz w:val="22"/>
-          <w:szCs w:val="22"/>
-        </w:rPr>
-        <w:t>Claim condition (both tests): a device can only be a hedge if it attaches to a claim. A claim is a statement about data, the world, or prior work that evidence could show to be wrong. Aims, directives, and routine procedure are excluded by kind, not by loose truth-evaluability. If the clause is not a claim, log the token as FP (with a reason code when useful: FP-Rec, FP-Gen, FP-Proc, or FP-Cap). Working Test: remove the device. Does the writer’s commitment to the claim’s truth go up? If yes → EC. Reader Test: remove the device. Does commitment to the truth stay the same, but the claim now reaches the reader more bluntly, or the writer takes sole ownership of it against prior work? If yes → P. Neither → FP. Both may hold on one token (EC+P). There is no required category pre-filter before these checks. Category codes label residual rejects after the claim condition or both tests fail.</w:t>
-      </w:r>
-    </w:p>
-    <w:p>
-      <w:pPr>
-        <w:spacing w:before="0" w:after="0" w:line="480" w:lineRule="auto"/>
+        </w:rPr>
+        <w:t>STEPS 1-3</w:t>
+      </w:r>
+    </w:p>
+    <w:p>
+      <w:pPr>
+        <w:spacing w:before="0" w:after="40" w:line="276" w:lineRule="auto"/>
         <w:ind w:firstLine="0"/>
-        <w:jc w:val="both"/>
+        <w:jc w:val="left"/>
       </w:pPr>
       <w:r>
         <w:rPr>
           <w:rFonts w:ascii="Georgia" w:hAnsi="Georgia" w:eastAsia="Georgia" w:cs="Georgia"/>
           <w:b/>
           <w:sz w:val="22"/>
-          <w:szCs w:val="22"/>
-        </w:rPr>
-        <w:t xml:space="preserve">• Working Test and Reader Test are the Step 2 function gate, after the claim condition. </w:t>
+        </w:rPr>
+        <w:t xml:space="preserve">• Step 1. </w:t>
       </w:r>
       <w:r>
         <w:rPr>
           <w:rFonts w:ascii="Georgia" w:hAnsi="Georgia" w:eastAsia="Georgia" w:cs="Georgia"/>
           <w:b w:val="0"/>
           <w:sz w:val="22"/>
-          <w:szCs w:val="22"/>
-        </w:rPr>
-        <w:t>Every Step 1 candidate can be run through the claim condition and the two removal checks. Directives, aim statements, and procedural norms fail the claim condition and are logged FP without needing a prior sort. Category codes (FP-Rec, FP-Cap, FP-Proc, FP-Gen) explain the residual inventory. They do not replace the tests.</w:t>
-      </w:r>
-    </w:p>
-    <w:p>
-      <w:pPr>
-        <w:spacing w:before="0" w:after="0" w:line="276" w:lineRule="auto"/>
+        </w:rPr>
+        <w:t>After a full read, mark all possible hedge candidates (wide net). Do not count retained hedges yet.</w:t>
+      </w:r>
+    </w:p>
+    <w:p>
+      <w:pPr>
+        <w:spacing w:before="0" w:after="40" w:line="276" w:lineRule="auto"/>
         <w:ind w:firstLine="0"/>
-        <w:jc w:val="both"/>
+        <w:jc w:val="left"/>
       </w:pPr>
       <w:r>
         <w:rPr>
           <w:rFonts w:ascii="Georgia" w:hAnsi="Georgia" w:eastAsia="Georgia" w:cs="Georgia"/>
           <w:b/>
           <w:sz w:val="22"/>
-          <w:szCs w:val="22"/>
-        </w:rPr>
-        <w:t xml:space="preserve">• Step 3 (type). </w:t>
+        </w:rPr>
+        <w:t xml:space="preserve">• Step 2. </w:t>
       </w:r>
       <w:r>
         <w:rPr>
           <w:rFonts w:ascii="Georgia" w:hAnsi="Georgia" w:eastAsia="Georgia" w:cs="Georgia"/>
           <w:b w:val="0"/>
           <w:sz w:val="22"/>
-          <w:szCs w:val="22"/>
-        </w:rPr>
-        <w:t>On retained P and EC tokens only, assign grammatical type (modal, lexical, adverbial, clause-level).</w:t>
-      </w:r>
-    </w:p>
-    <w:p>
-      <w:pPr>
-        <w:spacing w:before="0" w:after="0" w:line="480" w:lineRule="auto"/>
+        </w:rPr>
+        <w:t>Claim condition: the device must attach to a claim (a statement about data, the world, or prior work that evidence could show to be wrong). Aims, directives, and routine procedure are excluded by kind. If not a claim, log FP with a reason code. Working Test: remove the device. If commitment to the claim’s truth rises → EC. Reader Test: remove the device. If truth commitment stays the same but the claim is blunter to the reader or the writer takes sole ownership against prior work → P. Neither → FP. Both may hold (EC+P).</w:t>
+      </w:r>
+    </w:p>
+    <w:p>
+      <w:pPr>
+        <w:spacing w:before="0" w:after="40" w:line="276" w:lineRule="auto"/>
         <w:ind w:firstLine="0"/>
-        <w:jc w:val="both"/>
+        <w:jc w:val="left"/>
       </w:pPr>
       <w:r>
         <w:rPr>
           <w:rFonts w:ascii="Georgia" w:hAnsi="Georgia" w:eastAsia="Georgia" w:cs="Georgia"/>
           <w:b/>
           <w:sz w:val="22"/>
-          <w:szCs w:val="22"/>
-        </w:rPr>
-        <w:t xml:space="preserve">• Order. </w:t>
+        </w:rPr>
+        <w:t xml:space="preserve">• Step 3. </w:t>
       </w:r>
       <w:r>
         <w:rPr>
           <w:rFonts w:ascii="Georgia" w:hAnsi="Georgia" w:eastAsia="Georgia" w:cs="Georgia"/>
           <w:b w:val="0"/>
           <w:sz w:val="22"/>
-          <w:szCs w:val="22"/>
-        </w:rPr>
-        <w:t>Coding order: full abstract → Step 1 (wide net) → Step 2 (claim condition, then Working Test and Reader Test) → reason codes on rejects → Step 3 type on retained P and EC → Coder Notes. No mandatory category pre-filter before Step 2.</w:t>
-      </w:r>
-    </w:p>
-    <w:p>
-      <w:pPr>
-        <w:keepNext/>
-        <w:spacing w:before="240" w:after="0"/>
+        </w:rPr>
+        <w:t>On retained EC and P tokens only, assign type (modal, lexical, adverbial, clause-level).</w:t>
+      </w:r>
+    </w:p>
+    <w:p>
+      <w:pPr>
+        <w:spacing w:before="0" w:after="40" w:line="276" w:lineRule="auto"/>
+        <w:ind w:firstLine="0"/>
         <w:jc w:val="left"/>
-      </w:pPr>
-      <w:r>
-        <w:rPr>
-          <w:b/>
-          <w:sz w:val="22"/>
-          <w:szCs w:val="22"/>
-          <w:rFonts w:ascii="Georgia" w:hAnsi="Georgia" w:eastAsia="Georgia" w:cs="Georgia"/>
-        </w:rPr>
-        <w:t xml:space="preserve">WORKING EXAMPLES: STEP 2 (WORKING TEST + READER TEST) AND STEP 3 TYPE</w:t>
-      </w:r>
-    </w:p>
-    <w:p>
-      <w:pPr>
-        <w:spacing w:before="0" w:after="0" w:line="480" w:lineRule="auto"/>
-        <w:ind w:firstLine="0"/>
-        <w:jc w:val="both"/>
       </w:pPr>
       <w:r>
         <w:rPr>
           <w:rFonts w:ascii="Georgia" w:hAnsi="Georgia" w:eastAsia="Georgia" w:cs="Georgia"/>
           <w:b/>
           <w:sz w:val="22"/>
-          <w:szCs w:val="22"/>
-        </w:rPr>
-        <w:t xml:space="preserve">• Function labels apply to retained hedges after Step 2. </w:t>
+        </w:rPr>
+        <w:t xml:space="preserve">• Order. </w:t>
       </w:r>
       <w:r>
         <w:rPr>
           <w:rFonts w:ascii="Georgia" w:hAnsi="Georgia" w:eastAsia="Georgia" w:cs="Georgia"/>
           <w:b w:val="0"/>
           <w:sz w:val="22"/>
-          <w:szCs w:val="22"/>
-        </w:rPr>
-        <w:t>Only claim-attached devices can be EC or P. Working Test supports EC when commitment to the claim’s truth rises after removal. Reader Test supports P when truth commitment stays the same but the claim is blunter to the reader or the writer takes sole ownership against prior work.</w:t>
-      </w:r>
-    </w:p>
-    <w:p>
-      <w:pPr>
-        <w:spacing w:before="0" w:after="0" w:line="276" w:lineRule="auto"/>
+        </w:rPr>
+        <w:t>Full abstract → Step 1 → Step 2 (claim condition, then Working Test and Reader Test) → reason codes on rejects → Step 3 type → Coder Notes.</w:t>
+      </w:r>
+    </w:p>
+    <w:p>
+      <w:pPr>
+        <w:keepNext/>
+        <w:spacing w:before="200" w:after="40" w:line="276" w:lineRule="auto"/>
         <w:ind w:firstLine="0"/>
-        <w:jc w:val="both"/>
+        <w:jc w:val="left"/>
       </w:pPr>
       <w:r>
         <w:rPr>
           <w:rFonts w:ascii="Georgia" w:hAnsi="Georgia" w:eastAsia="Georgia" w:cs="Georgia"/>
           <w:b/>
           <w:sz w:val="22"/>
-          <w:szCs w:val="22"/>
-        </w:rPr>
-        <w:t xml:space="preserve">• EC (Working Test): </w:t>
-      </w:r>
-      <w:r>
-        <w:rPr>
-          <w:rFonts w:ascii="Georgia" w:hAnsi="Georgia" w:eastAsia="Georgia" w:cs="Georgia"/>
-          <w:b w:val="0"/>
-          <w:sz w:val="22"/>
-          <w:szCs w:val="22"/>
-        </w:rPr>
-        <w:t>“The treatment may reduce infection rates.” Host clause is a claim about data or the world. Removing may raises commitment to the claim’s truth → EC.</w:t>
-      </w:r>
-    </w:p>
-    <w:p>
-      <w:pPr>
-        <w:spacing w:before="0" w:after="0" w:line="276" w:lineRule="auto"/>
+        </w:rPr>
+        <w:t>WORKING EXAMPLES</w:t>
+      </w:r>
+    </w:p>
+    <w:p>
+      <w:pPr>
+        <w:spacing w:before="0" w:after="40" w:line="276" w:lineRule="auto"/>
         <w:ind w:firstLine="0"/>
-        <w:jc w:val="both"/>
+        <w:jc w:val="left"/>
       </w:pPr>
       <w:r>
         <w:rPr>
           <w:rFonts w:ascii="Georgia" w:hAnsi="Georgia" w:eastAsia="Georgia" w:cs="Georgia"/>
           <w:b/>
           <w:sz w:val="22"/>
-          <w:szCs w:val="22"/>
-        </w:rPr>
-        <w:t xml:space="preserve">• FP-Cap: </w:t>
+        </w:rPr>
+        <w:t xml:space="preserve">• EC: </w:t>
       </w:r>
       <w:r>
         <w:rPr>
           <w:rFonts w:ascii="Georgia" w:hAnsi="Georgia" w:eastAsia="Georgia" w:cs="Georgia"/>
           <w:b w:val="0"/>
           <w:sz w:val="22"/>
-          <w:szCs w:val="22"/>
-        </w:rPr>
-        <w:t>“PCR can detect low concentrations.” can = capability, not uncertainty about a finding.</w:t>
-      </w:r>
-    </w:p>
-    <w:p>
-      <w:pPr>
-        <w:spacing w:before="0" w:after="0" w:line="480" w:lineRule="auto"/>
+        </w:rPr>
+        <w:t>“The treatment may reduce infection rates.” Removing may raises truth commitment → EC.</w:t>
+      </w:r>
+    </w:p>
+    <w:p>
+      <w:pPr>
+        <w:spacing w:before="0" w:after="40" w:line="276" w:lineRule="auto"/>
         <w:ind w:firstLine="0"/>
-        <w:jc w:val="both"/>
+        <w:jc w:val="left"/>
       </w:pPr>
       <w:r>
         <w:rPr>
           <w:rFonts w:ascii="Georgia" w:hAnsi="Georgia" w:eastAsia="Georgia" w:cs="Georgia"/>
           <w:b/>
           <w:sz w:val="22"/>
-          <w:szCs w:val="22"/>
-        </w:rPr>
-        <w:t xml:space="preserve">• P (Reader Test): </w:t>
+        </w:rPr>
+        <w:t xml:space="preserve">• FP-Cap: </w:t>
       </w:r>
       <w:r>
         <w:rPr>
           <w:rFonts w:ascii="Georgia" w:hAnsi="Georgia" w:eastAsia="Georgia" w:cs="Georgia"/>
           <w:b w:val="0"/>
           <w:sz w:val="22"/>
-          <w:szCs w:val="22"/>
-        </w:rPr>
-        <w:t>“As suggested by previous researchers, the treatment is effective.” Host clause is a claim. Removing the attribution leaves truth commitment the same but the writer takes sole ownership against prior work → P. By contrast, “Farmers should adopt the treatment” is a directive (excluded by kind) → FP-Rec.</w:t>
-      </w:r>
-    </w:p>
-    <w:p>
-      <w:pPr>
-        <w:spacing w:before="0" w:after="0" w:line="276" w:lineRule="auto"/>
+        </w:rPr>
+        <w:t>“PCR can detect low concentrations.” can = capability, not uncertainty.</w:t>
+      </w:r>
+    </w:p>
+    <w:p>
+      <w:pPr>
+        <w:spacing w:before="0" w:after="40" w:line="276" w:lineRule="auto"/>
         <w:ind w:firstLine="0"/>
-        <w:jc w:val="both"/>
+        <w:jc w:val="left"/>
       </w:pPr>
       <w:r>
         <w:rPr>
           <w:rFonts w:ascii="Georgia" w:hAnsi="Georgia" w:eastAsia="Georgia" w:cs="Georgia"/>
           <w:b/>
           <w:sz w:val="22"/>
-          <w:szCs w:val="22"/>
-        </w:rPr>
-        <w:t xml:space="preserve">• P + EC: </w:t>
+        </w:rPr>
+        <w:t xml:space="preserve">• P: </w:t>
       </w:r>
       <w:r>
         <w:rPr>
           <w:rFonts w:ascii="Georgia" w:hAnsi="Georgia" w:eastAsia="Georgia" w:cs="Georgia"/>
           <w:b w:val="0"/>
           <w:sz w:val="22"/>
-          <w:szCs w:val="22"/>
-        </w:rPr>
-        <w:t>Both Working Test and Reader Test hold on one token → EC+P (or dominant label plus dual note in Coder Notes).</w:t>
-      </w:r>
-    </w:p>
-    <w:p>
-      <w:pPr>
-        <w:spacing w:before="0" w:after="0" w:line="276" w:lineRule="auto"/>
+        </w:rPr>
+        <w:t>“As suggested by previous researchers, the treatment is effective.” Removing the attribution leaves truth the same but sole ownership against prior work → P. “Farmers should adopt the treatment” is a directive → FP-Rec.</w:t>
+      </w:r>
+    </w:p>
+    <w:p>
+      <w:pPr>
+        <w:spacing w:before="0" w:after="40" w:line="276" w:lineRule="auto"/>
         <w:ind w:firstLine="0"/>
-        <w:jc w:val="both"/>
+        <w:jc w:val="left"/>
       </w:pPr>
       <w:r>
         <w:rPr>
           <w:rFonts w:ascii="Georgia" w:hAnsi="Georgia" w:eastAsia="Georgia" w:cs="Georgia"/>
           <w:b/>
           <w:sz w:val="22"/>
-          <w:szCs w:val="22"/>
-        </w:rPr>
-        <w:t xml:space="preserve">• FP: </w:t>
+        </w:rPr>
+        <w:t xml:space="preserve">• EC+P: </w:t>
       </w:r>
       <w:r>
         <w:rPr>
           <w:rFonts w:ascii="Georgia" w:hAnsi="Georgia" w:eastAsia="Georgia" w:cs="Georgia"/>
           <w:b w:val="0"/>
           <w:sz w:val="22"/>
-          <w:szCs w:val="22"/>
-        </w:rPr>
-        <w:t>“In conclusion, T3 produced the highest yield.” Removing the frame changes neither truth-commitment nor interpersonal imposition toward readers/prior work → FP.</w:t>
-      </w:r>
-    </w:p>
-    <w:p>
-      <w:pPr>
-        <w:spacing w:before="0" w:after="0" w:line="276" w:lineRule="auto"/>
+        </w:rPr>
+        <w:t>Both tests hold on one token → EC+P (or dominant label plus dual note).</w:t>
+      </w:r>
+    </w:p>
+    <w:p>
+      <w:pPr>
+        <w:spacing w:before="0" w:after="40" w:line="276" w:lineRule="auto"/>
         <w:ind w:firstLine="0"/>
-        <w:jc w:val="both"/>
+        <w:jc w:val="left"/>
       </w:pPr>
       <w:r>
         <w:rPr>
           <w:rFonts w:ascii="Georgia" w:hAnsi="Georgia" w:eastAsia="Georgia" w:cs="Georgia"/>
           <w:b/>
           <w:sz w:val="22"/>
-          <w:szCs w:val="22"/>
-        </w:rPr>
-        <w:t xml:space="preserve">• Frame + separate EC: </w:t>
+        </w:rPr>
+        <w:t xml:space="preserve">• FP: </w:t>
       </w:r>
       <w:r>
         <w:rPr>
           <w:rFonts w:ascii="Georgia" w:hAnsi="Georgia" w:eastAsia="Georgia" w:cs="Georgia"/>
           <w:b w:val="0"/>
           <w:sz w:val="22"/>
-          <w:szCs w:val="22"/>
-        </w:rPr>
-        <w:t>“It should be noted that the results may indicate growth.” Code may via Working Test as EC. The frame alone fails the claim condition or both checks and is not a second hedge.</w:t>
-      </w:r>
-    </w:p>
-    <w:p>
-      <w:pPr>
-        <w:spacing w:before="0" w:after="0" w:line="480" w:lineRule="auto"/>
+        </w:rPr>
+        <w:t>“In conclusion, T3 produced the highest yield.” Removing the frame changes neither truth commitment nor interpersonal force → FP.</w:t>
+      </w:r>
+    </w:p>
+    <w:p>
+      <w:pPr>
+        <w:spacing w:before="0" w:after="40" w:line="276" w:lineRule="auto"/>
         <w:ind w:firstLine="0"/>
-        <w:jc w:val="both"/>
+        <w:jc w:val="left"/>
       </w:pPr>
       <w:r>
         <w:rPr>
           <w:rFonts w:ascii="Georgia" w:hAnsi="Georgia" w:eastAsia="Georgia" w:cs="Georgia"/>
           <w:b/>
           <w:sz w:val="22"/>
-          <w:szCs w:val="22"/>
-        </w:rPr>
-        <w:t xml:space="preserve">• Summary: </w:t>
+        </w:rPr>
+        <w:t xml:space="preserve">• Frame + EC: </w:t>
       </w:r>
       <w:r>
         <w:rPr>
           <w:rFonts w:ascii="Georgia" w:hAnsi="Georgia" w:eastAsia="Georgia" w:cs="Georgia"/>
           <w:b w:val="0"/>
           <w:sz w:val="22"/>
-          <w:szCs w:val="22"/>
-        </w:rPr>
-        <w:t>Step 1 is wide. Step 2 uses a claim condition, then the Working Test (EC) and Reader Test (P). Non-claims fail the claim condition and are FP. Neither removal check met → FP. Step 3 assigns type to retained hedges only. In this corpus all 65 retained tokens were EC. No P forms appeared on claims. FP cases are inventoried separately with reason codes.</w:t>
+        </w:rPr>
+        <w:t>“It should be noted that the results may indicate growth.” Code may as EC. The frame alone is not a second hedge.</w:t>
       </w:r>
     </w:p>
     <w:p>
       <w:pPr>
         <w:keepNext/>
-        <w:spacing w:before="240" w:after="0" w:line="480" w:lineRule="auto"/>
+        <w:spacing w:before="200" w:after="40" w:line="276" w:lineRule="auto"/>
+        <w:ind w:firstLine="0"/>
         <w:jc w:val="left"/>
       </w:pPr>
       <w:r>
         <w:rPr>
-          <w:rFonts w:ascii="Georgia" w:hAnsi="Georgia" w:cs="Georgia" w:eastAsia="Georgia"/>
+          <w:rFonts w:ascii="Georgia" w:hAnsi="Georgia" w:eastAsia="Georgia" w:cs="Georgia"/>
           <w:b/>
-          <w:bCs w:val="1"/>
-          <w:sz w:val="22"/>
-          <w:szCs w:val="22"/>
-          <w:rtl w:val="0"/>
+          <w:sz w:val="22"/>
         </w:rPr>
         <w:t>HEDGE TYPE (PRIMARY COLORS)</w:t>
       </w:r>
-      <w:r>
-        <w:rPr>
-          <w:rFonts w:ascii="Georgia" w:hAnsi="Georgia" w:cs="Georgia" w:eastAsia="Georgia"/>
-          <w:rtl w:val="0"/>
-          <w:sz w:val="24"/>
-          <w:szCs w:val="24"/>
-          <w:b/>
-        </w:rPr>
-      </w:r>
-    </w:p>
-    <w:p>
-      <w:pPr>
-        <w:spacing w:before="0" w:after="0" w:line="480" w:lineRule="auto"/>
-        <w:ind w:firstLine="720"/>
-        <w:jc w:val="both"/>
-      </w:pPr>
-      <w:r>
-        <w:rPr>
-          <w:rFonts w:ascii="Georgia" w:cs="Georgia" w:eastAsia="Georgia" w:hAnsi="Georgia"/>
-          <w:b w:val="0"/>
-          <w:bCs w:val="0"/>
-          <w:i w:val="0"/>
-          <w:iCs w:val="0"/>
-          <w:sz w:val="22"/>
-          <w:szCs w:val="22"/>
-          <w:rtl w:val="0"/>
-        </w:rPr>
-        <w:t xml:space="preserve">Highlight each hedge token in the color matching its grammatical form.</w:t>
-      </w:r>
-      <w:r>
-        <w:rPr>
-          <w:rFonts w:ascii="Georgia" w:hAnsi="Georgia" w:cs="Georgia" w:eastAsia="Georgia"/>
-          <w:rtl w:val="0"/>
-          <w:sz w:val="22"/>
-          <w:szCs w:val="22"/>
-        </w:rPr>
+    </w:p>
+    <w:p>
+      <w:pPr>
+        <w:spacing w:before="0" w:after="40" w:line="276" w:lineRule="auto"/>
+        <w:ind w:firstLine="0"/>
+        <w:jc w:val="left"/>
+      </w:pPr>
+      <w:r>
+        <w:rPr>
+          <w:rFonts w:ascii="Georgia" w:hAnsi="Georgia" w:eastAsia="Georgia" w:cs="Georgia"/>
+          <w:b w:val="0"/>
+          <w:sz w:val="22"/>
+        </w:rPr>
+        <w:t>Highlight each retained hedge token in the color for its grammatical form. Exclusions are in the Decision Rules table.</w:t>
       </w:r>
     </w:p>
     <w:tbl>
@@ -14195,107 +14053,41 @@
     </w:tbl>
     <w:p>
       <w:pPr>
-        <w:spacing w:before="240" w:after="0" w:line="480" w:lineRule="auto"/>
-        <w:ind w:firstLine="720"/>
-        <w:jc w:val="both"/>
-      </w:pPr>
-      <w:r>
-        <w:rPr>
-          <w:rFonts w:ascii="Georgia" w:hAnsi="Georgia" w:cs="Georgia" w:eastAsia="Georgia"/>
-          <w:b w:val="0"/>
-          <w:bCs w:val="0"/>
-          <w:i w:val="1"/>
-          <w:iCs w:val="1"/>
-          <w:color w:val="000000"/>
-          <w:sz w:val="22"/>
-          <w:szCs w:val="22"/>
-          <w:rtl w:val="0"/>
-        </w:rPr>
-        <w:t>Exclusions (capability, recommendation, procedural norm, location) are in the Decision Rules table.</w:t>
-      </w:r>
-      <w:r>
-        <w:rPr>
-          <w:rFonts w:ascii="Georgia" w:cs="Georgia" w:eastAsia="Georgia" w:hAnsi="Georgia"/>
-          <w:bCs w:val="1"/>
-          <w:i w:val="1"/>
-          <w:iCs w:val="1"/>
-          <w:color w:val="000000"/>
-          <w:sz w:val="22"/>
-          <w:szCs w:val="22"/>
-          <w:rtl w:val="0"/>
-        </w:rPr>
-      </w:r>
-      <w:r>
-        <w:rPr>
-          <w:rFonts w:ascii="Georgia" w:cs="Georgia" w:eastAsia="Georgia" w:hAnsi="Georgia"/>
-          <w:bCs w:val="0"/>
-          <w:i w:val="1"/>
-          <w:iCs w:val="1"/>
-          <w:color w:val="000000"/>
-          <w:sz w:val="22"/>
-          <w:szCs w:val="22"/>
-          <w:rtl w:val="0"/>
-        </w:rPr>
-      </w:r>
-      <w:r>
-        <w:rPr>
-          <w:rFonts w:ascii="Georgia" w:hAnsi="Georgia" w:cs="Georgia" w:eastAsia="Georgia"/>
-          <w:rtl w:val="0"/>
-          <w:sz w:val="22"/>
-          <w:szCs w:val="22"/>
-        </w:rPr>
-      </w:r>
-    </w:p>
-    <w:p>
-      <w:pPr>
-        <w:spacing w:before="0" w:after="0" w:line="480" w:lineRule="auto"/>
+        <w:spacing w:before="0" w:after="40" w:line="276" w:lineRule="auto"/>
         <w:ind w:firstLine="0"/>
-        <w:jc w:val="both"/>
+        <w:jc w:val="left"/>
       </w:pPr>
       <w:r>
         <w:rPr>
           <w:rFonts w:ascii="Georgia" w:hAnsi="Georgia" w:eastAsia="Georgia" w:cs="Georgia"/>
           <w:b/>
           <w:sz w:val="22"/>
-          <w:szCs w:val="22"/>
-        </w:rPr>
-        <w:t xml:space="preserve">• imply / implies / implying = suggest. </w:t>
+        </w:rPr>
+        <w:t xml:space="preserve">• Type notes. </w:t>
       </w:r>
       <w:r>
         <w:rPr>
           <w:rFonts w:ascii="Georgia" w:hAnsi="Georgia" w:eastAsia="Georgia" w:cs="Georgia"/>
           <w:b w:val="0"/>
           <w:sz w:val="22"/>
-          <w:szCs w:val="22"/>
-        </w:rPr>
-        <w:t>• can be concluded / derived / stated = inferential hedge (not capability can). • potentially = adverbial. • potential + noun: aim/methods topic-naming = FP-Gen. Results/conclusion qualifying a finding = Lexical EC. If removing potential changes commitment to a proposition, code Lexical EC.</w:t>
+        </w:rPr>
+        <w:t>imply/implies/implying = suggest. can be concluded/derived/stated = inferential hedge (not capability can). potentially = adverbial. potential + noun: topic-naming in aims/methods = FP-Gen, qualifying a finding in results/conclusion = Lexical EC if removal changes commitment.</w:t>
       </w:r>
     </w:p>
     <w:p>
       <w:pPr>
         <w:keepNext/>
-        <w:spacing w:before="240" w:after="0" w:line="480" w:lineRule="auto"/>
+        <w:spacing w:before="200" w:after="40" w:line="276" w:lineRule="auto"/>
+        <w:ind w:firstLine="0"/>
         <w:jc w:val="left"/>
       </w:pPr>
       <w:r>
         <w:rPr>
-          <w:rFonts w:ascii="Georgia" w:hAnsi="Georgia" w:cs="Georgia" w:eastAsia="Georgia"/>
+          <w:rFonts w:ascii="Georgia" w:hAnsi="Georgia" w:eastAsia="Georgia" w:cs="Georgia"/>
           <w:b/>
-          <w:bCs w:val="1"/>
-          <w:sz w:val="22"/>
-          <w:szCs w:val="22"/>
-          <w:rtl w:val="0"/>
+          <w:sz w:val="22"/>
         </w:rPr>
         <w:t>HEDGE FUNCTION (COLORED TEXT LABELS)</w:t>
-      </w:r>
-      <w:r>
-        <w:rPr>
-          <w:rFonts w:ascii="Georgia" w:hAnsi="Georgia" w:cs="Georgia" w:eastAsia="Georgia"/>
-          <w:rtl w:val="0"/>
-          <w:sz w:val="24"/>
-          <w:szCs w:val="24"/>
-          <w:b/>
-        </w:rPr>
       </w:r>
     </w:p>
     <w:tbl>
@@ -15012,48 +14804,32 @@
     <w:p>
       <w:pPr>
         <w:keepNext/>
-        <w:spacing w:before="240" w:after="0" w:line="480" w:lineRule="auto"/>
+        <w:spacing w:before="200" w:after="40" w:line="276" w:lineRule="auto"/>
+        <w:ind w:firstLine="0"/>
         <w:jc w:val="left"/>
       </w:pPr>
       <w:r>
         <w:rPr>
-          <w:rFonts w:ascii="Georgia" w:cs="Georgia" w:eastAsia="Georgia" w:hAnsi="Georgia"/>
+          <w:rFonts w:ascii="Georgia" w:hAnsi="Georgia" w:eastAsia="Georgia" w:cs="Georgia"/>
           <w:b/>
-          <w:bCs w:val="1"/>
-          <w:sz w:val="22"/>
-          <w:szCs w:val="22"/>
-          <w:rtl w:val="0"/>
-        </w:rPr>
-        <w:t xml:space="preserve">DECISION RULES FOR AMBIGUOUS CASES</w:t>
-      </w:r>
-      <w:r>
-        <w:rPr>
-          <w:rFonts w:ascii="Georgia" w:hAnsi="Georgia" w:cs="Georgia" w:eastAsia="Georgia"/>
-          <w:rtl w:val="0"/>
-          <w:sz w:val="24"/>
-          <w:szCs w:val="24"/>
-          <w:b/>
-        </w:rPr>
-      </w:r>
-    </w:p>
-    <w:p>
-      <w:pPr>
-        <w:spacing w:before="0" w:after="0" w:line="480" w:lineRule="auto"/>
-        <w:ind w:firstLine="720"/>
-        <w:jc w:val="both"/>
-      </w:pPr>
-      <w:r>
-        <w:rPr>
-          <w:rFonts w:ascii="Georgia" w:cs="Georgia" w:eastAsia="Georgia" w:hAnsi="Georgia"/>
-          <w:b w:val="0"/>
-          <w:bCs w:val="0"/>
-          <w:i w:val="0"/>
-          <w:iCs w:val="0"/>
-          <w:sz w:val="22"/>
-          <w:szCs w:val="22"/>
-          <w:rtl w:val="0"/>
-        </w:rPr>
-        <w:t xml:space="preserve">Reason codes for residual rejects after the claim condition or both removal checks fail. Use the table below when labeling an FP. These codes are not a pre-filter before Step 2.</w:t>
+          <w:sz w:val="22"/>
+        </w:rPr>
+        <w:t>DECISION RULES FOR AMBIGUOUS CASES</w:t>
+      </w:r>
+    </w:p>
+    <w:p>
+      <w:pPr>
+        <w:spacing w:before="0" w:after="40" w:line="276" w:lineRule="auto"/>
+        <w:ind w:firstLine="0"/>
+        <w:jc w:val="left"/>
+      </w:pPr>
+      <w:r>
+        <w:rPr>
+          <w:rFonts w:ascii="Georgia" w:hAnsi="Georgia" w:eastAsia="Georgia" w:cs="Georgia"/>
+          <w:b w:val="0"/>
+          <w:sz w:val="22"/>
+        </w:rPr>
+        <w:t>Use the table below for FP reason codes after the claim condition or both tests fail.</w:t>
       </w:r>
     </w:p>
     <w:tbl>
@@ -15924,157 +15700,63 @@
     </w:tbl>
     <w:p>
       <w:pPr>
-        <w:spacing w:before="240" w:after="0" w:line="480" w:lineRule="auto"/>
-        <w:ind w:firstLine="720"/>
-        <w:jc w:val="both"/>
-      </w:pPr>
-      <w:r>
-        <w:rPr>
-          <w:rFonts w:ascii="Georgia" w:cs="Georgia" w:eastAsia="Georgia" w:hAnsi="Georgia"/>
-          <w:b w:val="0"/>
-          <w:bCs w:val="1"/>
-          <w:i w:val="1"/>
-          <w:iCs w:val="1"/>
-          <w:color w:val="000000"/>
-          <w:sz w:val="22"/>
-          <w:szCs w:val="22"/>
-          <w:rtl w:val="0"/>
-        </w:rPr>
-        <w:t xml:space="preserve">General exclusions: </w:t>
-      </w:r>
-      <w:r>
-        <w:rPr>
-          <w:rFonts w:ascii="Georgia" w:cs="Georgia" w:eastAsia="Georgia" w:hAnsi="Georgia"/>
-          <w:b w:val="0"/>
-          <w:bCs w:val="0"/>
-          <w:i w:val="1"/>
-          <w:iCs w:val="1"/>
-          <w:color w:val="000000"/>
-          <w:sz w:val="22"/>
-          <w:szCs w:val="22"/>
-          <w:rtl w:val="0"/>
-        </w:rPr>
-        <w:t xml:space="preserve">ability, future procedure, and procedural necessity (a step required by the procedure itself) are never coded as hedges.</w:t>
-      </w:r>
-      <w:r>
-        <w:rPr>
-          <w:rFonts w:ascii="Georgia" w:hAnsi="Georgia" w:cs="Georgia" w:eastAsia="Georgia"/>
-          <w:rtl w:val="0"/>
-          <w:sz w:val="22"/>
-          <w:szCs w:val="22"/>
-        </w:rPr>
-      </w:r>
-    </w:p>
-    <w:p>
-      <w:pPr>
-        <w:spacing w:before="0" w:after="0" w:line="480" w:lineRule="auto"/>
-        <w:ind w:firstLine="720"/>
-        <w:jc w:val="both"/>
-      </w:pPr>
-      <w:r>
-        <w:rPr>
-          <w:rFonts w:ascii="Georgia" w:cs="Georgia" w:eastAsia="Georgia" w:hAnsi="Georgia"/>
-          <w:b w:val="0"/>
-          <w:bCs w:val="0"/>
-          <w:i w:val="1"/>
-          <w:iCs w:val="1"/>
-          <w:color w:val="000000"/>
-          <w:sz w:val="22"/>
-          <w:szCs w:val="22"/>
-          <w:rtl w:val="0"/>
-        </w:rPr>
-        <w:t xml:space="preserve">Quick test for </w:t>
-      </w:r>
-      <w:r>
-        <w:rPr>
-          <w:rFonts w:ascii="Georgia" w:cs="Georgia" w:eastAsia="Georgia" w:hAnsi="Georgia"/>
-          <w:b w:val="0"/>
-          <w:bCs w:val="1"/>
-          <w:i w:val="1"/>
-          <w:iCs w:val="1"/>
-          <w:color w:val="000000"/>
-          <w:sz w:val="22"/>
-          <w:szCs w:val="22"/>
-          <w:rtl w:val="0"/>
-        </w:rPr>
-        <w:t xml:space="preserve">suggest/indicate</w:t>
-      </w:r>
-      <w:r>
-        <w:rPr>
-          <w:rFonts w:ascii="Georgia" w:cs="Georgia" w:eastAsia="Georgia" w:hAnsi="Georgia"/>
-          <w:b w:val="0"/>
-          <w:bCs w:val="0"/>
-          <w:i w:val="1"/>
-          <w:iCs w:val="1"/>
-          <w:color w:val="000000"/>
-          <w:sz w:val="22"/>
-          <w:szCs w:val="22"/>
-          <w:rtl w:val="0"/>
-        </w:rPr>
-        <w:t xml:space="preserve">: “Might this be true?” = hedge. “Should this be done?” = FP-Rec.</w:t>
-      </w:r>
-      <w:r>
-        <w:rPr>
-          <w:rFonts w:ascii="Georgia" w:hAnsi="Georgia" w:cs="Georgia" w:eastAsia="Georgia"/>
-          <w:rtl w:val="0"/>
-          <w:sz w:val="22"/>
-          <w:szCs w:val="22"/>
-        </w:rPr>
+        <w:spacing w:before="0" w:after="40" w:line="276" w:lineRule="auto"/>
+        <w:ind w:firstLine="0"/>
+        <w:jc w:val="left"/>
+      </w:pPr>
+      <w:r>
+        <w:rPr>
+          <w:rFonts w:ascii="Georgia" w:hAnsi="Georgia" w:eastAsia="Georgia" w:cs="Georgia"/>
+          <w:b w:val="0"/>
+          <w:sz w:val="22"/>
+        </w:rPr>
+        <w:t>Never hedges: ability, future procedure, and procedural necessity (a step required by the method itself).</w:t>
+      </w:r>
+    </w:p>
+    <w:p>
+      <w:pPr>
+        <w:spacing w:before="0" w:after="40" w:line="276" w:lineRule="auto"/>
+        <w:ind w:firstLine="0"/>
+        <w:jc w:val="left"/>
+      </w:pPr>
+      <w:r>
+        <w:rPr>
+          <w:rFonts w:ascii="Georgia" w:hAnsi="Georgia" w:eastAsia="Georgia" w:cs="Georgia"/>
+          <w:b w:val="0"/>
+          <w:sz w:val="22"/>
+        </w:rPr>
+        <w:t>Quick test for suggest/indicate: “Might this be true?” = hedge. “Should this be done?” = FP-Rec.</w:t>
       </w:r>
     </w:p>
     <w:p>
       <w:pPr>
         <w:keepNext/>
-        <w:spacing w:before="240" w:after="0" w:line="480" w:lineRule="auto"/>
+        <w:spacing w:before="200" w:after="40" w:line="276" w:lineRule="auto"/>
+        <w:ind w:firstLine="0"/>
         <w:jc w:val="left"/>
       </w:pPr>
       <w:r>
         <w:rPr>
-          <w:rFonts w:ascii="Georgia" w:cs="Georgia" w:eastAsia="Georgia" w:hAnsi="Georgia"/>
+          <w:rFonts w:ascii="Georgia" w:hAnsi="Georgia" w:eastAsia="Georgia" w:cs="Georgia"/>
           <w:b/>
-          <w:bCs w:val="1"/>
-          <w:sz w:val="22"/>
-          <w:szCs w:val="22"/>
-          <w:rtl w:val="0"/>
-        </w:rPr>
-        <w:t xml:space="preserve">MARKING FALSE POSITIVES</w:t>
-      </w:r>
-      <w:r>
-        <w:rPr>
-          <w:rFonts w:ascii="Georgia" w:hAnsi="Georgia" w:cs="Georgia" w:eastAsia="Georgia"/>
-          <w:rtl w:val="0"/>
-          <w:sz w:val="24"/>
-          <w:szCs w:val="24"/>
-          <w:b/>
-        </w:rPr>
-      </w:r>
-    </w:p>
-    <w:p>
-      <w:pPr>
-        <w:spacing w:before="0" w:after="0" w:line="480" w:lineRule="auto"/>
-        <w:ind w:firstLine="720"/>
-        <w:jc w:val="both"/>
-      </w:pPr>
-      <w:r>
-        <w:rPr>
-          <w:rFonts w:ascii="Georgia" w:cs="Georgia" w:eastAsia="Georgia" w:hAnsi="Georgia"/>
-          <w:b w:val="0"/>
-          <w:bCs w:val="0"/>
-          <w:i w:val="0"/>
-          <w:iCs w:val="0"/>
-          <w:sz w:val="22"/>
-          <w:szCs w:val="22"/>
-          <w:rtl w:val="0"/>
-        </w:rPr>
-        <w:t xml:space="preserve">Strike through a hedge-like token that fails the Working Test. Write the reason code beside it in grey text.</w:t>
-      </w:r>
-      <w:r>
-        <w:rPr>
-          <w:rFonts w:ascii="Georgia" w:hAnsi="Georgia" w:cs="Georgia" w:eastAsia="Georgia"/>
-          <w:rtl w:val="0"/>
-          <w:sz w:val="22"/>
-          <w:szCs w:val="22"/>
-        </w:rPr>
+          <w:sz w:val="22"/>
+        </w:rPr>
+        <w:t>MARKING FALSE POSITIVES</w:t>
+      </w:r>
+    </w:p>
+    <w:p>
+      <w:pPr>
+        <w:spacing w:before="0" w:after="40" w:line="276" w:lineRule="auto"/>
+        <w:ind w:firstLine="0"/>
+        <w:jc w:val="left"/>
+      </w:pPr>
+      <w:r>
+        <w:rPr>
+          <w:rFonts w:ascii="Georgia" w:hAnsi="Georgia" w:eastAsia="Georgia" w:cs="Georgia"/>
+          <w:b w:val="0"/>
+          <w:sz w:val="22"/>
+        </w:rPr>
+        <w:t>Strike through the token. Write the reason code beside it in grey text.</w:t>
       </w:r>
     </w:p>
     <w:tbl>
@@ -16833,172 +16515,132 @@
     <w:p>
       <w:pPr>
         <w:keepNext/>
-        <w:spacing w:before="240" w:after="0" w:line="480" w:lineRule="auto"/>
+        <w:spacing w:before="200" w:after="40" w:line="276" w:lineRule="auto"/>
+        <w:ind w:firstLine="0"/>
         <w:jc w:val="left"/>
-      </w:pPr>
-      <w:r>
-        <w:rPr>
-          <w:rFonts w:ascii="Georgia" w:hAnsi="Georgia" w:cs="Georgia" w:eastAsia="Georgia"/>
-          <w:b/>
-          <w:bCs w:val="1"/>
-          <w:sz w:val="22"/>
-          <w:szCs w:val="22"/>
-          <w:rtl w:val="0"/>
-        </w:rPr>
-        <w:t>UNHEDGED ASSERTIONS (WARRANTED CAUTION, NEUTRAL GREY)</w:t>
-      </w:r>
-      <w:r>
-        <w:rPr>
-          <w:rFonts w:ascii="Georgia" w:hAnsi="Georgia" w:cs="Georgia" w:eastAsia="Georgia"/>
-          <w:rtl w:val="0"/>
-          <w:sz w:val="24"/>
-          <w:szCs w:val="24"/>
-          <w:b/>
-        </w:rPr>
-      </w:r>
-    </w:p>
-    <w:p>
-      <w:pPr>
-        <w:spacing w:before="0" w:after="0" w:line="276" w:lineRule="auto"/>
-        <w:ind w:firstLine="0"/>
-        <w:jc w:val="both"/>
       </w:pPr>
       <w:r>
         <w:rPr>
           <w:rFonts w:ascii="Georgia" w:hAnsi="Georgia" w:eastAsia="Georgia" w:cs="Georgia"/>
           <w:b/>
           <w:sz w:val="22"/>
-          <w:szCs w:val="22"/>
-        </w:rPr>
-        <w:t xml:space="preserve">• Grey-highlight the main assertive verb, place [G] or [C] beside it (same placement as (EC) on hedges). </w:t>
-      </w:r>
-      <w:r>
-        <w:rPr>
-          <w:rFonts w:ascii="Georgia" w:hAnsi="Georgia" w:eastAsia="Georgia" w:cs="Georgia"/>
-          <w:b w:val="0"/>
-          <w:sz w:val="22"/>
-          <w:szCs w:val="22"/>
-        </w:rPr>
-      </w:r>
-    </w:p>
-    <w:p>
-      <w:pPr>
-        <w:spacing w:before="0" w:after="0" w:line="276" w:lineRule="auto"/>
+        </w:rPr>
+        <w:t>UNHEDGED ASSERTIONS (WARRANTED CAUTION, NEUTRAL GREY)</w:t>
+      </w:r>
+    </w:p>
+    <w:p>
+      <w:pPr>
+        <w:spacing w:before="0" w:after="40" w:line="276" w:lineRule="auto"/>
         <w:ind w:firstLine="0"/>
-        <w:jc w:val="both"/>
+        <w:jc w:val="left"/>
       </w:pPr>
       <w:r>
         <w:rPr>
           <w:rFonts w:ascii="Georgia" w:hAnsi="Georgia" w:eastAsia="Georgia" w:cs="Georgia"/>
           <w:b/>
           <w:sz w:val="22"/>
-          <w:szCs w:val="22"/>
-        </w:rPr>
-        <w:t xml:space="preserve">• Mark only claims where caution was warranted but absent. </w:t>
+        </w:rPr>
+        <w:t xml:space="preserve">• Mark. </w:t>
       </w:r>
       <w:r>
         <w:rPr>
           <w:rFonts w:ascii="Georgia" w:hAnsi="Georgia" w:eastAsia="Georgia" w:cs="Georgia"/>
           <w:b w:val="0"/>
           <w:sz w:val="22"/>
-          <w:szCs w:val="22"/>
-        </w:rPr>
-      </w:r>
-    </w:p>
-    <w:p>
-      <w:pPr>
-        <w:spacing w:before="0" w:after="0" w:line="276" w:lineRule="auto"/>
+        </w:rPr>
+        <w:t>Grey-highlight the main assertive verb. Place [G] or [C] beside it (same placement as (EC) on hedges).</w:t>
+      </w:r>
+    </w:p>
+    <w:p>
+      <w:pPr>
+        <w:spacing w:before="0" w:after="40" w:line="276" w:lineRule="auto"/>
         <w:ind w:firstLine="0"/>
-        <w:jc w:val="both"/>
+        <w:jc w:val="left"/>
       </w:pPr>
       <w:r>
         <w:rPr>
           <w:rFonts w:ascii="Georgia" w:hAnsi="Georgia" w:eastAsia="Georgia" w:cs="Georgia"/>
           <w:b/>
           <w:sz w:val="22"/>
-          <w:szCs w:val="22"/>
-        </w:rPr>
-        <w:t xml:space="preserve">• [G] = generalization or evaluative ranking beyond the data. </w:t>
+        </w:rPr>
+        <w:t xml:space="preserve">• Scope. </w:t>
       </w:r>
       <w:r>
         <w:rPr>
           <w:rFonts w:ascii="Georgia" w:hAnsi="Georgia" w:eastAsia="Georgia" w:cs="Georgia"/>
           <w:b w:val="0"/>
           <w:sz w:val="22"/>
-          <w:szCs w:val="22"/>
-        </w:rPr>
-      </w:r>
-    </w:p>
-    <w:p>
-      <w:pPr>
-        <w:spacing w:before="0" w:after="0" w:line="276" w:lineRule="auto"/>
+        </w:rPr>
+        <w:t>Only where caution was warranted but absent. Bare trial results, measured findings, and procedure are not marked.</w:t>
+      </w:r>
+    </w:p>
+    <w:p>
+      <w:pPr>
+        <w:spacing w:before="0" w:after="40" w:line="276" w:lineRule="auto"/>
         <w:ind w:firstLine="0"/>
-        <w:jc w:val="both"/>
+        <w:jc w:val="left"/>
       </w:pPr>
       <w:r>
         <w:rPr>
           <w:rFonts w:ascii="Georgia" w:hAnsi="Georgia" w:eastAsia="Georgia" w:cs="Georgia"/>
           <w:b/>
           <w:sz w:val="22"/>
-          <w:szCs w:val="22"/>
-        </w:rPr>
-        <w:t xml:space="preserve">• [C] = cause-effect or impact stronger than the design supports. </w:t>
+        </w:rPr>
+        <w:t xml:space="preserve">• [G]. </w:t>
       </w:r>
       <w:r>
         <w:rPr>
           <w:rFonts w:ascii="Georgia" w:hAnsi="Georgia" w:eastAsia="Georgia" w:cs="Georgia"/>
           <w:b w:val="0"/>
           <w:sz w:val="22"/>
-          <w:szCs w:val="22"/>
-        </w:rPr>
-      </w:r>
-    </w:p>
-    <w:p>
-      <w:pPr>
-        <w:spacing w:before="0" w:after="0" w:line="276" w:lineRule="auto"/>
+        </w:rPr>
+        <w:t>Generalization or evaluative ranking beyond the data.</w:t>
+      </w:r>
+    </w:p>
+    <w:p>
+      <w:pPr>
+        <w:spacing w:before="0" w:after="40" w:line="276" w:lineRule="auto"/>
         <w:ind w:firstLine="0"/>
-        <w:jc w:val="both"/>
+        <w:jc w:val="left"/>
       </w:pPr>
       <w:r>
         <w:rPr>
           <w:rFonts w:ascii="Georgia" w:hAnsi="Georgia" w:eastAsia="Georgia" w:cs="Georgia"/>
           <w:b/>
           <w:sz w:val="22"/>
-          <w:szCs w:val="22"/>
-        </w:rPr>
-        <w:t xml:space="preserve">• Do not mark bare trial results, measured findings, or procedural statements. </w:t>
+        </w:rPr>
+        <w:t xml:space="preserve">• [C]. </w:t>
       </w:r>
       <w:r>
         <w:rPr>
           <w:rFonts w:ascii="Georgia" w:hAnsi="Georgia" w:eastAsia="Georgia" w:cs="Georgia"/>
           <w:b w:val="0"/>
           <w:sz w:val="22"/>
-          <w:szCs w:val="22"/>
-        </w:rPr>
-      </w:r>
-    </w:p>
-    <w:p>
-      <w:pPr>
-        <w:spacing w:before="0" w:after="0" w:line="276" w:lineRule="auto"/>
+        </w:rPr>
+        <w:t>Cause-effect or impact stronger than the design supports.</w:t>
+      </w:r>
+    </w:p>
+    <w:p>
+      <w:pPr>
+        <w:spacing w:before="0" w:after="40" w:line="276" w:lineRule="auto"/>
         <w:ind w:firstLine="0"/>
-        <w:jc w:val="both"/>
+        <w:jc w:val="left"/>
       </w:pPr>
       <w:r>
         <w:rPr>
           <w:rFonts w:ascii="Georgia" w:hAnsi="Georgia" w:eastAsia="Georgia" w:cs="Georgia"/>
           <w:b/>
           <w:sz w:val="22"/>
-          <w:szCs w:val="22"/>
-        </w:rPr>
-        <w:t xml:space="preserve">• Record the full clause in the coding sheet. </w:t>
+        </w:rPr>
+        <w:t xml:space="preserve">• Record. </w:t>
       </w:r>
       <w:r>
         <w:rPr>
           <w:rFonts w:ascii="Georgia" w:hAnsi="Georgia" w:eastAsia="Georgia" w:cs="Georgia"/>
           <w:b w:val="0"/>
           <w:sz w:val="22"/>
-          <w:szCs w:val="22"/>
-        </w:rPr>
+        </w:rPr>
+        <w:t>Full clause in the coding sheet.</w:t>
       </w:r>
     </w:p>
     <w:tbl>
@@ -17535,28 +17177,17 @@
     <w:p>
       <w:pPr>
         <w:keepNext/>
-        <w:spacing w:before="240" w:after="0" w:line="480" w:lineRule="auto"/>
+        <w:spacing w:before="200" w:after="40" w:line="276" w:lineRule="auto"/>
+        <w:ind w:firstLine="0"/>
         <w:jc w:val="left"/>
       </w:pPr>
       <w:r>
         <w:rPr>
-          <w:rFonts w:ascii="Georgia" w:hAnsi="Georgia" w:cs="Georgia" w:eastAsia="Georgia"/>
+          <w:rFonts w:ascii="Georgia" w:hAnsi="Georgia" w:eastAsia="Georgia" w:cs="Georgia"/>
           <w:b/>
-          <w:bCs w:val="1"/>
-          <w:sz w:val="22"/>
-          <w:szCs w:val="22"/>
-          <w:rtl w:val="0"/>
+          <w:sz w:val="22"/>
         </w:rPr>
         <w:t>CODING SHEET COLUMNS</w:t>
-      </w:r>
-      <w:r>
-        <w:rPr>
-          <w:rFonts w:ascii="Georgia" w:hAnsi="Georgia" w:cs="Georgia" w:eastAsia="Georgia"/>
-          <w:rtl w:val="0"/>
-          <w:sz w:val="24"/>
-          <w:szCs w:val="24"/>
-          <w:b/>
-        </w:rPr>
       </w:r>
     </w:p>
     <w:tbl>
@@ -18926,101 +18557,94 @@
     </w:tbl>
     <w:p>
       <w:pPr>
-        <w:spacing w:before="0" w:after="0" w:line="276" w:lineRule="auto"/>
+        <w:spacing w:before="0" w:after="40" w:line="276" w:lineRule="auto"/>
         <w:ind w:firstLine="0"/>
-        <w:jc w:val="both"/>
+        <w:jc w:val="left"/>
       </w:pPr>
       <w:r>
         <w:rPr>
           <w:rFonts w:ascii="Georgia" w:hAnsi="Georgia" w:eastAsia="Georgia" w:cs="Georgia"/>
           <w:b/>
           <w:sz w:val="22"/>
-          <w:szCs w:val="22"/>
-        </w:rPr>
-        <w:t xml:space="preserve">• Highlighted abstract = primary record. </w:t>
+        </w:rPr>
+        <w:t xml:space="preserve">• Primary record. </w:t>
       </w:r>
       <w:r>
         <w:rPr>
           <w:rFonts w:ascii="Georgia" w:hAnsi="Georgia" w:eastAsia="Georgia" w:cs="Georgia"/>
           <w:b w:val="0"/>
           <w:sz w:val="22"/>
-          <w:szCs w:val="22"/>
-        </w:rPr>
-        <w:t>Spreadsheet = tallying and analysis only.</w:t>
-      </w:r>
-    </w:p>
-    <w:p>
-      <w:pPr>
-        <w:spacing w:before="0" w:after="0" w:line="276" w:lineRule="auto"/>
+        </w:rPr>
+        <w:t>Highlighted abstract. Spreadsheet is for tallying and analysis only.</w:t>
+      </w:r>
+    </w:p>
+    <w:p>
+      <w:pPr>
+        <w:spacing w:before="0" w:after="40" w:line="276" w:lineRule="auto"/>
         <w:ind w:firstLine="0"/>
-        <w:jc w:val="both"/>
+        <w:jc w:val="left"/>
       </w:pPr>
       <w:r>
         <w:rPr>
           <w:rFonts w:ascii="Georgia" w:hAnsi="Georgia" w:eastAsia="Georgia" w:cs="Georgia"/>
           <w:b/>
           <w:sz w:val="22"/>
-          <w:szCs w:val="22"/>
-        </w:rPr>
-        <w:t xml:space="preserve">• Codes: </w:t>
+        </w:rPr>
+        <w:t xml:space="preserve">• IDs. </w:t>
       </w:r>
       <w:r>
         <w:rPr>
           <w:rFonts w:ascii="Georgia" w:hAnsi="Georgia" w:eastAsia="Georgia" w:cs="Georgia"/>
           <w:b w:val="0"/>
           <w:sz w:val="22"/>
-          <w:szCs w:val="22"/>
         </w:rPr>
         <w:t>Acs1-Acs10, Aas1-Aas10 (Agriculture). VM1-VM20. B1-B20 (Biology).</w:t>
       </w:r>
     </w:p>
     <w:p>
       <w:pPr>
-        <w:spacing w:before="0" w:after="0" w:line="276" w:lineRule="auto"/>
+        <w:spacing w:before="0" w:after="40" w:line="276" w:lineRule="auto"/>
         <w:ind w:firstLine="0"/>
-        <w:jc w:val="both"/>
+        <w:jc w:val="left"/>
       </w:pPr>
       <w:r>
         <w:rPr>
           <w:rFonts w:ascii="Georgia" w:hAnsi="Georgia" w:eastAsia="Georgia" w:cs="Georgia"/>
           <w:b/>
           <w:sz w:val="22"/>
-          <w:szCs w:val="22"/>
-        </w:rPr>
-        <w:t xml:space="preserve">• Unhedged rows separate from hedge tallies. </w:t>
+        </w:rPr>
+        <w:t xml:space="preserve">• Unhedged rows. </w:t>
       </w:r>
       <w:r>
         <w:rPr>
           <w:rFonts w:ascii="Georgia" w:hAnsi="Georgia" w:eastAsia="Georgia" w:cs="Georgia"/>
           <w:b w:val="0"/>
           <w:sz w:val="22"/>
-          <w:szCs w:val="22"/>
-        </w:rPr>
-        <w:t>[G]/[C] only for warranted-but-absent caution.</w:t>
-      </w:r>
-    </w:p>
-    <w:p>
-      <w:pPr>
-        <w:spacing w:before="0" w:after="0" w:line="276" w:lineRule="auto"/>
+        </w:rPr>
+        <w:t>Separate from hedge tallies. [G]/[C] only for warranted-but-absent caution.</w:t>
+      </w:r>
+    </w:p>
+    <w:p>
+      <w:pPr>
+        <w:spacing w:before="0" w:after="40" w:line="276" w:lineRule="auto"/>
         <w:ind w:firstLine="0"/>
-        <w:jc w:val="both"/>
+        <w:jc w:val="left"/>
       </w:pPr>
       <w:r>
         <w:rPr>
           <w:rFonts w:ascii="Georgia" w:hAnsi="Georgia" w:eastAsia="Georgia" w:cs="Georgia"/>
           <w:b/>
           <w:sz w:val="22"/>
-          <w:szCs w:val="22"/>
-        </w:rPr>
-        <w:t xml:space="preserve">• Optional Rejected Candidates tab for FP traceability. </w:t>
+        </w:rPr>
+        <w:t xml:space="preserve">• FP tab. </w:t>
       </w:r>
       <w:r>
         <w:rPr>
           <w:rFonts w:ascii="Georgia" w:hAnsi="Georgia" w:eastAsia="Georgia" w:cs="Georgia"/>
           <w:b w:val="0"/>
           <w:sz w:val="22"/>
-          <w:szCs w:val="22"/>
-        </w:rPr>
+        </w:rPr>
+        <w:t>Optional Rejected Candidates tab for FP traceability.</w:t>
       </w:r>
     </w:p>
     <w:p>

</xml_diff>

<commit_message>
Draft_104: apply remaining adviser grammar tracked changes
</commit_message>
<xml_diff>
--- a/thesis/003_ThesisProposal_Draft_104.docx
+++ b/thesis/003_ThesisProposal_Draft_104.docx
@@ -10181,7 +10181,7 @@
           <w:szCs w:val="22"/>
           <w:rtl w:val="0"/>
         </w:rPr>
-        <w:t xml:space="preserve">Parts I through III established frequency, function, and density differences in this corpus. Part IV asks what those differences amount to once outcome type is in view. The aim is not to treat them as stable field traits, but as patterns in these sixty ratified abstracts. Inferential tests remain exploratory (Scope and Limitations). The discussion draws on Salager-Meyer’s (1994) claim-responsibility framework and Hyland’s (2005) stance model.</w:t>
+        <w:t xml:space="preserve">Parts I through III established frequency, function, and density differences in this corpus. Part IV asks what those differences amount to once the outcome type is in view. The aim is not to treat them as stable field traits, but as patterns in these sixty ratified abstracts. Inferential tests remain exploratory (Scope and Limitations). The discussion draws on Salager-Meyer’s (1994) claim-responsibility framework and Hyland’s (2005) stance model.</w:t>
       </w:r>
       <w:r>
         <w:rPr>
@@ -11298,7 +11298,7 @@
           <w:szCs w:val="22"/>
           <w:rtl w:val="0"/>
         </w:rPr>
-        <w:t xml:space="preserve">Disciplinary difference exists, but it is thinner than a strong "three cultures" story would predict. Veterinary Medicine is the clearest low-hedge corner of the sample. Agriculture and Biology are less distinct from each other once a single high-hedge Agriculture abstract is taken seriously as an outlier rather than as proof of a Null/NS style. The deeper point is institutional as much as linguistic. These texts are supervised products. What looks like a writer’s caution profile may also be a program’s tolerance for soft claims in a high-stakes summary. The data cannot name the cause. They can show the textual outcome.</w:t>
+        <w:t xml:space="preserve">Disciplinary difference exists, but it is thinner than a strong "three cultures" story would predict. Veterinary Medicine is the clearest low-hedge corner of the sample. Agriculture and Biology are less distinct from each other once a single high-hedge Agriculture abstract is taken seriously as an outlier rather than as proof of a Null/NS style. The deeper point is institutional as much as linguistics. These texts are supervised products. What looks like a writer’s caution profile may also be a program’s tolerance for soft claims in a high-stakes summary. The data cannot name the cause. They can show the textual outcome.</w:t>
       </w:r>
       <w:r>
         <w:rPr>
@@ -11384,7 +11384,7 @@
           <w:szCs w:val="22"/>
           <w:rtl w:val="0"/>
         </w:rPr>
-        <w:t xml:space="preserve">For teaching, that means dropping the idea of caution as a general polish. Hedging is a judgment about how far a sentence may go beyond the data. Advisers already see the final abstract and often shape it. The opening is to make that judgment visible in feedback, especially where the text turns from results to meaning. Students need help seeing when a finding can stand plain and when an implication needs restraint. They do not need a quota of soft wording, and they do not need to confuse move-organizing language with epistemic caution. Instruction that assumes a full academic hedging repertoire will miss what this campus sample actually shows: many abstracts soften little, and when they do, the work is concentrated and easy to misread as mere style.</w:t>
+        <w:t xml:space="preserve">For teaching, that means dropping the idea of caution as a general polish. Hedging is a judgment about how far a sentence may go beyond the data. Advisers already see the final abstract and often shape it. The opening is to make that judgment visible in feedback, especially where the text turns from results to meaning. Students need help seeing when a finding can stand plain and when an implication needs restraint. They do not need a quota of soft wording, and they do not need to confuse move-organizing language with epistemic caution. Instructions that assume a full academic hedging repertoire will miss what this campus sample actually shows: many abstracts soften little, and when they do, the work is concentrated and easy to misread as mere style.</w:t>
       </w:r>
       <w:r>
         <w:rPr>
@@ -19535,7 +19535,7 @@
           <w:szCs w:val="22"/>
           <w:rtl w:val="0"/>
         </w:rPr>
-        <w:t xml:space="preserve">Results of the study showed that Comparison on Curing Methods Using Oregano - dry cured duck ham had the highest rating with regards to appearance, texture and overall acceptability. While liquid cure duck ham got the highest rating in terms of aroma and taste/flavor. Comparison on Curing Methods Using Lemon Grass - liquid cured duck ham had the highest rating in terms to appearance, aroma, taste/flavor, texture and overall acceptability. Comparison of Spices on Dry Curing (Smoking) - dry cure duck ham smoked in lemon grass had the highest rating in terms of appearance, aroma, taste/flavor, texture and overall acceptability. Comparison of Spices on Liquid Smoke - liquid cured duck ham smoked in lemon grass had the highest rating in relation to appearance, aroma, taste/flavor, texture and overall acceptability. Descriptive rating revealed that all the treatment with regards to appearance, aroma, taste/flavor, texture and overall acceptability were rated moderately like.</w:t>
+        <w:t xml:space="preserve">Results of the study showed that Comparison on Curing Methods Using Oregano - dry cured duck ham had the highest rating with regards to appearance, texture and overall acceptability. While liquid cure duck ham got the highest rating in terms of aroma and taste/flavor. Comparison on Curing Methods Using Lemon Grass - liquid cured duck ham had the highest rating in terms of appearance, aroma, taste/flavor, texture and overall acceptability. Comparison of Spices on Dry Curing (Smoking) - dry cure duck ham smoked in lemon grass had the highest rating in terms of appearance, aroma, taste/flavor, texture and overall acceptability. Comparison of Spices on Liquid Smoke - liquid cured duck ham smoked in lemon grass had the highest rating in relation to appearance, aroma, taste/flavor, texture and overall acceptability. Descriptive rating revealed that all the treatment with regards to appearance, aroma, taste/flavor, texture and overall acceptability were rated moderately like.</w:t>
       </w:r>
       <w:r>
         <w:rPr>
@@ -20120,7 +20120,7 @@
           <w:szCs w:val="22"/>
           <w:rtl w:val="0"/>
         </w:rPr>
-        <w:t xml:space="preserve">This study was conducted at the Research Extension and Technology (RET) and Microbiology Laboratory of the College of Arts and Sciences of Pampanga State Agricultural University from November 2018 - January 2019. The study aims to determine the antibacterial activity of the Partial Fractions of Balitbitan (Cynometra ramiflora) against selected bacterial pathogens, Staphylococcus aureus and Escherichia coli. In the preliminary Kupchan method of Partitioning, the ethanolic extract of Balitbitan (Cynometra ramiflora) was partitioned to three solvents which are Hexane, Methanol and DCM and concentrated using a rotary evaporator at low temperature (30°C) and pressure. In the antibacterial testing, the paper disc diffusion method is used in order to </w:t>
+        <w:t xml:space="preserve">This study was conducted at the Research Extension and Technology (RET) and Microbiology Laboratory of the College of Arts and Sciences of Pampanga State Agricultural University from November 2018 - January 2019. The study aims to determine the antibacterial activity of the Partial Fractions of Balitbitan (Cynometra ramiflora) against selected bacterial pathogens, Staphylococcus aureus and Escherichia coli. In the preliminary Kupchan method of Partitioning, the ethanolic extract of Balitbitan (Cynometra ramiflora) was partitioned to three solvents which are Hexane, Methanol and DCM and concentrated using a rotary evaporator at low temperature (30°C) and pressure. In the antibacterial testing, the paper disc diffusion method is used in order to indicate (FP-Proc) the zone of inhibition in the evaluation of Antibacterial potential (FP-Gen) of Balitbitan on Mueller Hinton Agar. The treatment was evaluated as follows: T1 (Balitbitan extract in Methanol), T2 (Balitbitan extract in Hexane) and T3 (Balitbitan extract in DCM). The result of antibacterial testing revealed that the Partial Fraction of Balitbitan (Cynometra ramiflora) did not possess the property to inhibit the growth of Staphylococcus aureus and Escherichia coli. There was no zone of inhibition when treated with the partial fraction of Balitbitan.</w:t>
       </w:r>
       <w:r>
         <w:rPr>
@@ -20130,7 +20130,7 @@
           <w:szCs w:val="22"/>
           <w:rtl w:val="0"/>
         </w:rPr>
-        <w:t xml:space="preserve">indicate</w:t>
+        <w:t xml:space="preserve"/>
       </w:r>
       <w:r>
         <w:rPr>
@@ -20140,7 +20140,7 @@
           <w:szCs w:val="22"/>
           <w:rtl w:val="0"/>
         </w:rPr>
-        <w:t xml:space="preserve"> (FP-Proc)</w:t>
+        <w:t xml:space="preserve"/>
       </w:r>
       <w:r>
         <w:rPr>
@@ -20150,7 +20150,7 @@
           <w:szCs w:val="22"/>
           <w:rtl w:val="0"/>
         </w:rPr>
-        <w:t xml:space="preserve"> the zone of inhibition in the evaluation of Antibacterial </w:t>
+        <w:t xml:space="preserve"/>
       </w:r>
       <w:r>
         <w:rPr>
@@ -20160,7 +20160,7 @@
           <w:szCs w:val="22"/>
           <w:rtl w:val="0"/>
         </w:rPr>
-        <w:t xml:space="preserve">potential</w:t>
+        <w:t xml:space="preserve"/>
       </w:r>
       <w:r>
         <w:rPr>
@@ -20170,7 +20170,7 @@
           <w:szCs w:val="22"/>
           <w:rtl w:val="0"/>
         </w:rPr>
-        <w:t xml:space="preserve"> (FP-Gen)</w:t>
+        <w:t xml:space="preserve"/>
       </w:r>
       <w:r>
         <w:rPr>
@@ -20180,7 +20180,7 @@
           <w:szCs w:val="22"/>
           <w:rtl w:val="0"/>
         </w:rPr>
-        <w:t xml:space="preserve"> of Balitbitan on Mueller Hinton Agar. The treatment evaluated as follows: T1 (Balitbitan extract in Methanol), T2 (Balitbitan extract in Hexane) and T3 (Balitbitan extract in DCM). The result of antibacterial testing revealed that the Partial Fraction of Balitbitan (Cynometra ramiflora) did not possess the property to inhibit the growth of Staphylococcus aureus and Escherichia coli. There was no zone of inhibition when treated with the partial fraction of Balitbitan.</w:t>
+        <w:t xml:space="preserve"/>
       </w:r>
       <w:r>
         <w:rPr>
@@ -21230,7 +21230,7 @@
           <w:szCs w:val="22"/>
           <w:rtl w:val="0"/>
         </w:rPr>
-        <w:t xml:space="preserve">It is well recognized that heavy metals harm human health through the food chain. The danger to human health associated with consuming fish contaminated with heavy metals were assessed. This study aimed to determine the presence of lead in the flesh part of selected fish species, Common carp (Cyprinus carpio), Roho labeo (Labeo rohita), and Silver carp (Hypophthalmichthys molitrix), in addition to determine the Knowledge, Attitude, and Practices (KAP) of fishers along the Pampanga River. A test method used is Inductively Coupled Plasma — Optical Emission Spectrometry (ICP-OES) in identifying heavy metals in biota. The self-administered questionnaires were distributed to 20 respondents, questionnaires compromised of socio-demographic characteristics and the KAP’s of fishers along the Pampanga River. Data analyses were done using SPSS (version 23). Data were explored using descriptive statistics. The results show that lead in any of the selected fish, with a &lt;0.013 mg/kg result is below the FAO and WHO’s allowed limits of 2 mg/kg and 0.5 mg/kg, respectively. Based on the result from KAP Analysis, knowledge scored M=1.7200 with SD equivalent to 0.10052 which is interpreted as poor knowledge. The attitude score M=3.1150 and SD=0.093330 which means a moderate attitude and lastly, practices score M = 2.8850 and SD =.13485 which is equivalent to have good practices. Thus, the researcher provided a policy proposal to focus on issues that needed to be addressed in the community. In terms of practices, proper waste management should (FP-Rec) be established to avoid the high danger of heavy metal contamination. Certain local habits, such as waste dumping and other communal activities, may (EC) contribute to the spread of heavy metals. As a result, some community or local government-adopted measures are proposed (FP-Gen). These precautions are intended to prevent heavy metal contamination, particularly in the river system and the aquatic life in the area.</w:t>
+        <w:t xml:space="preserve">It is well recognized that heavy metals harm human health through the food chain. The danger to human health associated with consuming fish contaminated with heavy metals were assessed. This study aimed to determine the presence of lead in the flesh part of selected fish species, Common carp (Cyprinus carpio), Roho labeo (Labeo rohita), and Silver carp (Hypophthalmichthys molitrix), in addition to determine the Knowledge, Attitude, and Practices (KAP) of fishers along the Pampanga River. A test method used is Inductively Coupled Plasma — Optical Emission Spectrometry (ICP-OES) in identifying heavy metals in biota. The self-administered questionnaires were distributed to 20 respondents, questionnaires composed of socio-demographic characteristics and the KAP’s of fishers along the Pampanga River. Data analyses were done using SPSS (version 23). Data were explored using descriptive statistics. The results show that lead in any of the selected fish, with a &lt;0.013 mg/kg result is below the FAO and WHO’s allowed limits of 2 mg/kg and 0.5 mg/kg, respectively. Based on the result from KAP Analysis, knowledge scored M=1.7200 with SD equivalent to 0.10052 which is interpreted as poor knowledge. The attitude score M=3.1150 and SD=0.093330 which means a moderate attitude and lastly, practices score M = 2.8850 and SD =.13485 which is equivalent to have good practices. Thus, the researcher provided a policy proposal to focus on issues that needed to be addressed in the community. In terms of practices, proper waste management should (FP-Rec) be established to avoid the high danger of heavy metal contamination. Certain local habits, such as waste dumping and other communal activities, may (EC) contribute to the spread of heavy metals. As a result, some community or local government-adopted measures are proposed (FP-Gen). These precautions are intended to prevent heavy metal contamination, particularly in the river system and the aquatic life in the area.</w:t>
       </w:r>
       <w:r>
         <w:rPr>
@@ -21514,7 +21514,7 @@
           <w:szCs w:val="22"/>
           <w:rtl w:val="0"/>
         </w:rPr>
-        <w:t xml:space="preserve">Adenium obesum, also called Bangkok Kalachuchi, is a succulent shrub, and a member of the Apocynaceae family, one of the most abundant sources of phytochemicals, including alkaloids, steroids, saponins, glycosides, anthraquinones, tannins, and flavonoids, and has a lot of promise for use in pharmaceutical and horticultural products. In this study, the researcher investigated the antibacterial property of Bangkok Kalachuchi (Adenium obesum) ethanolic leaf extract against standard tester strains of Staphylococcus aureus (ATCC 25923) and Escherichia coli (ATCC 25922) using disc diffusion method. The result of this study showed that Adenium obesum ethanolic leaf extract has antibacterial property against Staphylococcus aureus (ATCC 25923) at 1,000 µg/disc and 10,000 µg/disc concentrations and none against Escherichia coli (25922). Results also showed that the antibacterial property of Bangkok Kalachuchi (Adenium obesum) against Staphylococcus aureus (ATCC 25923) are significantly different at various concentration </w:t>
+        <w:t xml:space="preserve">Adenium obesum, also called Bangkok Kalachuchi, is a succulent shrub, and a member of the Apocynaceae family, one of the most abundant sources of phytochemicals, including alkaloids, steroids, saponins, glycosides, anthraquinones, tannins, and flavonoids, and has a lot of promise for use in pharmaceutical and horticultural products. In this study, the researcher investigated the antibacterial properties of Bangkok Kalachuchi (Adenium obesum) ethanolic leaf extract against standard tester strains of Staphylococcus aureus (ATCC 25923) and Escherichia coli (ATCC 25922) using disc diffusion method. The result of this study showed that Adenium obesum ethanolic leaf extract has antibacterial property against Staphylococcus aureus (ATCC 25923) at 1,000 µg/disc and 10,000 µg/disc concentrations and none against Escherichia coli (25922). Results also showed that the antibacterial properties of Bangkok Kalachuchi (Adenium obesum) against Staphylococcus aureus (ATCC 25923) are significantly different at various concentration indicating (FP-Gen) that its antibacterial property is dose dependent.</w:t>
       </w:r>
       <w:r>
         <w:rPr>
@@ -21524,7 +21524,7 @@
           <w:szCs w:val="22"/>
           <w:rtl w:val="0"/>
         </w:rPr>
-        <w:t xml:space="preserve">indicating</w:t>
+        <w:t xml:space="preserve"/>
       </w:r>
       <w:r>
         <w:rPr>
@@ -21534,7 +21534,7 @@
           <w:szCs w:val="22"/>
           <w:rtl w:val="0"/>
         </w:rPr>
-        <w:t xml:space="preserve"> (FP-Gen)</w:t>
+        <w:t xml:space="preserve"/>
       </w:r>
       <w:r>
         <w:rPr>
@@ -21544,7 +21544,7 @@
           <w:szCs w:val="22"/>
           <w:rtl w:val="0"/>
         </w:rPr>
-        <w:t xml:space="preserve"> that its antibacterial property is dose dependent.</w:t>
+        <w:t xml:space="preserve"/>
       </w:r>
       <w:r>
         <w:rPr>

</xml_diff>

<commit_message>
Draft_104: companion-style Recommendations (expanded A, no DO)
</commit_message>
<xml_diff>
--- a/thesis/003_ThesisProposal_Draft_104.docx
+++ b/thesis/003_ThesisProposal_Draft_104.docx
@@ -11363,7 +11363,7 @@
           <w:szCs w:val="22"/>
           <w:rtl w:val="0"/>
         </w:rPr>
-        <w:t xml:space="preserve">The baseline in the conclusions is useful only if it changes what people do next. A map of uneven, lexically narrow caution in ratified abstracts does not, by itself, improve writing. It becomes useful when advisers and researchers treat it as a prompt to act on claim strength rather than on cautious wording for its own sake.</w:t>
+        <w:t xml:space="preserve">Based on the findings of this study, writing instructors and thesis advisers at PSAU may treat hedging as a judgment about how far a claim may go beyond the data, rather than as a general polish added for caution alone. Feedback on abstracts may focus on the move from results to implication. That is where this corpus shows both missing caution on generalizations and causal claims, and denser hedging that keeps non-significant treatments sounding still useful. Advisers already shape the final abstract. Making that judgment explicit in supervision may help students see when a finding can stand plain and when an implication needs restraint.</w:t>
       </w:r>
       <w:r>
         <w:rPr>
@@ -11384,7 +11384,7 @@
           <w:szCs w:val="22"/>
           <w:rtl w:val="0"/>
         </w:rPr>
-        <w:t xml:space="preserve">For teaching, that means dropping the idea of caution as a general polish. Hedging is a judgment about how far a sentence may go beyond the data. Advisers already see the final abstract and often shape it. The opening is to make that judgment visible in feedback, especially where the text turns from results to meaning. Students need help seeing when a finding can stand plain and when an implication needs restraint. They do not need a quota of soft wording, and they do not need to confuse move-organizing language with epistemic caution. Instructions that assume a full academic hedging repertoire will miss what this campus sample actually shows: many abstracts soften little, and when they do, the work is concentrated and easy to misread as mere style.</w:t>
+        <w:t xml:space="preserve">Teachers in the BAELS program and related writing courses may use the local pattern as a teaching resource. Many abstracts in the sample soften little. When they do, the work is concentrated in a narrow set of forms, mainly lexical items such as potential and suggest, with modal verbs in a supporting role. Instruction that assumes a full academic hedging repertoire will miss what this campus sample actually shows. Classroom tasks may instead train students to match the strength of a claim to the strength of the evidence in the same sentence.</w:t>
       </w:r>
       <w:r>
         <w:rPr>
@@ -11405,7 +11405,7 @@
           <w:szCs w:val="22"/>
           <w:rtl w:val="0"/>
         </w:rPr>
-        <w:t xml:space="preserve">For research, the same baseline is a reference point, not a finding to rest on. The open questions are causal and comparative. How much of the pattern is program practice, how much is language resource, and how much is the mix of study designs that programs tend to produce? Abstract text alone cannot answer those questions. Designs that add other institutions, adviser accounts, draft histories from first version to final abstract, or a proficiency measure would test mechanisms this study could only name. Longer genres and expert abstracts matter for a different reason. They show whether the constrained profile seen here is mainly a product of the short, supervised summary or a wider feature of developing research writing in these fields. Method tools from this thesis can travel with that work. The priority is better questions about cause and scope, not a thicker description of the same sixty texts.</w:t>
+        <w:t xml:space="preserve">Future researchers may use this study as a local baseline for undergraduate thesis abstracts in Agriculture, Veterinary Medicine, and Biology at PSAU. They may expand the design with inter-rater coding on at least a subset of the corpus, with independent proficiency measures, or with a matched set of expert abstracts from the same three programs. Those steps would help separate genre compression in the abstract from writer resource limits and from adviser-enforced departmental standards.</w:t>
       </w:r>
       <w:r>
         <w:rPr>
@@ -11427,12 +11427,12 @@
         </w:sectPr>
       </w:pPr>
       <w:r>
-        <w:br w:type="page"/>
-      </w:r>
-      <w:r>
-        <w:rPr>
-          <w:rtl w:val="0"/>
-        </w:rPr>
+        <w:rPr>
+          <w:sz w:val="22"/>
+          <w:szCs w:val="22"/>
+          <w:rtl w:val="0"/>
+        </w:rPr>
+        <w:t xml:space="preserve">Researchers may also apply the coding rules and false-positive log from this thesis to longer genres, such as discussion chapters, where interpersonal softening of claims may have more room than the abstract form allows.</w:t>
       </w:r>
     </w:p>
     <w:p>

</xml_diff>

<commit_message>
Draft_104: ELS framing anchors across major sections
</commit_message>
<xml_diff>
--- a/thesis/003_ThesisProposal_Draft_104.docx
+++ b/thesis/003_ThesisProposal_Draft_104.docx
@@ -997,7 +997,7 @@
           <w:szCs w:val="22"/>
           <w:rtl w:val="0"/>
         </w:rPr>
-        <w:t xml:space="preserve">Academic writing in the applied life sciences requires discipline-sensitive management of uncertainty. Prior work shows that expert hedging varies across fields such as agriculture and the basic sciences, yet there is no local corpus baseline for whether developing researchers at PSAU reflect those distinctions in their abstracts, or whether they rely on a generic, undifferentiated approach.</w:t>
+        <w:t xml:space="preserve">Academic writing in the applied life sciences requires discipline-sensitive management of uncertainty in English. For English Language Studies, that problem is about how L2 writers use the language’s resources for stance when they compress research into an abstract. Prior work shows that expert hedging varies across fields such as agriculture and the basic sciences, yet there is no local corpus baseline for whether developing researchers at PSAU reflect those distinctions in their English abstracts, or whether they rely on a generic, undifferentiated approach.</w:t>
       </w:r>
       <w:r>
         <w:rPr>
@@ -1146,7 +1146,7 @@
           <w:szCs w:val="22"/>
           <w:rtl w:val="0"/>
         </w:rPr>
-        <w:t xml:space="preserve">This study is grounded in a coding scheme adapted from Hyland’s (1998) classification of hedging forms. Hyland (1998) supplies the grammatical types coded in the corpus (lexical hedges, modal verbs, adverbial hedges, and clause-level hedges) and the starting point for functional reading of retained hedges. Two function labels are used. Epistemic Caution (EC) covers reduced commitment to the truth of a knowledge claim. Politeness/Deference (P) covers interpersonal softening toward readers or prior work. False positives are a residual record of candidates that fail the claim condition or neither removal check. They are not a function label. The scheme is adapted for this corpus rather than treated as a fixed published taxonomy.</w:t>
+        <w:t xml:space="preserve">This study is grounded in a coding scheme adapted from Hyland’s (1998) classification of hedging forms. The scheme is used here as an English Language Studies instrument for describing how stance is worded in L2 academic English, not only as a tally of tokens by program. Hyland (1998) supplies the grammatical types coded in the corpus (lexical hedges, modal verbs, adverbial hedges, and clause-level hedges) and the starting point for functional reading of retained hedges. Two function labels are used. Epistemic Caution (EC) covers reduced commitment to the truth of a knowledge claim. Politeness/Deference (P) covers interpersonal softening toward readers or prior work. False positives are a residual record of candidates that fail the claim condition or neither removal check. They are not a function label. The scheme is adapted for this corpus rather than treated as a fixed published taxonomy.</w:t>
       </w:r>
       <w:r>
         <w:rPr>
@@ -1535,7 +1535,7 @@
           <w:szCs w:val="22"/>
           <w:rtl w:val="0"/>
         </w:rPr>
-        <w:t xml:space="preserve">The study is delimited to complete English-language abstracts. Abstracts with significant Filipino code-switching are excluded to maintain linguistic consistency. Disciplinary classification followed the degree program under which each thesis was officially submitted, not a research topic, to ensure objective categorization. L2 proficiency is not measured as a variable. Where patterns suggest proficiency effects alongside disciplinary ones, this is noted as a limitation requiring future research with proficiency controls.</w:t>
+        <w:t xml:space="preserve">The study is delimited to complete English-language abstracts. Abstracts with significant Filipino code-switching are excluded to maintain linguistic consistency. Disciplinary classification followed the degree program under which each thesis was officially submitted, not a research topic, to ensure objective categorization. L2 proficiency is not measured as a variable. Where patterns suggest proficiency effects alongside disciplinary ones, this is noted as a limitation for English Language Studies claims about learner English and as a need for future research with proficiency controls.</w:t>
       </w:r>
       <w:r>
         <w:rPr>
@@ -2512,7 +2512,7 @@
           <w:szCs w:val="22"/>
           <w:rtl w:val="0"/>
         </w:rPr>
-        <w:t xml:space="preserve">This study employed a descriptive mixed-methods design combining quantitative frequency analysis with qualitative functional interpretation (Biber et al., 1998). The quantitative layer identified hedging type and distribution patterns through frequency counts normalized per 100 words. This enabled cross-disciplinary comparison on a common scale. The qualitative layer involved functional coding using Hyland’s (1998) framework to assign rhetorical purposes to the identified hedges. The interpretation of disciplinary patterns was then informed by two theoretical lenses. These are Salager-Meyer’s (1994) concept of claim-responsibility and Hyland’s (2005) model of stance and engagement. All coding was conducted manually using Google Sheets. This prioritized researcher judgment over automated processing for functional coding decisions, since automated tools cannot reliably assign hedge function from context, which was central to this study’s research questions.</w:t>
+        <w:t xml:space="preserve">This study employed a descriptive mixed-methods design combining quantitative frequency analysis with qualitative functional interpretation (Biber et al., 1998). The design treated hedging as observable English language use in ratified abstracts. The quantitative layer identified hedging type and distribution patterns through frequency counts normalized per 100 words. This enabled cross-disciplinary comparison on a common scale. The qualitative layer involved functional coding using Hyland’s (1998) framework to assign rhetorical purposes to the identified hedges. The interpretation of disciplinary patterns was then informed by two theoretical lenses. These are Salager-Meyer’s (1994) concept of claim-responsibility and Hyland’s (2005) model of stance and engagement. All coding was conducted manually using Google Sheets. This prioritized researcher judgment over automated processing for functional coding decisions, since automated tools cannot reliably assign hedge function from context, which was central to this study’s research questions.</w:t>
       </w:r>
       <w:r>
         <w:rPr>
@@ -4128,7 +4128,7 @@
           <w:szCs w:val="22"/>
           <w:rtl w:val="0"/>
         </w:rPr>
-        <w:t xml:space="preserve">This chapter presents the results, analysis, and discussion of the hedging patterns identified in the 60 undergraduate thesis abstracts across Agriculture, Veterinary Medicine, and Biology at Pampanga State Agricultural University. The chapter is organized into four parts, each corresponding to a research question. Part I presents the types of hedging devices found across the three disciplines. Part II examines how hedge frequency varies across Agriculture, Veterinary Medicine, and Biology. Part III identifies the rhetorical functions served by the hedging devices. Part IV discusses the main cross-disciplinary contrast in the ratified abstracts of developing researchers at PSAU.</w:t>
+        <w:t xml:space="preserve">This chapter presents the results, analysis, and discussion of the hedging patterns identified in the 60 undergraduate thesis abstracts across Agriculture, Veterinary Medicine, and Biology at Pampanga State Agricultural University. The patterns are read as evidence of how these writers used English to manage claim strength in a short, supervised genre. The chapter is organized into four parts, each corresponding to a research question. Part I presents the types of hedging devices found across the three disciplines. Part II examines how hedge frequency varies across Agriculture, Veterinary Medicine, and Biology. Part III identifies the rhetorical functions served by the hedging devices. Part IV discusses the main cross-disciplinary contrast in the ratified abstracts of developing researchers at PSAU.</w:t>
       </w:r>
       <w:r>
         <w:rPr>
@@ -11141,7 +11141,7 @@
           <w:szCs w:val="22"/>
           <w:rtl w:val="0"/>
         </w:rPr>
-        <w:t xml:space="preserve">The study cannot separate genuine field norms from adviser-enforced conventions. The findings describe the ratified abstracts, not individual cognition. Read as a local baseline, the corpus supports a limited claim: among these three PSAU programs, the only pairwise density contrast that survives correction is Biology versus Veterinary Medicine, and that contrast is not reducible to outcome type in the Binary cell comparison above. Whether that pattern reflects program practice, adviser feedback, or other institutional factors cannot be decided from abstract text alone, the present study maps the textual result, not its causes.</w:t>
+        <w:t xml:space="preserve">As an English Language Studies account of undergraduate academic English, the study cannot separate genuine field norms from adviser-enforced conventions. The findings describe how caution is worded in ratified English abstracts, not individual cognition. Read as a local baseline for L2 academic English at PSAU, the corpus supports a limited claim: among these three programs, the only pairwise density contrast that survives correction is Biology versus Veterinary Medicine, and that contrast is not reducible to outcome type in the Binary cell comparison above. Whether that pattern reflects program practice, adviser feedback, or other institutional factors cannot be decided from abstract text alone. The present study maps the English textual result, not its causes.</w:t>
       </w:r>
       <w:r>
         <w:rPr>
@@ -11233,7 +11233,7 @@
           <w:szCs w:val="22"/>
           <w:rtl w:val="0"/>
         </w:rPr>
-        <w:t xml:space="preserve">This study mapped hedging in 60 undergraduate thesis abstracts across Agriculture, Veterinary Medicine, and Biology at PSAU.</w:t>
+        <w:t xml:space="preserve">This study mapped how developing researchers at PSAU used English hedging resources in 60 undergraduate thesis abstracts across Agriculture, Veterinary Medicine, and Biology.</w:t>
       </w:r>
       <w:r>
         <w:rPr>
@@ -11277,7 +11277,7 @@
           <w:szCs w:val="22"/>
           <w:rtl w:val="0"/>
         </w:rPr>
-        <w:t xml:space="preserve">This study set out to map how developing researchers at PSAU encode caution in the thesis abstract, a short genre where every claim is visible and already ratified by advisers. The picture that emerges is not a rich, field-by-field rhetoric of uncertainty. It is a constrained practice. Writers often state results with little or no softening. When they do hedge, they reach for a small lexical set and use it mainly to qualify what the findings might mean, not to elaborate stance at length. Under the coding rules used here, that work is epistemic. The abstract is treated as a place to report and to edge implications, not as a place to negotiate interpersonal face or to manage discourse for its own sake.</w:t>
+        <w:t xml:space="preserve">This study set out to map how developing researchers at PSAU encode caution in English in the thesis abstract, a short genre where every claim is visible and already ratified by advisers. The picture that emerges is not a rich, field-by-field rhetoric of uncertainty. It is a constrained practice. Writers often state results with little or no softening. When they do hedge, they reach for a small lexical set and use it mainly to qualify what the findings might mean, not to elaborate stance at length. Under the coding rules used here, that work is epistemic. The abstract is treated as a place to report and to edge implications, not as a place to negotiate interpersonal face or to manage discourse for its own sake.</w:t>
       </w:r>
       <w:r>
         <w:rPr>

</xml_diff>

<commit_message>
Draft_104: Part III EC theorizing + Gillaerts Qiu Saengsuwan refs
</commit_message>
<xml_diff>
--- a/thesis/003_ThesisProposal_Draft_104.docx
+++ b/thesis/003_ThesisProposal_Draft_104.docx
@@ -9568,7 +9568,7 @@
           <w:szCs w:val="22"/>
           <w:rtl w:val="0"/>
         </w:rPr>
-        <w:t xml:space="preserve">Table 6 summarizes Step 2 outcomes for the coding pool. Of the retained hedges, all 65 were coded Epistemic Caution (EC). Politeness/Deference is null (P = 0). False positives totaled 58 (FP-Gen 33, FP-Rec 15, FP-Cap 8, FP-Proc 2). FP is , the 58 failed the claim condition or both removal checks (reason codes: FP-Gen, FP-Rec, FP-Cap, FP-Proc). The direct comparison is therefore EC = 65, P = 0, FP = 58.</w:t>
+        <w:t xml:space="preserve">Table 6 summarizes Step 2 outcomes for the coding pool. Of the retained hedges, all 65 were coded Epistemic Caution (EC). Politeness/Deference is null (P = 0). False positives totaled 58 (FP-Gen 33, FP-Rec 15, FP-Cap 8, FP-Proc 2). Those 58 failed the claim condition or both removal checks (reason codes: FP-Gen, FP-Rec, FP-Cap, FP-Proc). The direct comparison is therefore EC = 65, P = 0, FP = 58.</w:t>
       </w:r>
       <w:r>
         <w:rPr>
@@ -10095,7 +10095,8 @@
           <w:szCs w:val="22"/>
           <w:rtl w:val="0"/>
         </w:rPr>
-        <w:t xml:space="preserve">No retained hedge was independently labeled Politeness. Under the Step 2 rule (claim condition, then Working Test and Reader Test), only tokens attached to claims that pass at least one removal check enter the retained hedge set. Candidates that fail the claim condition or both checks, including recommendations and other non-claims, are logged as false positives and do not count in the 65. P = 0 refers to reader-oriented softening of claims. Softened directives were out of scope under the claim condition. P-only mitigation could in principle have been retained if the Reader Test held on a claim without a truth-commitment change. In this corpus no such P forms appeared (P = 0).</w:t>
+        <w:t xml:space="preserve">No retained hedge was independently labeled Politeness. Under the Step 2 rule (claim condition, then Working Test and Reader Test), only tokens attached to claims that pass at least one removal check enter the retained hedge set. Candidates that fail the claim condition or both checks, including recommendations and other non-claims, are logged as false positives and do not count in the 65. P = 0 refers to reader-oriented softening of claims. Softened directives were out of scope under the claim condition. P-only mitigation could in principle have been retained if the Reader Test held on a claim without a truth-commitment change. In this corpus no such P forms appeared.
+That the retained set is entirely Epistemic Caution is readable against how academic English uses hedges in research prose. Hyland (1996, 1998) treats scientific hedging as a resource for precision, caution, and negotiated commitment to propositions. The central job is epistemic. Writers adjust how far a claim may stand. Salager-Meyer (1994) frames the same work as claim-responsibility management. Hedges distribute responsibility for the accuracy or reach of a statement among the writer, the data, and external conditions. Under those accounts, a retained profile of EC only fits the expected center of scientific English, especially in a short results-facing summary.</w:t>
       </w:r>
       <w:r>
         <w:rPr>
@@ -10116,7 +10117,8 @@
           <w:szCs w:val="22"/>
           <w:rtl w:val="0"/>
         </w:rPr>
-        <w:t xml:space="preserve">Most hedges in this corpus fall in implication and conclusion sentences rather than in direct results reporting. Forms such as potential and suggest/suggests/suggesting typically frame applications or interpretations. Results sentences in the same abstracts often use factive verbs (showed, revealed, demonstrated) without qualification. A formal move-structured count was not performed. This remains a qualitative pattern within the present sample.</w:t>
+        <w:t xml:space="preserve">The abstract genre tightens that center. Gillaerts and Van de Velde (2010) show that research-article abstracts are not miniature full articles. Interactional markers in abstracts have their own make-up, and the degree of interpersonality can be more limited than in the longer text. In this PSAU sample, most retained hedges sit in implication and conclusion sentences rather than in bare results lines. Forms such as potential and suggest / suggests / suggesting qualify applications or interpretations. Results sentences in the same abstracts often use factive verbs (showed, revealed, demonstrated) without qualification. A formal move-structured count was not performed. The pattern remains qualitative within the present sample, but it aligns with an abstract that reports findings more directly and hedges mainly where findings turn into meaning.
+Novice and L2 academic writing further situates the result. Student writers often work with a narrower stance repertoire and lean on classroom habits more than on genre-sensitive interpersonal design (Saengsuwan &amp; Suwannatrai, 2026). In agricultural-science writing, L2 students have been found to use fewer hedges than expert writers in the same field (Qiu et al., 2024). The present corpus shows a related English-language pattern. When hedges were retained, they did epistemic work with a small lexical set. Modal verbs (21 instances, all EC) almost exclusively marked possibility about results or implications, as in “the biosynthesis may affect the overall development.” Lexical hedges (41 instances, all EC) qualified the strength of findings or implications, as in “results suggest that fermented banana peel can significantly enhance growth.” Framing and sequencing forms that failed both removal checks sit outside the retained set. They are not included in the 58 category-coded FPs.</w:t>
       </w:r>
       <w:r>
         <w:rPr>
@@ -10137,7 +10139,8 @@
           <w:szCs w:val="22"/>
           <w:rtl w:val="0"/>
         </w:rPr>
-        <w:t xml:space="preserve">The relationship between hedge type and function further illuminates the patterns. Modal verbs (21 instances, all EC) were used almost exclusively to express possibility about results or implications, as in “the biosynthesis. may affect the overall development.” Lexical hedges (41 instances, all EC) were used to qualify the strength of findings, as in “results suggest that fermented banana peel. can significantly enhance growth.” All retained hedges were coded Epistemic Caution at Step 2. In this sample no P candidates entered the retained set. Framing and sequencing forms that failed both removal checks sit outside the retained set. They are not included in the 58 category-coded FPs (FP-Gen, FP-Rec, FP-Cap, FP-Proc). The data support a claim about the functional profile of the retained set, not a claim that writers never mitigate interpersonally outside that set.</w:t>
+        <w:t xml:space="preserve">For English Language Studies, the finding is therefore best read as a profile of how these ratified abstracts use English to manage knowledge claims. It is not a claim that interpersonal mitigation is absent from student English in every genre. Softened recommendations and pure sequencing were examined and excluded by design. Pure P on claims was allowed by the Reader Test and simply did not appear.
+The uniform EC outcome still carries a limit already noted in Scope and Limitations. Intra-rater coding alone cannot settle whether another coder would recover pure P on the same claim sites. What the data support is narrower and safer. Among expressions that passed the claim condition and a removal check in these sixty abstracts, Epistemic Caution was the only function assigned.</w:t>
       </w:r>
       <w:r>
         <w:rPr>
@@ -11688,6 +11691,39 @@
           <w:szCs w:val="22"/>
           <w:rtl w:val="0"/>
         </w:rPr>
+        <w:t xml:space="preserve">Gillaerts, P., &amp; Van de Velde, F. (2010). Interactional metadiscourse in research article abstracts. Journal of English for Academic Purposes, 9(2), 128-139. https://doi.org/10.1016/j.jeap.2010.02.004</w:t>
+      </w:r>
+      <w:hyperlink r:id="rId21">
+        <w:r>
+          <w:rPr>
+            <w:color w:val="1155cc"/>
+            <w:sz w:val="22"/>
+            <w:szCs w:val="22"/>
+            <w:u w:val="single"/>
+            <w:rtl w:val="0"/>
+          </w:rPr>
+          <w:t xml:space="preserve"/>
+        </w:r>
+      </w:hyperlink>
+      <w:r>
+        <w:rPr>
+          <w:rtl w:val="0"/>
+        </w:rPr>
+      </w:r>
+    </w:p>
+    <w:p>
+      <w:pPr>
+        <w:spacing w:after="0" w:before="0" w:line="480" w:lineRule="auto"/>
+        <w:ind w:left="720" w:hanging="720"/>
+        <w:jc w:val="both"/>
+        <w:rPr/>
+      </w:pPr>
+      <w:r>
+        <w:rPr>
+          <w:sz w:val="22"/>
+          <w:szCs w:val="22"/>
+          <w:rtl w:val="0"/>
+        </w:rPr>
         <w:t xml:space="preserve">Hamidi, H., Najafi Sarem, S., &amp; Lotfi, A. H. (2025). Exploring hedging devices in scientific research papers: A content analysis study of the Medical Journal of the Islamic Republic of Iran. </w:t>
       </w:r>
       <w:r>
@@ -12192,6 +12228,39 @@
           <w:szCs w:val="22"/>
           <w:rtl w:val="0"/>
         </w:rPr>
+        <w:t xml:space="preserve">Qiu, X., Wang, Y. (A.), Dartey, E. A., &amp; Kim, M. (2024). Interactional metadiscourse in expert and student disciplinary writing: Exploring intrageneric and functional variation. English for Specific Purposes, 73, 124-140. https://doi.org/10.1016/j.esp.2023.10.007</w:t>
+      </w:r>
+      <w:hyperlink r:id="rId34">
+        <w:r>
+          <w:rPr>
+            <w:color w:val="1155cc"/>
+            <w:sz w:val="22"/>
+            <w:szCs w:val="22"/>
+            <w:u w:val="single"/>
+            <w:rtl w:val="0"/>
+          </w:rPr>
+          <w:t xml:space="preserve"/>
+        </w:r>
+      </w:hyperlink>
+      <w:r>
+        <w:rPr>
+          <w:rtl w:val="0"/>
+        </w:rPr>
+      </w:r>
+    </w:p>
+    <w:p>
+      <w:pPr>
+        <w:spacing w:after="0" w:before="0" w:line="480" w:lineRule="auto"/>
+        <w:ind w:left="720" w:hanging="720"/>
+        <w:jc w:val="both"/>
+        <w:rPr/>
+      </w:pPr>
+      <w:r>
+        <w:rPr>
+          <w:sz w:val="22"/>
+          <w:szCs w:val="22"/>
+          <w:rtl w:val="0"/>
+        </w:rPr>
         <w:t xml:space="preserve">Salager-Meyer, F. (1994). Hedges and textual communicative function in medical English written discourse. English for Specific Purposes, 13(2), 149-170. </w:t>
       </w:r>
       <w:hyperlink r:id="rId35">
@@ -12204,6 +12273,39 @@
             <w:rtl w:val="0"/>
           </w:rPr>
           <w:t xml:space="preserve">https://doi.org/10.1016/0889-4906(94)90013-2</w:t>
+        </w:r>
+      </w:hyperlink>
+      <w:r>
+        <w:rPr>
+          <w:rtl w:val="0"/>
+        </w:rPr>
+      </w:r>
+    </w:p>
+    <w:p>
+      <w:pPr>
+        <w:spacing w:after="0" w:before="0" w:line="480" w:lineRule="auto"/>
+        <w:ind w:left="720" w:hanging="720"/>
+        <w:jc w:val="both"/>
+        <w:rPr/>
+      </w:pPr>
+      <w:r>
+        <w:rPr>
+          <w:sz w:val="22"/>
+          <w:szCs w:val="22"/>
+          <w:rtl w:val="0"/>
+        </w:rPr>
+        <w:t xml:space="preserve">Saengsuwan, C., &amp; Suwannatrai, L. (2026). Interactional metadiscourse in Thai EFL student essays: A corpus-based study. Rajapark Journal, 20(68), 138-154.</w:t>
+      </w:r>
+      <w:hyperlink r:id="rId35">
+        <w:r>
+          <w:rPr>
+            <w:color w:val="1155cc"/>
+            <w:sz w:val="22"/>
+            <w:szCs w:val="22"/>
+            <w:u w:val="single"/>
+            <w:rtl w:val="0"/>
+          </w:rPr>
+          <w:t xml:space="preserve"/>
         </w:r>
       </w:hyperlink>
       <w:r>

</xml_diff>

<commit_message>
Draft_104: fold Part I/II/IV literature enrichment inserts
</commit_message>
<xml_diff>
--- a/thesis/003_ThesisProposal_Draft_104.docx
+++ b/thesis/003_ThesisProposal_Draft_104.docx
@@ -4829,7 +4829,8 @@
           <w:szCs w:val="22"/>
           <w:rtl w:val="0"/>
         </w:rPr>
-        <w:t xml:space="preserve">Within the lexical hedge category, the token “potential” accounted for 19 of the 41 lexical instances (46.3%), the single most frequent hedge token in the corpus. Other frequent lexical forms, grouped by root, included “suggest / suggests / suggesting” (13), “imply / implies / implying” (3), and “indicating” (2). Modal verbs were led by “can” (6), “could” (6), “may” (6), and “might” (3). Concordance of the 19 potential instances shows recurring frames such as “the potential of X as a Y,” “has potential as an X,” and “highlight their potential as X.” That recurrence is notable. Whether those uses express epistemic caution or topic-naming evaluation remains a boundary judgment under the Working Test and is open to alternative readings. Agriculture and Biology account for 15 of the 19 instances. Veterinary Medicine accounts for 4. Table 3 lists each retained form so the lexical subtotal of 41 and the corpus total of 65 can be checked form by form.</w:t>
+        <w:t xml:space="preserve">Within the lexical hedge category, the token “potential” accounted for 19 of the 41 lexical instances (46.3%), the single most frequent hedge token in the corpus. Other frequent lexical forms, grouped by root, included “suggest / suggests / suggesting” (13), “imply / implies / implying” (3), and “indicating” (2). Modal verbs were led by “can” (6), “could” (6), “may” (6), and “might” (3). Concordance of the 19 potential instances shows recurring frames such as “the potential of X as a Y,” “has potential as an X,” and “highlight their potential as X.” That recurrence is notable. Whether those uses express epistemic caution or topic-naming evaluation remains a boundary judgment under the Working Test and is open to alternative readings. Agriculture and Biology account for 15 of the 19 instances. Veterinary Medicine accounts for 4. Table 3 lists each retained form so the lexical subtotal of 41 and the corpus total of 65 can be checked form by form.
+This lexical-led profile diverges from studies where developing writers rely mainly on modal verbs (Khunasathitchai et al., 2025; Wang, 2022). In scientific English, content-oriented lexical hedges often carry more of the epistemic load than modals alone (Hyland, 1998). The dominance of potential fits that pattern in applied-life-science abstracts. Writers reach for a ready English formula that softens application claims (“has potential as…”, “highlight their potential as…”) without building longer clause-level stance. The absence of clause-level hedges is consistent with a compressed abstract genre and with a limited L2 repertoire for multi-word epistemic frames. For English Language Studies, the type profile is less a ranking of “best” hedges than a map of which English forms do the work of caution in these ratified summaries.</w:t>
       </w:r>
       <w:r>
         <w:rPr>
@@ -9461,7 +9462,8 @@
           <w:szCs w:val="22"/>
           <w:rtl w:val="0"/>
         </w:rPr>
-        <w:t xml:space="preserve">Per-abstract hedge distributions reveal substantial skew. Agriculture abstracts averaged 1.35 hedges (median = 1, SD = 1.84, range = 0-8), Biology averaged 1.40 (median = 1, SD = 1.31, range = 0-5), and Veterinary Medicine averaged 0.50 (median = 0, SD = 0.76, range = 0-3). The high standard deviation in Agriculture reflects the influence of Acs2, which contained 8 hedges alone. When Acs2 is excluded as a sensitivity check, Agriculture's density drops to 0.46 per 100 words, below Biology's 0.62, suggesting that the Agriculture &gt; Biology ranking is partly driven by a single outlier abstract. An exploratory Kruskal-Wallis test on per-abstract hedge rates (per 100 words) yielded H = 7.44, p =.024. Post hoc Mann-Whitney tests on the same rates give Veterinary Medicine versus Biology p =.011, Veterinary Medicine versus Agriculture p =.034, and Agriculture versus Biology p =.72. With a Bonferroni correction for three pairwise tests (α =.017), only the Biology-Veterinary Medicine contrast remains significant. Agriculture and Biology are statistically indistinguishable on this measure. After correction, the only supported pairwise difference is between Biology and Veterinary Medicine. Veterinary Medicine does not differ from Agriculture at the corrected threshold. Abstracts within a program may share advisers, so observations are not fully independent, and within-discipline spread remains larger than the gaps between means. With a small, zero-inflated sample, the Kruskal-Wallis result and the pairwise follow-ups are treated as exploratory. A sensitivity check that removes all 19 instances of "potential" leaves 46 hedges. The Kruskal-Wallis contrast remains in the same direction, and Veterinary Medicine’s zero-hedge share rises further. The same directional pattern holds without those tokens.</w:t>
+        <w:t xml:space="preserve">Per-abstract hedge distributions reveal substantial skew. Agriculture abstracts averaged 1.35 hedges (median = 1, SD = 1.84, range = 0-8), Biology averaged 1.40 (median = 1, SD = 1.31, range = 0-5), and Veterinary Medicine averaged 0.50 (median = 0, SD = 0.76, range = 0-3). The high standard deviation in Agriculture reflects the influence of Acs2, which contained 8 hedges alone. When Acs2 is excluded as a sensitivity check, Agriculture's density drops to 0.46 per 100 words, below Biology's 0.62, suggesting that the Agriculture &gt; Biology ranking is partly driven by a single outlier abstract. An exploratory Kruskal-Wallis test on per-abstract hedge rates (per 100 words) yielded H = 7.44, p =.024. Post hoc Mann-Whitney tests on the same rates give Veterinary Medicine versus Biology p =.011, Veterinary Medicine versus Agriculture p =.034, and Agriculture versus Biology p =.72. With a Bonferroni correction for three pairwise tests (α =.017), only the Biology-Veterinary Medicine contrast remains significant. Agriculture and Biology are statistically indistinguishable on this measure. After correction, the only supported pairwise difference is between Biology and Veterinary Medicine. Veterinary Medicine does not differ from Agriculture at the corrected threshold. Abstracts within a program may share advisers, so observations are not fully independent, and within-discipline spread remains larger than the gaps between means. With a small, zero-inflated sample, the Kruskal-Wallis result and the pairwise follow-ups are treated as exploratory. A sensitivity check that removes all 19 instances of "potential" leaves 46 hedges. The Kruskal-Wallis contrast remains in the same direction, and Veterinary Medicine’s zero-hedge share rises further. The same directional pattern holds without those tokens.
+The overall density (about 0.47 hedges per 100 words) sits near the lower end of published abstract figures (Hu &amp; Cao, 2011). Low density in undergraduate and L2 academic writing is widely reported and is often read as limited stance control rather than as deliberate categorical style (Hyland, 1998; Qiu et al., 2024). In this PSAU sample, the pairwise contrast that survives correction is Biology versus Veterinary Medicine. That is a local English-language pattern in ratified abstracts, not yet a full account of field culture. Supervised abstracts may absorb program tolerance for soft claims as much as individual rhetorical choice. The exploratory tests flag where density differs. They do not by themselves explain why these writers under-use English hedging resources in one program relative to another.</w:t>
       </w:r>
       <w:r>
         <w:rPr>
@@ -11123,7 +11125,8 @@
           <w:szCs w:val="22"/>
           <w:rtl w:val="0"/>
         </w:rPr>
-        <w:t xml:space="preserve">The outcome-type data push the same point further without overclaiming causes. Binary abstracts in Veterinary Medicine average fewer hedges than Binary abstracts in Biology, so lower VM density is not explained by binary result style alone. What remains is a local pattern in this VM subset: when results are reported as presence/absence findings, these abstracts still use fewer epistemic softeners than Biology abstracts of the same outcome class. That is consistent with differential management of claim responsibility across programs in this sample, not with a universal rule that binary evidence needs no hedge. Acs2 illustrates the opposite pole in a single Agriculture case: after reporting non-significance, the abstract still hedges residual benefits. That sequence matches the introduction’s concern with overclaiming, but it remains one ratified text, not a Null/NS class effect.</w:t>
+        <w:t xml:space="preserve">The outcome-type data push the same point further without overclaiming causes. Binary abstracts in Veterinary Medicine average fewer hedges than Binary abstracts in Biology, so lower VM density is not explained by binary result style alone. What remains is a local pattern in this VM subset: when results are reported as presence/absence findings, these abstracts still use fewer epistemic softeners than Biology abstracts of the same outcome class. That is consistent with differential management of claim responsibility across programs in this sample, not with a universal rule that binary evidence needs no hedge. Acs2 illustrates the opposite pole in a single Agriculture case: after reporting non-significance, the abstract still hedges residual benefits. That sequence matches the introduction’s concern with overclaiming, but it remains one ratified text, not a Null/NS class effect.
+Acs2 remains a single case, but it is theoretically useful. Under Salager-Meyer’s (1994) claim-responsibility account, the abstract reports non-significance and then redistributes responsibility by hedging residual benefits. In English terms, the writer keeps a treatment sounding viable after the statistical claim has failed. That is the overclaiming risk flagged in the introduction, visible as rescue-hedging rather than as high density alone. Binary outcome type does not erase Veterinary Medicine’s lower rates either. Biology Binary abstracts still average more hedges than VM Binary abstracts. Stance language in English is not made unnecessary by a yes/no result design. The corpus therefore supports a limited ELS claim: in these abstracts, density differences track how programs word caution around findings and implications, not only how study designs package results.</w:t>
       </w:r>
       <w:r>
         <w:rPr>

</xml_diff>

<commit_message>
Draft_104: Part I related lit Hyland 1996b + Table 4 type-mix note
</commit_message>
<xml_diff>
--- a/thesis/003_ThesisProposal_Draft_104.docx
+++ b/thesis/003_ThesisProposal_Draft_104.docx
@@ -4830,7 +4830,8 @@
           <w:rtl w:val="0"/>
         </w:rPr>
         <w:t xml:space="preserve">Within the lexical hedge category, the token “potential” accounted for 19 of the 41 lexical instances (46.3%), the single most frequent hedge token in the corpus. Other frequent lexical forms, grouped by root, included “suggest / suggests / suggesting” (13), “imply / implies / implying” (3), and “indicating” (2). Modal verbs were led by “can” (6), “could” (6), “may” (6), and “might” (3). Concordance of the 19 potential instances shows recurring frames such as “the potential of X as a Y,” “has potential as an X,” and “highlight their potential as X.” That recurrence is notable. Whether those uses express epistemic caution or topic-naming evaluation remains a boundary judgment under the Working Test and is open to alternative readings. Agriculture and Biology account for 15 of the 19 instances. Veterinary Medicine accounts for 4. Table 3 lists each retained form so the lexical subtotal of 41 and the corpus total of 65 can be checked form by form.
-This lexical-led profile diverges from studies where developing writers rely mainly on modal verbs (Khunasathitchai et al., 2025; Wang, 2022). In scientific English, content-oriented lexical hedges often carry more of the epistemic load than modals alone (Hyland, 1998). The dominance of potential fits that pattern in applied-life-science abstracts. Writers reach for a ready English formula that softens application claims (“has potential as…”, “highlight their potential as…”) without building longer clause-level stance. The absence of clause-level hedges is consistent with a compressed abstract genre and with a limited L2 repertoire for multi-word epistemic frames. For English Language Studies, the type profile is less a ranking of “best” hedges than a map of which English forms do the work of caution in these ratified summaries.</w:t>
+This lexical-led profile diverges from studies where developing writers rely mainly on modal verbs (Khunasathitchai et al., 2025; Wang, 2022). In scientific English, content-oriented lexical hedges often carry more of the epistemic load than modals alone (Hyland, 1998). The dominance of potential fits that pattern in applied-life-science abstracts. Writers reach for a ready English formula that softens application claims (“has potential as…”, “highlight their potential as…”) without building longer clause-level stance. The absence of clause-level hedges is consistent with a compressed abstract genre and with a limited L2 repertoire for multi-word epistemic frames. For English Language Studies, the type profile is less a ranking of “best” hedges than a map of which English forms do the work of caution in these ratified summaries.
+Related work on scientific research writing supports a lexical emphasis. Hyland (1996b) shows that hedging in molecular biology articles is realized mainly by surface lexical forms, with epistemic lexical verbs the largest and most varied group and items such as suggest and indicate among the most frequent. Biologists in that corpus also used fewer modal verbs than writers in general academic English. Student and L2 studies more often report modal dominance (Khunasathitchai et al., 2025; Wang, 2022). The present lexical-led profile, driven by potential and suggest in application and implication frames, therefore aligns more with the scientific pattern than with the modal-heavy student pattern.</w:t>
       </w:r>
       <w:r>
         <w:rPr>
@@ -6970,7 +6971,8 @@
           <w:szCs w:val="22"/>
           <w:rtl w:val="0"/>
         </w:rPr>
-        <w:t xml:space="preserve">The distribution of hedge types shows cross-disciplinary differences, most clearly in Veterinary Medicine’s small total and low modal share. Table 4 presents the per-discipline breakdown of hedge types.</w:t>
+        <w:t xml:space="preserve">The distribution of hedge types shows cross-disciplinary differences, most clearly in Veterinary Medicine’s small total and low modal share. Table 4 presents the per-discipline breakdown of hedge types.
+Cross-disciplinary differences in hedge-type mix are also reported in student and expert corpora (Wang, 2022; Hyland, 1996b). Veterinary Medicine’s small total and low modal share in Table 4 is therefore readable as a local type profile within this sample, not only as a density gap.</w:t>
       </w:r>
       <w:r>
         <w:rPr>
@@ -11823,6 +11825,39 @@
             <w:rtl w:val="0"/>
           </w:rPr>
           <w:t xml:space="preserve">https://doi.org/10.1093/applin/17.4.433</w:t>
+        </w:r>
+      </w:hyperlink>
+      <w:r>
+        <w:rPr>
+          <w:rtl w:val="0"/>
+        </w:rPr>
+      </w:r>
+    </w:p>
+    <w:p>
+      <w:pPr>
+        <w:spacing w:after="0" w:before="0" w:line="480" w:lineRule="auto"/>
+        <w:ind w:left="720" w:hanging="720"/>
+        <w:jc w:val="both"/>
+        <w:rPr/>
+      </w:pPr>
+      <w:r>
+        <w:rPr>
+          <w:sz w:val="22"/>
+          <w:szCs w:val="22"/>
+          <w:rtl w:val="0"/>
+        </w:rPr>
+        <w:t xml:space="preserve">Hyland, K. (1996b). Talking to the Academy: Forms of hedging in science research articles. Written Communication, 13(2), 251-281. https://doi.org/10.1177/0741088396013002004</w:t>
+      </w:r>
+      <w:hyperlink r:id="rId24">
+        <w:r>
+          <w:rPr>
+            <w:color w:val="1155cc"/>
+            <w:sz w:val="22"/>
+            <w:szCs w:val="22"/>
+            <w:u w:val="single"/>
+            <w:rtl w:val="0"/>
+          </w:rPr>
+          <w:t xml:space="preserve"/>
         </w:r>
       </w:hyperlink>
       <w:r>

</xml_diff>